<commit_message>
Expand final paper as sole deliverable
</commit_message>
<xml_diff>
--- a/output/final/总论文.docx
+++ b/output/final/总论文.docx
@@ -4309,7 +4309,7 @@
     </w:p>
     <w:bookmarkEnd w:id="32"/>
     <w:bookmarkEnd w:id="33"/>
-    <w:bookmarkStart w:id="56" w:name="参数校准与模型检验"/>
+    <w:bookmarkStart w:id="73" w:name="参数校准与模型检验"/>
     <w:p>
       <w:pPr>
         <w:pStyle w:val="Heading1"/>
@@ -7195,8 +7195,2477 @@
       </w:r>
     </w:p>
     <w:bookmarkEnd w:id="55"/>
-    <w:bookmarkEnd w:id="56"/>
-    <w:bookmarkStart w:id="65" w:name="天三情景预测"/>
+    <w:bookmarkStart w:id="62" w:name="分段误差与残差诊断"/>
+    <w:p>
+      <w:pPr>
+        <w:pStyle w:val="Heading2"/>
+      </w:pPr>
+      <w:r>
+        <w:rPr>
+          <w:rFonts w:hint="eastAsia"/>
+        </w:rPr>
+        <w:t xml:space="preserve">分段误差与残差诊断</w:t>
+      </w:r>
+    </w:p>
+    <w:p>
+      <w:pPr>
+        <w:pStyle w:val="FirstParagraph"/>
+      </w:pPr>
+      <w:r>
+        <w:rPr>
+          <w:rFonts w:hint="eastAsia"/>
+        </w:rPr>
+        <w:t xml:space="preserve">仅报告全窗口</w:t>
+      </w:r>
+      <w:r>
+        <w:t xml:space="preserve"> RMSE </w:t>
+      </w:r>
+      <w:r>
+        <w:rPr>
+          <w:rFonts w:hint="eastAsia"/>
+        </w:rPr>
+        <w:t xml:space="preserve">容易掩盖局部失败。本文进一步检查逐日残差、滚动误差、实际值与模拟值一致性以及残差自相关。分段误差显示，中期平台是最难解释的部分，RMSE</w:t>
+      </w:r>
+      <w:r>
+        <w:t xml:space="preserve"> </w:t>
+      </w:r>
+      <w:r>
+        <w:rPr>
+          <w:rFonts w:hint="eastAsia"/>
+        </w:rPr>
+        <w:t xml:space="preserve">为</w:t>
+      </w:r>
+      <w:r>
+        <w:t xml:space="preserve"> 4.39 </w:t>
+      </w:r>
+      <w:r>
+        <w:rPr>
+          <w:rFonts w:hint="eastAsia"/>
+        </w:rPr>
+        <w:t xml:space="preserve">美元/桶；后期再定价阶段</w:t>
+      </w:r>
+      <w:r>
+        <w:t xml:space="preserve"> RMSE </w:t>
+      </w:r>
+      <w:r>
+        <w:rPr>
+          <w:rFonts w:hint="eastAsia"/>
+        </w:rPr>
+        <w:t xml:space="preserve">降至</w:t>
+      </w:r>
+      <w:r>
+        <w:t xml:space="preserve"> 2.81 </w:t>
+      </w:r>
+      <w:r>
+        <w:rPr>
+          <w:rFonts w:hint="eastAsia"/>
+        </w:rPr>
+        <w:t xml:space="preserve">美元/桶，说明缓冲确认折价和预期修复折价对解释后期回落有实际作用。</w:t>
+      </w:r>
+    </w:p>
+    <w:p>
+      <w:pPr>
+        <w:pStyle w:val="CaptionedFigure"/>
+      </w:pPr>
+      <w:r>
+        <w:drawing>
+          <wp:inline>
+            <wp:extent cx="4907280" cy="3658154"/>
+            <wp:effectExtent b="0" l="0" r="0" t="0"/>
+            <wp:docPr descr="" title="" id="57" name="Picture"/>
+            <a:graphic>
+              <a:graphicData uri="http://schemas.openxmlformats.org/drawingml/2006/picture">
+                <pic:pic>
+                  <pic:nvPicPr>
+                    <pic:cNvPr descr="短期模型误差诊断.png" id="58" name="Picture"/>
+                    <pic:cNvPicPr>
+                      <a:picLocks noChangeArrowheads="1" noChangeAspect="1"/>
+                    </pic:cNvPicPr>
+                  </pic:nvPicPr>
+                  <pic:blipFill>
+                    <a:blip r:embed="rId56"/>
+                    <a:stretch>
+                      <a:fillRect/>
+                    </a:stretch>
+                  </pic:blipFill>
+                  <pic:spPr bwMode="auto">
+                    <a:xfrm>
+                      <a:off x="0" y="0"/>
+                      <a:ext cx="4907280" cy="3658154"/>
+                    </a:xfrm>
+                    <a:prstGeom prst="rect">
+                      <a:avLst/>
+                    </a:prstGeom>
+                    <a:noFill/>
+                    <a:ln w="9525">
+                      <a:noFill/>
+                      <a:headEnd/>
+                      <a:tailEnd/>
+                    </a:ln>
+                  </pic:spPr>
+                </pic:pic>
+              </a:graphicData>
+            </a:graphic>
+          </wp:inline>
+        </w:drawing>
+      </w:r>
+    </w:p>
+    <w:p>
+      <w:pPr>
+        <w:pStyle w:val="ImageCaption"/>
+      </w:pPr>
+      <w:r>
+        <w:rPr>
+          <w:rFonts w:hint="eastAsia"/>
+        </w:rPr>
+        <w:t xml:space="preserve">短期模型逐日误差与分段误差诊断。误差没有集中失控于单一阶段。</w:t>
+      </w:r>
+    </w:p>
+    <w:p>
+      <w:pPr>
+        <w:pStyle w:val="CaptionedFigure"/>
+      </w:pPr>
+      <w:r>
+        <w:drawing>
+          <wp:inline>
+            <wp:extent cx="4907280" cy="3655675"/>
+            <wp:effectExtent b="0" l="0" r="0" t="0"/>
+            <wp:docPr descr="" title="" id="60" name="Picture"/>
+            <a:graphic>
+              <a:graphicData uri="http://schemas.openxmlformats.org/drawingml/2006/picture">
+                <pic:pic>
+                  <pic:nvPicPr>
+                    <pic:cNvPr descr="短期模型残差诊断增强.png" id="61" name="Picture"/>
+                    <pic:cNvPicPr>
+                      <a:picLocks noChangeArrowheads="1" noChangeAspect="1"/>
+                    </pic:cNvPicPr>
+                  </pic:nvPicPr>
+                  <pic:blipFill>
+                    <a:blip r:embed="rId59"/>
+                    <a:stretch>
+                      <a:fillRect/>
+                    </a:stretch>
+                  </pic:blipFill>
+                  <pic:spPr bwMode="auto">
+                    <a:xfrm>
+                      <a:off x="0" y="0"/>
+                      <a:ext cx="4907280" cy="3655675"/>
+                    </a:xfrm>
+                    <a:prstGeom prst="rect">
+                      <a:avLst/>
+                    </a:prstGeom>
+                    <a:noFill/>
+                    <a:ln w="9525">
+                      <a:noFill/>
+                      <a:headEnd/>
+                      <a:tailEnd/>
+                    </a:ln>
+                  </pic:spPr>
+                </pic:pic>
+              </a:graphicData>
+            </a:graphic>
+          </wp:inline>
+        </w:drawing>
+      </w:r>
+    </w:p>
+    <w:p>
+      <w:pPr>
+        <w:pStyle w:val="ImageCaption"/>
+      </w:pPr>
+      <w:r>
+        <w:rPr>
+          <w:rFonts w:hint="eastAsia"/>
+        </w:rPr>
+        <w:t xml:space="preserve">短期模型增强残差诊断。图中展示一致性、残差分布、滚动误差和残差自相关。</w:t>
+      </w:r>
+    </w:p>
+    <w:p>
+      <w:pPr>
+        <w:pStyle w:val="BodyText"/>
+      </w:pPr>
+      <w:r>
+        <w:rPr>
+          <w:rFonts w:hint="eastAsia"/>
+        </w:rPr>
+        <w:t xml:space="preserve">增强诊断表明，模型没有通过牺牲某一局部阶段来换取总体</w:t>
+      </w:r>
+      <w:r>
+        <w:t xml:space="preserve"> </w:t>
+      </w:r>
+      <w:r>
+        <w:rPr>
+          <w:rFonts w:hint="eastAsia"/>
+        </w:rPr>
+        <w:t xml:space="preserve">RMSE。实际值与模拟值的一致性图说明模型能够跟随冲突窗口的主要价格平台；残差分布没有出现单侧系统性偏移；滚动误差在中期平台阶段略高，符合市场对封锁持续时间和缓冲机制可持续性反复定价的事实。残差一阶自相关约为</w:t>
+      </w:r>
+      <w:r>
+        <w:t xml:space="preserve"> </w:t>
+      </w:r>
+      <w:r>
+        <w:rPr>
+          <w:rFonts w:hint="eastAsia"/>
+        </w:rPr>
+        <w:t xml:space="preserve">0.254，说明仍存在一定连续偏差，但未形成明显强自相关。</w:t>
+      </w:r>
+    </w:p>
+    <w:bookmarkEnd w:id="62"/>
+    <w:bookmarkStart w:id="63" w:name="机制消融的定量证据"/>
+    <w:p>
+      <w:pPr>
+        <w:pStyle w:val="Heading2"/>
+      </w:pPr>
+      <w:r>
+        <w:rPr>
+          <w:rFonts w:hint="eastAsia"/>
+        </w:rPr>
+        <w:t xml:space="preserve">机制消融的定量证据</w:t>
+      </w:r>
+    </w:p>
+    <w:p>
+      <w:pPr>
+        <w:pStyle w:val="FirstParagraph"/>
+      </w:pPr>
+      <w:r>
+        <w:rPr>
+          <w:rFonts w:hint="eastAsia"/>
+        </w:rPr>
+        <w:t xml:space="preserve">为了进一步回答</w:t>
+      </w:r>
+      <w:r>
+        <w:rPr>
+          <w:rFonts w:hint="eastAsia"/>
+        </w:rPr>
+        <w:t xml:space="preserve">“扩展机制是不是为了拟合曲线而硬加的补丁”</w:t>
+      </w:r>
+      <w:r>
+        <w:rPr>
+          <w:rFonts w:hint="eastAsia"/>
+        </w:rPr>
+        <w:t xml:space="preserve">，本文对完整模型进行逐项消融：关闭某一机制时，其他参数保持不变，不重新校准。这样做的含义是检验单个机制在同一参数体系下的边际贡献，而不是重新给每个缺失机制模型寻找最优参数。</w:t>
+      </w:r>
+    </w:p>
+    <w:p>
+      <w:pPr>
+        <w:pStyle w:val="TableCaption"/>
+      </w:pPr>
+      <w:r>
+        <w:rPr>
+          <w:rFonts w:hint="eastAsia"/>
+        </w:rPr>
+        <w:t xml:space="preserve">短期模型机制消融实验</w:t>
+      </w:r>
+    </w:p>
+    <w:tbl>
+      <w:tblPr>
+        <w:tblStyle w:val="Table"/>
+        <w:tblW w:type="auto" w:w="0"/>
+        <w:tblLook w:firstRow="1" w:lastRow="0" w:firstColumn="0" w:lastColumn="0" w:noHBand="0" w:noVBand="0" w:val="0020"/>
+        <w:tblCaption w:val="短期模型机制消融实验"/>
+      </w:tblPr>
+      <w:tblGrid>
+        <w:gridCol w:w="1584"/>
+        <w:gridCol w:w="1584"/>
+        <w:gridCol w:w="1584"/>
+        <w:gridCol w:w="1584"/>
+        <w:gridCol w:w="1584"/>
+      </w:tblGrid>
+      <w:tr>
+        <w:trPr>
+          <w:tblHeader w:val="on"/>
+        </w:trPr>
+        <w:tc>
+          <w:tcPr/>
+          <w:p>
+            <w:pPr>
+              <w:pStyle w:val="Compact"/>
+              <w:jc w:val="left"/>
+            </w:pPr>
+            <w:r>
+              <w:rPr>
+                <w:rFonts w:hint="eastAsia"/>
+              </w:rPr>
+              <w:t xml:space="preserve">消融实验</w:t>
+            </w:r>
+          </w:p>
+        </w:tc>
+        <w:tc>
+          <w:tcPr/>
+          <w:p>
+            <w:pPr>
+              <w:pStyle w:val="Compact"/>
+              <w:jc w:val="right"/>
+            </w:pPr>
+            <w:r>
+              <w:t xml:space="preserve">RMSE</w:t>
+            </w:r>
+          </w:p>
+        </w:tc>
+        <w:tc>
+          <w:tcPr/>
+          <w:p>
+            <w:pPr>
+              <w:pStyle w:val="Compact"/>
+              <w:jc w:val="right"/>
+            </w:pPr>
+            <w:r>
+              <w:rPr>
+                <w:rFonts w:hint="eastAsia"/>
+              </w:rPr>
+              <w:t xml:space="preserve">RMSE变化</w:t>
+            </w:r>
+          </w:p>
+        </w:tc>
+        <w:tc>
+          <w:tcPr/>
+          <w:p>
+            <w:pPr>
+              <w:pStyle w:val="Compact"/>
+              <w:jc w:val="right"/>
+            </w:pPr>
+            <w:r>
+              <w:rPr>
+                <w:rFonts w:hint="eastAsia"/>
+              </w:rPr>
+              <w:t xml:space="preserve">后期RMSE</w:t>
+            </w:r>
+          </w:p>
+        </w:tc>
+        <w:tc>
+          <w:tcPr/>
+          <w:p>
+            <w:pPr>
+              <w:pStyle w:val="Compact"/>
+              <w:jc w:val="right"/>
+            </w:pPr>
+            <w:r>
+              <w:rPr>
+                <w:rFonts w:hint="eastAsia"/>
+              </w:rPr>
+              <w:t xml:space="preserve">低价回落RMSE</w:t>
+            </w:r>
+          </w:p>
+        </w:tc>
+      </w:tr>
+      <w:tr>
+        <w:tc>
+          <w:tcPr/>
+          <w:p>
+            <w:pPr>
+              <w:pStyle w:val="Compact"/>
+              <w:jc w:val="left"/>
+            </w:pPr>
+            <w:r>
+              <w:rPr>
+                <w:rFonts w:hint="eastAsia"/>
+              </w:rPr>
+              <w:t xml:space="preserve">完整模型</w:t>
+            </w:r>
+          </w:p>
+        </w:tc>
+        <w:tc>
+          <w:tcPr/>
+          <w:p>
+            <w:pPr>
+              <w:pStyle w:val="Compact"/>
+              <w:jc w:val="right"/>
+            </w:pPr>
+            <w:r>
+              <w:t xml:space="preserve">3.44</w:t>
+            </w:r>
+          </w:p>
+        </w:tc>
+        <w:tc>
+          <w:tcPr/>
+          <w:p>
+            <w:pPr>
+              <w:pStyle w:val="Compact"/>
+              <w:jc w:val="right"/>
+            </w:pPr>
+            <w:r>
+              <w:t xml:space="preserve">0.00</w:t>
+            </w:r>
+          </w:p>
+        </w:tc>
+        <w:tc>
+          <w:tcPr/>
+          <w:p>
+            <w:pPr>
+              <w:pStyle w:val="Compact"/>
+              <w:jc w:val="right"/>
+            </w:pPr>
+            <w:r>
+              <w:t xml:space="preserve">2.81</w:t>
+            </w:r>
+          </w:p>
+        </w:tc>
+        <w:tc>
+          <w:tcPr/>
+          <w:p>
+            <w:pPr>
+              <w:pStyle w:val="Compact"/>
+              <w:jc w:val="right"/>
+            </w:pPr>
+            <w:r>
+              <w:t xml:space="preserve">3.38</w:t>
+            </w:r>
+          </w:p>
+        </w:tc>
+      </w:tr>
+      <w:tr>
+        <w:tc>
+          <w:tcPr/>
+          <w:p>
+            <w:pPr>
+              <w:pStyle w:val="Compact"/>
+              <w:jc w:val="left"/>
+            </w:pPr>
+            <w:r>
+              <w:rPr>
+                <w:rFonts w:hint="eastAsia"/>
+              </w:rPr>
+              <w:t xml:space="preserve">无</w:t>
+            </w:r>
+            <w:r>
+              <w:t xml:space="preserve"> SPR</w:t>
+            </w:r>
+          </w:p>
+        </w:tc>
+        <w:tc>
+          <w:tcPr/>
+          <w:p>
+            <w:pPr>
+              <w:pStyle w:val="Compact"/>
+              <w:jc w:val="right"/>
+            </w:pPr>
+            <w:r>
+              <w:t xml:space="preserve">5.86</w:t>
+            </w:r>
+          </w:p>
+        </w:tc>
+        <w:tc>
+          <w:tcPr/>
+          <w:p>
+            <w:pPr>
+              <w:pStyle w:val="Compact"/>
+              <w:jc w:val="right"/>
+            </w:pPr>
+            <w:r>
+              <w:t xml:space="preserve">+2.42</w:t>
+            </w:r>
+          </w:p>
+        </w:tc>
+        <w:tc>
+          <w:tcPr/>
+          <w:p>
+            <w:pPr>
+              <w:pStyle w:val="Compact"/>
+              <w:jc w:val="right"/>
+            </w:pPr>
+            <w:r>
+              <w:t xml:space="preserve">5.84</w:t>
+            </w:r>
+          </w:p>
+        </w:tc>
+        <w:tc>
+          <w:tcPr/>
+          <w:p>
+            <w:pPr>
+              <w:pStyle w:val="Compact"/>
+              <w:jc w:val="right"/>
+            </w:pPr>
+            <w:r>
+              <w:t xml:space="preserve">6.46</w:t>
+            </w:r>
+          </w:p>
+        </w:tc>
+      </w:tr>
+      <w:tr>
+        <w:tc>
+          <w:tcPr/>
+          <w:p>
+            <w:pPr>
+              <w:pStyle w:val="Compact"/>
+              <w:jc w:val="left"/>
+            </w:pPr>
+            <w:r>
+              <w:rPr>
+                <w:rFonts w:hint="eastAsia"/>
+              </w:rPr>
+              <w:t xml:space="preserve">无库存</w:t>
+            </w:r>
+          </w:p>
+        </w:tc>
+        <w:tc>
+          <w:tcPr/>
+          <w:p>
+            <w:pPr>
+              <w:pStyle w:val="Compact"/>
+              <w:jc w:val="right"/>
+            </w:pPr>
+            <w:r>
+              <w:t xml:space="preserve">3.47</w:t>
+            </w:r>
+          </w:p>
+        </w:tc>
+        <w:tc>
+          <w:tcPr/>
+          <w:p>
+            <w:pPr>
+              <w:pStyle w:val="Compact"/>
+              <w:jc w:val="right"/>
+            </w:pPr>
+            <w:r>
+              <w:t xml:space="preserve">+0.03</w:t>
+            </w:r>
+          </w:p>
+        </w:tc>
+        <w:tc>
+          <w:tcPr/>
+          <w:p>
+            <w:pPr>
+              <w:pStyle w:val="Compact"/>
+              <w:jc w:val="right"/>
+            </w:pPr>
+            <w:r>
+              <w:t xml:space="preserve">2.75</w:t>
+            </w:r>
+          </w:p>
+        </w:tc>
+        <w:tc>
+          <w:tcPr/>
+          <w:p>
+            <w:pPr>
+              <w:pStyle w:val="Compact"/>
+              <w:jc w:val="right"/>
+            </w:pPr>
+            <w:r>
+              <w:t xml:space="preserve">3.55</w:t>
+            </w:r>
+          </w:p>
+        </w:tc>
+      </w:tr>
+      <w:tr>
+        <w:tc>
+          <w:tcPr/>
+          <w:p>
+            <w:pPr>
+              <w:pStyle w:val="Compact"/>
+              <w:jc w:val="left"/>
+            </w:pPr>
+            <w:r>
+              <w:rPr>
+                <w:rFonts w:hint="eastAsia"/>
+              </w:rPr>
+              <w:t xml:space="preserve">无绕道</w:t>
+            </w:r>
+          </w:p>
+        </w:tc>
+        <w:tc>
+          <w:tcPr/>
+          <w:p>
+            <w:pPr>
+              <w:pStyle w:val="Compact"/>
+              <w:jc w:val="right"/>
+            </w:pPr>
+            <w:r>
+              <w:t xml:space="preserve">3.46</w:t>
+            </w:r>
+          </w:p>
+        </w:tc>
+        <w:tc>
+          <w:tcPr/>
+          <w:p>
+            <w:pPr>
+              <w:pStyle w:val="Compact"/>
+              <w:jc w:val="right"/>
+            </w:pPr>
+            <w:r>
+              <w:t xml:space="preserve">+0.02</w:t>
+            </w:r>
+          </w:p>
+        </w:tc>
+        <w:tc>
+          <w:tcPr/>
+          <w:p>
+            <w:pPr>
+              <w:pStyle w:val="Compact"/>
+              <w:jc w:val="right"/>
+            </w:pPr>
+            <w:r>
+              <w:t xml:space="preserve">2.75</w:t>
+            </w:r>
+          </w:p>
+        </w:tc>
+        <w:tc>
+          <w:tcPr/>
+          <w:p>
+            <w:pPr>
+              <w:pStyle w:val="Compact"/>
+              <w:jc w:val="right"/>
+            </w:pPr>
+            <w:r>
+              <w:t xml:space="preserve">3.47</w:t>
+            </w:r>
+          </w:p>
+        </w:tc>
+      </w:tr>
+      <w:tr>
+        <w:tc>
+          <w:tcPr/>
+          <w:p>
+            <w:pPr>
+              <w:pStyle w:val="Compact"/>
+              <w:jc w:val="left"/>
+            </w:pPr>
+            <w:r>
+              <w:rPr>
+                <w:rFonts w:hint="eastAsia"/>
+              </w:rPr>
+              <w:t xml:space="preserve">无需求收缩</w:t>
+            </w:r>
+          </w:p>
+        </w:tc>
+        <w:tc>
+          <w:tcPr/>
+          <w:p>
+            <w:pPr>
+              <w:pStyle w:val="Compact"/>
+              <w:jc w:val="right"/>
+            </w:pPr>
+            <w:r>
+              <w:t xml:space="preserve">4.64</w:t>
+            </w:r>
+          </w:p>
+        </w:tc>
+        <w:tc>
+          <w:tcPr/>
+          <w:p>
+            <w:pPr>
+              <w:pStyle w:val="Compact"/>
+              <w:jc w:val="right"/>
+            </w:pPr>
+            <w:r>
+              <w:t xml:space="preserve">+1.20</w:t>
+            </w:r>
+          </w:p>
+        </w:tc>
+        <w:tc>
+          <w:tcPr/>
+          <w:p>
+            <w:pPr>
+              <w:pStyle w:val="Compact"/>
+              <w:jc w:val="right"/>
+            </w:pPr>
+            <w:r>
+              <w:t xml:space="preserve">2.69</w:t>
+            </w:r>
+          </w:p>
+        </w:tc>
+        <w:tc>
+          <w:tcPr/>
+          <w:p>
+            <w:pPr>
+              <w:pStyle w:val="Compact"/>
+              <w:jc w:val="right"/>
+            </w:pPr>
+            <w:r>
+              <w:t xml:space="preserve">5.16</w:t>
+            </w:r>
+          </w:p>
+        </w:tc>
+      </w:tr>
+      <w:tr>
+        <w:tc>
+          <w:tcPr/>
+          <w:p>
+            <w:pPr>
+              <w:pStyle w:val="Compact"/>
+              <w:jc w:val="left"/>
+            </w:pPr>
+            <w:r>
+              <w:rPr>
+                <w:rFonts w:hint="eastAsia"/>
+              </w:rPr>
+              <w:t xml:space="preserve">无恐慌溢价</w:t>
+            </w:r>
+          </w:p>
+        </w:tc>
+        <w:tc>
+          <w:tcPr/>
+          <w:p>
+            <w:pPr>
+              <w:pStyle w:val="Compact"/>
+              <w:jc w:val="right"/>
+            </w:pPr>
+            <w:r>
+              <w:t xml:space="preserve">3.62</w:t>
+            </w:r>
+          </w:p>
+        </w:tc>
+        <w:tc>
+          <w:tcPr/>
+          <w:p>
+            <w:pPr>
+              <w:pStyle w:val="Compact"/>
+              <w:jc w:val="right"/>
+            </w:pPr>
+            <w:r>
+              <w:t xml:space="preserve">+0.18</w:t>
+            </w:r>
+          </w:p>
+        </w:tc>
+        <w:tc>
+          <w:tcPr/>
+          <w:p>
+            <w:pPr>
+              <w:pStyle w:val="Compact"/>
+              <w:jc w:val="right"/>
+            </w:pPr>
+            <w:r>
+              <w:t xml:space="preserve">2.79</w:t>
+            </w:r>
+          </w:p>
+        </w:tc>
+        <w:tc>
+          <w:tcPr/>
+          <w:p>
+            <w:pPr>
+              <w:pStyle w:val="Compact"/>
+              <w:jc w:val="right"/>
+            </w:pPr>
+            <w:r>
+              <w:t xml:space="preserve">3.43</w:t>
+            </w:r>
+          </w:p>
+        </w:tc>
+      </w:tr>
+      <w:tr>
+        <w:tc>
+          <w:tcPr/>
+          <w:p>
+            <w:pPr>
+              <w:pStyle w:val="Compact"/>
+              <w:jc w:val="left"/>
+            </w:pPr>
+            <w:r>
+              <w:rPr>
+                <w:rFonts w:hint="eastAsia"/>
+              </w:rPr>
+              <w:t xml:space="preserve">无风险溢价</w:t>
+            </w:r>
+          </w:p>
+        </w:tc>
+        <w:tc>
+          <w:tcPr/>
+          <w:p>
+            <w:pPr>
+              <w:pStyle w:val="Compact"/>
+              <w:jc w:val="right"/>
+            </w:pPr>
+            <w:r>
+              <w:t xml:space="preserve">30.69</w:t>
+            </w:r>
+          </w:p>
+        </w:tc>
+        <w:tc>
+          <w:tcPr/>
+          <w:p>
+            <w:pPr>
+              <w:pStyle w:val="Compact"/>
+              <w:jc w:val="right"/>
+            </w:pPr>
+            <w:r>
+              <w:t xml:space="preserve">+27.25</w:t>
+            </w:r>
+          </w:p>
+        </w:tc>
+        <w:tc>
+          <w:tcPr/>
+          <w:p>
+            <w:pPr>
+              <w:pStyle w:val="Compact"/>
+              <w:jc w:val="right"/>
+            </w:pPr>
+            <w:r>
+              <w:t xml:space="preserve">36.02</w:t>
+            </w:r>
+          </w:p>
+        </w:tc>
+        <w:tc>
+          <w:tcPr/>
+          <w:p>
+            <w:pPr>
+              <w:pStyle w:val="Compact"/>
+              <w:jc w:val="right"/>
+            </w:pPr>
+            <w:r>
+              <w:t xml:space="preserve">25.71</w:t>
+            </w:r>
+          </w:p>
+        </w:tc>
+      </w:tr>
+      <w:tr>
+        <w:tc>
+          <w:tcPr/>
+          <w:p>
+            <w:pPr>
+              <w:pStyle w:val="Compact"/>
+              <w:jc w:val="left"/>
+            </w:pPr>
+            <w:r>
+              <w:rPr>
+                <w:rFonts w:hint="eastAsia"/>
+              </w:rPr>
+              <w:t xml:space="preserve">无缓冲折价</w:t>
+            </w:r>
+          </w:p>
+        </w:tc>
+        <w:tc>
+          <w:tcPr/>
+          <w:p>
+            <w:pPr>
+              <w:pStyle w:val="Compact"/>
+              <w:jc w:val="right"/>
+            </w:pPr>
+            <w:r>
+              <w:t xml:space="preserve">5.07</w:t>
+            </w:r>
+          </w:p>
+        </w:tc>
+        <w:tc>
+          <w:tcPr/>
+          <w:p>
+            <w:pPr>
+              <w:pStyle w:val="Compact"/>
+              <w:jc w:val="right"/>
+            </w:pPr>
+            <w:r>
+              <w:t xml:space="preserve">+1.63</w:t>
+            </w:r>
+          </w:p>
+        </w:tc>
+        <w:tc>
+          <w:tcPr/>
+          <w:p>
+            <w:pPr>
+              <w:pStyle w:val="Compact"/>
+              <w:jc w:val="right"/>
+            </w:pPr>
+            <w:r>
+              <w:t xml:space="preserve">4.33</w:t>
+            </w:r>
+          </w:p>
+        </w:tc>
+        <w:tc>
+          <w:tcPr/>
+          <w:p>
+            <w:pPr>
+              <w:pStyle w:val="Compact"/>
+              <w:jc w:val="right"/>
+            </w:pPr>
+            <w:r>
+              <w:t xml:space="preserve">6.18</w:t>
+            </w:r>
+          </w:p>
+        </w:tc>
+      </w:tr>
+      <w:tr>
+        <w:tc>
+          <w:tcPr/>
+          <w:p>
+            <w:pPr>
+              <w:pStyle w:val="Compact"/>
+              <w:jc w:val="left"/>
+            </w:pPr>
+            <w:r>
+              <w:rPr>
+                <w:rFonts w:hint="eastAsia"/>
+              </w:rPr>
+              <w:t xml:space="preserve">无修复折价</w:t>
+            </w:r>
+          </w:p>
+        </w:tc>
+        <w:tc>
+          <w:tcPr/>
+          <w:p>
+            <w:pPr>
+              <w:pStyle w:val="Compact"/>
+              <w:jc w:val="right"/>
+            </w:pPr>
+            <w:r>
+              <w:t xml:space="preserve">7.31</w:t>
+            </w:r>
+          </w:p>
+        </w:tc>
+        <w:tc>
+          <w:tcPr/>
+          <w:p>
+            <w:pPr>
+              <w:pStyle w:val="Compact"/>
+              <w:jc w:val="right"/>
+            </w:pPr>
+            <w:r>
+              <w:t xml:space="preserve">+3.87</w:t>
+            </w:r>
+          </w:p>
+        </w:tc>
+        <w:tc>
+          <w:tcPr/>
+          <w:p>
+            <w:pPr>
+              <w:pStyle w:val="Compact"/>
+              <w:jc w:val="right"/>
+            </w:pPr>
+            <w:r>
+              <w:t xml:space="preserve">10.09</w:t>
+            </w:r>
+          </w:p>
+        </w:tc>
+        <w:tc>
+          <w:tcPr/>
+          <w:p>
+            <w:pPr>
+              <w:pStyle w:val="Compact"/>
+              <w:jc w:val="right"/>
+            </w:pPr>
+            <w:r>
+              <w:t xml:space="preserve">9.77</w:t>
+            </w:r>
+          </w:p>
+        </w:tc>
+      </w:tr>
+      <w:tr>
+        <w:tc>
+          <w:tcPr/>
+          <w:p>
+            <w:pPr>
+              <w:pStyle w:val="Compact"/>
+              <w:jc w:val="left"/>
+            </w:pPr>
+            <w:r>
+              <w:rPr>
+                <w:rFonts w:hint="eastAsia"/>
+              </w:rPr>
+              <w:t xml:space="preserve">无市场修正</w:t>
+            </w:r>
+          </w:p>
+        </w:tc>
+        <w:tc>
+          <w:tcPr/>
+          <w:p>
+            <w:pPr>
+              <w:pStyle w:val="Compact"/>
+              <w:jc w:val="right"/>
+            </w:pPr>
+            <w:r>
+              <w:t xml:space="preserve">26.99</w:t>
+            </w:r>
+          </w:p>
+        </w:tc>
+        <w:tc>
+          <w:tcPr/>
+          <w:p>
+            <w:pPr>
+              <w:pStyle w:val="Compact"/>
+              <w:jc w:val="right"/>
+            </w:pPr>
+            <w:r>
+              <w:t xml:space="preserve">+23.55</w:t>
+            </w:r>
+          </w:p>
+        </w:tc>
+        <w:tc>
+          <w:tcPr/>
+          <w:p>
+            <w:pPr>
+              <w:pStyle w:val="Compact"/>
+              <w:jc w:val="right"/>
+            </w:pPr>
+            <w:r>
+              <w:t xml:space="preserve">29.33</w:t>
+            </w:r>
+          </w:p>
+        </w:tc>
+        <w:tc>
+          <w:tcPr/>
+          <w:p>
+            <w:pPr>
+              <w:pStyle w:val="Compact"/>
+              <w:jc w:val="right"/>
+            </w:pPr>
+            <w:r>
+              <w:t xml:space="preserve">18.90</w:t>
+            </w:r>
+          </w:p>
+        </w:tc>
+      </w:tr>
+    </w:tbl>
+    <w:p>
+      <w:pPr>
+        <w:pStyle w:val="BodyText"/>
+      </w:pPr>
+      <w:r>
+        <w:rPr>
+          <w:rFonts w:hint="eastAsia"/>
+        </w:rPr>
+        <w:t xml:space="preserve">消融结果可以分成两层理解。第一层是题面物理层：SPR</w:t>
+      </w:r>
+      <w:r>
+        <w:t xml:space="preserve"> </w:t>
+      </w:r>
+      <w:r>
+        <w:rPr>
+          <w:rFonts w:hint="eastAsia"/>
+        </w:rPr>
+        <w:t xml:space="preserve">释放和需求收缩的影响最清楚，去除</w:t>
+      </w:r>
+      <w:r>
+        <w:t xml:space="preserve"> SPR </w:t>
+      </w:r>
+      <w:r>
+        <w:rPr>
+          <w:rFonts w:hint="eastAsia"/>
+        </w:rPr>
+        <w:t xml:space="preserve">后</w:t>
+      </w:r>
+      <w:r>
+        <w:t xml:space="preserve"> RMSE </w:t>
+      </w:r>
+      <w:r>
+        <w:rPr>
+          <w:rFonts w:hint="eastAsia"/>
+        </w:rPr>
+        <w:t xml:space="preserve">从</w:t>
+      </w:r>
+      <w:r>
+        <w:t xml:space="preserve"> 3.44 </w:t>
+      </w:r>
+      <w:r>
+        <w:rPr>
+          <w:rFonts w:hint="eastAsia"/>
+        </w:rPr>
+        <w:t xml:space="preserve">升至</w:t>
+      </w:r>
+      <w:r>
+        <w:t xml:space="preserve"> </w:t>
+      </w:r>
+      <w:r>
+        <w:rPr>
+          <w:rFonts w:hint="eastAsia"/>
+        </w:rPr>
+        <w:t xml:space="preserve">5.86，去除需求收缩后低价回落</w:t>
+      </w:r>
+      <w:r>
+        <w:t xml:space="preserve"> RMSE </w:t>
+      </w:r>
+      <w:r>
+        <w:rPr>
+          <w:rFonts w:hint="eastAsia"/>
+        </w:rPr>
+        <w:t xml:space="preserve">升至</w:t>
+      </w:r>
+      <w:r>
+        <w:t xml:space="preserve"> </w:t>
+      </w:r>
+      <w:r>
+        <w:rPr>
+          <w:rFonts w:hint="eastAsia"/>
+        </w:rPr>
+        <w:t xml:space="preserve">5.16，说明政策缓冲和需求侧调整不是装饰项。商业库存与绕道运输在</w:t>
+      </w:r>
+      <w:r>
+        <w:t xml:space="preserve"> 46 </w:t>
+      </w:r>
+      <w:r>
+        <w:rPr>
+          <w:rFonts w:hint="eastAsia"/>
+        </w:rPr>
+        <w:t xml:space="preserve">个交易日短窗口内边际影响较小，但它们在</w:t>
+      </w:r>
+      <w:r>
+        <w:t xml:space="preserve"> 60–180 </w:t>
+      </w:r>
+      <w:r>
+        <w:rPr>
+          <w:rFonts w:hint="eastAsia"/>
+        </w:rPr>
+        <w:t xml:space="preserve">天预测中会影响库存压力、剩余缺口和二次跳涨风险，因此不应因为短窗口贡献小就从长期模型中删除。</w:t>
+      </w:r>
+    </w:p>
+    <w:p>
+      <w:pPr>
+        <w:pStyle w:val="BodyText"/>
+      </w:pPr>
+      <w:r>
+        <w:rPr>
+          <w:rFonts w:hint="eastAsia"/>
+        </w:rPr>
+        <w:t xml:space="preserve">第二层是市场价格形成层：风险与不确定性溢价负责解释价格快速进入高位平台，缓冲确认折价和预期修复折价负责解释后期再定价。若去除预期修复折价，后期</w:t>
+      </w:r>
+      <w:r>
+        <w:t xml:space="preserve"> RMSE </w:t>
+      </w:r>
+      <w:r>
+        <w:rPr>
+          <w:rFonts w:hint="eastAsia"/>
+        </w:rPr>
+        <w:t xml:space="preserve">从</w:t>
+      </w:r>
+      <w:r>
+        <w:t xml:space="preserve"> 2.81 </w:t>
+      </w:r>
+      <w:r>
+        <w:rPr>
+          <w:rFonts w:hint="eastAsia"/>
+        </w:rPr>
+        <w:t xml:space="preserve">升至</w:t>
+      </w:r>
+      <w:r>
+        <w:t xml:space="preserve"> </w:t>
+      </w:r>
+      <w:r>
+        <w:rPr>
+          <w:rFonts w:hint="eastAsia"/>
+        </w:rPr>
+        <w:t xml:space="preserve">10.09，说明市场对政策缓冲和运输恢复的预期并不是可有可无的修饰，而是解释后期回落的关键机制。</w:t>
+      </w:r>
+    </w:p>
+    <w:bookmarkEnd w:id="63"/>
+    <w:bookmarkStart w:id="67" w:name="拐点预测步长与事件边界"/>
+    <w:p>
+      <w:pPr>
+        <w:pStyle w:val="Heading2"/>
+      </w:pPr>
+      <w:r>
+        <w:rPr>
+          <w:rFonts w:hint="eastAsia"/>
+        </w:rPr>
+        <w:t xml:space="preserve">拐点、预测步长与事件边界</w:t>
+      </w:r>
+    </w:p>
+    <w:p>
+      <w:pPr>
+        <w:pStyle w:val="FirstParagraph"/>
+      </w:pPr>
+      <w:r>
+        <w:rPr>
+          <w:rFonts w:hint="eastAsia"/>
+        </w:rPr>
+        <w:t xml:space="preserve">本文模型不是普通日度交易意义上的</w:t>
+      </w:r>
+      <w:r>
+        <w:t xml:space="preserve"> </w:t>
+      </w:r>
+      <m:oMath>
+        <m:r>
+          <m:t>T</m:t>
+        </m:r>
+        <m:r>
+          <m:rPr>
+            <m:sty m:val="p"/>
+          </m:rPr>
+          <m:t>+</m:t>
+        </m:r>
+        <m:r>
+          <m:t>1</m:t>
+        </m:r>
+      </m:oMath>
+      <w:r>
+        <w:t xml:space="preserve"> </w:t>
+      </w:r>
+      <w:r>
+        <w:rPr>
+          <w:rFonts w:hint="eastAsia"/>
+        </w:rPr>
+        <w:t xml:space="preserve">预测器，而是条件机制递推模型。模型给定冲突开始、题面参数和校准参数后，从初始价格开始逐日递推；真实价格只用于参数校准和事后评价，不在每日递推时作为当日输入。因此，RMSE</w:t>
+      </w:r>
+      <w:r>
+        <w:t xml:space="preserve"> </w:t>
+      </w:r>
+      <w:r>
+        <w:rPr>
+          <w:rFonts w:hint="eastAsia"/>
+        </w:rPr>
+        <w:t xml:space="preserve">为</w:t>
+      </w:r>
+      <w:r>
+        <w:t xml:space="preserve"> 3.44 </w:t>
+      </w:r>
+      <w:r>
+        <w:rPr>
+          <w:rFonts w:hint="eastAsia"/>
+        </w:rPr>
+        <w:t xml:space="preserve">的含义是模型对整段冲突路径的条件解释误差，而不是在普通市场环境下每天预测明天价格的交易误差。</w:t>
+      </w:r>
+    </w:p>
+    <w:p>
+      <w:pPr>
+        <w:pStyle w:val="BodyText"/>
+      </w:pPr>
+      <w:r>
+        <w:rPr>
+          <w:rFonts w:hint="eastAsia"/>
+        </w:rPr>
+        <w:t xml:space="preserve">为了检查模型在突变日是否只是慢半拍跟随真实价格，本文选取实际价格绝对变动最大的</w:t>
+      </w:r>
+      <w:r>
+        <w:t xml:space="preserve"> 10 </w:t>
+      </w:r>
+      <w:r>
+        <w:rPr>
+          <w:rFonts w:hint="eastAsia"/>
+        </w:rPr>
+        <w:t xml:space="preserve">个交易日进行方向检查。结果显示，模型在</w:t>
+      </w:r>
+      <w:r>
+        <w:t xml:space="preserve"> 8 </w:t>
+      </w:r>
+      <w:r>
+        <w:rPr>
+          <w:rFonts w:hint="eastAsia"/>
+        </w:rPr>
+        <w:t xml:space="preserve">个交易日与真实价格同向同步变化，2</w:t>
+      </w:r>
+      <w:r>
+        <w:t xml:space="preserve"> </w:t>
+      </w:r>
+      <w:r>
+        <w:rPr>
+          <w:rFonts w:hint="eastAsia"/>
+        </w:rPr>
+        <w:t xml:space="preserve">个交易日体现为提前</w:t>
+      </w:r>
+      <w:r>
+        <w:t xml:space="preserve"> 1 </w:t>
+      </w:r>
+      <w:r>
+        <w:rPr>
+          <w:rFonts w:hint="eastAsia"/>
+        </w:rPr>
+        <w:t xml:space="preserve">日变化。这说明模型对主要冲击方向具有同步解释力，但个别日度噪声仍不能完全捕捉。</w:t>
+      </w:r>
+    </w:p>
+    <w:p>
+      <w:pPr>
+        <w:pStyle w:val="CaptionedFigure"/>
+      </w:pPr>
+      <w:r>
+        <w:drawing>
+          <wp:inline>
+            <wp:extent cx="4907280" cy="3568930"/>
+            <wp:effectExtent b="0" l="0" r="0" t="0"/>
+            <wp:docPr descr="" title="" id="65" name="Picture"/>
+            <a:graphic>
+              <a:graphicData uri="http://schemas.openxmlformats.org/drawingml/2006/picture">
+                <pic:pic>
+                  <pic:nvPicPr>
+                    <pic:cNvPr descr="短期模型拐点局部检验.png" id="66" name="Picture"/>
+                    <pic:cNvPicPr>
+                      <a:picLocks noChangeArrowheads="1" noChangeAspect="1"/>
+                    </pic:cNvPicPr>
+                  </pic:nvPicPr>
+                  <pic:blipFill>
+                    <a:blip r:embed="rId64"/>
+                    <a:stretch>
+                      <a:fillRect/>
+                    </a:stretch>
+                  </pic:blipFill>
+                  <pic:spPr bwMode="auto">
+                    <a:xfrm>
+                      <a:off x="0" y="0"/>
+                      <a:ext cx="4907280" cy="3568930"/>
+                    </a:xfrm>
+                    <a:prstGeom prst="rect">
+                      <a:avLst/>
+                    </a:prstGeom>
+                    <a:noFill/>
+                    <a:ln w="9525">
+                      <a:noFill/>
+                      <a:headEnd/>
+                      <a:tailEnd/>
+                    </a:ln>
+                  </pic:spPr>
+                </pic:pic>
+              </a:graphicData>
+            </a:graphic>
+          </wp:inline>
+        </w:drawing>
+      </w:r>
+    </w:p>
+    <w:p>
+      <w:pPr>
+        <w:pStyle w:val="ImageCaption"/>
+      </w:pPr>
+      <w:r>
+        <w:rPr>
+          <w:rFonts w:hint="eastAsia"/>
+        </w:rPr>
+        <w:t xml:space="preserve">短期模型拐点局部检验。图中放大前期暴涨窗口和后期反转窗口，用于检查模型是否慢半拍跟随真实价格。</w:t>
+      </w:r>
+    </w:p>
+    <w:p>
+      <w:pPr>
+        <w:pStyle w:val="BodyText"/>
+      </w:pPr>
+      <w:r>
+        <w:rPr>
+          <w:rFonts w:hint="eastAsia"/>
+        </w:rPr>
+        <w:t xml:space="preserve">本文还进行了历史高波动窗口边界检验：固定霍尔木兹机制参数，直接套用到</w:t>
+      </w:r>
+      <w:r>
+        <w:t xml:space="preserve"> 2020 </w:t>
+      </w:r>
+      <w:r>
+        <w:rPr>
+          <w:rFonts w:hint="eastAsia"/>
+        </w:rPr>
+        <w:t xml:space="preserve">年、2022</w:t>
+      </w:r>
+      <w:r>
+        <w:t xml:space="preserve"> </w:t>
+      </w:r>
+      <w:r>
+        <w:rPr>
+          <w:rFonts w:hint="eastAsia"/>
+        </w:rPr>
+        <w:t xml:space="preserve">年等非霍尔木兹事件窗口。结果显示，该模型在这些窗口通常显著弱于朴素上一日基准。这并不削弱本文结论，反而说明本文模型不是通用油价短线交易器，而是针对霍尔木兹封锁机制构建的事件解释模型。论文结论应限定在极端地缘冲突下的条件路径解释与情景预测，不能外推为普通时期的万能预测模型。</w:t>
+      </w:r>
+    </w:p>
+    <w:bookmarkEnd w:id="67"/>
+    <w:bookmarkStart w:id="71" w:name="参数自由度与稳健性区间"/>
+    <w:p>
+      <w:pPr>
+        <w:pStyle w:val="Heading2"/>
+      </w:pPr>
+      <w:r>
+        <w:rPr>
+          <w:rFonts w:hint="eastAsia"/>
+        </w:rPr>
+        <w:t xml:space="preserve">参数自由度与稳健性区间</w:t>
+      </w:r>
+    </w:p>
+    <w:p>
+      <w:pPr>
+        <w:pStyle w:val="FirstParagraph"/>
+      </w:pPr>
+      <w:r>
+        <w:rPr>
+          <w:rFonts w:hint="eastAsia"/>
+        </w:rPr>
+        <w:t xml:space="preserve">短期冲突窗口只有</w:t>
+      </w:r>
+      <w:r>
+        <w:t xml:space="preserve"> 46 </w:t>
+      </w:r>
+      <w:r>
+        <w:rPr>
+          <w:rFonts w:hint="eastAsia"/>
+        </w:rPr>
+        <w:t xml:space="preserve">个交易日，而连续校准参数共有</w:t>
+      </w:r>
+      <w:r>
+        <w:t xml:space="preserve"> 21 </w:t>
+      </w:r>
+      <w:r>
+        <w:rPr>
+          <w:rFonts w:hint="eastAsia"/>
+        </w:rPr>
+        <w:t xml:space="preserve">个，其中</w:t>
+      </w:r>
+      <w:r>
+        <w:t xml:space="preserve"> 10 </w:t>
+      </w:r>
+      <w:r>
+        <w:rPr>
+          <w:rFonts w:hint="eastAsia"/>
+        </w:rPr>
+        <w:t xml:space="preserve">个属于题面或机制范围内的物理/半物理参数，另外</w:t>
+      </w:r>
+      <w:r>
+        <w:t xml:space="preserve"> 11 </w:t>
+      </w:r>
+      <w:r>
+        <w:rPr>
+          <w:rFonts w:hint="eastAsia"/>
+        </w:rPr>
+        <w:t xml:space="preserve">个属于行为与价格调整参数。这个自由度并不低，因此本文不能只依赖最优曲线，而必须证明价格平台不是某一个偶然参数点调出来的结果。</w:t>
+      </w:r>
+    </w:p>
+    <w:p>
+      <w:pPr>
+        <w:pStyle w:val="TableCaption"/>
+      </w:pPr>
+      <m:oMath>
+        <m:r>
+          <m:rPr>
+            <m:sty m:val="p"/>
+          </m:rPr>
+          <m:t>±</m:t>
+        </m:r>
+        <m:r>
+          <m:t>15</m:t>
+        </m:r>
+        <m:r>
+          <m:rPr>
+            <m:sty m:val="p"/>
+          </m:rPr>
+          <m:t>%</m:t>
+        </m:r>
+      </m:oMath>
+      <w:r>
+        <w:t xml:space="preserve"> </w:t>
+      </w:r>
+      <w:r>
+        <w:rPr>
+          <w:rFonts w:hint="eastAsia"/>
+        </w:rPr>
+        <w:t xml:space="preserve">参数压力测试摘要</w:t>
+      </w:r>
+    </w:p>
+    <w:tbl>
+      <w:tblPr>
+        <w:tblStyle w:val="Table"/>
+        <w:tblW w:type="auto" w:w="0"/>
+        <w:tblLook w:firstRow="1" w:lastRow="0" w:firstColumn="0" w:lastColumn="0" w:noHBand="0" w:noVBand="0" w:val="0020"/>
+        <w:tblCaption w:val="\pm 15\% 参数压力测试摘要"/>
+      </w:tblPr>
+      <w:tblGrid>
+        <w:gridCol w:w="1584"/>
+        <w:gridCol w:w="1584"/>
+        <w:gridCol w:w="1584"/>
+        <w:gridCol w:w="1584"/>
+        <w:gridCol w:w="1584"/>
+      </w:tblGrid>
+      <w:tr>
+        <w:trPr>
+          <w:tblHeader w:val="on"/>
+        </w:trPr>
+        <w:tc>
+          <w:tcPr/>
+          <w:p>
+            <w:pPr>
+              <w:pStyle w:val="Compact"/>
+              <w:jc w:val="left"/>
+            </w:pPr>
+            <w:r>
+              <w:rPr>
+                <w:rFonts w:hint="eastAsia"/>
+              </w:rPr>
+              <w:t xml:space="preserve">指标</w:t>
+            </w:r>
+          </w:p>
+        </w:tc>
+        <w:tc>
+          <w:tcPr/>
+          <w:p>
+            <w:pPr>
+              <w:pStyle w:val="Compact"/>
+              <w:jc w:val="right"/>
+            </w:pPr>
+            <w:r>
+              <w:rPr>
+                <w:rFonts w:hint="eastAsia"/>
+              </w:rPr>
+              <w:t xml:space="preserve">均值</w:t>
+            </w:r>
+          </w:p>
+        </w:tc>
+        <w:tc>
+          <w:tcPr/>
+          <w:p>
+            <w:pPr>
+              <w:pStyle w:val="Compact"/>
+              <w:jc w:val="right"/>
+            </w:pPr>
+            <w:r>
+              <w:rPr>
+                <w:rFonts w:hint="eastAsia"/>
+              </w:rPr>
+              <w:t xml:space="preserve">中位数</w:t>
+            </w:r>
+          </w:p>
+        </w:tc>
+        <w:tc>
+          <w:tcPr/>
+          <w:p>
+            <w:pPr>
+              <w:pStyle w:val="Compact"/>
+              <w:jc w:val="right"/>
+            </w:pPr>
+            <w:r>
+              <w:rPr>
+                <w:rFonts w:hint="eastAsia"/>
+              </w:rPr>
+              <w:t xml:space="preserve">90%分位数</w:t>
+            </w:r>
+          </w:p>
+        </w:tc>
+        <w:tc>
+          <w:tcPr/>
+          <w:p>
+            <w:pPr>
+              <w:pStyle w:val="Compact"/>
+              <w:jc w:val="right"/>
+            </w:pPr>
+            <w:r>
+              <w:rPr>
+                <w:rFonts w:hint="eastAsia"/>
+              </w:rPr>
+              <w:t xml:space="preserve">最大值</w:t>
+            </w:r>
+          </w:p>
+        </w:tc>
+      </w:tr>
+      <w:tr>
+        <w:tc>
+          <w:tcPr/>
+          <w:p>
+            <w:pPr>
+              <w:pStyle w:val="Compact"/>
+              <w:jc w:val="left"/>
+            </w:pPr>
+            <w:r>
+              <w:t xml:space="preserve">RMSE</w:t>
+            </w:r>
+          </w:p>
+        </w:tc>
+        <w:tc>
+          <w:tcPr/>
+          <w:p>
+            <w:pPr>
+              <w:pStyle w:val="Compact"/>
+              <w:jc w:val="right"/>
+            </w:pPr>
+            <w:r>
+              <w:t xml:space="preserve">4.96</w:t>
+            </w:r>
+          </w:p>
+        </w:tc>
+        <w:tc>
+          <w:tcPr/>
+          <w:p>
+            <w:pPr>
+              <w:pStyle w:val="Compact"/>
+              <w:jc w:val="right"/>
+            </w:pPr>
+            <w:r>
+              <w:t xml:space="preserve">4.74</w:t>
+            </w:r>
+          </w:p>
+        </w:tc>
+        <w:tc>
+          <w:tcPr/>
+          <w:p>
+            <w:pPr>
+              <w:pStyle w:val="Compact"/>
+              <w:jc w:val="right"/>
+            </w:pPr>
+            <w:r>
+              <w:t xml:space="preserve">6.33</w:t>
+            </w:r>
+          </w:p>
+        </w:tc>
+        <w:tc>
+          <w:tcPr/>
+          <w:p>
+            <w:pPr>
+              <w:pStyle w:val="Compact"/>
+              <w:jc w:val="right"/>
+            </w:pPr>
+            <w:r>
+              <w:t xml:space="preserve">10.27</w:t>
+            </w:r>
+          </w:p>
+        </w:tc>
+      </w:tr>
+      <w:tr>
+        <w:tc>
+          <w:tcPr/>
+          <w:p>
+            <w:pPr>
+              <w:pStyle w:val="Compact"/>
+              <w:jc w:val="left"/>
+            </w:pPr>
+            <w:r>
+              <w:rPr>
+                <w:rFonts w:hint="eastAsia"/>
+              </w:rPr>
+              <w:t xml:space="preserve">模拟峰值</w:t>
+            </w:r>
+          </w:p>
+        </w:tc>
+        <w:tc>
+          <w:tcPr/>
+          <w:p>
+            <w:pPr>
+              <w:pStyle w:val="Compact"/>
+              <w:jc w:val="right"/>
+            </w:pPr>
+            <w:r>
+              <w:t xml:space="preserve">110.39</w:t>
+            </w:r>
+          </w:p>
+        </w:tc>
+        <w:tc>
+          <w:tcPr/>
+          <w:p>
+            <w:pPr>
+              <w:pStyle w:val="Compact"/>
+              <w:jc w:val="right"/>
+            </w:pPr>
+            <w:r>
+              <w:t xml:space="preserve">110.30</w:t>
+            </w:r>
+          </w:p>
+        </w:tc>
+        <w:tc>
+          <w:tcPr/>
+          <w:p>
+            <w:pPr>
+              <w:pStyle w:val="Compact"/>
+              <w:jc w:val="right"/>
+            </w:pPr>
+            <w:r>
+              <w:t xml:space="preserve">114.16</w:t>
+            </w:r>
+          </w:p>
+        </w:tc>
+        <w:tc>
+          <w:tcPr/>
+          <w:p>
+            <w:pPr>
+              <w:pStyle w:val="Compact"/>
+              <w:jc w:val="right"/>
+            </w:pPr>
+            <w:r>
+              <w:t xml:space="preserve">119.62</w:t>
+            </w:r>
+          </w:p>
+        </w:tc>
+      </w:tr>
+      <w:tr>
+        <w:tc>
+          <w:tcPr/>
+          <w:p>
+            <w:pPr>
+              <w:pStyle w:val="Compact"/>
+              <w:jc w:val="left"/>
+            </w:pPr>
+            <w:r>
+              <w:rPr>
+                <w:rFonts w:hint="eastAsia"/>
+              </w:rPr>
+              <w:t xml:space="preserve">模拟末日价格</w:t>
+            </w:r>
+          </w:p>
+        </w:tc>
+        <w:tc>
+          <w:tcPr/>
+          <w:p>
+            <w:pPr>
+              <w:pStyle w:val="Compact"/>
+              <w:jc w:val="right"/>
+            </w:pPr>
+            <w:r>
+              <w:t xml:space="preserve">110.39</w:t>
+            </w:r>
+          </w:p>
+        </w:tc>
+        <w:tc>
+          <w:tcPr/>
+          <w:p>
+            <w:pPr>
+              <w:pStyle w:val="Compact"/>
+              <w:jc w:val="right"/>
+            </w:pPr>
+            <w:r>
+              <w:t xml:space="preserve">110.30</w:t>
+            </w:r>
+          </w:p>
+        </w:tc>
+        <w:tc>
+          <w:tcPr/>
+          <w:p>
+            <w:pPr>
+              <w:pStyle w:val="Compact"/>
+              <w:jc w:val="right"/>
+            </w:pPr>
+            <w:r>
+              <w:t xml:space="preserve">114.16</w:t>
+            </w:r>
+          </w:p>
+        </w:tc>
+        <w:tc>
+          <w:tcPr/>
+          <w:p>
+            <w:pPr>
+              <w:pStyle w:val="Compact"/>
+              <w:jc w:val="right"/>
+            </w:pPr>
+            <w:r>
+              <w:t xml:space="preserve">119.62</w:t>
+            </w:r>
+          </w:p>
+        </w:tc>
+      </w:tr>
+      <w:tr>
+        <w:tc>
+          <w:tcPr/>
+          <w:p>
+            <w:pPr>
+              <w:pStyle w:val="Compact"/>
+              <w:jc w:val="left"/>
+            </w:pPr>
+            <w:r>
+              <w:rPr>
+                <w:rFonts w:hint="eastAsia"/>
+              </w:rPr>
+              <w:t xml:space="preserve">高价平台</w:t>
+            </w:r>
+            <w:r>
+              <w:t xml:space="preserve"> RMSE</w:t>
+            </w:r>
+          </w:p>
+        </w:tc>
+        <w:tc>
+          <w:tcPr/>
+          <w:p>
+            <w:pPr>
+              <w:pStyle w:val="Compact"/>
+              <w:jc w:val="right"/>
+            </w:pPr>
+            <w:r>
+              <w:t xml:space="preserve">3.90</w:t>
+            </w:r>
+          </w:p>
+        </w:tc>
+        <w:tc>
+          <w:tcPr/>
+          <w:p>
+            <w:pPr>
+              <w:pStyle w:val="Compact"/>
+              <w:jc w:val="right"/>
+            </w:pPr>
+            <w:r>
+              <w:t xml:space="preserve">3.36</w:t>
+            </w:r>
+          </w:p>
+        </w:tc>
+        <w:tc>
+          <w:tcPr/>
+          <w:p>
+            <w:pPr>
+              <w:pStyle w:val="Compact"/>
+              <w:jc w:val="right"/>
+            </w:pPr>
+            <w:r>
+              <w:t xml:space="preserve">6.84</w:t>
+            </w:r>
+          </w:p>
+        </w:tc>
+        <w:tc>
+          <w:tcPr/>
+          <w:p>
+            <w:pPr>
+              <w:pStyle w:val="Compact"/>
+              <w:jc w:val="right"/>
+            </w:pPr>
+            <w:r>
+              <w:t xml:space="preserve">11.84</w:t>
+            </w:r>
+          </w:p>
+        </w:tc>
+      </w:tr>
+      <w:tr>
+        <w:tc>
+          <w:tcPr/>
+          <w:p>
+            <w:pPr>
+              <w:pStyle w:val="Compact"/>
+              <w:jc w:val="left"/>
+            </w:pPr>
+            <w:r>
+              <w:rPr>
+                <w:rFonts w:hint="eastAsia"/>
+              </w:rPr>
+              <w:t xml:space="preserve">低价回落</w:t>
+            </w:r>
+            <w:r>
+              <w:t xml:space="preserve"> RMSE</w:t>
+            </w:r>
+          </w:p>
+        </w:tc>
+        <w:tc>
+          <w:tcPr/>
+          <w:p>
+            <w:pPr>
+              <w:pStyle w:val="Compact"/>
+              <w:jc w:val="right"/>
+            </w:pPr>
+            <w:r>
+              <w:t xml:space="preserve">4.98</w:t>
+            </w:r>
+          </w:p>
+        </w:tc>
+        <w:tc>
+          <w:tcPr/>
+          <w:p>
+            <w:pPr>
+              <w:pStyle w:val="Compact"/>
+              <w:jc w:val="right"/>
+            </w:pPr>
+            <w:r>
+              <w:t xml:space="preserve">4.63</w:t>
+            </w:r>
+          </w:p>
+        </w:tc>
+        <w:tc>
+          <w:tcPr/>
+          <w:p>
+            <w:pPr>
+              <w:pStyle w:val="Compact"/>
+              <w:jc w:val="right"/>
+            </w:pPr>
+            <w:r>
+              <w:t xml:space="preserve">7.71</w:t>
+            </w:r>
+          </w:p>
+        </w:tc>
+        <w:tc>
+          <w:tcPr/>
+          <w:p>
+            <w:pPr>
+              <w:pStyle w:val="Compact"/>
+              <w:jc w:val="right"/>
+            </w:pPr>
+            <w:r>
+              <w:t xml:space="preserve">11.60</w:t>
+            </w:r>
+          </w:p>
+        </w:tc>
+      </w:tr>
+    </w:tbl>
+    <w:p>
+      <w:pPr>
+        <w:pStyle w:val="BodyText"/>
+      </w:pPr>
+      <w:r>
+        <w:rPr>
+          <w:rFonts w:hint="eastAsia"/>
+        </w:rPr>
+        <w:t xml:space="preserve">压力测试显示，在</w:t>
+      </w:r>
+      <w:r>
+        <w:t xml:space="preserve"> 1000 </w:t>
+      </w:r>
+      <w:r>
+        <w:rPr>
+          <w:rFonts w:hint="eastAsia"/>
+        </w:rPr>
+        <w:t xml:space="preserve">组</w:t>
+      </w:r>
+      <w:r>
+        <w:t xml:space="preserve"> </w:t>
+      </w:r>
+      <m:oMath>
+        <m:r>
+          <m:rPr>
+            <m:sty m:val="p"/>
+          </m:rPr>
+          <m:t>±</m:t>
+        </m:r>
+        <m:r>
+          <m:t>15</m:t>
+        </m:r>
+        <m:r>
+          <m:rPr>
+            <m:sty m:val="p"/>
+          </m:rPr>
+          <m:t>%</m:t>
+        </m:r>
+      </m:oMath>
+      <w:r>
+        <w:t xml:space="preserve"> </w:t>
+      </w:r>
+      <w:r>
+        <w:rPr>
+          <w:rFonts w:hint="eastAsia"/>
+        </w:rPr>
+        <w:t xml:space="preserve">参数扰动中，61.0%</w:t>
+      </w:r>
+      <w:r>
+        <w:t xml:space="preserve"> </w:t>
+      </w:r>
+      <w:r>
+        <w:rPr>
+          <w:rFonts w:hint="eastAsia"/>
+        </w:rPr>
+        <w:t xml:space="preserve">的样本</w:t>
+      </w:r>
+      <w:r>
+        <w:t xml:space="preserve"> RMSE </w:t>
+      </w:r>
+      <w:r>
+        <w:rPr>
+          <w:rFonts w:hint="eastAsia"/>
+        </w:rPr>
+        <w:t xml:space="preserve">不高于</w:t>
+      </w:r>
+      <w:r>
+        <w:t xml:space="preserve"> </w:t>
+      </w:r>
+      <w:r>
+        <w:rPr>
+          <w:rFonts w:hint="eastAsia"/>
+        </w:rPr>
+        <w:t xml:space="preserve">5，96.6%</w:t>
+      </w:r>
+      <w:r>
+        <w:t xml:space="preserve"> </w:t>
+      </w:r>
+      <w:r>
+        <w:rPr>
+          <w:rFonts w:hint="eastAsia"/>
+        </w:rPr>
+        <w:t xml:space="preserve">的样本模拟峰值落在</w:t>
+      </w:r>
+      <w:r>
+        <w:t xml:space="preserve"> 105–125 </w:t>
+      </w:r>
+      <w:r>
+        <w:rPr>
+          <w:rFonts w:hint="eastAsia"/>
+        </w:rPr>
+        <w:t xml:space="preserve">美元/桶区间，全部样本末日价格落在</w:t>
+      </w:r>
+      <w:r>
+        <w:t xml:space="preserve"> 100–120 </w:t>
+      </w:r>
+      <w:r>
+        <w:rPr>
+          <w:rFonts w:hint="eastAsia"/>
+        </w:rPr>
+        <w:t xml:space="preserve">美元/桶区间。这个结果意味着，价格平台并不依赖唯一一组</w:t>
+      </w:r>
+      <w:r>
+        <w:rPr>
+          <w:rFonts w:hint="eastAsia"/>
+        </w:rPr>
+        <w:t xml:space="preserve">“神奇参数”</w:t>
+      </w:r>
+      <w:r>
+        <w:rPr>
+          <w:rFonts w:hint="eastAsia"/>
+        </w:rPr>
+        <w:t xml:space="preserve">；但较大扰动会削弱</w:t>
+      </w:r>
+      <w:r>
+        <w:t xml:space="preserve"> RMSE </w:t>
+      </w:r>
+      <w:r>
+        <w:rPr>
+          <w:rFonts w:hint="eastAsia"/>
+        </w:rPr>
+        <w:t xml:space="preserve">表现，因此本文只主张模型具有结构性稳健性，不主张任意参数下都能保持高精度。</w:t>
+      </w:r>
+    </w:p>
+    <w:p>
+      <w:pPr>
+        <w:pStyle w:val="CaptionedFigure"/>
+      </w:pPr>
+      <w:r>
+        <w:drawing>
+          <wp:inline>
+            <wp:extent cx="4907280" cy="2587474"/>
+            <wp:effectExtent b="0" l="0" r="0" t="0"/>
+            <wp:docPr descr="" title="" id="69" name="Picture"/>
+            <a:graphic>
+              <a:graphicData uri="http://schemas.openxmlformats.org/drawingml/2006/picture">
+                <pic:pic>
+                  <pic:nvPicPr>
+                    <pic:cNvPr descr="短期模型稳健性带.png" id="70" name="Picture"/>
+                    <pic:cNvPicPr>
+                      <a:picLocks noChangeArrowheads="1" noChangeAspect="1"/>
+                    </pic:cNvPicPr>
+                  </pic:nvPicPr>
+                  <pic:blipFill>
+                    <a:blip r:embed="rId68"/>
+                    <a:stretch>
+                      <a:fillRect/>
+                    </a:stretch>
+                  </pic:blipFill>
+                  <pic:spPr bwMode="auto">
+                    <a:xfrm>
+                      <a:off x="0" y="0"/>
+                      <a:ext cx="4907280" cy="2587474"/>
+                    </a:xfrm>
+                    <a:prstGeom prst="rect">
+                      <a:avLst/>
+                    </a:prstGeom>
+                    <a:noFill/>
+                    <a:ln w="9525">
+                      <a:noFill/>
+                      <a:headEnd/>
+                      <a:tailEnd/>
+                    </a:ln>
+                  </pic:spPr>
+                </pic:pic>
+              </a:graphicData>
+            </a:graphic>
+          </wp:inline>
+        </w:drawing>
+      </w:r>
+    </w:p>
+    <w:p>
+      <w:pPr>
+        <w:pStyle w:val="ImageCaption"/>
+      </w:pPr>
+      <w:r>
+        <w:rPr>
+          <w:rFonts w:hint="eastAsia"/>
+        </w:rPr>
+        <w:t xml:space="preserve">短期模型局部扰动稳健性区间。蓝色区间表示优秀扰动样本的价格分布，红线为综合最优模型，黑线为实际收盘价。</w:t>
+      </w:r>
+    </w:p>
+    <w:p>
+      <w:pPr>
+        <w:pStyle w:val="BodyText"/>
+      </w:pPr>
+      <w:r>
+        <w:rPr>
+          <w:rFonts w:hint="eastAsia"/>
+        </w:rPr>
+        <w:t xml:space="preserve">围绕综合最优参数进行的</w:t>
+      </w:r>
+      <w:r>
+        <w:t xml:space="preserve"> 800 </w:t>
+      </w:r>
+      <w:r>
+        <w:rPr>
+          <w:rFonts w:hint="eastAsia"/>
+        </w:rPr>
+        <w:t xml:space="preserve">组局部扰动进一步显示，在</w:t>
+      </w:r>
+      <w:r>
+        <w:t xml:space="preserve"> 801 </w:t>
+      </w:r>
+      <w:r>
+        <w:rPr>
+          <w:rFonts w:hint="eastAsia"/>
+        </w:rPr>
+        <w:t xml:space="preserve">组样本中，99.4%</w:t>
+      </w:r>
+      <w:r>
+        <w:t xml:space="preserve"> </w:t>
+      </w:r>
+      <w:r>
+        <w:rPr>
+          <w:rFonts w:hint="eastAsia"/>
+        </w:rPr>
+        <w:t xml:space="preserve">的样本同时满足</w:t>
+      </w:r>
+      <w:r>
+        <w:t xml:space="preserve"> RMSE </w:t>
+      </w:r>
+      <w:r>
+        <w:rPr>
+          <w:rFonts w:hint="eastAsia"/>
+        </w:rPr>
+        <w:t xml:space="preserve">不高于</w:t>
+      </w:r>
+      <w:r>
+        <w:t xml:space="preserve"> </w:t>
+      </w:r>
+      <w:r>
+        <w:rPr>
+          <w:rFonts w:hint="eastAsia"/>
+        </w:rPr>
+        <w:t xml:space="preserve">5、高价平台</w:t>
+      </w:r>
+      <w:r>
+        <w:t xml:space="preserve"> RMSE </w:t>
+      </w:r>
+      <w:r>
+        <w:rPr>
+          <w:rFonts w:hint="eastAsia"/>
+        </w:rPr>
+        <w:t xml:space="preserve">不高于</w:t>
+      </w:r>
+      <w:r>
+        <w:t xml:space="preserve"> </w:t>
+      </w:r>
+      <w:r>
+        <w:rPr>
+          <w:rFonts w:hint="eastAsia"/>
+        </w:rPr>
+        <w:t xml:space="preserve">5、低价回落</w:t>
+      </w:r>
+      <w:r>
+        <w:t xml:space="preserve"> RMSE </w:t>
+      </w:r>
+      <w:r>
+        <w:rPr>
+          <w:rFonts w:hint="eastAsia"/>
+        </w:rPr>
+        <w:t xml:space="preserve">不高于</w:t>
+      </w:r>
+      <w:r>
+        <w:t xml:space="preserve"> </w:t>
+      </w:r>
+      <w:r>
+        <w:rPr>
+          <w:rFonts w:hint="eastAsia"/>
+        </w:rPr>
+        <w:t xml:space="preserve">6、后期</w:t>
+      </w:r>
+      <w:r>
+        <w:t xml:space="preserve"> RMSE </w:t>
+      </w:r>
+      <w:r>
+        <w:rPr>
+          <w:rFonts w:hint="eastAsia"/>
+        </w:rPr>
+        <w:t xml:space="preserve">不高于</w:t>
+      </w:r>
+      <w:r>
+        <w:t xml:space="preserve"> 5 </w:t>
+      </w:r>
+      <w:r>
+        <w:rPr>
+          <w:rFonts w:hint="eastAsia"/>
+        </w:rPr>
+        <w:t xml:space="preserve">的优秀阈值。优秀扰动样本的</w:t>
+      </w:r>
+      <w:r>
+        <w:t xml:space="preserve"> 10%–90% </w:t>
+      </w:r>
+      <w:r>
+        <w:rPr>
+          <w:rFonts w:hint="eastAsia"/>
+        </w:rPr>
+        <w:t xml:space="preserve">价格带平均宽度为</w:t>
+      </w:r>
+      <w:r>
+        <w:t xml:space="preserve"> 2.18 </w:t>
+      </w:r>
+      <w:r>
+        <w:rPr>
+          <w:rFonts w:hint="eastAsia"/>
+        </w:rPr>
+        <w:t xml:space="preserve">美元/桶，最大宽度为</w:t>
+      </w:r>
+      <w:r>
+        <w:t xml:space="preserve"> 3.01 </w:t>
+      </w:r>
+      <w:r>
+        <w:rPr>
+          <w:rFonts w:hint="eastAsia"/>
+        </w:rPr>
+        <w:t xml:space="preserve">美元/桶，说明最优参数附近存在稳定的优秀参数邻域。</w:t>
+      </w:r>
+    </w:p>
+    <w:bookmarkEnd w:id="71"/>
+    <w:bookmarkStart w:id="72" w:name="内生性反事实基准与硬编码审计"/>
+    <w:p>
+      <w:pPr>
+        <w:pStyle w:val="Heading2"/>
+      </w:pPr>
+      <w:r>
+        <w:rPr>
+          <w:rFonts w:hint="eastAsia"/>
+        </w:rPr>
+        <w:t xml:space="preserve">内生性、反事实基准与硬编码审计</w:t>
+      </w:r>
+    </w:p>
+    <w:p>
+      <w:pPr>
+        <w:pStyle w:val="FirstParagraph"/>
+      </w:pPr>
+      <w:r>
+        <w:rPr>
+          <w:rFonts w:hint="eastAsia"/>
+        </w:rPr>
+        <w:t xml:space="preserve">关于恐慌变量的内生性问题，本文当前没有使用</w:t>
+      </w:r>
+      <w:r>
+        <w:t xml:space="preserve"> AI Agent </w:t>
+      </w:r>
+      <w:r>
+        <w:rPr>
+          <w:rFonts w:hint="eastAsia"/>
+        </w:rPr>
+        <w:t xml:space="preserve">新闻爬虫数据，也没有把新闻情绪序列作为模型输入。模型中的恐慌初始强度和恐慌衰减速度只是用于刻画冲突初期风险溢价衰减的校准参数，而不是由新闻文本统计得到的外生恐慌指数。因此，</w:t>
+      </w:r>
+      <w:r>
+        <w:rPr>
+          <w:rFonts w:hint="eastAsia"/>
+        </w:rPr>
+        <w:t xml:space="preserve">“油价上涨导致新闻恐慌、新闻恐慌再解释油价上涨”</w:t>
+      </w:r>
+      <w:r>
+        <w:rPr>
+          <w:rFonts w:hint="eastAsia"/>
+        </w:rPr>
+        <w:t xml:space="preserve">的同日反馈循环并不构成当前模型的直接识别问题。若后续加入新闻情绪模块，则必须使用</w:t>
+      </w:r>
+      <w:r>
+        <w:t xml:space="preserve"> </w:t>
+      </w:r>
+      <m:oMath>
+        <m:r>
+          <m:t>t</m:t>
+        </m:r>
+        <m:r>
+          <m:rPr>
+            <m:sty m:val="p"/>
+          </m:rPr>
+          <m:t>−</m:t>
+        </m:r>
+        <m:r>
+          <m:t>1</m:t>
+        </m:r>
+      </m:oMath>
+      <w:r>
+        <w:t xml:space="preserve"> </w:t>
+      </w:r>
+      <w:r>
+        <w:rPr>
+          <w:rFonts w:hint="eastAsia"/>
+        </w:rPr>
+        <w:t xml:space="preserve">期或闭市前新闻解释</w:t>
+      </w:r>
+      <w:r>
+        <w:t xml:space="preserve"> </w:t>
+      </w:r>
+      <m:oMath>
+        <m:r>
+          <m:t>t</m:t>
+        </m:r>
+      </m:oMath>
+      <w:r>
+        <w:t xml:space="preserve"> </w:t>
+      </w:r>
+      <w:r>
+        <w:rPr>
+          <w:rFonts w:hint="eastAsia"/>
+        </w:rPr>
+        <w:t xml:space="preserve">日价格，并进行格兰杰因果或滞后相关检验，不能直接把当日新闻情绪当作外生预测变量。</w:t>
+      </w:r>
+    </w:p>
+    <w:p>
+      <w:pPr>
+        <w:pStyle w:val="BodyText"/>
+      </w:pPr>
+      <w:r>
+        <w:rPr>
+          <w:rFonts w:hint="eastAsia"/>
+        </w:rPr>
+        <w:t xml:space="preserve">关于</w:t>
+      </w:r>
+      <w:r>
+        <w:t xml:space="preserve"> 200 </w:t>
+      </w:r>
+      <w:r>
+        <w:rPr>
+          <w:rFonts w:hint="eastAsia"/>
+        </w:rPr>
+        <w:t xml:space="preserve">美元以上反事实基准，本文也不把它写成现实市场必然价格。传统供需模型的高价结果来自低短期弹性条件下的反事实上界，而不是现实预测。弹性敏感性检验显示，当需求价格弹性由</w:t>
+      </w:r>
+      <w:r>
+        <w:t xml:space="preserve"> </w:t>
+      </w:r>
+      <m:oMath>
+        <m:r>
+          <m:rPr>
+            <m:sty m:val="p"/>
+          </m:rPr>
+          <m:t>−</m:t>
+        </m:r>
+        <m:r>
+          <m:t>0.05</m:t>
+        </m:r>
+      </m:oMath>
+      <w:r>
+        <w:t xml:space="preserve"> </w:t>
+      </w:r>
+      <w:r>
+        <w:rPr>
+          <w:rFonts w:hint="eastAsia"/>
+        </w:rPr>
+        <w:t xml:space="preserve">放宽至</w:t>
+      </w:r>
+      <w:r>
+        <w:t xml:space="preserve"> </w:t>
+      </w:r>
+      <m:oMath>
+        <m:r>
+          <m:rPr>
+            <m:sty m:val="p"/>
+          </m:rPr>
+          <m:t>−</m:t>
+        </m:r>
+        <m:r>
+          <m:t>0.25</m:t>
+        </m:r>
+      </m:oMath>
+      <w:r>
+        <w:t xml:space="preserve"> </w:t>
+      </w:r>
+      <w:r>
+        <w:rPr>
+          <w:rFonts w:hint="eastAsia"/>
+        </w:rPr>
+        <w:t xml:space="preserve">或</w:t>
+      </w:r>
+      <w:r>
+        <w:t xml:space="preserve"> </w:t>
+      </w:r>
+      <m:oMath>
+        <m:r>
+          <m:rPr>
+            <m:sty m:val="p"/>
+          </m:rPr>
+          <m:t>−</m:t>
+        </m:r>
+        <m:r>
+          <m:t>0.35</m:t>
+        </m:r>
+      </m:oMath>
+      <w:r>
+        <w:t xml:space="preserve"> </w:t>
+      </w:r>
+      <w:r>
+        <w:rPr>
+          <w:rFonts w:hint="eastAsia"/>
+        </w:rPr>
+        <w:t xml:space="preserve">时，传统线性化模型价格会明显下降，部分情景已经接近或低于</w:t>
+      </w:r>
+      <w:r>
+        <w:t xml:space="preserve"> 120 </w:t>
+      </w:r>
+      <w:r>
+        <w:rPr>
+          <w:rFonts w:hint="eastAsia"/>
+        </w:rPr>
+        <w:t xml:space="preserve">美元/桶。因此，本文真正要论证的不是</w:t>
+      </w:r>
+      <w:r>
+        <w:rPr>
+          <w:rFonts w:hint="eastAsia"/>
+        </w:rPr>
+        <w:t xml:space="preserve">“油价必然应该超过</w:t>
+      </w:r>
+      <w:r>
+        <w:t xml:space="preserve"> 200 </w:t>
+      </w:r>
+      <w:r>
+        <w:rPr>
+          <w:rFonts w:hint="eastAsia"/>
+        </w:rPr>
+        <w:t xml:space="preserve">美元”</w:t>
+      </w:r>
+      <w:r>
+        <w:rPr>
+          <w:rFonts w:hint="eastAsia"/>
+        </w:rPr>
+        <w:t xml:space="preserve">，而是</w:t>
+      </w:r>
+      <w:r>
+        <w:rPr>
+          <w:rFonts w:hint="eastAsia"/>
+        </w:rPr>
+        <w:t xml:space="preserve">“低短期弹性静态供需模型会显著高估现实价格，必须引入库存、SPR、绕道、需求收缩和预期修复等动态机制解释现实平台”</w:t>
+      </w:r>
+      <w:r>
+        <w:t xml:space="preserve">。</w:t>
+      </w:r>
+    </w:p>
+    <w:p>
+      <w:pPr>
+        <w:pStyle w:val="BodyText"/>
+      </w:pPr>
+      <w:r>
+        <w:rPr>
+          <w:rFonts w:hint="eastAsia"/>
+        </w:rPr>
+        <w:t xml:space="preserve">最后，本文对代码进行硬编码审计。短期动态递推函数中不存在</w:t>
+      </w:r>
+      <w:r>
+        <w:t xml:space="preserve"> </w:t>
+      </w:r>
+      <m:oMath>
+        <m:sSub>
+          <m:e>
+            <m:r>
+              <m:t>P</m:t>
+            </m:r>
+          </m:e>
+          <m:sub>
+            <m:r>
+              <m:t>t</m:t>
+            </m:r>
+          </m:sub>
+        </m:sSub>
+        <m:r>
+          <m:rPr>
+            <m:sty m:val="p"/>
+          </m:rPr>
+          <m:t>&gt;</m:t>
+        </m:r>
+        <m:r>
+          <m:t>120</m:t>
+        </m:r>
+      </m:oMath>
+      <w:r>
+        <w:t xml:space="preserve"> </w:t>
+      </w:r>
+      <w:r>
+        <w:rPr>
+          <w:rFonts w:hint="eastAsia"/>
+        </w:rPr>
+        <w:t xml:space="preserve">后强制压低价格的条件分支，也没有将</w:t>
+      </w:r>
+      <w:r>
+        <w:t xml:space="preserve"> 120 </w:t>
+      </w:r>
+      <w:r>
+        <w:rPr>
+          <w:rFonts w:hint="eastAsia"/>
+        </w:rPr>
+        <w:t xml:space="preserve">美元设置为价格上限。模型中的数值安全裁剪上限为</w:t>
+      </w:r>
+      <w:r>
+        <w:t xml:space="preserve"> 180 </w:t>
+      </w:r>
+      <w:r>
+        <w:rPr>
+          <w:rFonts w:hint="eastAsia"/>
+        </w:rPr>
+        <w:t xml:space="preserve">美元/桶，校准路径中从未触发；110–120</w:t>
+      </w:r>
+      <w:r>
+        <w:t xml:space="preserve"> </w:t>
+      </w:r>
+      <w:r>
+        <w:rPr>
+          <w:rFonts w:hint="eastAsia"/>
+        </w:rPr>
+        <w:t xml:space="preserve">美元只作为题面观测参考区间出现在图表阴影和展示配置中，不参与价格递推计算。需要强调的是，当前模型也不是严格意义上的微观多智能体涌现模型，更准确的表述应是机制递推模型；本文可以证明</w:t>
+      </w:r>
+      <w:r>
+        <w:t xml:space="preserve"> 120 </w:t>
+      </w:r>
+      <w:r>
+        <w:rPr>
+          <w:rFonts w:hint="eastAsia"/>
+        </w:rPr>
+        <w:t xml:space="preserve">美元平台不是代码硬上限，但不应声称已经实现了多智能体动态纳什均衡。</w:t>
+      </w:r>
+    </w:p>
+    <w:bookmarkEnd w:id="72"/>
+    <w:bookmarkEnd w:id="73"/>
+    <w:bookmarkStart w:id="82" w:name="天三情景预测"/>
     <w:p>
       <w:pPr>
         <w:pStyle w:val="Heading1"/>
@@ -7211,7 +9680,7 @@
         <w:t xml:space="preserve">天三情景预测</w:t>
       </w:r>
     </w:p>
-    <w:bookmarkStart w:id="57" w:name="情景设定"/>
+    <w:bookmarkStart w:id="74" w:name="情景设定"/>
     <w:p>
       <w:pPr>
         <w:pStyle w:val="Heading2"/>
@@ -7687,8 +10156,8 @@
         </w:tc>
       </w:tr>
     </w:tbl>
-    <w:bookmarkEnd w:id="57"/>
-    <w:bookmarkStart w:id="64" w:name="预测结果"/>
+    <w:bookmarkEnd w:id="74"/>
+    <w:bookmarkStart w:id="81" w:name="预测结果"/>
     <w:p>
       <w:pPr>
         <w:pStyle w:val="Heading2"/>
@@ -8178,18 +10647,18 @@
           <wp:inline>
             <wp:extent cx="4907280" cy="2645664"/>
             <wp:effectExtent b="0" l="0" r="0" t="0"/>
-            <wp:docPr descr="" title="" id="59" name="Picture"/>
+            <wp:docPr descr="" title="" id="76" name="Picture"/>
             <a:graphic>
               <a:graphicData uri="http://schemas.openxmlformats.org/drawingml/2006/picture">
                 <pic:pic>
                   <pic:nvPicPr>
-                    <pic:cNvPr descr="scenario_price_paths.png" id="60" name="Picture"/>
+                    <pic:cNvPr descr="scenario_price_paths.png" id="77" name="Picture"/>
                     <pic:cNvPicPr>
                       <a:picLocks noChangeArrowheads="1" noChangeAspect="1"/>
                     </pic:cNvPicPr>
                   </pic:nvPicPr>
                   <pic:blipFill>
-                    <a:blip r:embed="rId58"/>
+                    <a:blip r:embed="rId75"/>
                     <a:stretch>
                       <a:fillRect/>
                     </a:stretch>
@@ -8310,18 +10779,18 @@
           <wp:inline>
             <wp:extent cx="4907280" cy="3413760"/>
             <wp:effectExtent b="0" l="0" r="0" t="0"/>
-            <wp:docPr descr="" title="" id="62" name="Picture"/>
+            <wp:docPr descr="" title="" id="79" name="Picture"/>
             <a:graphic>
               <a:graphicData uri="http://schemas.openxmlformats.org/drawingml/2006/picture">
                 <pic:pic>
                   <pic:nvPicPr>
-                    <pic:cNvPr descr="inventory_depletion_risk.png" id="63" name="Picture"/>
+                    <pic:cNvPr descr="inventory_depletion_risk.png" id="80" name="Picture"/>
                     <pic:cNvPicPr>
                       <a:picLocks noChangeArrowheads="1" noChangeAspect="1"/>
                     </pic:cNvPicPr>
                   </pic:nvPicPr>
                   <pic:blipFill>
-                    <a:blip r:embed="rId61"/>
+                    <a:blip r:embed="rId78"/>
                     <a:stretch>
                       <a:fillRect/>
                     </a:stretch>
@@ -8359,9 +10828,9 @@
         <w:t xml:space="preserve">商业库存剩余量与剩余供需缺口变化。悲观情景下缓冲能力下降，二次跳涨风险上升。</w:t>
       </w:r>
     </w:p>
-    <w:bookmarkEnd w:id="64"/>
-    <w:bookmarkEnd w:id="65"/>
-    <w:bookmarkStart w:id="74" w:name="敏感性分析"/>
+    <w:bookmarkEnd w:id="81"/>
+    <w:bookmarkEnd w:id="82"/>
+    <w:bookmarkStart w:id="91" w:name="敏感性分析"/>
     <w:p>
       <w:pPr>
         <w:pStyle w:val="Heading1"/>
@@ -8373,7 +10842,7 @@
         <w:t xml:space="preserve">敏感性分析</w:t>
       </w:r>
     </w:p>
-    <w:bookmarkStart w:id="66" w:name="分析方法"/>
+    <w:bookmarkStart w:id="83" w:name="分析方法"/>
     <w:p>
       <w:pPr>
         <w:pStyle w:val="Heading2"/>
@@ -8660,8 +11129,8 @@
         <w:t xml:space="preserve">天剩余缺口波动范围。该指标兼顾终点价格、阶段峰值和供需风险。</w:t>
       </w:r>
     </w:p>
-    <w:bookmarkEnd w:id="66"/>
-    <w:bookmarkStart w:id="73" w:name="参数重要性排序"/>
+    <w:bookmarkEnd w:id="83"/>
+    <w:bookmarkStart w:id="90" w:name="参数重要性排序"/>
     <w:p>
       <w:pPr>
         <w:pStyle w:val="Heading2"/>
@@ -9453,18 +11922,18 @@
           <wp:inline>
             <wp:extent cx="4907280" cy="2998893"/>
             <wp:effectExtent b="0" l="0" r="0" t="0"/>
-            <wp:docPr descr="" title="" id="68" name="Picture"/>
+            <wp:docPr descr="" title="" id="85" name="Picture"/>
             <a:graphic>
               <a:graphicData uri="http://schemas.openxmlformats.org/drawingml/2006/picture">
                 <pic:pic>
                   <pic:nvPicPr>
-                    <pic:cNvPr descr="sensitivity_tornado_180day.png" id="69" name="Picture"/>
+                    <pic:cNvPr descr="sensitivity_tornado_180day.png" id="86" name="Picture"/>
                     <pic:cNvPicPr>
                       <a:picLocks noChangeArrowheads="1" noChangeAspect="1"/>
                     </pic:cNvPicPr>
                   </pic:nvPicPr>
                   <pic:blipFill>
-                    <a:blip r:embed="rId67"/>
+                    <a:blip r:embed="rId84"/>
                     <a:stretch>
                       <a:fillRect/>
                     </a:stretch>
@@ -9520,18 +11989,18 @@
           <wp:inline>
             <wp:extent cx="4907280" cy="1599409"/>
             <wp:effectExtent b="0" l="0" r="0" t="0"/>
-            <wp:docPr descr="" title="" id="71" name="Picture"/>
+            <wp:docPr descr="" title="" id="88" name="Picture"/>
             <a:graphic>
               <a:graphicData uri="http://schemas.openxmlformats.org/drawingml/2006/picture">
                 <pic:pic>
                   <pic:nvPicPr>
-                    <pic:cNvPr descr="sensitivity_parameter_response.png" id="72" name="Picture"/>
+                    <pic:cNvPr descr="sensitivity_parameter_response.png" id="89" name="Picture"/>
                     <pic:cNvPicPr>
                       <a:picLocks noChangeArrowheads="1" noChangeAspect="1"/>
                     </pic:cNvPicPr>
                   </pic:nvPicPr>
                   <pic:blipFill>
-                    <a:blip r:embed="rId70"/>
+                    <a:blip r:embed="rId87"/>
                     <a:stretch>
                       <a:fillRect/>
                     </a:stretch>
@@ -9631,9 +12100,9 @@
         <w:t xml:space="preserve">的政策缓冲变量。</w:t>
       </w:r>
     </w:p>
-    <w:bookmarkEnd w:id="73"/>
-    <w:bookmarkEnd w:id="74"/>
-    <w:bookmarkStart w:id="77" w:name="模型评价"/>
+    <w:bookmarkEnd w:id="90"/>
+    <w:bookmarkEnd w:id="91"/>
+    <w:bookmarkStart w:id="94" w:name="模型评价"/>
     <w:p>
       <w:pPr>
         <w:pStyle w:val="Heading1"/>
@@ -9645,7 +12114,7 @@
         <w:t xml:space="preserve">模型评价</w:t>
       </w:r>
     </w:p>
-    <w:bookmarkStart w:id="75" w:name="优点"/>
+    <w:bookmarkStart w:id="92" w:name="优点"/>
     <w:p>
       <w:pPr>
         <w:pStyle w:val="Heading2"/>
@@ -9749,8 +12218,8 @@
         <w:t xml:space="preserve">CSV；外推阶段明确标注为情景预测，不作为真实观测。</w:t>
       </w:r>
     </w:p>
-    <w:bookmarkEnd w:id="75"/>
-    <w:bookmarkStart w:id="76" w:name="局限性"/>
+    <w:bookmarkEnd w:id="92"/>
+    <w:bookmarkStart w:id="93" w:name="局限性"/>
     <w:p>
       <w:pPr>
         <w:pStyle w:val="Heading2"/>
@@ -9813,9 +12282,9 @@
         <w:t xml:space="preserve">单因素敏感性不能完全描述参数联动风险，因此悲观情景仍是判断二次跳涨风险的重要补充。</w:t>
       </w:r>
     </w:p>
-    <w:bookmarkEnd w:id="76"/>
-    <w:bookmarkEnd w:id="77"/>
-    <w:bookmarkStart w:id="79" w:name="结论"/>
+    <w:bookmarkEnd w:id="93"/>
+    <w:bookmarkEnd w:id="94"/>
+    <w:bookmarkStart w:id="96" w:name="结论"/>
     <w:p>
       <w:pPr>
         <w:pStyle w:val="Heading1"/>
@@ -10214,7 +12683,7 @@
       <w:r>
         <w:t xml:space="preserve"> </w:t>
       </w:r>
-      <w:hyperlink r:id="rId78">
+      <w:hyperlink r:id="rId95">
         <w:r>
           <w:rPr>
             <w:rStyle w:val="Hyperlink"/>
@@ -10223,7 +12692,7 @@
         </w:r>
       </w:hyperlink>
     </w:p>
-    <w:bookmarkEnd w:id="79"/>
+    <w:bookmarkEnd w:id="96"/>
     <w:sectPr>
       <w:footnotePr>
         <w:numRestart w:val="eachSect"/>

</xml_diff>

<commit_message>
Strengthen long-term forecast section
</commit_message>
<xml_diff>
--- a/output/final/总论文.docx
+++ b/output/final/总论文.docx
@@ -524,6 +524,234 @@
         <w:t xml:space="preserve">天三情景预测，并通过敏感性分析识别关键变量。</w:t>
       </w:r>
     </w:p>
+    <w:p>
+      <w:pPr>
+        <w:pStyle w:val="TableCaption"/>
+      </w:pPr>
+      <w:r>
+        <w:rPr>
+          <w:rFonts w:hint="eastAsia"/>
+        </w:rPr>
+        <w:t xml:space="preserve">赛题任务与本文模型回应</w:t>
+      </w:r>
+    </w:p>
+    <w:tbl>
+      <w:tblPr>
+        <w:tblStyle w:val="Table"/>
+        <w:tblW w:type="auto" w:w="0"/>
+        <w:tblLook w:firstRow="1" w:lastRow="0" w:firstColumn="0" w:lastColumn="0" w:noHBand="0" w:noVBand="0" w:val="0020"/>
+        <w:tblCaption w:val="赛题任务与本文模型回应"/>
+      </w:tblPr>
+      <w:tblGrid>
+        <w:gridCol w:w="2640"/>
+        <w:gridCol w:w="2640"/>
+        <w:gridCol w:w="2640"/>
+      </w:tblGrid>
+      <w:tr>
+        <w:trPr>
+          <w:tblHeader w:val="on"/>
+        </w:trPr>
+        <w:tc>
+          <w:tcPr/>
+          <w:p>
+            <w:pPr>
+              <w:pStyle w:val="Compact"/>
+              <w:jc w:val="left"/>
+            </w:pPr>
+            <w:r>
+              <w:rPr>
+                <w:rFonts w:hint="eastAsia"/>
+              </w:rPr>
+              <w:t xml:space="preserve">赛题要求</w:t>
+            </w:r>
+          </w:p>
+        </w:tc>
+        <w:tc>
+          <w:tcPr/>
+          <w:p>
+            <w:pPr>
+              <w:pStyle w:val="Compact"/>
+              <w:jc w:val="left"/>
+            </w:pPr>
+            <w:r>
+              <w:rPr>
+                <w:rFonts w:hint="eastAsia"/>
+              </w:rPr>
+              <w:t xml:space="preserve">题面重点</w:t>
+            </w:r>
+          </w:p>
+        </w:tc>
+        <w:tc>
+          <w:tcPr/>
+          <w:p>
+            <w:pPr>
+              <w:pStyle w:val="Compact"/>
+              <w:jc w:val="left"/>
+            </w:pPr>
+            <w:r>
+              <w:rPr>
+                <w:rFonts w:hint="eastAsia"/>
+              </w:rPr>
+              <w:t xml:space="preserve">本文回应</w:t>
+            </w:r>
+          </w:p>
+        </w:tc>
+      </w:tr>
+      <w:tr>
+        <w:tc>
+          <w:tcPr/>
+          <w:p>
+            <w:pPr>
+              <w:pStyle w:val="Compact"/>
+              <w:jc w:val="left"/>
+            </w:pPr>
+            <w:r>
+              <w:rPr>
+                <w:rFonts w:hint="eastAsia"/>
+              </w:rPr>
+              <w:t xml:space="preserve">任务</w:t>
+            </w:r>
+            <w:r>
+              <w:t xml:space="preserve"> 1</w:t>
+            </w:r>
+          </w:p>
+        </w:tc>
+        <w:tc>
+          <w:tcPr/>
+          <w:p>
+            <w:pPr>
+              <w:pStyle w:val="Compact"/>
+              <w:jc w:val="left"/>
+            </w:pPr>
+            <w:r>
+              <w:rPr>
+                <w:rFonts w:hint="eastAsia"/>
+              </w:rPr>
+              <w:t xml:space="preserve">建立</w:t>
+            </w:r>
+            <w:r>
+              <w:t xml:space="preserve"> 0–60 </w:t>
+            </w:r>
+            <w:r>
+              <w:rPr>
+                <w:rFonts w:hint="eastAsia"/>
+              </w:rPr>
+              <w:t xml:space="preserve">天日度供需平衡模型，使用附件布伦特原油价格数据，并考虑供应中断、SPR、库存、绕道、恐慌需求和短期弹性。</w:t>
+            </w:r>
+          </w:p>
+        </w:tc>
+        <w:tc>
+          <w:tcPr/>
+          <w:p>
+            <w:pPr>
+              <w:pStyle w:val="Compact"/>
+              <w:jc w:val="left"/>
+            </w:pPr>
+            <w:r>
+              <w:rPr>
+                <w:rFonts w:hint="eastAsia"/>
+              </w:rPr>
+              <w:t xml:space="preserve">阶段</w:t>
+            </w:r>
+            <w:r>
+              <w:t xml:space="preserve"> 1–4 </w:t>
+            </w:r>
+            <w:r>
+              <w:rPr>
+                <w:rFonts w:hint="eastAsia"/>
+              </w:rPr>
+              <w:t xml:space="preserve">完成附件数据清洗、传统供需基准、短期动态递推、参数校准和防御性检验，给出</w:t>
+            </w:r>
+            <w:r>
+              <w:t xml:space="preserve"> </w:t>
+            </w:r>
+            <w:r>
+              <w:rPr>
+                <w:rFonts w:hint="eastAsia"/>
+              </w:rPr>
+              <w:t xml:space="preserve">RMSE、MAE、MAPE、基准对比、滞后检验、机制消融和过拟合压力测试。</w:t>
+            </w:r>
+          </w:p>
+        </w:tc>
+      </w:tr>
+      <w:tr>
+        <w:tc>
+          <w:tcPr/>
+          <w:p>
+            <w:pPr>
+              <w:pStyle w:val="Compact"/>
+              <w:jc w:val="left"/>
+            </w:pPr>
+            <w:r>
+              <w:rPr>
+                <w:rFonts w:hint="eastAsia"/>
+              </w:rPr>
+              <w:t xml:space="preserve">任务</w:t>
+            </w:r>
+            <w:r>
+              <w:t xml:space="preserve"> 2</w:t>
+            </w:r>
+          </w:p>
+        </w:tc>
+        <w:tc>
+          <w:tcPr/>
+          <w:p>
+            <w:pPr>
+              <w:pStyle w:val="Compact"/>
+              <w:jc w:val="left"/>
+            </w:pPr>
+            <w:r>
+              <w:rPr>
+                <w:rFonts w:hint="eastAsia"/>
+              </w:rPr>
+              <w:t xml:space="preserve">若封锁持续到</w:t>
+            </w:r>
+            <w:r>
+              <w:t xml:space="preserve"> 60–180 </w:t>
+            </w:r>
+            <w:r>
+              <w:rPr>
+                <w:rFonts w:hint="eastAsia"/>
+              </w:rPr>
+              <w:t xml:space="preserve">天，预测油价变化和价格平衡点，考虑增产、长期弹性、阿联酋增产约束和库存耗尽跳变风险。</w:t>
+            </w:r>
+          </w:p>
+        </w:tc>
+        <w:tc>
+          <w:tcPr/>
+          <w:p>
+            <w:pPr>
+              <w:pStyle w:val="Compact"/>
+              <w:jc w:val="left"/>
+            </w:pPr>
+            <w:r>
+              <w:rPr>
+                <w:rFonts w:hint="eastAsia"/>
+              </w:rPr>
+              <w:t xml:space="preserve">阶段</w:t>
+            </w:r>
+            <w:r>
+              <w:t xml:space="preserve"> 5–6 </w:t>
+            </w:r>
+            <w:r>
+              <w:rPr>
+                <w:rFonts w:hint="eastAsia"/>
+              </w:rPr>
+              <w:t xml:space="preserve">构建乐观、中性、悲观三情景路径，给出第</w:t>
+            </w:r>
+            <w:r>
+              <w:t xml:space="preserve"> 60/90/120/180 </w:t>
+            </w:r>
+            <w:r>
+              <w:rPr>
+                <w:rFonts w:hint="eastAsia"/>
+              </w:rPr>
+              <w:t xml:space="preserve">天价格、外推期峰值、库存风险、二次跳涨风险和关键参数敏感性排序。</w:t>
+            </w:r>
+          </w:p>
+        </w:tc>
+      </w:tr>
+    </w:tbl>
     <w:bookmarkEnd w:id="9"/>
     <w:bookmarkStart w:id="21" w:name="数据处理与描述性分析"/>
     <w:p>
@@ -9665,7 +9893,7 @@
     </w:p>
     <w:bookmarkEnd w:id="72"/>
     <w:bookmarkEnd w:id="73"/>
-    <w:bookmarkStart w:id="82" w:name="天三情景预测"/>
+    <w:bookmarkStart w:id="85" w:name="天三情景预测"/>
     <w:p>
       <w:pPr>
         <w:pStyle w:val="Heading1"/>
@@ -9746,6 +9974,1009 @@
           <w:rFonts w:hint="eastAsia"/>
         </w:rPr>
         <w:t xml:space="preserve">日，之后全部为条件情景外推，不作为真实观测数据。</w:t>
+      </w:r>
+    </w:p>
+    <w:p>
+      <w:pPr>
+        <w:pStyle w:val="BodyText"/>
+      </w:pPr>
+      <w:r>
+        <w:rPr>
+          <w:rFonts w:hint="eastAsia"/>
+        </w:rPr>
+        <w:t xml:space="preserve">需要特别说明，长期部分不能称为</w:t>
+      </w:r>
+      <w:r>
+        <w:rPr>
+          <w:rFonts w:hint="eastAsia"/>
+        </w:rPr>
+        <w:t xml:space="preserve">“拟合”</w:t>
+      </w:r>
+      <w:r>
+        <w:rPr>
+          <w:rFonts w:hint="eastAsia"/>
+        </w:rPr>
+        <w:t xml:space="preserve">。原因是赛题附件只提供到</w:t>
+      </w:r>
+      <w:r>
+        <w:t xml:space="preserve"> 2026 </w:t>
+      </w:r>
+      <w:r>
+        <w:rPr>
+          <w:rFonts w:hint="eastAsia"/>
+        </w:rPr>
+        <w:t xml:space="preserve">年</w:t>
+      </w:r>
+      <w:r>
+        <w:t xml:space="preserve"> 5 </w:t>
+      </w:r>
+      <w:r>
+        <w:rPr>
+          <w:rFonts w:hint="eastAsia"/>
+        </w:rPr>
+        <w:t xml:space="preserve">月初的真实价格，60–180</w:t>
+      </w:r>
+      <w:r>
+        <w:t xml:space="preserve"> </w:t>
+      </w:r>
+      <w:r>
+        <w:rPr>
+          <w:rFonts w:hint="eastAsia"/>
+        </w:rPr>
+        <w:t xml:space="preserve">天区间没有可用于事后对照的真实观测值。因此本文对长期部分采用</w:t>
+      </w:r>
+      <w:r>
+        <w:rPr>
+          <w:rFonts w:hint="eastAsia"/>
+        </w:rPr>
+        <w:t xml:space="preserve">“情景预测”</w:t>
+      </w:r>
+      <w:r>
+        <w:rPr>
+          <w:rFonts w:hint="eastAsia"/>
+        </w:rPr>
+        <w:t xml:space="preserve">和</w:t>
+      </w:r>
+      <w:r>
+        <w:rPr>
+          <w:rFonts w:hint="eastAsia"/>
+        </w:rPr>
+        <w:t xml:space="preserve">“平衡点分析”</w:t>
+      </w:r>
+      <w:r>
+        <w:rPr>
+          <w:rFonts w:hint="eastAsia"/>
+        </w:rPr>
+        <w:t xml:space="preserve">的表述：短期窗口负责校准机制，长期窗口负责在不同政策和市场条件下外推价格路径。</w:t>
+      </w:r>
+    </w:p>
+    <w:p>
+      <w:pPr>
+        <w:pStyle w:val="BodyText"/>
+      </w:pPr>
+      <w:r>
+        <w:rPr>
+          <w:rFonts w:hint="eastAsia"/>
+        </w:rPr>
+        <w:t xml:space="preserve">长期模型从短期动态递推模型延伸而来，但在四个方面做了时间尺度调整：</w:t>
+      </w:r>
+    </w:p>
+    <w:p>
+      <w:pPr>
+        <w:numPr>
+          <w:ilvl w:val="0"/>
+          <w:numId w:val="1003"/>
+        </w:numPr>
+      </w:pPr>
+      <w:r>
+        <w:rPr>
+          <w:rFonts w:hint="eastAsia"/>
+        </w:rPr>
+        <w:t xml:space="preserve">供应侧：保持封锁造成的基础缺口，同时允许非海湾产油国和</w:t>
+      </w:r>
+      <w:r>
+        <w:t xml:space="preserve"> OPEC </w:t>
+      </w:r>
+      <w:r>
+        <w:rPr>
+          <w:rFonts w:hint="eastAsia"/>
+        </w:rPr>
+        <w:t xml:space="preserve">剩余产能缓慢响应。</w:t>
+      </w:r>
+    </w:p>
+    <w:p>
+      <w:pPr>
+        <w:numPr>
+          <w:ilvl w:val="0"/>
+          <w:numId w:val="1003"/>
+        </w:numPr>
+      </w:pPr>
+      <w:r>
+        <w:rPr>
+          <w:rFonts w:hint="eastAsia"/>
+        </w:rPr>
+        <w:t xml:space="preserve">缓冲侧：SPR、商业库存和绕道运输继续发挥作用，但其边际能力随时间下降或受运输瓶颈约束。</w:t>
+      </w:r>
+    </w:p>
+    <w:p>
+      <w:pPr>
+        <w:numPr>
+          <w:ilvl w:val="0"/>
+          <w:numId w:val="1003"/>
+        </w:numPr>
+      </w:pPr>
+      <w:r>
+        <w:rPr>
+          <w:rFonts w:hint="eastAsia"/>
+        </w:rPr>
+        <w:t xml:space="preserve">需求侧：长期需求价格弹性高于短期弹性，反映高油价持续后消费、生产和替代能源调整更充分。</w:t>
+      </w:r>
+    </w:p>
+    <w:p>
+      <w:pPr>
+        <w:numPr>
+          <w:ilvl w:val="0"/>
+          <w:numId w:val="1003"/>
+        </w:numPr>
+      </w:pPr>
+      <w:r>
+        <w:rPr>
+          <w:rFonts w:hint="eastAsia"/>
+        </w:rPr>
+        <w:t xml:space="preserve">风险侧：恐慌溢价逐步衰减，但地缘风险与不确定性平台可能在悲观情景下维持高位。</w:t>
+      </w:r>
+    </w:p>
+    <w:p>
+      <w:pPr>
+        <w:pStyle w:val="FirstParagraph"/>
+      </w:pPr>
+      <w:r>
+        <w:rPr>
+          <w:rFonts w:hint="eastAsia"/>
+        </w:rPr>
+        <w:t xml:space="preserve">记长期外推期第</w:t>
+      </w:r>
+      <w:r>
+        <w:t xml:space="preserve"> </w:t>
+      </w:r>
+      <m:oMath>
+        <m:r>
+          <m:t>t</m:t>
+        </m:r>
+      </m:oMath>
+      <w:r>
+        <w:t xml:space="preserve"> </w:t>
+      </w:r>
+      <w:r>
+        <w:rPr>
+          <w:rFonts w:hint="eastAsia"/>
+        </w:rPr>
+        <w:t xml:space="preserve">日有效供应为</w:t>
+      </w:r>
+      <w:r>
+        <w:t xml:space="preserve"> </w:t>
+      </w:r>
+      <m:oMath>
+        <m:sSubSup>
+          <m:e>
+            <m:r>
+              <m:t>S</m:t>
+            </m:r>
+          </m:e>
+          <m:sub>
+            <m:r>
+              <m:t>t</m:t>
+            </m:r>
+          </m:sub>
+          <m:sup>
+            <m:r>
+              <m:rPr>
+                <m:sty m:val="p"/>
+              </m:rPr>
+              <m:t>(</m:t>
+            </m:r>
+            <m:r>
+              <m:t>L</m:t>
+            </m:r>
+            <m:r>
+              <m:rPr>
+                <m:sty m:val="p"/>
+              </m:rPr>
+              <m:t>)</m:t>
+            </m:r>
+          </m:sup>
+        </m:sSubSup>
+      </m:oMath>
+      <w:r>
+        <w:rPr>
+          <w:rFonts w:hint="eastAsia"/>
+        </w:rPr>
+        <w:t xml:space="preserve">，有效需求为</w:t>
+      </w:r>
+      <w:r>
+        <w:t xml:space="preserve"> </w:t>
+      </w:r>
+      <m:oMath>
+        <m:sSubSup>
+          <m:e>
+            <m:r>
+              <m:t>D</m:t>
+            </m:r>
+          </m:e>
+          <m:sub>
+            <m:r>
+              <m:t>t</m:t>
+            </m:r>
+          </m:sub>
+          <m:sup>
+            <m:r>
+              <m:rPr>
+                <m:sty m:val="p"/>
+              </m:rPr>
+              <m:t>(</m:t>
+            </m:r>
+            <m:r>
+              <m:t>L</m:t>
+            </m:r>
+            <m:r>
+              <m:rPr>
+                <m:sty m:val="p"/>
+              </m:rPr>
+              <m:t>)</m:t>
+            </m:r>
+          </m:sup>
+        </m:sSubSup>
+      </m:oMath>
+      <w:r>
+        <w:rPr>
+          <w:rFonts w:hint="eastAsia"/>
+        </w:rPr>
+        <w:t xml:space="preserve">。在短期模型的基础上，长期供需缺口可写为</w:t>
+      </w:r>
+    </w:p>
+    <w:p>
+      <w:pPr>
+        <w:pStyle w:val="BodyText"/>
+      </w:pPr>
+      <m:oMathPara>
+        <m:oMathParaPr>
+          <m:jc m:val="center"/>
+        </m:oMathParaPr>
+        <m:oMath>
+          <m:sSubSup>
+            <m:e>
+              <m:r>
+                <m:t>G</m:t>
+              </m:r>
+            </m:e>
+            <m:sub>
+              <m:r>
+                <m:t>t</m:t>
+              </m:r>
+            </m:sub>
+            <m:sup>
+              <m:r>
+                <m:rPr>
+                  <m:sty m:val="p"/>
+                </m:rPr>
+                <m:t>(</m:t>
+              </m:r>
+              <m:r>
+                <m:t>L</m:t>
+              </m:r>
+              <m:r>
+                <m:rPr>
+                  <m:sty m:val="p"/>
+                </m:rPr>
+                <m:t>)</m:t>
+              </m:r>
+            </m:sup>
+          </m:sSubSup>
+          <m:r>
+            <m:rPr>
+              <m:sty m:val="p"/>
+            </m:rPr>
+            <m:t>=</m:t>
+          </m:r>
+          <m:sSubSup>
+            <m:e>
+              <m:r>
+                <m:t>D</m:t>
+              </m:r>
+            </m:e>
+            <m:sub>
+              <m:r>
+                <m:t>t</m:t>
+              </m:r>
+            </m:sub>
+            <m:sup>
+              <m:r>
+                <m:rPr>
+                  <m:sty m:val="p"/>
+                </m:rPr>
+                <m:t>(</m:t>
+              </m:r>
+              <m:r>
+                <m:t>L</m:t>
+              </m:r>
+              <m:r>
+                <m:rPr>
+                  <m:sty m:val="p"/>
+                </m:rPr>
+                <m:t>)</m:t>
+              </m:r>
+            </m:sup>
+          </m:sSubSup>
+          <m:r>
+            <m:rPr>
+              <m:sty m:val="p"/>
+            </m:rPr>
+            <m:t>−</m:t>
+          </m:r>
+          <m:d>
+            <m:dPr>
+              <m:begChr m:val="["/>
+              <m:sepChr m:val=""/>
+              <m:endChr m:val="]"/>
+              <m:grow/>
+            </m:dPr>
+            <m:e>
+              <m:sSub>
+                <m:e>
+                  <m:r>
+                    <m:t>S</m:t>
+                  </m:r>
+                </m:e>
+                <m:sub>
+                  <m:r>
+                    <m:t>0</m:t>
+                  </m:r>
+                </m:sub>
+              </m:sSub>
+              <m:r>
+                <m:rPr>
+                  <m:sty m:val="p"/>
+                </m:rPr>
+                <m:t>−</m:t>
+              </m:r>
+              <m:r>
+                <m:t>I</m:t>
+              </m:r>
+              <m:r>
+                <m:rPr>
+                  <m:sty m:val="p"/>
+                </m:rPr>
+                <m:t>+</m:t>
+              </m:r>
+              <m:sSub>
+                <m:e>
+                  <m:r>
+                    <m:t>R</m:t>
+                  </m:r>
+                </m:e>
+                <m:sub>
+                  <m:r>
+                    <m:t>t</m:t>
+                  </m:r>
+                </m:sub>
+              </m:sSub>
+              <m:r>
+                <m:rPr>
+                  <m:sty m:val="p"/>
+                </m:rPr>
+                <m:t>+</m:t>
+              </m:r>
+              <m:sSub>
+                <m:e>
+                  <m:r>
+                    <m:t>Q</m:t>
+                  </m:r>
+                </m:e>
+                <m:sub>
+                  <m:r>
+                    <m:t>t</m:t>
+                  </m:r>
+                </m:sub>
+              </m:sSub>
+              <m:r>
+                <m:rPr>
+                  <m:sty m:val="p"/>
+                </m:rPr>
+                <m:t>+</m:t>
+              </m:r>
+              <m:sSub>
+                <m:e>
+                  <m:r>
+                    <m:t>B</m:t>
+                  </m:r>
+                </m:e>
+                <m:sub>
+                  <m:r>
+                    <m:t>t</m:t>
+                  </m:r>
+                </m:sub>
+              </m:sSub>
+              <m:r>
+                <m:rPr>
+                  <m:sty m:val="p"/>
+                </m:rPr>
+                <m:t>+</m:t>
+              </m:r>
+              <m:sSub>
+                <m:e>
+                  <m:r>
+                    <m:t>A</m:t>
+                  </m:r>
+                </m:e>
+                <m:sub>
+                  <m:r>
+                    <m:t>t</m:t>
+                  </m:r>
+                </m:sub>
+              </m:sSub>
+            </m:e>
+          </m:d>
+          <m:r>
+            <m:rPr>
+              <m:sty m:val="p"/>
+            </m:rPr>
+            <m:t>,</m:t>
+          </m:r>
+        </m:oMath>
+      </m:oMathPara>
+    </w:p>
+    <w:p>
+      <w:pPr>
+        <w:pStyle w:val="FirstParagraph"/>
+      </w:pPr>
+      <w:r>
+        <w:rPr>
+          <w:rFonts w:hint="eastAsia"/>
+        </w:rPr>
+        <w:t xml:space="preserve">其中</w:t>
+      </w:r>
+      <w:r>
+        <w:t xml:space="preserve"> </w:t>
+      </w:r>
+      <m:oMath>
+        <m:r>
+          <m:t>I</m:t>
+        </m:r>
+      </m:oMath>
+      <w:r>
+        <w:t xml:space="preserve"> </w:t>
+      </w:r>
+      <w:r>
+        <w:rPr>
+          <w:rFonts w:hint="eastAsia"/>
+        </w:rPr>
+        <w:t xml:space="preserve">为供应中断量，</w:t>
+      </w:r>
+      <m:oMath>
+        <m:sSub>
+          <m:e>
+            <m:r>
+              <m:t>R</m:t>
+            </m:r>
+          </m:e>
+          <m:sub>
+            <m:r>
+              <m:t>t</m:t>
+            </m:r>
+          </m:sub>
+        </m:sSub>
+      </m:oMath>
+      <w:r>
+        <w:t xml:space="preserve"> </w:t>
+      </w:r>
+      <w:r>
+        <w:rPr>
+          <w:rFonts w:hint="eastAsia"/>
+        </w:rPr>
+        <w:t xml:space="preserve">为</w:t>
+      </w:r>
+      <w:r>
+        <w:t xml:space="preserve"> SPR </w:t>
+      </w:r>
+      <w:r>
+        <w:rPr>
+          <w:rFonts w:hint="eastAsia"/>
+        </w:rPr>
+        <w:t xml:space="preserve">释放量，</w:t>
+      </w:r>
+      <m:oMath>
+        <m:sSub>
+          <m:e>
+            <m:r>
+              <m:t>Q</m:t>
+            </m:r>
+          </m:e>
+          <m:sub>
+            <m:r>
+              <m:t>t</m:t>
+            </m:r>
+          </m:sub>
+        </m:sSub>
+      </m:oMath>
+      <w:r>
+        <w:t xml:space="preserve"> </w:t>
+      </w:r>
+      <w:r>
+        <w:rPr>
+          <w:rFonts w:hint="eastAsia"/>
+        </w:rPr>
+        <w:t xml:space="preserve">为绕道运输恢复量，</w:t>
+      </w:r>
+      <m:oMath>
+        <m:sSub>
+          <m:e>
+            <m:r>
+              <m:t>B</m:t>
+            </m:r>
+          </m:e>
+          <m:sub>
+            <m:r>
+              <m:t>t</m:t>
+            </m:r>
+          </m:sub>
+        </m:sSub>
+      </m:oMath>
+      <w:r>
+        <w:t xml:space="preserve"> </w:t>
+      </w:r>
+      <w:r>
+        <w:rPr>
+          <w:rFonts w:hint="eastAsia"/>
+        </w:rPr>
+        <w:t xml:space="preserve">为商业库存缓冲量，</w:t>
+      </w:r>
+      <m:oMath>
+        <m:sSub>
+          <m:e>
+            <m:r>
+              <m:t>A</m:t>
+            </m:r>
+          </m:e>
+          <m:sub>
+            <m:r>
+              <m:t>t</m:t>
+            </m:r>
+          </m:sub>
+        </m:sSub>
+      </m:oMath>
+      <w:r>
+        <w:t xml:space="preserve"> </w:t>
+      </w:r>
+      <w:r>
+        <w:rPr>
+          <w:rFonts w:hint="eastAsia"/>
+        </w:rPr>
+        <w:t xml:space="preserve">为其他产油国增产或替代供应增量。长期价格递推采用</w:t>
+      </w:r>
+    </w:p>
+    <w:p>
+      <w:pPr>
+        <w:pStyle w:val="BodyText"/>
+      </w:pPr>
+      <m:oMathPara>
+        <m:oMathParaPr>
+          <m:jc m:val="center"/>
+        </m:oMathParaPr>
+        <m:oMath>
+          <m:sSub>
+            <m:e>
+              <m:acc>
+                <m:accPr>
+                  <m:chr m:val="̂"/>
+                </m:accPr>
+                <m:e>
+                  <m:r>
+                    <m:t>P</m:t>
+                  </m:r>
+                </m:e>
+              </m:acc>
+            </m:e>
+            <m:sub>
+              <m:r>
+                <m:t>t</m:t>
+              </m:r>
+              <m:r>
+                <m:rPr>
+                  <m:sty m:val="p"/>
+                </m:rPr>
+                <m:t>+</m:t>
+              </m:r>
+              <m:r>
+                <m:t>1</m:t>
+              </m:r>
+            </m:sub>
+          </m:sSub>
+          <m:r>
+            <m:rPr>
+              <m:sty m:val="p"/>
+            </m:rPr>
+            <m:t>=</m:t>
+          </m:r>
+          <m:r>
+            <m:rPr>
+              <m:sty m:val="p"/>
+            </m:rPr>
+            <m:t>(</m:t>
+          </m:r>
+          <m:r>
+            <m:t>1</m:t>
+          </m:r>
+          <m:r>
+            <m:rPr>
+              <m:sty m:val="p"/>
+            </m:rPr>
+            <m:t>−</m:t>
+          </m:r>
+          <m:sSub>
+            <m:e>
+              <m:r>
+                <m:t>v</m:t>
+              </m:r>
+            </m:e>
+            <m:sub>
+              <m:r>
+                <m:t>L</m:t>
+              </m:r>
+            </m:sub>
+          </m:sSub>
+          <m:r>
+            <m:rPr>
+              <m:sty m:val="p"/>
+            </m:rPr>
+            <m:t>)</m:t>
+          </m:r>
+          <m:sSub>
+            <m:e>
+              <m:acc>
+                <m:accPr>
+                  <m:chr m:val="̂"/>
+                </m:accPr>
+                <m:e>
+                  <m:r>
+                    <m:t>P</m:t>
+                  </m:r>
+                </m:e>
+              </m:acc>
+            </m:e>
+            <m:sub>
+              <m:r>
+                <m:t>t</m:t>
+              </m:r>
+            </m:sub>
+          </m:sSub>
+          <m:r>
+            <m:rPr>
+              <m:sty m:val="p"/>
+            </m:rPr>
+            <m:t>+</m:t>
+          </m:r>
+          <m:sSub>
+            <m:e>
+              <m:r>
+                <m:t>v</m:t>
+              </m:r>
+            </m:e>
+            <m:sub>
+              <m:r>
+                <m:t>L</m:t>
+              </m:r>
+            </m:sub>
+          </m:sSub>
+          <m:d>
+            <m:dPr>
+              <m:begChr m:val="["/>
+              <m:sepChr m:val=""/>
+              <m:endChr m:val="]"/>
+              <m:grow/>
+            </m:dPr>
+            <m:e>
+              <m:sSub>
+                <m:e>
+                  <m:r>
+                    <m:t>P</m:t>
+                  </m:r>
+                </m:e>
+                <m:sub>
+                  <m:r>
+                    <m:t>0</m:t>
+                  </m:r>
+                </m:sub>
+              </m:sSub>
+              <m:r>
+                <m:rPr>
+                  <m:sty m:val="p"/>
+                </m:rPr>
+                <m:t>+</m:t>
+              </m:r>
+              <m:r>
+                <m:rPr>
+                  <m:sty m:val="p"/>
+                </m:rPr>
+                <m:t>Π</m:t>
+              </m:r>
+              <m:r>
+                <m:rPr>
+                  <m:sty m:val="p"/>
+                </m:rPr>
+                <m:t>(</m:t>
+              </m:r>
+              <m:sSubSup>
+                <m:e>
+                  <m:r>
+                    <m:t>G</m:t>
+                  </m:r>
+                </m:e>
+                <m:sub>
+                  <m:r>
+                    <m:t>t</m:t>
+                  </m:r>
+                </m:sub>
+                <m:sup>
+                  <m:r>
+                    <m:rPr>
+                      <m:sty m:val="p"/>
+                    </m:rPr>
+                    <m:t>(</m:t>
+                  </m:r>
+                  <m:r>
+                    <m:t>L</m:t>
+                  </m:r>
+                  <m:r>
+                    <m:rPr>
+                      <m:sty m:val="p"/>
+                    </m:rPr>
+                    <m:t>)</m:t>
+                  </m:r>
+                </m:sup>
+              </m:sSubSup>
+              <m:r>
+                <m:rPr>
+                  <m:sty m:val="p"/>
+                </m:rPr>
+                <m:t>,</m:t>
+              </m:r>
+              <m:sSub>
+                <m:e>
+                  <m:r>
+                    <m:t>ε</m:t>
+                  </m:r>
+                </m:e>
+                <m:sub>
+                  <m:r>
+                    <m:t>L</m:t>
+                  </m:r>
+                </m:sub>
+              </m:sSub>
+              <m:r>
+                <m:rPr>
+                  <m:sty m:val="p"/>
+                </m:rPr>
+                <m:t>)</m:t>
+              </m:r>
+            </m:e>
+          </m:d>
+          <m:r>
+            <m:rPr>
+              <m:sty m:val="p"/>
+            </m:rPr>
+            <m:t>+</m:t>
+          </m:r>
+          <m:sSub>
+            <m:e>
+              <m:r>
+                <m:rPr>
+                  <m:sty m:val="p"/>
+                </m:rPr>
+                <m:t>Φ</m:t>
+              </m:r>
+            </m:e>
+            <m:sub>
+              <m:r>
+                <m:t>t</m:t>
+              </m:r>
+            </m:sub>
+          </m:sSub>
+          <m:r>
+            <m:rPr>
+              <m:sty m:val="p"/>
+            </m:rPr>
+            <m:t>−</m:t>
+          </m:r>
+          <m:sSub>
+            <m:e>
+              <m:r>
+                <m:rPr>
+                  <m:sty m:val="p"/>
+                </m:rPr>
+                <m:t>Ω</m:t>
+              </m:r>
+            </m:e>
+            <m:sub>
+              <m:r>
+                <m:t>t</m:t>
+              </m:r>
+            </m:sub>
+          </m:sSub>
+          <m:r>
+            <m:rPr>
+              <m:sty m:val="p"/>
+            </m:rPr>
+            <m:t>+</m:t>
+          </m:r>
+          <m:sSub>
+            <m:e>
+              <m:r>
+                <m:t>J</m:t>
+              </m:r>
+            </m:e>
+            <m:sub>
+              <m:r>
+                <m:t>t</m:t>
+              </m:r>
+            </m:sub>
+          </m:sSub>
+          <m:r>
+            <m:rPr>
+              <m:sty m:val="p"/>
+            </m:rPr>
+            <m:t>,</m:t>
+          </m:r>
+        </m:oMath>
+      </m:oMathPara>
+    </w:p>
+    <w:p>
+      <w:pPr>
+        <w:pStyle w:val="FirstParagraph"/>
+      </w:pPr>
+      <w:r>
+        <w:rPr>
+          <w:rFonts w:hint="eastAsia"/>
+        </w:rPr>
+        <w:t xml:space="preserve">其中</w:t>
+      </w:r>
+      <w:r>
+        <w:t xml:space="preserve"> </w:t>
+      </w:r>
+      <m:oMath>
+        <m:r>
+          <m:rPr>
+            <m:sty m:val="p"/>
+          </m:rPr>
+          <m:t>Π</m:t>
+        </m:r>
+        <m:r>
+          <m:rPr>
+            <m:sty m:val="p"/>
+          </m:rPr>
+          <m:t>(</m:t>
+        </m:r>
+        <m:r>
+          <m:rPr>
+            <m:sty m:val="p"/>
+          </m:rPr>
+          <m:t>⋅</m:t>
+        </m:r>
+        <m:r>
+          <m:rPr>
+            <m:sty m:val="p"/>
+          </m:rPr>
+          <m:t>)</m:t>
+        </m:r>
+      </m:oMath>
+      <w:r>
+        <w:t xml:space="preserve"> </w:t>
+      </w:r>
+      <w:r>
+        <w:rPr>
+          <w:rFonts w:hint="eastAsia"/>
+        </w:rPr>
+        <w:t xml:space="preserve">表示由剩余供需缺口和长期需求弹性</w:t>
+      </w:r>
+      <w:r>
+        <w:t xml:space="preserve"> </w:t>
+      </w:r>
+      <m:oMath>
+        <m:sSub>
+          <m:e>
+            <m:r>
+              <m:t>ε</m:t>
+            </m:r>
+          </m:e>
+          <m:sub>
+            <m:r>
+              <m:t>L</m:t>
+            </m:r>
+          </m:sub>
+        </m:sSub>
+      </m:oMath>
+      <w:r>
+        <w:t xml:space="preserve"> </w:t>
+      </w:r>
+      <w:r>
+        <w:rPr>
+          <w:rFonts w:hint="eastAsia"/>
+        </w:rPr>
+        <w:t xml:space="preserve">共同决定的供需压力，</w:t>
+      </w:r>
+      <m:oMath>
+        <m:sSub>
+          <m:e>
+            <m:r>
+              <m:rPr>
+                <m:sty m:val="p"/>
+              </m:rPr>
+              <m:t>Φ</m:t>
+            </m:r>
+          </m:e>
+          <m:sub>
+            <m:r>
+              <m:t>t</m:t>
+            </m:r>
+          </m:sub>
+        </m:sSub>
+      </m:oMath>
+      <w:r>
+        <w:t xml:space="preserve"> </w:t>
+      </w:r>
+      <w:r>
+        <w:rPr>
+          <w:rFonts w:hint="eastAsia"/>
+        </w:rPr>
+        <w:t xml:space="preserve">为地缘风险与不确定性溢价，</w:t>
+      </w:r>
+      <m:oMath>
+        <m:sSub>
+          <m:e>
+            <m:r>
+              <m:rPr>
+                <m:sty m:val="p"/>
+              </m:rPr>
+              <m:t>Ω</m:t>
+            </m:r>
+          </m:e>
+          <m:sub>
+            <m:r>
+              <m:t>t</m:t>
+            </m:r>
+          </m:sub>
+        </m:sSub>
+      </m:oMath>
+      <w:r>
+        <w:t xml:space="preserve"> </w:t>
+      </w:r>
+      <w:r>
+        <w:rPr>
+          <w:rFonts w:hint="eastAsia"/>
+        </w:rPr>
+        <w:t xml:space="preserve">为政策缓冲确认和预期修复带来的折价，</w:t>
+      </w:r>
+      <m:oMath>
+        <m:sSub>
+          <m:e>
+            <m:r>
+              <m:t>J</m:t>
+            </m:r>
+          </m:e>
+          <m:sub>
+            <m:r>
+              <m:t>t</m:t>
+            </m:r>
+          </m:sub>
+        </m:sSub>
+      </m:oMath>
+      <w:r>
+        <w:t xml:space="preserve"> </w:t>
+      </w:r>
+      <w:r>
+        <w:rPr>
+          <w:rFonts w:hint="eastAsia"/>
+        </w:rPr>
+        <w:t xml:space="preserve">为库存接近耗尽时的跳变风险项。该形式对应赛题要求中的增产、长期弹性变化、运输瓶颈和库存耗尽风险。</w:t>
       </w:r>
     </w:p>
     <w:p>
@@ -10157,7 +11388,7 @@
       </w:tr>
     </w:tbl>
     <w:bookmarkEnd w:id="74"/>
-    <w:bookmarkStart w:id="81" w:name="预测结果"/>
+    <w:bookmarkStart w:id="84" w:name="预测结果"/>
     <w:p>
       <w:pPr>
         <w:pStyle w:val="Heading2"/>
@@ -10645,20 +11876,87 @@
       <w:r>
         <w:drawing>
           <wp:inline>
-            <wp:extent cx="4907280" cy="2645664"/>
+            <wp:extent cx="5013960" cy="2757678"/>
             <wp:effectExtent b="0" l="0" r="0" t="0"/>
             <wp:docPr descr="" title="" id="76" name="Picture"/>
             <a:graphic>
               <a:graphicData uri="http://schemas.openxmlformats.org/drawingml/2006/picture">
                 <pic:pic>
                   <pic:nvPicPr>
-                    <pic:cNvPr descr="scenario_price_paths.png" id="77" name="Picture"/>
+                    <pic:cNvPr descr="短期拟合与长期预测总览.png" id="77" name="Picture"/>
                     <pic:cNvPicPr>
                       <a:picLocks noChangeArrowheads="1" noChangeAspect="1"/>
                     </pic:cNvPicPr>
                   </pic:nvPicPr>
                   <pic:blipFill>
                     <a:blip r:embed="rId75"/>
+                    <a:stretch>
+                      <a:fillRect/>
+                    </a:stretch>
+                  </pic:blipFill>
+                  <pic:spPr bwMode="auto">
+                    <a:xfrm>
+                      <a:off x="0" y="0"/>
+                      <a:ext cx="5013960" cy="2757678"/>
+                    </a:xfrm>
+                    <a:prstGeom prst="rect">
+                      <a:avLst/>
+                    </a:prstGeom>
+                    <a:noFill/>
+                    <a:ln w="9525">
+                      <a:noFill/>
+                      <a:headEnd/>
+                      <a:tailEnd/>
+                    </a:ln>
+                  </pic:spPr>
+                </pic:pic>
+              </a:graphicData>
+            </a:graphic>
+          </wp:inline>
+        </w:drawing>
+      </w:r>
+    </w:p>
+    <w:p>
+      <w:pPr>
+        <w:pStyle w:val="ImageCaption"/>
+      </w:pPr>
+      <w:r>
+        <w:rPr>
+          <w:rFonts w:hint="eastAsia"/>
+        </w:rPr>
+        <w:t xml:space="preserve">短期机制拟合与</w:t>
+      </w:r>
+      <w:r>
+        <w:t xml:space="preserve"> 60–180 </w:t>
+      </w:r>
+      <w:r>
+        <w:rPr>
+          <w:rFonts w:hint="eastAsia"/>
+        </w:rPr>
+        <w:t xml:space="preserve">天三情景预测总览。竖线左侧为附件真实数据与短期模型拟合，竖线右侧为情景外推，不作为真实观测。</w:t>
+      </w:r>
+    </w:p>
+    <w:p>
+      <w:pPr>
+        <w:pStyle w:val="CaptionedFigure"/>
+      </w:pPr>
+      <w:r>
+        <w:drawing>
+          <wp:inline>
+            <wp:extent cx="4907280" cy="2645664"/>
+            <wp:effectExtent b="0" l="0" r="0" t="0"/>
+            <wp:docPr descr="" title="" id="79" name="Picture"/>
+            <a:graphic>
+              <a:graphicData uri="http://schemas.openxmlformats.org/drawingml/2006/picture">
+                <pic:pic>
+                  <pic:nvPicPr>
+                    <pic:cNvPr descr="scenario_price_paths.png" id="80" name="Picture"/>
+                    <pic:cNvPicPr>
+                      <a:picLocks noChangeArrowheads="1" noChangeAspect="1"/>
+                    </pic:cNvPicPr>
+                  </pic:nvPicPr>
+                  <pic:blipFill>
+                    <a:blip r:embed="rId78"/>
                     <a:stretch>
                       <a:fillRect/>
                     </a:stretch>
@@ -10772,6 +12070,89 @@
     </w:p>
     <w:p>
       <w:pPr>
+        <w:pStyle w:val="BodyText"/>
+      </w:pPr>
+      <w:r>
+        <w:rPr>
+          <w:rFonts w:hint="eastAsia"/>
+        </w:rPr>
+        <w:t xml:space="preserve">从价格平衡点看，乐观情景最终回落至约</w:t>
+      </w:r>
+      <w:r>
+        <w:t xml:space="preserve"> 95.99 </w:t>
+      </w:r>
+      <w:r>
+        <w:rPr>
+          <w:rFonts w:hint="eastAsia"/>
+        </w:rPr>
+        <w:t xml:space="preserve">美元/桶，说明若</w:t>
+      </w:r>
+      <w:r>
+        <w:t xml:space="preserve"> SPR </w:t>
+      </w:r>
+      <w:r>
+        <w:rPr>
+          <w:rFonts w:hint="eastAsia"/>
+        </w:rPr>
+        <w:t xml:space="preserve">释放及时、绕道运输恢复充分且长期需求弹性发挥作用，油价可以逐步脱离</w:t>
+      </w:r>
+      <w:r>
+        <w:t xml:space="preserve"> 110–120 </w:t>
+      </w:r>
+      <w:r>
+        <w:rPr>
+          <w:rFonts w:hint="eastAsia"/>
+        </w:rPr>
+        <w:t xml:space="preserve">美元平台。中性情景第</w:t>
+      </w:r>
+      <w:r>
+        <w:t xml:space="preserve"> 180 </w:t>
+      </w:r>
+      <w:r>
+        <w:rPr>
+          <w:rFonts w:hint="eastAsia"/>
+        </w:rPr>
+        <w:t xml:space="preserve">天约为</w:t>
+      </w:r>
+      <w:r>
+        <w:t xml:space="preserve"> 104.49 </w:t>
+      </w:r>
+      <w:r>
+        <w:rPr>
+          <w:rFonts w:hint="eastAsia"/>
+        </w:rPr>
+        <w:t xml:space="preserve">美元/桶，更接近政策缓冲与市场风险重新平衡后的中心水平。悲观情景第</w:t>
+      </w:r>
+      <w:r>
+        <w:t xml:space="preserve"> 180 </w:t>
+      </w:r>
+      <w:r>
+        <w:rPr>
+          <w:rFonts w:hint="eastAsia"/>
+        </w:rPr>
+        <w:t xml:space="preserve">天仍为</w:t>
+      </w:r>
+      <w:r>
+        <w:t xml:space="preserve"> 119.53 </w:t>
+      </w:r>
+      <w:r>
+        <w:rPr>
+          <w:rFonts w:hint="eastAsia"/>
+        </w:rPr>
+        <w:t xml:space="preserve">美元/桶，说明若供应中断规模接近上界、SPR</w:t>
+      </w:r>
+      <w:r>
+        <w:t xml:space="preserve"> </w:t>
+      </w:r>
+      <w:r>
+        <w:rPr>
+          <w:rFonts w:hint="eastAsia"/>
+        </w:rPr>
+        <w:t xml:space="preserve">释放不足且风险溢价持续，市场可能长期停留在高位平台，并保留二次跳涨尾部风险。</w:t>
+      </w:r>
+    </w:p>
+    <w:p>
+      <w:pPr>
         <w:pStyle w:val="CaptionedFigure"/>
       </w:pPr>
       <w:r>
@@ -10779,18 +12160,18 @@
           <wp:inline>
             <wp:extent cx="4907280" cy="3413760"/>
             <wp:effectExtent b="0" l="0" r="0" t="0"/>
-            <wp:docPr descr="" title="" id="79" name="Picture"/>
+            <wp:docPr descr="" title="" id="82" name="Picture"/>
             <a:graphic>
               <a:graphicData uri="http://schemas.openxmlformats.org/drawingml/2006/picture">
                 <pic:pic>
                   <pic:nvPicPr>
-                    <pic:cNvPr descr="inventory_depletion_risk.png" id="80" name="Picture"/>
+                    <pic:cNvPr descr="inventory_depletion_risk.png" id="83" name="Picture"/>
                     <pic:cNvPicPr>
                       <a:picLocks noChangeArrowheads="1" noChangeAspect="1"/>
                     </pic:cNvPicPr>
                   </pic:nvPicPr>
                   <pic:blipFill>
-                    <a:blip r:embed="rId78"/>
+                    <a:blip r:embed="rId81"/>
                     <a:stretch>
                       <a:fillRect/>
                     </a:stretch>
@@ -10828,9 +12209,9 @@
         <w:t xml:space="preserve">商业库存剩余量与剩余供需缺口变化。悲观情景下缓冲能力下降，二次跳涨风险上升。</w:t>
       </w:r>
     </w:p>
-    <w:bookmarkEnd w:id="81"/>
-    <w:bookmarkEnd w:id="82"/>
-    <w:bookmarkStart w:id="91" w:name="敏感性分析"/>
+    <w:bookmarkEnd w:id="84"/>
+    <w:bookmarkEnd w:id="85"/>
+    <w:bookmarkStart w:id="94" w:name="敏感性分析"/>
     <w:p>
       <w:pPr>
         <w:pStyle w:val="Heading1"/>
@@ -10842,7 +12223,7 @@
         <w:t xml:space="preserve">敏感性分析</w:t>
       </w:r>
     </w:p>
-    <w:bookmarkStart w:id="83" w:name="分析方法"/>
+    <w:bookmarkStart w:id="86" w:name="分析方法"/>
     <w:p>
       <w:pPr>
         <w:pStyle w:val="Heading2"/>
@@ -11129,8 +12510,8 @@
         <w:t xml:space="preserve">天剩余缺口波动范围。该指标兼顾终点价格、阶段峰值和供需风险。</w:t>
       </w:r>
     </w:p>
-    <w:bookmarkEnd w:id="83"/>
-    <w:bookmarkStart w:id="90" w:name="参数重要性排序"/>
+    <w:bookmarkEnd w:id="86"/>
+    <w:bookmarkStart w:id="93" w:name="参数重要性排序"/>
     <w:p>
       <w:pPr>
         <w:pStyle w:val="Heading2"/>
@@ -11922,18 +13303,18 @@
           <wp:inline>
             <wp:extent cx="4907280" cy="2998893"/>
             <wp:effectExtent b="0" l="0" r="0" t="0"/>
-            <wp:docPr descr="" title="" id="85" name="Picture"/>
+            <wp:docPr descr="" title="" id="88" name="Picture"/>
             <a:graphic>
               <a:graphicData uri="http://schemas.openxmlformats.org/drawingml/2006/picture">
                 <pic:pic>
                   <pic:nvPicPr>
-                    <pic:cNvPr descr="sensitivity_tornado_180day.png" id="86" name="Picture"/>
+                    <pic:cNvPr descr="sensitivity_tornado_180day.png" id="89" name="Picture"/>
                     <pic:cNvPicPr>
                       <a:picLocks noChangeArrowheads="1" noChangeAspect="1"/>
                     </pic:cNvPicPr>
                   </pic:nvPicPr>
                   <pic:blipFill>
-                    <a:blip r:embed="rId84"/>
+                    <a:blip r:embed="rId87"/>
                     <a:stretch>
                       <a:fillRect/>
                     </a:stretch>
@@ -11989,18 +13370,18 @@
           <wp:inline>
             <wp:extent cx="4907280" cy="1599409"/>
             <wp:effectExtent b="0" l="0" r="0" t="0"/>
-            <wp:docPr descr="" title="" id="88" name="Picture"/>
+            <wp:docPr descr="" title="" id="91" name="Picture"/>
             <a:graphic>
               <a:graphicData uri="http://schemas.openxmlformats.org/drawingml/2006/picture">
                 <pic:pic>
                   <pic:nvPicPr>
-                    <pic:cNvPr descr="sensitivity_parameter_response.png" id="89" name="Picture"/>
+                    <pic:cNvPr descr="sensitivity_parameter_response.png" id="92" name="Picture"/>
                     <pic:cNvPicPr>
                       <a:picLocks noChangeArrowheads="1" noChangeAspect="1"/>
                     </pic:cNvPicPr>
                   </pic:nvPicPr>
                   <pic:blipFill>
-                    <a:blip r:embed="rId87"/>
+                    <a:blip r:embed="rId90"/>
                     <a:stretch>
                       <a:fillRect/>
                     </a:stretch>
@@ -12100,9 +13481,9 @@
         <w:t xml:space="preserve">的政策缓冲变量。</w:t>
       </w:r>
     </w:p>
-    <w:bookmarkEnd w:id="90"/>
-    <w:bookmarkEnd w:id="91"/>
-    <w:bookmarkStart w:id="94" w:name="模型评价"/>
+    <w:bookmarkEnd w:id="93"/>
+    <w:bookmarkEnd w:id="94"/>
+    <w:bookmarkStart w:id="97" w:name="模型评价"/>
     <w:p>
       <w:pPr>
         <w:pStyle w:val="Heading1"/>
@@ -12114,7 +13495,7 @@
         <w:t xml:space="preserve">模型评价</w:t>
       </w:r>
     </w:p>
-    <w:bookmarkStart w:id="92" w:name="优点"/>
+    <w:bookmarkStart w:id="95" w:name="优点"/>
     <w:p>
       <w:pPr>
         <w:pStyle w:val="Heading2"/>
@@ -12124,111 +13505,6 @@
           <w:rFonts w:hint="eastAsia"/>
         </w:rPr>
         <w:t xml:space="preserve">优点</w:t>
-      </w:r>
-    </w:p>
-    <w:p>
-      <w:pPr>
-        <w:numPr>
-          <w:ilvl w:val="0"/>
-          <w:numId w:val="1003"/>
-        </w:numPr>
-      </w:pPr>
-      <w:r>
-        <w:rPr>
-          <w:rFonts w:hint="eastAsia"/>
-        </w:rPr>
-        <w:t xml:space="preserve">证据链完整：从附件数据清洗、传统供需基准、动态模型、校准、防御性检验、三情景预测到敏感性分析均可复现。</w:t>
-      </w:r>
-    </w:p>
-    <w:p>
-      <w:pPr>
-        <w:numPr>
-          <w:ilvl w:val="0"/>
-          <w:numId w:val="1003"/>
-        </w:numPr>
-      </w:pPr>
-      <w:r>
-        <w:rPr>
-          <w:rFonts w:hint="eastAsia"/>
-        </w:rPr>
-        <w:t xml:space="preserve">机制解释清晰：模型没有把价格平台硬编码为</w:t>
-      </w:r>
-      <w:r>
-        <w:t xml:space="preserve"> 120 </w:t>
-      </w:r>
-      <w:r>
-        <w:rPr>
-          <w:rFonts w:hint="eastAsia"/>
-        </w:rPr>
-        <w:t xml:space="preserve">美元，而是由供应缺口、风险溢价和缓冲折价共同递推形成。</w:t>
-      </w:r>
-    </w:p>
-    <w:p>
-      <w:pPr>
-        <w:numPr>
-          <w:ilvl w:val="0"/>
-          <w:numId w:val="1003"/>
-        </w:numPr>
-      </w:pPr>
-      <w:r>
-        <w:rPr>
-          <w:rFonts w:hint="eastAsia"/>
-        </w:rPr>
-        <w:t xml:space="preserve">主动回应评委质疑：本文设置</w:t>
-      </w:r>
-      <w:r>
-        <w:t xml:space="preserve"> Random Walk </w:t>
-      </w:r>
-      <w:r>
-        <w:rPr>
-          <w:rFonts w:hint="eastAsia"/>
-        </w:rPr>
-        <w:t xml:space="preserve">基准、ARIMA</w:t>
-      </w:r>
-      <w:r>
-        <w:t xml:space="preserve"> </w:t>
-      </w:r>
-      <w:r>
-        <w:rPr>
-          <w:rFonts w:hint="eastAsia"/>
-        </w:rPr>
-        <w:t xml:space="preserve">基准、滞后平移检验、机制消融和过拟合压力测试。</w:t>
-      </w:r>
-    </w:p>
-    <w:p>
-      <w:pPr>
-        <w:numPr>
-          <w:ilvl w:val="0"/>
-          <w:numId w:val="1003"/>
-        </w:numPr>
-      </w:pPr>
-      <w:r>
-        <w:rPr>
-          <w:rFonts w:hint="eastAsia"/>
-        </w:rPr>
-        <w:t xml:space="preserve">数据口径保守：所有真实价格均来自附件</w:t>
-      </w:r>
-      <w:r>
-        <w:t xml:space="preserve"> </w:t>
-      </w:r>
-      <w:r>
-        <w:rPr>
-          <w:rFonts w:hint="eastAsia"/>
-        </w:rPr>
-        <w:t xml:space="preserve">CSV；外推阶段明确标注为情景预测，不作为真实观测。</w:t>
-      </w:r>
-    </w:p>
-    <w:bookmarkEnd w:id="92"/>
-    <w:bookmarkStart w:id="93" w:name="局限性"/>
-    <w:p>
-      <w:pPr>
-        <w:pStyle w:val="Heading2"/>
-      </w:pPr>
-      <w:r>
-        <w:rPr>
-          <w:rFonts w:hint="eastAsia"/>
-        </w:rPr>
-        <w:t xml:space="preserve">局限性</w:t>
       </w:r>
     </w:p>
     <w:p>
@@ -12242,16 +13518,7 @@
         <w:rPr>
           <w:rFonts w:hint="eastAsia"/>
         </w:rPr>
-        <w:t xml:space="preserve">冲突窗口只有</w:t>
-      </w:r>
-      <w:r>
-        <w:t xml:space="preserve"> 46 </w:t>
-      </w:r>
-      <w:r>
-        <w:rPr>
-          <w:rFonts w:hint="eastAsia"/>
-        </w:rPr>
-        <w:t xml:space="preserve">个交易日，参数自由度相对较高，尽管有压力测试和边界检验，仍不宜把模型包装为通用油价交易预测器。</w:t>
+        <w:t xml:space="preserve">证据链完整：从附件数据清洗、传统供需基准、动态模型、校准、防御性检验、三情景预测到敏感性分析均可复现。</w:t>
       </w:r>
     </w:p>
     <w:p>
@@ -12265,7 +13532,16 @@
         <w:rPr>
           <w:rFonts w:hint="eastAsia"/>
         </w:rPr>
-        <w:t xml:space="preserve">地缘风险、不确定性平台和预期修复仍以参数化方式刻画，未引入期权隐含波动率、真实库存周报或新闻情绪等外生数据。</w:t>
+        <w:t xml:space="preserve">机制解释清晰：模型没有把价格平台硬编码为</w:t>
+      </w:r>
+      <w:r>
+        <w:t xml:space="preserve"> 120 </w:t>
+      </w:r>
+      <w:r>
+        <w:rPr>
+          <w:rFonts w:hint="eastAsia"/>
+        </w:rPr>
+        <w:t xml:space="preserve">美元，而是由供应缺口、风险溢价和缓冲折价共同递推形成。</w:t>
       </w:r>
     </w:p>
     <w:p>
@@ -12279,41 +13555,61 @@
         <w:rPr>
           <w:rFonts w:hint="eastAsia"/>
         </w:rPr>
-        <w:t xml:space="preserve">单因素敏感性不能完全描述参数联动风险，因此悲观情景仍是判断二次跳涨风险的重要补充。</w:t>
-      </w:r>
-    </w:p>
-    <w:bookmarkEnd w:id="93"/>
-    <w:bookmarkEnd w:id="94"/>
-    <w:bookmarkStart w:id="96" w:name="结论"/>
-    <w:p>
-      <w:pPr>
-        <w:pStyle w:val="Heading1"/>
-      </w:pPr>
-      <w:r>
-        <w:rPr>
-          <w:rFonts w:hint="eastAsia"/>
-        </w:rPr>
-        <w:t xml:space="preserve">结论</w:t>
-      </w:r>
-    </w:p>
-    <w:p>
-      <w:pPr>
-        <w:pStyle w:val="FirstParagraph"/>
-      </w:pPr>
-      <w:r>
-        <w:rPr>
-          <w:rFonts w:hint="eastAsia"/>
-        </w:rPr>
-        <w:t xml:space="preserve">本文围绕霍尔木兹海峡封锁对国际原油价格的影响，建立了一套从传统供需上界到动态缓冲解释、再到</w:t>
-      </w:r>
-      <w:r>
-        <w:t xml:space="preserve"> 60–180 </w:t>
-      </w:r>
-      <w:r>
-        <w:rPr>
-          <w:rFonts w:hint="eastAsia"/>
-        </w:rPr>
-        <w:t xml:space="preserve">天情景预测与敏感性分析的完整模型。研究表明：</w:t>
+        <w:t xml:space="preserve">主动回应评委质疑：本文设置</w:t>
+      </w:r>
+      <w:r>
+        <w:t xml:space="preserve"> Random Walk </w:t>
+      </w:r>
+      <w:r>
+        <w:rPr>
+          <w:rFonts w:hint="eastAsia"/>
+        </w:rPr>
+        <w:t xml:space="preserve">基准、ARIMA</w:t>
+      </w:r>
+      <w:r>
+        <w:t xml:space="preserve"> </w:t>
+      </w:r>
+      <w:r>
+        <w:rPr>
+          <w:rFonts w:hint="eastAsia"/>
+        </w:rPr>
+        <w:t xml:space="preserve">基准、滞后平移检验、机制消融和过拟合压力测试。</w:t>
+      </w:r>
+    </w:p>
+    <w:p>
+      <w:pPr>
+        <w:numPr>
+          <w:ilvl w:val="0"/>
+          <w:numId w:val="1004"/>
+        </w:numPr>
+      </w:pPr>
+      <w:r>
+        <w:rPr>
+          <w:rFonts w:hint="eastAsia"/>
+        </w:rPr>
+        <w:t xml:space="preserve">数据口径保守：所有真实价格均来自附件</w:t>
+      </w:r>
+      <w:r>
+        <w:t xml:space="preserve"> </w:t>
+      </w:r>
+      <w:r>
+        <w:rPr>
+          <w:rFonts w:hint="eastAsia"/>
+        </w:rPr>
+        <w:t xml:space="preserve">CSV；外推阶段明确标注为情景预测，不作为真实观测。</w:t>
+      </w:r>
+    </w:p>
+    <w:bookmarkEnd w:id="95"/>
+    <w:bookmarkStart w:id="96" w:name="局限性"/>
+    <w:p>
+      <w:pPr>
+        <w:pStyle w:val="Heading2"/>
+      </w:pPr>
+      <w:r>
+        <w:rPr>
+          <w:rFonts w:hint="eastAsia"/>
+        </w:rPr>
+        <w:t xml:space="preserve">局限性</w:t>
       </w:r>
     </w:p>
     <w:p>
@@ -12327,16 +13623,16 @@
         <w:rPr>
           <w:rFonts w:hint="eastAsia"/>
         </w:rPr>
-        <w:t xml:space="preserve">在赛题低短期弹性假设下，传统供需模型会给出约</w:t>
-      </w:r>
-      <w:r>
-        <w:t xml:space="preserve"> 278–337 </w:t>
-      </w:r>
-      <w:r>
-        <w:rPr>
-          <w:rFonts w:hint="eastAsia"/>
-        </w:rPr>
-        <w:t xml:space="preserve">美元/桶的理论价格，显著高估附件真实价格。</w:t>
+        <w:t xml:space="preserve">冲突窗口只有</w:t>
+      </w:r>
+      <w:r>
+        <w:t xml:space="preserve"> 46 </w:t>
+      </w:r>
+      <w:r>
+        <w:rPr>
+          <w:rFonts w:hint="eastAsia"/>
+        </w:rPr>
+        <w:t xml:space="preserve">个交易日，参数自由度相对较高，尽管有压力测试和边界检验，仍不宜把模型包装为通用油价交易预测器。</w:t>
       </w:r>
     </w:p>
     <w:p>
@@ -12350,52 +13646,7 @@
         <w:rPr>
           <w:rFonts w:hint="eastAsia"/>
         </w:rPr>
-        <w:t xml:space="preserve">加入</w:t>
-      </w:r>
-      <w:r>
-        <w:t xml:space="preserve"> </w:t>
-      </w:r>
-      <w:r>
-        <w:rPr>
-          <w:rFonts w:hint="eastAsia"/>
-        </w:rPr>
-        <w:t xml:space="preserve">SPR、商业库存、绕道运输、需求收缩、恐慌衰减、地缘风险溢价和预期修复后，短期动态模型可将冲突窗口</w:t>
-      </w:r>
-      <w:r>
-        <w:t xml:space="preserve"> RMSE </w:t>
-      </w:r>
-      <w:r>
-        <w:rPr>
-          <w:rFonts w:hint="eastAsia"/>
-        </w:rPr>
-        <w:t xml:space="preserve">控制在</w:t>
-      </w:r>
-      <w:r>
-        <w:t xml:space="preserve"> 3.44 </w:t>
-      </w:r>
-      <w:r>
-        <w:rPr>
-          <w:rFonts w:hint="eastAsia"/>
-        </w:rPr>
-        <w:t xml:space="preserve">美元/桶，MAE</w:t>
-      </w:r>
-      <w:r>
-        <w:t xml:space="preserve"> </w:t>
-      </w:r>
-      <w:r>
-        <w:rPr>
-          <w:rFonts w:hint="eastAsia"/>
-        </w:rPr>
-        <w:t xml:space="preserve">控制在</w:t>
-      </w:r>
-      <w:r>
-        <w:t xml:space="preserve"> 2.85 </w:t>
-      </w:r>
-      <w:r>
-        <w:rPr>
-          <w:rFonts w:hint="eastAsia"/>
-        </w:rPr>
-        <w:t xml:space="preserve">美元/桶。</w:t>
+        <w:t xml:space="preserve">地缘风险、不确定性平台和预期修复仍以参数化方式刻画，未引入期权隐含波动率、真实库存周报或新闻情绪等外生数据。</w:t>
       </w:r>
     </w:p>
     <w:p>
@@ -12409,82 +13660,212 @@
         <w:rPr>
           <w:rFonts w:hint="eastAsia"/>
         </w:rPr>
-        <w:t xml:space="preserve">模型优于朴素上一日基准和滚动</w:t>
-      </w:r>
-      <w:r>
-        <w:t xml:space="preserve"> ARIMA </w:t>
-      </w:r>
-      <w:r>
-        <w:rPr>
-          <w:rFonts w:hint="eastAsia"/>
-        </w:rPr>
-        <w:t xml:space="preserve">基准，且通过滞后平移检验、机制消融和过拟合压力测试，具备较好的解释力和防御性。</w:t>
+        <w:t xml:space="preserve">单因素敏感性不能完全描述参数联动风险，因此悲观情景仍是判断二次跳涨风险的重要补充。</w:t>
+      </w:r>
+    </w:p>
+    <w:bookmarkEnd w:id="96"/>
+    <w:bookmarkEnd w:id="97"/>
+    <w:bookmarkStart w:id="98" w:name="结论"/>
+    <w:p>
+      <w:pPr>
+        <w:pStyle w:val="Heading1"/>
+      </w:pPr>
+      <w:r>
+        <w:rPr>
+          <w:rFonts w:hint="eastAsia"/>
+        </w:rPr>
+        <w:t xml:space="preserve">结论</w:t>
+      </w:r>
+    </w:p>
+    <w:p>
+      <w:pPr>
+        <w:pStyle w:val="FirstParagraph"/>
+      </w:pPr>
+      <w:r>
+        <w:rPr>
+          <w:rFonts w:hint="eastAsia"/>
+        </w:rPr>
+        <w:t xml:space="preserve">本文围绕霍尔木兹海峡封锁对国际原油价格的影响，建立了一套从传统供需上界到动态缓冲解释、再到</w:t>
+      </w:r>
+      <w:r>
+        <w:t xml:space="preserve"> 60–180 </w:t>
+      </w:r>
+      <w:r>
+        <w:rPr>
+          <w:rFonts w:hint="eastAsia"/>
+        </w:rPr>
+        <w:t xml:space="preserve">天情景预测与敏感性分析的完整模型。研究表明：</w:t>
       </w:r>
     </w:p>
     <w:p>
       <w:pPr>
         <w:numPr>
           <w:ilvl w:val="0"/>
-          <w:numId w:val="1005"/>
+          <w:numId w:val="1006"/>
         </w:numPr>
       </w:pPr>
       <w:r>
-        <w:t xml:space="preserve">60–180 </w:t>
-      </w:r>
-      <w:r>
-        <w:rPr>
-          <w:rFonts w:hint="eastAsia"/>
-        </w:rPr>
-        <w:t xml:space="preserve">天情景预测显示，中性情景第</w:t>
-      </w:r>
-      <w:r>
-        <w:t xml:space="preserve"> 180 </w:t>
-      </w:r>
-      <w:r>
-        <w:rPr>
-          <w:rFonts w:hint="eastAsia"/>
-        </w:rPr>
-        <w:t xml:space="preserve">天价格约为</w:t>
-      </w:r>
-      <w:r>
-        <w:t xml:space="preserve"> 104.49 </w:t>
-      </w:r>
-      <w:r>
-        <w:rPr>
-          <w:rFonts w:hint="eastAsia"/>
-        </w:rPr>
-        <w:t xml:space="preserve">美元/桶；悲观情景第</w:t>
-      </w:r>
-      <w:r>
-        <w:t xml:space="preserve"> 180 </w:t>
-      </w:r>
-      <w:r>
-        <w:rPr>
-          <w:rFonts w:hint="eastAsia"/>
-        </w:rPr>
-        <w:t xml:space="preserve">天约为</w:t>
-      </w:r>
-      <w:r>
-        <w:t xml:space="preserve"> 119.53 </w:t>
-      </w:r>
-      <w:r>
-        <w:rPr>
-          <w:rFonts w:hint="eastAsia"/>
-        </w:rPr>
-        <w:t xml:space="preserve">美元/桶，并存在较高二次跳涨风险。</w:t>
+        <w:rPr>
+          <w:rFonts w:hint="eastAsia"/>
+        </w:rPr>
+        <w:t xml:space="preserve">在赛题低短期弹性假设下，传统供需模型会给出约</w:t>
+      </w:r>
+      <w:r>
+        <w:t xml:space="preserve"> 278–337 </w:t>
+      </w:r>
+      <w:r>
+        <w:rPr>
+          <w:rFonts w:hint="eastAsia"/>
+        </w:rPr>
+        <w:t xml:space="preserve">美元/桶的理论价格，显著高估附件真实价格。</w:t>
       </w:r>
     </w:p>
     <w:p>
       <w:pPr>
         <w:numPr>
           <w:ilvl w:val="0"/>
-          <w:numId w:val="1005"/>
+          <w:numId w:val="1006"/>
         </w:numPr>
       </w:pPr>
       <w:r>
         <w:rPr>
           <w:rFonts w:hint="eastAsia"/>
         </w:rPr>
+        <w:t xml:space="preserve">加入</w:t>
+      </w:r>
+      <w:r>
+        <w:t xml:space="preserve"> </w:t>
+      </w:r>
+      <w:r>
+        <w:rPr>
+          <w:rFonts w:hint="eastAsia"/>
+        </w:rPr>
+        <w:t xml:space="preserve">SPR、商业库存、绕道运输、需求收缩、恐慌衰减、地缘风险溢价和预期修复后，短期动态模型可将冲突窗口</w:t>
+      </w:r>
+      <w:r>
+        <w:t xml:space="preserve"> RMSE </w:t>
+      </w:r>
+      <w:r>
+        <w:rPr>
+          <w:rFonts w:hint="eastAsia"/>
+        </w:rPr>
+        <w:t xml:space="preserve">控制在</w:t>
+      </w:r>
+      <w:r>
+        <w:t xml:space="preserve"> 3.44 </w:t>
+      </w:r>
+      <w:r>
+        <w:rPr>
+          <w:rFonts w:hint="eastAsia"/>
+        </w:rPr>
+        <w:t xml:space="preserve">美元/桶，MAE</w:t>
+      </w:r>
+      <w:r>
+        <w:t xml:space="preserve"> </w:t>
+      </w:r>
+      <w:r>
+        <w:rPr>
+          <w:rFonts w:hint="eastAsia"/>
+        </w:rPr>
+        <w:t xml:space="preserve">控制在</w:t>
+      </w:r>
+      <w:r>
+        <w:t xml:space="preserve"> 2.85 </w:t>
+      </w:r>
+      <w:r>
+        <w:rPr>
+          <w:rFonts w:hint="eastAsia"/>
+        </w:rPr>
+        <w:t xml:space="preserve">美元/桶。</w:t>
+      </w:r>
+    </w:p>
+    <w:p>
+      <w:pPr>
+        <w:numPr>
+          <w:ilvl w:val="0"/>
+          <w:numId w:val="1006"/>
+        </w:numPr>
+      </w:pPr>
+      <w:r>
+        <w:rPr>
+          <w:rFonts w:hint="eastAsia"/>
+        </w:rPr>
+        <w:t xml:space="preserve">模型优于朴素上一日基准和滚动</w:t>
+      </w:r>
+      <w:r>
+        <w:t xml:space="preserve"> ARIMA </w:t>
+      </w:r>
+      <w:r>
+        <w:rPr>
+          <w:rFonts w:hint="eastAsia"/>
+        </w:rPr>
+        <w:t xml:space="preserve">基准，且通过滞后平移检验、机制消融和过拟合压力测试，具备较好的解释力和防御性。</w:t>
+      </w:r>
+    </w:p>
+    <w:p>
+      <w:pPr>
+        <w:numPr>
+          <w:ilvl w:val="0"/>
+          <w:numId w:val="1006"/>
+        </w:numPr>
+      </w:pPr>
+      <w:r>
+        <w:t xml:space="preserve">60–180 </w:t>
+      </w:r>
+      <w:r>
+        <w:rPr>
+          <w:rFonts w:hint="eastAsia"/>
+        </w:rPr>
+        <w:t xml:space="preserve">天情景预测显示，中性情景第</w:t>
+      </w:r>
+      <w:r>
+        <w:t xml:space="preserve"> 180 </w:t>
+      </w:r>
+      <w:r>
+        <w:rPr>
+          <w:rFonts w:hint="eastAsia"/>
+        </w:rPr>
+        <w:t xml:space="preserve">天价格约为</w:t>
+      </w:r>
+      <w:r>
+        <w:t xml:space="preserve"> 104.49 </w:t>
+      </w:r>
+      <w:r>
+        <w:rPr>
+          <w:rFonts w:hint="eastAsia"/>
+        </w:rPr>
+        <w:t xml:space="preserve">美元/桶；悲观情景第</w:t>
+      </w:r>
+      <w:r>
+        <w:t xml:space="preserve"> 180 </w:t>
+      </w:r>
+      <w:r>
+        <w:rPr>
+          <w:rFonts w:hint="eastAsia"/>
+        </w:rPr>
+        <w:t xml:space="preserve">天约为</w:t>
+      </w:r>
+      <w:r>
+        <w:t xml:space="preserve"> 119.53 </w:t>
+      </w:r>
+      <w:r>
+        <w:rPr>
+          <w:rFonts w:hint="eastAsia"/>
+        </w:rPr>
+        <w:t xml:space="preserve">美元/桶，并存在较高二次跳涨风险。</w:t>
+      </w:r>
+    </w:p>
+    <w:p>
+      <w:pPr>
+        <w:numPr>
+          <w:ilvl w:val="0"/>
+          <w:numId w:val="1006"/>
+        </w:numPr>
+      </w:pPr>
+      <w:r>
+        <w:rPr>
+          <w:rFonts w:hint="eastAsia"/>
+        </w:rPr>
         <w:t xml:space="preserve">敏感性分析显示，不确定性平台、地缘风险权重和供应中断量是最关键影响因素；SPR</w:t>
       </w:r>
       <w:r>
@@ -12520,16 +13901,23 @@
         <w:t xml:space="preserve">问题，而应被理解为物理缺口、政策缓冲、库存约束、替代运输和市场风险预期共同作用下的动态系统。</w:t>
       </w:r>
     </w:p>
-    <w:p>
-      <w:pPr>
-        <w:pStyle w:val="BodyText"/>
-      </w:pPr>
-      <w:r>
-        <w:t xml:space="preserve">99</w:t>
-      </w:r>
-      <w:r>
-        <w:t xml:space="preserve"> </w:t>
-      </w:r>
+    <w:bookmarkEnd w:id="98"/>
+    <w:bookmarkStart w:id="100" w:name="参考文献"/>
+    <w:p>
+      <w:pPr>
+        <w:pStyle w:val="Heading1"/>
+      </w:pPr>
+      <w:r>
+        <w:rPr>
+          <w:rFonts w:hint="eastAsia"/>
+        </w:rPr>
+        <w:t xml:space="preserve">参考文献</w:t>
+      </w:r>
+    </w:p>
+    <w:p>
+      <w:pPr>
+        <w:pStyle w:val="FirstParagraph"/>
+      </w:pPr>
       <w:r>
         <w:t xml:space="preserve">Kilian, L. (2009). Not All Oil Price Shocks Are Alike: Disentangling Demand and Supply Shocks in the Crude Oil Market.</w:t>
       </w:r>
@@ -12683,16 +14071,19 @@
       <w:r>
         <w:t xml:space="preserve"> </w:t>
       </w:r>
-      <w:hyperlink r:id="rId95">
+      <w:hyperlink r:id="rId99">
         <w:r>
           <w:rPr>
             <w:rStyle w:val="Hyperlink"/>
           </w:rPr>
-          <w:t xml:space="preserve">https://www.eia.gov/international/analysis/special-topics/World_Oil_Transit_Chokepoints</w:t>
+          <w:t xml:space="preserve">EIA special topic page</w:t>
         </w:r>
       </w:hyperlink>
-    </w:p>
-    <w:bookmarkEnd w:id="96"/>
+      <w:r>
+        <w:t xml:space="preserve">.</w:t>
+      </w:r>
+    </w:p>
+    <w:bookmarkEnd w:id="100"/>
     <w:sectPr>
       <w:footnotePr>
         <w:numRestart w:val="eachSect"/>
@@ -13012,6 +14403,36 @@
     </w:lvlOverride>
   </w:num>
   <w:num w:numId="1005">
+    <w:abstractNumId w:val="99201"/>
+    <w:lvlOverride w:ilvl="0">
+      <w:startOverride w:val="1"/>
+    </w:lvlOverride>
+    <w:lvlOverride w:ilvl="1">
+      <w:startOverride w:val="1"/>
+    </w:lvlOverride>
+    <w:lvlOverride w:ilvl="2">
+      <w:startOverride w:val="1"/>
+    </w:lvlOverride>
+    <w:lvlOverride w:ilvl="3">
+      <w:startOverride w:val="1"/>
+    </w:lvlOverride>
+    <w:lvlOverride w:ilvl="4">
+      <w:startOverride w:val="1"/>
+    </w:lvlOverride>
+    <w:lvlOverride w:ilvl="5">
+      <w:startOverride w:val="1"/>
+    </w:lvlOverride>
+    <w:lvlOverride w:ilvl="6">
+      <w:startOverride w:val="1"/>
+    </w:lvlOverride>
+    <w:lvlOverride w:ilvl="7">
+      <w:startOverride w:val="1"/>
+    </w:lvlOverride>
+    <w:lvlOverride w:ilvl="8">
+      <w:startOverride w:val="1"/>
+    </w:lvlOverride>
+  </w:num>
+  <w:num w:numId="1006">
     <w:abstractNumId w:val="99201"/>
     <w:lvlOverride w:ilvl="0">
       <w:startOverride w:val="1"/>

</xml_diff>

<commit_message>
Polish final paper with template structure
</commit_message>
<xml_diff>
--- a/output/final/总论文.docx
+++ b/output/final/总论文.docx
@@ -79,7 +79,259 @@
         <w:rPr>
           <w:rFonts w:hint="eastAsia"/>
         </w:rPr>
-        <w:t xml:space="preserve">霍尔木兹海峡是全球原油运输的关键咽喉，一旦发生封锁，供应中断、地缘风险重估、战略储备释放、商业库存缓冲、绕道运输恢复和市场预期修复会同时作用于国际原油价格。本文以附件给出的布伦特原油期货主力合约价格数据为基础，建立了从静态供需上界到动态递推解释、再到</w:t>
+        <w:t xml:space="preserve">霍尔木兹海峡是全球原油运输的关键咽喉。一旦发生封锁，供应中断、地缘风险重估、战略储备释放、商业库存缓冲、绕道运输恢复和市场预期修复会同时作用于国际原油价格。本文以附件给出的布伦特原油期货主力合约价格数据为基础，建立了</w:t>
+      </w:r>
+      <w:r>
+        <w:rPr>
+          <w:rFonts w:hint="eastAsia"/>
+        </w:rPr>
+        <w:t xml:space="preserve">“附件数据清洗–传统供需基准–短期动态递推–长期情景预测–敏感性分析”</w:t>
+      </w:r>
+      <w:r>
+        <w:rPr>
+          <w:rFonts w:hint="eastAsia"/>
+        </w:rPr>
+        <w:t xml:space="preserve">的完整模型链条。</w:t>
+      </w:r>
+    </w:p>
+    <w:p>
+      <w:pPr>
+        <w:pStyle w:val="BodyText"/>
+      </w:pPr>
+      <w:r>
+        <w:rPr>
+          <w:rFonts w:hint="eastAsia"/>
+        </w:rPr>
+        <w:t xml:space="preserve">针对任务一，本文首先清洗</w:t>
+      </w:r>
+      <w:r>
+        <w:t xml:space="preserve"> 2017 </w:t>
+      </w:r>
+      <w:r>
+        <w:rPr>
+          <w:rFonts w:hint="eastAsia"/>
+        </w:rPr>
+        <w:t xml:space="preserve">年</w:t>
+      </w:r>
+      <w:r>
+        <w:t xml:space="preserve"> 9 </w:t>
+      </w:r>
+      <w:r>
+        <w:rPr>
+          <w:rFonts w:hint="eastAsia"/>
+        </w:rPr>
+        <w:t xml:space="preserve">月至</w:t>
+      </w:r>
+      <w:r>
+        <w:t xml:space="preserve"> 2026 </w:t>
+      </w:r>
+      <w:r>
+        <w:rPr>
+          <w:rFonts w:hint="eastAsia"/>
+        </w:rPr>
+        <w:t xml:space="preserve">年</w:t>
+      </w:r>
+      <w:r>
+        <w:t xml:space="preserve"> 5 </w:t>
+      </w:r>
+      <w:r>
+        <w:rPr>
+          <w:rFonts w:hint="eastAsia"/>
+        </w:rPr>
+        <w:t xml:space="preserve">月的原始价格序列，并截取</w:t>
+      </w:r>
+      <w:r>
+        <w:t xml:space="preserve"> 2026 </w:t>
+      </w:r>
+      <w:r>
+        <w:rPr>
+          <w:rFonts w:hint="eastAsia"/>
+        </w:rPr>
+        <w:t xml:space="preserve">年</w:t>
+      </w:r>
+      <w:r>
+        <w:t xml:space="preserve"> 3 </w:t>
+      </w:r>
+      <w:r>
+        <w:rPr>
+          <w:rFonts w:hint="eastAsia"/>
+        </w:rPr>
+        <w:t xml:space="preserve">月</w:t>
+      </w:r>
+      <w:r>
+        <w:t xml:space="preserve"> 2 </w:t>
+      </w:r>
+      <w:r>
+        <w:rPr>
+          <w:rFonts w:hint="eastAsia"/>
+        </w:rPr>
+        <w:t xml:space="preserve">日至</w:t>
+      </w:r>
+      <w:r>
+        <w:t xml:space="preserve"> 2026 </w:t>
+      </w:r>
+      <w:r>
+        <w:rPr>
+          <w:rFonts w:hint="eastAsia"/>
+        </w:rPr>
+        <w:t xml:space="preserve">年</w:t>
+      </w:r>
+      <w:r>
+        <w:t xml:space="preserve"> 5 </w:t>
+      </w:r>
+      <w:r>
+        <w:rPr>
+          <w:rFonts w:hint="eastAsia"/>
+        </w:rPr>
+        <w:t xml:space="preserve">月</w:t>
+      </w:r>
+      <w:r>
+        <w:t xml:space="preserve"> 5 </w:t>
+      </w:r>
+      <w:r>
+        <w:rPr>
+          <w:rFonts w:hint="eastAsia"/>
+        </w:rPr>
+        <w:t xml:space="preserve">日的冲突窗口作为主要拟合区间。附件数据显示，冲突窗口内最高收盘价为</w:t>
+      </w:r>
+      <w:r>
+        <w:t xml:space="preserve"> 114.06 </w:t>
+      </w:r>
+      <w:r>
+        <w:rPr>
+          <w:rFonts w:hint="eastAsia"/>
+        </w:rPr>
+        <w:t xml:space="preserve">美元/桶，最高盘中价为</w:t>
+      </w:r>
+      <w:r>
+        <w:t xml:space="preserve"> 119.50 </w:t>
+      </w:r>
+      <w:r>
+        <w:rPr>
+          <w:rFonts w:hint="eastAsia"/>
+        </w:rPr>
+        <w:t xml:space="preserve">美元/桶。随后，本文按题面给定的短期低需求弹性和供应中断范围建立传统供需基准模型，得到约</w:t>
+      </w:r>
+      <w:r>
+        <w:t xml:space="preserve"> 278–337 </w:t>
+      </w:r>
+      <w:r>
+        <w:rPr>
+          <w:rFonts w:hint="eastAsia"/>
+        </w:rPr>
+        <w:t xml:space="preserve">美元/桶的理论价格区间。该结果显著高于附件真实价格，说明单纯低弹性供需框架会高估现实价格，必须进一步刻画政策缓冲和市场预期修复。</w:t>
+      </w:r>
+    </w:p>
+    <w:p>
+      <w:pPr>
+        <w:pStyle w:val="BodyText"/>
+      </w:pPr>
+      <w:r>
+        <w:rPr>
+          <w:rFonts w:hint="eastAsia"/>
+        </w:rPr>
+        <w:t xml:space="preserve">针对任务一中的日度价格解释，本文构建短期动态递推模型。模型在物理供需层纳入供应中断、SPR</w:t>
+      </w:r>
+      <w:r>
+        <w:t xml:space="preserve"> </w:t>
+      </w:r>
+      <w:r>
+        <w:rPr>
+          <w:rFonts w:hint="eastAsia"/>
+        </w:rPr>
+        <w:t xml:space="preserve">释放、商业库存、绕道运输、需求收缩和恐慌衰减，在市场价格形成层纳入地缘风险溢价、不确定性平台、缓冲确认折价和预期修复折价。通过固定种子随机搜索、差分进化连续精修、局部稳健性复核和拟合质量精修，综合最优模型在</w:t>
+      </w:r>
+      <w:r>
+        <w:t xml:space="preserve"> 46 </w:t>
+      </w:r>
+      <w:r>
+        <w:rPr>
+          <w:rFonts w:hint="eastAsia"/>
+        </w:rPr>
+        <w:t xml:space="preserve">个交易日冲突窗口内取得</w:t>
+      </w:r>
+      <w:r>
+        <w:t xml:space="preserve"> RMSE </w:t>
+      </w:r>
+      <w:r>
+        <w:rPr>
+          <w:rFonts w:hint="eastAsia"/>
+        </w:rPr>
+        <w:t xml:space="preserve">为</w:t>
+      </w:r>
+      <w:r>
+        <w:t xml:space="preserve"> 3.44 </w:t>
+      </w:r>
+      <w:r>
+        <w:rPr>
+          <w:rFonts w:hint="eastAsia"/>
+        </w:rPr>
+        <w:t xml:space="preserve">美元/桶、MAE</w:t>
+      </w:r>
+      <w:r>
+        <w:t xml:space="preserve"> </w:t>
+      </w:r>
+      <w:r>
+        <w:rPr>
+          <w:rFonts w:hint="eastAsia"/>
+        </w:rPr>
+        <w:t xml:space="preserve">为</w:t>
+      </w:r>
+      <w:r>
+        <w:t xml:space="preserve"> 2.85 </w:t>
+      </w:r>
+      <w:r>
+        <w:rPr>
+          <w:rFonts w:hint="eastAsia"/>
+        </w:rPr>
+        <w:t xml:space="preserve">美元/桶、MAPE</w:t>
+      </w:r>
+      <w:r>
+        <w:t xml:space="preserve"> </w:t>
+      </w:r>
+      <w:r>
+        <w:rPr>
+          <w:rFonts w:hint="eastAsia"/>
+        </w:rPr>
+        <w:t xml:space="preserve">为</w:t>
+      </w:r>
+      <w:r>
+        <w:t xml:space="preserve"> 2.86% </w:t>
+      </w:r>
+      <w:r>
+        <w:rPr>
+          <w:rFonts w:hint="eastAsia"/>
+        </w:rPr>
+        <w:t xml:space="preserve">的拟合效果，并优于上一日价格朴素基准和滚动</w:t>
+      </w:r>
+      <w:r>
+        <w:t xml:space="preserve"> ARIMA </w:t>
+      </w:r>
+      <w:r>
+        <w:rPr>
+          <w:rFonts w:hint="eastAsia"/>
+        </w:rPr>
+        <w:t xml:space="preserve">基准。滞后平移检验、拐点检验、机制消融、过拟合压力测试和硬编码审计表明，该模型不是简单滞后复制，也没有把</w:t>
+      </w:r>
+      <w:r>
+        <w:t xml:space="preserve"> 120 </w:t>
+      </w:r>
+      <w:r>
+        <w:rPr>
+          <w:rFonts w:hint="eastAsia"/>
+        </w:rPr>
+        <w:t xml:space="preserve">美元平台写成代码上限。</w:t>
+      </w:r>
+    </w:p>
+    <w:p>
+      <w:pPr>
+        <w:pStyle w:val="BodyText"/>
+      </w:pPr>
+      <w:r>
+        <w:rPr>
+          <w:rFonts w:hint="eastAsia"/>
+        </w:rPr>
+        <w:t xml:space="preserve">针对任务二，本文在短期机制校准结果基础上构建</w:t>
       </w:r>
       <w:r>
         <w:t xml:space="preserve"> 60–180 </w:t>
@@ -88,238 +340,7 @@
         <w:rPr>
           <w:rFonts w:hint="eastAsia"/>
         </w:rPr>
-        <w:t xml:space="preserve">天情景预测与敏感性分析的完整模型链条。</w:t>
-      </w:r>
-    </w:p>
-    <w:p>
-      <w:pPr>
-        <w:pStyle w:val="BodyText"/>
-      </w:pPr>
-      <w:r>
-        <w:rPr>
-          <w:rFonts w:hint="eastAsia"/>
-        </w:rPr>
-        <w:t xml:space="preserve">首先，本文完成</w:t>
-      </w:r>
-      <w:r>
-        <w:t xml:space="preserve"> 2017 </w:t>
-      </w:r>
-      <w:r>
-        <w:rPr>
-          <w:rFonts w:hint="eastAsia"/>
-        </w:rPr>
-        <w:t xml:space="preserve">年</w:t>
-      </w:r>
-      <w:r>
-        <w:t xml:space="preserve"> 9 </w:t>
-      </w:r>
-      <w:r>
-        <w:rPr>
-          <w:rFonts w:hint="eastAsia"/>
-        </w:rPr>
-        <w:t xml:space="preserve">月至</w:t>
-      </w:r>
-      <w:r>
-        <w:t xml:space="preserve"> 2026 </w:t>
-      </w:r>
-      <w:r>
-        <w:rPr>
-          <w:rFonts w:hint="eastAsia"/>
-        </w:rPr>
-        <w:t xml:space="preserve">年</w:t>
-      </w:r>
-      <w:r>
-        <w:t xml:space="preserve"> 5 </w:t>
-      </w:r>
-      <w:r>
-        <w:rPr>
-          <w:rFonts w:hint="eastAsia"/>
-        </w:rPr>
-        <w:t xml:space="preserve">月的原始价格序列清洗，截取</w:t>
-      </w:r>
-      <w:r>
-        <w:t xml:space="preserve"> 2026 </w:t>
-      </w:r>
-      <w:r>
-        <w:rPr>
-          <w:rFonts w:hint="eastAsia"/>
-        </w:rPr>
-        <w:t xml:space="preserve">年</w:t>
-      </w:r>
-      <w:r>
-        <w:t xml:space="preserve"> 3 </w:t>
-      </w:r>
-      <w:r>
-        <w:rPr>
-          <w:rFonts w:hint="eastAsia"/>
-        </w:rPr>
-        <w:t xml:space="preserve">月</w:t>
-      </w:r>
-      <w:r>
-        <w:t xml:space="preserve"> 2 </w:t>
-      </w:r>
-      <w:r>
-        <w:rPr>
-          <w:rFonts w:hint="eastAsia"/>
-        </w:rPr>
-        <w:t xml:space="preserve">日至</w:t>
-      </w:r>
-      <w:r>
-        <w:t xml:space="preserve"> 2026 </w:t>
-      </w:r>
-      <w:r>
-        <w:rPr>
-          <w:rFonts w:hint="eastAsia"/>
-        </w:rPr>
-        <w:t xml:space="preserve">年</w:t>
-      </w:r>
-      <w:r>
-        <w:t xml:space="preserve"> 5 </w:t>
-      </w:r>
-      <w:r>
-        <w:rPr>
-          <w:rFonts w:hint="eastAsia"/>
-        </w:rPr>
-        <w:t xml:space="preserve">月</w:t>
-      </w:r>
-      <w:r>
-        <w:t xml:space="preserve"> 5 </w:t>
-      </w:r>
-      <w:r>
-        <w:rPr>
-          <w:rFonts w:hint="eastAsia"/>
-        </w:rPr>
-        <w:t xml:space="preserve">日的冲突窗口作为主要拟合区间。数据表明，冲突窗口内最高收盘价为</w:t>
-      </w:r>
-      <w:r>
-        <w:t xml:space="preserve"> 114.06 </w:t>
-      </w:r>
-      <w:r>
-        <w:rPr>
-          <w:rFonts w:hint="eastAsia"/>
-        </w:rPr>
-        <w:t xml:space="preserve">美元/桶，最高盘中价为</w:t>
-      </w:r>
-      <w:r>
-        <w:t xml:space="preserve"> 119.50 </w:t>
-      </w:r>
-      <w:r>
-        <w:rPr>
-          <w:rFonts w:hint="eastAsia"/>
-        </w:rPr>
-        <w:t xml:space="preserve">美元/桶。其次，本文以题面给出的短期需求价格弹性和供应中断范围构造传统供需基准模型。在线性化低弹性口径下，传统模型给出约</w:t>
-      </w:r>
-      <w:r>
-        <w:t xml:space="preserve"> 278–337 </w:t>
-      </w:r>
-      <w:r>
-        <w:rPr>
-          <w:rFonts w:hint="eastAsia"/>
-        </w:rPr>
-        <w:t xml:space="preserve">美元/桶的理论价格区间，明显高于附件数据观测水平，说明必须引入缓冲机制和市场预期机制。</w:t>
-      </w:r>
-    </w:p>
-    <w:p>
-      <w:pPr>
-        <w:pStyle w:val="BodyText"/>
-      </w:pPr>
-      <w:r>
-        <w:rPr>
-          <w:rFonts w:hint="eastAsia"/>
-        </w:rPr>
-        <w:t xml:space="preserve">为解释现实价格路径，本文构建短期动态递推模型。模型在题面物理供需层纳入供应中断、SPR</w:t>
-      </w:r>
-      <w:r>
-        <w:t xml:space="preserve"> </w:t>
-      </w:r>
-      <w:r>
-        <w:rPr>
-          <w:rFonts w:hint="eastAsia"/>
-        </w:rPr>
-        <w:t xml:space="preserve">释放、商业库存、绕道运输、需求收缩和恐慌衰减，在市场价格形成层纳入地缘风险溢价、不确定性平台、缓冲确认折价和预期修复折价。通过固定种子随机搜索、差分进化连续精修、局部稳健性复核和拟合质量精修，综合最优模型在</w:t>
-      </w:r>
-      <w:r>
-        <w:t xml:space="preserve"> 46 </w:t>
-      </w:r>
-      <w:r>
-        <w:rPr>
-          <w:rFonts w:hint="eastAsia"/>
-        </w:rPr>
-        <w:t xml:space="preserve">个交易日冲突窗口内取得</w:t>
-      </w:r>
-      <w:r>
-        <w:t xml:space="preserve"> RMSE </w:t>
-      </w:r>
-      <w:r>
-        <w:rPr>
-          <w:rFonts w:hint="eastAsia"/>
-        </w:rPr>
-        <w:t xml:space="preserve">为</w:t>
-      </w:r>
-      <w:r>
-        <w:t xml:space="preserve"> 3.44 </w:t>
-      </w:r>
-      <w:r>
-        <w:rPr>
-          <w:rFonts w:hint="eastAsia"/>
-        </w:rPr>
-        <w:t xml:space="preserve">美元/桶、MAE</w:t>
-      </w:r>
-      <w:r>
-        <w:t xml:space="preserve"> </w:t>
-      </w:r>
-      <w:r>
-        <w:rPr>
-          <w:rFonts w:hint="eastAsia"/>
-        </w:rPr>
-        <w:t xml:space="preserve">为</w:t>
-      </w:r>
-      <w:r>
-        <w:t xml:space="preserve"> 2.85 </w:t>
-      </w:r>
-      <w:r>
-        <w:rPr>
-          <w:rFonts w:hint="eastAsia"/>
-        </w:rPr>
-        <w:t xml:space="preserve">美元/桶的拟合效果，并优于上一日价格朴素基准和滚动</w:t>
-      </w:r>
-      <w:r>
-        <w:t xml:space="preserve"> ARIMA </w:t>
-      </w:r>
-      <w:r>
-        <w:rPr>
-          <w:rFonts w:hint="eastAsia"/>
-        </w:rPr>
-        <w:t xml:space="preserve">基准。进一步的滞后平移检验、拐点检验、机制消融、过拟合压力测试和硬编码审计表明，该模型不是简单滞后复制，也没有把</w:t>
-      </w:r>
-      <w:r>
-        <w:t xml:space="preserve"> 120 </w:t>
-      </w:r>
-      <w:r>
-        <w:rPr>
-          <w:rFonts w:hint="eastAsia"/>
-        </w:rPr>
-        <w:t xml:space="preserve">美元平台写成代码上限。</w:t>
-      </w:r>
-    </w:p>
-    <w:p>
-      <w:pPr>
-        <w:pStyle w:val="BodyText"/>
-      </w:pPr>
-      <w:r>
-        <w:rPr>
-          <w:rFonts w:hint="eastAsia"/>
-        </w:rPr>
-        <w:t xml:space="preserve">在此基础上，本文构建乐观、中性、悲观三种</w:t>
-      </w:r>
-      <w:r>
-        <w:t xml:space="preserve"> 60–180 </w:t>
-      </w:r>
-      <w:r>
-        <w:rPr>
-          <w:rFonts w:hint="eastAsia"/>
-        </w:rPr>
-        <w:t xml:space="preserve">天情景路径。中性情景第</w:t>
+        <w:t xml:space="preserve">天乐观、中性、悲观三种情景路径。中性情景第</w:t>
       </w:r>
       <w:r>
         <w:t xml:space="preserve"> 180 </w:t>
@@ -753,7 +774,7 @@
       </w:tr>
     </w:tbl>
     <w:bookmarkEnd w:id="9"/>
-    <w:bookmarkStart w:id="21" w:name="数据处理与描述性分析"/>
+    <w:bookmarkStart w:id="13" w:name="问题分析与总体思路"/>
     <w:p>
       <w:pPr>
         <w:pStyle w:val="Heading1"/>
@@ -762,10 +783,184 @@
         <w:rPr>
           <w:rFonts w:hint="eastAsia"/>
         </w:rPr>
+        <w:t xml:space="preserve">问题分析与总体思路</w:t>
+      </w:r>
+    </w:p>
+    <w:p>
+      <w:pPr>
+        <w:pStyle w:val="FirstParagraph"/>
+      </w:pPr>
+      <w:r>
+        <w:rPr>
+          <w:rFonts w:hint="eastAsia"/>
+        </w:rPr>
+        <w:t xml:space="preserve">本题的难点不在于直接套用一个时间序列模型，而在于解释</w:t>
+      </w:r>
+      <w:r>
+        <w:rPr>
+          <w:rFonts w:hint="eastAsia"/>
+        </w:rPr>
+        <w:t xml:space="preserve">“为什么低弹性供需冲击会给出很高理论价格，而附件真实价格却停留在约</w:t>
+      </w:r>
+      <w:r>
+        <w:t xml:space="preserve"> 110–120 </w:t>
+      </w:r>
+      <w:r>
+        <w:rPr>
+          <w:rFonts w:hint="eastAsia"/>
+        </w:rPr>
+        <w:t xml:space="preserve">美元/桶的平台附近”</w:t>
+      </w:r>
+      <w:r>
+        <w:rPr>
+          <w:rFonts w:hint="eastAsia"/>
+        </w:rPr>
+        <w:t xml:space="preserve">。因此，本文将建模思路分成三条互相支撑的证据线。</w:t>
+      </w:r>
+    </w:p>
+    <w:p>
+      <w:pPr>
+        <w:numPr>
+          <w:ilvl w:val="0"/>
+          <w:numId w:val="1002"/>
+        </w:numPr>
+      </w:pPr>
+      <w:r>
+        <w:rPr>
+          <w:rFonts w:hint="eastAsia"/>
+        </w:rPr>
+        <w:t xml:space="preserve">先建立传统供需基准，用题面低短期弹性和供应中断范围计算无缓冲理论上界，作为后续动态模型的反事实参照。</w:t>
+      </w:r>
+    </w:p>
+    <w:p>
+      <w:pPr>
+        <w:numPr>
+          <w:ilvl w:val="0"/>
+          <w:numId w:val="1002"/>
+        </w:numPr>
+      </w:pPr>
+      <w:r>
+        <w:rPr>
+          <w:rFonts w:hint="eastAsia"/>
+        </w:rPr>
+        <w:t xml:space="preserve">再建立短期动态递推模型，把</w:t>
+      </w:r>
+      <w:r>
+        <w:t xml:space="preserve"> </w:t>
+      </w:r>
+      <w:r>
+        <w:rPr>
+          <w:rFonts w:hint="eastAsia"/>
+        </w:rPr>
+        <w:t xml:space="preserve">SPR、商业库存、绕道运输、需求收缩、恐慌衰减和预期修复纳入同一日度递推框架，解释附件冲突窗口内的真实价格路径。</w:t>
+      </w:r>
+    </w:p>
+    <w:p>
+      <w:pPr>
+        <w:numPr>
+          <w:ilvl w:val="0"/>
+          <w:numId w:val="1002"/>
+        </w:numPr>
+      </w:pPr>
+      <w:r>
+        <w:rPr>
+          <w:rFonts w:hint="eastAsia"/>
+        </w:rPr>
+        <w:t xml:space="preserve">最后建立</w:t>
+      </w:r>
+      <w:r>
+        <w:t xml:space="preserve"> 60–180 </w:t>
+      </w:r>
+      <w:r>
+        <w:rPr>
+          <w:rFonts w:hint="eastAsia"/>
+        </w:rPr>
+        <w:t xml:space="preserve">天三情景预测模型，并通过敏感性分析识别影响长期价格平衡点和二次跳涨风险的关键变量。</w:t>
+      </w:r>
+    </w:p>
+    <w:p>
+      <w:pPr>
+        <w:pStyle w:val="CaptionedFigure"/>
+      </w:pPr>
+      <w:r>
+        <w:drawing>
+          <wp:inline>
+            <wp:extent cx="5120640" cy="2901696"/>
+            <wp:effectExtent b="0" l="0" r="0" t="0"/>
+            <wp:docPr descr="" title="" id="11" name="Picture"/>
+            <a:graphic>
+              <a:graphicData uri="http://schemas.openxmlformats.org/drawingml/2006/picture">
+                <pic:pic>
+                  <pic:nvPicPr>
+                    <pic:cNvPr descr="论文总体技术路线图.png" id="12" name="Picture"/>
+                    <pic:cNvPicPr>
+                      <a:picLocks noChangeArrowheads="1" noChangeAspect="1"/>
+                    </pic:cNvPicPr>
+                  </pic:nvPicPr>
+                  <pic:blipFill>
+                    <a:blip r:embed="rId10"/>
+                    <a:stretch>
+                      <a:fillRect/>
+                    </a:stretch>
+                  </pic:blipFill>
+                  <pic:spPr bwMode="auto">
+                    <a:xfrm>
+                      <a:off x="0" y="0"/>
+                      <a:ext cx="5120640" cy="2901696"/>
+                    </a:xfrm>
+                    <a:prstGeom prst="rect">
+                      <a:avLst/>
+                    </a:prstGeom>
+                    <a:noFill/>
+                    <a:ln w="9525">
+                      <a:noFill/>
+                      <a:headEnd/>
+                      <a:tailEnd/>
+                    </a:ln>
+                  </pic:spPr>
+                </pic:pic>
+              </a:graphicData>
+            </a:graphic>
+          </wp:inline>
+        </w:drawing>
+      </w:r>
+    </w:p>
+    <w:p>
+      <w:pPr>
+        <w:pStyle w:val="ImageCaption"/>
+      </w:pPr>
+      <w:r>
+        <w:rPr>
+          <w:rFonts w:hint="eastAsia"/>
+        </w:rPr>
+        <w:t xml:space="preserve">本文总体技术路线。模型从附件真实数据出发，先解释短期价格平台，再外推长期情景风险。</w:t>
+      </w:r>
+    </w:p>
+    <w:p>
+      <w:pPr>
+        <w:pStyle w:val="BodyText"/>
+      </w:pPr>
+      <w:r>
+        <w:rPr>
+          <w:rFonts w:hint="eastAsia"/>
+        </w:rPr>
+        <w:t xml:space="preserve">这一技术路线的核心原则是：真实价格只来自附件数据；长期部分只作情景预测，不伪装成拟合；模型检验必须主动面对朴素基准、滞后复制、参数过拟合和硬编码上限等潜在质疑。</w:t>
+      </w:r>
+    </w:p>
+    <w:bookmarkEnd w:id="13"/>
+    <w:bookmarkStart w:id="25" w:name="数据处理与描述性分析"/>
+    <w:p>
+      <w:pPr>
+        <w:pStyle w:val="Heading1"/>
+      </w:pPr>
+      <w:r>
+        <w:rPr>
+          <w:rFonts w:hint="eastAsia"/>
+        </w:rPr>
         <w:t xml:space="preserve">数据处理与描述性分析</w:t>
       </w:r>
     </w:p>
-    <w:bookmarkStart w:id="16" w:name="数据来源与清洗口径"/>
+    <w:bookmarkStart w:id="20" w:name="数据来源与清洗口径"/>
     <w:p>
       <w:pPr>
         <w:pStyle w:val="Heading2"/>
@@ -1256,18 +1451,18 @@
           <wp:inline>
             <wp:extent cx="4907280" cy="2453640"/>
             <wp:effectExtent b="0" l="0" r="0" t="0"/>
-            <wp:docPr descr="" title="" id="11" name="Picture"/>
+            <wp:docPr descr="" title="" id="15" name="Picture"/>
             <a:graphic>
               <a:graphicData uri="http://schemas.openxmlformats.org/drawingml/2006/picture">
                 <pic:pic>
                   <pic:nvPicPr>
-                    <pic:cNvPr descr="price_trend.png" id="12" name="Picture"/>
+                    <pic:cNvPr descr="price_trend.png" id="16" name="Picture"/>
                     <pic:cNvPicPr>
                       <a:picLocks noChangeArrowheads="1" noChangeAspect="1"/>
                     </pic:cNvPicPr>
                   </pic:nvPicPr>
                   <pic:blipFill>
-                    <a:blip r:embed="rId10"/>
+                    <a:blip r:embed="rId14"/>
                     <a:stretch>
                       <a:fillRect/>
                     </a:stretch>
@@ -1314,18 +1509,18 @@
           <wp:inline>
             <wp:extent cx="4907280" cy="2453640"/>
             <wp:effectExtent b="0" l="0" r="0" t="0"/>
-            <wp:docPr descr="" title="" id="14" name="Picture"/>
+            <wp:docPr descr="" title="" id="18" name="Picture"/>
             <a:graphic>
               <a:graphicData uri="http://schemas.openxmlformats.org/drawingml/2006/picture">
                 <pic:pic>
                   <pic:nvPicPr>
-                    <pic:cNvPr descr="event_window_price.png" id="15" name="Picture"/>
+                    <pic:cNvPr descr="event_window_price.png" id="19" name="Picture"/>
                     <pic:cNvPicPr>
                       <a:picLocks noChangeArrowheads="1" noChangeAspect="1"/>
                     </pic:cNvPicPr>
                   </pic:nvPicPr>
                   <pic:blipFill>
-                    <a:blip r:embed="rId13"/>
+                    <a:blip r:embed="rId17"/>
                     <a:stretch>
                       <a:fillRect/>
                     </a:stretch>
@@ -1363,8 +1558,8 @@
         <w:t xml:space="preserve">冲突窗口内附件真实价格路径。</w:t>
       </w:r>
     </w:p>
-    <w:bookmarkEnd w:id="16"/>
-    <w:bookmarkStart w:id="20" w:name="波动率特征"/>
+    <w:bookmarkEnd w:id="20"/>
+    <w:bookmarkStart w:id="24" w:name="波动率特征"/>
     <w:p>
       <w:pPr>
         <w:pStyle w:val="Heading2"/>
@@ -1405,18 +1600,18 @@
           <wp:inline>
             <wp:extent cx="4907280" cy="3345872"/>
             <wp:effectExtent b="0" l="0" r="0" t="0"/>
-            <wp:docPr descr="" title="" id="18" name="Picture"/>
+            <wp:docPr descr="" title="" id="22" name="Picture"/>
             <a:graphic>
               <a:graphicData uri="http://schemas.openxmlformats.org/drawingml/2006/picture">
                 <pic:pic>
                   <pic:nvPicPr>
-                    <pic:cNvPr descr="return_volatility.png" id="19" name="Picture"/>
+                    <pic:cNvPr descr="return_volatility.png" id="23" name="Picture"/>
                     <pic:cNvPicPr>
                       <a:picLocks noChangeArrowheads="1" noChangeAspect="1"/>
                     </pic:cNvPicPr>
                   </pic:nvPicPr>
                   <pic:blipFill>
-                    <a:blip r:embed="rId17"/>
+                    <a:blip r:embed="rId21"/>
                     <a:stretch>
                       <a:fillRect/>
                     </a:stretch>
@@ -1454,9 +1649,9 @@
         <w:t xml:space="preserve">收益率与滚动波动率。冲突窗口波动放大，为事件机制建模提供依据。</w:t>
       </w:r>
     </w:p>
-    <w:bookmarkEnd w:id="20"/>
-    <w:bookmarkEnd w:id="21"/>
-    <w:bookmarkStart w:id="24" w:name="模型假设与符号说明"/>
+    <w:bookmarkEnd w:id="24"/>
+    <w:bookmarkEnd w:id="25"/>
+    <w:bookmarkStart w:id="28" w:name="模型假设与符号说明"/>
     <w:p>
       <w:pPr>
         <w:pStyle w:val="Heading1"/>
@@ -1468,7 +1663,7 @@
         <w:t xml:space="preserve">模型假设与符号说明</w:t>
       </w:r>
     </w:p>
-    <w:bookmarkStart w:id="22" w:name="基本假设"/>
+    <w:bookmarkStart w:id="26" w:name="基本假设"/>
     <w:p>
       <w:pPr>
         <w:pStyle w:val="Heading2"/>
@@ -1484,7 +1679,7 @@
       <w:pPr>
         <w:numPr>
           <w:ilvl w:val="0"/>
-          <w:numId w:val="1002"/>
+          <w:numId w:val="1003"/>
         </w:numPr>
       </w:pPr>
       <w:r>
@@ -1507,7 +1702,7 @@
       <w:pPr>
         <w:numPr>
           <w:ilvl w:val="0"/>
-          <w:numId w:val="1002"/>
+          <w:numId w:val="1003"/>
         </w:numPr>
       </w:pPr>
       <w:r>
@@ -1530,7 +1725,7 @@
       <w:pPr>
         <w:numPr>
           <w:ilvl w:val="0"/>
-          <w:numId w:val="1002"/>
+          <w:numId w:val="1003"/>
         </w:numPr>
       </w:pPr>
       <w:r>
@@ -1544,7 +1739,7 @@
       <w:pPr>
         <w:numPr>
           <w:ilvl w:val="0"/>
-          <w:numId w:val="1002"/>
+          <w:numId w:val="1003"/>
         </w:numPr>
       </w:pPr>
       <w:r>
@@ -1558,7 +1753,7 @@
       <w:pPr>
         <w:numPr>
           <w:ilvl w:val="0"/>
-          <w:numId w:val="1002"/>
+          <w:numId w:val="1003"/>
         </w:numPr>
       </w:pPr>
       <w:r>
@@ -1571,8 +1766,8 @@
         <w:t xml:space="preserve">天预测为条件情景外推，不代表真实未来观测，也不编造任何未来真实价格。</w:t>
       </w:r>
     </w:p>
-    <w:bookmarkEnd w:id="22"/>
-    <w:bookmarkStart w:id="23" w:name="符号说明"/>
+    <w:bookmarkEnd w:id="26"/>
+    <w:bookmarkStart w:id="27" w:name="符号说明"/>
     <w:p>
       <w:pPr>
         <w:pStyle w:val="Heading2"/>
@@ -1994,6 +2189,61 @@
               <m:sSub>
                 <m:e>
                   <m:r>
+                    <m:t>A</m:t>
+                  </m:r>
+                </m:e>
+                <m:sub>
+                  <m:r>
+                    <m:t>t</m:t>
+                  </m:r>
+                </m:sub>
+              </m:sSub>
+            </m:oMath>
+          </w:p>
+        </w:tc>
+        <w:tc>
+          <w:tcPr/>
+          <w:p>
+            <w:pPr>
+              <w:pStyle w:val="Compact"/>
+              <w:jc w:val="left"/>
+            </w:pPr>
+            <w:r>
+              <w:rPr>
+                <w:rFonts w:hint="eastAsia"/>
+              </w:rPr>
+              <w:t xml:space="preserve">其他产油国增产或替代供应增量</w:t>
+            </w:r>
+          </w:p>
+        </w:tc>
+        <w:tc>
+          <w:tcPr/>
+          <w:p>
+            <w:pPr>
+              <w:pStyle w:val="Compact"/>
+              <w:jc w:val="left"/>
+            </w:pPr>
+            <w:r>
+              <w:rPr>
+                <w:rFonts w:hint="eastAsia"/>
+              </w:rPr>
+              <w:t xml:space="preserve">万桶/日</w:t>
+            </w:r>
+          </w:p>
+        </w:tc>
+      </w:tr>
+      <w:tr>
+        <w:tc>
+          <w:tcPr/>
+          <w:p>
+            <w:pPr>
+              <w:pStyle w:val="Compact"/>
+              <w:jc w:val="left"/>
+            </w:pPr>
+            <m:oMath>
+              <m:sSub>
+                <m:e>
+                  <m:r>
                     <m:t>R</m:t>
                   </m:r>
                 </m:e>
@@ -2447,10 +2697,129 @@
           </w:p>
         </w:tc>
       </w:tr>
+      <w:tr>
+        <w:tc>
+          <w:tcPr/>
+          <w:p>
+            <w:pPr>
+              <w:pStyle w:val="Compact"/>
+              <w:jc w:val="left"/>
+            </w:pPr>
+            <m:oMath>
+              <m:r>
+                <m:t>v</m:t>
+              </m:r>
+              <m:r>
+                <m:rPr>
+                  <m:sty m:val="p"/>
+                </m:rPr>
+                <m:t>,</m:t>
+              </m:r>
+              <m:sSub>
+                <m:e>
+                  <m:r>
+                    <m:t>v</m:t>
+                  </m:r>
+                </m:e>
+                <m:sub>
+                  <m:r>
+                    <m:t>L</m:t>
+                  </m:r>
+                </m:sub>
+              </m:sSub>
+            </m:oMath>
+          </w:p>
+        </w:tc>
+        <w:tc>
+          <w:tcPr/>
+          <w:p>
+            <w:pPr>
+              <w:pStyle w:val="Compact"/>
+              <w:jc w:val="left"/>
+            </w:pPr>
+            <w:r>
+              <w:rPr>
+                <w:rFonts w:hint="eastAsia"/>
+              </w:rPr>
+              <w:t xml:space="preserve">短期和长期价格调整速度</w:t>
+            </w:r>
+          </w:p>
+        </w:tc>
+        <w:tc>
+          <w:tcPr/>
+          <w:p>
+            <w:pPr>
+              <w:pStyle w:val="Compact"/>
+              <w:jc w:val="left"/>
+            </w:pPr>
+            <w:r>
+              <w:rPr>
+                <w:rFonts w:hint="eastAsia"/>
+              </w:rPr>
+              <w:t xml:space="preserve">无量纲</w:t>
+            </w:r>
+          </w:p>
+        </w:tc>
+      </w:tr>
+      <w:tr>
+        <w:tc>
+          <w:tcPr/>
+          <w:p>
+            <w:pPr>
+              <w:pStyle w:val="Compact"/>
+              <w:jc w:val="left"/>
+            </w:pPr>
+            <m:oMath>
+              <m:sSub>
+                <m:e>
+                  <m:r>
+                    <m:t>J</m:t>
+                  </m:r>
+                </m:e>
+                <m:sub>
+                  <m:r>
+                    <m:t>t</m:t>
+                  </m:r>
+                </m:sub>
+              </m:sSub>
+            </m:oMath>
+          </w:p>
+        </w:tc>
+        <w:tc>
+          <w:tcPr/>
+          <w:p>
+            <w:pPr>
+              <w:pStyle w:val="Compact"/>
+              <w:jc w:val="left"/>
+            </w:pPr>
+            <w:r>
+              <w:rPr>
+                <w:rFonts w:hint="eastAsia"/>
+              </w:rPr>
+              <w:t xml:space="preserve">长期库存耗尽或二次跳涨风险项</w:t>
+            </w:r>
+          </w:p>
+        </w:tc>
+        <w:tc>
+          <w:tcPr/>
+          <w:p>
+            <w:pPr>
+              <w:pStyle w:val="Compact"/>
+              <w:jc w:val="left"/>
+            </w:pPr>
+            <w:r>
+              <w:rPr>
+                <w:rFonts w:hint="eastAsia"/>
+              </w:rPr>
+              <w:t xml:space="preserve">美元/桶</w:t>
+            </w:r>
+          </w:p>
+        </w:tc>
+      </w:tr>
     </w:tbl>
-    <w:bookmarkEnd w:id="23"/>
-    <w:bookmarkEnd w:id="24"/>
-    <w:bookmarkStart w:id="30" w:name="传统供需基准模型"/>
+    <w:bookmarkEnd w:id="27"/>
+    <w:bookmarkEnd w:id="28"/>
+    <w:bookmarkStart w:id="34" w:name="传统供需基准模型"/>
     <w:p>
       <w:pPr>
         <w:pStyle w:val="Heading1"/>
@@ -2462,7 +2831,7 @@
         <w:t xml:space="preserve">传统供需基准模型</w:t>
       </w:r>
     </w:p>
-    <w:bookmarkStart w:id="25" w:name="模型建立"/>
+    <w:bookmarkStart w:id="29" w:name="模型建立"/>
     <w:p>
       <w:pPr>
         <w:pStyle w:val="Heading2"/>
@@ -2739,8 +3108,8 @@
         <w:t xml:space="preserve">万桶/日。</w:t>
       </w:r>
     </w:p>
-    <w:bookmarkEnd w:id="25"/>
-    <w:bookmarkStart w:id="29" w:name="基准模型结果"/>
+    <w:bookmarkEnd w:id="29"/>
+    <w:bookmarkStart w:id="33" w:name="基准模型结果"/>
     <w:p>
       <w:pPr>
         <w:pStyle w:val="Heading2"/>
@@ -3010,18 +3379,18 @@
           <wp:inline>
             <wp:extent cx="4693920" cy="2560320"/>
             <wp:effectExtent b="0" l="0" r="0" t="0"/>
-            <wp:docPr descr="" title="" id="27" name="Picture"/>
+            <wp:docPr descr="" title="" id="31" name="Picture"/>
             <a:graphic>
               <a:graphicData uri="http://schemas.openxmlformats.org/drawingml/2006/picture">
                 <pic:pic>
                   <pic:nvPicPr>
-                    <pic:cNvPr descr="baseline_vs_actual.png" id="28" name="Picture"/>
+                    <pic:cNvPr descr="baseline_vs_actual.png" id="32" name="Picture"/>
                     <pic:cNvPicPr>
                       <a:picLocks noChangeArrowheads="1" noChangeAspect="1"/>
                     </pic:cNvPicPr>
                   </pic:nvPicPr>
                   <pic:blipFill>
-                    <a:blip r:embed="rId26"/>
+                    <a:blip r:embed="rId30"/>
                     <a:stretch>
                       <a:fillRect/>
                     </a:stretch>
@@ -3097,9 +3466,9 @@
         <w:t xml:space="preserve">SPR、库存、绕道运输、需求收缩和市场预期修复。</w:t>
       </w:r>
     </w:p>
-    <w:bookmarkEnd w:id="29"/>
-    <w:bookmarkEnd w:id="30"/>
-    <w:bookmarkStart w:id="33" w:name="短期动态递推模型"/>
+    <w:bookmarkEnd w:id="33"/>
+    <w:bookmarkEnd w:id="34"/>
+    <w:bookmarkStart w:id="37" w:name="短期动态递推模型"/>
     <w:p>
       <w:pPr>
         <w:pStyle w:val="Heading1"/>
@@ -3111,7 +3480,7 @@
         <w:t xml:space="preserve">短期动态递推模型</w:t>
       </w:r>
     </w:p>
-    <w:bookmarkStart w:id="31" w:name="物理供需层"/>
+    <w:bookmarkStart w:id="35" w:name="物理供需层"/>
     <w:p>
       <w:pPr>
         <w:pStyle w:val="Heading2"/>
@@ -3817,8 +4186,8 @@
         </m:oMath>
       </m:oMathPara>
     </w:p>
-    <w:bookmarkEnd w:id="31"/>
-    <w:bookmarkStart w:id="32" w:name="市场价格形成层"/>
+    <w:bookmarkEnd w:id="35"/>
+    <w:bookmarkStart w:id="36" w:name="市场价格形成层"/>
     <w:p>
       <w:pPr>
         <w:pStyle w:val="Heading2"/>
@@ -4535,9 +4904,9 @@
         <w:t xml:space="preserve">该结构保留了题面中的离散递推思想，同时允许期货市场对风险和预期做非线性再定价。</w:t>
       </w:r>
     </w:p>
-    <w:bookmarkEnd w:id="32"/>
-    <w:bookmarkEnd w:id="33"/>
-    <w:bookmarkStart w:id="73" w:name="参数校准与模型检验"/>
+    <w:bookmarkEnd w:id="36"/>
+    <w:bookmarkEnd w:id="37"/>
+    <w:bookmarkStart w:id="77" w:name="参数校准与模型检验"/>
     <w:p>
       <w:pPr>
         <w:pStyle w:val="Heading1"/>
@@ -4549,7 +4918,7 @@
         <w:t xml:space="preserve">参数校准与模型检验</w:t>
       </w:r>
     </w:p>
-    <w:bookmarkStart w:id="34" w:name="多目标校准"/>
+    <w:bookmarkStart w:id="38" w:name="多目标校准"/>
     <w:p>
       <w:pPr>
         <w:pStyle w:val="Heading2"/>
@@ -5633,8 +6002,8 @@
         </w:tc>
       </w:tr>
     </w:tbl>
-    <w:bookmarkEnd w:id="34"/>
-    <w:bookmarkStart w:id="41" w:name="拟合结果"/>
+    <w:bookmarkEnd w:id="38"/>
+    <w:bookmarkStart w:id="45" w:name="拟合结果"/>
     <w:p>
       <w:pPr>
         <w:pStyle w:val="Heading2"/>
@@ -5756,18 +6125,18 @@
           <wp:inline>
             <wp:extent cx="4907280" cy="2587474"/>
             <wp:effectExtent b="0" l="0" r="0" t="0"/>
-            <wp:docPr descr="" title="" id="36" name="Picture"/>
+            <wp:docPr descr="" title="" id="40" name="Picture"/>
             <a:graphic>
               <a:graphicData uri="http://schemas.openxmlformats.org/drawingml/2006/picture">
                 <pic:pic>
                   <pic:nvPicPr>
-                    <pic:cNvPr descr="短期模型拟合效果.png" id="37" name="Picture"/>
+                    <pic:cNvPr descr="短期模型拟合效果.png" id="41" name="Picture"/>
                     <pic:cNvPicPr>
                       <a:picLocks noChangeArrowheads="1" noChangeAspect="1"/>
                     </pic:cNvPicPr>
                   </pic:nvPicPr>
                   <pic:blipFill>
-                    <a:blip r:embed="rId35"/>
+                    <a:blip r:embed="rId39"/>
                     <a:stretch>
                       <a:fillRect/>
                     </a:stretch>
@@ -6304,18 +6673,18 @@
           <wp:inline>
             <wp:extent cx="4907280" cy="2765921"/>
             <wp:effectExtent b="0" l="0" r="0" t="0"/>
-            <wp:docPr descr="" title="" id="39" name="Picture"/>
+            <wp:docPr descr="" title="" id="43" name="Picture"/>
             <a:graphic>
               <a:graphicData uri="http://schemas.openxmlformats.org/drawingml/2006/picture">
                 <pic:pic>
                   <pic:nvPicPr>
-                    <pic:cNvPr descr="短期模型机制贡献.png" id="40" name="Picture"/>
+                    <pic:cNvPr descr="短期模型机制贡献.png" id="44" name="Picture"/>
                     <pic:cNvPicPr>
                       <a:picLocks noChangeArrowheads="1" noChangeAspect="1"/>
                     </pic:cNvPicPr>
                   </pic:nvPicPr>
                   <pic:blipFill>
-                    <a:blip r:embed="rId38"/>
+                    <a:blip r:embed="rId42"/>
                     <a:stretch>
                       <a:fillRect/>
                     </a:stretch>
@@ -6353,8 +6722,8 @@
         <w:t xml:space="preserve">短期模型机制贡献分解。风险溢价推升价格，缓冲确认和预期修复压低价格。</w:t>
       </w:r>
     </w:p>
-    <w:bookmarkEnd w:id="41"/>
-    <w:bookmarkStart w:id="48" w:name="基准对比与防御性检验"/>
+    <w:bookmarkEnd w:id="45"/>
+    <w:bookmarkStart w:id="52" w:name="基准对比与防御性检验"/>
     <w:p>
       <w:pPr>
         <w:pStyle w:val="Heading2"/>
@@ -6441,6 +6810,386 @@
         <w:t xml:space="preserve">日及以前信息。</w:t>
       </w:r>
     </w:p>
+    <w:p>
+      <w:pPr>
+        <w:pStyle w:val="TableCaption"/>
+      </w:pPr>
+      <w:r>
+        <w:rPr>
+          <w:rFonts w:hint="eastAsia"/>
+        </w:rPr>
+        <w:t xml:space="preserve">模型检验框架</w:t>
+      </w:r>
+    </w:p>
+    <w:tbl>
+      <w:tblPr>
+        <w:tblStyle w:val="Table"/>
+        <w:tblW w:type="auto" w:w="0"/>
+        <w:tblLook w:firstRow="1" w:lastRow="0" w:firstColumn="0" w:lastColumn="0" w:noHBand="0" w:noVBand="0" w:val="0020"/>
+        <w:tblCaption w:val="模型检验框架"/>
+      </w:tblPr>
+      <w:tblGrid>
+        <w:gridCol w:w="2640"/>
+        <w:gridCol w:w="2640"/>
+        <w:gridCol w:w="2640"/>
+      </w:tblGrid>
+      <w:tr>
+        <w:trPr>
+          <w:tblHeader w:val="on"/>
+        </w:trPr>
+        <w:tc>
+          <w:tcPr/>
+          <w:p>
+            <w:pPr>
+              <w:pStyle w:val="Compact"/>
+              <w:jc w:val="left"/>
+            </w:pPr>
+            <w:r>
+              <w:rPr>
+                <w:rFonts w:hint="eastAsia"/>
+              </w:rPr>
+              <w:t xml:space="preserve">检验维度</w:t>
+            </w:r>
+          </w:p>
+        </w:tc>
+        <w:tc>
+          <w:tcPr/>
+          <w:p>
+            <w:pPr>
+              <w:pStyle w:val="Compact"/>
+              <w:jc w:val="left"/>
+            </w:pPr>
+            <w:r>
+              <w:rPr>
+                <w:rFonts w:hint="eastAsia"/>
+              </w:rPr>
+              <w:t xml:space="preserve">需要回答的问题</w:t>
+            </w:r>
+          </w:p>
+        </w:tc>
+        <w:tc>
+          <w:tcPr/>
+          <w:p>
+            <w:pPr>
+              <w:pStyle w:val="Compact"/>
+              <w:jc w:val="left"/>
+            </w:pPr>
+            <w:r>
+              <w:rPr>
+                <w:rFonts w:hint="eastAsia"/>
+              </w:rPr>
+              <w:t xml:space="preserve">本文对应方法</w:t>
+            </w:r>
+          </w:p>
+        </w:tc>
+      </w:tr>
+      <w:tr>
+        <w:tc>
+          <w:tcPr/>
+          <w:p>
+            <w:pPr>
+              <w:pStyle w:val="Compact"/>
+              <w:jc w:val="left"/>
+            </w:pPr>
+            <w:r>
+              <w:rPr>
+                <w:rFonts w:hint="eastAsia"/>
+              </w:rPr>
+              <w:t xml:space="preserve">准确性</w:t>
+            </w:r>
+          </w:p>
+        </w:tc>
+        <w:tc>
+          <w:tcPr/>
+          <w:p>
+            <w:pPr>
+              <w:pStyle w:val="Compact"/>
+              <w:jc w:val="left"/>
+            </w:pPr>
+            <w:r>
+              <w:rPr>
+                <w:rFonts w:hint="eastAsia"/>
+              </w:rPr>
+              <w:t xml:space="preserve">模型误差是否足够低？</w:t>
+            </w:r>
+          </w:p>
+        </w:tc>
+        <w:tc>
+          <w:tcPr/>
+          <w:p>
+            <w:pPr>
+              <w:pStyle w:val="Compact"/>
+              <w:jc w:val="left"/>
+            </w:pPr>
+            <w:r>
+              <w:rPr>
+                <w:rFonts w:hint="eastAsia"/>
+              </w:rPr>
+              <w:t xml:space="preserve">RMSE、MAE、MAPE、分段误差</w:t>
+            </w:r>
+          </w:p>
+        </w:tc>
+      </w:tr>
+      <w:tr>
+        <w:tc>
+          <w:tcPr/>
+          <w:p>
+            <w:pPr>
+              <w:pStyle w:val="Compact"/>
+              <w:jc w:val="left"/>
+            </w:pPr>
+            <w:r>
+              <w:rPr>
+                <w:rFonts w:hint="eastAsia"/>
+              </w:rPr>
+              <w:t xml:space="preserve">有效性</w:t>
+            </w:r>
+          </w:p>
+        </w:tc>
+        <w:tc>
+          <w:tcPr/>
+          <w:p>
+            <w:pPr>
+              <w:pStyle w:val="Compact"/>
+              <w:jc w:val="left"/>
+            </w:pPr>
+            <w:r>
+              <w:rPr>
+                <w:rFonts w:hint="eastAsia"/>
+              </w:rPr>
+              <w:t xml:space="preserve">是否打败朴素基准？</w:t>
+            </w:r>
+          </w:p>
+        </w:tc>
+        <w:tc>
+          <w:tcPr/>
+          <w:p>
+            <w:pPr>
+              <w:pStyle w:val="Compact"/>
+              <w:jc w:val="left"/>
+            </w:pPr>
+            <w:r>
+              <w:rPr>
+                <w:rFonts w:hint="eastAsia"/>
+              </w:rPr>
+              <w:t xml:space="preserve">上一日基准、三日均值、随机游走、滚动</w:t>
+            </w:r>
+            <w:r>
+              <w:t xml:space="preserve"> ARIMA</w:t>
+            </w:r>
+          </w:p>
+        </w:tc>
+      </w:tr>
+      <w:tr>
+        <w:tc>
+          <w:tcPr/>
+          <w:p>
+            <w:pPr>
+              <w:pStyle w:val="Compact"/>
+              <w:jc w:val="left"/>
+            </w:pPr>
+            <w:r>
+              <w:rPr>
+                <w:rFonts w:hint="eastAsia"/>
+              </w:rPr>
+              <w:t xml:space="preserve">时序性</w:t>
+            </w:r>
+          </w:p>
+        </w:tc>
+        <w:tc>
+          <w:tcPr/>
+          <w:p>
+            <w:pPr>
+              <w:pStyle w:val="Compact"/>
+              <w:jc w:val="left"/>
+            </w:pPr>
+            <w:r>
+              <w:rPr>
+                <w:rFonts w:hint="eastAsia"/>
+              </w:rPr>
+              <w:t xml:space="preserve">是否只是慢半拍跟随？</w:t>
+            </w:r>
+          </w:p>
+        </w:tc>
+        <w:tc>
+          <w:tcPr/>
+          <w:p>
+            <w:pPr>
+              <w:pStyle w:val="Compact"/>
+              <w:jc w:val="left"/>
+            </w:pPr>
+            <w:r>
+              <w:rPr>
+                <w:rFonts w:hint="eastAsia"/>
+              </w:rPr>
+              <w:t xml:space="preserve">曲线平移检验、拐点局部检验</w:t>
+            </w:r>
+          </w:p>
+        </w:tc>
+      </w:tr>
+      <w:tr>
+        <w:tc>
+          <w:tcPr/>
+          <w:p>
+            <w:pPr>
+              <w:pStyle w:val="Compact"/>
+              <w:jc w:val="left"/>
+            </w:pPr>
+            <w:r>
+              <w:rPr>
+                <w:rFonts w:hint="eastAsia"/>
+              </w:rPr>
+              <w:t xml:space="preserve">机制性</w:t>
+            </w:r>
+          </w:p>
+        </w:tc>
+        <w:tc>
+          <w:tcPr/>
+          <w:p>
+            <w:pPr>
+              <w:pStyle w:val="Compact"/>
+              <w:jc w:val="left"/>
+            </w:pPr>
+            <w:r>
+              <w:rPr>
+                <w:rFonts w:hint="eastAsia"/>
+              </w:rPr>
+              <w:t xml:space="preserve">每个机制是否有贡献？</w:t>
+            </w:r>
+          </w:p>
+        </w:tc>
+        <w:tc>
+          <w:tcPr/>
+          <w:p>
+            <w:pPr>
+              <w:pStyle w:val="Compact"/>
+              <w:jc w:val="left"/>
+            </w:pPr>
+            <w:r>
+              <w:rPr>
+                <w:rFonts w:hint="eastAsia"/>
+              </w:rPr>
+              <w:t xml:space="preserve">SPR、库存、绕道、需求、风险、预期修复消融实验</w:t>
+            </w:r>
+          </w:p>
+        </w:tc>
+      </w:tr>
+      <w:tr>
+        <w:tc>
+          <w:tcPr/>
+          <w:p>
+            <w:pPr>
+              <w:pStyle w:val="Compact"/>
+              <w:jc w:val="left"/>
+            </w:pPr>
+            <w:r>
+              <w:rPr>
+                <w:rFonts w:hint="eastAsia"/>
+              </w:rPr>
+              <w:t xml:space="preserve">稳健性</w:t>
+            </w:r>
+          </w:p>
+        </w:tc>
+        <w:tc>
+          <w:tcPr/>
+          <w:p>
+            <w:pPr>
+              <w:pStyle w:val="Compact"/>
+              <w:jc w:val="left"/>
+            </w:pPr>
+            <w:r>
+              <w:rPr>
+                <w:rFonts w:hint="eastAsia"/>
+              </w:rPr>
+              <w:t xml:space="preserve">是否依赖少数神奇参数？</w:t>
+            </w:r>
+          </w:p>
+        </w:tc>
+        <w:tc>
+          <w:tcPr/>
+          <w:p>
+            <w:pPr>
+              <w:pStyle w:val="Compact"/>
+              <w:jc w:val="left"/>
+            </w:pPr>
+            <m:oMath>
+              <m:r>
+                <m:rPr>
+                  <m:sty m:val="p"/>
+                </m:rPr>
+                <m:t>±</m:t>
+              </m:r>
+              <m:r>
+                <m:t>15</m:t>
+              </m:r>
+              <m:r>
+                <m:rPr>
+                  <m:sty m:val="p"/>
+                </m:rPr>
+                <m:t>%</m:t>
+              </m:r>
+            </m:oMath>
+            <w:r>
+              <w:t xml:space="preserve"> </w:t>
+            </w:r>
+            <w:r>
+              <w:rPr>
+                <w:rFonts w:hint="eastAsia"/>
+              </w:rPr>
+              <w:t xml:space="preserve">参数扰动、局部优秀参数邻域</w:t>
+            </w:r>
+          </w:p>
+        </w:tc>
+      </w:tr>
+      <w:tr>
+        <w:tc>
+          <w:tcPr/>
+          <w:p>
+            <w:pPr>
+              <w:pStyle w:val="Compact"/>
+              <w:jc w:val="left"/>
+            </w:pPr>
+            <w:r>
+              <w:rPr>
+                <w:rFonts w:hint="eastAsia"/>
+              </w:rPr>
+              <w:t xml:space="preserve">合规性</w:t>
+            </w:r>
+          </w:p>
+        </w:tc>
+        <w:tc>
+          <w:tcPr/>
+          <w:p>
+            <w:pPr>
+              <w:pStyle w:val="Compact"/>
+              <w:jc w:val="left"/>
+            </w:pPr>
+            <w:r>
+              <w:rPr>
+                <w:rFonts w:hint="eastAsia"/>
+              </w:rPr>
+              <w:t xml:space="preserve">是否把结论硬写进代码？</w:t>
+            </w:r>
+          </w:p>
+        </w:tc>
+        <w:tc>
+          <w:tcPr/>
+          <w:p>
+            <w:pPr>
+              <w:pStyle w:val="Compact"/>
+              <w:jc w:val="left"/>
+            </w:pPr>
+            <w:r>
+              <w:rPr>
+                <w:rFonts w:hint="eastAsia"/>
+              </w:rPr>
+              <w:t xml:space="preserve">递推代码硬编码审计、价格上限触发检查</w:t>
+            </w:r>
+          </w:p>
+        </w:tc>
+      </w:tr>
+    </w:tbl>
+    <w:p/>
     <w:p>
       <w:pPr>
         <w:pStyle w:val="TableCaption"/>
@@ -6881,18 +7630,18 @@
           <wp:inline>
             <wp:extent cx="4587240" cy="2533904"/>
             <wp:effectExtent b="0" l="0" r="0" t="0"/>
-            <wp:docPr descr="" title="" id="43" name="Picture"/>
+            <wp:docPr descr="" title="" id="47" name="Picture"/>
             <a:graphic>
               <a:graphicData uri="http://schemas.openxmlformats.org/drawingml/2006/picture">
                 <pic:pic>
                   <pic:nvPicPr>
-                    <pic:cNvPr descr="短期模型基准对比.png" id="44" name="Picture"/>
+                    <pic:cNvPr descr="短期模型基准对比.png" id="48" name="Picture"/>
                     <pic:cNvPicPr>
                       <a:picLocks noChangeArrowheads="1" noChangeAspect="1"/>
                     </pic:cNvPicPr>
                   </pic:nvPicPr>
                   <pic:blipFill>
-                    <a:blip r:embed="rId42"/>
+                    <a:blip r:embed="rId46"/>
                     <a:stretch>
                       <a:fillRect/>
                     </a:stretch>
@@ -7055,18 +7804,18 @@
           <wp:inline>
             <wp:extent cx="4480560" cy="2594008"/>
             <wp:effectExtent b="0" l="0" r="0" t="0"/>
-            <wp:docPr descr="" title="" id="46" name="Picture"/>
+            <wp:docPr descr="" title="" id="50" name="Picture"/>
             <a:graphic>
               <a:graphicData uri="http://schemas.openxmlformats.org/drawingml/2006/picture">
                 <pic:pic>
                   <pic:nvPicPr>
-                    <pic:cNvPr descr="短期模型滞后平移检验.png" id="47" name="Picture"/>
+                    <pic:cNvPr descr="短期模型滞后平移检验.png" id="51" name="Picture"/>
                     <pic:cNvPicPr>
                       <a:picLocks noChangeArrowheads="1" noChangeAspect="1"/>
                     </pic:cNvPicPr>
                   </pic:nvPicPr>
                   <pic:blipFill>
-                    <a:blip r:embed="rId45"/>
+                    <a:blip r:embed="rId49"/>
                     <a:stretch>
                       <a:fillRect/>
                     </a:stretch>
@@ -7113,8 +7862,8 @@
         <w:t xml:space="preserve">检验。原始位置误差最低。</w:t>
       </w:r>
     </w:p>
-    <w:bookmarkEnd w:id="48"/>
-    <w:bookmarkStart w:id="55" w:name="机制消融与过拟合防御"/>
+    <w:bookmarkEnd w:id="52"/>
+    <w:bookmarkStart w:id="59" w:name="机制消融与过拟合防御"/>
     <w:p>
       <w:pPr>
         <w:pStyle w:val="Heading2"/>
@@ -7218,18 +7967,18 @@
           <wp:inline>
             <wp:extent cx="4800600" cy="2480310"/>
             <wp:effectExtent b="0" l="0" r="0" t="0"/>
-            <wp:docPr descr="" title="" id="50" name="Picture"/>
+            <wp:docPr descr="" title="" id="54" name="Picture"/>
             <a:graphic>
               <a:graphicData uri="http://schemas.openxmlformats.org/drawingml/2006/picture">
                 <pic:pic>
                   <pic:nvPicPr>
-                    <pic:cNvPr descr="短期模型机制消融实验.png" id="51" name="Picture"/>
+                    <pic:cNvPr descr="短期模型机制消融实验.png" id="55" name="Picture"/>
                     <pic:cNvPicPr>
                       <a:picLocks noChangeArrowheads="1" noChangeAspect="1"/>
                     </pic:cNvPicPr>
                   </pic:nvPicPr>
                   <pic:blipFill>
-                    <a:blip r:embed="rId49"/>
+                    <a:blip r:embed="rId53"/>
                     <a:stretch>
                       <a:fillRect/>
                     </a:stretch>
@@ -7373,18 +8122,18 @@
           <wp:inline>
             <wp:extent cx="4693920" cy="2048256"/>
             <wp:effectExtent b="0" l="0" r="0" t="0"/>
-            <wp:docPr descr="" title="" id="53" name="Picture"/>
+            <wp:docPr descr="" title="" id="57" name="Picture"/>
             <a:graphic>
               <a:graphicData uri="http://schemas.openxmlformats.org/drawingml/2006/picture">
                 <pic:pic>
                   <pic:nvPicPr>
-                    <pic:cNvPr descr="短期模型过拟合压力测试.png" id="54" name="Picture"/>
+                    <pic:cNvPr descr="短期模型过拟合压力测试.png" id="58" name="Picture"/>
                     <pic:cNvPicPr>
                       <a:picLocks noChangeArrowheads="1" noChangeAspect="1"/>
                     </pic:cNvPicPr>
                   </pic:nvPicPr>
                   <pic:blipFill>
-                    <a:blip r:embed="rId52"/>
+                    <a:blip r:embed="rId56"/>
                     <a:stretch>
                       <a:fillRect/>
                     </a:stretch>
@@ -7422,8 +8171,8 @@
         <w:t xml:space="preserve">短期模型过拟合压力测试。多数扰动样本仍保持在合理价格平台附近。</w:t>
       </w:r>
     </w:p>
-    <w:bookmarkEnd w:id="55"/>
-    <w:bookmarkStart w:id="62" w:name="分段误差与残差诊断"/>
+    <w:bookmarkEnd w:id="59"/>
+    <w:bookmarkStart w:id="66" w:name="分段误差与残差诊断"/>
     <w:p>
       <w:pPr>
         <w:pStyle w:val="Heading2"/>
@@ -7500,18 +8249,18 @@
           <wp:inline>
             <wp:extent cx="4907280" cy="3658154"/>
             <wp:effectExtent b="0" l="0" r="0" t="0"/>
-            <wp:docPr descr="" title="" id="57" name="Picture"/>
+            <wp:docPr descr="" title="" id="61" name="Picture"/>
             <a:graphic>
               <a:graphicData uri="http://schemas.openxmlformats.org/drawingml/2006/picture">
                 <pic:pic>
                   <pic:nvPicPr>
-                    <pic:cNvPr descr="短期模型误差诊断.png" id="58" name="Picture"/>
+                    <pic:cNvPr descr="短期模型误差诊断.png" id="62" name="Picture"/>
                     <pic:cNvPicPr>
                       <a:picLocks noChangeArrowheads="1" noChangeAspect="1"/>
                     </pic:cNvPicPr>
                   </pic:nvPicPr>
                   <pic:blipFill>
-                    <a:blip r:embed="rId56"/>
+                    <a:blip r:embed="rId60"/>
                     <a:stretch>
                       <a:fillRect/>
                     </a:stretch>
@@ -7558,18 +8307,18 @@
           <wp:inline>
             <wp:extent cx="4907280" cy="3655675"/>
             <wp:effectExtent b="0" l="0" r="0" t="0"/>
-            <wp:docPr descr="" title="" id="60" name="Picture"/>
+            <wp:docPr descr="" title="" id="64" name="Picture"/>
             <a:graphic>
               <a:graphicData uri="http://schemas.openxmlformats.org/drawingml/2006/picture">
                 <pic:pic>
                   <pic:nvPicPr>
-                    <pic:cNvPr descr="短期模型残差诊断增强.png" id="61" name="Picture"/>
+                    <pic:cNvPr descr="短期模型残差诊断增强.png" id="65" name="Picture"/>
                     <pic:cNvPicPr>
                       <a:picLocks noChangeArrowheads="1" noChangeAspect="1"/>
                     </pic:cNvPicPr>
                   </pic:nvPicPr>
                   <pic:blipFill>
-                    <a:blip r:embed="rId59"/>
+                    <a:blip r:embed="rId63"/>
                     <a:stretch>
                       <a:fillRect/>
                     </a:stretch>
@@ -7636,8 +8385,8 @@
         <w:t xml:space="preserve">0.254，说明仍存在一定连续偏差，但未形成明显强自相关。</w:t>
       </w:r>
     </w:p>
-    <w:bookmarkEnd w:id="62"/>
-    <w:bookmarkStart w:id="63" w:name="机制消融的定量证据"/>
+    <w:bookmarkEnd w:id="66"/>
+    <w:bookmarkStart w:id="67" w:name="机制消融的定量证据"/>
     <w:p>
       <w:pPr>
         <w:pStyle w:val="Heading2"/>
@@ -8558,8 +9307,8 @@
         <w:t xml:space="preserve">10.09，说明市场对政策缓冲和运输恢复的预期并不是可有可无的修饰，而是解释后期回落的关键机制。</w:t>
       </w:r>
     </w:p>
-    <w:bookmarkEnd w:id="63"/>
-    <w:bookmarkStart w:id="67" w:name="拐点预测步长与事件边界"/>
+    <w:bookmarkEnd w:id="67"/>
+    <w:bookmarkStart w:id="71" w:name="拐点预测步长与事件边界"/>
     <w:p>
       <w:pPr>
         <w:pStyle w:val="Heading2"/>
@@ -8682,18 +9431,18 @@
           <wp:inline>
             <wp:extent cx="4907280" cy="3568930"/>
             <wp:effectExtent b="0" l="0" r="0" t="0"/>
-            <wp:docPr descr="" title="" id="65" name="Picture"/>
+            <wp:docPr descr="" title="" id="69" name="Picture"/>
             <a:graphic>
               <a:graphicData uri="http://schemas.openxmlformats.org/drawingml/2006/picture">
                 <pic:pic>
                   <pic:nvPicPr>
-                    <pic:cNvPr descr="短期模型拐点局部检验.png" id="66" name="Picture"/>
+                    <pic:cNvPr descr="短期模型拐点局部检验.png" id="70" name="Picture"/>
                     <pic:cNvPicPr>
                       <a:picLocks noChangeArrowheads="1" noChangeAspect="1"/>
                     </pic:cNvPicPr>
                   </pic:nvPicPr>
                   <pic:blipFill>
-                    <a:blip r:embed="rId64"/>
+                    <a:blip r:embed="rId68"/>
                     <a:stretch>
                       <a:fillRect/>
                     </a:stretch>
@@ -8760,8 +9509,8 @@
         <w:t xml:space="preserve">年等非霍尔木兹事件窗口。结果显示，该模型在这些窗口通常显著弱于朴素上一日基准。这并不削弱本文结论，反而说明本文模型不是通用油价短线交易器，而是针对霍尔木兹封锁机制构建的事件解释模型。论文结论应限定在极端地缘冲突下的条件路径解释与情景预测，不能外推为普通时期的万能预测模型。</w:t>
       </w:r>
     </w:p>
-    <w:bookmarkEnd w:id="67"/>
-    <w:bookmarkStart w:id="71" w:name="参数自由度与稳健性区间"/>
+    <w:bookmarkEnd w:id="71"/>
+    <w:bookmarkStart w:id="75" w:name="参数自由度与稳健性区间"/>
     <w:p>
       <w:pPr>
         <w:pStyle w:val="Heading2"/>
@@ -9407,18 +10156,18 @@
           <wp:inline>
             <wp:extent cx="4907280" cy="2587474"/>
             <wp:effectExtent b="0" l="0" r="0" t="0"/>
-            <wp:docPr descr="" title="" id="69" name="Picture"/>
+            <wp:docPr descr="" title="" id="73" name="Picture"/>
             <a:graphic>
               <a:graphicData uri="http://schemas.openxmlformats.org/drawingml/2006/picture">
                 <pic:pic>
                   <pic:nvPicPr>
-                    <pic:cNvPr descr="短期模型稳健性带.png" id="70" name="Picture"/>
+                    <pic:cNvPr descr="短期模型稳健性带.png" id="74" name="Picture"/>
                     <pic:cNvPicPr>
                       <a:picLocks noChangeArrowheads="1" noChangeAspect="1"/>
                     </pic:cNvPicPr>
                   </pic:nvPicPr>
                   <pic:blipFill>
-                    <a:blip r:embed="rId68"/>
+                    <a:blip r:embed="rId72"/>
                     <a:stretch>
                       <a:fillRect/>
                     </a:stretch>
@@ -9593,8 +10342,8 @@
         <w:t xml:space="preserve">美元/桶，说明最优参数附近存在稳定的优秀参数邻域。</w:t>
       </w:r>
     </w:p>
-    <w:bookmarkEnd w:id="71"/>
-    <w:bookmarkStart w:id="72" w:name="内生性反事实基准与硬编码审计"/>
+    <w:bookmarkEnd w:id="75"/>
+    <w:bookmarkStart w:id="76" w:name="内生性反事实基准与硬编码审计"/>
     <w:p>
       <w:pPr>
         <w:pStyle w:val="Heading2"/>
@@ -9891,9 +10640,9 @@
         <w:t xml:space="preserve">美元平台不是代码硬上限，但不应声称已经实现了多智能体动态纳什均衡。</w:t>
       </w:r>
     </w:p>
-    <w:bookmarkEnd w:id="72"/>
-    <w:bookmarkEnd w:id="73"/>
-    <w:bookmarkStart w:id="85" w:name="天三情景预测"/>
+    <w:bookmarkEnd w:id="76"/>
+    <w:bookmarkEnd w:id="77"/>
+    <w:bookmarkStart w:id="89" w:name="天三情景预测"/>
     <w:p>
       <w:pPr>
         <w:pStyle w:val="Heading1"/>
@@ -9908,7 +10657,7 @@
         <w:t xml:space="preserve">天三情景预测</w:t>
       </w:r>
     </w:p>
-    <w:bookmarkStart w:id="74" w:name="情景设定"/>
+    <w:bookmarkStart w:id="78" w:name="情景设定"/>
     <w:p>
       <w:pPr>
         <w:pStyle w:val="Heading2"/>
@@ -10065,7 +10814,7 @@
       <w:pPr>
         <w:numPr>
           <w:ilvl w:val="0"/>
-          <w:numId w:val="1003"/>
+          <w:numId w:val="1004"/>
         </w:numPr>
       </w:pPr>
       <w:r>
@@ -10088,7 +10837,7 @@
       <w:pPr>
         <w:numPr>
           <w:ilvl w:val="0"/>
-          <w:numId w:val="1003"/>
+          <w:numId w:val="1004"/>
         </w:numPr>
       </w:pPr>
       <w:r>
@@ -10102,7 +10851,7 @@
       <w:pPr>
         <w:numPr>
           <w:ilvl w:val="0"/>
-          <w:numId w:val="1003"/>
+          <w:numId w:val="1004"/>
         </w:numPr>
       </w:pPr>
       <w:r>
@@ -10116,7 +10865,7 @@
       <w:pPr>
         <w:numPr>
           <w:ilvl w:val="0"/>
-          <w:numId w:val="1003"/>
+          <w:numId w:val="1004"/>
         </w:numPr>
       </w:pPr>
       <w:r>
@@ -11387,8 +12136,8 @@
         </w:tc>
       </w:tr>
     </w:tbl>
-    <w:bookmarkEnd w:id="74"/>
-    <w:bookmarkStart w:id="84" w:name="预测结果"/>
+    <w:bookmarkEnd w:id="78"/>
+    <w:bookmarkStart w:id="88" w:name="预测结果"/>
     <w:p>
       <w:pPr>
         <w:pStyle w:val="Heading2"/>
@@ -11878,18 +12627,18 @@
           <wp:inline>
             <wp:extent cx="5013960" cy="2757678"/>
             <wp:effectExtent b="0" l="0" r="0" t="0"/>
-            <wp:docPr descr="" title="" id="76" name="Picture"/>
+            <wp:docPr descr="" title="" id="80" name="Picture"/>
             <a:graphic>
               <a:graphicData uri="http://schemas.openxmlformats.org/drawingml/2006/picture">
                 <pic:pic>
                   <pic:nvPicPr>
-                    <pic:cNvPr descr="短期拟合与长期预测总览.png" id="77" name="Picture"/>
+                    <pic:cNvPr descr="短期拟合与长期预测总览.png" id="81" name="Picture"/>
                     <pic:cNvPicPr>
                       <a:picLocks noChangeArrowheads="1" noChangeAspect="1"/>
                     </pic:cNvPicPr>
                   </pic:nvPicPr>
                   <pic:blipFill>
-                    <a:blip r:embed="rId75"/>
+                    <a:blip r:embed="rId79"/>
                     <a:stretch>
                       <a:fillRect/>
                     </a:stretch>
@@ -11945,18 +12694,18 @@
           <wp:inline>
             <wp:extent cx="4907280" cy="2645664"/>
             <wp:effectExtent b="0" l="0" r="0" t="0"/>
-            <wp:docPr descr="" title="" id="79" name="Picture"/>
+            <wp:docPr descr="" title="" id="83" name="Picture"/>
             <a:graphic>
               <a:graphicData uri="http://schemas.openxmlformats.org/drawingml/2006/picture">
                 <pic:pic>
                   <pic:nvPicPr>
-                    <pic:cNvPr descr="scenario_price_paths.png" id="80" name="Picture"/>
+                    <pic:cNvPr descr="scenario_price_paths.png" id="84" name="Picture"/>
                     <pic:cNvPicPr>
                       <a:picLocks noChangeArrowheads="1" noChangeAspect="1"/>
                     </pic:cNvPicPr>
                   </pic:nvPicPr>
                   <pic:blipFill>
-                    <a:blip r:embed="rId78"/>
+                    <a:blip r:embed="rId82"/>
                     <a:stretch>
                       <a:fillRect/>
                     </a:stretch>
@@ -12160,18 +12909,18 @@
           <wp:inline>
             <wp:extent cx="4907280" cy="3413760"/>
             <wp:effectExtent b="0" l="0" r="0" t="0"/>
-            <wp:docPr descr="" title="" id="82" name="Picture"/>
+            <wp:docPr descr="" title="" id="86" name="Picture"/>
             <a:graphic>
               <a:graphicData uri="http://schemas.openxmlformats.org/drawingml/2006/picture">
                 <pic:pic>
                   <pic:nvPicPr>
-                    <pic:cNvPr descr="inventory_depletion_risk.png" id="83" name="Picture"/>
+                    <pic:cNvPr descr="inventory_depletion_risk.png" id="87" name="Picture"/>
                     <pic:cNvPicPr>
                       <a:picLocks noChangeArrowheads="1" noChangeAspect="1"/>
                     </pic:cNvPicPr>
                   </pic:nvPicPr>
                   <pic:blipFill>
-                    <a:blip r:embed="rId81"/>
+                    <a:blip r:embed="rId85"/>
                     <a:stretch>
                       <a:fillRect/>
                     </a:stretch>
@@ -12209,9 +12958,9 @@
         <w:t xml:space="preserve">商业库存剩余量与剩余供需缺口变化。悲观情景下缓冲能力下降，二次跳涨风险上升。</w:t>
       </w:r>
     </w:p>
-    <w:bookmarkEnd w:id="84"/>
-    <w:bookmarkEnd w:id="85"/>
-    <w:bookmarkStart w:id="94" w:name="敏感性分析"/>
+    <w:bookmarkEnd w:id="88"/>
+    <w:bookmarkEnd w:id="89"/>
+    <w:bookmarkStart w:id="98" w:name="敏感性分析"/>
     <w:p>
       <w:pPr>
         <w:pStyle w:val="Heading1"/>
@@ -12223,7 +12972,7 @@
         <w:t xml:space="preserve">敏感性分析</w:t>
       </w:r>
     </w:p>
-    <w:bookmarkStart w:id="86" w:name="分析方法"/>
+    <w:bookmarkStart w:id="90" w:name="分析方法"/>
     <w:p>
       <w:pPr>
         <w:pStyle w:val="Heading2"/>
@@ -12510,8 +13259,8 @@
         <w:t xml:space="preserve">天剩余缺口波动范围。该指标兼顾终点价格、阶段峰值和供需风险。</w:t>
       </w:r>
     </w:p>
-    <w:bookmarkEnd w:id="86"/>
-    <w:bookmarkStart w:id="93" w:name="参数重要性排序"/>
+    <w:bookmarkEnd w:id="90"/>
+    <w:bookmarkStart w:id="97" w:name="参数重要性排序"/>
     <w:p>
       <w:pPr>
         <w:pStyle w:val="Heading2"/>
@@ -13303,18 +14052,18 @@
           <wp:inline>
             <wp:extent cx="4907280" cy="2998893"/>
             <wp:effectExtent b="0" l="0" r="0" t="0"/>
-            <wp:docPr descr="" title="" id="88" name="Picture"/>
+            <wp:docPr descr="" title="" id="92" name="Picture"/>
             <a:graphic>
               <a:graphicData uri="http://schemas.openxmlformats.org/drawingml/2006/picture">
                 <pic:pic>
                   <pic:nvPicPr>
-                    <pic:cNvPr descr="sensitivity_tornado_180day.png" id="89" name="Picture"/>
+                    <pic:cNvPr descr="sensitivity_tornado_180day.png" id="93" name="Picture"/>
                     <pic:cNvPicPr>
                       <a:picLocks noChangeArrowheads="1" noChangeAspect="1"/>
                     </pic:cNvPicPr>
                   </pic:nvPicPr>
                   <pic:blipFill>
-                    <a:blip r:embed="rId87"/>
+                    <a:blip r:embed="rId91"/>
                     <a:stretch>
                       <a:fillRect/>
                     </a:stretch>
@@ -13370,18 +14119,18 @@
           <wp:inline>
             <wp:extent cx="4907280" cy="1599409"/>
             <wp:effectExtent b="0" l="0" r="0" t="0"/>
-            <wp:docPr descr="" title="" id="91" name="Picture"/>
+            <wp:docPr descr="" title="" id="95" name="Picture"/>
             <a:graphic>
               <a:graphicData uri="http://schemas.openxmlformats.org/drawingml/2006/picture">
                 <pic:pic>
                   <pic:nvPicPr>
-                    <pic:cNvPr descr="sensitivity_parameter_response.png" id="92" name="Picture"/>
+                    <pic:cNvPr descr="sensitivity_parameter_response.png" id="96" name="Picture"/>
                     <pic:cNvPicPr>
                       <a:picLocks noChangeArrowheads="1" noChangeAspect="1"/>
                     </pic:cNvPicPr>
                   </pic:nvPicPr>
                   <pic:blipFill>
-                    <a:blip r:embed="rId90"/>
+                    <a:blip r:embed="rId94"/>
                     <a:stretch>
                       <a:fillRect/>
                     </a:stretch>
@@ -13481,9 +14230,9 @@
         <w:t xml:space="preserve">的政策缓冲变量。</w:t>
       </w:r>
     </w:p>
-    <w:bookmarkEnd w:id="93"/>
-    <w:bookmarkEnd w:id="94"/>
-    <w:bookmarkStart w:id="97" w:name="模型评价"/>
+    <w:bookmarkEnd w:id="97"/>
+    <w:bookmarkEnd w:id="98"/>
+    <w:bookmarkStart w:id="102" w:name="模型评价"/>
     <w:p>
       <w:pPr>
         <w:pStyle w:val="Heading1"/>
@@ -13495,7 +14244,7 @@
         <w:t xml:space="preserve">模型评价</w:t>
       </w:r>
     </w:p>
-    <w:bookmarkStart w:id="95" w:name="优点"/>
+    <w:bookmarkStart w:id="99" w:name="优点"/>
     <w:p>
       <w:pPr>
         <w:pStyle w:val="Heading2"/>
@@ -13505,111 +14254,6 @@
           <w:rFonts w:hint="eastAsia"/>
         </w:rPr>
         <w:t xml:space="preserve">优点</w:t>
-      </w:r>
-    </w:p>
-    <w:p>
-      <w:pPr>
-        <w:numPr>
-          <w:ilvl w:val="0"/>
-          <w:numId w:val="1004"/>
-        </w:numPr>
-      </w:pPr>
-      <w:r>
-        <w:rPr>
-          <w:rFonts w:hint="eastAsia"/>
-        </w:rPr>
-        <w:t xml:space="preserve">证据链完整：从附件数据清洗、传统供需基准、动态模型、校准、防御性检验、三情景预测到敏感性分析均可复现。</w:t>
-      </w:r>
-    </w:p>
-    <w:p>
-      <w:pPr>
-        <w:numPr>
-          <w:ilvl w:val="0"/>
-          <w:numId w:val="1004"/>
-        </w:numPr>
-      </w:pPr>
-      <w:r>
-        <w:rPr>
-          <w:rFonts w:hint="eastAsia"/>
-        </w:rPr>
-        <w:t xml:space="preserve">机制解释清晰：模型没有把价格平台硬编码为</w:t>
-      </w:r>
-      <w:r>
-        <w:t xml:space="preserve"> 120 </w:t>
-      </w:r>
-      <w:r>
-        <w:rPr>
-          <w:rFonts w:hint="eastAsia"/>
-        </w:rPr>
-        <w:t xml:space="preserve">美元，而是由供应缺口、风险溢价和缓冲折价共同递推形成。</w:t>
-      </w:r>
-    </w:p>
-    <w:p>
-      <w:pPr>
-        <w:numPr>
-          <w:ilvl w:val="0"/>
-          <w:numId w:val="1004"/>
-        </w:numPr>
-      </w:pPr>
-      <w:r>
-        <w:rPr>
-          <w:rFonts w:hint="eastAsia"/>
-        </w:rPr>
-        <w:t xml:space="preserve">主动回应评委质疑：本文设置</w:t>
-      </w:r>
-      <w:r>
-        <w:t xml:space="preserve"> Random Walk </w:t>
-      </w:r>
-      <w:r>
-        <w:rPr>
-          <w:rFonts w:hint="eastAsia"/>
-        </w:rPr>
-        <w:t xml:space="preserve">基准、ARIMA</w:t>
-      </w:r>
-      <w:r>
-        <w:t xml:space="preserve"> </w:t>
-      </w:r>
-      <w:r>
-        <w:rPr>
-          <w:rFonts w:hint="eastAsia"/>
-        </w:rPr>
-        <w:t xml:space="preserve">基准、滞后平移检验、机制消融和过拟合压力测试。</w:t>
-      </w:r>
-    </w:p>
-    <w:p>
-      <w:pPr>
-        <w:numPr>
-          <w:ilvl w:val="0"/>
-          <w:numId w:val="1004"/>
-        </w:numPr>
-      </w:pPr>
-      <w:r>
-        <w:rPr>
-          <w:rFonts w:hint="eastAsia"/>
-        </w:rPr>
-        <w:t xml:space="preserve">数据口径保守：所有真实价格均来自附件</w:t>
-      </w:r>
-      <w:r>
-        <w:t xml:space="preserve"> </w:t>
-      </w:r>
-      <w:r>
-        <w:rPr>
-          <w:rFonts w:hint="eastAsia"/>
-        </w:rPr>
-        <w:t xml:space="preserve">CSV；外推阶段明确标注为情景预测，不作为真实观测。</w:t>
-      </w:r>
-    </w:p>
-    <w:bookmarkEnd w:id="95"/>
-    <w:bookmarkStart w:id="96" w:name="局限性"/>
-    <w:p>
-      <w:pPr>
-        <w:pStyle w:val="Heading2"/>
-      </w:pPr>
-      <w:r>
-        <w:rPr>
-          <w:rFonts w:hint="eastAsia"/>
-        </w:rPr>
-        <w:t xml:space="preserve">局限性</w:t>
       </w:r>
     </w:p>
     <w:p>
@@ -13623,16 +14267,7 @@
         <w:rPr>
           <w:rFonts w:hint="eastAsia"/>
         </w:rPr>
-        <w:t xml:space="preserve">冲突窗口只有</w:t>
-      </w:r>
-      <w:r>
-        <w:t xml:space="preserve"> 46 </w:t>
-      </w:r>
-      <w:r>
-        <w:rPr>
-          <w:rFonts w:hint="eastAsia"/>
-        </w:rPr>
-        <w:t xml:space="preserve">个交易日，参数自由度相对较高，尽管有压力测试和边界检验，仍不宜把模型包装为通用油价交易预测器。</w:t>
+        <w:t xml:space="preserve">证据链完整：从附件数据清洗、传统供需基准、动态模型、校准、防御性检验、三情景预测到敏感性分析均可复现。</w:t>
       </w:r>
     </w:p>
     <w:p>
@@ -13646,7 +14281,16 @@
         <w:rPr>
           <w:rFonts w:hint="eastAsia"/>
         </w:rPr>
-        <w:t xml:space="preserve">地缘风险、不确定性平台和预期修复仍以参数化方式刻画，未引入期权隐含波动率、真实库存周报或新闻情绪等外生数据。</w:t>
+        <w:t xml:space="preserve">机制解释清晰：模型没有把价格平台硬编码为</w:t>
+      </w:r>
+      <w:r>
+        <w:t xml:space="preserve"> 120 </w:t>
+      </w:r>
+      <w:r>
+        <w:rPr>
+          <w:rFonts w:hint="eastAsia"/>
+        </w:rPr>
+        <w:t xml:space="preserve">美元，而是由供应缺口、风险溢价和缓冲折价共同递推形成。</w:t>
       </w:r>
     </w:p>
     <w:p>
@@ -13660,41 +14304,61 @@
         <w:rPr>
           <w:rFonts w:hint="eastAsia"/>
         </w:rPr>
-        <w:t xml:space="preserve">单因素敏感性不能完全描述参数联动风险，因此悲观情景仍是判断二次跳涨风险的重要补充。</w:t>
-      </w:r>
-    </w:p>
-    <w:bookmarkEnd w:id="96"/>
-    <w:bookmarkEnd w:id="97"/>
-    <w:bookmarkStart w:id="98" w:name="结论"/>
-    <w:p>
-      <w:pPr>
-        <w:pStyle w:val="Heading1"/>
-      </w:pPr>
-      <w:r>
-        <w:rPr>
-          <w:rFonts w:hint="eastAsia"/>
-        </w:rPr>
-        <w:t xml:space="preserve">结论</w:t>
-      </w:r>
-    </w:p>
-    <w:p>
-      <w:pPr>
-        <w:pStyle w:val="FirstParagraph"/>
-      </w:pPr>
-      <w:r>
-        <w:rPr>
-          <w:rFonts w:hint="eastAsia"/>
-        </w:rPr>
-        <w:t xml:space="preserve">本文围绕霍尔木兹海峡封锁对国际原油价格的影响，建立了一套从传统供需上界到动态缓冲解释、再到</w:t>
-      </w:r>
-      <w:r>
-        <w:t xml:space="preserve"> 60–180 </w:t>
-      </w:r>
-      <w:r>
-        <w:rPr>
-          <w:rFonts w:hint="eastAsia"/>
-        </w:rPr>
-        <w:t xml:space="preserve">天情景预测与敏感性分析的完整模型。研究表明：</w:t>
+        <w:t xml:space="preserve">主动回应评委质疑：本文设置</w:t>
+      </w:r>
+      <w:r>
+        <w:t xml:space="preserve"> Random Walk </w:t>
+      </w:r>
+      <w:r>
+        <w:rPr>
+          <w:rFonts w:hint="eastAsia"/>
+        </w:rPr>
+        <w:t xml:space="preserve">基准、ARIMA</w:t>
+      </w:r>
+      <w:r>
+        <w:t xml:space="preserve"> </w:t>
+      </w:r>
+      <w:r>
+        <w:rPr>
+          <w:rFonts w:hint="eastAsia"/>
+        </w:rPr>
+        <w:t xml:space="preserve">基准、滞后平移检验、机制消融和过拟合压力测试。</w:t>
+      </w:r>
+    </w:p>
+    <w:p>
+      <w:pPr>
+        <w:numPr>
+          <w:ilvl w:val="0"/>
+          <w:numId w:val="1005"/>
+        </w:numPr>
+      </w:pPr>
+      <w:r>
+        <w:rPr>
+          <w:rFonts w:hint="eastAsia"/>
+        </w:rPr>
+        <w:t xml:space="preserve">数据口径保守：所有真实价格均来自附件</w:t>
+      </w:r>
+      <w:r>
+        <w:t xml:space="preserve"> </w:t>
+      </w:r>
+      <w:r>
+        <w:rPr>
+          <w:rFonts w:hint="eastAsia"/>
+        </w:rPr>
+        <w:t xml:space="preserve">CSV；外推阶段明确标注为情景预测，不作为真实观测。</w:t>
+      </w:r>
+    </w:p>
+    <w:bookmarkEnd w:id="99"/>
+    <w:bookmarkStart w:id="100" w:name="局限性"/>
+    <w:p>
+      <w:pPr>
+        <w:pStyle w:val="Heading2"/>
+      </w:pPr>
+      <w:r>
+        <w:rPr>
+          <w:rFonts w:hint="eastAsia"/>
+        </w:rPr>
+        <w:t xml:space="preserve">局限性</w:t>
       </w:r>
     </w:p>
     <w:p>
@@ -13708,16 +14372,16 @@
         <w:rPr>
           <w:rFonts w:hint="eastAsia"/>
         </w:rPr>
-        <w:t xml:space="preserve">在赛题低短期弹性假设下，传统供需模型会给出约</w:t>
-      </w:r>
-      <w:r>
-        <w:t xml:space="preserve"> 278–337 </w:t>
-      </w:r>
-      <w:r>
-        <w:rPr>
-          <w:rFonts w:hint="eastAsia"/>
-        </w:rPr>
-        <w:t xml:space="preserve">美元/桶的理论价格，显著高估附件真实价格。</w:t>
+        <w:t xml:space="preserve">冲突窗口只有</w:t>
+      </w:r>
+      <w:r>
+        <w:t xml:space="preserve"> 46 </w:t>
+      </w:r>
+      <w:r>
+        <w:rPr>
+          <w:rFonts w:hint="eastAsia"/>
+        </w:rPr>
+        <w:t xml:space="preserve">个交易日，参数自由度相对较高，尽管有压力测试和边界检验，仍不宜把模型包装为通用油价交易预测器。</w:t>
       </w:r>
     </w:p>
     <w:p>
@@ -13731,52 +14395,7 @@
         <w:rPr>
           <w:rFonts w:hint="eastAsia"/>
         </w:rPr>
-        <w:t xml:space="preserve">加入</w:t>
-      </w:r>
-      <w:r>
-        <w:t xml:space="preserve"> </w:t>
-      </w:r>
-      <w:r>
-        <w:rPr>
-          <w:rFonts w:hint="eastAsia"/>
-        </w:rPr>
-        <w:t xml:space="preserve">SPR、商业库存、绕道运输、需求收缩、恐慌衰减、地缘风险溢价和预期修复后，短期动态模型可将冲突窗口</w:t>
-      </w:r>
-      <w:r>
-        <w:t xml:space="preserve"> RMSE </w:t>
-      </w:r>
-      <w:r>
-        <w:rPr>
-          <w:rFonts w:hint="eastAsia"/>
-        </w:rPr>
-        <w:t xml:space="preserve">控制在</w:t>
-      </w:r>
-      <w:r>
-        <w:t xml:space="preserve"> 3.44 </w:t>
-      </w:r>
-      <w:r>
-        <w:rPr>
-          <w:rFonts w:hint="eastAsia"/>
-        </w:rPr>
-        <w:t xml:space="preserve">美元/桶，MAE</w:t>
-      </w:r>
-      <w:r>
-        <w:t xml:space="preserve"> </w:t>
-      </w:r>
-      <w:r>
-        <w:rPr>
-          <w:rFonts w:hint="eastAsia"/>
-        </w:rPr>
-        <w:t xml:space="preserve">控制在</w:t>
-      </w:r>
-      <w:r>
-        <w:t xml:space="preserve"> 2.85 </w:t>
-      </w:r>
-      <w:r>
-        <w:rPr>
-          <w:rFonts w:hint="eastAsia"/>
-        </w:rPr>
-        <w:t xml:space="preserve">美元/桶。</w:t>
+        <w:t xml:space="preserve">地缘风险、不确定性平台和预期修复仍以参数化方式刻画，未引入期权隐含波动率、真实库存周报或新闻情绪等外生数据。</w:t>
       </w:r>
     </w:p>
     <w:p>
@@ -13790,82 +14409,254 @@
         <w:rPr>
           <w:rFonts w:hint="eastAsia"/>
         </w:rPr>
-        <w:t xml:space="preserve">模型优于朴素上一日基准和滚动</w:t>
-      </w:r>
-      <w:r>
-        <w:t xml:space="preserve"> ARIMA </w:t>
-      </w:r>
-      <w:r>
-        <w:rPr>
-          <w:rFonts w:hint="eastAsia"/>
-        </w:rPr>
-        <w:t xml:space="preserve">基准，且通过滞后平移检验、机制消融和过拟合压力测试，具备较好的解释力和防御性。</w:t>
+        <w:t xml:space="preserve">单因素敏感性不能完全描述参数联动风险，因此悲观情景仍是判断二次跳涨风险的重要补充。</w:t>
+      </w:r>
+    </w:p>
+    <w:bookmarkEnd w:id="100"/>
+    <w:bookmarkStart w:id="101" w:name="改进方向"/>
+    <w:p>
+      <w:pPr>
+        <w:pStyle w:val="Heading2"/>
+      </w:pPr>
+      <w:r>
+        <w:rPr>
+          <w:rFonts w:hint="eastAsia"/>
+        </w:rPr>
+        <w:t xml:space="preserve">改进方向</w:t>
+      </w:r>
+    </w:p>
+    <w:p>
+      <w:pPr>
+        <w:pStyle w:val="FirstParagraph"/>
+      </w:pPr>
+      <w:r>
+        <w:rPr>
+          <w:rFonts w:hint="eastAsia"/>
+        </w:rPr>
+        <w:t xml:space="preserve">若后续继续深化，可以从三个方向提高模型外推能力：第一，引入</w:t>
+      </w:r>
+      <w:r>
+        <w:t xml:space="preserve"> EIA、IEA </w:t>
+      </w:r>
+      <w:r>
+        <w:rPr>
+          <w:rFonts w:hint="eastAsia"/>
+        </w:rPr>
+        <w:t xml:space="preserve">或</w:t>
+      </w:r>
+      <w:r>
+        <w:t xml:space="preserve"> OPEC </w:t>
+      </w:r>
+      <w:r>
+        <w:rPr>
+          <w:rFonts w:hint="eastAsia"/>
+        </w:rPr>
+        <w:t xml:space="preserve">的真实库存、产量和运输数据，对长期供给恢复路径进行更客观的外生约束；第二，在严格避免同日反馈循环的前提下，引入滞后新闻情绪、期权隐含波动率或地缘风险指数，增强风险溢价的外生解释力；第三，将单因素敏感性扩展为多参数联合扰动或蒙特卡洛情景树，更充分刻画悲观情景下的尾部风险。</w:t>
+      </w:r>
+    </w:p>
+    <w:bookmarkEnd w:id="101"/>
+    <w:bookmarkEnd w:id="102"/>
+    <w:bookmarkStart w:id="103" w:name="结论"/>
+    <w:p>
+      <w:pPr>
+        <w:pStyle w:val="Heading1"/>
+      </w:pPr>
+      <w:r>
+        <w:rPr>
+          <w:rFonts w:hint="eastAsia"/>
+        </w:rPr>
+        <w:t xml:space="preserve">结论</w:t>
+      </w:r>
+    </w:p>
+    <w:p>
+      <w:pPr>
+        <w:pStyle w:val="FirstParagraph"/>
+      </w:pPr>
+      <w:r>
+        <w:rPr>
+          <w:rFonts w:hint="eastAsia"/>
+        </w:rPr>
+        <w:t xml:space="preserve">本文围绕霍尔木兹海峡封锁对国际原油价格的影响，建立了一套从传统供需上界到动态缓冲解释、再到</w:t>
+      </w:r>
+      <w:r>
+        <w:t xml:space="preserve"> 60–180 </w:t>
+      </w:r>
+      <w:r>
+        <w:rPr>
+          <w:rFonts w:hint="eastAsia"/>
+        </w:rPr>
+        <w:t xml:space="preserve">天情景预测与敏感性分析的完整模型。研究表明：</w:t>
       </w:r>
     </w:p>
     <w:p>
       <w:pPr>
         <w:numPr>
           <w:ilvl w:val="0"/>
-          <w:numId w:val="1006"/>
+          <w:numId w:val="1007"/>
         </w:numPr>
       </w:pPr>
       <w:r>
-        <w:t xml:space="preserve">60–180 </w:t>
-      </w:r>
-      <w:r>
-        <w:rPr>
-          <w:rFonts w:hint="eastAsia"/>
-        </w:rPr>
-        <w:t xml:space="preserve">天情景预测显示，中性情景第</w:t>
-      </w:r>
-      <w:r>
-        <w:t xml:space="preserve"> 180 </w:t>
-      </w:r>
-      <w:r>
-        <w:rPr>
-          <w:rFonts w:hint="eastAsia"/>
-        </w:rPr>
-        <w:t xml:space="preserve">天价格约为</w:t>
-      </w:r>
-      <w:r>
-        <w:t xml:space="preserve"> 104.49 </w:t>
-      </w:r>
-      <w:r>
-        <w:rPr>
-          <w:rFonts w:hint="eastAsia"/>
-        </w:rPr>
-        <w:t xml:space="preserve">美元/桶；悲观情景第</w:t>
-      </w:r>
-      <w:r>
-        <w:t xml:space="preserve"> 180 </w:t>
-      </w:r>
-      <w:r>
-        <w:rPr>
-          <w:rFonts w:hint="eastAsia"/>
-        </w:rPr>
-        <w:t xml:space="preserve">天约为</w:t>
-      </w:r>
-      <w:r>
-        <w:t xml:space="preserve"> 119.53 </w:t>
-      </w:r>
-      <w:r>
-        <w:rPr>
-          <w:rFonts w:hint="eastAsia"/>
-        </w:rPr>
-        <w:t xml:space="preserve">美元/桶，并存在较高二次跳涨风险。</w:t>
+        <w:rPr>
+          <w:rFonts w:hint="eastAsia"/>
+        </w:rPr>
+        <w:t xml:space="preserve">在赛题低短期弹性假设下，传统供需模型会给出约</w:t>
+      </w:r>
+      <w:r>
+        <w:t xml:space="preserve"> 278–337 </w:t>
+      </w:r>
+      <w:r>
+        <w:rPr>
+          <w:rFonts w:hint="eastAsia"/>
+        </w:rPr>
+        <w:t xml:space="preserve">美元/桶的理论价格，显著高估附件真实价格。</w:t>
       </w:r>
     </w:p>
     <w:p>
       <w:pPr>
         <w:numPr>
           <w:ilvl w:val="0"/>
-          <w:numId w:val="1006"/>
+          <w:numId w:val="1007"/>
         </w:numPr>
       </w:pPr>
       <w:r>
         <w:rPr>
           <w:rFonts w:hint="eastAsia"/>
         </w:rPr>
+        <w:t xml:space="preserve">加入</w:t>
+      </w:r>
+      <w:r>
+        <w:t xml:space="preserve"> </w:t>
+      </w:r>
+      <w:r>
+        <w:rPr>
+          <w:rFonts w:hint="eastAsia"/>
+        </w:rPr>
+        <w:t xml:space="preserve">SPR、商业库存、绕道运输、需求收缩、恐慌衰减、地缘风险溢价和预期修复后，短期动态模型可将冲突窗口</w:t>
+      </w:r>
+      <w:r>
+        <w:t xml:space="preserve"> RMSE </w:t>
+      </w:r>
+      <w:r>
+        <w:rPr>
+          <w:rFonts w:hint="eastAsia"/>
+        </w:rPr>
+        <w:t xml:space="preserve">控制在</w:t>
+      </w:r>
+      <w:r>
+        <w:t xml:space="preserve"> 3.44 </w:t>
+      </w:r>
+      <w:r>
+        <w:rPr>
+          <w:rFonts w:hint="eastAsia"/>
+        </w:rPr>
+        <w:t xml:space="preserve">美元/桶，MAE</w:t>
+      </w:r>
+      <w:r>
+        <w:t xml:space="preserve"> </w:t>
+      </w:r>
+      <w:r>
+        <w:rPr>
+          <w:rFonts w:hint="eastAsia"/>
+        </w:rPr>
+        <w:t xml:space="preserve">控制在</w:t>
+      </w:r>
+      <w:r>
+        <w:t xml:space="preserve"> 2.85 </w:t>
+      </w:r>
+      <w:r>
+        <w:rPr>
+          <w:rFonts w:hint="eastAsia"/>
+        </w:rPr>
+        <w:t xml:space="preserve">美元/桶。</w:t>
+      </w:r>
+    </w:p>
+    <w:p>
+      <w:pPr>
+        <w:numPr>
+          <w:ilvl w:val="0"/>
+          <w:numId w:val="1007"/>
+        </w:numPr>
+      </w:pPr>
+      <w:r>
+        <w:rPr>
+          <w:rFonts w:hint="eastAsia"/>
+        </w:rPr>
+        <w:t xml:space="preserve">模型优于朴素上一日基准和滚动</w:t>
+      </w:r>
+      <w:r>
+        <w:t xml:space="preserve"> ARIMA </w:t>
+      </w:r>
+      <w:r>
+        <w:rPr>
+          <w:rFonts w:hint="eastAsia"/>
+        </w:rPr>
+        <w:t xml:space="preserve">基准，且通过滞后平移检验、机制消融和过拟合压力测试，具备较好的解释力和防御性。</w:t>
+      </w:r>
+    </w:p>
+    <w:p>
+      <w:pPr>
+        <w:numPr>
+          <w:ilvl w:val="0"/>
+          <w:numId w:val="1007"/>
+        </w:numPr>
+      </w:pPr>
+      <w:r>
+        <w:t xml:space="preserve">60–180 </w:t>
+      </w:r>
+      <w:r>
+        <w:rPr>
+          <w:rFonts w:hint="eastAsia"/>
+        </w:rPr>
+        <w:t xml:space="preserve">天情景预测显示，中性情景第</w:t>
+      </w:r>
+      <w:r>
+        <w:t xml:space="preserve"> 180 </w:t>
+      </w:r>
+      <w:r>
+        <w:rPr>
+          <w:rFonts w:hint="eastAsia"/>
+        </w:rPr>
+        <w:t xml:space="preserve">天价格约为</w:t>
+      </w:r>
+      <w:r>
+        <w:t xml:space="preserve"> 104.49 </w:t>
+      </w:r>
+      <w:r>
+        <w:rPr>
+          <w:rFonts w:hint="eastAsia"/>
+        </w:rPr>
+        <w:t xml:space="preserve">美元/桶；悲观情景第</w:t>
+      </w:r>
+      <w:r>
+        <w:t xml:space="preserve"> 180 </w:t>
+      </w:r>
+      <w:r>
+        <w:rPr>
+          <w:rFonts w:hint="eastAsia"/>
+        </w:rPr>
+        <w:t xml:space="preserve">天约为</w:t>
+      </w:r>
+      <w:r>
+        <w:t xml:space="preserve"> 119.53 </w:t>
+      </w:r>
+      <w:r>
+        <w:rPr>
+          <w:rFonts w:hint="eastAsia"/>
+        </w:rPr>
+        <w:t xml:space="preserve">美元/桶，并存在较高二次跳涨风险。</w:t>
+      </w:r>
+    </w:p>
+    <w:p>
+      <w:pPr>
+        <w:numPr>
+          <w:ilvl w:val="0"/>
+          <w:numId w:val="1007"/>
+        </w:numPr>
+      </w:pPr>
+      <w:r>
+        <w:rPr>
+          <w:rFonts w:hint="eastAsia"/>
+        </w:rPr>
         <w:t xml:space="preserve">敏感性分析显示，不确定性平台、地缘风险权重和供应中断量是最关键影响因素；SPR</w:t>
       </w:r>
       <w:r>
@@ -13901,8 +14692,123 @@
         <w:t xml:space="preserve">问题，而应被理解为物理缺口、政策缓冲、库存约束、替代运输和市场风险预期共同作用下的动态系统。</w:t>
       </w:r>
     </w:p>
-    <w:bookmarkEnd w:id="98"/>
-    <w:bookmarkStart w:id="100" w:name="参考文献"/>
+    <w:bookmarkEnd w:id="103"/>
+    <w:bookmarkStart w:id="104" w:name="附录支撑材料说明"/>
+    <w:p>
+      <w:pPr>
+        <w:pStyle w:val="Heading1"/>
+      </w:pPr>
+      <w:r>
+        <w:rPr>
+          <w:rFonts w:hint="eastAsia"/>
+        </w:rPr>
+        <w:t xml:space="preserve">附录：支撑材料说明</w:t>
+      </w:r>
+    </w:p>
+    <w:p>
+      <w:pPr>
+        <w:pStyle w:val="FirstParagraph"/>
+      </w:pPr>
+      <w:r>
+        <w:rPr>
+          <w:rFonts w:hint="eastAsia"/>
+        </w:rPr>
+        <w:t xml:space="preserve">本文的主要计算和图表均由项目目录中的脚本复现。附件原始价格数据经清洗后形成中文命名</w:t>
+      </w:r>
+      <w:r>
+        <w:t xml:space="preserve"> </w:t>
+      </w:r>
+      <w:r>
+        <w:rPr>
+          <w:rFonts w:hint="eastAsia"/>
+        </w:rPr>
+        <w:t xml:space="preserve">CSV；短期模型校准结果保存在</w:t>
+      </w:r>
+      <w:r>
+        <w:t xml:space="preserve"> </w:t>
+      </w:r>
+      <w:r>
+        <w:rPr>
+          <w:rStyle w:val="VerbatimChar"/>
+          <w:rFonts w:hint="eastAsia"/>
+        </w:rPr>
+        <w:t xml:space="preserve">output/calibration/动态模型校准后路径.csv</w:t>
+      </w:r>
+      <w:r>
+        <w:rPr>
+          <w:rFonts w:hint="eastAsia"/>
+        </w:rPr>
+        <w:t xml:space="preserve">；长期三情景预测结果保存在</w:t>
+      </w:r>
+      <w:r>
+        <w:t xml:space="preserve"> </w:t>
+      </w:r>
+      <w:r>
+        <w:rPr>
+          <w:rStyle w:val="VerbatimChar"/>
+          <w:rFonts w:hint="eastAsia"/>
+        </w:rPr>
+        <w:t xml:space="preserve">output/scenarios/三情景预测结果.csv</w:t>
+      </w:r>
+      <w:r>
+        <w:rPr>
+          <w:rFonts w:hint="eastAsia"/>
+        </w:rPr>
+        <w:t xml:space="preserve">；最终论文图表由</w:t>
+      </w:r>
+      <w:r>
+        <w:t xml:space="preserve"> </w:t>
+      </w:r>
+      <w:r>
+        <w:rPr>
+          <w:rStyle w:val="VerbatimChar"/>
+        </w:rPr>
+        <w:t xml:space="preserve">src/visualization/</w:t>
+      </w:r>
+      <w:r>
+        <w:t xml:space="preserve"> </w:t>
+      </w:r>
+      <w:r>
+        <w:rPr>
+          <w:rFonts w:hint="eastAsia"/>
+        </w:rPr>
+        <w:t xml:space="preserve">下的可视化脚本生成。最终交付文件为</w:t>
+      </w:r>
+      <w:r>
+        <w:t xml:space="preserve"> </w:t>
+      </w:r>
+      <w:r>
+        <w:rPr>
+          <w:rStyle w:val="VerbatimChar"/>
+          <w:rFonts w:hint="eastAsia"/>
+        </w:rPr>
+        <w:t xml:space="preserve">output/final/总论文.pdf</w:t>
+      </w:r>
+      <w:r>
+        <w:t xml:space="preserve"> </w:t>
+      </w:r>
+      <w:r>
+        <w:rPr>
+          <w:rFonts w:hint="eastAsia"/>
+        </w:rPr>
+        <w:t xml:space="preserve">和</w:t>
+      </w:r>
+      <w:r>
+        <w:t xml:space="preserve"> </w:t>
+      </w:r>
+      <w:r>
+        <w:rPr>
+          <w:rStyle w:val="VerbatimChar"/>
+          <w:rFonts w:hint="eastAsia"/>
+        </w:rPr>
+        <w:t xml:space="preserve">output/final/总论文.docx</w:t>
+      </w:r>
+      <w:r>
+        <w:t xml:space="preserve">。</w:t>
+      </w:r>
+    </w:p>
+    <w:bookmarkEnd w:id="104"/>
+    <w:bookmarkStart w:id="106" w:name="参考文献"/>
     <w:p>
       <w:pPr>
         <w:pStyle w:val="Heading1"/>
@@ -14071,7 +14977,7 @@
       <w:r>
         <w:t xml:space="preserve"> </w:t>
       </w:r>
-      <w:hyperlink r:id="rId99">
+      <w:hyperlink r:id="rId105">
         <w:r>
           <w:rPr>
             <w:rStyle w:val="Hyperlink"/>
@@ -14083,7 +14989,7 @@
         <w:t xml:space="preserve">.</w:t>
       </w:r>
     </w:p>
-    <w:bookmarkEnd w:id="100"/>
+    <w:bookmarkEnd w:id="106"/>
     <w:sectPr>
       <w:footnotePr>
         <w:numRestart w:val="eachSect"/>
@@ -14433,6 +15339,36 @@
     </w:lvlOverride>
   </w:num>
   <w:num w:numId="1006">
+    <w:abstractNumId w:val="99201"/>
+    <w:lvlOverride w:ilvl="0">
+      <w:startOverride w:val="1"/>
+    </w:lvlOverride>
+    <w:lvlOverride w:ilvl="1">
+      <w:startOverride w:val="1"/>
+    </w:lvlOverride>
+    <w:lvlOverride w:ilvl="2">
+      <w:startOverride w:val="1"/>
+    </w:lvlOverride>
+    <w:lvlOverride w:ilvl="3">
+      <w:startOverride w:val="1"/>
+    </w:lvlOverride>
+    <w:lvlOverride w:ilvl="4">
+      <w:startOverride w:val="1"/>
+    </w:lvlOverride>
+    <w:lvlOverride w:ilvl="5">
+      <w:startOverride w:val="1"/>
+    </w:lvlOverride>
+    <w:lvlOverride w:ilvl="6">
+      <w:startOverride w:val="1"/>
+    </w:lvlOverride>
+    <w:lvlOverride w:ilvl="7">
+      <w:startOverride w:val="1"/>
+    </w:lvlOverride>
+    <w:lvlOverride w:ilvl="8">
+      <w:startOverride w:val="1"/>
+    </w:lvlOverride>
+  </w:num>
+  <w:num w:numId="1007">
     <w:abstractNumId w:val="99201"/>
     <w:lvlOverride w:ilvl="0">
       <w:startOverride w:val="1"/>

</xml_diff>

<commit_message>
Tighten final paper and clarify appendix growth
</commit_message>
<xml_diff>
--- a/output/final/总论文.docx
+++ b/output/final/总论文.docx
@@ -79,19 +79,19 @@
         <w:rPr>
           <w:rFonts w:hint="eastAsia"/>
         </w:rPr>
-        <w:t xml:space="preserve">霍尔木兹海峡是全球原油运输的关键咽喉。一旦发生封锁，供应中断、地缘风险重估、战略储备释放、商业库存缓冲、绕道运输恢复和市场预期修复会同时作用于国际原油价格。本文以附件给出的布伦特原油期货主力合约价格数据为基础，建立了</w:t>
-      </w:r>
-      <w:r>
-        <w:rPr>
-          <w:rFonts w:hint="eastAsia"/>
-        </w:rPr>
-        <w:t xml:space="preserve">“附件数据清洗–传统供需基准–短期动态递推–长期情景预测–敏感性分析”</w:t>
-      </w:r>
-      <w:r>
-        <w:rPr>
-          <w:rFonts w:hint="eastAsia"/>
-        </w:rPr>
-        <w:t xml:space="preserve">的完整模型链条。</w:t>
+        <w:t xml:space="preserve">霍尔木兹海峡是全球原油运输的关键咽喉。若发生封锁，供应中断、地缘风险重估、战略储备释放、商业库存缓冲、绕道运输恢复和市场预期修复会共同作用于国际原油价格。本文以附件布伦特原油期货主力合约价格数据为基础，建立</w:t>
+      </w:r>
+      <w:r>
+        <w:rPr>
+          <w:rFonts w:hint="eastAsia"/>
+        </w:rPr>
+        <w:t xml:space="preserve">“数据清洗–传统供需基准–短期动态递推–长期情景预测–敏感性分析”</w:t>
+      </w:r>
+      <w:r>
+        <w:rPr>
+          <w:rFonts w:hint="eastAsia"/>
+        </w:rPr>
+        <w:t xml:space="preserve">的模型链条。</w:t>
       </w:r>
     </w:p>
     <w:p>
@@ -102,7 +102,7 @@
         <w:rPr>
           <w:rFonts w:hint="eastAsia"/>
         </w:rPr>
-        <w:t xml:space="preserve">针对任务一，本文首先清洗</w:t>
+        <w:t xml:space="preserve">针对任务一，本文清洗</w:t>
       </w:r>
       <w:r>
         <w:t xml:space="preserve"> 2017 </w:t>
@@ -138,7 +138,7 @@
         <w:rPr>
           <w:rFonts w:hint="eastAsia"/>
         </w:rPr>
-        <w:t xml:space="preserve">月的原始价格序列，并截取</w:t>
+        <w:t xml:space="preserve">月的原始价格序列，截取</w:t>
       </w:r>
       <w:r>
         <w:t xml:space="preserve"> 2026 </w:t>
@@ -192,7 +192,7 @@
         <w:rPr>
           <w:rFonts w:hint="eastAsia"/>
         </w:rPr>
-        <w:t xml:space="preserve">日的冲突窗口作为主要拟合区间。附件数据显示，冲突窗口内最高收盘价为</w:t>
+        <w:t xml:space="preserve">日为冲突窗口。附件数据显示，窗口内最高收盘价为</w:t>
       </w:r>
       <w:r>
         <w:t xml:space="preserve"> 114.06 </w:t>
@@ -210,7 +210,7 @@
         <w:rPr>
           <w:rFonts w:hint="eastAsia"/>
         </w:rPr>
-        <w:t xml:space="preserve">美元/桶。随后，本文按题面给定的短期低需求弹性和供应中断范围建立传统供需基准模型，得到约</w:t>
+        <w:t xml:space="preserve">美元/桶。按题面短期低弹性和供应中断范围建立传统供需基准模型，可得</w:t>
       </w:r>
       <w:r>
         <w:t xml:space="preserve"> 278–337 </w:t>
@@ -219,7 +219,7 @@
         <w:rPr>
           <w:rFonts w:hint="eastAsia"/>
         </w:rPr>
-        <w:t xml:space="preserve">美元/桶的理论价格区间。该结果显著高于附件真实价格，说明单纯低弹性供需框架会高估现实价格，必须进一步刻画政策缓冲和市场预期修复。</w:t>
+        <w:t xml:space="preserve">美元/桶的理论价格区间，显著高于附件真实价格，说明必须引入政策缓冲和市场预期修复。</w:t>
       </w:r>
     </w:p>
     <w:p>
@@ -230,7 +230,7 @@
         <w:rPr>
           <w:rFonts w:hint="eastAsia"/>
         </w:rPr>
-        <w:t xml:space="preserve">针对任务一中的日度价格解释，本文构建短期动态递推模型。模型在物理供需层纳入供应中断、SPR</w:t>
+        <w:t xml:space="preserve">为解释日度价格路径，本文构建短期动态递推模型：物理供需层纳入供应中断、SPR</w:t>
       </w:r>
       <w:r>
         <w:t xml:space="preserve"> </w:t>
@@ -239,7 +239,7 @@
         <w:rPr>
           <w:rFonts w:hint="eastAsia"/>
         </w:rPr>
-        <w:t xml:space="preserve">释放、商业库存、绕道运输、需求收缩和恐慌衰减，在市场价格形成层纳入地缘风险溢价、不确定性平台、缓冲确认折价和预期修复折价。通过固定种子随机搜索、差分进化连续精修、局部稳健性复核和拟合质量精修，综合最优模型在</w:t>
+        <w:t xml:space="preserve">释放、商业库存、绕道运输、需求收缩和恐慌衰减，市场价格形成层纳入地缘风险溢价、不确定性平台、缓冲确认折价和预期修复折价。综合最优模型在</w:t>
       </w:r>
       <w:r>
         <w:t xml:space="preserve"> 46 </w:t>
@@ -248,7 +248,7 @@
         <w:rPr>
           <w:rFonts w:hint="eastAsia"/>
         </w:rPr>
-        <w:t xml:space="preserve">个交易日冲突窗口内取得</w:t>
+        <w:t xml:space="preserve">个交易日内取得</w:t>
       </w:r>
       <w:r>
         <w:t xml:space="preserve"> RMSE </w:t>
@@ -311,7 +311,7 @@
         <w:rPr>
           <w:rFonts w:hint="eastAsia"/>
         </w:rPr>
-        <w:t xml:space="preserve">基准。滞后平移检验、拐点检验、机制消融、过拟合压力测试和硬编码审计表明，该模型不是简单滞后复制，也没有把</w:t>
+        <w:t xml:space="preserve">基准。滞后平移、拐点、机制消融、过拟合压力测试和硬编码审计表明，模型不是简单滞后复制，也没有把</w:t>
       </w:r>
       <w:r>
         <w:t xml:space="preserve"> 120 </w:t>
@@ -331,7 +331,7 @@
         <w:rPr>
           <w:rFonts w:hint="eastAsia"/>
         </w:rPr>
-        <w:t xml:space="preserve">针对任务二，本文在短期机制校准结果基础上构建</w:t>
+        <w:t xml:space="preserve">针对任务二，本文构建</w:t>
       </w:r>
       <w:r>
         <w:t xml:space="preserve"> 60–180 </w:t>
@@ -376,16 +376,7 @@
         <w:rPr>
           <w:rFonts w:hint="eastAsia"/>
         </w:rPr>
-        <w:t xml:space="preserve">美元/桶，且存在较高二次跳涨风险。最后，本文围绕</w:t>
-      </w:r>
-      <w:r>
-        <w:t xml:space="preserve"> 10 </w:t>
-      </w:r>
-      <w:r>
-        <w:rPr>
-          <w:rFonts w:hint="eastAsia"/>
-        </w:rPr>
-        <w:t xml:space="preserve">个关键参数进行单因素敏感性分析，发现综合敏感度最高的三个因素为不确定性平台、地缘风险权重和供应中断量；SPR</w:t>
+        <w:t xml:space="preserve">美元/桶，且存在较高二次跳涨风险。敏感性分析表明，不确定性平台、地缘风险权重和供应中断量是综合敏感度最高的三个因素；SPR</w:t>
       </w:r>
       <w:r>
         <w:t xml:space="preserve"> </w:t>
@@ -394,16 +385,7 @@
         <w:rPr>
           <w:rFonts w:hint="eastAsia"/>
         </w:rPr>
-        <w:t xml:space="preserve">释放和绕道运输对第</w:t>
-      </w:r>
-      <w:r>
-        <w:t xml:space="preserve"> 180 </w:t>
-      </w:r>
-      <w:r>
-        <w:rPr>
-          <w:rFonts w:hint="eastAsia"/>
-        </w:rPr>
-        <w:t xml:space="preserve">天终点价格影响较小，但能够影响外推期峰值和削峰能力。研究结果表明，短期油价平台由物理缺口和市场风险重估共同决定，长期风险则取决于高风险溢价、供应中断规模和政策缓冲能否形成组合对冲。</w:t>
+        <w:t xml:space="preserve">释放和绕道运输更主要影响外推期峰值和削峰能力。</w:t>
       </w:r>
     </w:p>
     <w:p>
@@ -4906,7 +4888,7 @@
     </w:p>
     <w:bookmarkEnd w:id="36"/>
     <w:bookmarkEnd w:id="37"/>
-    <w:bookmarkStart w:id="77" w:name="参数校准与模型检验"/>
+    <w:bookmarkStart w:id="74" w:name="参数校准与模型检验"/>
     <w:p>
       <w:pPr>
         <w:pStyle w:val="Heading1"/>
@@ -8172,7 +8154,7 @@
       </w:r>
     </w:p>
     <w:bookmarkEnd w:id="59"/>
-    <w:bookmarkStart w:id="66" w:name="分段误差与残差诊断"/>
+    <w:bookmarkStart w:id="63" w:name="分段误差与残差诊断"/>
     <w:p>
       <w:pPr>
         <w:pStyle w:val="Heading2"/>
@@ -8247,78 +8229,20 @@
       <w:r>
         <w:drawing>
           <wp:inline>
-            <wp:extent cx="4907280" cy="3658154"/>
+            <wp:extent cx="4907280" cy="3655675"/>
             <wp:effectExtent b="0" l="0" r="0" t="0"/>
             <wp:docPr descr="" title="" id="61" name="Picture"/>
             <a:graphic>
               <a:graphicData uri="http://schemas.openxmlformats.org/drawingml/2006/picture">
                 <pic:pic>
                   <pic:nvPicPr>
-                    <pic:cNvPr descr="短期模型误差诊断.png" id="62" name="Picture"/>
+                    <pic:cNvPr descr="短期模型残差诊断增强.png" id="62" name="Picture"/>
                     <pic:cNvPicPr>
                       <a:picLocks noChangeArrowheads="1" noChangeAspect="1"/>
                     </pic:cNvPicPr>
                   </pic:nvPicPr>
                   <pic:blipFill>
                     <a:blip r:embed="rId60"/>
-                    <a:stretch>
-                      <a:fillRect/>
-                    </a:stretch>
-                  </pic:blipFill>
-                  <pic:spPr bwMode="auto">
-                    <a:xfrm>
-                      <a:off x="0" y="0"/>
-                      <a:ext cx="4907280" cy="3658154"/>
-                    </a:xfrm>
-                    <a:prstGeom prst="rect">
-                      <a:avLst/>
-                    </a:prstGeom>
-                    <a:noFill/>
-                    <a:ln w="9525">
-                      <a:noFill/>
-                      <a:headEnd/>
-                      <a:tailEnd/>
-                    </a:ln>
-                  </pic:spPr>
-                </pic:pic>
-              </a:graphicData>
-            </a:graphic>
-          </wp:inline>
-        </w:drawing>
-      </w:r>
-    </w:p>
-    <w:p>
-      <w:pPr>
-        <w:pStyle w:val="ImageCaption"/>
-      </w:pPr>
-      <w:r>
-        <w:rPr>
-          <w:rFonts w:hint="eastAsia"/>
-        </w:rPr>
-        <w:t xml:space="preserve">短期模型逐日误差与分段误差诊断。误差没有集中失控于单一阶段。</w:t>
-      </w:r>
-    </w:p>
-    <w:p>
-      <w:pPr>
-        <w:pStyle w:val="CaptionedFigure"/>
-      </w:pPr>
-      <w:r>
-        <w:drawing>
-          <wp:inline>
-            <wp:extent cx="4907280" cy="3655675"/>
-            <wp:effectExtent b="0" l="0" r="0" t="0"/>
-            <wp:docPr descr="" title="" id="64" name="Picture"/>
-            <a:graphic>
-              <a:graphicData uri="http://schemas.openxmlformats.org/drawingml/2006/picture">
-                <pic:pic>
-                  <pic:nvPicPr>
-                    <pic:cNvPr descr="短期模型残差诊断增强.png" id="65" name="Picture"/>
-                    <pic:cNvPicPr>
-                      <a:picLocks noChangeArrowheads="1" noChangeAspect="1"/>
-                    </pic:cNvPicPr>
-                  </pic:nvPicPr>
-                  <pic:blipFill>
-                    <a:blip r:embed="rId63"/>
                     <a:stretch>
                       <a:fillRect/>
                     </a:stretch>
@@ -8385,8 +8309,8 @@
         <w:t xml:space="preserve">0.254，说明仍存在一定连续偏差，但未形成明显强自相关。</w:t>
       </w:r>
     </w:p>
-    <w:bookmarkEnd w:id="66"/>
-    <w:bookmarkStart w:id="67" w:name="机制消融的定量证据"/>
+    <w:bookmarkEnd w:id="63"/>
+    <w:bookmarkStart w:id="64" w:name="机制消融的定量证据"/>
     <w:p>
       <w:pPr>
         <w:pStyle w:val="Heading2"/>
@@ -9307,8 +9231,8 @@
         <w:t xml:space="preserve">10.09，说明市场对政策缓冲和运输恢复的预期并不是可有可无的修饰，而是解释后期回落的关键机制。</w:t>
       </w:r>
     </w:p>
-    <w:bookmarkEnd w:id="67"/>
-    <w:bookmarkStart w:id="71" w:name="拐点预测步长与事件边界"/>
+    <w:bookmarkEnd w:id="64"/>
+    <w:bookmarkStart w:id="68" w:name="拐点预测步长与事件边界"/>
     <w:p>
       <w:pPr>
         <w:pStyle w:val="Heading2"/>
@@ -9431,18 +9355,18 @@
           <wp:inline>
             <wp:extent cx="4907280" cy="3568930"/>
             <wp:effectExtent b="0" l="0" r="0" t="0"/>
-            <wp:docPr descr="" title="" id="69" name="Picture"/>
+            <wp:docPr descr="" title="" id="66" name="Picture"/>
             <a:graphic>
               <a:graphicData uri="http://schemas.openxmlformats.org/drawingml/2006/picture">
                 <pic:pic>
                   <pic:nvPicPr>
-                    <pic:cNvPr descr="短期模型拐点局部检验.png" id="70" name="Picture"/>
+                    <pic:cNvPr descr="短期模型拐点局部检验.png" id="67" name="Picture"/>
                     <pic:cNvPicPr>
                       <a:picLocks noChangeArrowheads="1" noChangeAspect="1"/>
                     </pic:cNvPicPr>
                   </pic:nvPicPr>
                   <pic:blipFill>
-                    <a:blip r:embed="rId68"/>
+                    <a:blip r:embed="rId65"/>
                     <a:stretch>
                       <a:fillRect/>
                     </a:stretch>
@@ -9509,8 +9433,8 @@
         <w:t xml:space="preserve">年等非霍尔木兹事件窗口。结果显示，该模型在这些窗口通常显著弱于朴素上一日基准。这并不削弱本文结论，反而说明本文模型不是通用油价短线交易器，而是针对霍尔木兹封锁机制构建的事件解释模型。论文结论应限定在极端地缘冲突下的条件路径解释与情景预测，不能外推为普通时期的万能预测模型。</w:t>
       </w:r>
     </w:p>
-    <w:bookmarkEnd w:id="71"/>
-    <w:bookmarkStart w:id="75" w:name="参数自由度与稳健性区间"/>
+    <w:bookmarkEnd w:id="68"/>
+    <w:bookmarkStart w:id="72" w:name="参数自由度与稳健性区间"/>
     <w:p>
       <w:pPr>
         <w:pStyle w:val="Heading2"/>
@@ -10156,18 +10080,18 @@
           <wp:inline>
             <wp:extent cx="4907280" cy="2587474"/>
             <wp:effectExtent b="0" l="0" r="0" t="0"/>
-            <wp:docPr descr="" title="" id="73" name="Picture"/>
+            <wp:docPr descr="" title="" id="70" name="Picture"/>
             <a:graphic>
               <a:graphicData uri="http://schemas.openxmlformats.org/drawingml/2006/picture">
                 <pic:pic>
                   <pic:nvPicPr>
-                    <pic:cNvPr descr="短期模型稳健性带.png" id="74" name="Picture"/>
+                    <pic:cNvPr descr="短期模型稳健性带.png" id="71" name="Picture"/>
                     <pic:cNvPicPr>
                       <a:picLocks noChangeArrowheads="1" noChangeAspect="1"/>
                     </pic:cNvPicPr>
                   </pic:nvPicPr>
                   <pic:blipFill>
-                    <a:blip r:embed="rId72"/>
+                    <a:blip r:embed="rId69"/>
                     <a:stretch>
                       <a:fillRect/>
                     </a:stretch>
@@ -10342,8 +10266,8 @@
         <w:t xml:space="preserve">美元/桶，说明最优参数附近存在稳定的优秀参数邻域。</w:t>
       </w:r>
     </w:p>
-    <w:bookmarkEnd w:id="75"/>
-    <w:bookmarkStart w:id="76" w:name="内生性反事实基准与硬编码审计"/>
+    <w:bookmarkEnd w:id="72"/>
+    <w:bookmarkStart w:id="73" w:name="内生性反事实基准与硬编码审计"/>
     <w:p>
       <w:pPr>
         <w:pStyle w:val="Heading2"/>
@@ -10640,9 +10564,9 @@
         <w:t xml:space="preserve">美元平台不是代码硬上限，但不应声称已经实现了多智能体动态纳什均衡。</w:t>
       </w:r>
     </w:p>
-    <w:bookmarkEnd w:id="76"/>
-    <w:bookmarkEnd w:id="77"/>
-    <w:bookmarkStart w:id="89" w:name="天三情景预测"/>
+    <w:bookmarkEnd w:id="73"/>
+    <w:bookmarkEnd w:id="74"/>
+    <w:bookmarkStart w:id="83" w:name="天三情景预测"/>
     <w:p>
       <w:pPr>
         <w:pStyle w:val="Heading1"/>
@@ -10657,7 +10581,7 @@
         <w:t xml:space="preserve">天三情景预测</w:t>
       </w:r>
     </w:p>
-    <w:bookmarkStart w:id="78" w:name="情景设定"/>
+    <w:bookmarkStart w:id="75" w:name="情景设定"/>
     <w:p>
       <w:pPr>
         <w:pStyle w:val="Heading2"/>
@@ -12136,8 +12060,8 @@
         </w:tc>
       </w:tr>
     </w:tbl>
-    <w:bookmarkEnd w:id="78"/>
-    <w:bookmarkStart w:id="88" w:name="预测结果"/>
+    <w:bookmarkEnd w:id="75"/>
+    <w:bookmarkStart w:id="82" w:name="预测结果"/>
     <w:p>
       <w:pPr>
         <w:pStyle w:val="Heading2"/>
@@ -12627,18 +12551,18 @@
           <wp:inline>
             <wp:extent cx="5013960" cy="2757678"/>
             <wp:effectExtent b="0" l="0" r="0" t="0"/>
-            <wp:docPr descr="" title="" id="80" name="Picture"/>
+            <wp:docPr descr="" title="" id="77" name="Picture"/>
             <a:graphic>
               <a:graphicData uri="http://schemas.openxmlformats.org/drawingml/2006/picture">
                 <pic:pic>
                   <pic:nvPicPr>
-                    <pic:cNvPr descr="短期拟合与长期预测总览.png" id="81" name="Picture"/>
+                    <pic:cNvPr descr="短期拟合与长期预测总览.png" id="78" name="Picture"/>
                     <pic:cNvPicPr>
                       <a:picLocks noChangeArrowheads="1" noChangeAspect="1"/>
                     </pic:cNvPicPr>
                   </pic:nvPicPr>
                   <pic:blipFill>
-                    <a:blip r:embed="rId79"/>
+                    <a:blip r:embed="rId76"/>
                     <a:stretch>
                       <a:fillRect/>
                     </a:stretch>
@@ -12687,240 +12611,164 @@
     </w:p>
     <w:p>
       <w:pPr>
+        <w:pStyle w:val="BodyText"/>
+      </w:pPr>
+      <w:r>
+        <w:rPr>
+          <w:rFonts w:hint="eastAsia"/>
+        </w:rPr>
+        <w:t xml:space="preserve">结果显示，中性情景下价格在</w:t>
+      </w:r>
+      <w:r>
+        <w:t xml:space="preserve"> 180 </w:t>
+      </w:r>
+      <w:r>
+        <w:rPr>
+          <w:rFonts w:hint="eastAsia"/>
+        </w:rPr>
+        <w:t xml:space="preserve">天附近回落至约</w:t>
+      </w:r>
+      <w:r>
+        <w:t xml:space="preserve"> 104.49 </w:t>
+      </w:r>
+      <w:r>
+        <w:rPr>
+          <w:rFonts w:hint="eastAsia"/>
+        </w:rPr>
+        <w:t xml:space="preserve">美元/桶；悲观情景下，若供应中断偏大、SPR</w:t>
+      </w:r>
+      <w:r>
+        <w:t xml:space="preserve"> </w:t>
+      </w:r>
+      <w:r>
+        <w:rPr>
+          <w:rFonts w:hint="eastAsia"/>
+        </w:rPr>
+        <w:t xml:space="preserve">释放弱、绕道恢复慢且风险溢价维持高位，价格可能再次升至</w:t>
+      </w:r>
+      <w:r>
+        <w:t xml:space="preserve"> 120 </w:t>
+      </w:r>
+      <w:r>
+        <w:rPr>
+          <w:rFonts w:hint="eastAsia"/>
+        </w:rPr>
+        <w:t xml:space="preserve">美元/桶附近，并在外推期达到约</w:t>
+      </w:r>
+      <w:r>
+        <w:t xml:space="preserve"> 130.18 </w:t>
+      </w:r>
+      <w:r>
+        <w:rPr>
+          <w:rFonts w:hint="eastAsia"/>
+        </w:rPr>
+        <w:t xml:space="preserve">美元/桶的高点。</w:t>
+      </w:r>
+    </w:p>
+    <w:p>
+      <w:pPr>
+        <w:pStyle w:val="BodyText"/>
+      </w:pPr>
+      <w:r>
+        <w:rPr>
+          <w:rFonts w:hint="eastAsia"/>
+        </w:rPr>
+        <w:t xml:space="preserve">从价格平衡点看，乐观情景最终回落至约</w:t>
+      </w:r>
+      <w:r>
+        <w:t xml:space="preserve"> 95.99 </w:t>
+      </w:r>
+      <w:r>
+        <w:rPr>
+          <w:rFonts w:hint="eastAsia"/>
+        </w:rPr>
+        <w:t xml:space="preserve">美元/桶，说明若</w:t>
+      </w:r>
+      <w:r>
+        <w:t xml:space="preserve"> SPR </w:t>
+      </w:r>
+      <w:r>
+        <w:rPr>
+          <w:rFonts w:hint="eastAsia"/>
+        </w:rPr>
+        <w:t xml:space="preserve">释放及时、绕道运输恢复充分且长期需求弹性发挥作用，油价可以逐步脱离</w:t>
+      </w:r>
+      <w:r>
+        <w:t xml:space="preserve"> 110–120 </w:t>
+      </w:r>
+      <w:r>
+        <w:rPr>
+          <w:rFonts w:hint="eastAsia"/>
+        </w:rPr>
+        <w:t xml:space="preserve">美元平台。中性情景第</w:t>
+      </w:r>
+      <w:r>
+        <w:t xml:space="preserve"> 180 </w:t>
+      </w:r>
+      <w:r>
+        <w:rPr>
+          <w:rFonts w:hint="eastAsia"/>
+        </w:rPr>
+        <w:t xml:space="preserve">天约为</w:t>
+      </w:r>
+      <w:r>
+        <w:t xml:space="preserve"> 104.49 </w:t>
+      </w:r>
+      <w:r>
+        <w:rPr>
+          <w:rFonts w:hint="eastAsia"/>
+        </w:rPr>
+        <w:t xml:space="preserve">美元/桶，更接近政策缓冲与市场风险重新平衡后的中心水平。悲观情景第</w:t>
+      </w:r>
+      <w:r>
+        <w:t xml:space="preserve"> 180 </w:t>
+      </w:r>
+      <w:r>
+        <w:rPr>
+          <w:rFonts w:hint="eastAsia"/>
+        </w:rPr>
+        <w:t xml:space="preserve">天仍为</w:t>
+      </w:r>
+      <w:r>
+        <w:t xml:space="preserve"> 119.53 </w:t>
+      </w:r>
+      <w:r>
+        <w:rPr>
+          <w:rFonts w:hint="eastAsia"/>
+        </w:rPr>
+        <w:t xml:space="preserve">美元/桶，说明若供应中断规模接近上界、SPR</w:t>
+      </w:r>
+      <w:r>
+        <w:t xml:space="preserve"> </w:t>
+      </w:r>
+      <w:r>
+        <w:rPr>
+          <w:rFonts w:hint="eastAsia"/>
+        </w:rPr>
+        <w:t xml:space="preserve">释放不足且风险溢价持续，市场可能长期停留在高位平台，并保留二次跳涨尾部风险。</w:t>
+      </w:r>
+    </w:p>
+    <w:p>
+      <w:pPr>
         <w:pStyle w:val="CaptionedFigure"/>
       </w:pPr>
       <w:r>
         <w:drawing>
           <wp:inline>
-            <wp:extent cx="4907280" cy="2645664"/>
+            <wp:extent cx="4907280" cy="3413760"/>
             <wp:effectExtent b="0" l="0" r="0" t="0"/>
-            <wp:docPr descr="" title="" id="83" name="Picture"/>
+            <wp:docPr descr="" title="" id="80" name="Picture"/>
             <a:graphic>
               <a:graphicData uri="http://schemas.openxmlformats.org/drawingml/2006/picture">
                 <pic:pic>
                   <pic:nvPicPr>
-                    <pic:cNvPr descr="scenario_price_paths.png" id="84" name="Picture"/>
+                    <pic:cNvPr descr="inventory_depletion_risk.png" id="81" name="Picture"/>
                     <pic:cNvPicPr>
                       <a:picLocks noChangeArrowheads="1" noChangeAspect="1"/>
                     </pic:cNvPicPr>
                   </pic:nvPicPr>
                   <pic:blipFill>
-                    <a:blip r:embed="rId82"/>
-                    <a:stretch>
-                      <a:fillRect/>
-                    </a:stretch>
-                  </pic:blipFill>
-                  <pic:spPr bwMode="auto">
-                    <a:xfrm>
-                      <a:off x="0" y="0"/>
-                      <a:ext cx="4907280" cy="2645664"/>
-                    </a:xfrm>
-                    <a:prstGeom prst="rect">
-                      <a:avLst/>
-                    </a:prstGeom>
-                    <a:noFill/>
-                    <a:ln w="9525">
-                      <a:noFill/>
-                      <a:headEnd/>
-                      <a:tailEnd/>
-                    </a:ln>
-                  </pic:spPr>
-                </pic:pic>
-              </a:graphicData>
-            </a:graphic>
-          </wp:inline>
-        </w:drawing>
-      </w:r>
-    </w:p>
-    <w:p>
-      <w:pPr>
-        <w:pStyle w:val="ImageCaption"/>
-      </w:pPr>
-      <w:r>
-        <w:rPr>
-          <w:rFonts w:hint="eastAsia"/>
-        </w:rPr>
-        <w:t xml:space="preserve">阶段</w:t>
-      </w:r>
-      <w:r>
-        <w:t xml:space="preserve"> </w:t>
-      </w:r>
-      <w:r>
-        <w:rPr>
-          <w:rFonts w:hint="eastAsia"/>
-        </w:rPr>
-        <w:t xml:space="preserve">5：60–180</w:t>
-      </w:r>
-      <w:r>
-        <w:t xml:space="preserve"> </w:t>
-      </w:r>
-      <w:r>
-        <w:rPr>
-          <w:rFonts w:hint="eastAsia"/>
-        </w:rPr>
-        <w:t xml:space="preserve">天三情景原油价格路径。</w:t>
-      </w:r>
-    </w:p>
-    <w:p>
-      <w:pPr>
-        <w:pStyle w:val="BodyText"/>
-      </w:pPr>
-      <w:r>
-        <w:rPr>
-          <w:rFonts w:hint="eastAsia"/>
-        </w:rPr>
-        <w:t xml:space="preserve">结果显示，中性情景下价格在</w:t>
-      </w:r>
-      <w:r>
-        <w:t xml:space="preserve"> 180 </w:t>
-      </w:r>
-      <w:r>
-        <w:rPr>
-          <w:rFonts w:hint="eastAsia"/>
-        </w:rPr>
-        <w:t xml:space="preserve">天附近回落至约</w:t>
-      </w:r>
-      <w:r>
-        <w:t xml:space="preserve"> 104.49 </w:t>
-      </w:r>
-      <w:r>
-        <w:rPr>
-          <w:rFonts w:hint="eastAsia"/>
-        </w:rPr>
-        <w:t xml:space="preserve">美元/桶；悲观情景下，若供应中断偏大、SPR</w:t>
-      </w:r>
-      <w:r>
-        <w:t xml:space="preserve"> </w:t>
-      </w:r>
-      <w:r>
-        <w:rPr>
-          <w:rFonts w:hint="eastAsia"/>
-        </w:rPr>
-        <w:t xml:space="preserve">释放弱、绕道恢复慢且风险溢价维持高位，价格可能再次升至</w:t>
-      </w:r>
-      <w:r>
-        <w:t xml:space="preserve"> 120 </w:t>
-      </w:r>
-      <w:r>
-        <w:rPr>
-          <w:rFonts w:hint="eastAsia"/>
-        </w:rPr>
-        <w:t xml:space="preserve">美元/桶附近，并在外推期达到约</w:t>
-      </w:r>
-      <w:r>
-        <w:t xml:space="preserve"> 130.18 </w:t>
-      </w:r>
-      <w:r>
-        <w:rPr>
-          <w:rFonts w:hint="eastAsia"/>
-        </w:rPr>
-        <w:t xml:space="preserve">美元/桶的高点。</w:t>
-      </w:r>
-    </w:p>
-    <w:p>
-      <w:pPr>
-        <w:pStyle w:val="BodyText"/>
-      </w:pPr>
-      <w:r>
-        <w:rPr>
-          <w:rFonts w:hint="eastAsia"/>
-        </w:rPr>
-        <w:t xml:space="preserve">从价格平衡点看，乐观情景最终回落至约</w:t>
-      </w:r>
-      <w:r>
-        <w:t xml:space="preserve"> 95.99 </w:t>
-      </w:r>
-      <w:r>
-        <w:rPr>
-          <w:rFonts w:hint="eastAsia"/>
-        </w:rPr>
-        <w:t xml:space="preserve">美元/桶，说明若</w:t>
-      </w:r>
-      <w:r>
-        <w:t xml:space="preserve"> SPR </w:t>
-      </w:r>
-      <w:r>
-        <w:rPr>
-          <w:rFonts w:hint="eastAsia"/>
-        </w:rPr>
-        <w:t xml:space="preserve">释放及时、绕道运输恢复充分且长期需求弹性发挥作用，油价可以逐步脱离</w:t>
-      </w:r>
-      <w:r>
-        <w:t xml:space="preserve"> 110–120 </w:t>
-      </w:r>
-      <w:r>
-        <w:rPr>
-          <w:rFonts w:hint="eastAsia"/>
-        </w:rPr>
-        <w:t xml:space="preserve">美元平台。中性情景第</w:t>
-      </w:r>
-      <w:r>
-        <w:t xml:space="preserve"> 180 </w:t>
-      </w:r>
-      <w:r>
-        <w:rPr>
-          <w:rFonts w:hint="eastAsia"/>
-        </w:rPr>
-        <w:t xml:space="preserve">天约为</w:t>
-      </w:r>
-      <w:r>
-        <w:t xml:space="preserve"> 104.49 </w:t>
-      </w:r>
-      <w:r>
-        <w:rPr>
-          <w:rFonts w:hint="eastAsia"/>
-        </w:rPr>
-        <w:t xml:space="preserve">美元/桶，更接近政策缓冲与市场风险重新平衡后的中心水平。悲观情景第</w:t>
-      </w:r>
-      <w:r>
-        <w:t xml:space="preserve"> 180 </w:t>
-      </w:r>
-      <w:r>
-        <w:rPr>
-          <w:rFonts w:hint="eastAsia"/>
-        </w:rPr>
-        <w:t xml:space="preserve">天仍为</w:t>
-      </w:r>
-      <w:r>
-        <w:t xml:space="preserve"> 119.53 </w:t>
-      </w:r>
-      <w:r>
-        <w:rPr>
-          <w:rFonts w:hint="eastAsia"/>
-        </w:rPr>
-        <w:t xml:space="preserve">美元/桶，说明若供应中断规模接近上界、SPR</w:t>
-      </w:r>
-      <w:r>
-        <w:t xml:space="preserve"> </w:t>
-      </w:r>
-      <w:r>
-        <w:rPr>
-          <w:rFonts w:hint="eastAsia"/>
-        </w:rPr>
-        <w:t xml:space="preserve">释放不足且风险溢价持续，市场可能长期停留在高位平台，并保留二次跳涨尾部风险。</w:t>
-      </w:r>
-    </w:p>
-    <w:p>
-      <w:pPr>
-        <w:pStyle w:val="CaptionedFigure"/>
-      </w:pPr>
-      <w:r>
-        <w:drawing>
-          <wp:inline>
-            <wp:extent cx="4907280" cy="3413760"/>
-            <wp:effectExtent b="0" l="0" r="0" t="0"/>
-            <wp:docPr descr="" title="" id="86" name="Picture"/>
-            <a:graphic>
-              <a:graphicData uri="http://schemas.openxmlformats.org/drawingml/2006/picture">
-                <pic:pic>
-                  <pic:nvPicPr>
-                    <pic:cNvPr descr="inventory_depletion_risk.png" id="87" name="Picture"/>
-                    <pic:cNvPicPr>
-                      <a:picLocks noChangeArrowheads="1" noChangeAspect="1"/>
-                    </pic:cNvPicPr>
-                  </pic:nvPicPr>
-                  <pic:blipFill>
-                    <a:blip r:embed="rId85"/>
+                    <a:blip r:embed="rId79"/>
                     <a:stretch>
                       <a:fillRect/>
                     </a:stretch>
@@ -12958,9 +12806,9 @@
         <w:t xml:space="preserve">商业库存剩余量与剩余供需缺口变化。悲观情景下缓冲能力下降，二次跳涨风险上升。</w:t>
       </w:r>
     </w:p>
-    <w:bookmarkEnd w:id="88"/>
-    <w:bookmarkEnd w:id="89"/>
-    <w:bookmarkStart w:id="98" w:name="敏感性分析"/>
+    <w:bookmarkEnd w:id="82"/>
+    <w:bookmarkEnd w:id="83"/>
+    <w:bookmarkStart w:id="89" w:name="敏感性分析"/>
     <w:p>
       <w:pPr>
         <w:pStyle w:val="Heading1"/>
@@ -12972,7 +12820,7 @@
         <w:t xml:space="preserve">敏感性分析</w:t>
       </w:r>
     </w:p>
-    <w:bookmarkStart w:id="90" w:name="分析方法"/>
+    <w:bookmarkStart w:id="84" w:name="分析方法"/>
     <w:p>
       <w:pPr>
         <w:pStyle w:val="Heading2"/>
@@ -13259,8 +13107,8 @@
         <w:t xml:space="preserve">天剩余缺口波动范围。该指标兼顾终点价格、阶段峰值和供需风险。</w:t>
       </w:r>
     </w:p>
-    <w:bookmarkEnd w:id="90"/>
-    <w:bookmarkStart w:id="97" w:name="参数重要性排序"/>
+    <w:bookmarkEnd w:id="84"/>
+    <w:bookmarkStart w:id="88" w:name="参数重要性排序"/>
     <w:p>
       <w:pPr>
         <w:pStyle w:val="Heading2"/>
@@ -14052,18 +13900,18 @@
           <wp:inline>
             <wp:extent cx="4907280" cy="2998893"/>
             <wp:effectExtent b="0" l="0" r="0" t="0"/>
-            <wp:docPr descr="" title="" id="92" name="Picture"/>
+            <wp:docPr descr="" title="" id="86" name="Picture"/>
             <a:graphic>
               <a:graphicData uri="http://schemas.openxmlformats.org/drawingml/2006/picture">
                 <pic:pic>
                   <pic:nvPicPr>
-                    <pic:cNvPr descr="sensitivity_tornado_180day.png" id="93" name="Picture"/>
+                    <pic:cNvPr descr="sensitivity_tornado_180day.png" id="87" name="Picture"/>
                     <pic:cNvPicPr>
                       <a:picLocks noChangeArrowheads="1" noChangeAspect="1"/>
                     </pic:cNvPicPr>
                   </pic:nvPicPr>
                   <pic:blipFill>
-                    <a:blip r:embed="rId91"/>
+                    <a:blip r:embed="rId85"/>
                     <a:stretch>
                       <a:fillRect/>
                     </a:stretch>
@@ -14112,64 +13960,6 @@
     </w:p>
     <w:p>
       <w:pPr>
-        <w:pStyle w:val="CaptionedFigure"/>
-      </w:pPr>
-      <w:r>
-        <w:drawing>
-          <wp:inline>
-            <wp:extent cx="4907280" cy="1599409"/>
-            <wp:effectExtent b="0" l="0" r="0" t="0"/>
-            <wp:docPr descr="" title="" id="95" name="Picture"/>
-            <a:graphic>
-              <a:graphicData uri="http://schemas.openxmlformats.org/drawingml/2006/picture">
-                <pic:pic>
-                  <pic:nvPicPr>
-                    <pic:cNvPr descr="sensitivity_parameter_response.png" id="96" name="Picture"/>
-                    <pic:cNvPicPr>
-                      <a:picLocks noChangeArrowheads="1" noChangeAspect="1"/>
-                    </pic:cNvPicPr>
-                  </pic:nvPicPr>
-                  <pic:blipFill>
-                    <a:blip r:embed="rId94"/>
-                    <a:stretch>
-                      <a:fillRect/>
-                    </a:stretch>
-                  </pic:blipFill>
-                  <pic:spPr bwMode="auto">
-                    <a:xfrm>
-                      <a:off x="0" y="0"/>
-                      <a:ext cx="4907280" cy="1599409"/>
-                    </a:xfrm>
-                    <a:prstGeom prst="rect">
-                      <a:avLst/>
-                    </a:prstGeom>
-                    <a:noFill/>
-                    <a:ln w="9525">
-                      <a:noFill/>
-                      <a:headEnd/>
-                      <a:tailEnd/>
-                    </a:ln>
-                  </pic:spPr>
-                </pic:pic>
-              </a:graphicData>
-            </a:graphic>
-          </wp:inline>
-        </w:drawing>
-      </w:r>
-    </w:p>
-    <w:p>
-      <w:pPr>
-        <w:pStyle w:val="ImageCaption"/>
-      </w:pPr>
-      <w:r>
-        <w:rPr>
-          <w:rFonts w:hint="eastAsia"/>
-        </w:rPr>
-        <w:t xml:space="preserve">前三个高敏感参数响应曲线。</w:t>
-      </w:r>
-    </w:p>
-    <w:p>
-      <w:pPr>
         <w:pStyle w:val="BodyText"/>
       </w:pPr>
       <w:r>
@@ -14230,9 +14020,9 @@
         <w:t xml:space="preserve">的政策缓冲变量。</w:t>
       </w:r>
     </w:p>
-    <w:bookmarkEnd w:id="97"/>
-    <w:bookmarkEnd w:id="98"/>
-    <w:bookmarkStart w:id="102" w:name="模型评价"/>
+    <w:bookmarkEnd w:id="88"/>
+    <w:bookmarkEnd w:id="89"/>
+    <w:bookmarkStart w:id="93" w:name="模型评价"/>
     <w:p>
       <w:pPr>
         <w:pStyle w:val="Heading1"/>
@@ -14244,7 +14034,7 @@
         <w:t xml:space="preserve">模型评价</w:t>
       </w:r>
     </w:p>
-    <w:bookmarkStart w:id="99" w:name="优点"/>
+    <w:bookmarkStart w:id="90" w:name="优点"/>
     <w:p>
       <w:pPr>
         <w:pStyle w:val="Heading2"/>
@@ -14348,8 +14138,8 @@
         <w:t xml:space="preserve">CSV；外推阶段明确标注为情景预测，不作为真实观测。</w:t>
       </w:r>
     </w:p>
-    <w:bookmarkEnd w:id="99"/>
-    <w:bookmarkStart w:id="100" w:name="局限性"/>
+    <w:bookmarkEnd w:id="90"/>
+    <w:bookmarkStart w:id="91" w:name="局限性"/>
     <w:p>
       <w:pPr>
         <w:pStyle w:val="Heading2"/>
@@ -14412,8 +14202,8 @@
         <w:t xml:space="preserve">单因素敏感性不能完全描述参数联动风险，因此悲观情景仍是判断二次跳涨风险的重要补充。</w:t>
       </w:r>
     </w:p>
-    <w:bookmarkEnd w:id="100"/>
-    <w:bookmarkStart w:id="101" w:name="改进方向"/>
+    <w:bookmarkEnd w:id="91"/>
+    <w:bookmarkStart w:id="92" w:name="改进方向"/>
     <w:p>
       <w:pPr>
         <w:pStyle w:val="Heading2"/>
@@ -14454,9 +14244,9 @@
         <w:t xml:space="preserve">的真实库存、产量和运输数据，对长期供给恢复路径进行更客观的外生约束；第二，在严格避免同日反馈循环的前提下，引入滞后新闻情绪、期权隐含波动率或地缘风险指数，增强风险溢价的外生解释力；第三，将单因素敏感性扩展为多参数联合扰动或蒙特卡洛情景树，更充分刻画悲观情景下的尾部风险。</w:t>
       </w:r>
     </w:p>
-    <w:bookmarkEnd w:id="101"/>
-    <w:bookmarkEnd w:id="102"/>
-    <w:bookmarkStart w:id="103" w:name="结论"/>
+    <w:bookmarkEnd w:id="92"/>
+    <w:bookmarkEnd w:id="93"/>
+    <w:bookmarkStart w:id="94" w:name="结论"/>
     <w:p>
       <w:pPr>
         <w:pStyle w:val="Heading1"/>
@@ -14692,8 +14482,8 @@
         <w:t xml:space="preserve">问题，而应被理解为物理缺口、政策缓冲、库存约束、替代运输和市场风险预期共同作用下的动态系统。</w:t>
       </w:r>
     </w:p>
-    <w:bookmarkEnd w:id="103"/>
-    <w:bookmarkStart w:id="104" w:name="附录支撑材料说明"/>
+    <w:bookmarkEnd w:id="94"/>
+    <w:bookmarkStart w:id="95" w:name="附录支撑材料说明"/>
     <w:p>
       <w:pPr>
         <w:pStyle w:val="Heading1"/>
@@ -14807,8 +14597,8 @@
         <w:t xml:space="preserve">。</w:t>
       </w:r>
     </w:p>
-    <w:bookmarkEnd w:id="104"/>
-    <w:bookmarkStart w:id="106" w:name="参考文献"/>
+    <w:bookmarkEnd w:id="95"/>
+    <w:bookmarkStart w:id="97" w:name="参考文献"/>
     <w:p>
       <w:pPr>
         <w:pStyle w:val="Heading1"/>
@@ -14977,7 +14767,7 @@
       <w:r>
         <w:t xml:space="preserve"> </w:t>
       </w:r>
-      <w:hyperlink r:id="rId105">
+      <w:hyperlink r:id="rId96">
         <w:r>
           <w:rPr>
             <w:rStyle w:val="Hyperlink"/>
@@ -14989,7 +14779,7 @@
         <w:t xml:space="preserve">.</w:t>
       </w:r>
     </w:p>
-    <w:bookmarkEnd w:id="106"/>
+    <w:bookmarkEnd w:id="97"/>
     <w:sectPr>
       <w:footnotePr>
         <w:numRestart w:val="eachSect"/>

</xml_diff>

<commit_message>
Add integrated model factor governance
</commit_message>
<xml_diff>
--- a/output/final/总论文.docx
+++ b/output/final/总论文.docx
@@ -230,7 +230,7 @@
         <w:rPr>
           <w:rFonts w:hint="eastAsia"/>
         </w:rPr>
-        <w:t xml:space="preserve">为解释日度价格路径，本文构建短期动态递推模型：物理供需层纳入供应中断、SPR</w:t>
+        <w:t xml:space="preserve">为解释日度价格路径，本文构建综合机制递推模型：物理供需层纳入供应中断、SPR</w:t>
       </w:r>
       <w:r>
         <w:t xml:space="preserve"> </w:t>
@@ -756,7 +756,7 @@
       </w:tr>
     </w:tbl>
     <w:bookmarkEnd w:id="9"/>
-    <w:bookmarkStart w:id="13" w:name="问题分析与总体思路"/>
+    <w:bookmarkStart w:id="14" w:name="问题分析与总体思路"/>
     <w:p>
       <w:pPr>
         <w:pStyle w:val="Heading1"/>
@@ -929,8 +929,327 @@
         <w:t xml:space="preserve">这一技术路线的核心原则是：真实价格只来自附件数据；长期部分只作情景预测，不伪装成拟合；模型检验必须主动面对朴素基准、滞后复制、参数过拟合和硬编码上限等潜在质疑。</w:t>
       </w:r>
     </w:p>
+    <w:p>
+      <w:pPr>
+        <w:pStyle w:val="BodyText"/>
+      </w:pPr>
+      <w:r>
+        <w:rPr>
+          <w:rFonts w:hint="eastAsia"/>
+        </w:rPr>
+        <w:t xml:space="preserve">最终论文只推荐一个主模型，即综合机制递推模型。传统供需模型用于提供反事实基准，三情景模型是主模型在</w:t>
+      </w:r>
+      <w:r>
+        <w:t xml:space="preserve"> 60–180 </w:t>
+      </w:r>
+      <w:r>
+        <w:rPr>
+          <w:rFonts w:hint="eastAsia"/>
+        </w:rPr>
+        <w:t xml:space="preserve">天尺度上的条件外推，消融实验和敏感性分析用于证明主模型中的因素是否值得保留。因素纳入原则见表</w:t>
+      </w:r>
+      <w:r>
+        <w:t xml:space="preserve"> </w:t>
+      </w:r>
+      <w:hyperlink w:anchor="tab:factor-inclusion">
+        <w:r>
+          <w:rPr>
+            <w:rStyle w:val="Hyperlink"/>
+          </w:rPr>
+          <w:t xml:space="preserve">1</w:t>
+        </w:r>
+      </w:hyperlink>
+      <w:r>
+        <w:t xml:space="preserve">。</w:t>
+      </w:r>
+    </w:p>
+    <w:bookmarkStart w:id="13" w:name="tab:factor-inclusion"/>
+    <w:p>
+      <w:pPr>
+        <w:pStyle w:val="TableCaption"/>
+      </w:pPr>
+      <w:r>
+        <w:rPr>
+          <w:rFonts w:hint="eastAsia"/>
+        </w:rPr>
+        <w:t xml:space="preserve">因素纳入原则</w:t>
+      </w:r>
+    </w:p>
+    <w:tbl>
+      <w:tblPr>
+        <w:tblStyle w:val="Table"/>
+        <w:tblW w:type="auto" w:w="0"/>
+        <w:tblLook w:firstRow="1" w:lastRow="0" w:firstColumn="0" w:lastColumn="0" w:noHBand="0" w:noVBand="0" w:val="0020"/>
+        <w:tblCaption w:val="因素纳入原则"/>
+      </w:tblPr>
+      <w:tblGrid>
+        <w:gridCol w:w="2640"/>
+        <w:gridCol w:w="2640"/>
+        <w:gridCol w:w="2640"/>
+      </w:tblGrid>
+      <w:tr>
+        <w:trPr>
+          <w:tblHeader w:val="on"/>
+        </w:trPr>
+        <w:tc>
+          <w:tcPr/>
+          <w:p>
+            <w:pPr>
+              <w:pStyle w:val="Compact"/>
+              <w:jc w:val="left"/>
+            </w:pPr>
+            <w:r>
+              <w:rPr>
+                <w:rFonts w:hint="eastAsia"/>
+              </w:rPr>
+              <w:t xml:space="preserve">层级</w:t>
+            </w:r>
+          </w:p>
+        </w:tc>
+        <w:tc>
+          <w:tcPr/>
+          <w:p>
+            <w:pPr>
+              <w:pStyle w:val="Compact"/>
+              <w:jc w:val="left"/>
+            </w:pPr>
+            <w:r>
+              <w:rPr>
+                <w:rFonts w:hint="eastAsia"/>
+              </w:rPr>
+              <w:t xml:space="preserve">因素</w:t>
+            </w:r>
+          </w:p>
+        </w:tc>
+        <w:tc>
+          <w:tcPr/>
+          <w:p>
+            <w:pPr>
+              <w:pStyle w:val="Compact"/>
+              <w:jc w:val="left"/>
+            </w:pPr>
+            <w:r>
+              <w:rPr>
+                <w:rFonts w:hint="eastAsia"/>
+              </w:rPr>
+              <w:t xml:space="preserve">处理方式</w:t>
+            </w:r>
+          </w:p>
+        </w:tc>
+      </w:tr>
+      <w:tr>
+        <w:tc>
+          <w:tcPr/>
+          <w:p>
+            <w:pPr>
+              <w:pStyle w:val="Compact"/>
+              <w:jc w:val="left"/>
+            </w:pPr>
+            <w:r>
+              <w:rPr>
+                <w:rFonts w:hint="eastAsia"/>
+              </w:rPr>
+              <w:t xml:space="preserve">主模型物理层</w:t>
+            </w:r>
+          </w:p>
+        </w:tc>
+        <w:tc>
+          <w:tcPr/>
+          <w:p>
+            <w:pPr>
+              <w:pStyle w:val="Compact"/>
+              <w:jc w:val="left"/>
+            </w:pPr>
+            <w:r>
+              <w:rPr>
+                <w:rFonts w:hint="eastAsia"/>
+              </w:rPr>
+              <w:t xml:space="preserve">供应中断、短期弹性、SPR、商业库存、绕道运输、需求收缩、恐慌衰减</w:t>
+            </w:r>
+          </w:p>
+        </w:tc>
+        <w:tc>
+          <w:tcPr/>
+          <w:p>
+            <w:pPr>
+              <w:pStyle w:val="Compact"/>
+              <w:jc w:val="left"/>
+            </w:pPr>
+            <w:r>
+              <w:rPr>
+                <w:rFonts w:hint="eastAsia"/>
+              </w:rPr>
+              <w:t xml:space="preserve">进入综合机制递推模型，参与短期路径拟合与机制解释</w:t>
+            </w:r>
+          </w:p>
+        </w:tc>
+      </w:tr>
+      <w:tr>
+        <w:tc>
+          <w:tcPr/>
+          <w:p>
+            <w:pPr>
+              <w:pStyle w:val="Compact"/>
+              <w:jc w:val="left"/>
+            </w:pPr>
+            <w:r>
+              <w:rPr>
+                <w:rFonts w:hint="eastAsia"/>
+              </w:rPr>
+              <w:t xml:space="preserve">主模型价格形成层</w:t>
+            </w:r>
+          </w:p>
+        </w:tc>
+        <w:tc>
+          <w:tcPr/>
+          <w:p>
+            <w:pPr>
+              <w:pStyle w:val="Compact"/>
+              <w:jc w:val="left"/>
+            </w:pPr>
+            <w:r>
+              <w:rPr>
+                <w:rFonts w:hint="eastAsia"/>
+              </w:rPr>
+              <w:t xml:space="preserve">地缘风险溢价、不确定性平台、缓冲确认折价、预期修复折价</w:t>
+            </w:r>
+          </w:p>
+        </w:tc>
+        <w:tc>
+          <w:tcPr/>
+          <w:p>
+            <w:pPr>
+              <w:pStyle w:val="Compact"/>
+              <w:jc w:val="left"/>
+            </w:pPr>
+            <w:r>
+              <w:rPr>
+                <w:rFonts w:hint="eastAsia"/>
+              </w:rPr>
+              <w:t xml:space="preserve">进入主模型，但必须通过基准对比、消融实验和稳健性检验证明必要性</w:t>
+            </w:r>
+          </w:p>
+        </w:tc>
+      </w:tr>
+      <w:tr>
+        <w:tc>
+          <w:tcPr/>
+          <w:p>
+            <w:pPr>
+              <w:pStyle w:val="Compact"/>
+              <w:jc w:val="left"/>
+            </w:pPr>
+            <w:r>
+              <w:rPr>
+                <w:rFonts w:hint="eastAsia"/>
+              </w:rPr>
+              <w:t xml:space="preserve">长期情景层</w:t>
+            </w:r>
+          </w:p>
+        </w:tc>
+        <w:tc>
+          <w:tcPr/>
+          <w:p>
+            <w:pPr>
+              <w:pStyle w:val="Compact"/>
+              <w:jc w:val="left"/>
+            </w:pPr>
+            <w:r>
+              <w:t xml:space="preserve">OPEC+ </w:t>
+            </w:r>
+            <w:r>
+              <w:rPr>
+                <w:rFonts w:hint="eastAsia"/>
+              </w:rPr>
+              <w:t xml:space="preserve">剩余产能、非</w:t>
+            </w:r>
+            <w:r>
+              <w:t xml:space="preserve"> OPEC </w:t>
+            </w:r>
+            <w:r>
+              <w:rPr>
+                <w:rFonts w:hint="eastAsia"/>
+              </w:rPr>
+              <w:t xml:space="preserve">供给响应、冲突升级概率</w:t>
+            </w:r>
+          </w:p>
+        </w:tc>
+        <w:tc>
+          <w:tcPr/>
+          <w:p>
+            <w:pPr>
+              <w:pStyle w:val="Compact"/>
+              <w:jc w:val="left"/>
+            </w:pPr>
+            <w:r>
+              <w:rPr>
+                <w:rFonts w:hint="eastAsia"/>
+              </w:rPr>
+              <w:t xml:space="preserve">不强行用于短期拟合，进入</w:t>
+            </w:r>
+            <w:r>
+              <w:t xml:space="preserve"> 60–180 </w:t>
+            </w:r>
+            <w:r>
+              <w:rPr>
+                <w:rFonts w:hint="eastAsia"/>
+              </w:rPr>
+              <w:t xml:space="preserve">天情景预测和尾部风险解释</w:t>
+            </w:r>
+          </w:p>
+        </w:tc>
+      </w:tr>
+      <w:tr>
+        <w:tc>
+          <w:tcPr/>
+          <w:p>
+            <w:pPr>
+              <w:pStyle w:val="Compact"/>
+              <w:jc w:val="left"/>
+            </w:pPr>
+            <w:r>
+              <w:rPr>
+                <w:rFonts w:hint="eastAsia"/>
+              </w:rPr>
+              <w:t xml:space="preserve">改进方向</w:t>
+            </w:r>
+          </w:p>
+        </w:tc>
+        <w:tc>
+          <w:tcPr/>
+          <w:p>
+            <w:pPr>
+              <w:pStyle w:val="Compact"/>
+              <w:jc w:val="left"/>
+            </w:pPr>
+            <w:r>
+              <w:rPr>
+                <w:rFonts w:hint="eastAsia"/>
+              </w:rPr>
+              <w:t xml:space="preserve">油轮保险费、美元指数、期货期限结构、投机资金和套保需求</w:t>
+            </w:r>
+          </w:p>
+        </w:tc>
+        <w:tc>
+          <w:tcPr/>
+          <w:p>
+            <w:pPr>
+              <w:pStyle w:val="Compact"/>
+              <w:jc w:val="left"/>
+            </w:pPr>
+            <w:r>
+              <w:rPr>
+                <w:rFonts w:hint="eastAsia"/>
+              </w:rPr>
+              <w:t xml:space="preserve">当前缺少附件内真实外生数据，不单独参数化，作为后续扩展方向</w:t>
+            </w:r>
+          </w:p>
+        </w:tc>
+      </w:tr>
+    </w:tbl>
     <w:bookmarkEnd w:id="13"/>
-    <w:bookmarkStart w:id="25" w:name="数据处理与描述性分析"/>
+    <w:bookmarkEnd w:id="14"/>
+    <w:bookmarkStart w:id="26" w:name="数据处理与描述性分析"/>
     <w:p>
       <w:pPr>
         <w:pStyle w:val="Heading1"/>
@@ -942,7 +1261,7 @@
         <w:t xml:space="preserve">数据处理与描述性分析</w:t>
       </w:r>
     </w:p>
-    <w:bookmarkStart w:id="20" w:name="数据来源与清洗口径"/>
+    <w:bookmarkStart w:id="21" w:name="数据来源与清洗口径"/>
     <w:p>
       <w:pPr>
         <w:pStyle w:val="Heading2"/>
@@ -1433,18 +1752,18 @@
           <wp:inline>
             <wp:extent cx="4907280" cy="2453640"/>
             <wp:effectExtent b="0" l="0" r="0" t="0"/>
-            <wp:docPr descr="" title="" id="15" name="Picture"/>
+            <wp:docPr descr="" title="" id="16" name="Picture"/>
             <a:graphic>
               <a:graphicData uri="http://schemas.openxmlformats.org/drawingml/2006/picture">
                 <pic:pic>
                   <pic:nvPicPr>
-                    <pic:cNvPr descr="price_trend.png" id="16" name="Picture"/>
+                    <pic:cNvPr descr="price_trend.png" id="17" name="Picture"/>
                     <pic:cNvPicPr>
                       <a:picLocks noChangeArrowheads="1" noChangeAspect="1"/>
                     </pic:cNvPicPr>
                   </pic:nvPicPr>
                   <pic:blipFill>
-                    <a:blip r:embed="rId14"/>
+                    <a:blip r:embed="rId15"/>
                     <a:stretch>
                       <a:fillRect/>
                     </a:stretch>
@@ -1491,18 +1810,18 @@
           <wp:inline>
             <wp:extent cx="4907280" cy="2453640"/>
             <wp:effectExtent b="0" l="0" r="0" t="0"/>
-            <wp:docPr descr="" title="" id="18" name="Picture"/>
+            <wp:docPr descr="" title="" id="19" name="Picture"/>
             <a:graphic>
               <a:graphicData uri="http://schemas.openxmlformats.org/drawingml/2006/picture">
                 <pic:pic>
                   <pic:nvPicPr>
-                    <pic:cNvPr descr="event_window_price.png" id="19" name="Picture"/>
+                    <pic:cNvPr descr="event_window_price.png" id="20" name="Picture"/>
                     <pic:cNvPicPr>
                       <a:picLocks noChangeArrowheads="1" noChangeAspect="1"/>
                     </pic:cNvPicPr>
                   </pic:nvPicPr>
                   <pic:blipFill>
-                    <a:blip r:embed="rId17"/>
+                    <a:blip r:embed="rId18"/>
                     <a:stretch>
                       <a:fillRect/>
                     </a:stretch>
@@ -1540,8 +1859,8 @@
         <w:t xml:space="preserve">冲突窗口内附件真实价格路径。</w:t>
       </w:r>
     </w:p>
-    <w:bookmarkEnd w:id="20"/>
-    <w:bookmarkStart w:id="24" w:name="波动率特征"/>
+    <w:bookmarkEnd w:id="21"/>
+    <w:bookmarkStart w:id="25" w:name="波动率特征"/>
     <w:p>
       <w:pPr>
         <w:pStyle w:val="Heading2"/>
@@ -1582,18 +1901,18 @@
           <wp:inline>
             <wp:extent cx="4907280" cy="3345872"/>
             <wp:effectExtent b="0" l="0" r="0" t="0"/>
-            <wp:docPr descr="" title="" id="22" name="Picture"/>
+            <wp:docPr descr="" title="" id="23" name="Picture"/>
             <a:graphic>
               <a:graphicData uri="http://schemas.openxmlformats.org/drawingml/2006/picture">
                 <pic:pic>
                   <pic:nvPicPr>
-                    <pic:cNvPr descr="return_volatility.png" id="23" name="Picture"/>
+                    <pic:cNvPr descr="return_volatility.png" id="24" name="Picture"/>
                     <pic:cNvPicPr>
                       <a:picLocks noChangeArrowheads="1" noChangeAspect="1"/>
                     </pic:cNvPicPr>
                   </pic:nvPicPr>
                   <pic:blipFill>
-                    <a:blip r:embed="rId21"/>
+                    <a:blip r:embed="rId22"/>
                     <a:stretch>
                       <a:fillRect/>
                     </a:stretch>
@@ -1631,9 +1950,9 @@
         <w:t xml:space="preserve">收益率与滚动波动率。冲突窗口波动放大，为事件机制建模提供依据。</w:t>
       </w:r>
     </w:p>
-    <w:bookmarkEnd w:id="24"/>
     <w:bookmarkEnd w:id="25"/>
-    <w:bookmarkStart w:id="28" w:name="模型假设与符号说明"/>
+    <w:bookmarkEnd w:id="26"/>
+    <w:bookmarkStart w:id="29" w:name="模型假设与符号说明"/>
     <w:p>
       <w:pPr>
         <w:pStyle w:val="Heading1"/>
@@ -1645,7 +1964,7 @@
         <w:t xml:space="preserve">模型假设与符号说明</w:t>
       </w:r>
     </w:p>
-    <w:bookmarkStart w:id="26" w:name="基本假设"/>
+    <w:bookmarkStart w:id="27" w:name="基本假设"/>
     <w:p>
       <w:pPr>
         <w:pStyle w:val="Heading2"/>
@@ -1748,8 +2067,8 @@
         <w:t xml:space="preserve">天预测为条件情景外推，不代表真实未来观测，也不编造任何未来真实价格。</w:t>
       </w:r>
     </w:p>
-    <w:bookmarkEnd w:id="26"/>
-    <w:bookmarkStart w:id="27" w:name="符号说明"/>
+    <w:bookmarkEnd w:id="27"/>
+    <w:bookmarkStart w:id="28" w:name="符号说明"/>
     <w:p>
       <w:pPr>
         <w:pStyle w:val="Heading2"/>
@@ -2799,9 +3118,9 @@
         </w:tc>
       </w:tr>
     </w:tbl>
-    <w:bookmarkEnd w:id="27"/>
     <w:bookmarkEnd w:id="28"/>
-    <w:bookmarkStart w:id="34" w:name="传统供需基准模型"/>
+    <w:bookmarkEnd w:id="29"/>
+    <w:bookmarkStart w:id="35" w:name="传统供需基准模型"/>
     <w:p>
       <w:pPr>
         <w:pStyle w:val="Heading1"/>
@@ -2813,7 +3132,7 @@
         <w:t xml:space="preserve">传统供需基准模型</w:t>
       </w:r>
     </w:p>
-    <w:bookmarkStart w:id="29" w:name="模型建立"/>
+    <w:bookmarkStart w:id="30" w:name="模型建立"/>
     <w:p>
       <w:pPr>
         <w:pStyle w:val="Heading2"/>
@@ -3090,8 +3409,8 @@
         <w:t xml:space="preserve">万桶/日。</w:t>
       </w:r>
     </w:p>
-    <w:bookmarkEnd w:id="29"/>
-    <w:bookmarkStart w:id="33" w:name="基准模型结果"/>
+    <w:bookmarkEnd w:id="30"/>
+    <w:bookmarkStart w:id="34" w:name="基准模型结果"/>
     <w:p>
       <w:pPr>
         <w:pStyle w:val="Heading2"/>
@@ -3361,18 +3680,18 @@
           <wp:inline>
             <wp:extent cx="4693920" cy="2560320"/>
             <wp:effectExtent b="0" l="0" r="0" t="0"/>
-            <wp:docPr descr="" title="" id="31" name="Picture"/>
+            <wp:docPr descr="" title="" id="32" name="Picture"/>
             <a:graphic>
               <a:graphicData uri="http://schemas.openxmlformats.org/drawingml/2006/picture">
                 <pic:pic>
                   <pic:nvPicPr>
-                    <pic:cNvPr descr="baseline_vs_actual.png" id="32" name="Picture"/>
+                    <pic:cNvPr descr="baseline_vs_actual.png" id="33" name="Picture"/>
                     <pic:cNvPicPr>
                       <a:picLocks noChangeArrowheads="1" noChangeAspect="1"/>
                     </pic:cNvPicPr>
                   </pic:nvPicPr>
                   <pic:blipFill>
-                    <a:blip r:embed="rId30"/>
+                    <a:blip r:embed="rId31"/>
                     <a:stretch>
                       <a:fillRect/>
                     </a:stretch>
@@ -3448,9 +3767,9 @@
         <w:t xml:space="preserve">SPR、库存、绕道运输、需求收缩和市场预期修复。</w:t>
       </w:r>
     </w:p>
-    <w:bookmarkEnd w:id="33"/>
     <w:bookmarkEnd w:id="34"/>
-    <w:bookmarkStart w:id="37" w:name="短期动态递推模型"/>
+    <w:bookmarkEnd w:id="35"/>
+    <w:bookmarkStart w:id="38" w:name="综合机制递推模型"/>
     <w:p>
       <w:pPr>
         <w:pStyle w:val="Heading1"/>
@@ -3459,10 +3778,30 @@
         <w:rPr>
           <w:rFonts w:hint="eastAsia"/>
         </w:rPr>
-        <w:t xml:space="preserve">短期动态递推模型</w:t>
-      </w:r>
-    </w:p>
-    <w:bookmarkStart w:id="35" w:name="物理供需层"/>
+        <w:t xml:space="preserve">综合机制递推模型</w:t>
+      </w:r>
+    </w:p>
+    <w:p>
+      <w:pPr>
+        <w:pStyle w:val="FirstParagraph"/>
+      </w:pPr>
+      <w:r>
+        <w:rPr>
+          <w:rFonts w:hint="eastAsia"/>
+        </w:rPr>
+        <w:t xml:space="preserve">综合机制递推模型是本文最终主模型。它不是把所有可能因素无差别加入拟合，而是在赛题要求因素的基础上，保留已经通过消融实验和敏感性分析证明有效的价格形成因素。模型目标是在附件冲突窗口内解释真实价格路径，并为后续</w:t>
+      </w:r>
+      <w:r>
+        <w:t xml:space="preserve"> 60–180 </w:t>
+      </w:r>
+      <w:r>
+        <w:rPr>
+          <w:rFonts w:hint="eastAsia"/>
+        </w:rPr>
+        <w:t xml:space="preserve">天情景外推提供统一机制基础。</w:t>
+      </w:r>
+    </w:p>
+    <w:bookmarkStart w:id="36" w:name="物理供需层"/>
     <w:p>
       <w:pPr>
         <w:pStyle w:val="Heading2"/>
@@ -4168,8 +4507,8 @@
         </m:oMath>
       </m:oMathPara>
     </w:p>
-    <w:bookmarkEnd w:id="35"/>
-    <w:bookmarkStart w:id="36" w:name="市场价格形成层"/>
+    <w:bookmarkEnd w:id="36"/>
+    <w:bookmarkStart w:id="37" w:name="市场价格形成层"/>
     <w:p>
       <w:pPr>
         <w:pStyle w:val="Heading2"/>
@@ -4886,9 +5225,9 @@
         <w:t xml:space="preserve">该结构保留了题面中的离散递推思想，同时允许期货市场对风险和预期做非线性再定价。</w:t>
       </w:r>
     </w:p>
-    <w:bookmarkEnd w:id="36"/>
     <w:bookmarkEnd w:id="37"/>
-    <w:bookmarkStart w:id="74" w:name="参数校准与模型检验"/>
+    <w:bookmarkEnd w:id="38"/>
+    <w:bookmarkStart w:id="75" w:name="参数校准与模型检验"/>
     <w:p>
       <w:pPr>
         <w:pStyle w:val="Heading1"/>
@@ -4900,7 +5239,7 @@
         <w:t xml:space="preserve">参数校准与模型检验</w:t>
       </w:r>
     </w:p>
-    <w:bookmarkStart w:id="38" w:name="多目标校准"/>
+    <w:bookmarkStart w:id="39" w:name="多目标校准"/>
     <w:p>
       <w:pPr>
         <w:pStyle w:val="Heading2"/>
@@ -5984,8 +6323,8 @@
         </w:tc>
       </w:tr>
     </w:tbl>
-    <w:bookmarkEnd w:id="38"/>
-    <w:bookmarkStart w:id="45" w:name="拟合结果"/>
+    <w:bookmarkEnd w:id="39"/>
+    <w:bookmarkStart w:id="46" w:name="拟合结果"/>
     <w:p>
       <w:pPr>
         <w:pStyle w:val="Heading2"/>
@@ -6107,18 +6446,18 @@
           <wp:inline>
             <wp:extent cx="4907280" cy="2587474"/>
             <wp:effectExtent b="0" l="0" r="0" t="0"/>
-            <wp:docPr descr="" title="" id="40" name="Picture"/>
+            <wp:docPr descr="" title="" id="41" name="Picture"/>
             <a:graphic>
               <a:graphicData uri="http://schemas.openxmlformats.org/drawingml/2006/picture">
                 <pic:pic>
                   <pic:nvPicPr>
-                    <pic:cNvPr descr="短期模型拟合效果.png" id="41" name="Picture"/>
+                    <pic:cNvPr descr="短期模型拟合效果.png" id="42" name="Picture"/>
                     <pic:cNvPicPr>
                       <a:picLocks noChangeArrowheads="1" noChangeAspect="1"/>
                     </pic:cNvPicPr>
                   </pic:nvPicPr>
                   <pic:blipFill>
-                    <a:blip r:embed="rId39"/>
+                    <a:blip r:embed="rId40"/>
                     <a:stretch>
                       <a:fillRect/>
                     </a:stretch>
@@ -6655,18 +6994,18 @@
           <wp:inline>
             <wp:extent cx="4907280" cy="2765921"/>
             <wp:effectExtent b="0" l="0" r="0" t="0"/>
-            <wp:docPr descr="" title="" id="43" name="Picture"/>
+            <wp:docPr descr="" title="" id="44" name="Picture"/>
             <a:graphic>
               <a:graphicData uri="http://schemas.openxmlformats.org/drawingml/2006/picture">
                 <pic:pic>
                   <pic:nvPicPr>
-                    <pic:cNvPr descr="短期模型机制贡献.png" id="44" name="Picture"/>
+                    <pic:cNvPr descr="短期模型机制贡献.png" id="45" name="Picture"/>
                     <pic:cNvPicPr>
                       <a:picLocks noChangeArrowheads="1" noChangeAspect="1"/>
                     </pic:cNvPicPr>
                   </pic:nvPicPr>
                   <pic:blipFill>
-                    <a:blip r:embed="rId42"/>
+                    <a:blip r:embed="rId43"/>
                     <a:stretch>
                       <a:fillRect/>
                     </a:stretch>
@@ -6704,8 +7043,8 @@
         <w:t xml:space="preserve">短期模型机制贡献分解。风险溢价推升价格，缓冲确认和预期修复压低价格。</w:t>
       </w:r>
     </w:p>
-    <w:bookmarkEnd w:id="45"/>
-    <w:bookmarkStart w:id="52" w:name="基准对比与防御性检验"/>
+    <w:bookmarkEnd w:id="46"/>
+    <w:bookmarkStart w:id="53" w:name="基准对比与防御性检验"/>
     <w:p>
       <w:pPr>
         <w:pStyle w:val="Heading2"/>
@@ -7612,18 +7951,18 @@
           <wp:inline>
             <wp:extent cx="4587240" cy="2533904"/>
             <wp:effectExtent b="0" l="0" r="0" t="0"/>
-            <wp:docPr descr="" title="" id="47" name="Picture"/>
+            <wp:docPr descr="" title="" id="48" name="Picture"/>
             <a:graphic>
               <a:graphicData uri="http://schemas.openxmlformats.org/drawingml/2006/picture">
                 <pic:pic>
                   <pic:nvPicPr>
-                    <pic:cNvPr descr="短期模型基准对比.png" id="48" name="Picture"/>
+                    <pic:cNvPr descr="短期模型基准对比.png" id="49" name="Picture"/>
                     <pic:cNvPicPr>
                       <a:picLocks noChangeArrowheads="1" noChangeAspect="1"/>
                     </pic:cNvPicPr>
                   </pic:nvPicPr>
                   <pic:blipFill>
-                    <a:blip r:embed="rId46"/>
+                    <a:blip r:embed="rId47"/>
                     <a:stretch>
                       <a:fillRect/>
                     </a:stretch>
@@ -7786,18 +8125,18 @@
           <wp:inline>
             <wp:extent cx="4480560" cy="2594008"/>
             <wp:effectExtent b="0" l="0" r="0" t="0"/>
-            <wp:docPr descr="" title="" id="50" name="Picture"/>
+            <wp:docPr descr="" title="" id="51" name="Picture"/>
             <a:graphic>
               <a:graphicData uri="http://schemas.openxmlformats.org/drawingml/2006/picture">
                 <pic:pic>
                   <pic:nvPicPr>
-                    <pic:cNvPr descr="短期模型滞后平移检验.png" id="51" name="Picture"/>
+                    <pic:cNvPr descr="短期模型滞后平移检验.png" id="52" name="Picture"/>
                     <pic:cNvPicPr>
                       <a:picLocks noChangeArrowheads="1" noChangeAspect="1"/>
                     </pic:cNvPicPr>
                   </pic:nvPicPr>
                   <pic:blipFill>
-                    <a:blip r:embed="rId49"/>
+                    <a:blip r:embed="rId50"/>
                     <a:stretch>
                       <a:fillRect/>
                     </a:stretch>
@@ -7844,8 +8183,8 @@
         <w:t xml:space="preserve">检验。原始位置误差最低。</w:t>
       </w:r>
     </w:p>
-    <w:bookmarkEnd w:id="52"/>
-    <w:bookmarkStart w:id="59" w:name="机制消融与过拟合防御"/>
+    <w:bookmarkEnd w:id="53"/>
+    <w:bookmarkStart w:id="60" w:name="机制消融与过拟合防御"/>
     <w:p>
       <w:pPr>
         <w:pStyle w:val="Heading2"/>
@@ -7949,18 +8288,18 @@
           <wp:inline>
             <wp:extent cx="4800600" cy="2480310"/>
             <wp:effectExtent b="0" l="0" r="0" t="0"/>
-            <wp:docPr descr="" title="" id="54" name="Picture"/>
+            <wp:docPr descr="" title="" id="55" name="Picture"/>
             <a:graphic>
               <a:graphicData uri="http://schemas.openxmlformats.org/drawingml/2006/picture">
                 <pic:pic>
                   <pic:nvPicPr>
-                    <pic:cNvPr descr="短期模型机制消融实验.png" id="55" name="Picture"/>
+                    <pic:cNvPr descr="短期模型机制消融实验.png" id="56" name="Picture"/>
                     <pic:cNvPicPr>
                       <a:picLocks noChangeArrowheads="1" noChangeAspect="1"/>
                     </pic:cNvPicPr>
                   </pic:nvPicPr>
                   <pic:blipFill>
-                    <a:blip r:embed="rId53"/>
+                    <a:blip r:embed="rId54"/>
                     <a:stretch>
                       <a:fillRect/>
                     </a:stretch>
@@ -8104,18 +8443,18 @@
           <wp:inline>
             <wp:extent cx="4693920" cy="2048256"/>
             <wp:effectExtent b="0" l="0" r="0" t="0"/>
-            <wp:docPr descr="" title="" id="57" name="Picture"/>
+            <wp:docPr descr="" title="" id="58" name="Picture"/>
             <a:graphic>
               <a:graphicData uri="http://schemas.openxmlformats.org/drawingml/2006/picture">
                 <pic:pic>
                   <pic:nvPicPr>
-                    <pic:cNvPr descr="短期模型过拟合压力测试.png" id="58" name="Picture"/>
+                    <pic:cNvPr descr="短期模型过拟合压力测试.png" id="59" name="Picture"/>
                     <pic:cNvPicPr>
                       <a:picLocks noChangeArrowheads="1" noChangeAspect="1"/>
                     </pic:cNvPicPr>
                   </pic:nvPicPr>
                   <pic:blipFill>
-                    <a:blip r:embed="rId56"/>
+                    <a:blip r:embed="rId57"/>
                     <a:stretch>
                       <a:fillRect/>
                     </a:stretch>
@@ -8153,8 +8492,8 @@
         <w:t xml:space="preserve">短期模型过拟合压力测试。多数扰动样本仍保持在合理价格平台附近。</w:t>
       </w:r>
     </w:p>
-    <w:bookmarkEnd w:id="59"/>
-    <w:bookmarkStart w:id="63" w:name="分段误差与残差诊断"/>
+    <w:bookmarkEnd w:id="60"/>
+    <w:bookmarkStart w:id="64" w:name="分段误差与残差诊断"/>
     <w:p>
       <w:pPr>
         <w:pStyle w:val="Heading2"/>
@@ -8231,18 +8570,18 @@
           <wp:inline>
             <wp:extent cx="4907280" cy="3655675"/>
             <wp:effectExtent b="0" l="0" r="0" t="0"/>
-            <wp:docPr descr="" title="" id="61" name="Picture"/>
+            <wp:docPr descr="" title="" id="62" name="Picture"/>
             <a:graphic>
               <a:graphicData uri="http://schemas.openxmlformats.org/drawingml/2006/picture">
                 <pic:pic>
                   <pic:nvPicPr>
-                    <pic:cNvPr descr="短期模型残差诊断增强.png" id="62" name="Picture"/>
+                    <pic:cNvPr descr="短期模型残差诊断增强.png" id="63" name="Picture"/>
                     <pic:cNvPicPr>
                       <a:picLocks noChangeArrowheads="1" noChangeAspect="1"/>
                     </pic:cNvPicPr>
                   </pic:nvPicPr>
                   <pic:blipFill>
-                    <a:blip r:embed="rId60"/>
+                    <a:blip r:embed="rId61"/>
                     <a:stretch>
                       <a:fillRect/>
                     </a:stretch>
@@ -8309,8 +8648,8 @@
         <w:t xml:space="preserve">0.254，说明仍存在一定连续偏差，但未形成明显强自相关。</w:t>
       </w:r>
     </w:p>
-    <w:bookmarkEnd w:id="63"/>
-    <w:bookmarkStart w:id="64" w:name="机制消融的定量证据"/>
+    <w:bookmarkEnd w:id="64"/>
+    <w:bookmarkStart w:id="65" w:name="机制消融的定量证据"/>
     <w:p>
       <w:pPr>
         <w:pStyle w:val="Heading2"/>
@@ -9231,8 +9570,8 @@
         <w:t xml:space="preserve">10.09，说明市场对政策缓冲和运输恢复的预期并不是可有可无的修饰，而是解释后期回落的关键机制。</w:t>
       </w:r>
     </w:p>
-    <w:bookmarkEnd w:id="64"/>
-    <w:bookmarkStart w:id="68" w:name="拐点预测步长与事件边界"/>
+    <w:bookmarkEnd w:id="65"/>
+    <w:bookmarkStart w:id="69" w:name="拐点预测步长与事件边界"/>
     <w:p>
       <w:pPr>
         <w:pStyle w:val="Heading2"/>
@@ -9355,18 +9694,18 @@
           <wp:inline>
             <wp:extent cx="4907280" cy="3568930"/>
             <wp:effectExtent b="0" l="0" r="0" t="0"/>
-            <wp:docPr descr="" title="" id="66" name="Picture"/>
+            <wp:docPr descr="" title="" id="67" name="Picture"/>
             <a:graphic>
               <a:graphicData uri="http://schemas.openxmlformats.org/drawingml/2006/picture">
                 <pic:pic>
                   <pic:nvPicPr>
-                    <pic:cNvPr descr="短期模型拐点局部检验.png" id="67" name="Picture"/>
+                    <pic:cNvPr descr="短期模型拐点局部检验.png" id="68" name="Picture"/>
                     <pic:cNvPicPr>
                       <a:picLocks noChangeArrowheads="1" noChangeAspect="1"/>
                     </pic:cNvPicPr>
                   </pic:nvPicPr>
                   <pic:blipFill>
-                    <a:blip r:embed="rId65"/>
+                    <a:blip r:embed="rId66"/>
                     <a:stretch>
                       <a:fillRect/>
                     </a:stretch>
@@ -9433,8 +9772,8 @@
         <w:t xml:space="preserve">年等非霍尔木兹事件窗口。结果显示，该模型在这些窗口通常显著弱于朴素上一日基准。这并不削弱本文结论，反而说明本文模型不是通用油价短线交易器，而是针对霍尔木兹封锁机制构建的事件解释模型。论文结论应限定在极端地缘冲突下的条件路径解释与情景预测，不能外推为普通时期的万能预测模型。</w:t>
       </w:r>
     </w:p>
-    <w:bookmarkEnd w:id="68"/>
-    <w:bookmarkStart w:id="72" w:name="参数自由度与稳健性区间"/>
+    <w:bookmarkEnd w:id="69"/>
+    <w:bookmarkStart w:id="73" w:name="参数自由度与稳健性区间"/>
     <w:p>
       <w:pPr>
         <w:pStyle w:val="Heading2"/>
@@ -10080,18 +10419,18 @@
           <wp:inline>
             <wp:extent cx="4907280" cy="2587474"/>
             <wp:effectExtent b="0" l="0" r="0" t="0"/>
-            <wp:docPr descr="" title="" id="70" name="Picture"/>
+            <wp:docPr descr="" title="" id="71" name="Picture"/>
             <a:graphic>
               <a:graphicData uri="http://schemas.openxmlformats.org/drawingml/2006/picture">
                 <pic:pic>
                   <pic:nvPicPr>
-                    <pic:cNvPr descr="短期模型稳健性带.png" id="71" name="Picture"/>
+                    <pic:cNvPr descr="短期模型稳健性带.png" id="72" name="Picture"/>
                     <pic:cNvPicPr>
                       <a:picLocks noChangeArrowheads="1" noChangeAspect="1"/>
                     </pic:cNvPicPr>
                   </pic:nvPicPr>
                   <pic:blipFill>
-                    <a:blip r:embed="rId69"/>
+                    <a:blip r:embed="rId70"/>
                     <a:stretch>
                       <a:fillRect/>
                     </a:stretch>
@@ -10266,8 +10605,8 @@
         <w:t xml:space="preserve">美元/桶，说明最优参数附近存在稳定的优秀参数邻域。</w:t>
       </w:r>
     </w:p>
-    <w:bookmarkEnd w:id="72"/>
-    <w:bookmarkStart w:id="73" w:name="内生性反事实基准与硬编码审计"/>
+    <w:bookmarkEnd w:id="73"/>
+    <w:bookmarkStart w:id="74" w:name="内生性反事实基准与硬编码审计"/>
     <w:p>
       <w:pPr>
         <w:pStyle w:val="Heading2"/>
@@ -10564,9 +10903,9 @@
         <w:t xml:space="preserve">美元平台不是代码硬上限，但不应声称已经实现了多智能体动态纳什均衡。</w:t>
       </w:r>
     </w:p>
-    <w:bookmarkEnd w:id="73"/>
     <w:bookmarkEnd w:id="74"/>
-    <w:bookmarkStart w:id="83" w:name="天三情景预测"/>
+    <w:bookmarkEnd w:id="75"/>
+    <w:bookmarkStart w:id="84" w:name="天三情景预测"/>
     <w:p>
       <w:pPr>
         <w:pStyle w:val="Heading1"/>
@@ -10581,7 +10920,7 @@
         <w:t xml:space="preserve">天三情景预测</w:t>
       </w:r>
     </w:p>
-    <w:bookmarkStart w:id="75" w:name="情景设定"/>
+    <w:bookmarkStart w:id="76" w:name="情景设定"/>
     <w:p>
       <w:pPr>
         <w:pStyle w:val="Heading2"/>
@@ -12060,8 +12399,8 @@
         </w:tc>
       </w:tr>
     </w:tbl>
-    <w:bookmarkEnd w:id="75"/>
-    <w:bookmarkStart w:id="82" w:name="预测结果"/>
+    <w:bookmarkEnd w:id="76"/>
+    <w:bookmarkStart w:id="83" w:name="预测结果"/>
     <w:p>
       <w:pPr>
         <w:pStyle w:val="Heading2"/>
@@ -12551,18 +12890,18 @@
           <wp:inline>
             <wp:extent cx="5013960" cy="2757678"/>
             <wp:effectExtent b="0" l="0" r="0" t="0"/>
-            <wp:docPr descr="" title="" id="77" name="Picture"/>
+            <wp:docPr descr="" title="" id="78" name="Picture"/>
             <a:graphic>
               <a:graphicData uri="http://schemas.openxmlformats.org/drawingml/2006/picture">
                 <pic:pic>
                   <pic:nvPicPr>
-                    <pic:cNvPr descr="短期拟合与长期预测总览.png" id="78" name="Picture"/>
+                    <pic:cNvPr descr="短期拟合与长期预测总览.png" id="79" name="Picture"/>
                     <pic:cNvPicPr>
                       <a:picLocks noChangeArrowheads="1" noChangeAspect="1"/>
                     </pic:cNvPicPr>
                   </pic:nvPicPr>
                   <pic:blipFill>
-                    <a:blip r:embed="rId76"/>
+                    <a:blip r:embed="rId77"/>
                     <a:stretch>
                       <a:fillRect/>
                     </a:stretch>
@@ -12757,18 +13096,18 @@
           <wp:inline>
             <wp:extent cx="4907280" cy="3413760"/>
             <wp:effectExtent b="0" l="0" r="0" t="0"/>
-            <wp:docPr descr="" title="" id="80" name="Picture"/>
+            <wp:docPr descr="" title="" id="81" name="Picture"/>
             <a:graphic>
               <a:graphicData uri="http://schemas.openxmlformats.org/drawingml/2006/picture">
                 <pic:pic>
                   <pic:nvPicPr>
-                    <pic:cNvPr descr="inventory_depletion_risk.png" id="81" name="Picture"/>
+                    <pic:cNvPr descr="inventory_depletion_risk.png" id="82" name="Picture"/>
                     <pic:cNvPicPr>
                       <a:picLocks noChangeArrowheads="1" noChangeAspect="1"/>
                     </pic:cNvPicPr>
                   </pic:nvPicPr>
                   <pic:blipFill>
-                    <a:blip r:embed="rId79"/>
+                    <a:blip r:embed="rId80"/>
                     <a:stretch>
                       <a:fillRect/>
                     </a:stretch>
@@ -12806,9 +13145,9 @@
         <w:t xml:space="preserve">商业库存剩余量与剩余供需缺口变化。悲观情景下缓冲能力下降，二次跳涨风险上升。</w:t>
       </w:r>
     </w:p>
-    <w:bookmarkEnd w:id="82"/>
     <w:bookmarkEnd w:id="83"/>
-    <w:bookmarkStart w:id="89" w:name="敏感性分析"/>
+    <w:bookmarkEnd w:id="84"/>
+    <w:bookmarkStart w:id="90" w:name="敏感性分析"/>
     <w:p>
       <w:pPr>
         <w:pStyle w:val="Heading1"/>
@@ -12820,7 +13159,7 @@
         <w:t xml:space="preserve">敏感性分析</w:t>
       </w:r>
     </w:p>
-    <w:bookmarkStart w:id="84" w:name="分析方法"/>
+    <w:bookmarkStart w:id="85" w:name="分析方法"/>
     <w:p>
       <w:pPr>
         <w:pStyle w:val="Heading2"/>
@@ -13107,8 +13446,8 @@
         <w:t xml:space="preserve">天剩余缺口波动范围。该指标兼顾终点价格、阶段峰值和供需风险。</w:t>
       </w:r>
     </w:p>
-    <w:bookmarkEnd w:id="84"/>
-    <w:bookmarkStart w:id="88" w:name="参数重要性排序"/>
+    <w:bookmarkEnd w:id="85"/>
+    <w:bookmarkStart w:id="89" w:name="参数重要性排序"/>
     <w:p>
       <w:pPr>
         <w:pStyle w:val="Heading2"/>
@@ -13900,18 +14239,18 @@
           <wp:inline>
             <wp:extent cx="4907280" cy="2998893"/>
             <wp:effectExtent b="0" l="0" r="0" t="0"/>
-            <wp:docPr descr="" title="" id="86" name="Picture"/>
+            <wp:docPr descr="" title="" id="87" name="Picture"/>
             <a:graphic>
               <a:graphicData uri="http://schemas.openxmlformats.org/drawingml/2006/picture">
                 <pic:pic>
                   <pic:nvPicPr>
-                    <pic:cNvPr descr="sensitivity_tornado_180day.png" id="87" name="Picture"/>
+                    <pic:cNvPr descr="sensitivity_tornado_180day.png" id="88" name="Picture"/>
                     <pic:cNvPicPr>
                       <a:picLocks noChangeArrowheads="1" noChangeAspect="1"/>
                     </pic:cNvPicPr>
                   </pic:nvPicPr>
                   <pic:blipFill>
-                    <a:blip r:embed="rId85"/>
+                    <a:blip r:embed="rId86"/>
                     <a:stretch>
                       <a:fillRect/>
                     </a:stretch>
@@ -14020,9 +14359,9 @@
         <w:t xml:space="preserve">的政策缓冲变量。</w:t>
       </w:r>
     </w:p>
-    <w:bookmarkEnd w:id="88"/>
     <w:bookmarkEnd w:id="89"/>
-    <w:bookmarkStart w:id="93" w:name="模型评价"/>
+    <w:bookmarkEnd w:id="90"/>
+    <w:bookmarkStart w:id="94" w:name="模型评价"/>
     <w:p>
       <w:pPr>
         <w:pStyle w:val="Heading1"/>
@@ -14034,7 +14373,7 @@
         <w:t xml:space="preserve">模型评价</w:t>
       </w:r>
     </w:p>
-    <w:bookmarkStart w:id="90" w:name="优点"/>
+    <w:bookmarkStart w:id="91" w:name="优点"/>
     <w:p>
       <w:pPr>
         <w:pStyle w:val="Heading2"/>
@@ -14138,8 +14477,8 @@
         <w:t xml:space="preserve">CSV；外推阶段明确标注为情景预测，不作为真实观测。</w:t>
       </w:r>
     </w:p>
-    <w:bookmarkEnd w:id="90"/>
-    <w:bookmarkStart w:id="91" w:name="局限性"/>
+    <w:bookmarkEnd w:id="91"/>
+    <w:bookmarkStart w:id="92" w:name="局限性"/>
     <w:p>
       <w:pPr>
         <w:pStyle w:val="Heading2"/>
@@ -14202,8 +14541,8 @@
         <w:t xml:space="preserve">单因素敏感性不能完全描述参数联动风险，因此悲观情景仍是判断二次跳涨风险的重要补充。</w:t>
       </w:r>
     </w:p>
-    <w:bookmarkEnd w:id="91"/>
-    <w:bookmarkStart w:id="92" w:name="改进方向"/>
+    <w:bookmarkEnd w:id="92"/>
+    <w:bookmarkStart w:id="93" w:name="改进方向"/>
     <w:p>
       <w:pPr>
         <w:pStyle w:val="Heading2"/>
@@ -14244,9 +14583,9 @@
         <w:t xml:space="preserve">的真实库存、产量和运输数据，对长期供给恢复路径进行更客观的外生约束；第二，在严格避免同日反馈循环的前提下，引入滞后新闻情绪、期权隐含波动率或地缘风险指数，增强风险溢价的外生解释力；第三，将单因素敏感性扩展为多参数联合扰动或蒙特卡洛情景树，更充分刻画悲观情景下的尾部风险。</w:t>
       </w:r>
     </w:p>
-    <w:bookmarkEnd w:id="92"/>
     <w:bookmarkEnd w:id="93"/>
-    <w:bookmarkStart w:id="94" w:name="结论"/>
+    <w:bookmarkEnd w:id="94"/>
+    <w:bookmarkStart w:id="95" w:name="结论"/>
     <w:p>
       <w:pPr>
         <w:pStyle w:val="Heading1"/>
@@ -14482,8 +14821,8 @@
         <w:t xml:space="preserve">问题，而应被理解为物理缺口、政策缓冲、库存约束、替代运输和市场风险预期共同作用下的动态系统。</w:t>
       </w:r>
     </w:p>
-    <w:bookmarkEnd w:id="94"/>
-    <w:bookmarkStart w:id="95" w:name="附录支撑材料说明"/>
+    <w:bookmarkEnd w:id="95"/>
+    <w:bookmarkStart w:id="96" w:name="附录支撑材料说明"/>
     <w:p>
       <w:pPr>
         <w:pStyle w:val="Heading1"/>
@@ -14597,8 +14936,8 @@
         <w:t xml:space="preserve">。</w:t>
       </w:r>
     </w:p>
-    <w:bookmarkEnd w:id="95"/>
-    <w:bookmarkStart w:id="97" w:name="参考文献"/>
+    <w:bookmarkEnd w:id="96"/>
+    <w:bookmarkStart w:id="98" w:name="参考文献"/>
     <w:p>
       <w:pPr>
         <w:pStyle w:val="Heading1"/>
@@ -14767,7 +15106,7 @@
       <w:r>
         <w:t xml:space="preserve"> </w:t>
       </w:r>
-      <w:hyperlink r:id="rId96">
+      <w:hyperlink r:id="rId97">
         <w:r>
           <w:rPr>
             <w:rStyle w:val="Hyperlink"/>
@@ -14779,7 +15118,7 @@
         <w:t xml:space="preserve">.</w:t>
       </w:r>
     </w:p>
-    <w:bookmarkEnd w:id="97"/>
+    <w:bookmarkEnd w:id="98"/>
     <w:sectPr>
       <w:footnotePr>
         <w:numRestart w:val="eachSect"/>

</xml_diff>

<commit_message>
Refine long-term scenario model defenses
</commit_message>
<xml_diff>
--- a/output/final/总论文.docx
+++ b/output/final/总论文.docx
@@ -239,7 +239,7 @@
         <w:rPr>
           <w:rFonts w:hint="eastAsia"/>
         </w:rPr>
-        <w:t xml:space="preserve">释放、商业库存、绕道运输、需求收缩和恐慌衰减，市场价格形成层纳入地缘风险溢价、不确定性平台、缓冲确认折价和预期修复折价。综合最优模型在</w:t>
+        <w:t xml:space="preserve">释放、商业库存、绕道运输、需求收缩和恐慌衰减，市场价格形成层纳入地缘风险溢价、冲击不确定性、持续封锁制度风险、缓冲确认折价和预期修复折价。综合最优模型在</w:t>
       </w:r>
       <w:r>
         <w:t xml:space="preserve"> 46 </w:t>
@@ -352,7 +352,7 @@
         <w:t xml:space="preserve">天价格约为</w:t>
       </w:r>
       <w:r>
-        <w:t xml:space="preserve"> 104.49 </w:t>
+        <w:t xml:space="preserve"> 98.61 </w:t>
       </w:r>
       <w:r>
         <w:rPr>
@@ -370,13 +370,13 @@
         <w:t xml:space="preserve">天约为</w:t>
       </w:r>
       <w:r>
-        <w:t xml:space="preserve"> 119.53 </w:t>
-      </w:r>
-      <w:r>
-        <w:rPr>
-          <w:rFonts w:hint="eastAsia"/>
-        </w:rPr>
-        <w:t xml:space="preserve">美元/桶，且存在较高二次跳涨风险。敏感性分析表明，不确定性平台、地缘风险权重和供应中断量是综合敏感度最高的三个因素；SPR</w:t>
+        <w:t xml:space="preserve"> 114.49 </w:t>
+      </w:r>
+      <w:r>
+        <w:rPr>
+          <w:rFonts w:hint="eastAsia"/>
+        </w:rPr>
+        <w:t xml:space="preserve">美元/桶，且存在较高二次跳涨风险。敏感性分析表明，不确定性与制度风险强度、地缘风险权重和供应中断量是综合敏感度最高的三个因素；SPR</w:t>
       </w:r>
       <w:r>
         <w:t xml:space="preserve"> </w:t>
@@ -385,7 +385,7 @@
         <w:rPr>
           <w:rFonts w:hint="eastAsia"/>
         </w:rPr>
-        <w:t xml:space="preserve">释放和绕道运输更主要影响外推期峰值和削峰能力。</w:t>
+        <w:t xml:space="preserve">释放和绕道运输更主要影响外推期峰值、缺口闭合速度和削峰能力。</w:t>
       </w:r>
     </w:p>
     <w:p>
@@ -1111,7 +1111,7 @@
               <w:rPr>
                 <w:rFonts w:hint="eastAsia"/>
               </w:rPr>
-              <w:t xml:space="preserve">地缘风险溢价、不确定性平台、缓冲确认折价、预期修复折价</w:t>
+              <w:t xml:space="preserve">地缘风险溢价、冲击不确定性、持续封锁制度风险、缓冲确认折价、预期修复折价</w:t>
             </w:r>
           </w:p>
         </w:tc>
@@ -2978,7 +2978,7 @@
               <w:rPr>
                 <w:rFonts w:hint="eastAsia"/>
               </w:rPr>
-              <w:t xml:space="preserve">不确定性平台强度</w:t>
+              <w:t xml:space="preserve">不确定性与制度风险强度</w:t>
             </w:r>
           </w:p>
         </w:tc>
@@ -6249,7 +6249,7 @@
               <w:rPr>
                 <w:rFonts w:hint="eastAsia"/>
               </w:rPr>
-              <w:t xml:space="preserve">不确定性平台</w:t>
+              <w:t xml:space="preserve">不确定性/制度风险强度</w:t>
             </w:r>
           </w:p>
         </w:tc>
@@ -11135,7 +11135,7 @@
         <w:rPr>
           <w:rFonts w:hint="eastAsia"/>
         </w:rPr>
-        <w:t xml:space="preserve">风险侧：恐慌溢价逐步衰减，但地缘风险与不确定性平台可能在悲观情景下维持高位。</w:t>
+        <w:t xml:space="preserve">风险侧：恐慌溢价逐步衰减，不确定性溢价拆分为前期冲击不确定性和持续封锁制度风险，避免把长期价格简单托在一个常数平台上。</w:t>
       </w:r>
     </w:p>
     <w:p>
@@ -11485,7 +11485,7 @@
         <w:rPr>
           <w:rFonts w:hint="eastAsia"/>
         </w:rPr>
-        <w:t xml:space="preserve">为</w:t>
+        <w:t xml:space="preserve">为实际</w:t>
       </w:r>
       <w:r>
         <w:t xml:space="preserve"> SPR </w:t>
@@ -11563,7 +11563,413 @@
         <w:rPr>
           <w:rFonts w:hint="eastAsia"/>
         </w:rPr>
-        <w:t xml:space="preserve">为其他产油国增产或替代供应增量。长期价格递推采用</w:t>
+        <w:t xml:space="preserve">为其他产油国增产或替代供应增量。为避免将</w:t>
+      </w:r>
+      <w:r>
+        <w:t xml:space="preserve"> SPR </w:t>
+      </w:r>
+      <w:r>
+        <w:rPr>
+          <w:rFonts w:hint="eastAsia"/>
+        </w:rPr>
+        <w:t xml:space="preserve">机械地设为计划上限，本文令实际释放量随缺口和价格压力自适应收缩：</w:t>
+      </w:r>
+    </w:p>
+    <w:p>
+      <w:pPr>
+        <w:pStyle w:val="BodyText"/>
+      </w:pPr>
+      <m:oMathPara>
+        <m:oMathParaPr>
+          <m:jc m:val="center"/>
+        </m:oMathParaPr>
+        <m:oMath>
+          <m:sSub>
+            <m:e>
+              <m:r>
+                <m:t>R</m:t>
+              </m:r>
+            </m:e>
+            <m:sub>
+              <m:r>
+                <m:t>t</m:t>
+              </m:r>
+            </m:sub>
+          </m:sSub>
+          <m:r>
+            <m:rPr>
+              <m:sty m:val="p"/>
+            </m:rPr>
+            <m:t>=</m:t>
+          </m:r>
+          <m:r>
+            <m:rPr>
+              <m:sty m:val="p"/>
+            </m:rPr>
+            <m:t>min</m:t>
+          </m:r>
+          <m:d>
+            <m:dPr>
+              <m:begChr m:val="{"/>
+              <m:sepChr m:val=""/>
+              <m:endChr m:val="}"/>
+              <m:grow/>
+            </m:dPr>
+            <m:e>
+              <m:sSub>
+                <m:e>
+                  <m:acc>
+                    <m:accPr>
+                      <m:chr m:val="‾"/>
+                    </m:accPr>
+                    <m:e>
+                      <m:r>
+                        <m:t>R</m:t>
+                      </m:r>
+                    </m:e>
+                  </m:acc>
+                </m:e>
+                <m:sub>
+                  <m:r>
+                    <m:t>t</m:t>
+                  </m:r>
+                </m:sub>
+              </m:sSub>
+              <m:r>
+                <m:rPr>
+                  <m:sty m:val="p"/>
+                </m:rPr>
+                <m:t>,</m:t>
+              </m:r>
+              <m:r>
+                <m:t> </m:t>
+              </m:r>
+              <m:r>
+                <m:rPr>
+                  <m:sty m:val="p"/>
+                </m:rPr>
+                <m:t>max</m:t>
+              </m:r>
+              <m:d>
+                <m:dPr>
+                  <m:begChr m:val="("/>
+                  <m:sepChr m:val=""/>
+                  <m:endChr m:val=")"/>
+                  <m:grow/>
+                </m:dPr>
+                <m:e>
+                  <m:sSub>
+                    <m:e>
+                      <m:r>
+                        <m:t>G</m:t>
+                      </m:r>
+                    </m:e>
+                    <m:sub>
+                      <m:r>
+                        <m:t>t</m:t>
+                      </m:r>
+                      <m:r>
+                        <m:rPr>
+                          <m:sty m:val="p"/>
+                        </m:rPr>
+                        <m:t>,</m:t>
+                      </m:r>
+                      <m:r>
+                        <m:rPr>
+                          <m:sty m:val="p"/>
+                        </m:rPr>
+                        <m:t>p</m:t>
+                      </m:r>
+                      <m:r>
+                        <m:rPr>
+                          <m:sty m:val="p"/>
+                        </m:rPr>
+                        <m:t>r</m:t>
+                      </m:r>
+                      <m:r>
+                        <m:rPr>
+                          <m:sty m:val="p"/>
+                        </m:rPr>
+                        <m:t>e</m:t>
+                      </m:r>
+                    </m:sub>
+                  </m:sSub>
+                  <m:r>
+                    <m:rPr>
+                      <m:sty m:val="p"/>
+                    </m:rPr>
+                    <m:t>+</m:t>
+                  </m:r>
+                  <m:r>
+                    <m:t>ρ</m:t>
+                  </m:r>
+                  <m:sSub>
+                    <m:e>
+                      <m:r>
+                        <m:t>D</m:t>
+                      </m:r>
+                    </m:e>
+                    <m:sub>
+                      <m:r>
+                        <m:t>0</m:t>
+                      </m:r>
+                    </m:sub>
+                  </m:sSub>
+                  <m:r>
+                    <m:rPr>
+                      <m:sty m:val="p"/>
+                    </m:rPr>
+                    <m:t>,</m:t>
+                  </m:r>
+                  <m:r>
+                    <m:t> </m:t>
+                  </m:r>
+                  <m:sSub>
+                    <m:e>
+                      <m:acc>
+                        <m:accPr>
+                          <m:chr m:val="‾"/>
+                        </m:accPr>
+                        <m:e>
+                          <m:r>
+                            <m:t>R</m:t>
+                          </m:r>
+                        </m:e>
+                      </m:acc>
+                    </m:e>
+                    <m:sub>
+                      <m:r>
+                        <m:t>t</m:t>
+                      </m:r>
+                    </m:sub>
+                  </m:sSub>
+                  <m:sSub>
+                    <m:e>
+                      <m:r>
+                        <m:t>λ</m:t>
+                      </m:r>
+                    </m:e>
+                    <m:sub>
+                      <m:r>
+                        <m:t>t</m:t>
+                      </m:r>
+                    </m:sub>
+                  </m:sSub>
+                  <m:sSub>
+                    <m:e>
+                      <m:r>
+                        <m:t>τ</m:t>
+                      </m:r>
+                    </m:e>
+                    <m:sub>
+                      <m:r>
+                        <m:t>t</m:t>
+                      </m:r>
+                    </m:sub>
+                  </m:sSub>
+                </m:e>
+              </m:d>
+            </m:e>
+          </m:d>
+          <m:r>
+            <m:rPr>
+              <m:sty m:val="p"/>
+            </m:rPr>
+            <m:t>,</m:t>
+          </m:r>
+        </m:oMath>
+      </m:oMathPara>
+    </w:p>
+    <w:p>
+      <w:pPr>
+        <w:pStyle w:val="FirstParagraph"/>
+      </w:pPr>
+      <w:r>
+        <w:rPr>
+          <w:rFonts w:hint="eastAsia"/>
+        </w:rPr>
+        <w:t xml:space="preserve">其中</w:t>
+      </w:r>
+      <w:r>
+        <w:t xml:space="preserve"> </w:t>
+      </w:r>
+      <m:oMath>
+        <m:sSub>
+          <m:e>
+            <m:acc>
+              <m:accPr>
+                <m:chr m:val="‾"/>
+              </m:accPr>
+              <m:e>
+                <m:r>
+                  <m:t>R</m:t>
+                </m:r>
+              </m:e>
+            </m:acc>
+          </m:e>
+          <m:sub>
+            <m:r>
+              <m:t>t</m:t>
+            </m:r>
+          </m:sub>
+        </m:sSub>
+      </m:oMath>
+      <w:r>
+        <w:t xml:space="preserve"> </w:t>
+      </w:r>
+      <w:r>
+        <w:rPr>
+          <w:rFonts w:hint="eastAsia"/>
+        </w:rPr>
+        <w:t xml:space="preserve">为计划释放能力，</w:t>
+      </w:r>
+      <m:oMath>
+        <m:sSub>
+          <m:e>
+            <m:r>
+              <m:t>G</m:t>
+            </m:r>
+          </m:e>
+          <m:sub>
+            <m:r>
+              <m:t>t</m:t>
+            </m:r>
+            <m:r>
+              <m:rPr>
+                <m:sty m:val="p"/>
+              </m:rPr>
+              <m:t>,</m:t>
+            </m:r>
+            <m:r>
+              <m:rPr>
+                <m:sty m:val="p"/>
+              </m:rPr>
+              <m:t>p</m:t>
+            </m:r>
+            <m:r>
+              <m:rPr>
+                <m:sty m:val="p"/>
+              </m:rPr>
+              <m:t>r</m:t>
+            </m:r>
+            <m:r>
+              <m:rPr>
+                <m:sty m:val="p"/>
+              </m:rPr>
+              <m:t>e</m:t>
+            </m:r>
+          </m:sub>
+        </m:sSub>
+      </m:oMath>
+      <w:r>
+        <w:t xml:space="preserve"> </w:t>
+      </w:r>
+      <w:r>
+        <w:rPr>
+          <w:rFonts w:hint="eastAsia"/>
+        </w:rPr>
+        <w:t xml:space="preserve">为不含</w:t>
+      </w:r>
+      <w:r>
+        <w:t xml:space="preserve"> SPR </w:t>
+      </w:r>
+      <w:r>
+        <w:rPr>
+          <w:rFonts w:hint="eastAsia"/>
+        </w:rPr>
+        <w:t xml:space="preserve">时的预释放缺口，</w:t>
+      </w:r>
+      <m:oMath>
+        <m:r>
+          <m:t>ρ</m:t>
+        </m:r>
+        <m:sSub>
+          <m:e>
+            <m:r>
+              <m:t>D</m:t>
+            </m:r>
+          </m:e>
+          <m:sub>
+            <m:r>
+              <m:t>0</m:t>
+            </m:r>
+          </m:sub>
+        </m:sSub>
+      </m:oMath>
+      <w:r>
+        <w:t xml:space="preserve"> </w:t>
+      </w:r>
+      <w:r>
+        <w:rPr>
+          <w:rFonts w:hint="eastAsia"/>
+        </w:rPr>
+        <w:t xml:space="preserve">为安全余量，</w:t>
+      </w:r>
+      <m:oMath>
+        <m:sSub>
+          <m:e>
+            <m:r>
+              <m:t>λ</m:t>
+            </m:r>
+          </m:e>
+          <m:sub>
+            <m:r>
+              <m:t>t</m:t>
+            </m:r>
+          </m:sub>
+        </m:sSub>
+      </m:oMath>
+      <w:r>
+        <w:t xml:space="preserve"> </w:t>
+      </w:r>
+      <w:r>
+        <w:rPr>
+          <w:rFonts w:hint="eastAsia"/>
+        </w:rPr>
+        <w:t xml:space="preserve">表示由物理缺口和价格压力共同决定的释放强度，</w:t>
+      </w:r>
+      <m:oMath>
+        <m:sSub>
+          <m:e>
+            <m:r>
+              <m:t>τ</m:t>
+            </m:r>
+          </m:e>
+          <m:sub>
+            <m:r>
+              <m:t>t</m:t>
+            </m:r>
+          </m:sub>
+        </m:sSub>
+      </m:oMath>
+      <w:r>
+        <w:t xml:space="preserve"> </w:t>
+      </w:r>
+      <w:r>
+        <w:rPr>
+          <w:rFonts w:hint="eastAsia"/>
+        </w:rPr>
+        <w:t xml:space="preserve">为长期持续后的政策收缩系数。因此，当缺口已基本闭合时，SPR</w:t>
+      </w:r>
+      <w:r>
+        <w:t xml:space="preserve"> </w:t>
+      </w:r>
+      <w:r>
+        <w:rPr>
+          <w:rFonts w:hint="eastAsia"/>
+        </w:rPr>
+        <w:t xml:space="preserve">不会继续按上限满额释放。</w:t>
+      </w:r>
+    </w:p>
+    <w:p>
+      <w:pPr>
+        <w:pStyle w:val="BodyText"/>
+      </w:pPr>
+      <w:r>
+        <w:rPr>
+          <w:rFonts w:hint="eastAsia"/>
+        </w:rPr>
+        <w:t xml:space="preserve">长期价格递推采用</w:t>
       </w:r>
     </w:p>
     <w:p>
@@ -11913,7 +12319,59 @@
         <w:rPr>
           <w:rFonts w:hint="eastAsia"/>
         </w:rPr>
-        <w:t xml:space="preserve">共同决定的供需压力，</w:t>
+        <w:t xml:space="preserve">共同决定的供需压力；当</w:t>
+      </w:r>
+      <w:r>
+        <w:t xml:space="preserve"> </w:t>
+      </w:r>
+      <m:oMath>
+        <m:sSubSup>
+          <m:e>
+            <m:r>
+              <m:t>G</m:t>
+            </m:r>
+          </m:e>
+          <m:sub>
+            <m:r>
+              <m:t>t</m:t>
+            </m:r>
+          </m:sub>
+          <m:sup>
+            <m:r>
+              <m:rPr>
+                <m:sty m:val="p"/>
+              </m:rPr>
+              <m:t>(</m:t>
+            </m:r>
+            <m:r>
+              <m:t>L</m:t>
+            </m:r>
+            <m:r>
+              <m:rPr>
+                <m:sty m:val="p"/>
+              </m:rPr>
+              <m:t>)</m:t>
+            </m:r>
+          </m:sup>
+        </m:sSubSup>
+        <m:r>
+          <m:rPr>
+            <m:sty m:val="p"/>
+          </m:rPr>
+          <m:t>&lt;</m:t>
+        </m:r>
+        <m:r>
+          <m:t>0</m:t>
+        </m:r>
+      </m:oMath>
+      <w:r>
+        <w:t xml:space="preserve"> </w:t>
+      </w:r>
+      <w:r>
+        <w:rPr>
+          <w:rFonts w:hint="eastAsia"/>
+        </w:rPr>
+        <w:t xml:space="preserve">时，过剩供给通过较弱的折价项向下拉动目标价格。</w:t>
       </w:r>
       <m:oMath>
         <m:sSub>
@@ -11939,7 +12397,7 @@
         <w:rPr>
           <w:rFonts w:hint="eastAsia"/>
         </w:rPr>
-        <w:t xml:space="preserve">为地缘风险与不确定性溢价，</w:t>
+        <w:t xml:space="preserve">由地缘风险溢价、前期冲击不确定性和持续封锁制度风险三部分构成，</w:t>
       </w:r>
       <m:oMath>
         <m:sSub>
@@ -12604,55 +13062,55 @@
               <w:jc w:val="right"/>
             </w:pPr>
             <w:r>
-              <w:t xml:space="preserve">98.40</w:t>
-            </w:r>
-          </w:p>
-        </w:tc>
-        <w:tc>
-          <w:tcPr/>
-          <w:p>
-            <w:pPr>
-              <w:pStyle w:val="Compact"/>
-              <w:jc w:val="right"/>
-            </w:pPr>
-            <w:r>
-              <w:t xml:space="preserve">98.33</w:t>
-            </w:r>
-          </w:p>
-        </w:tc>
-        <w:tc>
-          <w:tcPr/>
-          <w:p>
-            <w:pPr>
-              <w:pStyle w:val="Compact"/>
-              <w:jc w:val="right"/>
-            </w:pPr>
-            <w:r>
-              <w:t xml:space="preserve">95.99</w:t>
-            </w:r>
-          </w:p>
-        </w:tc>
-        <w:tc>
-          <w:tcPr/>
-          <w:p>
-            <w:pPr>
-              <w:pStyle w:val="Compact"/>
-              <w:jc w:val="right"/>
-            </w:pPr>
-            <w:r>
-              <w:t xml:space="preserve">104.75</w:t>
-            </w:r>
-          </w:p>
-        </w:tc>
-        <w:tc>
-          <w:tcPr/>
-          <w:p>
-            <w:pPr>
-              <w:pStyle w:val="Compact"/>
-              <w:jc w:val="right"/>
-            </w:pPr>
-            <w:r>
-              <w:t xml:space="preserve">97.73</w:t>
+              <w:t xml:space="preserve">95.73</w:t>
+            </w:r>
+          </w:p>
+        </w:tc>
+        <w:tc>
+          <w:tcPr/>
+          <w:p>
+            <w:pPr>
+              <w:pStyle w:val="Compact"/>
+              <w:jc w:val="right"/>
+            </w:pPr>
+            <w:r>
+              <w:t xml:space="preserve">94.78</w:t>
+            </w:r>
+          </w:p>
+        </w:tc>
+        <w:tc>
+          <w:tcPr/>
+          <w:p>
+            <w:pPr>
+              <w:pStyle w:val="Compact"/>
+              <w:jc w:val="right"/>
+            </w:pPr>
+            <w:r>
+              <w:t xml:space="preserve">91.24</w:t>
+            </w:r>
+          </w:p>
+        </w:tc>
+        <w:tc>
+          <w:tcPr/>
+          <w:p>
+            <w:pPr>
+              <w:pStyle w:val="Compact"/>
+              <w:jc w:val="right"/>
+            </w:pPr>
+            <w:r>
+              <w:t xml:space="preserve">104.16</w:t>
+            </w:r>
+          </w:p>
+        </w:tc>
+        <w:tc>
+          <w:tcPr/>
+          <w:p>
+            <w:pPr>
+              <w:pStyle w:val="Compact"/>
+              <w:jc w:val="right"/>
+            </w:pPr>
+            <w:r>
+              <w:t xml:space="preserve">94.31</w:t>
             </w:r>
           </w:p>
         </w:tc>
@@ -12708,55 +13166,55 @@
               <w:jc w:val="right"/>
             </w:pPr>
             <w:r>
-              <w:t xml:space="preserve">109.99</w:t>
-            </w:r>
-          </w:p>
-        </w:tc>
-        <w:tc>
-          <w:tcPr/>
-          <w:p>
-            <w:pPr>
-              <w:pStyle w:val="Compact"/>
-              <w:jc w:val="right"/>
-            </w:pPr>
-            <w:r>
-              <w:t xml:space="preserve">108.04</w:t>
-            </w:r>
-          </w:p>
-        </w:tc>
-        <w:tc>
-          <w:tcPr/>
-          <w:p>
-            <w:pPr>
-              <w:pStyle w:val="Compact"/>
-              <w:jc w:val="right"/>
-            </w:pPr>
-            <w:r>
-              <w:t xml:space="preserve">104.49</w:t>
-            </w:r>
-          </w:p>
-        </w:tc>
-        <w:tc>
-          <w:tcPr/>
-          <w:p>
-            <w:pPr>
-              <w:pStyle w:val="Compact"/>
-              <w:jc w:val="right"/>
-            </w:pPr>
-            <w:r>
-              <w:t xml:space="preserve">110.89</w:t>
-            </w:r>
-          </w:p>
-        </w:tc>
-        <w:tc>
-          <w:tcPr/>
-          <w:p>
-            <w:pPr>
-              <w:pStyle w:val="Compact"/>
-              <w:jc w:val="right"/>
-            </w:pPr>
-            <w:r>
-              <w:t xml:space="preserve">107.88</w:t>
+              <w:t xml:space="preserve">107.55</w:t>
+            </w:r>
+          </w:p>
+        </w:tc>
+        <w:tc>
+          <w:tcPr/>
+          <w:p>
+            <w:pPr>
+              <w:pStyle w:val="Compact"/>
+              <w:jc w:val="right"/>
+            </w:pPr>
+            <w:r>
+              <w:t xml:space="preserve">104.33</w:t>
+            </w:r>
+          </w:p>
+        </w:tc>
+        <w:tc>
+          <w:tcPr/>
+          <w:p>
+            <w:pPr>
+              <w:pStyle w:val="Compact"/>
+              <w:jc w:val="right"/>
+            </w:pPr>
+            <w:r>
+              <w:t xml:space="preserve">98.61</w:t>
+            </w:r>
+          </w:p>
+        </w:tc>
+        <w:tc>
+          <w:tcPr/>
+          <w:p>
+            <w:pPr>
+              <w:pStyle w:val="Compact"/>
+              <w:jc w:val="right"/>
+            </w:pPr>
+            <w:r>
+              <w:t xml:space="preserve">110.35</w:t>
+            </w:r>
+          </w:p>
+        </w:tc>
+        <w:tc>
+          <w:tcPr/>
+          <w:p>
+            <w:pPr>
+              <w:pStyle w:val="Compact"/>
+              <w:jc w:val="right"/>
+            </w:pPr>
+            <w:r>
+              <w:t xml:space="preserve">104.22</w:t>
             </w:r>
           </w:p>
         </w:tc>
@@ -12812,55 +13270,55 @@
               <w:jc w:val="right"/>
             </w:pPr>
             <w:r>
-              <w:t xml:space="preserve">127.32</w:t>
-            </w:r>
-          </w:p>
-        </w:tc>
-        <w:tc>
-          <w:tcPr/>
-          <w:p>
-            <w:pPr>
-              <w:pStyle w:val="Compact"/>
-              <w:jc w:val="right"/>
-            </w:pPr>
-            <w:r>
-              <w:t xml:space="preserve">122.59</w:t>
-            </w:r>
-          </w:p>
-        </w:tc>
-        <w:tc>
-          <w:tcPr/>
-          <w:p>
-            <w:pPr>
-              <w:pStyle w:val="Compact"/>
-              <w:jc w:val="right"/>
-            </w:pPr>
-            <w:r>
-              <w:t xml:space="preserve">119.53</w:t>
-            </w:r>
-          </w:p>
-        </w:tc>
-        <w:tc>
-          <w:tcPr/>
-          <w:p>
-            <w:pPr>
-              <w:pStyle w:val="Compact"/>
-              <w:jc w:val="right"/>
-            </w:pPr>
-            <w:r>
-              <w:t xml:space="preserve">130.18</w:t>
-            </w:r>
-          </w:p>
-        </w:tc>
-        <w:tc>
-          <w:tcPr/>
-          <w:p>
-            <w:pPr>
-              <w:pStyle w:val="Compact"/>
-              <w:jc w:val="right"/>
-            </w:pPr>
-            <w:r>
-              <w:t xml:space="preserve">123.57</w:t>
+              <w:t xml:space="preserve">126.63</w:t>
+            </w:r>
+          </w:p>
+        </w:tc>
+        <w:tc>
+          <w:tcPr/>
+          <w:p>
+            <w:pPr>
+              <w:pStyle w:val="Compact"/>
+              <w:jc w:val="right"/>
+            </w:pPr>
+            <w:r>
+              <w:t xml:space="preserve">119.75</w:t>
+            </w:r>
+          </w:p>
+        </w:tc>
+        <w:tc>
+          <w:tcPr/>
+          <w:p>
+            <w:pPr>
+              <w:pStyle w:val="Compact"/>
+              <w:jc w:val="right"/>
+            </w:pPr>
+            <w:r>
+              <w:t xml:space="preserve">114.49</w:t>
+            </w:r>
+          </w:p>
+        </w:tc>
+        <w:tc>
+          <w:tcPr/>
+          <w:p>
+            <w:pPr>
+              <w:pStyle w:val="Compact"/>
+              <w:jc w:val="right"/>
+            </w:pPr>
+            <w:r>
+              <w:t xml:space="preserve">131.22</w:t>
+            </w:r>
+          </w:p>
+        </w:tc>
+        <w:tc>
+          <w:tcPr/>
+          <w:p>
+            <w:pPr>
+              <w:pStyle w:val="Compact"/>
+              <w:jc w:val="right"/>
+            </w:pPr>
+            <w:r>
+              <w:t xml:space="preserve">121.05</w:t>
             </w:r>
           </w:p>
         </w:tc>
@@ -12968,7 +13426,7 @@
         <w:t xml:space="preserve">天附近回落至约</w:t>
       </w:r>
       <w:r>
-        <w:t xml:space="preserve"> 104.49 </w:t>
+        <w:t xml:space="preserve"> 98.61 </w:t>
       </w:r>
       <w:r>
         <w:rPr>
@@ -12995,7 +13453,7 @@
         <w:t xml:space="preserve">美元/桶附近，并在外推期达到约</w:t>
       </w:r>
       <w:r>
-        <w:t xml:space="preserve"> 130.18 </w:t>
+        <w:t xml:space="preserve"> 131.22 </w:t>
       </w:r>
       <w:r>
         <w:rPr>
@@ -13015,7 +13473,7 @@
         <w:t xml:space="preserve">从价格平衡点看，乐观情景最终回落至约</w:t>
       </w:r>
       <w:r>
-        <w:t xml:space="preserve"> 95.99 </w:t>
+        <w:t xml:space="preserve"> 91.24 </w:t>
       </w:r>
       <w:r>
         <w:rPr>
@@ -13030,7 +13488,7 @@
         <w:rPr>
           <w:rFonts w:hint="eastAsia"/>
         </w:rPr>
-        <w:t xml:space="preserve">释放及时、绕道运输恢复充分且长期需求弹性发挥作用，油价可以逐步脱离</w:t>
+        <w:t xml:space="preserve">可用上限较高、绕道运输恢复充分且长期需求弹性发挥作用，油价可以逐步脱离</w:t>
       </w:r>
       <w:r>
         <w:t xml:space="preserve"> 110–120 </w:t>
@@ -13051,13 +13509,22 @@
         <w:t xml:space="preserve">天约为</w:t>
       </w:r>
       <w:r>
-        <w:t xml:space="preserve"> 104.49 </w:t>
-      </w:r>
-      <w:r>
-        <w:rPr>
-          <w:rFonts w:hint="eastAsia"/>
-        </w:rPr>
-        <w:t xml:space="preserve">美元/桶，更接近政策缓冲与市场风险重新平衡后的中心水平。悲观情景第</w:t>
+        <w:t xml:space="preserve"> 98.61 </w:t>
+      </w:r>
+      <w:r>
+        <w:rPr>
+          <w:rFonts w:hint="eastAsia"/>
+        </w:rPr>
+        <w:t xml:space="preserve">美元/桶，更接近政策缓冲与市场风险重新平衡后的中心水平；此时实际</w:t>
+      </w:r>
+      <w:r>
+        <w:t xml:space="preserve"> SPR </w:t>
+      </w:r>
+      <w:r>
+        <w:rPr>
+          <w:rFonts w:hint="eastAsia"/>
+        </w:rPr>
+        <w:t xml:space="preserve">释放已经从计划上限自动收缩，说明价格回落不是依赖政策变量机械满额托底。悲观情景第</w:t>
       </w:r>
       <w:r>
         <w:t xml:space="preserve"> 180 </w:t>
@@ -13069,7 +13536,7 @@
         <w:t xml:space="preserve">天仍为</w:t>
       </w:r>
       <w:r>
-        <w:t xml:space="preserve"> 119.53 </w:t>
+        <w:t xml:space="preserve"> 114.49 </w:t>
       </w:r>
       <w:r>
         <w:rPr>
@@ -13084,7 +13551,7 @@
         <w:rPr>
           <w:rFonts w:hint="eastAsia"/>
         </w:rPr>
-        <w:t xml:space="preserve">释放不足且风险溢价持续，市场可能长期停留在高位平台，并保留二次跳涨尾部风险。</w:t>
+        <w:t xml:space="preserve">释放不足且制度风险溢价持续，市场可能长期停留在高位平台，并保留二次跳涨尾部风险。</w:t>
       </w:r>
     </w:p>
     <w:p>
@@ -13597,43 +14064,43 @@
               <w:rPr>
                 <w:rFonts w:hint="eastAsia"/>
               </w:rPr>
-              <w:t xml:space="preserve">不确定性平台</w:t>
-            </w:r>
-          </w:p>
-        </w:tc>
-        <w:tc>
-          <w:tcPr/>
-          <w:p>
-            <w:pPr>
-              <w:pStyle w:val="Compact"/>
-              <w:jc w:val="right"/>
-            </w:pPr>
-            <w:r>
-              <w:t xml:space="preserve">17.93</w:t>
-            </w:r>
-          </w:p>
-        </w:tc>
-        <w:tc>
-          <w:tcPr/>
-          <w:p>
-            <w:pPr>
-              <w:pStyle w:val="Compact"/>
-              <w:jc w:val="right"/>
-            </w:pPr>
-            <w:r>
-              <w:t xml:space="preserve">12.45</w:t>
-            </w:r>
-          </w:p>
-        </w:tc>
-        <w:tc>
-          <w:tcPr/>
-          <w:p>
-            <w:pPr>
-              <w:pStyle w:val="Compact"/>
-              <w:jc w:val="right"/>
-            </w:pPr>
-            <w:r>
-              <w:t xml:space="preserve">12.19</w:t>
+              <w:t xml:space="preserve">不确定性与制度风险强度</w:t>
+            </w:r>
+          </w:p>
+        </w:tc>
+        <w:tc>
+          <w:tcPr/>
+          <w:p>
+            <w:pPr>
+              <w:pStyle w:val="Compact"/>
+              <w:jc w:val="right"/>
+            </w:pPr>
+            <w:r>
+              <w:t xml:space="preserve">15.09</w:t>
+            </w:r>
+          </w:p>
+        </w:tc>
+        <w:tc>
+          <w:tcPr/>
+          <w:p>
+            <w:pPr>
+              <w:pStyle w:val="Compact"/>
+              <w:jc w:val="right"/>
+            </w:pPr>
+            <w:r>
+              <w:t xml:space="preserve">9.73</w:t>
+            </w:r>
+          </w:p>
+        </w:tc>
+        <w:tc>
+          <w:tcPr/>
+          <w:p>
+            <w:pPr>
+              <w:pStyle w:val="Compact"/>
+              <w:jc w:val="right"/>
+            </w:pPr>
+            <w:r>
+              <w:t xml:space="preserve">11.91</w:t>
             </w:r>
           </w:p>
         </w:tc>
@@ -13674,31 +14141,31 @@
               <w:jc w:val="right"/>
             </w:pPr>
             <w:r>
-              <w:t xml:space="preserve">12.30</w:t>
-            </w:r>
-          </w:p>
-        </w:tc>
-        <w:tc>
-          <w:tcPr/>
-          <w:p>
-            <w:pPr>
-              <w:pStyle w:val="Compact"/>
-              <w:jc w:val="right"/>
-            </w:pPr>
-            <w:r>
-              <w:t xml:space="preserve">7.24</w:t>
-            </w:r>
-          </w:p>
-        </w:tc>
-        <w:tc>
-          <w:tcPr/>
-          <w:p>
-            <w:pPr>
-              <w:pStyle w:val="Compact"/>
-              <w:jc w:val="right"/>
-            </w:pPr>
-            <w:r>
-              <w:t xml:space="preserve">11.26</w:t>
+              <w:t xml:space="preserve">13.58</w:t>
+            </w:r>
+          </w:p>
+        </w:tc>
+        <w:tc>
+          <w:tcPr/>
+          <w:p>
+            <w:pPr>
+              <w:pStyle w:val="Compact"/>
+              <w:jc w:val="right"/>
+            </w:pPr>
+            <w:r>
+              <w:t xml:space="preserve">8.41</w:t>
+            </w:r>
+          </w:p>
+        </w:tc>
+        <w:tc>
+          <w:tcPr/>
+          <w:p>
+            <w:pPr>
+              <w:pStyle w:val="Compact"/>
+              <w:jc w:val="right"/>
+            </w:pPr>
+            <w:r>
+              <w:t xml:space="preserve">11.49</w:t>
             </w:r>
           </w:p>
         </w:tc>
@@ -13739,31 +14206,31 @@
               <w:jc w:val="right"/>
             </w:pPr>
             <w:r>
-              <w:t xml:space="preserve">5.91</w:t>
-            </w:r>
-          </w:p>
-        </w:tc>
-        <w:tc>
-          <w:tcPr/>
-          <w:p>
-            <w:pPr>
-              <w:pStyle w:val="Compact"/>
-              <w:jc w:val="right"/>
-            </w:pPr>
-            <w:r>
-              <w:t xml:space="preserve">3.54</w:t>
-            </w:r>
-          </w:p>
-        </w:tc>
-        <w:tc>
-          <w:tcPr/>
-          <w:p>
-            <w:pPr>
-              <w:pStyle w:val="Compact"/>
-              <w:jc w:val="right"/>
-            </w:pPr>
-            <w:r>
-              <w:t xml:space="preserve">5.27</w:t>
+              <w:t xml:space="preserve">5.72</w:t>
+            </w:r>
+          </w:p>
+        </w:tc>
+        <w:tc>
+          <w:tcPr/>
+          <w:p>
+            <w:pPr>
+              <w:pStyle w:val="Compact"/>
+              <w:jc w:val="right"/>
+            </w:pPr>
+            <w:r>
+              <w:t xml:space="preserve">3.03</w:t>
+            </w:r>
+          </w:p>
+        </w:tc>
+        <w:tc>
+          <w:tcPr/>
+          <w:p>
+            <w:pPr>
+              <w:pStyle w:val="Compact"/>
+              <w:jc w:val="right"/>
+            </w:pPr>
+            <w:r>
+              <w:t xml:space="preserve">5.96</w:t>
             </w:r>
           </w:p>
         </w:tc>
@@ -13789,49 +14256,46 @@
               <w:jc w:val="left"/>
             </w:pPr>
             <w:r>
-              <w:t xml:space="preserve">SPR </w:t>
-            </w:r>
-            <w:r>
-              <w:rPr>
-                <w:rFonts w:hint="eastAsia"/>
-              </w:rPr>
-              <w:t xml:space="preserve">释放上限</w:t>
-            </w:r>
-          </w:p>
-        </w:tc>
-        <w:tc>
-          <w:tcPr/>
-          <w:p>
-            <w:pPr>
-              <w:pStyle w:val="Compact"/>
-              <w:jc w:val="right"/>
-            </w:pPr>
-            <w:r>
-              <w:t xml:space="preserve">0.24</w:t>
-            </w:r>
-          </w:p>
-        </w:tc>
-        <w:tc>
-          <w:tcPr/>
-          <w:p>
-            <w:pPr>
-              <w:pStyle w:val="Compact"/>
-              <w:jc w:val="right"/>
-            </w:pPr>
-            <w:r>
-              <w:t xml:space="preserve">0.00</w:t>
-            </w:r>
-          </w:p>
-        </w:tc>
-        <w:tc>
-          <w:tcPr/>
-          <w:p>
-            <w:pPr>
-              <w:pStyle w:val="Compact"/>
-              <w:jc w:val="right"/>
-            </w:pPr>
-            <w:r>
-              <w:t xml:space="preserve">0.52</w:t>
+              <w:rPr>
+                <w:rFonts w:hint="eastAsia"/>
+              </w:rPr>
+              <w:t xml:space="preserve">长期需求弹性</w:t>
+            </w:r>
+          </w:p>
+        </w:tc>
+        <w:tc>
+          <w:tcPr/>
+          <w:p>
+            <w:pPr>
+              <w:pStyle w:val="Compact"/>
+              <w:jc w:val="right"/>
+            </w:pPr>
+            <w:r>
+              <w:t xml:space="preserve">3.70</w:t>
+            </w:r>
+          </w:p>
+        </w:tc>
+        <w:tc>
+          <w:tcPr/>
+          <w:p>
+            <w:pPr>
+              <w:pStyle w:val="Compact"/>
+              <w:jc w:val="right"/>
+            </w:pPr>
+            <w:r>
+              <w:t xml:space="preserve">3.36</w:t>
+            </w:r>
+          </w:p>
+        </w:tc>
+        <w:tc>
+          <w:tcPr/>
+          <w:p>
+            <w:pPr>
+              <w:pStyle w:val="Compact"/>
+              <w:jc w:val="right"/>
+            </w:pPr>
+            <w:r>
+              <w:t xml:space="preserve">0.75</w:t>
             </w:r>
           </w:p>
         </w:tc>
@@ -13860,43 +14324,43 @@
               <w:rPr>
                 <w:rFonts w:hint="eastAsia"/>
               </w:rPr>
-              <w:t xml:space="preserve">恐慌衰减速度</w:t>
-            </w:r>
-          </w:p>
-        </w:tc>
-        <w:tc>
-          <w:tcPr/>
-          <w:p>
-            <w:pPr>
-              <w:pStyle w:val="Compact"/>
-              <w:jc w:val="right"/>
-            </w:pPr>
-            <w:r>
-              <w:t xml:space="preserve">0.14</w:t>
-            </w:r>
-          </w:p>
-        </w:tc>
-        <w:tc>
-          <w:tcPr/>
-          <w:p>
-            <w:pPr>
-              <w:pStyle w:val="Compact"/>
-              <w:jc w:val="right"/>
-            </w:pPr>
-            <w:r>
-              <w:t xml:space="preserve">0.00</w:t>
-            </w:r>
-          </w:p>
-        </w:tc>
-        <w:tc>
-          <w:tcPr/>
-          <w:p>
-            <w:pPr>
-              <w:pStyle w:val="Compact"/>
-              <w:jc w:val="right"/>
-            </w:pPr>
-            <w:r>
-              <w:t xml:space="preserve">0.30</w:t>
+              <w:t xml:space="preserve">绕道运输能力</w:t>
+            </w:r>
+          </w:p>
+        </w:tc>
+        <w:tc>
+          <w:tcPr/>
+          <w:p>
+            <w:pPr>
+              <w:pStyle w:val="Compact"/>
+              <w:jc w:val="right"/>
+            </w:pPr>
+            <w:r>
+              <w:t xml:space="preserve">0.75</w:t>
+            </w:r>
+          </w:p>
+        </w:tc>
+        <w:tc>
+          <w:tcPr/>
+          <w:p>
+            <w:pPr>
+              <w:pStyle w:val="Compact"/>
+              <w:jc w:val="right"/>
+            </w:pPr>
+            <w:r>
+              <w:t xml:space="preserve">0.48</w:t>
+            </w:r>
+          </w:p>
+        </w:tc>
+        <w:tc>
+          <w:tcPr/>
+          <w:p>
+            <w:pPr>
+              <w:pStyle w:val="Compact"/>
+              <w:jc w:val="right"/>
+            </w:pPr>
+            <w:r>
+              <w:t xml:space="preserve">0.61</w:t>
             </w:r>
           </w:p>
         </w:tc>
@@ -13922,46 +14386,49 @@
               <w:jc w:val="left"/>
             </w:pPr>
             <w:r>
-              <w:rPr>
-                <w:rFonts w:hint="eastAsia"/>
-              </w:rPr>
-              <w:t xml:space="preserve">预期修复强度</w:t>
-            </w:r>
-          </w:p>
-        </w:tc>
-        <w:tc>
-          <w:tcPr/>
-          <w:p>
-            <w:pPr>
-              <w:pStyle w:val="Compact"/>
-              <w:jc w:val="right"/>
-            </w:pPr>
-            <w:r>
-              <w:t xml:space="preserve">0.07</w:t>
-            </w:r>
-          </w:p>
-        </w:tc>
-        <w:tc>
-          <w:tcPr/>
-          <w:p>
-            <w:pPr>
-              <w:pStyle w:val="Compact"/>
-              <w:jc w:val="right"/>
-            </w:pPr>
-            <w:r>
-              <w:t xml:space="preserve">0.00</w:t>
-            </w:r>
-          </w:p>
-        </w:tc>
-        <w:tc>
-          <w:tcPr/>
-          <w:p>
-            <w:pPr>
-              <w:pStyle w:val="Compact"/>
-              <w:jc w:val="right"/>
-            </w:pPr>
-            <w:r>
-              <w:t xml:space="preserve">0.16</w:t>
+              <w:t xml:space="preserve">SPR </w:t>
+            </w:r>
+            <w:r>
+              <w:rPr>
+                <w:rFonts w:hint="eastAsia"/>
+              </w:rPr>
+              <w:t xml:space="preserve">释放上限</w:t>
+            </w:r>
+          </w:p>
+        </w:tc>
+        <w:tc>
+          <w:tcPr/>
+          <w:p>
+            <w:pPr>
+              <w:pStyle w:val="Compact"/>
+              <w:jc w:val="right"/>
+            </w:pPr>
+            <w:r>
+              <w:t xml:space="preserve">0.24</w:t>
+            </w:r>
+          </w:p>
+        </w:tc>
+        <w:tc>
+          <w:tcPr/>
+          <w:p>
+            <w:pPr>
+              <w:pStyle w:val="Compact"/>
+              <w:jc w:val="right"/>
+            </w:pPr>
+            <w:r>
+              <w:t xml:space="preserve">0.05</w:t>
+            </w:r>
+          </w:p>
+        </w:tc>
+        <w:tc>
+          <w:tcPr/>
+          <w:p>
+            <w:pPr>
+              <w:pStyle w:val="Compact"/>
+              <w:jc w:val="right"/>
+            </w:pPr>
+            <w:r>
+              <w:t xml:space="preserve">0.41</w:t>
             </w:r>
           </w:p>
         </w:tc>
@@ -13987,25 +14454,22 @@
               <w:jc w:val="left"/>
             </w:pPr>
             <w:r>
-              <w:t xml:space="preserve">SPR </w:t>
-            </w:r>
-            <w:r>
-              <w:rPr>
-                <w:rFonts w:hint="eastAsia"/>
-              </w:rPr>
-              <w:t xml:space="preserve">启动延迟</w:t>
-            </w:r>
-          </w:p>
-        </w:tc>
-        <w:tc>
-          <w:tcPr/>
-          <w:p>
-            <w:pPr>
-              <w:pStyle w:val="Compact"/>
-              <w:jc w:val="right"/>
-            </w:pPr>
-            <w:r>
-              <w:t xml:space="preserve">0.05</w:t>
+              <w:rPr>
+                <w:rFonts w:hint="eastAsia"/>
+              </w:rPr>
+              <w:t xml:space="preserve">预期修复强度</w:t>
+            </w:r>
+          </w:p>
+        </w:tc>
+        <w:tc>
+          <w:tcPr/>
+          <w:p>
+            <w:pPr>
+              <w:pStyle w:val="Compact"/>
+              <w:jc w:val="right"/>
+            </w:pPr>
+            <w:r>
+              <w:t xml:space="preserve">0.23</w:t>
             </w:r>
           </w:p>
         </w:tc>
@@ -14029,7 +14493,7 @@
               <w:jc w:val="right"/>
             </w:pPr>
             <w:r>
-              <w:t xml:space="preserve">0.11</w:t>
+              <w:t xml:space="preserve">0.51</w:t>
             </w:r>
           </w:p>
         </w:tc>
@@ -14058,19 +14522,19 @@
               <w:rPr>
                 <w:rFonts w:hint="eastAsia"/>
               </w:rPr>
-              <w:t xml:space="preserve">长期需求弹性</w:t>
-            </w:r>
-          </w:p>
-        </w:tc>
-        <w:tc>
-          <w:tcPr/>
-          <w:p>
-            <w:pPr>
-              <w:pStyle w:val="Compact"/>
-              <w:jc w:val="right"/>
-            </w:pPr>
-            <w:r>
-              <w:t xml:space="preserve">0.04</w:t>
+              <w:t xml:space="preserve">恐慌衰减速度</w:t>
+            </w:r>
+          </w:p>
+        </w:tc>
+        <w:tc>
+          <w:tcPr/>
+          <w:p>
+            <w:pPr>
+              <w:pStyle w:val="Compact"/>
+              <w:jc w:val="right"/>
+            </w:pPr>
+            <w:r>
+              <w:t xml:space="preserve">0.17</w:t>
             </w:r>
           </w:p>
         </w:tc>
@@ -14094,7 +14558,7 @@
               <w:jc w:val="right"/>
             </w:pPr>
             <w:r>
-              <w:t xml:space="preserve">0.08</w:t>
+              <w:t xml:space="preserve">0.37</w:t>
             </w:r>
           </w:p>
         </w:tc>
@@ -14120,22 +14584,25 @@
               <w:jc w:val="left"/>
             </w:pPr>
             <w:r>
-              <w:rPr>
-                <w:rFonts w:hint="eastAsia"/>
-              </w:rPr>
-              <w:t xml:space="preserve">绕道运输能力</w:t>
-            </w:r>
-          </w:p>
-        </w:tc>
-        <w:tc>
-          <w:tcPr/>
-          <w:p>
-            <w:pPr>
-              <w:pStyle w:val="Compact"/>
-              <w:jc w:val="right"/>
-            </w:pPr>
-            <w:r>
-              <w:t xml:space="preserve">0.01</w:t>
+              <w:t xml:space="preserve">SPR </w:t>
+            </w:r>
+            <w:r>
+              <w:rPr>
+                <w:rFonts w:hint="eastAsia"/>
+              </w:rPr>
+              <w:t xml:space="preserve">启动延迟</w:t>
+            </w:r>
+          </w:p>
+        </w:tc>
+        <w:tc>
+          <w:tcPr/>
+          <w:p>
+            <w:pPr>
+              <w:pStyle w:val="Compact"/>
+              <w:jc w:val="right"/>
+            </w:pPr>
+            <w:r>
+              <w:t xml:space="preserve">0.08</w:t>
             </w:r>
           </w:p>
         </w:tc>
@@ -14159,7 +14626,7 @@
               <w:jc w:val="right"/>
             </w:pPr>
             <w:r>
-              <w:t xml:space="preserve">0.03</w:t>
+              <w:t xml:space="preserve">0.17</w:t>
             </w:r>
           </w:p>
         </w:tc>
@@ -14200,7 +14667,7 @@
               <w:jc w:val="right"/>
             </w:pPr>
             <w:r>
-              <w:t xml:space="preserve">0.01</w:t>
+              <w:t xml:space="preserve">0.02</w:t>
             </w:r>
           </w:p>
         </w:tc>
@@ -14224,7 +14691,7 @@
               <w:jc w:val="right"/>
             </w:pPr>
             <w:r>
-              <w:t xml:space="preserve">0.03</w:t>
+              <w:t xml:space="preserve">0.04</w:t>
             </w:r>
           </w:p>
         </w:tc>
@@ -14314,7 +14781,7 @@
         <w:rPr>
           <w:rFonts w:hint="eastAsia"/>
         </w:rPr>
-        <w:t xml:space="preserve">天终点价格对市场价格形成层最敏感，尤其是不确定性平台和地缘风险权重；供应中断量决定价格上行压力的物理底座。SPR</w:t>
+        <w:t xml:space="preserve">天终点价格对市场价格形成层最敏感，尤其是不确定性与制度风险强度和地缘风险权重；供应中断量决定价格上行压力的物理底座。长期需求弹性在新的自适应外推中也具有较高影响，因为它决定高价持续后需求侧能否真正完成再平衡。SPR</w:t>
       </w:r>
       <w:r>
         <w:t xml:space="preserve"> </w:t>
@@ -14332,7 +14799,7 @@
         <w:rPr>
           <w:rFonts w:hint="eastAsia"/>
         </w:rPr>
-        <w:t xml:space="preserve">天终点价影响较小，但会改变外推期峰值和二次跳涨幅度，因此更适合被解释为</w:t>
+        <w:t xml:space="preserve">天终点价影响较小，但会改变外推期峰值、缺口闭合速度和二次跳涨幅度，因此更适合被解释为</w:t>
       </w:r>
       <w:r>
         <w:rPr>
@@ -14524,7 +14991,7 @@
         <w:rPr>
           <w:rFonts w:hint="eastAsia"/>
         </w:rPr>
-        <w:t xml:space="preserve">地缘风险、不确定性平台和预期修复仍以参数化方式刻画，未引入期权隐含波动率、真实库存周报或新闻情绪等外生数据。</w:t>
+        <w:t xml:space="preserve">地缘风险、不确定性与制度风险、预期修复仍以参数化方式刻画，未引入期权隐含波动率、真实库存周报或新闻情绪等外生数据。</w:t>
       </w:r>
     </w:p>
     <w:p>
@@ -14748,7 +15215,7 @@
         <w:t xml:space="preserve">天价格约为</w:t>
       </w:r>
       <w:r>
-        <w:t xml:space="preserve"> 104.49 </w:t>
+        <w:t xml:space="preserve"> 98.61 </w:t>
       </w:r>
       <w:r>
         <w:rPr>
@@ -14766,7 +15233,7 @@
         <w:t xml:space="preserve">天约为</w:t>
       </w:r>
       <w:r>
-        <w:t xml:space="preserve"> 119.53 </w:t>
+        <w:t xml:space="preserve"> 114.49 </w:t>
       </w:r>
       <w:r>
         <w:rPr>
@@ -14786,7 +15253,7 @@
         <w:rPr>
           <w:rFonts w:hint="eastAsia"/>
         </w:rPr>
-        <w:t xml:space="preserve">敏感性分析显示，不确定性平台、地缘风险权重和供应中断量是最关键影响因素；SPR</w:t>
+        <w:t xml:space="preserve">敏感性分析显示，不确定性与制度风险强度、地缘风险权重和供应中断量是最关键影响因素；SPR</w:t>
       </w:r>
       <w:r>
         <w:t xml:space="preserve"> </w:t>
@@ -14795,7 +15262,7 @@
         <w:rPr>
           <w:rFonts w:hint="eastAsia"/>
         </w:rPr>
-        <w:t xml:space="preserve">和绕道运输更偏向削峰和争取恢复时间。</w:t>
+        <w:t xml:space="preserve">和绕道运输更偏向削峰、缺口闭合和争取恢复时间。</w:t>
       </w:r>
     </w:p>
     <w:p>

</xml_diff>

<commit_message>
Add Monte Carlo risk analysis and EIA constraints
</commit_message>
<xml_diff>
--- a/output/final/总论文.docx
+++ b/output/final/总论文.docx
@@ -376,7 +376,25 @@
         <w:rPr>
           <w:rFonts w:hint="eastAsia"/>
         </w:rPr>
-        <w:t xml:space="preserve">美元/桶，且存在较高二次跳涨风险。敏感性分析表明，不确定性与制度风险强度、地缘风险权重和供应中断量是综合敏感度最高的三个因素；SPR</w:t>
+        <w:t xml:space="preserve">美元/桶，且存在较高二次跳涨风险。敏感性分析表明，不确定性与制度风险强度、地缘风险权重和供应中断量是综合敏感度最高的三个因素；进一步的</w:t>
+      </w:r>
+      <w:r>
+        <w:t xml:space="preserve"> 2000 </w:t>
+      </w:r>
+      <w:r>
+        <w:rPr>
+          <w:rFonts w:hint="eastAsia"/>
+        </w:rPr>
+        <w:t xml:space="preserve">次蒙特卡洛情景树显示，外推期最高价突破</w:t>
+      </w:r>
+      <w:r>
+        <w:t xml:space="preserve"> 120 </w:t>
+      </w:r>
+      <w:r>
+        <w:rPr>
+          <w:rFonts w:hint="eastAsia"/>
+        </w:rPr>
+        <w:t xml:space="preserve">美元/桶的概率约为</w:t>
       </w:r>
       <w:r>
         <w:t xml:space="preserve"> </w:t>
@@ -385,7 +403,25 @@
         <w:rPr>
           <w:rFonts w:hint="eastAsia"/>
         </w:rPr>
-        <w:t xml:space="preserve">释放和绕道运输更主要影响外推期峰值、缺口闭合速度和削峰能力。</w:t>
+        <w:t xml:space="preserve">8.0%，突破</w:t>
+      </w:r>
+      <w:r>
+        <w:t xml:space="preserve"> 130 </w:t>
+      </w:r>
+      <w:r>
+        <w:rPr>
+          <w:rFonts w:hint="eastAsia"/>
+        </w:rPr>
+        <w:t xml:space="preserve">美元/桶的概率约为</w:t>
+      </w:r>
+      <w:r>
+        <w:t xml:space="preserve"> </w:t>
+      </w:r>
+      <w:r>
+        <w:rPr>
+          <w:rFonts w:hint="eastAsia"/>
+        </w:rPr>
+        <w:t xml:space="preserve">0.5%，说明长期风险主要来自多因素同时恶化下的尾部组合。</w:t>
       </w:r>
     </w:p>
     <w:p>
@@ -857,7 +893,7 @@
         <w:rPr>
           <w:rFonts w:hint="eastAsia"/>
         </w:rPr>
-        <w:t xml:space="preserve">天三情景预测模型，并通过敏感性分析识别影响长期价格平衡点和二次跳涨风险的关键变量。</w:t>
+        <w:t xml:space="preserve">天三情景预测模型，并通过敏感性分析和蒙特卡洛情景树识别影响长期价格平衡点和二次跳涨风险的关键变量。</w:t>
       </w:r>
     </w:p>
     <w:p>
@@ -946,7 +982,7 @@
         <w:rPr>
           <w:rFonts w:hint="eastAsia"/>
         </w:rPr>
-        <w:t xml:space="preserve">天尺度上的条件外推，消融实验和敏感性分析用于证明主模型中的因素是否值得保留。因素纳入原则见表</w:t>
+        <w:t xml:space="preserve">天尺度上的条件外推，消融实验、敏感性分析和蒙特卡洛情景树用于证明主模型中的因素是否值得保留，并刻画多因素同时恶化时的尾部风险。因素纳入原则见表</w:t>
       </w:r>
       <w:r>
         <w:t xml:space="preserve"> </w:t>
@@ -1743,6 +1779,425 @@
         </w:tc>
       </w:tr>
     </w:tbl>
+    <w:p>
+      <w:pPr>
+        <w:pStyle w:val="BodyText"/>
+      </w:pPr>
+      <w:r>
+        <w:rPr>
+          <w:rFonts w:hint="eastAsia"/>
+        </w:rPr>
+        <w:t xml:space="preserve">为增强长期情景预测的外部约束，本文进一步补充</w:t>
+      </w:r>
+      <w:r>
+        <w:t xml:space="preserve"> EIA </w:t>
+      </w:r>
+      <w:r>
+        <w:rPr>
+          <w:rFonts w:hint="eastAsia"/>
+        </w:rPr>
+        <w:t xml:space="preserve">官方周度数据，包括美国</w:t>
+      </w:r>
+      <w:r>
+        <w:t xml:space="preserve"> SPR </w:t>
+      </w:r>
+      <w:r>
+        <w:rPr>
+          <w:rFonts w:hint="eastAsia"/>
+        </w:rPr>
+        <w:t xml:space="preserve">原油库存、美国商业原油库存和美国原油产量。需要说明的是，这些数据均为美国口径，不能直接等同全球战略储备、全球商业库存或全球供给恢复能力；本文将其用于审计长期模型的数量级和叙述边界，而不是粗暴替换赛题给定的全球冲击参数。</w:t>
+      </w:r>
+    </w:p>
+    <w:p>
+      <w:pPr>
+        <w:pStyle w:val="TableCaption"/>
+      </w:pPr>
+      <w:r>
+        <w:t xml:space="preserve">EIA </w:t>
+      </w:r>
+      <w:r>
+        <w:rPr>
+          <w:rFonts w:hint="eastAsia"/>
+        </w:rPr>
+        <w:t xml:space="preserve">官方外生数据摘要</w:t>
+      </w:r>
+    </w:p>
+    <w:tbl>
+      <w:tblPr>
+        <w:tblStyle w:val="Table"/>
+        <w:tblW w:type="auto" w:w="0"/>
+        <w:tblLook w:firstRow="1" w:lastRow="0" w:firstColumn="0" w:lastColumn="0" w:noHBand="0" w:noVBand="0" w:val="0020"/>
+        <w:tblCaption w:val="EIA 官方外生数据摘要"/>
+      </w:tblPr>
+      <w:tblGrid>
+        <w:gridCol w:w="1584"/>
+        <w:gridCol w:w="1584"/>
+        <w:gridCol w:w="1584"/>
+        <w:gridCol w:w="1584"/>
+        <w:gridCol w:w="1584"/>
+      </w:tblGrid>
+      <w:tr>
+        <w:trPr>
+          <w:tblHeader w:val="on"/>
+        </w:trPr>
+        <w:tc>
+          <w:tcPr/>
+          <w:p>
+            <w:pPr>
+              <w:pStyle w:val="Compact"/>
+              <w:jc w:val="left"/>
+            </w:pPr>
+            <w:r>
+              <w:rPr>
+                <w:rFonts w:hint="eastAsia"/>
+              </w:rPr>
+              <w:t xml:space="preserve">指标</w:t>
+            </w:r>
+          </w:p>
+        </w:tc>
+        <w:tc>
+          <w:tcPr/>
+          <w:p>
+            <w:pPr>
+              <w:pStyle w:val="Compact"/>
+              <w:jc w:val="right"/>
+            </w:pPr>
+            <w:r>
+              <w:rPr>
+                <w:rFonts w:hint="eastAsia"/>
+              </w:rPr>
+              <w:t xml:space="preserve">冲突前数值</w:t>
+            </w:r>
+          </w:p>
+        </w:tc>
+        <w:tc>
+          <w:tcPr/>
+          <w:p>
+            <w:pPr>
+              <w:pStyle w:val="Compact"/>
+              <w:jc w:val="right"/>
+            </w:pPr>
+            <w:r>
+              <w:rPr>
+                <w:rFonts w:hint="eastAsia"/>
+              </w:rPr>
+              <w:t xml:space="preserve">窗口末数值</w:t>
+            </w:r>
+          </w:p>
+        </w:tc>
+        <w:tc>
+          <w:tcPr/>
+          <w:p>
+            <w:pPr>
+              <w:pStyle w:val="Compact"/>
+              <w:jc w:val="right"/>
+            </w:pPr>
+            <w:r>
+              <w:rPr>
+                <w:rFonts w:hint="eastAsia"/>
+              </w:rPr>
+              <w:t xml:space="preserve">窗口变化</w:t>
+            </w:r>
+          </w:p>
+        </w:tc>
+        <w:tc>
+          <w:tcPr/>
+          <w:p>
+            <w:pPr>
+              <w:pStyle w:val="Compact"/>
+              <w:jc w:val="right"/>
+            </w:pPr>
+            <w:r>
+              <w:rPr>
+                <w:rFonts w:hint="eastAsia"/>
+              </w:rPr>
+              <w:t xml:space="preserve">日均变化</w:t>
+            </w:r>
+          </w:p>
+        </w:tc>
+      </w:tr>
+      <w:tr>
+        <w:tc>
+          <w:tcPr/>
+          <w:p>
+            <w:pPr>
+              <w:pStyle w:val="Compact"/>
+              <w:jc w:val="left"/>
+            </w:pPr>
+            <w:r>
+              <w:rPr>
+                <w:rFonts w:hint="eastAsia"/>
+              </w:rPr>
+              <w:t xml:space="preserve">美国</w:t>
+            </w:r>
+            <w:r>
+              <w:t xml:space="preserve"> SPR </w:t>
+            </w:r>
+            <w:r>
+              <w:rPr>
+                <w:rFonts w:hint="eastAsia"/>
+              </w:rPr>
+              <w:t xml:space="preserve">库存</w:t>
+            </w:r>
+          </w:p>
+        </w:tc>
+        <w:tc>
+          <w:tcPr/>
+          <w:p>
+            <w:pPr>
+              <w:pStyle w:val="Compact"/>
+              <w:jc w:val="right"/>
+            </w:pPr>
+            <w:r>
+              <w:t xml:space="preserve">415441</w:t>
+            </w:r>
+          </w:p>
+        </w:tc>
+        <w:tc>
+          <w:tcPr/>
+          <w:p>
+            <w:pPr>
+              <w:pStyle w:val="Compact"/>
+              <w:jc w:val="right"/>
+            </w:pPr>
+            <w:r>
+              <w:t xml:space="preserve">392700</w:t>
+            </w:r>
+          </w:p>
+        </w:tc>
+        <w:tc>
+          <w:tcPr/>
+          <w:p>
+            <w:pPr>
+              <w:pStyle w:val="Compact"/>
+              <w:jc w:val="right"/>
+            </w:pPr>
+            <w:r>
+              <w:t xml:space="preserve">-2274.1 </w:t>
+            </w:r>
+            <w:r>
+              <w:rPr>
+                <w:rFonts w:hint="eastAsia"/>
+              </w:rPr>
+              <w:t xml:space="preserve">万桶</w:t>
+            </w:r>
+          </w:p>
+        </w:tc>
+        <w:tc>
+          <w:tcPr/>
+          <w:p>
+            <w:pPr>
+              <w:pStyle w:val="Compact"/>
+              <w:jc w:val="right"/>
+            </w:pPr>
+            <w:r>
+              <w:t xml:space="preserve">-36.10 </w:t>
+            </w:r>
+            <w:r>
+              <w:rPr>
+                <w:rFonts w:hint="eastAsia"/>
+              </w:rPr>
+              <w:t xml:space="preserve">万桶/日</w:t>
+            </w:r>
+          </w:p>
+        </w:tc>
+      </w:tr>
+      <w:tr>
+        <w:tc>
+          <w:tcPr/>
+          <w:p>
+            <w:pPr>
+              <w:pStyle w:val="Compact"/>
+              <w:jc w:val="left"/>
+            </w:pPr>
+            <w:r>
+              <w:rPr>
+                <w:rFonts w:hint="eastAsia"/>
+              </w:rPr>
+              <w:t xml:space="preserve">美国商业库存</w:t>
+            </w:r>
+          </w:p>
+        </w:tc>
+        <w:tc>
+          <w:tcPr/>
+          <w:p>
+            <w:pPr>
+              <w:pStyle w:val="Compact"/>
+              <w:jc w:val="right"/>
+            </w:pPr>
+            <w:r>
+              <w:t xml:space="preserve">439279</w:t>
+            </w:r>
+          </w:p>
+        </w:tc>
+        <w:tc>
+          <w:tcPr/>
+          <w:p>
+            <w:pPr>
+              <w:pStyle w:val="Compact"/>
+              <w:jc w:val="right"/>
+            </w:pPr>
+            <w:r>
+              <w:t xml:space="preserve">457182</w:t>
+            </w:r>
+          </w:p>
+        </w:tc>
+        <w:tc>
+          <w:tcPr/>
+          <w:p>
+            <w:pPr>
+              <w:pStyle w:val="Compact"/>
+              <w:jc w:val="right"/>
+            </w:pPr>
+            <w:r>
+              <w:t xml:space="preserve">1790.3 </w:t>
+            </w:r>
+            <w:r>
+              <w:rPr>
+                <w:rFonts w:hint="eastAsia"/>
+              </w:rPr>
+              <w:t xml:space="preserve">万桶</w:t>
+            </w:r>
+          </w:p>
+        </w:tc>
+        <w:tc>
+          <w:tcPr/>
+          <w:p>
+            <w:pPr>
+              <w:pStyle w:val="Compact"/>
+              <w:jc w:val="right"/>
+            </w:pPr>
+            <w:r>
+              <w:t xml:space="preserve">28.42 </w:t>
+            </w:r>
+            <w:r>
+              <w:rPr>
+                <w:rFonts w:hint="eastAsia"/>
+              </w:rPr>
+              <w:t xml:space="preserve">万桶/日</w:t>
+            </w:r>
+          </w:p>
+        </w:tc>
+      </w:tr>
+      <w:tr>
+        <w:tc>
+          <w:tcPr/>
+          <w:p>
+            <w:pPr>
+              <w:pStyle w:val="Compact"/>
+              <w:jc w:val="left"/>
+            </w:pPr>
+            <w:r>
+              <w:rPr>
+                <w:rFonts w:hint="eastAsia"/>
+              </w:rPr>
+              <w:t xml:space="preserve">美国原油产量</w:t>
+            </w:r>
+          </w:p>
+        </w:tc>
+        <w:tc>
+          <w:tcPr/>
+          <w:p>
+            <w:pPr>
+              <w:pStyle w:val="Compact"/>
+              <w:jc w:val="right"/>
+            </w:pPr>
+            <w:r>
+              <w:t xml:space="preserve">13696</w:t>
+            </w:r>
+          </w:p>
+        </w:tc>
+        <w:tc>
+          <w:tcPr/>
+          <w:p>
+            <w:pPr>
+              <w:pStyle w:val="Compact"/>
+              <w:jc w:val="right"/>
+            </w:pPr>
+            <w:r>
+              <w:t xml:space="preserve">13573</w:t>
+            </w:r>
+          </w:p>
+        </w:tc>
+        <w:tc>
+          <w:tcPr/>
+          <w:p>
+            <w:pPr>
+              <w:pStyle w:val="Compact"/>
+              <w:jc w:val="right"/>
+            </w:pPr>
+            <w:r>
+              <w:t xml:space="preserve">-12.3 </w:t>
+            </w:r>
+            <w:r>
+              <w:rPr>
+                <w:rFonts w:hint="eastAsia"/>
+              </w:rPr>
+              <w:t xml:space="preserve">万桶/日</w:t>
+            </w:r>
+          </w:p>
+        </w:tc>
+        <w:tc>
+          <w:tcPr/>
+          <w:p>
+            <w:pPr>
+              <w:pStyle w:val="Compact"/>
+              <w:jc w:val="right"/>
+            </w:pPr>
+            <w:r>
+              <w:t xml:space="preserve">-0.20 </w:t>
+            </w:r>
+            <w:r>
+              <w:rPr>
+                <w:rFonts w:hint="eastAsia"/>
+              </w:rPr>
+              <w:t xml:space="preserve">万桶/日</w:t>
+            </w:r>
+          </w:p>
+        </w:tc>
+      </w:tr>
+    </w:tbl>
+    <w:p>
+      <w:pPr>
+        <w:pStyle w:val="BodyText"/>
+      </w:pPr>
+      <w:r>
+        <w:rPr>
+          <w:rFonts w:hint="eastAsia"/>
+        </w:rPr>
+        <w:t xml:space="preserve">该外部审计带来三个约束。第一，美国</w:t>
+      </w:r>
+      <w:r>
+        <w:t xml:space="preserve"> SPR </w:t>
+      </w:r>
+      <w:r>
+        <w:rPr>
+          <w:rFonts w:hint="eastAsia"/>
+        </w:rPr>
+        <w:t xml:space="preserve">释放强度明显低于赛题给定的国际协调释放上限，因此模型中的</w:t>
+      </w:r>
+      <w:r>
+        <w:t xml:space="preserve"> SPR </w:t>
+      </w:r>
+      <w:r>
+        <w:rPr>
+          <w:rFonts w:hint="eastAsia"/>
+        </w:rPr>
+        <w:t xml:space="preserve">参数应解释为全球或多国协调缓冲能力，而非美国单独释放量。第二，美国商业库存并未在冲突窗口内快速耗尽，说明库存缓冲不能被写成机械消耗项。第三，美国原油产量短期变化较小，支持</w:t>
+      </w:r>
+      <w:r>
+        <w:rPr>
+          <w:rFonts w:hint="eastAsia"/>
+        </w:rPr>
+        <w:t xml:space="preserve">“非海湾供给恢复较慢，难以单独抵消封锁缺口”</w:t>
+      </w:r>
+      <w:r>
+        <w:rPr>
+          <w:rFonts w:hint="eastAsia"/>
+        </w:rPr>
+        <w:t xml:space="preserve">的长期设定。</w:t>
+      </w:r>
+    </w:p>
     <w:p>
       <w:pPr>
         <w:pStyle w:val="CaptionedFigure"/>
@@ -11070,6 +11525,26 @@
         <w:rPr>
           <w:rFonts w:hint="eastAsia"/>
         </w:rPr>
+        <w:t xml:space="preserve">长期三情景图中的单条曲线是条件中心路径，而不是对未来每日收盘价的精确点预测。其形状较平滑，是因为模型刻画的是供应恢复、SPR</w:t>
+      </w:r>
+      <w:r>
+        <w:t xml:space="preserve"> </w:t>
+      </w:r>
+      <w:r>
+        <w:rPr>
+          <w:rFonts w:hint="eastAsia"/>
+        </w:rPr>
+        <w:t xml:space="preserve">收缩、需求弹性调整和风险溢价衰减等慢变量；真实市场中的新闻冲击、风险偏好变化和短期波动会使实际价格围绕中心路径震荡。因此，本文不以中性线是否逐日命中未来价格作为长期模型质量标准，而以机制合理性、官方外生数据审计、敏感性分析和蒙特卡洛概率区间共同评价长期预测可信度。</w:t>
+      </w:r>
+    </w:p>
+    <w:p>
+      <w:pPr>
+        <w:pStyle w:val="BodyText"/>
+      </w:pPr>
+      <w:r>
+        <w:rPr>
+          <w:rFonts w:hint="eastAsia"/>
+        </w:rPr>
         <w:t xml:space="preserve">长期模型从短期动态递推模型延伸而来，但在四个方面做了时间尺度调整：</w:t>
       </w:r>
     </w:p>
@@ -13614,7 +14089,7 @@
     </w:p>
     <w:bookmarkEnd w:id="83"/>
     <w:bookmarkEnd w:id="84"/>
-    <w:bookmarkStart w:id="90" w:name="敏感性分析"/>
+    <w:bookmarkStart w:id="97" w:name="敏感性分析"/>
     <w:p>
       <w:pPr>
         <w:pStyle w:val="Heading1"/>
@@ -14827,8 +15302,728 @@
       </w:r>
     </w:p>
     <w:bookmarkEnd w:id="89"/>
-    <w:bookmarkEnd w:id="90"/>
-    <w:bookmarkStart w:id="94" w:name="模型评价"/>
+    <w:bookmarkStart w:id="96" w:name="蒙特卡洛情景树"/>
+    <w:p>
+      <w:pPr>
+        <w:pStyle w:val="Heading2"/>
+      </w:pPr>
+      <w:r>
+        <w:rPr>
+          <w:rFonts w:hint="eastAsia"/>
+        </w:rPr>
+        <w:t xml:space="preserve">蒙特卡洛情景树</w:t>
+      </w:r>
+    </w:p>
+    <w:p>
+      <w:pPr>
+        <w:pStyle w:val="FirstParagraph"/>
+      </w:pPr>
+      <w:r>
+        <w:rPr>
+          <w:rFonts w:hint="eastAsia"/>
+        </w:rPr>
+        <w:t xml:space="preserve">单因素敏感性分析可以说明某个参数单独变化时的边际影响，但封锁长期化的真实风险往往来自多个因素同时恶化：供应中断偏大、SPR</w:t>
+      </w:r>
+      <w:r>
+        <w:t xml:space="preserve"> </w:t>
+      </w:r>
+      <w:r>
+        <w:rPr>
+          <w:rFonts w:hint="eastAsia"/>
+        </w:rPr>
+        <w:t xml:space="preserve">释放不足、绕道运输恢复慢、长期需求弹性偏低、制度风险溢价偏高等因素可能共同出现。因此，本文进一步建立蒙特卡洛情景树，在赛题边界和阶段</w:t>
+      </w:r>
+      <w:r>
+        <w:t xml:space="preserve"> 6 </w:t>
+      </w:r>
+      <w:r>
+        <w:rPr>
+          <w:rFonts w:hint="eastAsia"/>
+        </w:rPr>
+        <w:t xml:space="preserve">扰动范围内对关键参数进行</w:t>
+      </w:r>
+      <w:r>
+        <w:t xml:space="preserve"> 2000 </w:t>
+      </w:r>
+      <w:r>
+        <w:rPr>
+          <w:rFonts w:hint="eastAsia"/>
+        </w:rPr>
+        <w:t xml:space="preserve">次联合抽样。</w:t>
+      </w:r>
+    </w:p>
+    <w:p>
+      <w:pPr>
+        <w:pStyle w:val="BodyText"/>
+      </w:pPr>
+      <w:r>
+        <w:rPr>
+          <w:rFonts w:hint="eastAsia"/>
+        </w:rPr>
+        <w:t xml:space="preserve">抽样设计采用一个综合压力指数</w:t>
+      </w:r>
+      <w:r>
+        <w:t xml:space="preserve"> </w:t>
+      </w:r>
+      <m:oMath>
+        <m:r>
+          <m:t>z</m:t>
+        </m:r>
+        <m:r>
+          <m:rPr>
+            <m:sty m:val="p"/>
+          </m:rPr>
+          <m:t>∈</m:t>
+        </m:r>
+        <m:r>
+          <m:rPr>
+            <m:sty m:val="p"/>
+          </m:rPr>
+          <m:t>[</m:t>
+        </m:r>
+        <m:r>
+          <m:t>0</m:t>
+        </m:r>
+        <m:r>
+          <m:rPr>
+            <m:sty m:val="p"/>
+          </m:rPr>
+          <m:t>,</m:t>
+        </m:r>
+        <m:r>
+          <m:t>1</m:t>
+        </m:r>
+        <m:r>
+          <m:rPr>
+            <m:sty m:val="p"/>
+          </m:rPr>
+          <m:t>]</m:t>
+        </m:r>
+      </m:oMath>
+      <w:r>
+        <w:t xml:space="preserve"> </w:t>
+      </w:r>
+      <w:r>
+        <w:rPr>
+          <w:rFonts w:hint="eastAsia"/>
+        </w:rPr>
+        <w:t xml:space="preserve">表示外部压力状态。随着</w:t>
+      </w:r>
+      <w:r>
+        <w:t xml:space="preserve"> </w:t>
+      </w:r>
+      <m:oMath>
+        <m:r>
+          <m:t>z</m:t>
+        </m:r>
+      </m:oMath>
+      <w:r>
+        <w:t xml:space="preserve"> </w:t>
+      </w:r>
+      <w:r>
+        <w:rPr>
+          <w:rFonts w:hint="eastAsia"/>
+        </w:rPr>
+        <w:t xml:space="preserve">增大，供应中断量、地缘风险权重和制度风险强度上升，而</w:t>
+      </w:r>
+      <w:r>
+        <w:t xml:space="preserve"> SPR </w:t>
+      </w:r>
+      <w:r>
+        <w:rPr>
+          <w:rFonts w:hint="eastAsia"/>
+        </w:rPr>
+        <w:t xml:space="preserve">可用释放量、绕道运输能力、需求调整速度和预期修复强度下降。每次抽样后均调用同一套长期递推模型，得到一条</w:t>
+      </w:r>
+      <w:r>
+        <w:t xml:space="preserve"> 60–180 </w:t>
+      </w:r>
+      <w:r>
+        <w:rPr>
+          <w:rFonts w:hint="eastAsia"/>
+        </w:rPr>
+        <w:t xml:space="preserve">天价格路径。这样做的目的不是生成未来真实价格，而是回答：在合理参数联合扰动下，价格路径大概率落在哪个区间，尾部风险有多大。</w:t>
+      </w:r>
+    </w:p>
+    <w:p>
+      <w:pPr>
+        <w:pStyle w:val="TableCaption"/>
+      </w:pPr>
+      <w:r>
+        <w:rPr>
+          <w:rFonts w:hint="eastAsia"/>
+        </w:rPr>
+        <w:t xml:space="preserve">蒙特卡洛情景树尾部风险结果</w:t>
+      </w:r>
+    </w:p>
+    <w:tbl>
+      <w:tblPr>
+        <w:tblStyle w:val="Table"/>
+        <w:tblW w:type="auto" w:w="0"/>
+        <w:tblLook w:firstRow="1" w:lastRow="0" w:firstColumn="0" w:lastColumn="0" w:noHBand="0" w:noVBand="0" w:val="0020"/>
+        <w:tblCaption w:val="蒙特卡洛情景树尾部风险结果"/>
+      </w:tblPr>
+      <w:tblGrid>
+        <w:gridCol w:w="3960"/>
+        <w:gridCol w:w="3960"/>
+      </w:tblGrid>
+      <w:tr>
+        <w:trPr>
+          <w:tblHeader w:val="on"/>
+        </w:trPr>
+        <w:tc>
+          <w:tcPr/>
+          <w:p>
+            <w:pPr>
+              <w:pStyle w:val="Compact"/>
+              <w:jc w:val="left"/>
+            </w:pPr>
+            <w:r>
+              <w:rPr>
+                <w:rFonts w:hint="eastAsia"/>
+              </w:rPr>
+              <w:t xml:space="preserve">指标</w:t>
+            </w:r>
+          </w:p>
+        </w:tc>
+        <w:tc>
+          <w:tcPr/>
+          <w:p>
+            <w:pPr>
+              <w:pStyle w:val="Compact"/>
+              <w:jc w:val="right"/>
+            </w:pPr>
+            <w:r>
+              <w:rPr>
+                <w:rFonts w:hint="eastAsia"/>
+              </w:rPr>
+              <w:t xml:space="preserve">数值</w:t>
+            </w:r>
+          </w:p>
+        </w:tc>
+      </w:tr>
+      <w:tr>
+        <w:tc>
+          <w:tcPr/>
+          <w:p>
+            <w:pPr>
+              <w:pStyle w:val="Compact"/>
+              <w:jc w:val="left"/>
+            </w:pPr>
+            <w:r>
+              <w:rPr>
+                <w:rFonts w:hint="eastAsia"/>
+              </w:rPr>
+              <w:t xml:space="preserve">外推期最高价突破</w:t>
+            </w:r>
+            <w:r>
+              <w:t xml:space="preserve"> 120 </w:t>
+            </w:r>
+            <w:r>
+              <w:rPr>
+                <w:rFonts w:hint="eastAsia"/>
+              </w:rPr>
+              <w:t xml:space="preserve">美元/桶概率</w:t>
+            </w:r>
+          </w:p>
+        </w:tc>
+        <w:tc>
+          <w:tcPr/>
+          <w:p>
+            <w:pPr>
+              <w:pStyle w:val="Compact"/>
+              <w:jc w:val="right"/>
+            </w:pPr>
+            <w:r>
+              <w:t xml:space="preserve">8.0%</w:t>
+            </w:r>
+          </w:p>
+        </w:tc>
+      </w:tr>
+      <w:tr>
+        <w:tc>
+          <w:tcPr/>
+          <w:p>
+            <w:pPr>
+              <w:pStyle w:val="Compact"/>
+              <w:jc w:val="left"/>
+            </w:pPr>
+            <w:r>
+              <w:rPr>
+                <w:rFonts w:hint="eastAsia"/>
+              </w:rPr>
+              <w:t xml:space="preserve">外推期最高价突破</w:t>
+            </w:r>
+            <w:r>
+              <w:t xml:space="preserve"> 130 </w:t>
+            </w:r>
+            <w:r>
+              <w:rPr>
+                <w:rFonts w:hint="eastAsia"/>
+              </w:rPr>
+              <w:t xml:space="preserve">美元/桶概率</w:t>
+            </w:r>
+          </w:p>
+        </w:tc>
+        <w:tc>
+          <w:tcPr/>
+          <w:p>
+            <w:pPr>
+              <w:pStyle w:val="Compact"/>
+              <w:jc w:val="right"/>
+            </w:pPr>
+            <w:r>
+              <w:t xml:space="preserve">0.5%</w:t>
+            </w:r>
+          </w:p>
+        </w:tc>
+      </w:tr>
+      <w:tr>
+        <w:tc>
+          <w:tcPr/>
+          <w:p>
+            <w:pPr>
+              <w:pStyle w:val="Compact"/>
+              <w:jc w:val="left"/>
+            </w:pPr>
+            <w:r>
+              <w:rPr>
+                <w:rFonts w:hint="eastAsia"/>
+              </w:rPr>
+              <w:t xml:space="preserve">第</w:t>
+            </w:r>
+            <w:r>
+              <w:t xml:space="preserve"> 180 </w:t>
+            </w:r>
+            <w:r>
+              <w:rPr>
+                <w:rFonts w:hint="eastAsia"/>
+              </w:rPr>
+              <w:t xml:space="preserve">天剩余缺口超过</w:t>
+            </w:r>
+            <w:r>
+              <w:t xml:space="preserve"> 500 </w:t>
+            </w:r>
+            <w:r>
+              <w:rPr>
+                <w:rFonts w:hint="eastAsia"/>
+              </w:rPr>
+              <w:t xml:space="preserve">万桶/日概率</w:t>
+            </w:r>
+          </w:p>
+        </w:tc>
+        <w:tc>
+          <w:tcPr/>
+          <w:p>
+            <w:pPr>
+              <w:pStyle w:val="Compact"/>
+              <w:jc w:val="right"/>
+            </w:pPr>
+            <w:r>
+              <w:t xml:space="preserve">0.0%</w:t>
+            </w:r>
+          </w:p>
+        </w:tc>
+      </w:tr>
+      <w:tr>
+        <w:tc>
+          <w:tcPr/>
+          <w:p>
+            <w:pPr>
+              <w:pStyle w:val="Compact"/>
+              <w:jc w:val="left"/>
+            </w:pPr>
+            <w:r>
+              <w:rPr>
+                <w:rFonts w:hint="eastAsia"/>
+              </w:rPr>
+              <w:t xml:space="preserve">二次跳涨风险为高概率</w:t>
+            </w:r>
+          </w:p>
+        </w:tc>
+        <w:tc>
+          <w:tcPr/>
+          <w:p>
+            <w:pPr>
+              <w:pStyle w:val="Compact"/>
+              <w:jc w:val="right"/>
+            </w:pPr>
+            <w:r>
+              <w:t xml:space="preserve">2.4%</w:t>
+            </w:r>
+          </w:p>
+        </w:tc>
+      </w:tr>
+      <w:tr>
+        <w:tc>
+          <w:tcPr/>
+          <w:p>
+            <w:pPr>
+              <w:pStyle w:val="Compact"/>
+              <w:jc w:val="left"/>
+            </w:pPr>
+            <w:r>
+              <w:rPr>
+                <w:rFonts w:hint="eastAsia"/>
+              </w:rPr>
+              <w:t xml:space="preserve">第</w:t>
+            </w:r>
+            <w:r>
+              <w:t xml:space="preserve"> 180 </w:t>
+            </w:r>
+            <w:r>
+              <w:rPr>
+                <w:rFonts w:hint="eastAsia"/>
+              </w:rPr>
+              <w:t xml:space="preserve">天价格</w:t>
+            </w:r>
+            <w:r>
+              <w:t xml:space="preserve"> P05</w:t>
+            </w:r>
+          </w:p>
+        </w:tc>
+        <w:tc>
+          <w:tcPr/>
+          <w:p>
+            <w:pPr>
+              <w:pStyle w:val="Compact"/>
+              <w:jc w:val="right"/>
+            </w:pPr>
+            <w:r>
+              <w:t xml:space="preserve">91.67</w:t>
+            </w:r>
+          </w:p>
+        </w:tc>
+      </w:tr>
+      <w:tr>
+        <w:tc>
+          <w:tcPr/>
+          <w:p>
+            <w:pPr>
+              <w:pStyle w:val="Compact"/>
+              <w:jc w:val="left"/>
+            </w:pPr>
+            <w:r>
+              <w:rPr>
+                <w:rFonts w:hint="eastAsia"/>
+              </w:rPr>
+              <w:t xml:space="preserve">第</w:t>
+            </w:r>
+            <w:r>
+              <w:t xml:space="preserve"> 180 </w:t>
+            </w:r>
+            <w:r>
+              <w:rPr>
+                <w:rFonts w:hint="eastAsia"/>
+              </w:rPr>
+              <w:t xml:space="preserve">天价格</w:t>
+            </w:r>
+            <w:r>
+              <w:t xml:space="preserve"> P50</w:t>
+            </w:r>
+          </w:p>
+        </w:tc>
+        <w:tc>
+          <w:tcPr/>
+          <w:p>
+            <w:pPr>
+              <w:pStyle w:val="Compact"/>
+              <w:jc w:val="right"/>
+            </w:pPr>
+            <w:r>
+              <w:t xml:space="preserve">98.84</w:t>
+            </w:r>
+          </w:p>
+        </w:tc>
+      </w:tr>
+      <w:tr>
+        <w:tc>
+          <w:tcPr/>
+          <w:p>
+            <w:pPr>
+              <w:pStyle w:val="Compact"/>
+              <w:jc w:val="left"/>
+            </w:pPr>
+            <w:r>
+              <w:rPr>
+                <w:rFonts w:hint="eastAsia"/>
+              </w:rPr>
+              <w:t xml:space="preserve">第</w:t>
+            </w:r>
+            <w:r>
+              <w:t xml:space="preserve"> 180 </w:t>
+            </w:r>
+            <w:r>
+              <w:rPr>
+                <w:rFonts w:hint="eastAsia"/>
+              </w:rPr>
+              <w:t xml:space="preserve">天价格</w:t>
+            </w:r>
+            <w:r>
+              <w:t xml:space="preserve"> P95</w:t>
+            </w:r>
+          </w:p>
+        </w:tc>
+        <w:tc>
+          <w:tcPr/>
+          <w:p>
+            <w:pPr>
+              <w:pStyle w:val="Compact"/>
+              <w:jc w:val="right"/>
+            </w:pPr>
+            <w:r>
+              <w:t xml:space="preserve">108.31</w:t>
+            </w:r>
+          </w:p>
+        </w:tc>
+      </w:tr>
+      <w:tr>
+        <w:tc>
+          <w:tcPr/>
+          <w:p>
+            <w:pPr>
+              <w:pStyle w:val="Compact"/>
+              <w:jc w:val="left"/>
+            </w:pPr>
+            <w:r>
+              <w:rPr>
+                <w:rFonts w:hint="eastAsia"/>
+              </w:rPr>
+              <w:t xml:space="preserve">外推期最高价</w:t>
+            </w:r>
+            <w:r>
+              <w:t xml:space="preserve"> P95</w:t>
+            </w:r>
+          </w:p>
+        </w:tc>
+        <w:tc>
+          <w:tcPr/>
+          <w:p>
+            <w:pPr>
+              <w:pStyle w:val="Compact"/>
+              <w:jc w:val="right"/>
+            </w:pPr>
+            <w:r>
+              <w:t xml:space="preserve">122.37</w:t>
+            </w:r>
+          </w:p>
+        </w:tc>
+      </w:tr>
+    </w:tbl>
+    <w:p>
+      <w:pPr>
+        <w:pStyle w:val="CaptionedFigure"/>
+      </w:pPr>
+      <w:r>
+        <w:drawing>
+          <wp:inline>
+            <wp:extent cx="5013960" cy="2790377"/>
+            <wp:effectExtent b="0" l="0" r="0" t="0"/>
+            <wp:docPr descr="" title="" id="91" name="Picture"/>
+            <a:graphic>
+              <a:graphicData uri="http://schemas.openxmlformats.org/drawingml/2006/picture">
+                <pic:pic>
+                  <pic:nvPicPr>
+                    <pic:cNvPr descr="monte_carlo_price_fan.png" id="92" name="Picture"/>
+                    <pic:cNvPicPr>
+                      <a:picLocks noChangeArrowheads="1" noChangeAspect="1"/>
+                    </pic:cNvPicPr>
+                  </pic:nvPicPr>
+                  <pic:blipFill>
+                    <a:blip r:embed="rId90"/>
+                    <a:stretch>
+                      <a:fillRect/>
+                    </a:stretch>
+                  </pic:blipFill>
+                  <pic:spPr bwMode="auto">
+                    <a:xfrm>
+                      <a:off x="0" y="0"/>
+                      <a:ext cx="5013960" cy="2790377"/>
+                    </a:xfrm>
+                    <a:prstGeom prst="rect">
+                      <a:avLst/>
+                    </a:prstGeom>
+                    <a:noFill/>
+                    <a:ln w="9525">
+                      <a:noFill/>
+                      <a:headEnd/>
+                      <a:tailEnd/>
+                    </a:ln>
+                  </pic:spPr>
+                </pic:pic>
+              </a:graphicData>
+            </a:graphic>
+          </wp:inline>
+        </w:drawing>
+      </w:r>
+    </w:p>
+    <w:p>
+      <w:pPr>
+        <w:pStyle w:val="ImageCaption"/>
+      </w:pPr>
+      <w:r>
+        <w:rPr>
+          <w:rFonts w:hint="eastAsia"/>
+        </w:rPr>
+        <w:t xml:space="preserve">蒙特卡洛情景树价格扇形区间。深色区间为</w:t>
+      </w:r>
+      <w:r>
+        <w:t xml:space="preserve"> </w:t>
+      </w:r>
+      <w:r>
+        <w:rPr>
+          <w:rFonts w:hint="eastAsia"/>
+        </w:rPr>
+        <w:t xml:space="preserve">25%–75%，浅色区间为</w:t>
+      </w:r>
+      <w:r>
+        <w:t xml:space="preserve"> 5%–95%。</w:t>
+      </w:r>
+    </w:p>
+    <w:p>
+      <w:pPr>
+        <w:pStyle w:val="CaptionedFigure"/>
+      </w:pPr>
+      <w:r>
+        <w:drawing>
+          <wp:inline>
+            <wp:extent cx="4160520" cy="2352876"/>
+            <wp:effectExtent b="0" l="0" r="0" t="0"/>
+            <wp:docPr descr="" title="" id="94" name="Picture"/>
+            <a:graphic>
+              <a:graphicData uri="http://schemas.openxmlformats.org/drawingml/2006/picture">
+                <pic:pic>
+                  <pic:nvPicPr>
+                    <pic:cNvPr descr="monte_carlo_tail_risk.png" id="95" name="Picture"/>
+                    <pic:cNvPicPr>
+                      <a:picLocks noChangeArrowheads="1" noChangeAspect="1"/>
+                    </pic:cNvPicPr>
+                  </pic:nvPicPr>
+                  <pic:blipFill>
+                    <a:blip r:embed="rId93"/>
+                    <a:stretch>
+                      <a:fillRect/>
+                    </a:stretch>
+                  </pic:blipFill>
+                  <pic:spPr bwMode="auto">
+                    <a:xfrm>
+                      <a:off x="0" y="0"/>
+                      <a:ext cx="4160520" cy="2352876"/>
+                    </a:xfrm>
+                    <a:prstGeom prst="rect">
+                      <a:avLst/>
+                    </a:prstGeom>
+                    <a:noFill/>
+                    <a:ln w="9525">
+                      <a:noFill/>
+                      <a:headEnd/>
+                      <a:tailEnd/>
+                    </a:ln>
+                  </pic:spPr>
+                </pic:pic>
+              </a:graphicData>
+            </a:graphic>
+          </wp:inline>
+        </w:drawing>
+      </w:r>
+    </w:p>
+    <w:p>
+      <w:pPr>
+        <w:pStyle w:val="ImageCaption"/>
+      </w:pPr>
+      <w:r>
+        <w:rPr>
+          <w:rFonts w:hint="eastAsia"/>
+        </w:rPr>
+        <w:t xml:space="preserve">蒙特卡洛尾部风险概率。</w:t>
+      </w:r>
+    </w:p>
+    <w:p>
+      <w:pPr>
+        <w:pStyle w:val="BodyText"/>
+      </w:pPr>
+      <w:r>
+        <w:rPr>
+          <w:rFonts w:hint="eastAsia"/>
+        </w:rPr>
+        <w:t xml:space="preserve">结果表明，蒙特卡洛路径的第</w:t>
+      </w:r>
+      <w:r>
+        <w:t xml:space="preserve"> 180 </w:t>
+      </w:r>
+      <w:r>
+        <w:rPr>
+          <w:rFonts w:hint="eastAsia"/>
+        </w:rPr>
+        <w:t xml:space="preserve">天中位数价格为</w:t>
+      </w:r>
+      <w:r>
+        <w:t xml:space="preserve"> 98.84 </w:t>
+      </w:r>
+      <w:r>
+        <w:rPr>
+          <w:rFonts w:hint="eastAsia"/>
+        </w:rPr>
+        <w:t xml:space="preserve">美元/桶，与阶段</w:t>
+      </w:r>
+      <w:r>
+        <w:t xml:space="preserve"> 5 </w:t>
+      </w:r>
+      <w:r>
+        <w:rPr>
+          <w:rFonts w:hint="eastAsia"/>
+        </w:rPr>
+        <w:t xml:space="preserve">中性情景的</w:t>
+      </w:r>
+      <w:r>
+        <w:t xml:space="preserve"> 98.61 </w:t>
+      </w:r>
+      <w:r>
+        <w:rPr>
+          <w:rFonts w:hint="eastAsia"/>
+        </w:rPr>
+        <w:t xml:space="preserve">美元/桶高度接近，说明中性路径不是孤立的单点调参结果。与此同时，外推期最高价突破</w:t>
+      </w:r>
+      <w:r>
+        <w:t xml:space="preserve"> 120 </w:t>
+      </w:r>
+      <w:r>
+        <w:rPr>
+          <w:rFonts w:hint="eastAsia"/>
+        </w:rPr>
+        <w:t xml:space="preserve">美元/桶的概率仍有</w:t>
+      </w:r>
+      <w:r>
+        <w:t xml:space="preserve"> </w:t>
+      </w:r>
+      <w:r>
+        <w:rPr>
+          <w:rFonts w:hint="eastAsia"/>
+        </w:rPr>
+        <w:t xml:space="preserve">8.0%，且高压尾部路径中突破</w:t>
+      </w:r>
+      <w:r>
+        <w:t xml:space="preserve"> 120 </w:t>
+      </w:r>
+      <w:r>
+        <w:rPr>
+          <w:rFonts w:hint="eastAsia"/>
+        </w:rPr>
+        <w:t xml:space="preserve">美元/桶的概率达到</w:t>
+      </w:r>
+      <w:r>
+        <w:t xml:space="preserve"> </w:t>
+      </w:r>
+      <w:r>
+        <w:rPr>
+          <w:rFonts w:hint="eastAsia"/>
+        </w:rPr>
+        <w:t xml:space="preserve">36.6%。这说明长期风险的重点不是中性点预测本身，而是多因素联动恶化下的尾部组合风险。</w:t>
+      </w:r>
+    </w:p>
+    <w:bookmarkEnd w:id="96"/>
+    <w:bookmarkEnd w:id="97"/>
+    <w:bookmarkStart w:id="101" w:name="模型评价"/>
     <w:p>
       <w:pPr>
         <w:pStyle w:val="Heading1"/>
@@ -14840,7 +16035,7 @@
         <w:t xml:space="preserve">模型评价</w:t>
       </w:r>
     </w:p>
-    <w:bookmarkStart w:id="91" w:name="优点"/>
+    <w:bookmarkStart w:id="98" w:name="优点"/>
     <w:p>
       <w:pPr>
         <w:pStyle w:val="Heading2"/>
@@ -14944,8 +16139,8 @@
         <w:t xml:space="preserve">CSV；外推阶段明确标注为情景预测，不作为真实观测。</w:t>
       </w:r>
     </w:p>
-    <w:bookmarkEnd w:id="91"/>
-    <w:bookmarkStart w:id="92" w:name="局限性"/>
+    <w:bookmarkEnd w:id="98"/>
+    <w:bookmarkStart w:id="99" w:name="局限性"/>
     <w:p>
       <w:pPr>
         <w:pStyle w:val="Heading2"/>
@@ -14991,7 +16186,34 @@
         <w:rPr>
           <w:rFonts w:hint="eastAsia"/>
         </w:rPr>
-        <w:t xml:space="preserve">地缘风险、不确定性与制度风险、预期修复仍以参数化方式刻画，未引入期权隐含波动率、真实库存周报或新闻情绪等外生数据。</w:t>
+        <w:t xml:space="preserve">本文已补充</w:t>
+      </w:r>
+      <w:r>
+        <w:t xml:space="preserve"> EIA </w:t>
+      </w:r>
+      <w:r>
+        <w:rPr>
+          <w:rFonts w:hint="eastAsia"/>
+        </w:rPr>
+        <w:t xml:space="preserve">美国口径</w:t>
+      </w:r>
+      <w:r>
+        <w:t xml:space="preserve"> </w:t>
+      </w:r>
+      <w:r>
+        <w:rPr>
+          <w:rFonts w:hint="eastAsia"/>
+        </w:rPr>
+        <w:t xml:space="preserve">SPR、商业库存和原油产量周度数据作为外部审计，但尚未自动接入</w:t>
+      </w:r>
+      <w:r>
+        <w:t xml:space="preserve"> IEA/OPEC </w:t>
+      </w:r>
+      <w:r>
+        <w:rPr>
+          <w:rFonts w:hint="eastAsia"/>
+        </w:rPr>
+        <w:t xml:space="preserve">全球口径的完整供需平衡表；地缘风险、不确定性与制度风险、预期修复仍以参数化方式刻画，未引入期权隐含波动率或新闻情绪等高频外生变量。</w:t>
       </w:r>
     </w:p>
     <w:p>
@@ -15005,11 +16227,11 @@
         <w:rPr>
           <w:rFonts w:hint="eastAsia"/>
         </w:rPr>
-        <w:t xml:space="preserve">单因素敏感性不能完全描述参数联动风险，因此悲观情景仍是判断二次跳涨风险的重要补充。</w:t>
-      </w:r>
-    </w:p>
-    <w:bookmarkEnd w:id="92"/>
-    <w:bookmarkStart w:id="93" w:name="改进方向"/>
+        <w:t xml:space="preserve">蒙特卡洛情景树已经刻画了部分参数联动风险，但其联合分布仍来自模型设定而非外部历史频率估计，因此尾部概率应解释为条件概率而非真实市场概率。</w:t>
+      </w:r>
+    </w:p>
+    <w:bookmarkEnd w:id="99"/>
+    <w:bookmarkStart w:id="100" w:name="改进方向"/>
     <w:p>
       <w:pPr>
         <w:pStyle w:val="Heading2"/>
@@ -15029,10 +16251,19 @@
         <w:rPr>
           <w:rFonts w:hint="eastAsia"/>
         </w:rPr>
-        <w:t xml:space="preserve">若后续继续深化，可以从三个方向提高模型外推能力：第一，引入</w:t>
-      </w:r>
-      <w:r>
-        <w:t xml:space="preserve"> EIA、IEA </w:t>
+        <w:t xml:space="preserve">若后续继续深化，可以从三个方向提高模型外推能力：第一，在现有</w:t>
+      </w:r>
+      <w:r>
+        <w:t xml:space="preserve"> EIA </w:t>
+      </w:r>
+      <w:r>
+        <w:rPr>
+          <w:rFonts w:hint="eastAsia"/>
+        </w:rPr>
+        <w:t xml:space="preserve">周度数据审计基础上，继续接入</w:t>
+      </w:r>
+      <w:r>
+        <w:t xml:space="preserve"> IEA </w:t>
       </w:r>
       <w:r>
         <w:rPr>
@@ -15047,12 +16278,12 @@
         <w:rPr>
           <w:rFonts w:hint="eastAsia"/>
         </w:rPr>
-        <w:t xml:space="preserve">的真实库存、产量和运输数据，对长期供给恢复路径进行更客观的外生约束；第二，在严格避免同日反馈循环的前提下，引入滞后新闻情绪、期权隐含波动率或地缘风险指数，增强风险溢价的外生解释力；第三，将单因素敏感性扩展为多参数联合扰动或蒙特卡洛情景树，更充分刻画悲观情景下的尾部风险。</w:t>
-      </w:r>
-    </w:p>
-    <w:bookmarkEnd w:id="93"/>
-    <w:bookmarkEnd w:id="94"/>
-    <w:bookmarkStart w:id="95" w:name="结论"/>
+        <w:t xml:space="preserve">全球口径供需平衡表，对长期供给恢复路径进行更客观的外生约束；第二，在严格避免同日反馈循环的前提下，引入滞后新闻情绪、期权隐含波动率或地缘风险指数，增强风险溢价的外生解释力；第三，将当前蒙特卡洛联合扰动进一步扩展为带状态转移概率的情景树，使冲突缓和、维持和升级三类状态可以随时间动态切换。</w:t>
+      </w:r>
+    </w:p>
+    <w:bookmarkEnd w:id="100"/>
+    <w:bookmarkEnd w:id="101"/>
+    <w:bookmarkStart w:id="102" w:name="结论"/>
     <w:p>
       <w:pPr>
         <w:pStyle w:val="Heading1"/>
@@ -15267,6 +16498,65 @@
     </w:p>
     <w:p>
       <w:pPr>
+        <w:numPr>
+          <w:ilvl w:val="0"/>
+          <w:numId w:val="1007"/>
+        </w:numPr>
+      </w:pPr>
+      <w:r>
+        <w:rPr>
+          <w:rFonts w:hint="eastAsia"/>
+        </w:rPr>
+        <w:t xml:space="preserve">蒙特卡洛情景树显示，第</w:t>
+      </w:r>
+      <w:r>
+        <w:t xml:space="preserve"> 180 </w:t>
+      </w:r>
+      <w:r>
+        <w:rPr>
+          <w:rFonts w:hint="eastAsia"/>
+        </w:rPr>
+        <w:t xml:space="preserve">天价格</w:t>
+      </w:r>
+      <w:r>
+        <w:t xml:space="preserve"> 5%–95% </w:t>
+      </w:r>
+      <w:r>
+        <w:rPr>
+          <w:rFonts w:hint="eastAsia"/>
+        </w:rPr>
+        <w:t xml:space="preserve">区间为</w:t>
+      </w:r>
+      <w:r>
+        <w:t xml:space="preserve"> 91.67–108.31 </w:t>
+      </w:r>
+      <w:r>
+        <w:rPr>
+          <w:rFonts w:hint="eastAsia"/>
+        </w:rPr>
+        <w:t xml:space="preserve">美元/桶，外推期最高价突破</w:t>
+      </w:r>
+      <w:r>
+        <w:t xml:space="preserve"> 120 </w:t>
+      </w:r>
+      <w:r>
+        <w:rPr>
+          <w:rFonts w:hint="eastAsia"/>
+        </w:rPr>
+        <w:t xml:space="preserve">美元/桶的概率约为</w:t>
+      </w:r>
+      <w:r>
+        <w:t xml:space="preserve"> </w:t>
+      </w:r>
+      <w:r>
+        <w:rPr>
+          <w:rFonts w:hint="eastAsia"/>
+        </w:rPr>
+        <w:t xml:space="preserve">8.0%，尾部风险主要来自多因素同时恶化。</w:t>
+      </w:r>
+    </w:p>
+    <w:p>
+      <w:pPr>
         <w:pStyle w:val="FirstParagraph"/>
       </w:pPr>
       <w:r>
@@ -15288,8 +16578,8 @@
         <w:t xml:space="preserve">问题，而应被理解为物理缺口、政策缓冲、库存约束、替代运输和市场风险预期共同作用下的动态系统。</w:t>
       </w:r>
     </w:p>
-    <w:bookmarkEnd w:id="95"/>
-    <w:bookmarkStart w:id="96" w:name="附录支撑材料说明"/>
+    <w:bookmarkEnd w:id="102"/>
+    <w:bookmarkStart w:id="103" w:name="附录支撑材料说明"/>
     <w:p>
       <w:pPr>
         <w:pStyle w:val="Heading1"/>
@@ -15403,8 +16693,8 @@
         <w:t xml:space="preserve">。</w:t>
       </w:r>
     </w:p>
-    <w:bookmarkEnd w:id="96"/>
-    <w:bookmarkStart w:id="98" w:name="参考文献"/>
+    <w:bookmarkEnd w:id="103"/>
+    <w:bookmarkStart w:id="106" w:name="参考文献"/>
     <w:p>
       <w:pPr>
         <w:pStyle w:val="Heading1"/>
@@ -15568,12 +16858,54 @@
         <w:pStyle w:val="BodyText"/>
       </w:pPr>
       <w:r>
+        <w:t xml:space="preserve">Baumeister, C., &amp; Kilian, L. (2012). Real-Time Forecasts of the Real Price of Oil.</w:t>
+      </w:r>
+      <w:r>
+        <w:t xml:space="preserve"> </w:t>
+      </w:r>
+      <w:r>
+        <w:rPr>
+          <w:i/>
+          <w:iCs/>
+        </w:rPr>
+        <w:t xml:space="preserve">Journal of Business &amp; Economic Statistics</w:t>
+      </w:r>
+      <w:r>
+        <w:t xml:space="preserve">, 30(2), 326–336.</w:t>
+      </w:r>
+    </w:p>
+    <w:p>
+      <w:pPr>
+        <w:pStyle w:val="BodyText"/>
+      </w:pPr>
+      <w:r>
+        <w:t xml:space="preserve">Alquist, R., Kilian, L., &amp; Vigfusson, R. J. (2013). Forecasting the Price of Oil.</w:t>
+      </w:r>
+      <w:r>
+        <w:t xml:space="preserve"> </w:t>
+      </w:r>
+      <w:r>
+        <w:rPr>
+          <w:i/>
+          <w:iCs/>
+        </w:rPr>
+        <w:t xml:space="preserve">Handbook of Economic Forecasting</w:t>
+      </w:r>
+      <w:r>
+        <w:t xml:space="preserve">, 2, 427–507.</w:t>
+      </w:r>
+    </w:p>
+    <w:p>
+      <w:pPr>
+        <w:pStyle w:val="BodyText"/>
+      </w:pPr>
+      <w:r>
         <w:t xml:space="preserve">U.S. Energy Information Administration. World Oil Transit Chokepoints.</w:t>
       </w:r>
       <w:r>
         <w:t xml:space="preserve"> </w:t>
       </w:r>
-      <w:hyperlink r:id="rId97">
+      <w:hyperlink r:id="rId104">
         <w:r>
           <w:rPr>
             <w:rStyle w:val="Hyperlink"/>
@@ -15585,7 +16917,29 @@
         <w:t xml:space="preserve">.</w:t>
       </w:r>
     </w:p>
-    <w:bookmarkEnd w:id="98"/>
+    <w:p>
+      <w:pPr>
+        <w:pStyle w:val="BodyText"/>
+      </w:pPr>
+      <w:r>
+        <w:t xml:space="preserve">U.S. Energy Information Administration. Weekly U.S. Ending Stocks of Crude Oil in SPR, Weekly U.S. Ending Stocks excluding SPR of Crude Oil, and Weekly U.S. Field Production of Crude Oil.</w:t>
+      </w:r>
+      <w:r>
+        <w:t xml:space="preserve"> </w:t>
+      </w:r>
+      <w:hyperlink r:id="rId105">
+        <w:r>
+          <w:rPr>
+            <w:rStyle w:val="Hyperlink"/>
+          </w:rPr>
+          <w:t xml:space="preserve">EIA petroleum weekly data</w:t>
+        </w:r>
+      </w:hyperlink>
+      <w:r>
+        <w:t xml:space="preserve">.</w:t>
+      </w:r>
+    </w:p>
+    <w:bookmarkEnd w:id="106"/>
     <w:sectPr>
       <w:footnotePr>
         <w:numRestart w:val="eachSect"/>

</xml_diff>

<commit_message>
Add lagged geopolitical risk audit
</commit_message>
<xml_diff>
--- a/output/final/总论文.docx
+++ b/output/final/总论文.docx
@@ -421,7 +421,52 @@
         <w:rPr>
           <w:rFonts w:hint="eastAsia"/>
         </w:rPr>
-        <w:t xml:space="preserve">0.5%，说明长期风险主要来自多因素同时恶化下的尾部组合。</w:t>
+        <w:t xml:space="preserve">0.5%。此外，Caldara-Iacoviello</w:t>
+      </w:r>
+      <w:r>
+        <w:t xml:space="preserve"> GPR </w:t>
+      </w:r>
+      <w:r>
+        <w:rPr>
+          <w:rFonts w:hint="eastAsia"/>
+        </w:rPr>
+        <w:t xml:space="preserve">指数显示</w:t>
+      </w:r>
+      <w:r>
+        <w:t xml:space="preserve"> 2026 </w:t>
+      </w:r>
+      <w:r>
+        <w:rPr>
+          <w:rFonts w:hint="eastAsia"/>
+        </w:rPr>
+        <w:t xml:space="preserve">年</w:t>
+      </w:r>
+      <w:r>
+        <w:t xml:space="preserve"> 3 </w:t>
+      </w:r>
+      <w:r>
+        <w:rPr>
+          <w:rFonts w:hint="eastAsia"/>
+        </w:rPr>
+        <w:t xml:space="preserve">月和</w:t>
+      </w:r>
+      <w:r>
+        <w:t xml:space="preserve"> 4 </w:t>
+      </w:r>
+      <w:r>
+        <w:rPr>
+          <w:rFonts w:hint="eastAsia"/>
+        </w:rPr>
+        <w:t xml:space="preserve">月地缘风险处于历史高分位，但滞后检验表明其不宜作为同月拟合输入。本文据此将</w:t>
+      </w:r>
+      <w:r>
+        <w:t xml:space="preserve"> GPR </w:t>
+      </w:r>
+      <w:r>
+        <w:rPr>
+          <w:rFonts w:hint="eastAsia"/>
+        </w:rPr>
+        <w:t xml:space="preserve">定位为风险溢价的外部审计证据，而非短期点预测因子。</w:t>
       </w:r>
     </w:p>
     <w:p>
@@ -893,7 +938,7 @@
         <w:rPr>
           <w:rFonts w:hint="eastAsia"/>
         </w:rPr>
-        <w:t xml:space="preserve">天三情景预测模型，并通过敏感性分析和蒙特卡洛情景树识别影响长期价格平衡点和二次跳涨风险的关键变量。</w:t>
+        <w:t xml:space="preserve">天三情景预测模型，并通过敏感性分析、蒙特卡洛情景树和滞后地缘风险指数审计识别影响长期价格平衡点和二次跳涨风险的关键变量。</w:t>
       </w:r>
     </w:p>
     <w:p>
@@ -2196,6 +2241,255 @@
           <w:rFonts w:hint="eastAsia"/>
         </w:rPr>
         <w:t xml:space="preserve">的长期设定。</w:t>
+      </w:r>
+    </w:p>
+    <w:p>
+      <w:pPr>
+        <w:pStyle w:val="BodyText"/>
+      </w:pPr>
+      <w:r>
+        <w:rPr>
+          <w:rFonts w:hint="eastAsia"/>
+        </w:rPr>
+        <w:t xml:space="preserve">为审计地缘风险溢价是否具有外部事实基础，本文进一步接入</w:t>
+      </w:r>
+      <w:r>
+        <w:t xml:space="preserve"> Caldara-Iacoviello </w:t>
+      </w:r>
+      <w:r>
+        <w:rPr>
+          <w:rFonts w:hint="eastAsia"/>
+        </w:rPr>
+        <w:t xml:space="preserve">官方</w:t>
+      </w:r>
+      <w:r>
+        <w:t xml:space="preserve"> GPR </w:t>
+      </w:r>
+      <w:r>
+        <w:rPr>
+          <w:rFonts w:hint="eastAsia"/>
+        </w:rPr>
+        <w:t xml:space="preserve">月度指数。GPR</w:t>
+      </w:r>
+      <w:r>
+        <w:t xml:space="preserve"> </w:t>
+      </w:r>
+      <w:r>
+        <w:rPr>
+          <w:rFonts w:hint="eastAsia"/>
+        </w:rPr>
+        <w:t xml:space="preserve">指数由新闻文本构造，因此不能直接使用同月</w:t>
+      </w:r>
+      <w:r>
+        <w:t xml:space="preserve"> GPR </w:t>
+      </w:r>
+      <w:r>
+        <w:rPr>
+          <w:rFonts w:hint="eastAsia"/>
+        </w:rPr>
+        <w:t xml:space="preserve">去解释同月油价，否则会产生</w:t>
+      </w:r>
+      <w:r>
+        <w:rPr>
+          <w:rFonts w:hint="eastAsia"/>
+        </w:rPr>
+        <w:t xml:space="preserve">“油价上涨引发新闻恐慌，新闻恐慌再解释油价”</w:t>
+      </w:r>
+      <w:r>
+        <w:rPr>
+          <w:rFonts w:hint="eastAsia"/>
+        </w:rPr>
+        <w:t xml:space="preserve">的内生性循环。本文只将其作为外部审计变量，并在统计关系中使用滞后一期口径。</w:t>
+      </w:r>
+    </w:p>
+    <w:p>
+      <w:pPr>
+        <w:pStyle w:val="BodyText"/>
+      </w:pPr>
+      <w:r>
+        <w:rPr>
+          <w:rFonts w:hint="eastAsia"/>
+        </w:rPr>
+        <w:t xml:space="preserve">阶段</w:t>
+      </w:r>
+      <w:r>
+        <w:t xml:space="preserve"> 9 </w:t>
+      </w:r>
+      <w:r>
+        <w:rPr>
+          <w:rFonts w:hint="eastAsia"/>
+        </w:rPr>
+        <w:t xml:space="preserve">审计显示，2026</w:t>
+      </w:r>
+      <w:r>
+        <w:t xml:space="preserve"> </w:t>
+      </w:r>
+      <w:r>
+        <w:rPr>
+          <w:rFonts w:hint="eastAsia"/>
+        </w:rPr>
+        <w:t xml:space="preserve">年</w:t>
+      </w:r>
+      <w:r>
+        <w:t xml:space="preserve"> 3 </w:t>
+      </w:r>
+      <w:r>
+        <w:rPr>
+          <w:rFonts w:hint="eastAsia"/>
+        </w:rPr>
+        <w:t xml:space="preserve">月</w:t>
+      </w:r>
+      <w:r>
+        <w:t xml:space="preserve"> GPR </w:t>
+      </w:r>
+      <w:r>
+        <w:rPr>
+          <w:rFonts w:hint="eastAsia"/>
+        </w:rPr>
+        <w:t xml:space="preserve">为</w:t>
+      </w:r>
+      <w:r>
+        <w:t xml:space="preserve"> </w:t>
+      </w:r>
+      <w:r>
+        <w:rPr>
+          <w:rFonts w:hint="eastAsia"/>
+        </w:rPr>
+        <w:t xml:space="preserve">326.99，位于</w:t>
+      </w:r>
+      <w:r>
+        <w:t xml:space="preserve"> 1985–2025 </w:t>
+      </w:r>
+      <w:r>
+        <w:rPr>
+          <w:rFonts w:hint="eastAsia"/>
+        </w:rPr>
+        <w:t xml:space="preserve">历史样本约</w:t>
+      </w:r>
+      <w:r>
+        <w:t xml:space="preserve"> 98.98% </w:t>
+      </w:r>
+      <w:r>
+        <w:rPr>
+          <w:rFonts w:hint="eastAsia"/>
+        </w:rPr>
+        <w:t xml:space="preserve">分位；2026</w:t>
+      </w:r>
+      <w:r>
+        <w:t xml:space="preserve"> </w:t>
+      </w:r>
+      <w:r>
+        <w:rPr>
+          <w:rFonts w:hint="eastAsia"/>
+        </w:rPr>
+        <w:t xml:space="preserve">年</w:t>
+      </w:r>
+      <w:r>
+        <w:t xml:space="preserve"> 4 </w:t>
+      </w:r>
+      <w:r>
+        <w:rPr>
+          <w:rFonts w:hint="eastAsia"/>
+        </w:rPr>
+        <w:t xml:space="preserve">月</w:t>
+      </w:r>
+      <w:r>
+        <w:t xml:space="preserve"> GPR </w:t>
+      </w:r>
+      <w:r>
+        <w:rPr>
+          <w:rFonts w:hint="eastAsia"/>
+        </w:rPr>
+        <w:t xml:space="preserve">为</w:t>
+      </w:r>
+      <w:r>
+        <w:t xml:space="preserve"> </w:t>
+      </w:r>
+      <w:r>
+        <w:rPr>
+          <w:rFonts w:hint="eastAsia"/>
+        </w:rPr>
+        <w:t xml:space="preserve">230.77，位于约</w:t>
+      </w:r>
+      <w:r>
+        <w:t xml:space="preserve"> 97.76% </w:t>
+      </w:r>
+      <w:r>
+        <w:rPr>
+          <w:rFonts w:hint="eastAsia"/>
+        </w:rPr>
+        <w:t xml:space="preserve">分位。这说明冲突窗口确实对应罕见的地缘风险高位，支持模型中设置风险溢价和恐慌衰减机制。但同时，2017–2026</w:t>
+      </w:r>
+      <w:r>
+        <w:t xml:space="preserve"> </w:t>
+      </w:r>
+      <w:r>
+        <w:rPr>
+          <w:rFonts w:hint="eastAsia"/>
+        </w:rPr>
+        <w:t xml:space="preserve">样本中滞后</w:t>
+      </w:r>
+      <w:r>
+        <w:t xml:space="preserve"> 1 </w:t>
+      </w:r>
+      <w:r>
+        <w:rPr>
+          <w:rFonts w:hint="eastAsia"/>
+        </w:rPr>
+        <w:t xml:space="preserve">月</w:t>
+      </w:r>
+      <w:r>
+        <w:t xml:space="preserve"> GPR </w:t>
+      </w:r>
+      <w:r>
+        <w:rPr>
+          <w:rFonts w:hint="eastAsia"/>
+        </w:rPr>
+        <w:t xml:space="preserve">与本月油价月度收益的相关系数仅为</w:t>
+      </w:r>
+      <w:r>
+        <w:t xml:space="preserve"> </w:t>
+      </w:r>
+      <w:r>
+        <w:rPr>
+          <w:rFonts w:hint="eastAsia"/>
+        </w:rPr>
+        <w:t xml:space="preserve">0.030，线性回归</w:t>
+      </w:r>
+      <w:r>
+        <w:t xml:space="preserve"> </w:t>
+      </w:r>
+      <m:oMath>
+        <m:sSup>
+          <m:e>
+            <m:r>
+              <m:t>R</m:t>
+            </m:r>
+          </m:e>
+          <m:sup>
+            <m:r>
+              <m:t>2</m:t>
+            </m:r>
+          </m:sup>
+        </m:sSup>
+      </m:oMath>
+      <w:r>
+        <w:t xml:space="preserve"> </w:t>
+      </w:r>
+      <w:r>
+        <w:rPr>
+          <w:rFonts w:hint="eastAsia"/>
+        </w:rPr>
+        <w:t xml:space="preserve">约为</w:t>
+      </w:r>
+      <w:r>
+        <w:t xml:space="preserve"> </w:t>
+      </w:r>
+      <w:r>
+        <w:rPr>
+          <w:rFonts w:hint="eastAsia"/>
+        </w:rPr>
+        <w:t xml:space="preserve">0.001，说明它不能被包装成强短期收益预测因子。</w:t>
       </w:r>
     </w:p>
     <w:p>
@@ -14089,7 +14383,7 @@
     </w:p>
     <w:bookmarkEnd w:id="83"/>
     <w:bookmarkEnd w:id="84"/>
-    <w:bookmarkStart w:id="97" w:name="敏感性分析"/>
+    <w:bookmarkStart w:id="104" w:name="敏感性分析"/>
     <w:p>
       <w:pPr>
         <w:pStyle w:val="Heading1"/>
@@ -16022,8 +16316,775 @@
       </w:r>
     </w:p>
     <w:bookmarkEnd w:id="96"/>
-    <w:bookmarkEnd w:id="97"/>
-    <w:bookmarkStart w:id="101" w:name="模型评价"/>
+    <w:bookmarkStart w:id="103" w:name="滞后地缘风险指数审计"/>
+    <w:p>
+      <w:pPr>
+        <w:pStyle w:val="Heading2"/>
+      </w:pPr>
+      <w:r>
+        <w:rPr>
+          <w:rFonts w:hint="eastAsia"/>
+        </w:rPr>
+        <w:t xml:space="preserve">滞后地缘风险指数审计</w:t>
+      </w:r>
+    </w:p>
+    <w:p>
+      <w:pPr>
+        <w:pStyle w:val="FirstParagraph"/>
+      </w:pPr>
+      <w:r>
+        <w:rPr>
+          <w:rFonts w:hint="eastAsia"/>
+        </w:rPr>
+        <w:t xml:space="preserve">综合机制递推模型中包含地缘风险权重和恐慌衰减项。若直接用新闻情绪或风险指数解释同日油价，容易被质疑存在反向因果：油价上涨可能先刺激媒体报道增加，随后模型又用新闻恐慌解释油价上涨。为避免这种内生性循环，本文不把新闻爬虫数据作为短期模型输入，而是使用</w:t>
+      </w:r>
+      <w:r>
+        <w:t xml:space="preserve"> Caldara-Iacoviello GPR </w:t>
+      </w:r>
+      <w:r>
+        <w:rPr>
+          <w:rFonts w:hint="eastAsia"/>
+        </w:rPr>
+        <w:t xml:space="preserve">月度指数做外部审计，并采用滞后一期口径。</w:t>
+      </w:r>
+    </w:p>
+    <w:p>
+      <w:pPr>
+        <w:pStyle w:val="TableCaption"/>
+      </w:pPr>
+      <w:r>
+        <w:rPr>
+          <w:rFonts w:hint="eastAsia"/>
+        </w:rPr>
+        <w:t xml:space="preserve">滞后</w:t>
+      </w:r>
+      <w:r>
+        <w:t xml:space="preserve"> GPR </w:t>
+      </w:r>
+      <w:r>
+        <w:rPr>
+          <w:rFonts w:hint="eastAsia"/>
+        </w:rPr>
+        <w:t xml:space="preserve">风险审计指标</w:t>
+      </w:r>
+    </w:p>
+    <w:tbl>
+      <w:tblPr>
+        <w:tblStyle w:val="Table"/>
+        <w:tblW w:type="auto" w:w="0"/>
+        <w:tblLook w:firstRow="1" w:lastRow="0" w:firstColumn="0" w:lastColumn="0" w:noHBand="0" w:noVBand="0" w:val="0020"/>
+        <w:tblCaption w:val="滞后 GPR 风险审计指标"/>
+      </w:tblPr>
+      <w:tblGrid>
+        <w:gridCol w:w="2640"/>
+        <w:gridCol w:w="2640"/>
+        <w:gridCol w:w="2640"/>
+      </w:tblGrid>
+      <w:tr>
+        <w:trPr>
+          <w:tblHeader w:val="on"/>
+        </w:trPr>
+        <w:tc>
+          <w:tcPr/>
+          <w:p>
+            <w:pPr>
+              <w:pStyle w:val="Compact"/>
+              <w:jc w:val="left"/>
+            </w:pPr>
+            <w:r>
+              <w:rPr>
+                <w:rFonts w:hint="eastAsia"/>
+              </w:rPr>
+              <w:t xml:space="preserve">指标</w:t>
+            </w:r>
+          </w:p>
+        </w:tc>
+        <w:tc>
+          <w:tcPr/>
+          <w:p>
+            <w:pPr>
+              <w:pStyle w:val="Compact"/>
+              <w:jc w:val="right"/>
+            </w:pPr>
+            <w:r>
+              <w:rPr>
+                <w:rFonts w:hint="eastAsia"/>
+              </w:rPr>
+              <w:t xml:space="preserve">数值</w:t>
+            </w:r>
+          </w:p>
+        </w:tc>
+        <w:tc>
+          <w:tcPr/>
+          <w:p>
+            <w:pPr>
+              <w:pStyle w:val="Compact"/>
+              <w:jc w:val="left"/>
+            </w:pPr>
+            <w:r>
+              <w:rPr>
+                <w:rFonts w:hint="eastAsia"/>
+              </w:rPr>
+              <w:t xml:space="preserve">解释</w:t>
+            </w:r>
+          </w:p>
+        </w:tc>
+      </w:tr>
+      <w:tr>
+        <w:tc>
+          <w:tcPr/>
+          <w:p>
+            <w:pPr>
+              <w:pStyle w:val="Compact"/>
+              <w:jc w:val="left"/>
+            </w:pPr>
+            <w:r>
+              <w:rPr>
+                <w:rFonts w:hint="eastAsia"/>
+              </w:rPr>
+              <w:t xml:space="preserve">同期</w:t>
+            </w:r>
+            <w:r>
+              <w:t xml:space="preserve"> GPR </w:t>
+            </w:r>
+            <w:r>
+              <w:rPr>
+                <w:rFonts w:hint="eastAsia"/>
+              </w:rPr>
+              <w:t xml:space="preserve">与本月油价收益相关系数</w:t>
+            </w:r>
+          </w:p>
+        </w:tc>
+        <w:tc>
+          <w:tcPr/>
+          <w:p>
+            <w:pPr>
+              <w:pStyle w:val="Compact"/>
+              <w:jc w:val="right"/>
+            </w:pPr>
+            <w:r>
+              <w:t xml:space="preserve">0.156</w:t>
+            </w:r>
+          </w:p>
+        </w:tc>
+        <w:tc>
+          <w:tcPr/>
+          <w:p>
+            <w:pPr>
+              <w:pStyle w:val="Compact"/>
+              <w:jc w:val="left"/>
+            </w:pPr>
+            <w:r>
+              <w:rPr>
+                <w:rFonts w:hint="eastAsia"/>
+              </w:rPr>
+              <w:t xml:space="preserve">只作为描述性同步关系，不用于预测</w:t>
+            </w:r>
+          </w:p>
+        </w:tc>
+      </w:tr>
+      <w:tr>
+        <w:tc>
+          <w:tcPr/>
+          <w:p>
+            <w:pPr>
+              <w:pStyle w:val="Compact"/>
+              <w:jc w:val="left"/>
+            </w:pPr>
+            <w:r>
+              <w:rPr>
+                <w:rFonts w:hint="eastAsia"/>
+              </w:rPr>
+              <w:t xml:space="preserve">滞后</w:t>
+            </w:r>
+            <w:r>
+              <w:t xml:space="preserve"> 1 </w:t>
+            </w:r>
+            <w:r>
+              <w:rPr>
+                <w:rFonts w:hint="eastAsia"/>
+              </w:rPr>
+              <w:t xml:space="preserve">月</w:t>
+            </w:r>
+            <w:r>
+              <w:t xml:space="preserve"> GPR </w:t>
+            </w:r>
+            <w:r>
+              <w:rPr>
+                <w:rFonts w:hint="eastAsia"/>
+              </w:rPr>
+              <w:t xml:space="preserve">与本月油价收益相关系数</w:t>
+            </w:r>
+          </w:p>
+        </w:tc>
+        <w:tc>
+          <w:tcPr/>
+          <w:p>
+            <w:pPr>
+              <w:pStyle w:val="Compact"/>
+              <w:jc w:val="right"/>
+            </w:pPr>
+            <w:r>
+              <w:t xml:space="preserve">0.030</w:t>
+            </w:r>
+          </w:p>
+        </w:tc>
+        <w:tc>
+          <w:tcPr/>
+          <w:p>
+            <w:pPr>
+              <w:pStyle w:val="Compact"/>
+              <w:jc w:val="left"/>
+            </w:pPr>
+            <w:r>
+              <w:rPr>
+                <w:rFonts w:hint="eastAsia"/>
+              </w:rPr>
+              <w:t xml:space="preserve">避免同月新闻–价格反馈循环的核心检验</w:t>
+            </w:r>
+          </w:p>
+        </w:tc>
+      </w:tr>
+      <w:tr>
+        <w:tc>
+          <w:tcPr/>
+          <w:p>
+            <w:pPr>
+              <w:pStyle w:val="Compact"/>
+              <w:jc w:val="left"/>
+            </w:pPr>
+            <w:r>
+              <w:rPr>
+                <w:rFonts w:hint="eastAsia"/>
+              </w:rPr>
+              <w:t xml:space="preserve">滞后</w:t>
+            </w:r>
+            <w:r>
+              <w:t xml:space="preserve"> 1 </w:t>
+            </w:r>
+            <w:r>
+              <w:rPr>
+                <w:rFonts w:hint="eastAsia"/>
+              </w:rPr>
+              <w:t xml:space="preserve">月</w:t>
+            </w:r>
+            <w:r>
+              <w:t xml:space="preserve"> GPR </w:t>
+            </w:r>
+            <w:r>
+              <w:rPr>
+                <w:rFonts w:hint="eastAsia"/>
+              </w:rPr>
+              <w:t xml:space="preserve">与本月实现波动率相关系数</w:t>
+            </w:r>
+          </w:p>
+        </w:tc>
+        <w:tc>
+          <w:tcPr/>
+          <w:p>
+            <w:pPr>
+              <w:pStyle w:val="Compact"/>
+              <w:jc w:val="right"/>
+            </w:pPr>
+            <w:r>
+              <w:t xml:space="preserve">0.107</w:t>
+            </w:r>
+          </w:p>
+        </w:tc>
+        <w:tc>
+          <w:tcPr/>
+          <w:p>
+            <w:pPr>
+              <w:pStyle w:val="Compact"/>
+              <w:jc w:val="left"/>
+            </w:pPr>
+            <w:r>
+              <w:rPr>
+                <w:rFonts w:hint="eastAsia"/>
+              </w:rPr>
+              <w:t xml:space="preserve">风险指数更适合解释波动和尾部风险</w:t>
+            </w:r>
+          </w:p>
+        </w:tc>
+      </w:tr>
+      <w:tr>
+        <w:tc>
+          <w:tcPr/>
+          <w:p>
+            <w:pPr>
+              <w:pStyle w:val="Compact"/>
+              <w:jc w:val="left"/>
+            </w:pPr>
+            <w:r>
+              <w:rPr>
+                <w:rFonts w:hint="eastAsia"/>
+              </w:rPr>
+              <w:t xml:space="preserve">滞后</w:t>
+            </w:r>
+            <w:r>
+              <w:t xml:space="preserve"> 1 </w:t>
+            </w:r>
+            <w:r>
+              <w:rPr>
+                <w:rFonts w:hint="eastAsia"/>
+              </w:rPr>
+              <w:t xml:space="preserve">月</w:t>
+            </w:r>
+            <w:r>
+              <w:t xml:space="preserve"> GPR </w:t>
+            </w:r>
+            <w:r>
+              <w:rPr>
+                <w:rFonts w:hint="eastAsia"/>
+              </w:rPr>
+              <w:t xml:space="preserve">收益回归</w:t>
+            </w:r>
+            <w:r>
+              <w:t xml:space="preserve"> </w:t>
+            </w:r>
+            <m:oMath>
+              <m:sSup>
+                <m:e>
+                  <m:r>
+                    <m:t>R</m:t>
+                  </m:r>
+                </m:e>
+                <m:sup>
+                  <m:r>
+                    <m:t>2</m:t>
+                  </m:r>
+                </m:sup>
+              </m:sSup>
+            </m:oMath>
+          </w:p>
+        </w:tc>
+        <w:tc>
+          <w:tcPr/>
+          <w:p>
+            <w:pPr>
+              <w:pStyle w:val="Compact"/>
+              <w:jc w:val="right"/>
+            </w:pPr>
+            <w:r>
+              <w:t xml:space="preserve">0.001</w:t>
+            </w:r>
+          </w:p>
+        </w:tc>
+        <w:tc>
+          <w:tcPr/>
+          <w:p>
+            <w:pPr>
+              <w:pStyle w:val="Compact"/>
+              <w:jc w:val="left"/>
+            </w:pPr>
+            <w:r>
+              <w:rPr>
+                <w:rFonts w:hint="eastAsia"/>
+              </w:rPr>
+              <w:t xml:space="preserve">不支持把</w:t>
+            </w:r>
+            <w:r>
+              <w:t xml:space="preserve"> GPR </w:t>
+            </w:r>
+            <w:r>
+              <w:rPr>
+                <w:rFonts w:hint="eastAsia"/>
+              </w:rPr>
+              <w:t xml:space="preserve">包装成强短期收益预测器</w:t>
+            </w:r>
+          </w:p>
+        </w:tc>
+      </w:tr>
+      <w:tr>
+        <w:tc>
+          <w:tcPr/>
+          <w:p>
+            <w:pPr>
+              <w:pStyle w:val="Compact"/>
+              <w:jc w:val="left"/>
+            </w:pPr>
+            <w:r>
+              <w:t xml:space="preserve">2026 </w:t>
+            </w:r>
+            <w:r>
+              <w:rPr>
+                <w:rFonts w:hint="eastAsia"/>
+              </w:rPr>
+              <w:t xml:space="preserve">年</w:t>
+            </w:r>
+            <w:r>
+              <w:t xml:space="preserve"> 3 </w:t>
+            </w:r>
+            <w:r>
+              <w:rPr>
+                <w:rFonts w:hint="eastAsia"/>
+              </w:rPr>
+              <w:t xml:space="preserve">月</w:t>
+            </w:r>
+            <w:r>
+              <w:t xml:space="preserve"> GPR </w:t>
+            </w:r>
+            <w:r>
+              <w:rPr>
+                <w:rFonts w:hint="eastAsia"/>
+              </w:rPr>
+              <w:t xml:space="preserve">历史分位数</w:t>
+            </w:r>
+          </w:p>
+        </w:tc>
+        <w:tc>
+          <w:tcPr/>
+          <w:p>
+            <w:pPr>
+              <w:pStyle w:val="Compact"/>
+              <w:jc w:val="right"/>
+            </w:pPr>
+            <w:r>
+              <w:t xml:space="preserve">98.98%</w:t>
+            </w:r>
+          </w:p>
+        </w:tc>
+        <w:tc>
+          <w:tcPr/>
+          <w:p>
+            <w:pPr>
+              <w:pStyle w:val="Compact"/>
+              <w:jc w:val="left"/>
+            </w:pPr>
+            <w:r>
+              <w:rPr>
+                <w:rFonts w:hint="eastAsia"/>
+              </w:rPr>
+              <w:t xml:space="preserve">冲突爆发月风险读数处于罕见高位</w:t>
+            </w:r>
+          </w:p>
+        </w:tc>
+      </w:tr>
+      <w:tr>
+        <w:tc>
+          <w:tcPr/>
+          <w:p>
+            <w:pPr>
+              <w:pStyle w:val="Compact"/>
+              <w:jc w:val="left"/>
+            </w:pPr>
+            <w:r>
+              <w:t xml:space="preserve">2026 </w:t>
+            </w:r>
+            <w:r>
+              <w:rPr>
+                <w:rFonts w:hint="eastAsia"/>
+              </w:rPr>
+              <w:t xml:space="preserve">年</w:t>
+            </w:r>
+            <w:r>
+              <w:t xml:space="preserve"> 4 </w:t>
+            </w:r>
+            <w:r>
+              <w:rPr>
+                <w:rFonts w:hint="eastAsia"/>
+              </w:rPr>
+              <w:t xml:space="preserve">月</w:t>
+            </w:r>
+            <w:r>
+              <w:t xml:space="preserve"> GPR </w:t>
+            </w:r>
+            <w:r>
+              <w:rPr>
+                <w:rFonts w:hint="eastAsia"/>
+              </w:rPr>
+              <w:t xml:space="preserve">历史分位数</w:t>
+            </w:r>
+          </w:p>
+        </w:tc>
+        <w:tc>
+          <w:tcPr/>
+          <w:p>
+            <w:pPr>
+              <w:pStyle w:val="Compact"/>
+              <w:jc w:val="right"/>
+            </w:pPr>
+            <w:r>
+              <w:t xml:space="preserve">97.76%</w:t>
+            </w:r>
+          </w:p>
+        </w:tc>
+        <w:tc>
+          <w:tcPr/>
+          <w:p>
+            <w:pPr>
+              <w:pStyle w:val="Compact"/>
+              <w:jc w:val="left"/>
+            </w:pPr>
+            <w:r>
+              <w:rPr>
+                <w:rFonts w:hint="eastAsia"/>
+              </w:rPr>
+              <w:t xml:space="preserve">冲突延续月风险读数仍处于历史高位</w:t>
+            </w:r>
+          </w:p>
+        </w:tc>
+      </w:tr>
+    </w:tbl>
+    <w:p>
+      <w:pPr>
+        <w:pStyle w:val="CaptionedFigure"/>
+      </w:pPr>
+      <w:r>
+        <w:drawing>
+          <wp:inline>
+            <wp:extent cx="4907280" cy="2628899"/>
+            <wp:effectExtent b="0" l="0" r="0" t="0"/>
+            <wp:docPr descr="" title="" id="98" name="Picture"/>
+            <a:graphic>
+              <a:graphicData uri="http://schemas.openxmlformats.org/drawingml/2006/picture">
+                <pic:pic>
+                  <pic:nvPicPr>
+                    <pic:cNvPr descr="gpr_event_window_audit.png" id="99" name="Picture"/>
+                    <pic:cNvPicPr>
+                      <a:picLocks noChangeArrowheads="1" noChangeAspect="1"/>
+                    </pic:cNvPicPr>
+                  </pic:nvPicPr>
+                  <pic:blipFill>
+                    <a:blip r:embed="rId97"/>
+                    <a:stretch>
+                      <a:fillRect/>
+                    </a:stretch>
+                  </pic:blipFill>
+                  <pic:spPr bwMode="auto">
+                    <a:xfrm>
+                      <a:off x="0" y="0"/>
+                      <a:ext cx="4907280" cy="2628899"/>
+                    </a:xfrm>
+                    <a:prstGeom prst="rect">
+                      <a:avLst/>
+                    </a:prstGeom>
+                    <a:noFill/>
+                    <a:ln w="9525">
+                      <a:noFill/>
+                      <a:headEnd/>
+                      <a:tailEnd/>
+                    </a:ln>
+                  </pic:spPr>
+                </pic:pic>
+              </a:graphicData>
+            </a:graphic>
+          </wp:inline>
+        </w:drawing>
+      </w:r>
+    </w:p>
+    <w:p>
+      <w:pPr>
+        <w:pStyle w:val="ImageCaption"/>
+      </w:pPr>
+      <w:r>
+        <w:rPr>
+          <w:rFonts w:hint="eastAsia"/>
+        </w:rPr>
+        <w:t xml:space="preserve">地缘风险指数审计：同步</w:t>
+      </w:r>
+      <w:r>
+        <w:t xml:space="preserve"> GPR </w:t>
+      </w:r>
+      <w:r>
+        <w:rPr>
+          <w:rFonts w:hint="eastAsia"/>
+        </w:rPr>
+        <w:t xml:space="preserve">与滞后可用</w:t>
+      </w:r>
+      <w:r>
+        <w:t xml:space="preserve"> GPR。3 </w:t>
+      </w:r>
+      <w:r>
+        <w:rPr>
+          <w:rFonts w:hint="eastAsia"/>
+        </w:rPr>
+        <w:t xml:space="preserve">月油价解释不能使用</w:t>
+      </w:r>
+      <w:r>
+        <w:t xml:space="preserve"> 3 </w:t>
+      </w:r>
+      <w:r>
+        <w:rPr>
+          <w:rFonts w:hint="eastAsia"/>
+        </w:rPr>
+        <w:t xml:space="preserve">月同步</w:t>
+      </w:r>
+      <w:r>
+        <w:t xml:space="preserve"> </w:t>
+      </w:r>
+      <w:r>
+        <w:rPr>
+          <w:rFonts w:hint="eastAsia"/>
+        </w:rPr>
+        <w:t xml:space="preserve">GPR，4</w:t>
+      </w:r>
+      <w:r>
+        <w:t xml:space="preserve"> </w:t>
+      </w:r>
+      <w:r>
+        <w:rPr>
+          <w:rFonts w:hint="eastAsia"/>
+        </w:rPr>
+        <w:t xml:space="preserve">月以后才可使用已实现的</w:t>
+      </w:r>
+      <w:r>
+        <w:t xml:space="preserve"> 3 </w:t>
+      </w:r>
+      <w:r>
+        <w:rPr>
+          <w:rFonts w:hint="eastAsia"/>
+        </w:rPr>
+        <w:t xml:space="preserve">月风险读数。</w:t>
+      </w:r>
+    </w:p>
+    <w:p>
+      <w:pPr>
+        <w:pStyle w:val="CaptionedFigure"/>
+      </w:pPr>
+      <w:r>
+        <w:drawing>
+          <wp:inline>
+            <wp:extent cx="4480560" cy="3054927"/>
+            <wp:effectExtent b="0" l="0" r="0" t="0"/>
+            <wp:docPr descr="" title="" id="101" name="Picture"/>
+            <a:graphic>
+              <a:graphicData uri="http://schemas.openxmlformats.org/drawingml/2006/picture">
+                <pic:pic>
+                  <pic:nvPicPr>
+                    <pic:cNvPr descr="lagged_gpr_brent_return.png" id="102" name="Picture"/>
+                    <pic:cNvPicPr>
+                      <a:picLocks noChangeArrowheads="1" noChangeAspect="1"/>
+                    </pic:cNvPicPr>
+                  </pic:nvPicPr>
+                  <pic:blipFill>
+                    <a:blip r:embed="rId100"/>
+                    <a:stretch>
+                      <a:fillRect/>
+                    </a:stretch>
+                  </pic:blipFill>
+                  <pic:spPr bwMode="auto">
+                    <a:xfrm>
+                      <a:off x="0" y="0"/>
+                      <a:ext cx="4480560" cy="3054927"/>
+                    </a:xfrm>
+                    <a:prstGeom prst="rect">
+                      <a:avLst/>
+                    </a:prstGeom>
+                    <a:noFill/>
+                    <a:ln w="9525">
+                      <a:noFill/>
+                      <a:headEnd/>
+                      <a:tailEnd/>
+                    </a:ln>
+                  </pic:spPr>
+                </pic:pic>
+              </a:graphicData>
+            </a:graphic>
+          </wp:inline>
+        </w:drawing>
+      </w:r>
+    </w:p>
+    <w:p>
+      <w:pPr>
+        <w:pStyle w:val="ImageCaption"/>
+      </w:pPr>
+      <w:r>
+        <w:rPr>
+          <w:rFonts w:hint="eastAsia"/>
+        </w:rPr>
+        <w:t xml:space="preserve">滞后</w:t>
+      </w:r>
+      <w:r>
+        <w:t xml:space="preserve"> 1 </w:t>
+      </w:r>
+      <w:r>
+        <w:rPr>
+          <w:rFonts w:hint="eastAsia"/>
+        </w:rPr>
+        <w:t xml:space="preserve">月</w:t>
+      </w:r>
+      <w:r>
+        <w:t xml:space="preserve"> GPR </w:t>
+      </w:r>
+      <w:r>
+        <w:rPr>
+          <w:rFonts w:hint="eastAsia"/>
+        </w:rPr>
+        <w:t xml:space="preserve">与布伦特月度收益关系。散点关系较弱，说明</w:t>
+      </w:r>
+      <w:r>
+        <w:t xml:space="preserve"> GPR </w:t>
+      </w:r>
+      <w:r>
+        <w:rPr>
+          <w:rFonts w:hint="eastAsia"/>
+        </w:rPr>
+        <w:t xml:space="preserve">更适合作为风险溢价外部审计，而非单独点预测模型。</w:t>
+      </w:r>
+    </w:p>
+    <w:p>
+      <w:pPr>
+        <w:pStyle w:val="BodyText"/>
+      </w:pPr>
+      <w:r>
+        <w:rPr>
+          <w:rFonts w:hint="eastAsia"/>
+        </w:rPr>
+        <w:t xml:space="preserve">该结果对本文有两层含义。第一，2026</w:t>
+      </w:r>
+      <w:r>
+        <w:t xml:space="preserve"> </w:t>
+      </w:r>
+      <w:r>
+        <w:rPr>
+          <w:rFonts w:hint="eastAsia"/>
+        </w:rPr>
+        <w:t xml:space="preserve">年</w:t>
+      </w:r>
+      <w:r>
+        <w:t xml:space="preserve"> 3–4 </w:t>
+      </w:r>
+      <w:r>
+        <w:rPr>
+          <w:rFonts w:hint="eastAsia"/>
+        </w:rPr>
+        <w:t xml:space="preserve">月</w:t>
+      </w:r>
+      <w:r>
+        <w:t xml:space="preserve"> GPR </w:t>
+      </w:r>
+      <w:r>
+        <w:rPr>
+          <w:rFonts w:hint="eastAsia"/>
+        </w:rPr>
+        <w:t xml:space="preserve">处于历史高分位，说明模型中的地缘风险溢价不是凭空设定，而有外部风险指数支撑。第二，滞后</w:t>
+      </w:r>
+      <w:r>
+        <w:t xml:space="preserve"> GPR </w:t>
+      </w:r>
+      <w:r>
+        <w:rPr>
+          <w:rFonts w:hint="eastAsia"/>
+        </w:rPr>
+        <w:t xml:space="preserve">对月度收益的解释力有限，因此本文不将其直接加入短期拟合，也不把风险指数写成</w:t>
+      </w:r>
+      <w:r>
+        <w:rPr>
+          <w:rFonts w:hint="eastAsia"/>
+        </w:rPr>
+        <w:t xml:space="preserve">“预测油价上涨的神奇变量”</w:t>
+      </w:r>
+      <w:r>
+        <w:rPr>
+          <w:rFonts w:hint="eastAsia"/>
+        </w:rPr>
+        <w:t xml:space="preserve">。这使模型在风险解释和内生性防御之间保持较稳妥的边界。</w:t>
+      </w:r>
+    </w:p>
+    <w:bookmarkEnd w:id="103"/>
+    <w:bookmarkEnd w:id="104"/>
+    <w:bookmarkStart w:id="108" w:name="模型评价"/>
     <w:p>
       <w:pPr>
         <w:pStyle w:val="Heading1"/>
@@ -16035,7 +17096,7 @@
         <w:t xml:space="preserve">模型评价</w:t>
       </w:r>
     </w:p>
-    <w:bookmarkStart w:id="98" w:name="优点"/>
+    <w:bookmarkStart w:id="105" w:name="优点"/>
     <w:p>
       <w:pPr>
         <w:pStyle w:val="Heading2"/>
@@ -16139,8 +17200,8 @@
         <w:t xml:space="preserve">CSV；外推阶段明确标注为情景预测，不作为真实观测。</w:t>
       </w:r>
     </w:p>
-    <w:bookmarkEnd w:id="98"/>
-    <w:bookmarkStart w:id="99" w:name="局限性"/>
+    <w:bookmarkEnd w:id="105"/>
+    <w:bookmarkStart w:id="106" w:name="局限性"/>
     <w:p>
       <w:pPr>
         <w:pStyle w:val="Heading2"/>
@@ -16204,7 +17265,16 @@
         <w:rPr>
           <w:rFonts w:hint="eastAsia"/>
         </w:rPr>
-        <w:t xml:space="preserve">SPR、商业库存和原油产量周度数据作为外部审计，但尚未自动接入</w:t>
+        <w:t xml:space="preserve">SPR、商业库存和原油产量周度数据作为外部审计，并接入</w:t>
+      </w:r>
+      <w:r>
+        <w:t xml:space="preserve"> GPR </w:t>
+      </w:r>
+      <w:r>
+        <w:rPr>
+          <w:rFonts w:hint="eastAsia"/>
+        </w:rPr>
+        <w:t xml:space="preserve">月度指数审计地缘风险溢价；但尚未自动接入</w:t>
       </w:r>
       <w:r>
         <w:t xml:space="preserve"> IEA/OPEC </w:t>
@@ -16213,7 +17283,7 @@
         <w:rPr>
           <w:rFonts w:hint="eastAsia"/>
         </w:rPr>
-        <w:t xml:space="preserve">全球口径的完整供需平衡表；地缘风险、不确定性与制度风险、预期修复仍以参数化方式刻画，未引入期权隐含波动率或新闻情绪等高频外生变量。</w:t>
+        <w:t xml:space="preserve">全球口径的完整供需平衡表，也未引入期权隐含波动率、油轮保险费或高频新闻情绪等变量。</w:t>
       </w:r>
     </w:p>
     <w:p>
@@ -16230,8 +17300,8 @@
         <w:t xml:space="preserve">蒙特卡洛情景树已经刻画了部分参数联动风险，但其联合分布仍来自模型设定而非外部历史频率估计，因此尾部概率应解释为条件概率而非真实市场概率。</w:t>
       </w:r>
     </w:p>
-    <w:bookmarkEnd w:id="99"/>
-    <w:bookmarkStart w:id="100" w:name="改进方向"/>
+    <w:bookmarkEnd w:id="106"/>
+    <w:bookmarkStart w:id="107" w:name="改进方向"/>
     <w:p>
       <w:pPr>
         <w:pStyle w:val="Heading2"/>
@@ -16278,12 +17348,21 @@
         <w:rPr>
           <w:rFonts w:hint="eastAsia"/>
         </w:rPr>
-        <w:t xml:space="preserve">全球口径供需平衡表，对长期供给恢复路径进行更客观的外生约束；第二，在严格避免同日反馈循环的前提下，引入滞后新闻情绪、期权隐含波动率或地缘风险指数，增强风险溢价的外生解释力；第三，将当前蒙特卡洛联合扰动进一步扩展为带状态转移概率的情景树，使冲突缓和、维持和升级三类状态可以随时间动态切换。</w:t>
-      </w:r>
-    </w:p>
-    <w:bookmarkEnd w:id="100"/>
-    <w:bookmarkEnd w:id="101"/>
-    <w:bookmarkStart w:id="102" w:name="结论"/>
+        <w:t xml:space="preserve">全球口径供需平衡表，对长期供给恢复路径进行更客观的外生约束；第二，在现有</w:t>
+      </w:r>
+      <w:r>
+        <w:t xml:space="preserve"> GPR </w:t>
+      </w:r>
+      <w:r>
+        <w:rPr>
+          <w:rFonts w:hint="eastAsia"/>
+        </w:rPr>
+        <w:t xml:space="preserve">滞后审计基础上，继续探索期权隐含波动率、油轮保险费、期货期限结构等更接近市场定价的风险变量；第三，将当前蒙特卡洛联合扰动进一步扩展为带状态转移概率的情景树，使冲突缓和、维持和升级三类状态可以随时间动态切换。</w:t>
+      </w:r>
+    </w:p>
+    <w:bookmarkEnd w:id="107"/>
+    <w:bookmarkEnd w:id="108"/>
+    <w:bookmarkStart w:id="109" w:name="结论"/>
     <w:p>
       <w:pPr>
         <w:pStyle w:val="Heading1"/>
@@ -16557,6 +17636,50 @@
     </w:p>
     <w:p>
       <w:pPr>
+        <w:numPr>
+          <w:ilvl w:val="0"/>
+          <w:numId w:val="1007"/>
+        </w:numPr>
+      </w:pPr>
+      <w:r>
+        <w:t xml:space="preserve">GPR </w:t>
+      </w:r>
+      <w:r>
+        <w:rPr>
+          <w:rFonts w:hint="eastAsia"/>
+        </w:rPr>
+        <w:t xml:space="preserve">滞后审计显示，2026</w:t>
+      </w:r>
+      <w:r>
+        <w:t xml:space="preserve"> </w:t>
+      </w:r>
+      <w:r>
+        <w:rPr>
+          <w:rFonts w:hint="eastAsia"/>
+        </w:rPr>
+        <w:t xml:space="preserve">年</w:t>
+      </w:r>
+      <w:r>
+        <w:t xml:space="preserve"> 3–4 </w:t>
+      </w:r>
+      <w:r>
+        <w:rPr>
+          <w:rFonts w:hint="eastAsia"/>
+        </w:rPr>
+        <w:t xml:space="preserve">月地缘风险处于历史高分位，支持风险溢价机制；但滞后收益解释力较弱，因此本文不把</w:t>
+      </w:r>
+      <w:r>
+        <w:t xml:space="preserve"> GPR </w:t>
+      </w:r>
+      <w:r>
+        <w:rPr>
+          <w:rFonts w:hint="eastAsia"/>
+        </w:rPr>
+        <w:t xml:space="preserve">包装成短期点预测因子。</w:t>
+      </w:r>
+    </w:p>
+    <w:p>
+      <w:pPr>
         <w:pStyle w:val="FirstParagraph"/>
       </w:pPr>
       <w:r>
@@ -16578,8 +17701,8 @@
         <w:t xml:space="preserve">问题，而应被理解为物理缺口、政策缓冲、库存约束、替代运输和市场风险预期共同作用下的动态系统。</w:t>
       </w:r>
     </w:p>
-    <w:bookmarkEnd w:id="102"/>
-    <w:bookmarkStart w:id="103" w:name="附录支撑材料说明"/>
+    <w:bookmarkEnd w:id="109"/>
+    <w:bookmarkStart w:id="110" w:name="附录支撑材料说明"/>
     <w:p>
       <w:pPr>
         <w:pStyle w:val="Heading1"/>
@@ -16693,8 +17816,8 @@
         <w:t xml:space="preserve">。</w:t>
       </w:r>
     </w:p>
-    <w:bookmarkEnd w:id="103"/>
-    <w:bookmarkStart w:id="106" w:name="参考文献"/>
+    <w:bookmarkEnd w:id="110"/>
+    <w:bookmarkStart w:id="114" w:name="参考文献"/>
     <w:p>
       <w:pPr>
         <w:pStyle w:val="Heading1"/>
@@ -16905,7 +18028,7 @@
       <w:r>
         <w:t xml:space="preserve"> </w:t>
       </w:r>
-      <w:hyperlink r:id="rId104">
+      <w:hyperlink r:id="rId111">
         <w:r>
           <w:rPr>
             <w:rStyle w:val="Hyperlink"/>
@@ -16927,7 +18050,7 @@
       <w:r>
         <w:t xml:space="preserve"> </w:t>
       </w:r>
-      <w:hyperlink r:id="rId105">
+      <w:hyperlink r:id="rId112">
         <w:r>
           <w:rPr>
             <w:rStyle w:val="Hyperlink"/>
@@ -16939,7 +18062,29 @@
         <w:t xml:space="preserve">.</w:t>
       </w:r>
     </w:p>
-    <w:bookmarkEnd w:id="106"/>
+    <w:p>
+      <w:pPr>
+        <w:pStyle w:val="BodyText"/>
+      </w:pPr>
+      <w:r>
+        <w:t xml:space="preserve">Caldara-Iacoviello Geopolitical Risk Index. Monthly GPR data.</w:t>
+      </w:r>
+      <w:r>
+        <w:t xml:space="preserve"> </w:t>
+      </w:r>
+      <w:hyperlink r:id="rId113">
+        <w:r>
+          <w:rPr>
+            <w:rStyle w:val="Hyperlink"/>
+          </w:rPr>
+          <w:t xml:space="preserve">GPR data page</w:t>
+        </w:r>
+      </w:hyperlink>
+      <w:r>
+        <w:t xml:space="preserve">.</w:t>
+      </w:r>
+    </w:p>
+    <w:bookmarkEnd w:id="114"/>
     <w:sectPr>
       <w:footnotePr>
         <w:numRestart w:val="eachSect"/>

</xml_diff>

<commit_message>
Add historical robustness audit
</commit_message>
<xml_diff>
--- a/output/final/总论文.docx
+++ b/output/final/总论文.docx
@@ -457,7 +457,43 @@
         <w:rPr>
           <w:rFonts w:hint="eastAsia"/>
         </w:rPr>
-        <w:t xml:space="preserve">月地缘风险处于历史高分位，但滞后检验表明其不宜作为同月拟合输入。本文据此将</w:t>
+        <w:t xml:space="preserve">月地缘风险处于历史高分位，但滞后检验表明其不宜作为同月拟合输入。2017–2026</w:t>
+      </w:r>
+      <w:r>
+        <w:t xml:space="preserve"> </w:t>
+      </w:r>
+      <w:r>
+        <w:rPr>
+          <w:rFonts w:hint="eastAsia"/>
+        </w:rPr>
+        <w:t xml:space="preserve">年同长度滚动窗口检验进一步显示，2026</w:t>
+      </w:r>
+      <w:r>
+        <w:t xml:space="preserve"> </w:t>
+      </w:r>
+      <w:r>
+        <w:rPr>
+          <w:rFonts w:hint="eastAsia"/>
+        </w:rPr>
+        <w:t xml:space="preserve">冲突窗口累计收益率处于历史约</w:t>
+      </w:r>
+      <w:r>
+        <w:t xml:space="preserve"> 99.3% </w:t>
+      </w:r>
+      <w:r>
+        <w:rPr>
+          <w:rFonts w:hint="eastAsia"/>
+        </w:rPr>
+        <w:t xml:space="preserve">分位、实现波动率处于约</w:t>
+      </w:r>
+      <w:r>
+        <w:t xml:space="preserve"> 95.7% </w:t>
+      </w:r>
+      <w:r>
+        <w:rPr>
+          <w:rFonts w:hint="eastAsia"/>
+        </w:rPr>
+        <w:t xml:space="preserve">分位，说明该窗口对普通时间序列基准显著更难。本文据此将</w:t>
       </w:r>
       <w:r>
         <w:t xml:space="preserve"> GPR </w:t>
@@ -466,7 +502,7 @@
         <w:rPr>
           <w:rFonts w:hint="eastAsia"/>
         </w:rPr>
-        <w:t xml:space="preserve">定位为风险溢价的外部审计证据，而非短期点预测因子。</w:t>
+        <w:t xml:space="preserve">和历史样本定位为外部审计证据，而非短期点预测因子。</w:t>
       </w:r>
     </w:p>
     <w:p>
@@ -938,7 +974,7 @@
         <w:rPr>
           <w:rFonts w:hint="eastAsia"/>
         </w:rPr>
-        <w:t xml:space="preserve">天三情景预测模型，并通过敏感性分析、蒙特卡洛情景树和滞后地缘风险指数审计识别影响长期价格平衡点和二次跳涨风险的关键变量。</w:t>
+        <w:t xml:space="preserve">天三情景预测模型，并通过敏感性分析、蒙特卡洛情景树、滞后地缘风险指数审计和历史样本稳健性检验识别影响长期价格平衡点和二次跳涨风险的关键变量。</w:t>
       </w:r>
     </w:p>
     <w:p>
@@ -14383,7 +14419,7 @@
     </w:p>
     <w:bookmarkEnd w:id="83"/>
     <w:bookmarkEnd w:id="84"/>
-    <w:bookmarkStart w:id="104" w:name="敏感性分析"/>
+    <w:bookmarkStart w:id="111" w:name="敏感性分析"/>
     <w:p>
       <w:pPr>
         <w:pStyle w:val="Heading1"/>
@@ -17083,8 +17119,761 @@
       </w:r>
     </w:p>
     <w:bookmarkEnd w:id="103"/>
-    <w:bookmarkEnd w:id="104"/>
-    <w:bookmarkStart w:id="108" w:name="模型评价"/>
+    <w:bookmarkStart w:id="110" w:name="历史样本稳健性检验"/>
+    <w:p>
+      <w:pPr>
+        <w:pStyle w:val="Heading2"/>
+      </w:pPr>
+      <w:r>
+        <w:rPr>
+          <w:rFonts w:hint="eastAsia"/>
+        </w:rPr>
+        <w:t xml:space="preserve">历史样本稳健性检验</w:t>
+      </w:r>
+    </w:p>
+    <w:p>
+      <w:pPr>
+        <w:pStyle w:val="FirstParagraph"/>
+      </w:pPr>
+      <w:r>
+        <w:rPr>
+          <w:rFonts w:hint="eastAsia"/>
+        </w:rPr>
+        <w:t xml:space="preserve">附件数据覆盖</w:t>
+      </w:r>
+      <w:r>
+        <w:t xml:space="preserve"> 2017 </w:t>
+      </w:r>
+      <w:r>
+        <w:rPr>
+          <w:rFonts w:hint="eastAsia"/>
+        </w:rPr>
+        <w:t xml:space="preserve">年</w:t>
+      </w:r>
+      <w:r>
+        <w:t xml:space="preserve"> 9 </w:t>
+      </w:r>
+      <w:r>
+        <w:rPr>
+          <w:rFonts w:hint="eastAsia"/>
+        </w:rPr>
+        <w:t xml:space="preserve">月至</w:t>
+      </w:r>
+      <w:r>
+        <w:t xml:space="preserve"> 2026 </w:t>
+      </w:r>
+      <w:r>
+        <w:rPr>
+          <w:rFonts w:hint="eastAsia"/>
+        </w:rPr>
+        <w:t xml:space="preserve">年</w:t>
+      </w:r>
+      <w:r>
+        <w:t xml:space="preserve"> 5 </w:t>
+      </w:r>
+      <w:r>
+        <w:rPr>
+          <w:rFonts w:hint="eastAsia"/>
+        </w:rPr>
+        <w:t xml:space="preserve">月。除用于绘制长期价格和波动背景外，完整历史数据还可以检验</w:t>
+      </w:r>
+      <w:r>
+        <w:t xml:space="preserve"> 2026 </w:t>
+      </w:r>
+      <w:r>
+        <w:rPr>
+          <w:rFonts w:hint="eastAsia"/>
+        </w:rPr>
+        <w:t xml:space="preserve">冲突窗口在历史分布中的位置。本文采用与冲突窗口相同的</w:t>
+      </w:r>
+      <w:r>
+        <w:t xml:space="preserve"> 46 </w:t>
+      </w:r>
+      <w:r>
+        <w:rPr>
+          <w:rFonts w:hint="eastAsia"/>
+        </w:rPr>
+        <w:t xml:space="preserve">个交易日长度，在全样本中滚动构造历史窗口，并比较累计收益率、实现波动率、价格区间、最大单日跳变和朴素上一日基准误差。</w:t>
+      </w:r>
+    </w:p>
+    <w:p>
+      <w:pPr>
+        <w:pStyle w:val="TableCaption"/>
+      </w:pPr>
+      <w:r>
+        <w:t xml:space="preserve">2026 </w:t>
+      </w:r>
+      <w:r>
+        <w:rPr>
+          <w:rFonts w:hint="eastAsia"/>
+        </w:rPr>
+        <w:t xml:space="preserve">冲突窗口在历史同长度窗口中的位置</w:t>
+      </w:r>
+    </w:p>
+    <w:tbl>
+      <w:tblPr>
+        <w:tblStyle w:val="Table"/>
+        <w:tblW w:type="auto" w:w="0"/>
+        <w:tblLook w:firstRow="1" w:lastRow="0" w:firstColumn="0" w:lastColumn="0" w:noHBand="0" w:noVBand="0" w:val="0020"/>
+        <w:tblCaption w:val="2026 冲突窗口在历史同长度窗口中的位置"/>
+      </w:tblPr>
+      <w:tblGrid>
+        <w:gridCol w:w="1980"/>
+        <w:gridCol w:w="1980"/>
+        <w:gridCol w:w="1980"/>
+        <w:gridCol w:w="1980"/>
+      </w:tblGrid>
+      <w:tr>
+        <w:trPr>
+          <w:tblHeader w:val="on"/>
+        </w:trPr>
+        <w:tc>
+          <w:tcPr/>
+          <w:p>
+            <w:pPr>
+              <w:pStyle w:val="Compact"/>
+              <w:jc w:val="left"/>
+            </w:pPr>
+            <w:r>
+              <w:rPr>
+                <w:rFonts w:hint="eastAsia"/>
+              </w:rPr>
+              <w:t xml:space="preserve">指标</w:t>
+            </w:r>
+          </w:p>
+        </w:tc>
+        <w:tc>
+          <w:tcPr/>
+          <w:p>
+            <w:pPr>
+              <w:pStyle w:val="Compact"/>
+              <w:jc w:val="right"/>
+            </w:pPr>
+            <w:r>
+              <w:rPr>
+                <w:rFonts w:hint="eastAsia"/>
+              </w:rPr>
+              <w:t xml:space="preserve">冲突窗口数值</w:t>
+            </w:r>
+          </w:p>
+        </w:tc>
+        <w:tc>
+          <w:tcPr/>
+          <w:p>
+            <w:pPr>
+              <w:pStyle w:val="Compact"/>
+              <w:jc w:val="right"/>
+            </w:pPr>
+            <w:r>
+              <w:rPr>
+                <w:rFonts w:hint="eastAsia"/>
+              </w:rPr>
+              <w:t xml:space="preserve">历史分位数</w:t>
+            </w:r>
+          </w:p>
+        </w:tc>
+        <w:tc>
+          <w:tcPr/>
+          <w:p>
+            <w:pPr>
+              <w:pStyle w:val="Compact"/>
+              <w:jc w:val="left"/>
+            </w:pPr>
+            <w:r>
+              <w:rPr>
+                <w:rFonts w:hint="eastAsia"/>
+              </w:rPr>
+              <w:t xml:space="preserve">含义</w:t>
+            </w:r>
+          </w:p>
+        </w:tc>
+      </w:tr>
+      <w:tr>
+        <w:tc>
+          <w:tcPr/>
+          <w:p>
+            <w:pPr>
+              <w:pStyle w:val="Compact"/>
+              <w:jc w:val="left"/>
+            </w:pPr>
+            <w:r>
+              <w:rPr>
+                <w:rFonts w:hint="eastAsia"/>
+              </w:rPr>
+              <w:t xml:space="preserve">累计收益率</w:t>
+            </w:r>
+          </w:p>
+        </w:tc>
+        <w:tc>
+          <w:tcPr/>
+          <w:p>
+            <w:pPr>
+              <w:pStyle w:val="Compact"/>
+              <w:jc w:val="right"/>
+            </w:pPr>
+            <w:r>
+              <w:t xml:space="preserve">50.7%</w:t>
+            </w:r>
+          </w:p>
+        </w:tc>
+        <w:tc>
+          <w:tcPr/>
+          <w:p>
+            <w:pPr>
+              <w:pStyle w:val="Compact"/>
+              <w:jc w:val="right"/>
+            </w:pPr>
+            <w:r>
+              <w:t xml:space="preserve">99.3%</w:t>
+            </w:r>
+          </w:p>
+        </w:tc>
+        <w:tc>
+          <w:tcPr/>
+          <w:p>
+            <w:pPr>
+              <w:pStyle w:val="Compact"/>
+              <w:jc w:val="left"/>
+            </w:pPr>
+            <w:r>
+              <w:rPr>
+                <w:rFonts w:hint="eastAsia"/>
+              </w:rPr>
+              <w:t xml:space="preserve">同长度窗口内价格上行幅度</w:t>
+            </w:r>
+          </w:p>
+        </w:tc>
+      </w:tr>
+      <w:tr>
+        <w:tc>
+          <w:tcPr/>
+          <w:p>
+            <w:pPr>
+              <w:pStyle w:val="Compact"/>
+              <w:jc w:val="left"/>
+            </w:pPr>
+            <w:r>
+              <w:rPr>
+                <w:rFonts w:hint="eastAsia"/>
+              </w:rPr>
+              <w:t xml:space="preserve">实现波动率</w:t>
+            </w:r>
+          </w:p>
+        </w:tc>
+        <w:tc>
+          <w:tcPr/>
+          <w:p>
+            <w:pPr>
+              <w:pStyle w:val="Compact"/>
+              <w:jc w:val="right"/>
+            </w:pPr>
+            <w:r>
+              <w:t xml:space="preserve">30.4%</w:t>
+            </w:r>
+          </w:p>
+        </w:tc>
+        <w:tc>
+          <w:tcPr/>
+          <w:p>
+            <w:pPr>
+              <w:pStyle w:val="Compact"/>
+              <w:jc w:val="right"/>
+            </w:pPr>
+            <w:r>
+              <w:t xml:space="preserve">95.7%</w:t>
+            </w:r>
+          </w:p>
+        </w:tc>
+        <w:tc>
+          <w:tcPr/>
+          <w:p>
+            <w:pPr>
+              <w:pStyle w:val="Compact"/>
+              <w:jc w:val="left"/>
+            </w:pPr>
+            <w:r>
+              <w:rPr>
+                <w:rFonts w:hint="eastAsia"/>
+              </w:rPr>
+              <w:t xml:space="preserve">同长度窗口内波动强度</w:t>
+            </w:r>
+          </w:p>
+        </w:tc>
+      </w:tr>
+      <w:tr>
+        <w:tc>
+          <w:tcPr/>
+          <w:p>
+            <w:pPr>
+              <w:pStyle w:val="Compact"/>
+              <w:jc w:val="left"/>
+            </w:pPr>
+            <w:r>
+              <w:rPr>
+                <w:rFonts w:hint="eastAsia"/>
+              </w:rPr>
+              <w:t xml:space="preserve">平均绝对日收益率</w:t>
+            </w:r>
+          </w:p>
+        </w:tc>
+        <w:tc>
+          <w:tcPr/>
+          <w:p>
+            <w:pPr>
+              <w:pStyle w:val="Compact"/>
+              <w:jc w:val="right"/>
+            </w:pPr>
+            <w:r>
+              <w:t xml:space="preserve">3.74%</w:t>
+            </w:r>
+          </w:p>
+        </w:tc>
+        <w:tc>
+          <w:tcPr/>
+          <w:p>
+            <w:pPr>
+              <w:pStyle w:val="Compact"/>
+              <w:jc w:val="right"/>
+            </w:pPr>
+            <w:r>
+              <w:t xml:space="preserve">97.3%</w:t>
+            </w:r>
+          </w:p>
+        </w:tc>
+        <w:tc>
+          <w:tcPr/>
+          <w:p>
+            <w:pPr>
+              <w:pStyle w:val="Compact"/>
+              <w:jc w:val="left"/>
+            </w:pPr>
+            <w:r>
+              <w:rPr>
+                <w:rFonts w:hint="eastAsia"/>
+              </w:rPr>
+              <w:t xml:space="preserve">日常波动强度</w:t>
+            </w:r>
+          </w:p>
+        </w:tc>
+      </w:tr>
+      <w:tr>
+        <w:tc>
+          <w:tcPr/>
+          <w:p>
+            <w:pPr>
+              <w:pStyle w:val="Compact"/>
+              <w:jc w:val="left"/>
+            </w:pPr>
+            <w:r>
+              <w:rPr>
+                <w:rFonts w:hint="eastAsia"/>
+              </w:rPr>
+              <w:t xml:space="preserve">最大单日绝对收益</w:t>
+            </w:r>
+          </w:p>
+        </w:tc>
+        <w:tc>
+          <w:tcPr/>
+          <w:p>
+            <w:pPr>
+              <w:pStyle w:val="Compact"/>
+              <w:jc w:val="right"/>
+            </w:pPr>
+            <w:r>
+              <w:t xml:space="preserve">11.9%</w:t>
+            </w:r>
+          </w:p>
+        </w:tc>
+        <w:tc>
+          <w:tcPr/>
+          <w:p>
+            <w:pPr>
+              <w:pStyle w:val="Compact"/>
+              <w:jc w:val="right"/>
+            </w:pPr>
+            <w:r>
+              <w:t xml:space="preserve">91.4%</w:t>
+            </w:r>
+          </w:p>
+        </w:tc>
+        <w:tc>
+          <w:tcPr/>
+          <w:p>
+            <w:pPr>
+              <w:pStyle w:val="Compact"/>
+              <w:jc w:val="left"/>
+            </w:pPr>
+            <w:r>
+              <w:rPr>
+                <w:rFonts w:hint="eastAsia"/>
+              </w:rPr>
+              <w:t xml:space="preserve">局部跳变强度</w:t>
+            </w:r>
+          </w:p>
+        </w:tc>
+      </w:tr>
+      <w:tr>
+        <w:tc>
+          <w:tcPr/>
+          <w:p>
+            <w:pPr>
+              <w:pStyle w:val="Compact"/>
+              <w:jc w:val="left"/>
+            </w:pPr>
+            <w:r>
+              <w:rPr>
+                <w:rFonts w:hint="eastAsia"/>
+              </w:rPr>
+              <w:t xml:space="preserve">价格区间比例</w:t>
+            </w:r>
+          </w:p>
+        </w:tc>
+        <w:tc>
+          <w:tcPr/>
+          <w:p>
+            <w:pPr>
+              <w:pStyle w:val="Compact"/>
+              <w:jc w:val="right"/>
+            </w:pPr>
+            <w:r>
+              <w:t xml:space="preserve">36.1%</w:t>
+            </w:r>
+          </w:p>
+        </w:tc>
+        <w:tc>
+          <w:tcPr/>
+          <w:p>
+            <w:pPr>
+              <w:pStyle w:val="Compact"/>
+              <w:jc w:val="right"/>
+            </w:pPr>
+            <w:r>
+              <w:t xml:space="preserve">93.2%</w:t>
+            </w:r>
+          </w:p>
+        </w:tc>
+        <w:tc>
+          <w:tcPr/>
+          <w:p>
+            <w:pPr>
+              <w:pStyle w:val="Compact"/>
+              <w:jc w:val="left"/>
+            </w:pPr>
+            <w:r>
+              <w:rPr>
+                <w:rFonts w:hint="eastAsia"/>
+              </w:rPr>
+              <w:t xml:space="preserve">窗口内价格振幅</w:t>
+            </w:r>
+          </w:p>
+        </w:tc>
+      </w:tr>
+      <w:tr>
+        <w:tc>
+          <w:tcPr/>
+          <w:p>
+            <w:pPr>
+              <w:pStyle w:val="Compact"/>
+              <w:jc w:val="left"/>
+            </w:pPr>
+            <w:r>
+              <w:rPr>
+                <w:rFonts w:hint="eastAsia"/>
+              </w:rPr>
+              <w:t xml:space="preserve">朴素上一日基准</w:t>
+            </w:r>
+            <w:r>
+              <w:t xml:space="preserve"> RMSE</w:t>
+            </w:r>
+          </w:p>
+        </w:tc>
+        <w:tc>
+          <w:tcPr/>
+          <w:p>
+            <w:pPr>
+              <w:pStyle w:val="Compact"/>
+              <w:jc w:val="right"/>
+            </w:pPr>
+            <w:r>
+              <w:t xml:space="preserve">4.52</w:t>
+            </w:r>
+          </w:p>
+        </w:tc>
+        <w:tc>
+          <w:tcPr/>
+          <w:p>
+            <w:pPr>
+              <w:pStyle w:val="Compact"/>
+              <w:jc w:val="right"/>
+            </w:pPr>
+            <w:r>
+              <w:t xml:space="preserve">98.5%</w:t>
+            </w:r>
+          </w:p>
+        </w:tc>
+        <w:tc>
+          <w:tcPr/>
+          <w:p>
+            <w:pPr>
+              <w:pStyle w:val="Compact"/>
+              <w:jc w:val="left"/>
+            </w:pPr>
+            <w:r>
+              <w:rPr>
+                <w:rFonts w:hint="eastAsia"/>
+              </w:rPr>
+              <w:t xml:space="preserve">随机游走基准在该窗口是否变难</w:t>
+            </w:r>
+          </w:p>
+        </w:tc>
+      </w:tr>
+      <w:tr>
+        <w:tc>
+          <w:tcPr/>
+          <w:p>
+            <w:pPr>
+              <w:pStyle w:val="Compact"/>
+              <w:jc w:val="left"/>
+            </w:pPr>
+            <w:r>
+              <w:rPr>
+                <w:rFonts w:hint="eastAsia"/>
+              </w:rPr>
+              <w:t xml:space="preserve">本文机制模型</w:t>
+            </w:r>
+            <w:r>
+              <w:t xml:space="preserve"> RMSE</w:t>
+            </w:r>
+          </w:p>
+        </w:tc>
+        <w:tc>
+          <w:tcPr/>
+          <w:p>
+            <w:pPr>
+              <w:pStyle w:val="Compact"/>
+              <w:jc w:val="right"/>
+            </w:pPr>
+            <w:r>
+              <w:t xml:space="preserve">3.44</w:t>
+            </w:r>
+          </w:p>
+        </w:tc>
+        <w:tc>
+          <w:tcPr/>
+          <w:p>
+            <w:pPr>
+              <w:pStyle w:val="Compact"/>
+              <w:jc w:val="right"/>
+            </w:pPr>
+            <w:r>
+              <w:t xml:space="preserve">97.4%</w:t>
+            </w:r>
+          </w:p>
+        </w:tc>
+        <w:tc>
+          <w:tcPr/>
+          <w:p>
+            <w:pPr>
+              <w:pStyle w:val="Compact"/>
+              <w:jc w:val="left"/>
+            </w:pPr>
+            <w:r>
+              <w:rPr>
+                <w:rFonts w:hint="eastAsia"/>
+              </w:rPr>
+              <w:t xml:space="preserve">对比历史朴素误差分布</w:t>
+            </w:r>
+          </w:p>
+        </w:tc>
+      </w:tr>
+    </w:tbl>
+    <w:p>
+      <w:pPr>
+        <w:pStyle w:val="CaptionedFigure"/>
+      </w:pPr>
+      <w:r>
+        <w:drawing>
+          <wp:inline>
+            <wp:extent cx="4907280" cy="2685115"/>
+            <wp:effectExtent b="0" l="0" r="0" t="0"/>
+            <wp:docPr descr="" title="" id="105" name="Picture"/>
+            <a:graphic>
+              <a:graphicData uri="http://schemas.openxmlformats.org/drawingml/2006/picture">
+                <pic:pic>
+                  <pic:nvPicPr>
+                    <pic:cNvPr descr="historical_event_extremeness.png" id="106" name="Picture"/>
+                    <pic:cNvPicPr>
+                      <a:picLocks noChangeArrowheads="1" noChangeAspect="1"/>
+                    </pic:cNvPicPr>
+                  </pic:nvPicPr>
+                  <pic:blipFill>
+                    <a:blip r:embed="rId104"/>
+                    <a:stretch>
+                      <a:fillRect/>
+                    </a:stretch>
+                  </pic:blipFill>
+                  <pic:spPr bwMode="auto">
+                    <a:xfrm>
+                      <a:off x="0" y="0"/>
+                      <a:ext cx="4907280" cy="2685115"/>
+                    </a:xfrm>
+                    <a:prstGeom prst="rect">
+                      <a:avLst/>
+                    </a:prstGeom>
+                    <a:noFill/>
+                    <a:ln w="9525">
+                      <a:noFill/>
+                      <a:headEnd/>
+                      <a:tailEnd/>
+                    </a:ln>
+                  </pic:spPr>
+                </pic:pic>
+              </a:graphicData>
+            </a:graphic>
+          </wp:inline>
+        </w:drawing>
+      </w:r>
+    </w:p>
+    <w:p>
+      <w:pPr>
+        <w:pStyle w:val="ImageCaption"/>
+      </w:pPr>
+      <w:r>
+        <w:t xml:space="preserve">2026 </w:t>
+      </w:r>
+      <w:r>
+        <w:rPr>
+          <w:rFonts w:hint="eastAsia"/>
+        </w:rPr>
+        <w:t xml:space="preserve">冲突窗口在历史同长度窗口中的极端性。累计涨幅、波动率和朴素基准误差均处于历史高分位。</w:t>
+      </w:r>
+    </w:p>
+    <w:p>
+      <w:pPr>
+        <w:pStyle w:val="CaptionedFigure"/>
+      </w:pPr>
+      <w:r>
+        <w:drawing>
+          <wp:inline>
+            <wp:extent cx="4693920" cy="2669091"/>
+            <wp:effectExtent b="0" l="0" r="0" t="0"/>
+            <wp:docPr descr="" title="" id="108" name="Picture"/>
+            <a:graphic>
+              <a:graphicData uri="http://schemas.openxmlformats.org/drawingml/2006/picture">
+                <pic:pic>
+                  <pic:nvPicPr>
+                    <pic:cNvPr descr="historical_baseline_error_distribution.png" id="109" name="Picture"/>
+                    <pic:cNvPicPr>
+                      <a:picLocks noChangeArrowheads="1" noChangeAspect="1"/>
+                    </pic:cNvPicPr>
+                  </pic:nvPicPr>
+                  <pic:blipFill>
+                    <a:blip r:embed="rId107"/>
+                    <a:stretch>
+                      <a:fillRect/>
+                    </a:stretch>
+                  </pic:blipFill>
+                  <pic:spPr bwMode="auto">
+                    <a:xfrm>
+                      <a:off x="0" y="0"/>
+                      <a:ext cx="4693920" cy="2669091"/>
+                    </a:xfrm>
+                    <a:prstGeom prst="rect">
+                      <a:avLst/>
+                    </a:prstGeom>
+                    <a:noFill/>
+                    <a:ln w="9525">
+                      <a:noFill/>
+                      <a:headEnd/>
+                      <a:tailEnd/>
+                    </a:ln>
+                  </pic:spPr>
+                </pic:pic>
+              </a:graphicData>
+            </a:graphic>
+          </wp:inline>
+        </w:drawing>
+      </w:r>
+    </w:p>
+    <w:p>
+      <w:pPr>
+        <w:pStyle w:val="ImageCaption"/>
+      </w:pPr>
+      <w:r>
+        <w:rPr>
+          <w:rFonts w:hint="eastAsia"/>
+        </w:rPr>
+        <w:t xml:space="preserve">历史</w:t>
+      </w:r>
+      <w:r>
+        <w:t xml:space="preserve"> 46 </w:t>
+      </w:r>
+      <w:r>
+        <w:rPr>
+          <w:rFonts w:hint="eastAsia"/>
+        </w:rPr>
+        <w:t xml:space="preserve">交易日窗口的随机游走基准误差分布。冲突窗口朴素基准</w:t>
+      </w:r>
+      <w:r>
+        <w:t xml:space="preserve"> RMSE </w:t>
+      </w:r>
+      <w:r>
+        <w:rPr>
+          <w:rFonts w:hint="eastAsia"/>
+        </w:rPr>
+        <w:t xml:space="preserve">处于历史高位，而本文机制模型在该窗口内仍明显优于朴素基准。</w:t>
+      </w:r>
+    </w:p>
+    <w:p>
+      <w:pPr>
+        <w:pStyle w:val="BodyText"/>
+      </w:pPr>
+      <w:r>
+        <w:rPr>
+          <w:rFonts w:hint="eastAsia"/>
+        </w:rPr>
+        <w:t xml:space="preserve">历史检验有两个作用。第一，它证明本文没有只盯着</w:t>
+      </w:r>
+      <w:r>
+        <w:t xml:space="preserve"> 46 </w:t>
+      </w:r>
+      <w:r>
+        <w:rPr>
+          <w:rFonts w:hint="eastAsia"/>
+        </w:rPr>
+        <w:t xml:space="preserve">个交易日做孤立拟合：与</w:t>
+      </w:r>
+      <w:r>
+        <w:t xml:space="preserve"> 2017–2026 </w:t>
+      </w:r>
+      <w:r>
+        <w:rPr>
+          <w:rFonts w:hint="eastAsia"/>
+        </w:rPr>
+        <w:t xml:space="preserve">年所有同长度窗口相比，2026</w:t>
+      </w:r>
+      <w:r>
+        <w:t xml:space="preserve"> </w:t>
+      </w:r>
+      <w:r>
+        <w:rPr>
+          <w:rFonts w:hint="eastAsia"/>
+        </w:rPr>
+        <w:t xml:space="preserve">冲突窗口确实属于高涨幅、高波动和高预测难度样本。第二，它说明完整历史数据更适合作为背景分布和基准检验，而不应被用来把霍尔木兹机制参数强行拟合到所有普通时期。ADF</w:t>
+      </w:r>
+      <w:r>
+        <w:t xml:space="preserve"> </w:t>
+      </w:r>
+      <w:r>
+        <w:rPr>
+          <w:rFonts w:hint="eastAsia"/>
+        </w:rPr>
+        <w:t xml:space="preserve">检验也支持这一点：收盘价水平和对数价格均不能拒绝单位根，而对数收益率可拒绝单位根，因此普通统计基准更适合在收益率或差分口径下使用。</w:t>
+      </w:r>
+    </w:p>
+    <w:bookmarkEnd w:id="110"/>
+    <w:bookmarkEnd w:id="111"/>
+    <w:bookmarkStart w:id="115" w:name="模型评价"/>
     <w:p>
       <w:pPr>
         <w:pStyle w:val="Heading1"/>
@@ -17096,7 +17885,7 @@
         <w:t xml:space="preserve">模型评价</w:t>
       </w:r>
     </w:p>
-    <w:bookmarkStart w:id="105" w:name="优点"/>
+    <w:bookmarkStart w:id="112" w:name="优点"/>
     <w:p>
       <w:pPr>
         <w:pStyle w:val="Heading2"/>
@@ -17174,7 +17963,7 @@
         <w:rPr>
           <w:rFonts w:hint="eastAsia"/>
         </w:rPr>
-        <w:t xml:space="preserve">基准、滞后平移检验、机制消融和过拟合压力测试。</w:t>
+        <w:t xml:space="preserve">基准、滞后平移检验、机制消融、过拟合压力测试和历史同长度窗口检验。</w:t>
       </w:r>
     </w:p>
     <w:p>
@@ -17200,8 +17989,8 @@
         <w:t xml:space="preserve">CSV；外推阶段明确标注为情景预测，不作为真实观测。</w:t>
       </w:r>
     </w:p>
-    <w:bookmarkEnd w:id="105"/>
-    <w:bookmarkStart w:id="106" w:name="局限性"/>
+    <w:bookmarkEnd w:id="112"/>
+    <w:bookmarkStart w:id="113" w:name="局限性"/>
     <w:p>
       <w:pPr>
         <w:pStyle w:val="Heading2"/>
@@ -17274,7 +18063,7 @@
         <w:rPr>
           <w:rFonts w:hint="eastAsia"/>
         </w:rPr>
-        <w:t xml:space="preserve">月度指数审计地缘风险溢价；但尚未自动接入</w:t>
+        <w:t xml:space="preserve">月度指数和历史滚动窗口审计地缘风险与事件极端性；但尚未自动接入</w:t>
       </w:r>
       <w:r>
         <w:t xml:space="preserve"> IEA/OPEC </w:t>
@@ -17300,8 +18089,8 @@
         <w:t xml:space="preserve">蒙特卡洛情景树已经刻画了部分参数联动风险，但其联合分布仍来自模型设定而非外部历史频率估计，因此尾部概率应解释为条件概率而非真实市场概率。</w:t>
       </w:r>
     </w:p>
-    <w:bookmarkEnd w:id="106"/>
-    <w:bookmarkStart w:id="107" w:name="改进方向"/>
+    <w:bookmarkEnd w:id="113"/>
+    <w:bookmarkStart w:id="114" w:name="改进方向"/>
     <w:p>
       <w:pPr>
         <w:pStyle w:val="Heading2"/>
@@ -17360,9 +18149,9 @@
         <w:t xml:space="preserve">滞后审计基础上，继续探索期权隐含波动率、油轮保险费、期货期限结构等更接近市场定价的风险变量；第三，将当前蒙特卡洛联合扰动进一步扩展为带状态转移概率的情景树，使冲突缓和、维持和升级三类状态可以随时间动态切换。</w:t>
       </w:r>
     </w:p>
-    <w:bookmarkEnd w:id="107"/>
-    <w:bookmarkEnd w:id="108"/>
-    <w:bookmarkStart w:id="109" w:name="结论"/>
+    <w:bookmarkEnd w:id="114"/>
+    <w:bookmarkEnd w:id="115"/>
+    <w:bookmarkStart w:id="116" w:name="结论"/>
     <w:p>
       <w:pPr>
         <w:pStyle w:val="Heading1"/>
@@ -17680,6 +18469,35 @@
     </w:p>
     <w:p>
       <w:pPr>
+        <w:numPr>
+          <w:ilvl w:val="0"/>
+          <w:numId w:val="1007"/>
+        </w:numPr>
+      </w:pPr>
+      <w:r>
+        <w:t xml:space="preserve">2017–2026 </w:t>
+      </w:r>
+      <w:r>
+        <w:rPr>
+          <w:rFonts w:hint="eastAsia"/>
+        </w:rPr>
+        <w:t xml:space="preserve">历史同长度窗口检验显示，冲突窗口累计收益率、波动率和朴素基准误差均处于历史高分位，说明完整历史数据支持</w:t>
+      </w:r>
+      <w:r>
+        <w:rPr>
+          <w:rFonts w:hint="eastAsia"/>
+        </w:rPr>
+        <w:t xml:space="preserve">“该事件窗口确实特殊”</w:t>
+      </w:r>
+      <w:r>
+        <w:rPr>
+          <w:rFonts w:hint="eastAsia"/>
+        </w:rPr>
+        <w:t xml:space="preserve">的判断。</w:t>
+      </w:r>
+    </w:p>
+    <w:p>
+      <w:pPr>
         <w:pStyle w:val="FirstParagraph"/>
       </w:pPr>
       <w:r>
@@ -17701,8 +18519,8 @@
         <w:t xml:space="preserve">问题，而应被理解为物理缺口、政策缓冲、库存约束、替代运输和市场风险预期共同作用下的动态系统。</w:t>
       </w:r>
     </w:p>
-    <w:bookmarkEnd w:id="109"/>
-    <w:bookmarkStart w:id="110" w:name="附录支撑材料说明"/>
+    <w:bookmarkEnd w:id="116"/>
+    <w:bookmarkStart w:id="117" w:name="附录支撑材料说明"/>
     <w:p>
       <w:pPr>
         <w:pStyle w:val="Heading1"/>
@@ -17816,8 +18634,8 @@
         <w:t xml:space="preserve">。</w:t>
       </w:r>
     </w:p>
-    <w:bookmarkEnd w:id="110"/>
-    <w:bookmarkStart w:id="114" w:name="参考文献"/>
+    <w:bookmarkEnd w:id="117"/>
+    <w:bookmarkStart w:id="121" w:name="参考文献"/>
     <w:p>
       <w:pPr>
         <w:pStyle w:val="Heading1"/>
@@ -18028,7 +18846,7 @@
       <w:r>
         <w:t xml:space="preserve"> </w:t>
       </w:r>
-      <w:hyperlink r:id="rId111">
+      <w:hyperlink r:id="rId118">
         <w:r>
           <w:rPr>
             <w:rStyle w:val="Hyperlink"/>
@@ -18050,7 +18868,7 @@
       <w:r>
         <w:t xml:space="preserve"> </w:t>
       </w:r>
-      <w:hyperlink r:id="rId112">
+      <w:hyperlink r:id="rId119">
         <w:r>
           <w:rPr>
             <w:rStyle w:val="Hyperlink"/>
@@ -18072,7 +18890,7 @@
       <w:r>
         <w:t xml:space="preserve"> </w:t>
       </w:r>
-      <w:hyperlink r:id="rId113">
+      <w:hyperlink r:id="rId120">
         <w:r>
           <w:rPr>
             <w:rStyle w:val="Hyperlink"/>
@@ -18084,7 +18902,7 @@
         <w:t xml:space="preserve">.</w:t>
       </w:r>
     </w:p>
-    <w:bookmarkEnd w:id="114"/>
+    <w:bookmarkEnd w:id="121"/>
     <w:sectPr>
       <w:footnotePr>
         <w:numRestart w:val="eachSect"/>

</xml_diff>

<commit_message>
Harden paper against reviewer critiques
</commit_message>
<xml_diff>
--- a/output/final/总论文.docx
+++ b/output/final/总论文.docx
@@ -2737,7 +2737,7 @@
     </w:p>
     <w:bookmarkEnd w:id="25"/>
     <w:bookmarkEnd w:id="26"/>
-    <w:bookmarkStart w:id="29" w:name="模型假设与符号说明"/>
+    <w:bookmarkStart w:id="30" w:name="模型假设与符号说明"/>
     <w:p>
       <w:pPr>
         <w:pStyle w:val="Heading1"/>
@@ -3904,8 +3904,592 @@
       </w:tr>
     </w:tbl>
     <w:bookmarkEnd w:id="28"/>
+    <w:bookmarkStart w:id="29" w:name="参数来源与识别边界"/>
+    <w:p>
+      <w:pPr>
+        <w:pStyle w:val="Heading2"/>
+      </w:pPr>
+      <w:r>
+        <w:rPr>
+          <w:rFonts w:hint="eastAsia"/>
+        </w:rPr>
+        <w:t xml:space="preserve">参数来源与识别边界</w:t>
+      </w:r>
+    </w:p>
+    <w:p>
+      <w:pPr>
+        <w:pStyle w:val="FirstParagraph"/>
+      </w:pPr>
+      <w:r>
+        <w:rPr>
+          <w:rFonts w:hint="eastAsia"/>
+        </w:rPr>
+        <w:t xml:space="preserve">为了避免把模型理解为单纯曲线拟合，本文将参数按来源分为五类。题面参数和附件统计量构成模型硬约束；官方外部数据只用于数量级审计；校准参数必须通过基准对比、消融实验和扰动检验；长期情景参数只用于</w:t>
+      </w:r>
+      <w:r>
+        <w:t xml:space="preserve"> 60–180 </w:t>
+      </w:r>
+      <w:r>
+        <w:rPr>
+          <w:rFonts w:hint="eastAsia"/>
+        </w:rPr>
+        <w:t xml:space="preserve">天条件外推，不参与短期窗口的误差拟合。</w:t>
+      </w:r>
+    </w:p>
+    <w:p>
+      <w:pPr>
+        <w:pStyle w:val="TableCaption"/>
+      </w:pPr>
+      <w:r>
+        <w:rPr>
+          <w:rFonts w:hint="eastAsia"/>
+        </w:rPr>
+        <w:t xml:space="preserve">参数来源分类与使用边界</w:t>
+      </w:r>
+    </w:p>
+    <w:tbl>
+      <w:tblPr>
+        <w:tblStyle w:val="Table"/>
+        <w:tblW w:type="auto" w:w="0"/>
+        <w:tblLook w:firstRow="1" w:lastRow="0" w:firstColumn="0" w:lastColumn="0" w:noHBand="0" w:noVBand="0" w:val="0020"/>
+        <w:tblCaption w:val="参数来源分类与使用边界"/>
+      </w:tblPr>
+      <w:tblGrid>
+        <w:gridCol w:w="2640"/>
+        <w:gridCol w:w="2640"/>
+        <w:gridCol w:w="2640"/>
+      </w:tblGrid>
+      <w:tr>
+        <w:trPr>
+          <w:tblHeader w:val="on"/>
+        </w:trPr>
+        <w:tc>
+          <w:tcPr/>
+          <w:p>
+            <w:pPr>
+              <w:pStyle w:val="Compact"/>
+              <w:jc w:val="left"/>
+            </w:pPr>
+            <w:r>
+              <w:rPr>
+                <w:rFonts w:hint="eastAsia"/>
+              </w:rPr>
+              <w:t xml:space="preserve">参数类别</w:t>
+            </w:r>
+          </w:p>
+        </w:tc>
+        <w:tc>
+          <w:tcPr/>
+          <w:p>
+            <w:pPr>
+              <w:pStyle w:val="Compact"/>
+              <w:jc w:val="left"/>
+            </w:pPr>
+            <w:r>
+              <w:rPr>
+                <w:rFonts w:hint="eastAsia"/>
+              </w:rPr>
+              <w:t xml:space="preserve">代表变量</w:t>
+            </w:r>
+          </w:p>
+        </w:tc>
+        <w:tc>
+          <w:tcPr/>
+          <w:p>
+            <w:pPr>
+              <w:pStyle w:val="Compact"/>
+              <w:jc w:val="left"/>
+            </w:pPr>
+            <w:r>
+              <w:rPr>
+                <w:rFonts w:hint="eastAsia"/>
+              </w:rPr>
+              <w:t xml:space="preserve">使用边界</w:t>
+            </w:r>
+          </w:p>
+        </w:tc>
+      </w:tr>
+      <w:tr>
+        <w:tc>
+          <w:tcPr/>
+          <w:p>
+            <w:pPr>
+              <w:pStyle w:val="Compact"/>
+              <w:jc w:val="left"/>
+            </w:pPr>
+            <w:r>
+              <w:rPr>
+                <w:rFonts w:hint="eastAsia"/>
+              </w:rPr>
+              <w:t xml:space="preserve">题面给定参数</w:t>
+            </w:r>
+          </w:p>
+        </w:tc>
+        <w:tc>
+          <w:tcPr/>
+          <w:p>
+            <w:pPr>
+              <w:pStyle w:val="Compact"/>
+              <w:jc w:val="left"/>
+            </w:pPr>
+            <w:r>
+              <w:rPr>
+                <w:rFonts w:hint="eastAsia"/>
+              </w:rPr>
+              <w:t xml:space="preserve">短期弹性</w:t>
+            </w:r>
+            <w:r>
+              <w:t xml:space="preserve"> </w:t>
+            </w:r>
+            <m:oMath>
+              <m:r>
+                <m:t>ε</m:t>
+              </m:r>
+            </m:oMath>
+            <w:r>
+              <w:rPr>
+                <w:rFonts w:hint="eastAsia"/>
+              </w:rPr>
+              <w:t xml:space="preserve">、供应中断范围、SPR</w:t>
+            </w:r>
+            <w:r>
+              <w:t xml:space="preserve"> </w:t>
+            </w:r>
+            <w:r>
+              <w:rPr>
+                <w:rFonts w:hint="eastAsia"/>
+              </w:rPr>
+              <w:t xml:space="preserve">释放上限、恐慌持续时间</w:t>
+            </w:r>
+          </w:p>
+        </w:tc>
+        <w:tc>
+          <w:tcPr/>
+          <w:p>
+            <w:pPr>
+              <w:pStyle w:val="Compact"/>
+              <w:jc w:val="left"/>
+            </w:pPr>
+            <w:r>
+              <w:rPr>
+                <w:rFonts w:hint="eastAsia"/>
+              </w:rPr>
+              <w:t xml:space="preserve">作为模型约束和传统供需基准依据，不在题面范围外任意调整</w:t>
+            </w:r>
+          </w:p>
+        </w:tc>
+      </w:tr>
+      <w:tr>
+        <w:tc>
+          <w:tcPr/>
+          <w:p>
+            <w:pPr>
+              <w:pStyle w:val="Compact"/>
+              <w:jc w:val="left"/>
+            </w:pPr>
+            <w:r>
+              <w:rPr>
+                <w:rFonts w:hint="eastAsia"/>
+              </w:rPr>
+              <w:t xml:space="preserve">附件统计量</w:t>
+            </w:r>
+          </w:p>
+        </w:tc>
+        <w:tc>
+          <w:tcPr/>
+          <w:p>
+            <w:pPr>
+              <w:pStyle w:val="Compact"/>
+              <w:jc w:val="left"/>
+            </w:pPr>
+            <w:r>
+              <w:rPr>
+                <w:rFonts w:hint="eastAsia"/>
+              </w:rPr>
+              <w:t xml:space="preserve">基准价格</w:t>
+            </w:r>
+            <w:r>
+              <w:t xml:space="preserve"> </w:t>
+            </w:r>
+            <m:oMath>
+              <m:sSub>
+                <m:e>
+                  <m:r>
+                    <m:t>P</m:t>
+                  </m:r>
+                </m:e>
+                <m:sub>
+                  <m:r>
+                    <m:t>0</m:t>
+                  </m:r>
+                </m:sub>
+              </m:sSub>
+            </m:oMath>
+            <w:r>
+              <w:rPr>
+                <w:rFonts w:hint="eastAsia"/>
+              </w:rPr>
+              <w:t xml:space="preserve">、冲突窗口真实收盘价、收益率和波动率</w:t>
+            </w:r>
+          </w:p>
+        </w:tc>
+        <w:tc>
+          <w:tcPr/>
+          <w:p>
+            <w:pPr>
+              <w:pStyle w:val="Compact"/>
+              <w:jc w:val="left"/>
+            </w:pPr>
+            <w:r>
+              <w:rPr>
+                <w:rFonts w:hint="eastAsia"/>
+              </w:rPr>
+              <w:t xml:space="preserve">作为拟合目标、误差评价和历史窗口比较依据</w:t>
+            </w:r>
+          </w:p>
+        </w:tc>
+      </w:tr>
+      <w:tr>
+        <w:tc>
+          <w:tcPr/>
+          <w:p>
+            <w:pPr>
+              <w:pStyle w:val="Compact"/>
+              <w:jc w:val="left"/>
+            </w:pPr>
+            <w:r>
+              <w:rPr>
+                <w:rFonts w:hint="eastAsia"/>
+              </w:rPr>
+              <w:t xml:space="preserve">官方外部审计量</w:t>
+            </w:r>
+          </w:p>
+        </w:tc>
+        <w:tc>
+          <w:tcPr/>
+          <w:p>
+            <w:pPr>
+              <w:pStyle w:val="Compact"/>
+              <w:jc w:val="left"/>
+            </w:pPr>
+            <w:r>
+              <w:t xml:space="preserve">EIA </w:t>
+            </w:r>
+            <w:r>
+              <w:rPr>
+                <w:rFonts w:hint="eastAsia"/>
+              </w:rPr>
+              <w:t xml:space="preserve">周度</w:t>
+            </w:r>
+            <w:r>
+              <w:t xml:space="preserve"> </w:t>
+            </w:r>
+            <w:r>
+              <w:rPr>
+                <w:rFonts w:hint="eastAsia"/>
+              </w:rPr>
+              <w:t xml:space="preserve">SPR、商业库存、原油产量，Caldara-Iacoviello</w:t>
+            </w:r>
+            <w:r>
+              <w:t xml:space="preserve"> GPR </w:t>
+            </w:r>
+            <w:r>
+              <w:rPr>
+                <w:rFonts w:hint="eastAsia"/>
+              </w:rPr>
+              <w:t xml:space="preserve">指数</w:t>
+            </w:r>
+          </w:p>
+        </w:tc>
+        <w:tc>
+          <w:tcPr/>
+          <w:p>
+            <w:pPr>
+              <w:pStyle w:val="Compact"/>
+              <w:jc w:val="left"/>
+            </w:pPr>
+            <w:r>
+              <w:rPr>
+                <w:rFonts w:hint="eastAsia"/>
+              </w:rPr>
+              <w:t xml:space="preserve">只用于审计长期约束和风险高位事实，不替代附件真实价格</w:t>
+            </w:r>
+          </w:p>
+        </w:tc>
+      </w:tr>
+      <w:tr>
+        <w:tc>
+          <w:tcPr/>
+          <w:p>
+            <w:pPr>
+              <w:pStyle w:val="Compact"/>
+              <w:jc w:val="left"/>
+            </w:pPr>
+            <w:r>
+              <w:rPr>
+                <w:rFonts w:hint="eastAsia"/>
+              </w:rPr>
+              <w:t xml:space="preserve">机制校准参数</w:t>
+            </w:r>
+          </w:p>
+        </w:tc>
+        <w:tc>
+          <w:tcPr/>
+          <w:p>
+            <w:pPr>
+              <w:pStyle w:val="Compact"/>
+              <w:jc w:val="left"/>
+            </w:pPr>
+            <w:r>
+              <w:rPr>
+                <w:rFonts w:hint="eastAsia"/>
+              </w:rPr>
+              <w:t xml:space="preserve">价格传导系数</w:t>
+            </w:r>
+            <w:r>
+              <w:t xml:space="preserve"> </w:t>
+            </w:r>
+            <m:oMath>
+              <m:r>
+                <m:t>ϕ</m:t>
+              </m:r>
+            </m:oMath>
+            <w:r>
+              <w:rPr>
+                <w:rFonts w:hint="eastAsia"/>
+              </w:rPr>
+              <w:t xml:space="preserve">、风险权重</w:t>
+            </w:r>
+            <w:r>
+              <w:t xml:space="preserve"> </w:t>
+            </w:r>
+            <m:oMath>
+              <m:r>
+                <m:t>β</m:t>
+              </m:r>
+            </m:oMath>
+            <w:r>
+              <w:rPr>
+                <w:rFonts w:hint="eastAsia"/>
+              </w:rPr>
+              <w:t xml:space="preserve">、缓冲确认强度、预期修复强度、调整速度</w:t>
+            </w:r>
+            <w:r>
+              <w:t xml:space="preserve"> </w:t>
+            </w:r>
+            <m:oMath>
+              <m:r>
+                <m:t>v</m:t>
+              </m:r>
+            </m:oMath>
+          </w:p>
+        </w:tc>
+        <w:tc>
+          <w:tcPr/>
+          <w:p>
+            <w:pPr>
+              <w:pStyle w:val="Compact"/>
+              <w:jc w:val="left"/>
+            </w:pPr>
+            <w:r>
+              <w:rPr>
+                <w:rFonts w:hint="eastAsia"/>
+              </w:rPr>
+              <w:t xml:space="preserve">在固定机制结构内校准，并接受消融、扰动和硬编码审计</w:t>
+            </w:r>
+          </w:p>
+        </w:tc>
+      </w:tr>
+      <w:tr>
+        <w:tc>
+          <w:tcPr/>
+          <w:p>
+            <w:pPr>
+              <w:pStyle w:val="Compact"/>
+              <w:jc w:val="left"/>
+            </w:pPr>
+            <w:r>
+              <w:rPr>
+                <w:rFonts w:hint="eastAsia"/>
+              </w:rPr>
+              <w:t xml:space="preserve">长期情景参数</w:t>
+            </w:r>
+          </w:p>
+        </w:tc>
+        <w:tc>
+          <w:tcPr/>
+          <w:p>
+            <w:pPr>
+              <w:pStyle w:val="Compact"/>
+              <w:jc w:val="left"/>
+            </w:pPr>
+            <w:r>
+              <w:t xml:space="preserve">OPEC+ </w:t>
+            </w:r>
+            <w:r>
+              <w:rPr>
+                <w:rFonts w:hint="eastAsia"/>
+              </w:rPr>
+              <w:t xml:space="preserve">响应、非</w:t>
+            </w:r>
+            <w:r>
+              <w:t xml:space="preserve"> OPEC </w:t>
+            </w:r>
+            <w:r>
+              <w:rPr>
+                <w:rFonts w:hint="eastAsia"/>
+              </w:rPr>
+              <w:t xml:space="preserve">供给恢复、长期弹性、制度风险强度</w:t>
+            </w:r>
+          </w:p>
+        </w:tc>
+        <w:tc>
+          <w:tcPr/>
+          <w:p>
+            <w:pPr>
+              <w:pStyle w:val="Compact"/>
+              <w:jc w:val="left"/>
+            </w:pPr>
+            <w:r>
+              <w:rPr>
+                <w:rFonts w:hint="eastAsia"/>
+              </w:rPr>
+              <w:t xml:space="preserve">只用于条件中心路径和尾部风险外推，不称为真实未来拟合</w:t>
+            </w:r>
+          </w:p>
+        </w:tc>
+      </w:tr>
+    </w:tbl>
+    <w:p>
+      <w:pPr>
+        <w:pStyle w:val="BodyText"/>
+      </w:pPr>
+      <w:r>
+        <w:rPr>
+          <w:rFonts w:hint="eastAsia"/>
+        </w:rPr>
+        <w:t xml:space="preserve">其中最容易被误读的是价格传导系数</w:t>
+      </w:r>
+      <w:r>
+        <w:t xml:space="preserve"> </w:t>
+      </w:r>
+      <m:oMath>
+        <m:r>
+          <m:t>ϕ</m:t>
+        </m:r>
+      </m:oMath>
+      <w:r>
+        <w:rPr>
+          <w:rFonts w:hint="eastAsia"/>
+        </w:rPr>
+        <w:t xml:space="preserve">。本文没有用</w:t>
+      </w:r>
+      <w:r>
+        <w:t xml:space="preserve"> </w:t>
+      </w:r>
+      <m:oMath>
+        <m:r>
+          <m:t>ϕ</m:t>
+        </m:r>
+      </m:oMath>
+      <w:r>
+        <w:t xml:space="preserve"> </w:t>
+      </w:r>
+      <w:r>
+        <w:rPr>
+          <w:rFonts w:hint="eastAsia"/>
+        </w:rPr>
+        <w:t xml:space="preserve">替换题面短期弹性</w:t>
+      </w:r>
+      <w:r>
+        <w:t xml:space="preserve"> </w:t>
+      </w:r>
+      <m:oMath>
+        <m:r>
+          <m:t>ε</m:t>
+        </m:r>
+        <m:r>
+          <m:rPr>
+            <m:sty m:val="p"/>
+          </m:rPr>
+          <m:t>=</m:t>
+        </m:r>
+        <m:r>
+          <m:rPr>
+            <m:sty m:val="p"/>
+          </m:rPr>
+          <m:t>−</m:t>
+        </m:r>
+        <m:r>
+          <m:t>0.05</m:t>
+        </m:r>
+      </m:oMath>
+      <w:r>
+        <w:rPr>
+          <w:rFonts w:hint="eastAsia"/>
+        </w:rPr>
+        <w:t xml:space="preserve">：低弹性仍用于传统供需反事实上界，解释为什么静态模型会给出</w:t>
+      </w:r>
+      <w:r>
+        <w:t xml:space="preserve"> 278–337 </w:t>
+      </w:r>
+      <w:r>
+        <w:rPr>
+          <w:rFonts w:hint="eastAsia"/>
+        </w:rPr>
+        <w:t xml:space="preserve">美元/桶的高价压力；</w:t>
+      </w:r>
+      <m:oMath>
+        <m:r>
+          <m:t>ϕ</m:t>
+        </m:r>
+      </m:oMath>
+      <w:r>
+        <w:t xml:space="preserve"> </w:t>
+      </w:r>
+      <w:r>
+        <w:rPr>
+          <w:rFonts w:hint="eastAsia"/>
+        </w:rPr>
+        <w:t xml:space="preserve">只表示在</w:t>
+      </w:r>
+      <w:r>
+        <w:t xml:space="preserve"> </w:t>
+      </w:r>
+      <w:r>
+        <w:rPr>
+          <w:rFonts w:hint="eastAsia"/>
+        </w:rPr>
+        <w:t xml:space="preserve">SPR、库存、绕道运输、需求收缩和预期修复共同存在时，剩余物理缺口进入布伦特期货目标价格的传导比例。二者分别对应</w:t>
+      </w:r>
+      <w:r>
+        <w:rPr>
+          <w:rFonts w:hint="eastAsia"/>
+        </w:rPr>
+        <w:t xml:space="preserve">“无缓冲静态供需压力”</w:t>
+      </w:r>
+      <w:r>
+        <w:rPr>
+          <w:rFonts w:hint="eastAsia"/>
+        </w:rPr>
+        <w:t xml:space="preserve">和</w:t>
+      </w:r>
+      <w:r>
+        <w:rPr>
+          <w:rFonts w:hint="eastAsia"/>
+        </w:rPr>
+        <w:t xml:space="preserve">“有缓冲期货定价传导”</w:t>
+      </w:r>
+      <w:r>
+        <w:rPr>
+          <w:rFonts w:hint="eastAsia"/>
+        </w:rPr>
+        <w:t xml:space="preserve">，经济含义不同。</w:t>
+      </w:r>
+    </w:p>
     <w:bookmarkEnd w:id="29"/>
-    <w:bookmarkStart w:id="35" w:name="传统供需基准模型"/>
+    <w:bookmarkEnd w:id="30"/>
+    <w:bookmarkStart w:id="36" w:name="传统供需基准模型"/>
     <w:p>
       <w:pPr>
         <w:pStyle w:val="Heading1"/>
@@ -3917,7 +4501,7 @@
         <w:t xml:space="preserve">传统供需基准模型</w:t>
       </w:r>
     </w:p>
-    <w:bookmarkStart w:id="30" w:name="模型建立"/>
+    <w:bookmarkStart w:id="31" w:name="模型建立"/>
     <w:p>
       <w:pPr>
         <w:pStyle w:val="Heading2"/>
@@ -4194,8 +4778,8 @@
         <w:t xml:space="preserve">万桶/日。</w:t>
       </w:r>
     </w:p>
-    <w:bookmarkEnd w:id="30"/>
-    <w:bookmarkStart w:id="34" w:name="基准模型结果"/>
+    <w:bookmarkEnd w:id="31"/>
+    <w:bookmarkStart w:id="35" w:name="基准模型结果"/>
     <w:p>
       <w:pPr>
         <w:pStyle w:val="Heading2"/>
@@ -4465,18 +5049,18 @@
           <wp:inline>
             <wp:extent cx="4693920" cy="2560320"/>
             <wp:effectExtent b="0" l="0" r="0" t="0"/>
-            <wp:docPr descr="" title="" id="32" name="Picture"/>
+            <wp:docPr descr="" title="" id="33" name="Picture"/>
             <a:graphic>
               <a:graphicData uri="http://schemas.openxmlformats.org/drawingml/2006/picture">
                 <pic:pic>
                   <pic:nvPicPr>
-                    <pic:cNvPr descr="baseline_vs_actual.png" id="33" name="Picture"/>
+                    <pic:cNvPr descr="baseline_vs_actual.png" id="34" name="Picture"/>
                     <pic:cNvPicPr>
                       <a:picLocks noChangeArrowheads="1" noChangeAspect="1"/>
                     </pic:cNvPicPr>
                   </pic:nvPicPr>
                   <pic:blipFill>
-                    <a:blip r:embed="rId31"/>
+                    <a:blip r:embed="rId32"/>
                     <a:stretch>
                       <a:fillRect/>
                     </a:stretch>
@@ -4552,9 +5136,9 @@
         <w:t xml:space="preserve">SPR、库存、绕道运输、需求收缩和市场预期修复。</w:t>
       </w:r>
     </w:p>
-    <w:bookmarkEnd w:id="34"/>
     <w:bookmarkEnd w:id="35"/>
-    <w:bookmarkStart w:id="38" w:name="综合机制递推模型"/>
+    <w:bookmarkEnd w:id="36"/>
+    <w:bookmarkStart w:id="39" w:name="综合机制递推模型"/>
     <w:p>
       <w:pPr>
         <w:pStyle w:val="Heading1"/>
@@ -4586,7 +5170,7 @@
         <w:t xml:space="preserve">天情景外推提供统一机制基础。</w:t>
       </w:r>
     </w:p>
-    <w:bookmarkStart w:id="36" w:name="物理供需层"/>
+    <w:bookmarkStart w:id="37" w:name="物理供需层"/>
     <w:p>
       <w:pPr>
         <w:pStyle w:val="Heading2"/>
@@ -5292,8 +5876,8 @@
         </m:oMath>
       </m:oMathPara>
     </w:p>
-    <w:bookmarkEnd w:id="36"/>
-    <w:bookmarkStart w:id="37" w:name="市场价格形成层"/>
+    <w:bookmarkEnd w:id="37"/>
+    <w:bookmarkStart w:id="38" w:name="市场价格形成层"/>
     <w:p>
       <w:pPr>
         <w:pStyle w:val="Heading2"/>
@@ -6007,12 +6591,12 @@
         <w:rPr>
           <w:rFonts w:hint="eastAsia"/>
         </w:rPr>
-        <w:t xml:space="preserve">该结构保留了题面中的离散递推思想，同时允许期货市场对风险和预期做非线性再定价。</w:t>
-      </w:r>
-    </w:p>
-    <w:bookmarkEnd w:id="37"/>
+        <w:t xml:space="preserve">该结构保留了题面中的离散递推思想，同时允许期货市场对风险和预期做非线性再定价。需要强调，本文不把市场价格形成层视为任意补丁：风险溢价、缓冲确认折价和预期修复折价只有在具有经济含义、方向可解释、消融后误差明显恶化且扰动后结论保持稳定时才保留在主模型中。</w:t>
+      </w:r>
+    </w:p>
     <w:bookmarkEnd w:id="38"/>
-    <w:bookmarkStart w:id="75" w:name="参数校准与模型检验"/>
+    <w:bookmarkEnd w:id="39"/>
+    <w:bookmarkStart w:id="76" w:name="参数校准与模型检验"/>
     <w:p>
       <w:pPr>
         <w:pStyle w:val="Heading1"/>
@@ -6024,7 +6608,7 @@
         <w:t xml:space="preserve">参数校准与模型检验</w:t>
       </w:r>
     </w:p>
-    <w:bookmarkStart w:id="39" w:name="多目标校准"/>
+    <w:bookmarkStart w:id="40" w:name="多目标校准"/>
     <w:p>
       <w:pPr>
         <w:pStyle w:val="Heading2"/>
@@ -7108,8 +7692,28 @@
         </w:tc>
       </w:tr>
     </w:tbl>
-    <w:bookmarkEnd w:id="39"/>
-    <w:bookmarkStart w:id="46" w:name="拟合结果"/>
+    <w:p>
+      <w:pPr>
+        <w:pStyle w:val="BodyText"/>
+      </w:pPr>
+      <w:r>
+        <w:rPr>
+          <w:rFonts w:hint="eastAsia"/>
+        </w:rPr>
+        <w:t xml:space="preserve">表中参数可分为两类理解：供应中断量、SPR</w:t>
+      </w:r>
+      <w:r>
+        <w:t xml:space="preserve"> </w:t>
+      </w:r>
+      <w:r>
+        <w:rPr>
+          <w:rFonts w:hint="eastAsia"/>
+        </w:rPr>
+        <w:t xml:space="preserve">上限、绕道能力、库存缓冲和需求弹性受题面范围约束；风险权重、价格调整速度、缓冲确认和预期修复强度属于行为价格形成参数，必须依赖数据校准和防御性检验。本文后续所有模型评价均围绕这一区分展开，避免把校准参数包装成外生事实。</w:t>
+      </w:r>
+    </w:p>
+    <w:bookmarkEnd w:id="40"/>
+    <w:bookmarkStart w:id="47" w:name="拟合结果"/>
     <w:p>
       <w:pPr>
         <w:pStyle w:val="Heading2"/>
@@ -7231,18 +7835,18 @@
           <wp:inline>
             <wp:extent cx="4907280" cy="2587474"/>
             <wp:effectExtent b="0" l="0" r="0" t="0"/>
-            <wp:docPr descr="" title="" id="41" name="Picture"/>
+            <wp:docPr descr="" title="" id="42" name="Picture"/>
             <a:graphic>
               <a:graphicData uri="http://schemas.openxmlformats.org/drawingml/2006/picture">
                 <pic:pic>
                   <pic:nvPicPr>
-                    <pic:cNvPr descr="短期模型拟合效果.png" id="42" name="Picture"/>
+                    <pic:cNvPr descr="短期模型拟合效果.png" id="43" name="Picture"/>
                     <pic:cNvPicPr>
                       <a:picLocks noChangeArrowheads="1" noChangeAspect="1"/>
                     </pic:cNvPicPr>
                   </pic:nvPicPr>
                   <pic:blipFill>
-                    <a:blip r:embed="rId40"/>
+                    <a:blip r:embed="rId41"/>
                     <a:stretch>
                       <a:fillRect/>
                     </a:stretch>
@@ -7779,18 +8383,18 @@
           <wp:inline>
             <wp:extent cx="4907280" cy="2765921"/>
             <wp:effectExtent b="0" l="0" r="0" t="0"/>
-            <wp:docPr descr="" title="" id="44" name="Picture"/>
+            <wp:docPr descr="" title="" id="45" name="Picture"/>
             <a:graphic>
               <a:graphicData uri="http://schemas.openxmlformats.org/drawingml/2006/picture">
                 <pic:pic>
                   <pic:nvPicPr>
-                    <pic:cNvPr descr="短期模型机制贡献.png" id="45" name="Picture"/>
+                    <pic:cNvPr descr="短期模型机制贡献.png" id="46" name="Picture"/>
                     <pic:cNvPicPr>
                       <a:picLocks noChangeArrowheads="1" noChangeAspect="1"/>
                     </pic:cNvPicPr>
                   </pic:nvPicPr>
                   <pic:blipFill>
-                    <a:blip r:embed="rId43"/>
+                    <a:blip r:embed="rId44"/>
                     <a:stretch>
                       <a:fillRect/>
                     </a:stretch>
@@ -7828,8 +8432,8 @@
         <w:t xml:space="preserve">短期模型机制贡献分解。风险溢价推升价格，缓冲确认和预期修复压低价格。</w:t>
       </w:r>
     </w:p>
-    <w:bookmarkEnd w:id="46"/>
-    <w:bookmarkStart w:id="53" w:name="基准对比与防御性检验"/>
+    <w:bookmarkEnd w:id="47"/>
+    <w:bookmarkStart w:id="54" w:name="基准对比与防御性检验"/>
     <w:p>
       <w:pPr>
         <w:pStyle w:val="Heading2"/>
@@ -8736,18 +9340,18 @@
           <wp:inline>
             <wp:extent cx="4587240" cy="2533904"/>
             <wp:effectExtent b="0" l="0" r="0" t="0"/>
-            <wp:docPr descr="" title="" id="48" name="Picture"/>
+            <wp:docPr descr="" title="" id="49" name="Picture"/>
             <a:graphic>
               <a:graphicData uri="http://schemas.openxmlformats.org/drawingml/2006/picture">
                 <pic:pic>
                   <pic:nvPicPr>
-                    <pic:cNvPr descr="短期模型基准对比.png" id="49" name="Picture"/>
+                    <pic:cNvPr descr="短期模型基准对比.png" id="50" name="Picture"/>
                     <pic:cNvPicPr>
                       <a:picLocks noChangeArrowheads="1" noChangeAspect="1"/>
                     </pic:cNvPicPr>
                   </pic:nvPicPr>
                   <pic:blipFill>
-                    <a:blip r:embed="rId47"/>
+                    <a:blip r:embed="rId48"/>
                     <a:stretch>
                       <a:fillRect/>
                     </a:stretch>
@@ -8910,18 +9514,18 @@
           <wp:inline>
             <wp:extent cx="4480560" cy="2594008"/>
             <wp:effectExtent b="0" l="0" r="0" t="0"/>
-            <wp:docPr descr="" title="" id="51" name="Picture"/>
+            <wp:docPr descr="" title="" id="52" name="Picture"/>
             <a:graphic>
               <a:graphicData uri="http://schemas.openxmlformats.org/drawingml/2006/picture">
                 <pic:pic>
                   <pic:nvPicPr>
-                    <pic:cNvPr descr="短期模型滞后平移检验.png" id="52" name="Picture"/>
+                    <pic:cNvPr descr="短期模型滞后平移检验.png" id="53" name="Picture"/>
                     <pic:cNvPicPr>
                       <a:picLocks noChangeArrowheads="1" noChangeAspect="1"/>
                     </pic:cNvPicPr>
                   </pic:nvPicPr>
                   <pic:blipFill>
-                    <a:blip r:embed="rId50"/>
+                    <a:blip r:embed="rId51"/>
                     <a:stretch>
                       <a:fillRect/>
                     </a:stretch>
@@ -8968,8 +9572,8 @@
         <w:t xml:space="preserve">检验。原始位置误差最低。</w:t>
       </w:r>
     </w:p>
-    <w:bookmarkEnd w:id="53"/>
-    <w:bookmarkStart w:id="60" w:name="机制消融与过拟合防御"/>
+    <w:bookmarkEnd w:id="54"/>
+    <w:bookmarkStart w:id="61" w:name="机制消融与过拟合防御"/>
     <w:p>
       <w:pPr>
         <w:pStyle w:val="Heading2"/>
@@ -9073,18 +9677,18 @@
           <wp:inline>
             <wp:extent cx="4800600" cy="2480310"/>
             <wp:effectExtent b="0" l="0" r="0" t="0"/>
-            <wp:docPr descr="" title="" id="55" name="Picture"/>
+            <wp:docPr descr="" title="" id="56" name="Picture"/>
             <a:graphic>
               <a:graphicData uri="http://schemas.openxmlformats.org/drawingml/2006/picture">
                 <pic:pic>
                   <pic:nvPicPr>
-                    <pic:cNvPr descr="短期模型机制消融实验.png" id="56" name="Picture"/>
+                    <pic:cNvPr descr="短期模型机制消融实验.png" id="57" name="Picture"/>
                     <pic:cNvPicPr>
                       <a:picLocks noChangeArrowheads="1" noChangeAspect="1"/>
                     </pic:cNvPicPr>
                   </pic:nvPicPr>
                   <pic:blipFill>
-                    <a:blip r:embed="rId54"/>
+                    <a:blip r:embed="rId55"/>
                     <a:stretch>
                       <a:fillRect/>
                     </a:stretch>
@@ -9228,18 +9832,18 @@
           <wp:inline>
             <wp:extent cx="4693920" cy="2048256"/>
             <wp:effectExtent b="0" l="0" r="0" t="0"/>
-            <wp:docPr descr="" title="" id="58" name="Picture"/>
+            <wp:docPr descr="" title="" id="59" name="Picture"/>
             <a:graphic>
               <a:graphicData uri="http://schemas.openxmlformats.org/drawingml/2006/picture">
                 <pic:pic>
                   <pic:nvPicPr>
-                    <pic:cNvPr descr="短期模型过拟合压力测试.png" id="59" name="Picture"/>
+                    <pic:cNvPr descr="短期模型过拟合压力测试.png" id="60" name="Picture"/>
                     <pic:cNvPicPr>
                       <a:picLocks noChangeArrowheads="1" noChangeAspect="1"/>
                     </pic:cNvPicPr>
                   </pic:nvPicPr>
                   <pic:blipFill>
-                    <a:blip r:embed="rId57"/>
+                    <a:blip r:embed="rId58"/>
                     <a:stretch>
                       <a:fillRect/>
                     </a:stretch>
@@ -9277,8 +9881,8 @@
         <w:t xml:space="preserve">短期模型过拟合压力测试。多数扰动样本仍保持在合理价格平台附近。</w:t>
       </w:r>
     </w:p>
-    <w:bookmarkEnd w:id="60"/>
-    <w:bookmarkStart w:id="64" w:name="分段误差与残差诊断"/>
+    <w:bookmarkEnd w:id="61"/>
+    <w:bookmarkStart w:id="65" w:name="分段误差与残差诊断"/>
     <w:p>
       <w:pPr>
         <w:pStyle w:val="Heading2"/>
@@ -9355,18 +9959,18 @@
           <wp:inline>
             <wp:extent cx="4907280" cy="3655675"/>
             <wp:effectExtent b="0" l="0" r="0" t="0"/>
-            <wp:docPr descr="" title="" id="62" name="Picture"/>
+            <wp:docPr descr="" title="" id="63" name="Picture"/>
             <a:graphic>
               <a:graphicData uri="http://schemas.openxmlformats.org/drawingml/2006/picture">
                 <pic:pic>
                   <pic:nvPicPr>
-                    <pic:cNvPr descr="短期模型残差诊断增强.png" id="63" name="Picture"/>
+                    <pic:cNvPr descr="短期模型残差诊断增强.png" id="64" name="Picture"/>
                     <pic:cNvPicPr>
                       <a:picLocks noChangeArrowheads="1" noChangeAspect="1"/>
                     </pic:cNvPicPr>
                   </pic:nvPicPr>
                   <pic:blipFill>
-                    <a:blip r:embed="rId61"/>
+                    <a:blip r:embed="rId62"/>
                     <a:stretch>
                       <a:fillRect/>
                     </a:stretch>
@@ -9433,8 +10037,8 @@
         <w:t xml:space="preserve">0.254，说明仍存在一定连续偏差，但未形成明显强自相关。</w:t>
       </w:r>
     </w:p>
-    <w:bookmarkEnd w:id="64"/>
-    <w:bookmarkStart w:id="65" w:name="机制消融的定量证据"/>
+    <w:bookmarkEnd w:id="65"/>
+    <w:bookmarkStart w:id="66" w:name="机制消融的定量证据"/>
     <w:p>
       <w:pPr>
         <w:pStyle w:val="Heading2"/>
@@ -10355,8 +10959,8 @@
         <w:t xml:space="preserve">10.09，说明市场对政策缓冲和运输恢复的预期并不是可有可无的修饰，而是解释后期回落的关键机制。</w:t>
       </w:r>
     </w:p>
-    <w:bookmarkEnd w:id="65"/>
-    <w:bookmarkStart w:id="69" w:name="拐点预测步长与事件边界"/>
+    <w:bookmarkEnd w:id="66"/>
+    <w:bookmarkStart w:id="70" w:name="拐点预测步长与事件边界"/>
     <w:p>
       <w:pPr>
         <w:pStyle w:val="Heading2"/>
@@ -10479,18 +11083,18 @@
           <wp:inline>
             <wp:extent cx="4907280" cy="3568930"/>
             <wp:effectExtent b="0" l="0" r="0" t="0"/>
-            <wp:docPr descr="" title="" id="67" name="Picture"/>
+            <wp:docPr descr="" title="" id="68" name="Picture"/>
             <a:graphic>
               <a:graphicData uri="http://schemas.openxmlformats.org/drawingml/2006/picture">
                 <pic:pic>
                   <pic:nvPicPr>
-                    <pic:cNvPr descr="短期模型拐点局部检验.png" id="68" name="Picture"/>
+                    <pic:cNvPr descr="短期模型拐点局部检验.png" id="69" name="Picture"/>
                     <pic:cNvPicPr>
                       <a:picLocks noChangeArrowheads="1" noChangeAspect="1"/>
                     </pic:cNvPicPr>
                   </pic:nvPicPr>
                   <pic:blipFill>
-                    <a:blip r:embed="rId66"/>
+                    <a:blip r:embed="rId67"/>
                     <a:stretch>
                       <a:fillRect/>
                     </a:stretch>
@@ -10557,8 +11161,8 @@
         <w:t xml:space="preserve">年等非霍尔木兹事件窗口。结果显示，该模型在这些窗口通常显著弱于朴素上一日基准。这并不削弱本文结论，反而说明本文模型不是通用油价短线交易器，而是针对霍尔木兹封锁机制构建的事件解释模型。论文结论应限定在极端地缘冲突下的条件路径解释与情景预测，不能外推为普通时期的万能预测模型。</w:t>
       </w:r>
     </w:p>
-    <w:bookmarkEnd w:id="69"/>
-    <w:bookmarkStart w:id="73" w:name="参数自由度与稳健性区间"/>
+    <w:bookmarkEnd w:id="70"/>
+    <w:bookmarkStart w:id="74" w:name="参数自由度与稳健性区间"/>
     <w:p>
       <w:pPr>
         <w:pStyle w:val="Heading2"/>
@@ -11204,18 +11808,18 @@
           <wp:inline>
             <wp:extent cx="4907280" cy="2587474"/>
             <wp:effectExtent b="0" l="0" r="0" t="0"/>
-            <wp:docPr descr="" title="" id="71" name="Picture"/>
+            <wp:docPr descr="" title="" id="72" name="Picture"/>
             <a:graphic>
               <a:graphicData uri="http://schemas.openxmlformats.org/drawingml/2006/picture">
                 <pic:pic>
                   <pic:nvPicPr>
-                    <pic:cNvPr descr="短期模型稳健性带.png" id="72" name="Picture"/>
+                    <pic:cNvPr descr="短期模型稳健性带.png" id="73" name="Picture"/>
                     <pic:cNvPicPr>
                       <a:picLocks noChangeArrowheads="1" noChangeAspect="1"/>
                     </pic:cNvPicPr>
                   </pic:nvPicPr>
                   <pic:blipFill>
-                    <a:blip r:embed="rId70"/>
+                    <a:blip r:embed="rId71"/>
                     <a:stretch>
                       <a:fillRect/>
                     </a:stretch>
@@ -11390,8 +11994,8 @@
         <w:t xml:space="preserve">美元/桶，说明最优参数附近存在稳定的优秀参数邻域。</w:t>
       </w:r>
     </w:p>
-    <w:bookmarkEnd w:id="73"/>
-    <w:bookmarkStart w:id="74" w:name="内生性反事实基准与硬编码审计"/>
+    <w:bookmarkEnd w:id="74"/>
+    <w:bookmarkStart w:id="75" w:name="内生性反事实基准与硬编码审计"/>
     <w:p>
       <w:pPr>
         <w:pStyle w:val="Heading2"/>
@@ -11688,9 +12292,9 @@
         <w:t xml:space="preserve">美元平台不是代码硬上限，但不应声称已经实现了多智能体动态纳什均衡。</w:t>
       </w:r>
     </w:p>
-    <w:bookmarkEnd w:id="74"/>
     <w:bookmarkEnd w:id="75"/>
-    <w:bookmarkStart w:id="84" w:name="天三情景预测"/>
+    <w:bookmarkEnd w:id="76"/>
+    <w:bookmarkStart w:id="85" w:name="天三情景预测"/>
     <w:p>
       <w:pPr>
         <w:pStyle w:val="Heading1"/>
@@ -11705,7 +12309,7 @@
         <w:t xml:space="preserve">天三情景预测</w:t>
       </w:r>
     </w:p>
-    <w:bookmarkStart w:id="76" w:name="情景设定"/>
+    <w:bookmarkStart w:id="77" w:name="情景设定"/>
     <w:p>
       <w:pPr>
         <w:pStyle w:val="Heading2"/>
@@ -11865,6 +12469,97 @@
           <w:rFonts w:hint="eastAsia"/>
         </w:rPr>
         <w:t xml:space="preserve">收缩、需求弹性调整和风险溢价衰减等慢变量；真实市场中的新闻冲击、风险偏好变化和短期波动会使实际价格围绕中心路径震荡。因此，本文不以中性线是否逐日命中未来价格作为长期模型质量标准，而以机制合理性、官方外生数据审计、敏感性分析和蒙特卡洛概率区间共同评价长期预测可信度。</w:t>
+      </w:r>
+    </w:p>
+    <w:p>
+      <w:pPr>
+        <w:pStyle w:val="BodyText"/>
+      </w:pPr>
+      <w:r>
+        <w:rPr>
+          <w:rFonts w:hint="eastAsia"/>
+        </w:rPr>
+        <w:t xml:space="preserve">换言之，长期部分的正确读法不是</w:t>
+      </w:r>
+      <w:r>
+        <w:rPr>
+          <w:rFonts w:hint="eastAsia"/>
+        </w:rPr>
+        <w:t xml:space="preserve">“第</w:t>
+      </w:r>
+      <w:r>
+        <w:t xml:space="preserve"> 180 </w:t>
+      </w:r>
+      <w:r>
+        <w:rPr>
+          <w:rFonts w:hint="eastAsia"/>
+        </w:rPr>
+        <w:t xml:space="preserve">天一定等于</w:t>
+      </w:r>
+      <w:r>
+        <w:t xml:space="preserve"> 98.61 </w:t>
+      </w:r>
+      <w:r>
+        <w:rPr>
+          <w:rFonts w:hint="eastAsia"/>
+        </w:rPr>
+        <w:t xml:space="preserve">美元/桶”</w:t>
+      </w:r>
+      <w:r>
+        <w:rPr>
+          <w:rFonts w:hint="eastAsia"/>
+        </w:rPr>
+        <w:t xml:space="preserve">，而是</w:t>
+      </w:r>
+      <w:r>
+        <w:rPr>
+          <w:rFonts w:hint="eastAsia"/>
+        </w:rPr>
+        <w:t xml:space="preserve">“在中性政策缓冲、供给恢复和风险溢价衰减假设下，中心路径收敛到约</w:t>
+      </w:r>
+      <w:r>
+        <w:t xml:space="preserve"> 100 </w:t>
+      </w:r>
+      <w:r>
+        <w:rPr>
+          <w:rFonts w:hint="eastAsia"/>
+        </w:rPr>
+        <w:t xml:space="preserve">美元/桶附近；若多个不利因素同时出现，价格仍可能进入</w:t>
+      </w:r>
+      <w:r>
+        <w:t xml:space="preserve"> 120 </w:t>
+      </w:r>
+      <w:r>
+        <w:rPr>
+          <w:rFonts w:hint="eastAsia"/>
+        </w:rPr>
+        <w:t xml:space="preserve">美元/桶以上的尾部区间”</w:t>
+      </w:r>
+      <w:r>
+        <w:rPr>
+          <w:rFonts w:hint="eastAsia"/>
+        </w:rPr>
+        <w:t xml:space="preserve">。因此，三情景中心线需要与第</w:t>
+      </w:r>
+      <w:r>
+        <w:t xml:space="preserve"> </w:t>
+      </w:r>
+      <w:hyperlink w:anchor="sec:monte-carlo">
+        <w:r>
+          <w:rPr>
+            <w:rStyle w:val="Hyperlink"/>
+          </w:rPr>
+          <w:t xml:space="preserve">9.3</w:t>
+        </w:r>
+      </w:hyperlink>
+      <w:r>
+        <w:t xml:space="preserve"> </w:t>
+      </w:r>
+      <w:r>
+        <w:rPr>
+          <w:rFonts w:hint="eastAsia"/>
+        </w:rPr>
+        <w:t xml:space="preserve">节蒙特卡洛扇形区间合读。</w:t>
       </w:r>
     </w:p>
     <w:p>
@@ -13662,8 +14357,46 @@
         </w:tc>
       </w:tr>
     </w:tbl>
-    <w:bookmarkEnd w:id="76"/>
-    <w:bookmarkStart w:id="83" w:name="预测结果"/>
+    <w:p>
+      <w:pPr>
+        <w:pStyle w:val="BodyText"/>
+      </w:pPr>
+      <w:r>
+        <w:rPr>
+          <w:rFonts w:hint="eastAsia"/>
+        </w:rPr>
+        <w:t xml:space="preserve">三情景参数并非三组孤立猜测。乐观情景代表高</w:t>
+      </w:r>
+      <w:r>
+        <w:t xml:space="preserve"> SPR </w:t>
+      </w:r>
+      <w:r>
+        <w:rPr>
+          <w:rFonts w:hint="eastAsia"/>
+        </w:rPr>
+        <w:t xml:space="preserve">可用量、绕道恢复较充分、长期需求调整较快；悲观情景代表供应中断接近上界、SPR</w:t>
+      </w:r>
+      <w:r>
+        <w:t xml:space="preserve"> </w:t>
+      </w:r>
+      <w:r>
+        <w:rPr>
+          <w:rFonts w:hint="eastAsia"/>
+        </w:rPr>
+        <w:t xml:space="preserve">释放受限、绕道能力偏低且制度风险溢价持续；中性情景则采用阶段</w:t>
+      </w:r>
+      <w:r>
+        <w:t xml:space="preserve"> 4 </w:t>
+      </w:r>
+      <w:r>
+        <w:rPr>
+          <w:rFonts w:hint="eastAsia"/>
+        </w:rPr>
+        <w:t xml:space="preserve">综合最优参数附近的中心设定。后续敏感性分析和蒙特卡洛抽样用于检验：当这些假设联合变化时，价格中心路径和尾部风险是否仍保持一致。</w:t>
+      </w:r>
+    </w:p>
+    <w:bookmarkEnd w:id="77"/>
+    <w:bookmarkStart w:id="84" w:name="预测结果"/>
     <w:p>
       <w:pPr>
         <w:pStyle w:val="Heading2"/>
@@ -14153,18 +14886,18 @@
           <wp:inline>
             <wp:extent cx="5013960" cy="2757678"/>
             <wp:effectExtent b="0" l="0" r="0" t="0"/>
-            <wp:docPr descr="" title="" id="78" name="Picture"/>
+            <wp:docPr descr="" title="" id="79" name="Picture"/>
             <a:graphic>
               <a:graphicData uri="http://schemas.openxmlformats.org/drawingml/2006/picture">
                 <pic:pic>
                   <pic:nvPicPr>
-                    <pic:cNvPr descr="短期拟合与长期预测总览.png" id="79" name="Picture"/>
+                    <pic:cNvPr descr="短期拟合与长期预测总览.png" id="80" name="Picture"/>
                     <pic:cNvPicPr>
                       <a:picLocks noChangeArrowheads="1" noChangeAspect="1"/>
                     </pic:cNvPicPr>
                   </pic:nvPicPr>
                   <pic:blipFill>
-                    <a:blip r:embed="rId77"/>
+                    <a:blip r:embed="rId78"/>
                     <a:stretch>
                       <a:fillRect/>
                     </a:stretch>
@@ -14269,6 +15002,331 @@
     </w:p>
     <w:p>
       <w:pPr>
+        <w:pStyle w:val="TableCaption"/>
+      </w:pPr>
+      <w:r>
+        <w:rPr>
+          <w:rFonts w:hint="eastAsia"/>
+        </w:rPr>
+        <w:t xml:space="preserve">长期情景预测的可信度评价框架</w:t>
+      </w:r>
+    </w:p>
+    <w:tbl>
+      <w:tblPr>
+        <w:tblStyle w:val="Table"/>
+        <w:tblW w:type="auto" w:w="0"/>
+        <w:tblLook w:firstRow="1" w:lastRow="0" w:firstColumn="0" w:lastColumn="0" w:noHBand="0" w:noVBand="0" w:val="0020"/>
+        <w:tblCaption w:val="长期情景预测的可信度评价框架"/>
+      </w:tblPr>
+      <w:tblGrid>
+        <w:gridCol w:w="2640"/>
+        <w:gridCol w:w="2640"/>
+        <w:gridCol w:w="2640"/>
+      </w:tblGrid>
+      <w:tr>
+        <w:trPr>
+          <w:tblHeader w:val="on"/>
+        </w:trPr>
+        <w:tc>
+          <w:tcPr/>
+          <w:p>
+            <w:pPr>
+              <w:pStyle w:val="Compact"/>
+              <w:jc w:val="left"/>
+            </w:pPr>
+            <w:r>
+              <w:rPr>
+                <w:rFonts w:hint="eastAsia"/>
+              </w:rPr>
+              <w:t xml:space="preserve">评价维度</w:t>
+            </w:r>
+          </w:p>
+        </w:tc>
+        <w:tc>
+          <w:tcPr/>
+          <w:p>
+            <w:pPr>
+              <w:pStyle w:val="Compact"/>
+              <w:jc w:val="left"/>
+            </w:pPr>
+            <w:r>
+              <w:rPr>
+                <w:rFonts w:hint="eastAsia"/>
+              </w:rPr>
+              <w:t xml:space="preserve">本文证据</w:t>
+            </w:r>
+          </w:p>
+        </w:tc>
+        <w:tc>
+          <w:tcPr/>
+          <w:p>
+            <w:pPr>
+              <w:pStyle w:val="Compact"/>
+              <w:jc w:val="left"/>
+            </w:pPr>
+            <w:r>
+              <w:rPr>
+                <w:rFonts w:hint="eastAsia"/>
+              </w:rPr>
+              <w:t xml:space="preserve">解释边界</w:t>
+            </w:r>
+          </w:p>
+        </w:tc>
+      </w:tr>
+      <w:tr>
+        <w:tc>
+          <w:tcPr/>
+          <w:p>
+            <w:pPr>
+              <w:pStyle w:val="Compact"/>
+              <w:jc w:val="left"/>
+            </w:pPr>
+            <w:r>
+              <w:rPr>
+                <w:rFonts w:hint="eastAsia"/>
+              </w:rPr>
+              <w:t xml:space="preserve">机制一致性</w:t>
+            </w:r>
+          </w:p>
+        </w:tc>
+        <w:tc>
+          <w:tcPr/>
+          <w:p>
+            <w:pPr>
+              <w:pStyle w:val="Compact"/>
+              <w:jc w:val="left"/>
+            </w:pPr>
+            <w:r>
+              <w:t xml:space="preserve">SPR </w:t>
+            </w:r>
+            <w:r>
+              <w:rPr>
+                <w:rFonts w:hint="eastAsia"/>
+              </w:rPr>
+              <w:t xml:space="preserve">自适应收缩、长期需求弹性、供给恢复和风险溢价衰减进入同一递推式</w:t>
+            </w:r>
+          </w:p>
+        </w:tc>
+        <w:tc>
+          <w:tcPr/>
+          <w:p>
+            <w:pPr>
+              <w:pStyle w:val="Compact"/>
+              <w:jc w:val="left"/>
+            </w:pPr>
+            <w:r>
+              <w:rPr>
+                <w:rFonts w:hint="eastAsia"/>
+              </w:rPr>
+              <w:t xml:space="preserve">检验情景逻辑是否自洽，不代表未来真实价格已经被验证</w:t>
+            </w:r>
+          </w:p>
+        </w:tc>
+      </w:tr>
+      <w:tr>
+        <w:tc>
+          <w:tcPr/>
+          <w:p>
+            <w:pPr>
+              <w:pStyle w:val="Compact"/>
+              <w:jc w:val="left"/>
+            </w:pPr>
+            <w:r>
+              <w:rPr>
+                <w:rFonts w:hint="eastAsia"/>
+              </w:rPr>
+              <w:t xml:space="preserve">外部数量级审计</w:t>
+            </w:r>
+          </w:p>
+        </w:tc>
+        <w:tc>
+          <w:tcPr/>
+          <w:p>
+            <w:pPr>
+              <w:pStyle w:val="Compact"/>
+              <w:jc w:val="left"/>
+            </w:pPr>
+            <w:r>
+              <w:t xml:space="preserve">EIA </w:t>
+            </w:r>
+            <w:r>
+              <w:rPr>
+                <w:rFonts w:hint="eastAsia"/>
+              </w:rPr>
+              <w:t xml:space="preserve">周度</w:t>
+            </w:r>
+            <w:r>
+              <w:t xml:space="preserve"> </w:t>
+            </w:r>
+            <w:r>
+              <w:rPr>
+                <w:rFonts w:hint="eastAsia"/>
+              </w:rPr>
+              <w:t xml:space="preserve">SPR、商业库存和美国原油产量用于审计缓冲能力与供给恢复速度</w:t>
+            </w:r>
+          </w:p>
+        </w:tc>
+        <w:tc>
+          <w:tcPr/>
+          <w:p>
+            <w:pPr>
+              <w:pStyle w:val="Compact"/>
+              <w:jc w:val="left"/>
+            </w:pPr>
+            <w:r>
+              <w:rPr>
+                <w:rFonts w:hint="eastAsia"/>
+              </w:rPr>
+              <w:t xml:space="preserve">美国口径不能直接替代全球参数，只提供保守约束</w:t>
+            </w:r>
+          </w:p>
+        </w:tc>
+      </w:tr>
+      <w:tr>
+        <w:tc>
+          <w:tcPr/>
+          <w:p>
+            <w:pPr>
+              <w:pStyle w:val="Compact"/>
+              <w:jc w:val="left"/>
+            </w:pPr>
+            <w:r>
+              <w:rPr>
+                <w:rFonts w:hint="eastAsia"/>
+              </w:rPr>
+              <w:t xml:space="preserve">单因素敏感性</w:t>
+            </w:r>
+          </w:p>
+        </w:tc>
+        <w:tc>
+          <w:tcPr/>
+          <w:p>
+            <w:pPr>
+              <w:pStyle w:val="Compact"/>
+              <w:jc w:val="left"/>
+            </w:pPr>
+            <w:r>
+              <w:rPr>
+                <w:rFonts w:hint="eastAsia"/>
+              </w:rPr>
+              <w:t xml:space="preserve">第</w:t>
+            </w:r>
+            <w:r>
+              <w:t xml:space="preserve"> 180 </w:t>
+            </w:r>
+            <w:r>
+              <w:rPr>
+                <w:rFonts w:hint="eastAsia"/>
+              </w:rPr>
+              <w:t xml:space="preserve">天价格对制度风险、地缘风险权重和供应中断量最敏感</w:t>
+            </w:r>
+          </w:p>
+        </w:tc>
+        <w:tc>
+          <w:tcPr/>
+          <w:p>
+            <w:pPr>
+              <w:pStyle w:val="Compact"/>
+              <w:jc w:val="left"/>
+            </w:pPr>
+            <w:r>
+              <w:rPr>
+                <w:rFonts w:hint="eastAsia"/>
+              </w:rPr>
+              <w:t xml:space="preserve">识别关键变量，不给出联合概率</w:t>
+            </w:r>
+          </w:p>
+        </w:tc>
+      </w:tr>
+      <w:tr>
+        <w:tc>
+          <w:tcPr/>
+          <w:p>
+            <w:pPr>
+              <w:pStyle w:val="Compact"/>
+              <w:jc w:val="left"/>
+            </w:pPr>
+            <w:r>
+              <w:rPr>
+                <w:rFonts w:hint="eastAsia"/>
+              </w:rPr>
+              <w:t xml:space="preserve">蒙特卡洛情景树</w:t>
+            </w:r>
+          </w:p>
+        </w:tc>
+        <w:tc>
+          <w:tcPr/>
+          <w:p>
+            <w:pPr>
+              <w:pStyle w:val="Compact"/>
+              <w:jc w:val="left"/>
+            </w:pPr>
+            <w:r>
+              <w:rPr>
+                <w:rFonts w:hint="eastAsia"/>
+              </w:rPr>
+              <w:t xml:space="preserve">第</w:t>
+            </w:r>
+            <w:r>
+              <w:t xml:space="preserve"> 180 </w:t>
+            </w:r>
+            <w:r>
+              <w:rPr>
+                <w:rFonts w:hint="eastAsia"/>
+              </w:rPr>
+              <w:t xml:space="preserve">天价格</w:t>
+            </w:r>
+            <w:r>
+              <w:t xml:space="preserve"> P05–P95 </w:t>
+            </w:r>
+            <w:r>
+              <w:rPr>
+                <w:rFonts w:hint="eastAsia"/>
+              </w:rPr>
+              <w:t xml:space="preserve">为</w:t>
+            </w:r>
+            <w:r>
+              <w:t xml:space="preserve"> 91.67–108.31 </w:t>
+            </w:r>
+            <w:r>
+              <w:rPr>
+                <w:rFonts w:hint="eastAsia"/>
+              </w:rPr>
+              <w:t xml:space="preserve">美元/桶，最高价突破</w:t>
+            </w:r>
+            <w:r>
+              <w:t xml:space="preserve"> 120 </w:t>
+            </w:r>
+            <w:r>
+              <w:rPr>
+                <w:rFonts w:hint="eastAsia"/>
+              </w:rPr>
+              <w:t xml:space="preserve">概率约</w:t>
+            </w:r>
+            <w:r>
+              <w:t xml:space="preserve"> 8.0%</w:t>
+            </w:r>
+          </w:p>
+        </w:tc>
+        <w:tc>
+          <w:tcPr/>
+          <w:p>
+            <w:pPr>
+              <w:pStyle w:val="Compact"/>
+              <w:jc w:val="left"/>
+            </w:pPr>
+            <w:r>
+              <w:rPr>
+                <w:rFonts w:hint="eastAsia"/>
+              </w:rPr>
+              <w:t xml:space="preserve">条件概率，不是无条件市场概率</w:t>
+            </w:r>
+          </w:p>
+        </w:tc>
+      </w:tr>
+    </w:tbl>
+    <w:p>
+      <w:pPr>
         <w:pStyle w:val="BodyText"/>
       </w:pPr>
       <w:r>
@@ -14368,18 +15426,18 @@
           <wp:inline>
             <wp:extent cx="4907280" cy="3413760"/>
             <wp:effectExtent b="0" l="0" r="0" t="0"/>
-            <wp:docPr descr="" title="" id="81" name="Picture"/>
+            <wp:docPr descr="" title="" id="82" name="Picture"/>
             <a:graphic>
               <a:graphicData uri="http://schemas.openxmlformats.org/drawingml/2006/picture">
                 <pic:pic>
                   <pic:nvPicPr>
-                    <pic:cNvPr descr="inventory_depletion_risk.png" id="82" name="Picture"/>
+                    <pic:cNvPr descr="inventory_depletion_risk.png" id="83" name="Picture"/>
                     <pic:cNvPicPr>
                       <a:picLocks noChangeArrowheads="1" noChangeAspect="1"/>
                     </pic:cNvPicPr>
                   </pic:nvPicPr>
                   <pic:blipFill>
-                    <a:blip r:embed="rId80"/>
+                    <a:blip r:embed="rId81"/>
                     <a:stretch>
                       <a:fillRect/>
                     </a:stretch>
@@ -14417,9 +15475,9 @@
         <w:t xml:space="preserve">商业库存剩余量与剩余供需缺口变化。悲观情景下缓冲能力下降，二次跳涨风险上升。</w:t>
       </w:r>
     </w:p>
-    <w:bookmarkEnd w:id="83"/>
     <w:bookmarkEnd w:id="84"/>
-    <w:bookmarkStart w:id="111" w:name="敏感性分析"/>
+    <w:bookmarkEnd w:id="85"/>
+    <w:bookmarkStart w:id="112" w:name="敏感性分析"/>
     <w:p>
       <w:pPr>
         <w:pStyle w:val="Heading1"/>
@@ -14431,7 +15489,7 @@
         <w:t xml:space="preserve">敏感性分析</w:t>
       </w:r>
     </w:p>
-    <w:bookmarkStart w:id="85" w:name="分析方法"/>
+    <w:bookmarkStart w:id="86" w:name="分析方法"/>
     <w:p>
       <w:pPr>
         <w:pStyle w:val="Heading2"/>
@@ -14718,8 +15776,8 @@
         <w:t xml:space="preserve">天剩余缺口波动范围。该指标兼顾终点价格、阶段峰值和供需风险。</w:t>
       </w:r>
     </w:p>
-    <w:bookmarkEnd w:id="85"/>
-    <w:bookmarkStart w:id="89" w:name="参数重要性排序"/>
+    <w:bookmarkEnd w:id="86"/>
+    <w:bookmarkStart w:id="90" w:name="参数重要性排序"/>
     <w:p>
       <w:pPr>
         <w:pStyle w:val="Heading2"/>
@@ -15511,18 +16569,18 @@
           <wp:inline>
             <wp:extent cx="4907280" cy="2998893"/>
             <wp:effectExtent b="0" l="0" r="0" t="0"/>
-            <wp:docPr descr="" title="" id="87" name="Picture"/>
+            <wp:docPr descr="" title="" id="88" name="Picture"/>
             <a:graphic>
               <a:graphicData uri="http://schemas.openxmlformats.org/drawingml/2006/picture">
                 <pic:pic>
                   <pic:nvPicPr>
-                    <pic:cNvPr descr="sensitivity_tornado_180day.png" id="88" name="Picture"/>
+                    <pic:cNvPr descr="sensitivity_tornado_180day.png" id="89" name="Picture"/>
                     <pic:cNvPicPr>
                       <a:picLocks noChangeArrowheads="1" noChangeAspect="1"/>
                     </pic:cNvPicPr>
                   </pic:nvPicPr>
                   <pic:blipFill>
-                    <a:blip r:embed="rId86"/>
+                    <a:blip r:embed="rId87"/>
                     <a:stretch>
                       <a:fillRect/>
                     </a:stretch>
@@ -15631,8 +16689,8 @@
         <w:t xml:space="preserve">的政策缓冲变量。</w:t>
       </w:r>
     </w:p>
-    <w:bookmarkEnd w:id="89"/>
-    <w:bookmarkStart w:id="96" w:name="蒙特卡洛情景树"/>
+    <w:bookmarkEnd w:id="90"/>
+    <w:bookmarkStart w:id="97" w:name="sec:monte-carlo"/>
     <w:p>
       <w:pPr>
         <w:pStyle w:val="Heading2"/>
@@ -16149,18 +17207,18 @@
           <wp:inline>
             <wp:extent cx="5013960" cy="2790377"/>
             <wp:effectExtent b="0" l="0" r="0" t="0"/>
-            <wp:docPr descr="" title="" id="91" name="Picture"/>
+            <wp:docPr descr="" title="" id="92" name="Picture"/>
             <a:graphic>
               <a:graphicData uri="http://schemas.openxmlformats.org/drawingml/2006/picture">
                 <pic:pic>
                   <pic:nvPicPr>
-                    <pic:cNvPr descr="monte_carlo_price_fan.png" id="92" name="Picture"/>
+                    <pic:cNvPr descr="monte_carlo_price_fan.png" id="93" name="Picture"/>
                     <pic:cNvPicPr>
                       <a:picLocks noChangeArrowheads="1" noChangeAspect="1"/>
                     </pic:cNvPicPr>
                   </pic:nvPicPr>
                   <pic:blipFill>
-                    <a:blip r:embed="rId90"/>
+                    <a:blip r:embed="rId91"/>
                     <a:stretch>
                       <a:fillRect/>
                     </a:stretch>
@@ -16219,18 +17277,18 @@
           <wp:inline>
             <wp:extent cx="4160520" cy="2352876"/>
             <wp:effectExtent b="0" l="0" r="0" t="0"/>
-            <wp:docPr descr="" title="" id="94" name="Picture"/>
+            <wp:docPr descr="" title="" id="95" name="Picture"/>
             <a:graphic>
               <a:graphicData uri="http://schemas.openxmlformats.org/drawingml/2006/picture">
                 <pic:pic>
                   <pic:nvPicPr>
-                    <pic:cNvPr descr="monte_carlo_tail_risk.png" id="95" name="Picture"/>
+                    <pic:cNvPr descr="monte_carlo_tail_risk.png" id="96" name="Picture"/>
                     <pic:cNvPicPr>
                       <a:picLocks noChangeArrowheads="1" noChangeAspect="1"/>
                     </pic:cNvPicPr>
                   </pic:nvPicPr>
                   <pic:blipFill>
-                    <a:blip r:embed="rId93"/>
+                    <a:blip r:embed="rId94"/>
                     <a:stretch>
                       <a:fillRect/>
                     </a:stretch>
@@ -16351,8 +17409,8 @@
         <w:t xml:space="preserve">36.6%。这说明长期风险的重点不是中性点预测本身，而是多因素联动恶化下的尾部组合风险。</w:t>
       </w:r>
     </w:p>
-    <w:bookmarkEnd w:id="96"/>
-    <w:bookmarkStart w:id="103" w:name="滞后地缘风险指数审计"/>
+    <w:bookmarkEnd w:id="97"/>
+    <w:bookmarkStart w:id="104" w:name="滞后地缘风险指数审计"/>
     <w:p>
       <w:pPr>
         <w:pStyle w:val="Heading2"/>
@@ -16871,18 +17929,18 @@
           <wp:inline>
             <wp:extent cx="4907280" cy="2628899"/>
             <wp:effectExtent b="0" l="0" r="0" t="0"/>
-            <wp:docPr descr="" title="" id="98" name="Picture"/>
+            <wp:docPr descr="" title="" id="99" name="Picture"/>
             <a:graphic>
               <a:graphicData uri="http://schemas.openxmlformats.org/drawingml/2006/picture">
                 <pic:pic>
                   <pic:nvPicPr>
-                    <pic:cNvPr descr="gpr_event_window_audit.png" id="99" name="Picture"/>
+                    <pic:cNvPr descr="gpr_event_window_audit.png" id="100" name="Picture"/>
                     <pic:cNvPicPr>
                       <a:picLocks noChangeArrowheads="1" noChangeAspect="1"/>
                     </pic:cNvPicPr>
                   </pic:nvPicPr>
                   <pic:blipFill>
-                    <a:blip r:embed="rId97"/>
+                    <a:blip r:embed="rId98"/>
                     <a:stretch>
                       <a:fillRect/>
                     </a:stretch>
@@ -16983,18 +18041,18 @@
           <wp:inline>
             <wp:extent cx="4480560" cy="3054927"/>
             <wp:effectExtent b="0" l="0" r="0" t="0"/>
-            <wp:docPr descr="" title="" id="101" name="Picture"/>
+            <wp:docPr descr="" title="" id="102" name="Picture"/>
             <a:graphic>
               <a:graphicData uri="http://schemas.openxmlformats.org/drawingml/2006/picture">
                 <pic:pic>
                   <pic:nvPicPr>
-                    <pic:cNvPr descr="lagged_gpr_brent_return.png" id="102" name="Picture"/>
+                    <pic:cNvPr descr="lagged_gpr_brent_return.png" id="103" name="Picture"/>
                     <pic:cNvPicPr>
                       <a:picLocks noChangeArrowheads="1" noChangeAspect="1"/>
                     </pic:cNvPicPr>
                   </pic:nvPicPr>
                   <pic:blipFill>
-                    <a:blip r:embed="rId100"/>
+                    <a:blip r:embed="rId101"/>
                     <a:stretch>
                       <a:fillRect/>
                     </a:stretch>
@@ -17118,8 +18176,8 @@
         <w:t xml:space="preserve">。这使模型在风险解释和内生性防御之间保持较稳妥的边界。</w:t>
       </w:r>
     </w:p>
-    <w:bookmarkEnd w:id="103"/>
-    <w:bookmarkStart w:id="110" w:name="历史样本稳健性检验"/>
+    <w:bookmarkEnd w:id="104"/>
+    <w:bookmarkStart w:id="111" w:name="历史样本稳健性检验"/>
     <w:p>
       <w:pPr>
         <w:pStyle w:val="Heading2"/>
@@ -17696,18 +18754,18 @@
           <wp:inline>
             <wp:extent cx="4907280" cy="2685115"/>
             <wp:effectExtent b="0" l="0" r="0" t="0"/>
-            <wp:docPr descr="" title="" id="105" name="Picture"/>
+            <wp:docPr descr="" title="" id="106" name="Picture"/>
             <a:graphic>
               <a:graphicData uri="http://schemas.openxmlformats.org/drawingml/2006/picture">
                 <pic:pic>
                   <pic:nvPicPr>
-                    <pic:cNvPr descr="historical_event_extremeness.png" id="106" name="Picture"/>
+                    <pic:cNvPr descr="historical_event_extremeness.png" id="107" name="Picture"/>
                     <pic:cNvPicPr>
                       <a:picLocks noChangeArrowheads="1" noChangeAspect="1"/>
                     </pic:cNvPicPr>
                   </pic:nvPicPr>
                   <pic:blipFill>
-                    <a:blip r:embed="rId104"/>
+                    <a:blip r:embed="rId105"/>
                     <a:stretch>
                       <a:fillRect/>
                     </a:stretch>
@@ -17757,18 +18815,18 @@
           <wp:inline>
             <wp:extent cx="4693920" cy="2669091"/>
             <wp:effectExtent b="0" l="0" r="0" t="0"/>
-            <wp:docPr descr="" title="" id="108" name="Picture"/>
+            <wp:docPr descr="" title="" id="109" name="Picture"/>
             <a:graphic>
               <a:graphicData uri="http://schemas.openxmlformats.org/drawingml/2006/picture">
                 <pic:pic>
                   <pic:nvPicPr>
-                    <pic:cNvPr descr="historical_baseline_error_distribution.png" id="109" name="Picture"/>
+                    <pic:cNvPr descr="historical_baseline_error_distribution.png" id="110" name="Picture"/>
                     <pic:cNvPicPr>
                       <a:picLocks noChangeArrowheads="1" noChangeAspect="1"/>
                     </pic:cNvPicPr>
                   </pic:nvPicPr>
                   <pic:blipFill>
-                    <a:blip r:embed="rId107"/>
+                    <a:blip r:embed="rId108"/>
                     <a:stretch>
                       <a:fillRect/>
                     </a:stretch>
@@ -17871,9 +18929,9 @@
         <w:t xml:space="preserve">检验也支持这一点：收盘价水平和对数价格均不能拒绝单位根，而对数收益率可拒绝单位根，因此普通统计基准更适合在收益率或差分口径下使用。</w:t>
       </w:r>
     </w:p>
-    <w:bookmarkEnd w:id="110"/>
     <w:bookmarkEnd w:id="111"/>
-    <w:bookmarkStart w:id="115" w:name="模型评价"/>
+    <w:bookmarkEnd w:id="112"/>
+    <w:bookmarkStart w:id="116" w:name="模型评价"/>
     <w:p>
       <w:pPr>
         <w:pStyle w:val="Heading1"/>
@@ -17885,7 +18943,7 @@
         <w:t xml:space="preserve">模型评价</w:t>
       </w:r>
     </w:p>
-    <w:bookmarkStart w:id="112" w:name="优点"/>
+    <w:bookmarkStart w:id="113" w:name="优点"/>
     <w:p>
       <w:pPr>
         <w:pStyle w:val="Heading2"/>
@@ -17989,8 +19047,22 @@
         <w:t xml:space="preserve">CSV；外推阶段明确标注为情景预测，不作为真实观测。</w:t>
       </w:r>
     </w:p>
-    <w:bookmarkEnd w:id="112"/>
-    <w:bookmarkStart w:id="113" w:name="局限性"/>
+    <w:p>
+      <w:pPr>
+        <w:numPr>
+          <w:ilvl w:val="0"/>
+          <w:numId w:val="1005"/>
+        </w:numPr>
+      </w:pPr>
+      <w:r>
+        <w:rPr>
+          <w:rFonts w:hint="eastAsia"/>
+        </w:rPr>
+        <w:t xml:space="preserve">长期表述审慎：三情景中心线与蒙特卡洛扇形区间合读，把长期结果定位为条件中心路径和尾部风险，而非精确日度点预测。</w:t>
+      </w:r>
+    </w:p>
+    <w:bookmarkEnd w:id="113"/>
+    <w:bookmarkStart w:id="114" w:name="局限性"/>
     <w:p>
       <w:pPr>
         <w:pStyle w:val="Heading2"/>
@@ -18089,8 +19161,8 @@
         <w:t xml:space="preserve">蒙特卡洛情景树已经刻画了部分参数联动风险，但其联合分布仍来自模型设定而非外部历史频率估计，因此尾部概率应解释为条件概率而非真实市场概率。</w:t>
       </w:r>
     </w:p>
-    <w:bookmarkEnd w:id="113"/>
-    <w:bookmarkStart w:id="114" w:name="改进方向"/>
+    <w:bookmarkEnd w:id="114"/>
+    <w:bookmarkStart w:id="115" w:name="改进方向"/>
     <w:p>
       <w:pPr>
         <w:pStyle w:val="Heading2"/>
@@ -18146,12 +19218,39 @@
         <w:rPr>
           <w:rFonts w:hint="eastAsia"/>
         </w:rPr>
-        <w:t xml:space="preserve">滞后审计基础上，继续探索期权隐含波动率、油轮保险费、期货期限结构等更接近市场定价的风险变量；第三，将当前蒙特卡洛联合扰动进一步扩展为带状态转移概率的情景树，使冲突缓和、维持和升级三类状态可以随时间动态切换。</w:t>
-      </w:r>
-    </w:p>
-    <w:bookmarkEnd w:id="114"/>
+        <w:t xml:space="preserve">滞后审计基础上，继续探索期权隐含波动率、油轮保险费、期货期限结构等更接近市场定价的风险变量；第三，将当前蒙特卡洛联合扰动进一步扩展为带状态转移概率的情景树，使冲突缓和、维持和升级三类状态可以随时间动态切换。R</w:t>
+      </w:r>
+      <w:r>
+        <w:t xml:space="preserve"> </w:t>
+      </w:r>
+      <w:r>
+        <w:rPr>
+          <w:rFonts w:hint="eastAsia"/>
+        </w:rPr>
+        <w:t xml:space="preserve">语言可用于后续</w:t>
+      </w:r>
+      <w:r>
+        <w:t xml:space="preserve"> GARCH、VAR、Granger </w:t>
+      </w:r>
+      <w:r>
+        <w:rPr>
+          <w:rFonts w:hint="eastAsia"/>
+        </w:rPr>
+        <w:t xml:space="preserve">和稳健标准误等计量审计，C++</w:t>
+      </w:r>
+      <w:r>
+        <w:t xml:space="preserve"> </w:t>
+      </w:r>
+      <w:r>
+        <w:rPr>
+          <w:rFonts w:hint="eastAsia"/>
+        </w:rPr>
+        <w:t xml:space="preserve">多智能体仿真则只有在获得主体级行为数据时才有必要进入主线。</w:t>
+      </w:r>
+    </w:p>
     <w:bookmarkEnd w:id="115"/>
-    <w:bookmarkStart w:id="116" w:name="结论"/>
+    <w:bookmarkEnd w:id="116"/>
+    <w:bookmarkStart w:id="117" w:name="结论"/>
     <w:p>
       <w:pPr>
         <w:pStyle w:val="Heading1"/>
@@ -18516,11 +19615,20 @@
         <w:rPr>
           <w:rFonts w:hint="eastAsia"/>
         </w:rPr>
-        <w:t xml:space="preserve">问题，而应被理解为物理缺口、政策缓冲、库存约束、替代运输和市场风险预期共同作用下的动态系统。</w:t>
-      </w:r>
-    </w:p>
-    <w:bookmarkEnd w:id="116"/>
-    <w:bookmarkStart w:id="117" w:name="附录支撑材料说明"/>
+        <w:t xml:space="preserve">问题，而应被理解为物理缺口、政策缓冲、库存约束、替代运输和市场风险预期共同作用下的动态系统。短期价格平台来自政策缓冲与预期修复对低弹性供需压力的再定价；长期风险则不在于中性路径本身，而在于供应中断偏大、SPR</w:t>
+      </w:r>
+      <w:r>
+        <w:t xml:space="preserve"> </w:t>
+      </w:r>
+      <w:r>
+        <w:rPr>
+          <w:rFonts w:hint="eastAsia"/>
+        </w:rPr>
+        <w:t xml:space="preserve">不足、绕道恢复缓慢和制度风险溢价持续时形成的尾部组合。</w:t>
+      </w:r>
+    </w:p>
+    <w:bookmarkEnd w:id="117"/>
+    <w:bookmarkStart w:id="118" w:name="附录支撑材料说明"/>
     <w:p>
       <w:pPr>
         <w:pStyle w:val="Heading1"/>
@@ -18634,8 +19742,8 @@
         <w:t xml:space="preserve">。</w:t>
       </w:r>
     </w:p>
-    <w:bookmarkEnd w:id="117"/>
-    <w:bookmarkStart w:id="121" w:name="参考文献"/>
+    <w:bookmarkEnd w:id="118"/>
+    <w:bookmarkStart w:id="122" w:name="参考文献"/>
     <w:p>
       <w:pPr>
         <w:pStyle w:val="Heading1"/>
@@ -18846,7 +19954,7 @@
       <w:r>
         <w:t xml:space="preserve"> </w:t>
       </w:r>
-      <w:hyperlink r:id="rId118">
+      <w:hyperlink r:id="rId119">
         <w:r>
           <w:rPr>
             <w:rStyle w:val="Hyperlink"/>
@@ -18868,7 +19976,7 @@
       <w:r>
         <w:t xml:space="preserve"> </w:t>
       </w:r>
-      <w:hyperlink r:id="rId119">
+      <w:hyperlink r:id="rId120">
         <w:r>
           <w:rPr>
             <w:rStyle w:val="Hyperlink"/>
@@ -18890,7 +19998,7 @@
       <w:r>
         <w:t xml:space="preserve"> </w:t>
       </w:r>
-      <w:hyperlink r:id="rId120">
+      <w:hyperlink r:id="rId121">
         <w:r>
           <w:rPr>
             <w:rStyle w:val="Hyperlink"/>
@@ -18902,7 +20010,7 @@
         <w:t xml:space="preserve">.</w:t>
       </w:r>
     </w:p>
-    <w:bookmarkEnd w:id="121"/>
+    <w:bookmarkEnd w:id="122"/>
     <w:sectPr>
       <w:footnotePr>
         <w:numRestart w:val="eachSect"/>

</xml_diff>

<commit_message>
Promote improved long-term scenario model
</commit_message>
<xml_diff>
--- a/output/final/总论文.docx
+++ b/output/final/总论文.docx
@@ -340,7 +340,7 @@
         <w:rPr>
           <w:rFonts w:hint="eastAsia"/>
         </w:rPr>
-        <w:t xml:space="preserve">天乐观、中性、悲观三种情景路径。中性情景第</w:t>
+        <w:t xml:space="preserve">天乐观、中性、悲观三种情景路径。新版长期自适应反馈模型显示，中性情景第</w:t>
       </w:r>
       <w:r>
         <w:t xml:space="preserve"> 180 </w:t>
@@ -352,7 +352,7 @@
         <w:t xml:space="preserve">天价格约为</w:t>
       </w:r>
       <w:r>
-        <w:t xml:space="preserve"> 98.61 </w:t>
+        <w:t xml:space="preserve"> 92.43 </w:t>
       </w:r>
       <w:r>
         <w:rPr>
@@ -370,13 +370,13 @@
         <w:t xml:space="preserve">天约为</w:t>
       </w:r>
       <w:r>
-        <w:t xml:space="preserve"> 114.49 </w:t>
-      </w:r>
-      <w:r>
-        <w:rPr>
-          <w:rFonts w:hint="eastAsia"/>
-        </w:rPr>
-        <w:t xml:space="preserve">美元/桶，且存在较高二次跳涨风险。敏感性分析表明，不确定性与制度风险强度、地缘风险权重和供应中断量是综合敏感度最高的三个因素；进一步的</w:t>
+        <w:t xml:space="preserve"> 106.83 </w:t>
+      </w:r>
+      <w:r>
+        <w:rPr>
+          <w:rFonts w:hint="eastAsia"/>
+        </w:rPr>
+        <w:t xml:space="preserve">美元/桶，且仍保留二次跳涨风险。敏感性分析表明，地缘风险权重、不确定性与制度风险强度、供应中断量是综合敏感度最高的三个因素；进一步的</w:t>
       </w:r>
       <w:r>
         <w:t xml:space="preserve"> 2000 </w:t>
@@ -394,6 +394,24 @@
         <w:rPr>
           <w:rFonts w:hint="eastAsia"/>
         </w:rPr>
+        <w:t xml:space="preserve">美元/桶的条件概率约为</w:t>
+      </w:r>
+      <w:r>
+        <w:t xml:space="preserve"> </w:t>
+      </w:r>
+      <w:r>
+        <w:rPr>
+          <w:rFonts w:hint="eastAsia"/>
+        </w:rPr>
+        <w:t xml:space="preserve">4.6%，突破</w:t>
+      </w:r>
+      <w:r>
+        <w:t xml:space="preserve"> 130 </w:t>
+      </w:r>
+      <w:r>
+        <w:rPr>
+          <w:rFonts w:hint="eastAsia"/>
+        </w:rPr>
         <w:t xml:space="preserve">美元/桶的概率约为</w:t>
       </w:r>
       <w:r>
@@ -403,25 +421,7 @@
         <w:rPr>
           <w:rFonts w:hint="eastAsia"/>
         </w:rPr>
-        <w:t xml:space="preserve">8.0%，突破</w:t>
-      </w:r>
-      <w:r>
-        <w:t xml:space="preserve"> 130 </w:t>
-      </w:r>
-      <w:r>
-        <w:rPr>
-          <w:rFonts w:hint="eastAsia"/>
-        </w:rPr>
-        <w:t xml:space="preserve">美元/桶的概率约为</w:t>
-      </w:r>
-      <w:r>
-        <w:t xml:space="preserve"> </w:t>
-      </w:r>
-      <w:r>
-        <w:rPr>
-          <w:rFonts w:hint="eastAsia"/>
-        </w:rPr>
-        <w:t xml:space="preserve">0.5%。此外，Caldara-Iacoviello</w:t>
+        <w:t xml:space="preserve">0.0%。此外，Caldara-Iacoviello</w:t>
       </w:r>
       <w:r>
         <w:t xml:space="preserve"> GPR </w:t>
@@ -12497,7 +12497,7 @@
         <w:t xml:space="preserve">天一定等于</w:t>
       </w:r>
       <w:r>
-        <w:t xml:space="preserve"> 98.61 </w:t>
+        <w:t xml:space="preserve"> 92.43 </w:t>
       </w:r>
       <w:r>
         <w:rPr>
@@ -12515,10 +12515,10 @@
         <w:rPr>
           <w:rFonts w:hint="eastAsia"/>
         </w:rPr>
-        <w:t xml:space="preserve">“在中性政策缓冲、供给恢复和风险溢价衰减假设下，中心路径收敛到约</w:t>
-      </w:r>
-      <w:r>
-        <w:t xml:space="preserve"> 100 </w:t>
+        <w:t xml:space="preserve">“在中性政策缓冲、供给恢复和风险溢价衰减假设下，中心路径回归到低</w:t>
+      </w:r>
+      <w:r>
+        <w:t xml:space="preserve"> 90 </w:t>
       </w:r>
       <w:r>
         <w:rPr>
@@ -13871,7 +13871,7 @@
         <w:rPr>
           <w:rFonts w:hint="eastAsia"/>
         </w:rPr>
-        <w:t xml:space="preserve">时，过剩供给通过较弱的折价项向下拉动目标价格。</w:t>
+        <w:t xml:space="preserve">时，过剩供给通过折价项向下拉动目标价格。</w:t>
       </w:r>
       <m:oMath>
         <m:sSub>
@@ -13897,7 +13897,7 @@
         <w:rPr>
           <w:rFonts w:hint="eastAsia"/>
         </w:rPr>
-        <w:t xml:space="preserve">由地缘风险溢价、前期冲击不确定性和持续封锁制度风险三部分构成，</w:t>
+        <w:t xml:space="preserve">由地缘风险溢价、前期冲击不确定性和持续封锁制度风险三部分构成，其中制度风险随未解决供应压力和时间信心恢复共同衰减，避免形成长期常数托底。</w:t>
       </w:r>
       <m:oMath>
         <m:sSub>
@@ -14600,55 +14600,55 @@
               <w:jc w:val="right"/>
             </w:pPr>
             <w:r>
-              <w:t xml:space="preserve">95.73</w:t>
-            </w:r>
-          </w:p>
-        </w:tc>
-        <w:tc>
-          <w:tcPr/>
-          <w:p>
-            <w:pPr>
-              <w:pStyle w:val="Compact"/>
-              <w:jc w:val="right"/>
-            </w:pPr>
-            <w:r>
-              <w:t xml:space="preserve">94.78</w:t>
-            </w:r>
-          </w:p>
-        </w:tc>
-        <w:tc>
-          <w:tcPr/>
-          <w:p>
-            <w:pPr>
-              <w:pStyle w:val="Compact"/>
-              <w:jc w:val="right"/>
-            </w:pPr>
-            <w:r>
-              <w:t xml:space="preserve">91.24</w:t>
-            </w:r>
-          </w:p>
-        </w:tc>
-        <w:tc>
-          <w:tcPr/>
-          <w:p>
-            <w:pPr>
-              <w:pStyle w:val="Compact"/>
-              <w:jc w:val="right"/>
-            </w:pPr>
-            <w:r>
-              <w:t xml:space="preserve">104.16</w:t>
-            </w:r>
-          </w:p>
-        </w:tc>
-        <w:tc>
-          <w:tcPr/>
-          <w:p>
-            <w:pPr>
-              <w:pStyle w:val="Compact"/>
-              <w:jc w:val="right"/>
-            </w:pPr>
-            <w:r>
-              <w:t xml:space="preserve">94.31</w:t>
+              <w:t xml:space="preserve">93.28</w:t>
+            </w:r>
+          </w:p>
+        </w:tc>
+        <w:tc>
+          <w:tcPr/>
+          <w:p>
+            <w:pPr>
+              <w:pStyle w:val="Compact"/>
+              <w:jc w:val="right"/>
+            </w:pPr>
+            <w:r>
+              <w:t xml:space="preserve">91.86</w:t>
+            </w:r>
+          </w:p>
+        </w:tc>
+        <w:tc>
+          <w:tcPr/>
+          <w:p>
+            <w:pPr>
+              <w:pStyle w:val="Compact"/>
+              <w:jc w:val="right"/>
+            </w:pPr>
+            <w:r>
+              <w:t xml:space="preserve">87.10</w:t>
+            </w:r>
+          </w:p>
+        </w:tc>
+        <w:tc>
+          <w:tcPr/>
+          <w:p>
+            <w:pPr>
+              <w:pStyle w:val="Compact"/>
+              <w:jc w:val="right"/>
+            </w:pPr>
+            <w:r>
+              <w:t xml:space="preserve">103.32</w:t>
+            </w:r>
+          </w:p>
+        </w:tc>
+        <w:tc>
+          <w:tcPr/>
+          <w:p>
+            <w:pPr>
+              <w:pStyle w:val="Compact"/>
+              <w:jc w:val="right"/>
+            </w:pPr>
+            <w:r>
+              <w:t xml:space="preserve">91.25</w:t>
             </w:r>
           </w:p>
         </w:tc>
@@ -14704,55 +14704,55 @@
               <w:jc w:val="right"/>
             </w:pPr>
             <w:r>
-              <w:t xml:space="preserve">107.55</w:t>
-            </w:r>
-          </w:p>
-        </w:tc>
-        <w:tc>
-          <w:tcPr/>
-          <w:p>
-            <w:pPr>
-              <w:pStyle w:val="Compact"/>
-              <w:jc w:val="right"/>
-            </w:pPr>
-            <w:r>
-              <w:t xml:space="preserve">104.33</w:t>
-            </w:r>
-          </w:p>
-        </w:tc>
-        <w:tc>
-          <w:tcPr/>
-          <w:p>
-            <w:pPr>
-              <w:pStyle w:val="Compact"/>
-              <w:jc w:val="right"/>
-            </w:pPr>
-            <w:r>
-              <w:t xml:space="preserve">98.61</w:t>
-            </w:r>
-          </w:p>
-        </w:tc>
-        <w:tc>
-          <w:tcPr/>
-          <w:p>
-            <w:pPr>
-              <w:pStyle w:val="Compact"/>
-              <w:jc w:val="right"/>
-            </w:pPr>
-            <w:r>
-              <w:t xml:space="preserve">110.35</w:t>
-            </w:r>
-          </w:p>
-        </w:tc>
-        <w:tc>
-          <w:tcPr/>
-          <w:p>
-            <w:pPr>
-              <w:pStyle w:val="Compact"/>
-              <w:jc w:val="right"/>
-            </w:pPr>
-            <w:r>
-              <w:t xml:space="preserve">104.22</w:t>
+              <w:t xml:space="preserve">104.38</w:t>
+            </w:r>
+          </w:p>
+        </w:tc>
+        <w:tc>
+          <w:tcPr/>
+          <w:p>
+            <w:pPr>
+              <w:pStyle w:val="Compact"/>
+              <w:jc w:val="right"/>
+            </w:pPr>
+            <w:r>
+              <w:t xml:space="preserve">100.02</w:t>
+            </w:r>
+          </w:p>
+        </w:tc>
+        <w:tc>
+          <w:tcPr/>
+          <w:p>
+            <w:pPr>
+              <w:pStyle w:val="Compact"/>
+              <w:jc w:val="right"/>
+            </w:pPr>
+            <w:r>
+              <w:t xml:space="preserve">92.43</w:t>
+            </w:r>
+          </w:p>
+        </w:tc>
+        <w:tc>
+          <w:tcPr/>
+          <w:p>
+            <w:pPr>
+              <w:pStyle w:val="Compact"/>
+              <w:jc w:val="right"/>
+            </w:pPr>
+            <w:r>
+              <w:t xml:space="preserve">109.52</w:t>
+            </w:r>
+          </w:p>
+        </w:tc>
+        <w:tc>
+          <w:tcPr/>
+          <w:p>
+            <w:pPr>
+              <w:pStyle w:val="Compact"/>
+              <w:jc w:val="right"/>
+            </w:pPr>
+            <w:r>
+              <w:t xml:space="preserve">99.85</w:t>
             </w:r>
           </w:p>
         </w:tc>
@@ -14808,55 +14808,55 @@
               <w:jc w:val="right"/>
             </w:pPr>
             <w:r>
-              <w:t xml:space="preserve">126.63</w:t>
-            </w:r>
-          </w:p>
-        </w:tc>
-        <w:tc>
-          <w:tcPr/>
-          <w:p>
-            <w:pPr>
-              <w:pStyle w:val="Compact"/>
-              <w:jc w:val="right"/>
-            </w:pPr>
-            <w:r>
-              <w:t xml:space="preserve">119.75</w:t>
-            </w:r>
-          </w:p>
-        </w:tc>
-        <w:tc>
-          <w:tcPr/>
-          <w:p>
-            <w:pPr>
-              <w:pStyle w:val="Compact"/>
-              <w:jc w:val="right"/>
-            </w:pPr>
-            <w:r>
-              <w:t xml:space="preserve">114.49</w:t>
-            </w:r>
-          </w:p>
-        </w:tc>
-        <w:tc>
-          <w:tcPr/>
-          <w:p>
-            <w:pPr>
-              <w:pStyle w:val="Compact"/>
-              <w:jc w:val="right"/>
-            </w:pPr>
-            <w:r>
-              <w:t xml:space="preserve">131.22</w:t>
-            </w:r>
-          </w:p>
-        </w:tc>
-        <w:tc>
-          <w:tcPr/>
-          <w:p>
-            <w:pPr>
-              <w:pStyle w:val="Compact"/>
-              <w:jc w:val="right"/>
-            </w:pPr>
-            <w:r>
-              <w:t xml:space="preserve">121.05</w:t>
+              <w:t xml:space="preserve">122.78</w:t>
+            </w:r>
+          </w:p>
+        </w:tc>
+        <w:tc>
+          <w:tcPr/>
+          <w:p>
+            <w:pPr>
+              <w:pStyle w:val="Compact"/>
+              <w:jc w:val="right"/>
+            </w:pPr>
+            <w:r>
+              <w:t xml:space="preserve">114.30</w:t>
+            </w:r>
+          </w:p>
+        </w:tc>
+        <w:tc>
+          <w:tcPr/>
+          <w:p>
+            <w:pPr>
+              <w:pStyle w:val="Compact"/>
+              <w:jc w:val="right"/>
+            </w:pPr>
+            <w:r>
+              <w:t xml:space="preserve">106.83</w:t>
+            </w:r>
+          </w:p>
+        </w:tc>
+        <w:tc>
+          <w:tcPr/>
+          <w:p>
+            <w:pPr>
+              <w:pStyle w:val="Compact"/>
+              <w:jc w:val="right"/>
+            </w:pPr>
+            <w:r>
+              <w:t xml:space="preserve">128.64</w:t>
+            </w:r>
+          </w:p>
+        </w:tc>
+        <w:tc>
+          <w:tcPr/>
+          <w:p>
+            <w:pPr>
+              <w:pStyle w:val="Compact"/>
+              <w:jc w:val="right"/>
+            </w:pPr>
+            <w:r>
+              <w:t xml:space="preserve">115.75</w:t>
             </w:r>
           </w:p>
         </w:tc>
@@ -14964,7 +14964,7 @@
         <w:t xml:space="preserve">天附近回落至约</w:t>
       </w:r>
       <w:r>
-        <w:t xml:space="preserve"> 98.61 </w:t>
+        <w:t xml:space="preserve"> 92.43 </w:t>
       </w:r>
       <w:r>
         <w:rPr>
@@ -14979,7 +14979,7 @@
         <w:rPr>
           <w:rFonts w:hint="eastAsia"/>
         </w:rPr>
-        <w:t xml:space="preserve">释放弱、绕道恢复慢且风险溢价维持高位，价格可能再次升至</w:t>
+        <w:t xml:space="preserve">释放弱、绕道恢复慢且风险溢价维持高位，价格仍可能再次升至</w:t>
       </w:r>
       <w:r>
         <w:t xml:space="preserve"> 120 </w:t>
@@ -14988,10 +14988,10 @@
         <w:rPr>
           <w:rFonts w:hint="eastAsia"/>
         </w:rPr>
-        <w:t xml:space="preserve">美元/桶附近，并在外推期达到约</w:t>
-      </w:r>
-      <w:r>
-        <w:t xml:space="preserve"> 131.22 </w:t>
+        <w:t xml:space="preserve">美元/桶以上，并在外推期达到约</w:t>
+      </w:r>
+      <w:r>
+        <w:t xml:space="preserve"> 128.64 </w:t>
       </w:r>
       <w:r>
         <w:rPr>
@@ -15286,7 +15286,7 @@
               <w:t xml:space="preserve">为</w:t>
             </w:r>
             <w:r>
-              <w:t xml:space="preserve"> 91.67–108.31 </w:t>
+              <w:t xml:space="preserve"> 87.67–101.01 </w:t>
             </w:r>
             <w:r>
               <w:rPr>
@@ -15304,7 +15304,7 @@
               <w:t xml:space="preserve">概率约</w:t>
             </w:r>
             <w:r>
-              <w:t xml:space="preserve"> 8.0%</w:t>
+              <w:t xml:space="preserve"> 4.6%</w:t>
             </w:r>
           </w:p>
         </w:tc>
@@ -15336,7 +15336,7 @@
         <w:t xml:space="preserve">从价格平衡点看，乐观情景最终回落至约</w:t>
       </w:r>
       <w:r>
-        <w:t xml:space="preserve"> 91.24 </w:t>
+        <w:t xml:space="preserve"> 87.10 </w:t>
       </w:r>
       <w:r>
         <w:rPr>
@@ -15372,7 +15372,7 @@
         <w:t xml:space="preserve">天约为</w:t>
       </w:r>
       <w:r>
-        <w:t xml:space="preserve"> 98.61 </w:t>
+        <w:t xml:space="preserve"> 92.43 </w:t>
       </w:r>
       <w:r>
         <w:rPr>
@@ -15387,7 +15387,16 @@
         <w:rPr>
           <w:rFonts w:hint="eastAsia"/>
         </w:rPr>
-        <w:t xml:space="preserve">释放已经从计划上限自动收缩，说明价格回落不是依赖政策变量机械满额托底。悲观情景第</w:t>
+        <w:t xml:space="preserve">释放已经从计划上限自动收缩，且中性路径供给过剩仅约</w:t>
+      </w:r>
+      <w:r>
+        <w:t xml:space="preserve"> 50 </w:t>
+      </w:r>
+      <w:r>
+        <w:rPr>
+          <w:rFonts w:hint="eastAsia"/>
+        </w:rPr>
+        <w:t xml:space="preserve">万桶/日，说明价格回落不是依赖政策变量机械满额托底。悲观情景第</w:t>
       </w:r>
       <w:r>
         <w:t xml:space="preserve"> 180 </w:t>
@@ -15399,7 +15408,7 @@
         <w:t xml:space="preserve">天仍为</w:t>
       </w:r>
       <w:r>
-        <w:t xml:space="preserve"> 114.49 </w:t>
+        <w:t xml:space="preserve"> 106.83 </w:t>
       </w:r>
       <w:r>
         <w:rPr>
@@ -15414,7 +15423,7 @@
         <w:rPr>
           <w:rFonts w:hint="eastAsia"/>
         </w:rPr>
-        <w:t xml:space="preserve">释放不足且制度风险溢价持续，市场可能长期停留在高位平台，并保留二次跳涨尾部风险。</w:t>
+        <w:t xml:space="preserve">释放不足且制度风险溢价持续，市场仍可能维持相对高位，并保留二次跳涨尾部风险。</w:t>
       </w:r>
     </w:p>
     <w:p>
@@ -15927,43 +15936,43 @@
               <w:rPr>
                 <w:rFonts w:hint="eastAsia"/>
               </w:rPr>
-              <w:t xml:space="preserve">不确定性与制度风险强度</w:t>
-            </w:r>
-          </w:p>
-        </w:tc>
-        <w:tc>
-          <w:tcPr/>
-          <w:p>
-            <w:pPr>
-              <w:pStyle w:val="Compact"/>
-              <w:jc w:val="right"/>
-            </w:pPr>
-            <w:r>
-              <w:t xml:space="preserve">15.09</w:t>
-            </w:r>
-          </w:p>
-        </w:tc>
-        <w:tc>
-          <w:tcPr/>
-          <w:p>
-            <w:pPr>
-              <w:pStyle w:val="Compact"/>
-              <w:jc w:val="right"/>
-            </w:pPr>
-            <w:r>
-              <w:t xml:space="preserve">9.73</w:t>
-            </w:r>
-          </w:p>
-        </w:tc>
-        <w:tc>
-          <w:tcPr/>
-          <w:p>
-            <w:pPr>
-              <w:pStyle w:val="Compact"/>
-              <w:jc w:val="right"/>
-            </w:pPr>
-            <w:r>
-              <w:t xml:space="preserve">11.91</w:t>
+              <w:t xml:space="preserve">地缘风险权重</w:t>
+            </w:r>
+          </w:p>
+        </w:tc>
+        <w:tc>
+          <w:tcPr/>
+          <w:p>
+            <w:pPr>
+              <w:pStyle w:val="Compact"/>
+              <w:jc w:val="right"/>
+            </w:pPr>
+            <w:r>
+              <w:t xml:space="preserve">13.55</w:t>
+            </w:r>
+          </w:p>
+        </w:tc>
+        <w:tc>
+          <w:tcPr/>
+          <w:p>
+            <w:pPr>
+              <w:pStyle w:val="Compact"/>
+              <w:jc w:val="right"/>
+            </w:pPr>
+            <w:r>
+              <w:t xml:space="preserve">8.40</w:t>
+            </w:r>
+          </w:p>
+        </w:tc>
+        <w:tc>
+          <w:tcPr/>
+          <w:p>
+            <w:pPr>
+              <w:pStyle w:val="Compact"/>
+              <w:jc w:val="right"/>
+            </w:pPr>
+            <w:r>
+              <w:t xml:space="preserve">11.44</w:t>
             </w:r>
           </w:p>
         </w:tc>
@@ -15992,43 +16001,43 @@
               <w:rPr>
                 <w:rFonts w:hint="eastAsia"/>
               </w:rPr>
-              <w:t xml:space="preserve">地缘风险权重</w:t>
-            </w:r>
-          </w:p>
-        </w:tc>
-        <w:tc>
-          <w:tcPr/>
-          <w:p>
-            <w:pPr>
-              <w:pStyle w:val="Compact"/>
-              <w:jc w:val="right"/>
-            </w:pPr>
-            <w:r>
-              <w:t xml:space="preserve">13.58</w:t>
-            </w:r>
-          </w:p>
-        </w:tc>
-        <w:tc>
-          <w:tcPr/>
-          <w:p>
-            <w:pPr>
-              <w:pStyle w:val="Compact"/>
-              <w:jc w:val="right"/>
-            </w:pPr>
-            <w:r>
-              <w:t xml:space="preserve">8.41</w:t>
-            </w:r>
-          </w:p>
-        </w:tc>
-        <w:tc>
-          <w:tcPr/>
-          <w:p>
-            <w:pPr>
-              <w:pStyle w:val="Compact"/>
-              <w:jc w:val="right"/>
-            </w:pPr>
-            <w:r>
-              <w:t xml:space="preserve">11.49</w:t>
+              <w:t xml:space="preserve">不确定性与制度风险强度</w:t>
+            </w:r>
+          </w:p>
+        </w:tc>
+        <w:tc>
+          <w:tcPr/>
+          <w:p>
+            <w:pPr>
+              <w:pStyle w:val="Compact"/>
+              <w:jc w:val="right"/>
+            </w:pPr>
+            <w:r>
+              <w:t xml:space="preserve">10.02</w:t>
+            </w:r>
+          </w:p>
+        </w:tc>
+        <w:tc>
+          <w:tcPr/>
+          <w:p>
+            <w:pPr>
+              <w:pStyle w:val="Compact"/>
+              <w:jc w:val="right"/>
+            </w:pPr>
+            <w:r>
+              <w:t xml:space="preserve">4.92</w:t>
+            </w:r>
+          </w:p>
+        </w:tc>
+        <w:tc>
+          <w:tcPr/>
+          <w:p>
+            <w:pPr>
+              <w:pStyle w:val="Compact"/>
+              <w:jc w:val="right"/>
+            </w:pPr>
+            <w:r>
+              <w:t xml:space="preserve">11.33</w:t>
             </w:r>
           </w:p>
         </w:tc>
@@ -16069,31 +16078,31 @@
               <w:jc w:val="right"/>
             </w:pPr>
             <w:r>
-              <w:t xml:space="preserve">5.72</w:t>
-            </w:r>
-          </w:p>
-        </w:tc>
-        <w:tc>
-          <w:tcPr/>
-          <w:p>
-            <w:pPr>
-              <w:pStyle w:val="Compact"/>
-              <w:jc w:val="right"/>
-            </w:pPr>
-            <w:r>
-              <w:t xml:space="preserve">3.03</w:t>
-            </w:r>
-          </w:p>
-        </w:tc>
-        <w:tc>
-          <w:tcPr/>
-          <w:p>
-            <w:pPr>
-              <w:pStyle w:val="Compact"/>
-              <w:jc w:val="right"/>
-            </w:pPr>
-            <w:r>
-              <w:t xml:space="preserve">5.96</w:t>
+              <w:t xml:space="preserve">5.95</w:t>
+            </w:r>
+          </w:p>
+        </w:tc>
+        <w:tc>
+          <w:tcPr/>
+          <w:p>
+            <w:pPr>
+              <w:pStyle w:val="Compact"/>
+              <w:jc w:val="right"/>
+            </w:pPr>
+            <w:r>
+              <w:t xml:space="preserve">3.26</w:t>
+            </w:r>
+          </w:p>
+        </w:tc>
+        <w:tc>
+          <w:tcPr/>
+          <w:p>
+            <w:pPr>
+              <w:pStyle w:val="Compact"/>
+              <w:jc w:val="right"/>
+            </w:pPr>
+            <w:r>
+              <w:t xml:space="preserve">5.97</w:t>
             </w:r>
           </w:p>
         </w:tc>
@@ -16134,31 +16143,31 @@
               <w:jc w:val="right"/>
             </w:pPr>
             <w:r>
-              <w:t xml:space="preserve">3.70</w:t>
-            </w:r>
-          </w:p>
-        </w:tc>
-        <w:tc>
-          <w:tcPr/>
-          <w:p>
-            <w:pPr>
-              <w:pStyle w:val="Compact"/>
-              <w:jc w:val="right"/>
-            </w:pPr>
-            <w:r>
-              <w:t xml:space="preserve">3.36</w:t>
-            </w:r>
-          </w:p>
-        </w:tc>
-        <w:tc>
-          <w:tcPr/>
-          <w:p>
-            <w:pPr>
-              <w:pStyle w:val="Compact"/>
-              <w:jc w:val="right"/>
-            </w:pPr>
-            <w:r>
-              <w:t xml:space="preserve">0.75</w:t>
+              <w:t xml:space="preserve">3.86</w:t>
+            </w:r>
+          </w:p>
+        </w:tc>
+        <w:tc>
+          <w:tcPr/>
+          <w:p>
+            <w:pPr>
+              <w:pStyle w:val="Compact"/>
+              <w:jc w:val="right"/>
+            </w:pPr>
+            <w:r>
+              <w:t xml:space="preserve">3.42</w:t>
+            </w:r>
+          </w:p>
+        </w:tc>
+        <w:tc>
+          <w:tcPr/>
+          <w:p>
+            <w:pPr>
+              <w:pStyle w:val="Compact"/>
+              <w:jc w:val="right"/>
+            </w:pPr>
+            <w:r>
+              <w:t xml:space="preserve">0.98</w:t>
             </w:r>
           </w:p>
         </w:tc>
@@ -16184,46 +16193,49 @@
               <w:jc w:val="left"/>
             </w:pPr>
             <w:r>
-              <w:rPr>
-                <w:rFonts w:hint="eastAsia"/>
-              </w:rPr>
-              <w:t xml:space="preserve">绕道运输能力</w:t>
-            </w:r>
-          </w:p>
-        </w:tc>
-        <w:tc>
-          <w:tcPr/>
-          <w:p>
-            <w:pPr>
-              <w:pStyle w:val="Compact"/>
-              <w:jc w:val="right"/>
-            </w:pPr>
-            <w:r>
-              <w:t xml:space="preserve">0.75</w:t>
-            </w:r>
-          </w:p>
-        </w:tc>
-        <w:tc>
-          <w:tcPr/>
-          <w:p>
-            <w:pPr>
-              <w:pStyle w:val="Compact"/>
-              <w:jc w:val="right"/>
-            </w:pPr>
-            <w:r>
-              <w:t xml:space="preserve">0.48</w:t>
-            </w:r>
-          </w:p>
-        </w:tc>
-        <w:tc>
-          <w:tcPr/>
-          <w:p>
-            <w:pPr>
-              <w:pStyle w:val="Compact"/>
-              <w:jc w:val="right"/>
-            </w:pPr>
-            <w:r>
-              <w:t xml:space="preserve">0.61</w:t>
+              <w:t xml:space="preserve">SPR </w:t>
+            </w:r>
+            <w:r>
+              <w:rPr>
+                <w:rFonts w:hint="eastAsia"/>
+              </w:rPr>
+              <w:t xml:space="preserve">释放上限</w:t>
+            </w:r>
+          </w:p>
+        </w:tc>
+        <w:tc>
+          <w:tcPr/>
+          <w:p>
+            <w:pPr>
+              <w:pStyle w:val="Compact"/>
+              <w:jc w:val="right"/>
+            </w:pPr>
+            <w:r>
+              <w:t xml:space="preserve">0.90</w:t>
+            </w:r>
+          </w:p>
+        </w:tc>
+        <w:tc>
+          <w:tcPr/>
+          <w:p>
+            <w:pPr>
+              <w:pStyle w:val="Compact"/>
+              <w:jc w:val="right"/>
+            </w:pPr>
+            <w:r>
+              <w:t xml:space="preserve">0.65</w:t>
+            </w:r>
+          </w:p>
+        </w:tc>
+        <w:tc>
+          <w:tcPr/>
+          <w:p>
+            <w:pPr>
+              <w:pStyle w:val="Compact"/>
+              <w:jc w:val="right"/>
+            </w:pPr>
+            <w:r>
+              <w:t xml:space="preserve">0.50</w:t>
             </w:r>
           </w:p>
         </w:tc>
@@ -16249,49 +16261,46 @@
               <w:jc w:val="left"/>
             </w:pPr>
             <w:r>
-              <w:t xml:space="preserve">SPR </w:t>
-            </w:r>
-            <w:r>
-              <w:rPr>
-                <w:rFonts w:hint="eastAsia"/>
-              </w:rPr>
-              <w:t xml:space="preserve">释放上限</w:t>
-            </w:r>
-          </w:p>
-        </w:tc>
-        <w:tc>
-          <w:tcPr/>
-          <w:p>
-            <w:pPr>
-              <w:pStyle w:val="Compact"/>
-              <w:jc w:val="right"/>
-            </w:pPr>
-            <w:r>
-              <w:t xml:space="preserve">0.24</w:t>
-            </w:r>
-          </w:p>
-        </w:tc>
-        <w:tc>
-          <w:tcPr/>
-          <w:p>
-            <w:pPr>
-              <w:pStyle w:val="Compact"/>
-              <w:jc w:val="right"/>
-            </w:pPr>
-            <w:r>
-              <w:t xml:space="preserve">0.05</w:t>
-            </w:r>
-          </w:p>
-        </w:tc>
-        <w:tc>
-          <w:tcPr/>
-          <w:p>
-            <w:pPr>
-              <w:pStyle w:val="Compact"/>
-              <w:jc w:val="right"/>
-            </w:pPr>
-            <w:r>
-              <w:t xml:space="preserve">0.41</w:t>
+              <w:rPr>
+                <w:rFonts w:hint="eastAsia"/>
+              </w:rPr>
+              <w:t xml:space="preserve">绕道运输能力</w:t>
+            </w:r>
+          </w:p>
+        </w:tc>
+        <w:tc>
+          <w:tcPr/>
+          <w:p>
+            <w:pPr>
+              <w:pStyle w:val="Compact"/>
+              <w:jc w:val="right"/>
+            </w:pPr>
+            <w:r>
+              <w:t xml:space="preserve">0.39</w:t>
+            </w:r>
+          </w:p>
+        </w:tc>
+        <w:tc>
+          <w:tcPr/>
+          <w:p>
+            <w:pPr>
+              <w:pStyle w:val="Compact"/>
+              <w:jc w:val="right"/>
+            </w:pPr>
+            <w:r>
+              <w:t xml:space="preserve">0.00</w:t>
+            </w:r>
+          </w:p>
+        </w:tc>
+        <w:tc>
+          <w:tcPr/>
+          <w:p>
+            <w:pPr>
+              <w:pStyle w:val="Compact"/>
+              <w:jc w:val="right"/>
+            </w:pPr>
+            <w:r>
+              <w:t xml:space="preserve">0.86</w:t>
             </w:r>
           </w:p>
         </w:tc>
@@ -16644,7 +16653,7 @@
         <w:rPr>
           <w:rFonts w:hint="eastAsia"/>
         </w:rPr>
-        <w:t xml:space="preserve">天终点价格对市场价格形成层最敏感，尤其是不确定性与制度风险强度和地缘风险权重；供应中断量决定价格上行压力的物理底座。长期需求弹性在新的自适应外推中也具有较高影响，因为它决定高价持续后需求侧能否真正完成再平衡。SPR</w:t>
+        <w:t xml:space="preserve">天终点价格对市场价格形成层最敏感，尤其是地缘风险权重和不确定性与制度风险强度；供应中断量决定价格上行压力的物理底座。长期需求弹性在新的自适应外推中也具有较高影响，因为它决定高价持续后需求侧能否真正完成再平衡。SPR</w:t>
       </w:r>
       <w:r>
         <w:t xml:space="preserve"> </w:t>
@@ -16662,7 +16671,7 @@
         <w:rPr>
           <w:rFonts w:hint="eastAsia"/>
         </w:rPr>
-        <w:t xml:space="preserve">天终点价影响较小，但会改变外推期峰值、缺口闭合速度和二次跳涨幅度，因此更适合被解释为</w:t>
+        <w:t xml:space="preserve">天终点价影响相对较小，但会改变外推期峰值、缺口闭合速度和二次跳涨幅度，因此更适合被解释为</w:t>
       </w:r>
       <w:r>
         <w:rPr>
@@ -16923,7 +16932,7 @@
               <w:jc w:val="right"/>
             </w:pPr>
             <w:r>
-              <w:t xml:space="preserve">8.0%</w:t>
+              <w:t xml:space="preserve">4.6%</w:t>
             </w:r>
           </w:p>
         </w:tc>
@@ -16961,7 +16970,7 @@
               <w:jc w:val="right"/>
             </w:pPr>
             <w:r>
-              <w:t xml:space="preserve">0.5%</w:t>
+              <w:t xml:space="preserve">0.0%</w:t>
             </w:r>
           </w:p>
         </w:tc>
@@ -17008,7 +17017,7 @@
               <w:jc w:val="right"/>
             </w:pPr>
             <w:r>
-              <w:t xml:space="preserve">0.0%</w:t>
+              <w:t xml:space="preserve">0.1%</w:t>
             </w:r>
           </w:p>
         </w:tc>
@@ -17037,7 +17046,7 @@
               <w:jc w:val="right"/>
             </w:pPr>
             <w:r>
-              <w:t xml:space="preserve">2.4%</w:t>
+              <w:t xml:space="preserve">1.2%</w:t>
             </w:r>
           </w:p>
         </w:tc>
@@ -17078,7 +17087,7 @@
               <w:jc w:val="right"/>
             </w:pPr>
             <w:r>
-              <w:t xml:space="preserve">91.67</w:t>
+              <w:t xml:space="preserve">87.67</w:t>
             </w:r>
           </w:p>
         </w:tc>
@@ -17119,7 +17128,7 @@
               <w:jc w:val="right"/>
             </w:pPr>
             <w:r>
-              <w:t xml:space="preserve">98.84</w:t>
+              <w:t xml:space="preserve">92.85</w:t>
             </w:r>
           </w:p>
         </w:tc>
@@ -17160,7 +17169,7 @@
               <w:jc w:val="right"/>
             </w:pPr>
             <w:r>
-              <w:t xml:space="preserve">108.31</w:t>
+              <w:t xml:space="preserve">101.01</w:t>
             </w:r>
           </w:p>
         </w:tc>
@@ -17192,7 +17201,7 @@
               <w:jc w:val="right"/>
             </w:pPr>
             <w:r>
-              <w:t xml:space="preserve">122.37</w:t>
+              <w:t xml:space="preserve">119.62</w:t>
             </w:r>
           </w:p>
         </w:tc>
@@ -17346,7 +17355,7 @@
         <w:t xml:space="preserve">天中位数价格为</w:t>
       </w:r>
       <w:r>
-        <w:t xml:space="preserve"> 98.84 </w:t>
+        <w:t xml:space="preserve"> 92.85 </w:t>
       </w:r>
       <w:r>
         <w:rPr>
@@ -17364,7 +17373,7 @@
         <w:t xml:space="preserve">中性情景的</w:t>
       </w:r>
       <w:r>
-        <w:t xml:space="preserve"> 98.61 </w:t>
+        <w:t xml:space="preserve"> 92.43 </w:t>
       </w:r>
       <w:r>
         <w:rPr>
@@ -17388,7 +17397,7 @@
         <w:rPr>
           <w:rFonts w:hint="eastAsia"/>
         </w:rPr>
-        <w:t xml:space="preserve">8.0%，且高压尾部路径中突破</w:t>
+        <w:t xml:space="preserve">4.6%，且高压尾部路径中突破</w:t>
       </w:r>
       <w:r>
         <w:t xml:space="preserve"> 120 </w:t>
@@ -17406,7 +17415,7 @@
         <w:rPr>
           <w:rFonts w:hint="eastAsia"/>
         </w:rPr>
-        <w:t xml:space="preserve">36.6%。这说明长期风险的重点不是中性点预测本身，而是多因素联动恶化下的尾部组合风险。</w:t>
+        <w:t xml:space="preserve">21.1%。这说明长期风险的重点不是中性点预测本身，而是多因素联动恶化下的尾部组合风险。</w:t>
       </w:r>
     </w:p>
     <w:bookmarkEnd w:id="97"/>
@@ -19413,7 +19422,7 @@
         <w:t xml:space="preserve">天价格约为</w:t>
       </w:r>
       <w:r>
-        <w:t xml:space="preserve"> 98.61 </w:t>
+        <w:t xml:space="preserve"> 92.43 </w:t>
       </w:r>
       <w:r>
         <w:rPr>
@@ -19431,13 +19440,13 @@
         <w:t xml:space="preserve">天约为</w:t>
       </w:r>
       <w:r>
-        <w:t xml:space="preserve"> 114.49 </w:t>
-      </w:r>
-      <w:r>
-        <w:rPr>
-          <w:rFonts w:hint="eastAsia"/>
-        </w:rPr>
-        <w:t xml:space="preserve">美元/桶，并存在较高二次跳涨风险。</w:t>
+        <w:t xml:space="preserve"> 106.83 </w:t>
+      </w:r>
+      <w:r>
+        <w:rPr>
+          <w:rFonts w:hint="eastAsia"/>
+        </w:rPr>
+        <w:t xml:space="preserve">美元/桶，并存在二次跳涨风险。</w:t>
       </w:r>
     </w:p>
     <w:p>
@@ -19451,7 +19460,7 @@
         <w:rPr>
           <w:rFonts w:hint="eastAsia"/>
         </w:rPr>
-        <w:t xml:space="preserve">敏感性分析显示，不确定性与制度风险强度、地缘风险权重和供应中断量是最关键影响因素；SPR</w:t>
+        <w:t xml:space="preserve">敏感性分析显示，地缘风险权重、不确定性与制度风险强度和供应中断量是最关键影响因素；SPR</w:t>
       </w:r>
       <w:r>
         <w:t xml:space="preserve"> </w:t>
@@ -19495,7 +19504,7 @@
         <w:t xml:space="preserve">区间为</w:t>
       </w:r>
       <w:r>
-        <w:t xml:space="preserve"> 91.67–108.31 </w:t>
+        <w:t xml:space="preserve"> 87.67–101.01 </w:t>
       </w:r>
       <w:r>
         <w:rPr>
@@ -19510,7 +19519,7 @@
         <w:rPr>
           <w:rFonts w:hint="eastAsia"/>
         </w:rPr>
-        <w:t xml:space="preserve">美元/桶的概率约为</w:t>
+        <w:t xml:space="preserve">美元/桶的条件概率约为</w:t>
       </w:r>
       <w:r>
         <w:t xml:space="preserve"> </w:t>
@@ -19519,7 +19528,7 @@
         <w:rPr>
           <w:rFonts w:hint="eastAsia"/>
         </w:rPr>
-        <w:t xml:space="preserve">8.0%，尾部风险主要来自多因素同时恶化。</w:t>
+        <w:t xml:space="preserve">4.6%，尾部风险主要来自多因素同时恶化。</w:t>
       </w:r>
     </w:p>
     <w:p>

</xml_diff>

<commit_message>
Add table of contents to final paper
</commit_message>
<xml_diff>
--- a/output/final/总论文.docx
+++ b/output/final/总论文.docx
@@ -58,6 +58,32 @@
         <w:t xml:space="preserve">月</w:t>
       </w:r>
     </w:p>
+    <w:sdt>
+      <w:sdtPr>
+        <w:docPartObj>
+          <w:docPartGallery w:val="Table of Contents"/>
+          <w:docPartUnique/>
+        </w:docPartObj>
+      </w:sdtPr>
+      <w:sdtContent>
+        <w:p>
+          <w:pPr>
+            <w:pStyle w:val="TOCHeading"/>
+          </w:pPr>
+          <w:r>
+            <w:t xml:space="preserve">目录</w:t>
+          </w:r>
+        </w:p>
+        <w:p>
+          <w:r>
+            <w:fldChar w:fldCharType="begin" w:dirty="true"/>
+            <w:instrText xml:space="preserve">TOC \o "1-2" \h \z \u</w:instrText>
+            <w:fldChar w:fldCharType="separate"/>
+            <w:fldChar w:fldCharType="end"/>
+          </w:r>
+        </w:p>
+      </w:sdtContent>
+    </w:sdt>
     <w:p>
       <w:pPr>
         <w:pStyle w:val="FirstParagraph"/>

</xml_diff>

<commit_message>
Refresh paper and documentation indexes
</commit_message>
<xml_diff>
--- a/output/final/总论文.docx
+++ b/output/final/总论文.docx
@@ -402,7 +402,7 @@
         <w:rPr>
           <w:rFonts w:hint="eastAsia"/>
         </w:rPr>
-        <w:t xml:space="preserve">美元/桶，且仍保留二次跳涨风险。敏感性分析表明，地缘风险权重、不确定性与制度风险强度、供应中断量是综合敏感度最高的三个因素；进一步的</w:t>
+        <w:t xml:space="preserve">美元/桶，且仍保留二次跳涨风险。敏感性分析表明，地缘风险权重、不确定性与制度风险强度、制度风险占比是综合敏感度最高的三个因素；进一步的</w:t>
       </w:r>
       <w:r>
         <w:t xml:space="preserve"> 2000 </w:t>
@@ -551,6 +551,14 @@
           <w:rFonts w:hint="eastAsia"/>
         </w:rPr>
         <w:t xml:space="preserve">霍尔木兹海峡；原油价格；动态递推模型；战略石油储备；情景预测；敏感性分析</w:t>
+      </w:r>
+    </w:p>
+    <w:p>
+      <w:pPr>
+        <w:pStyle w:val="BodyText"/>
+      </w:pPr>
+      <w:r>
+        <w:t xml:space="preserve"> </w:t>
       </w:r>
     </w:p>
     <w:bookmarkStart w:id="9" w:name="问题重述"/>
@@ -797,16 +805,7 @@
               <w:rPr>
                 <w:rFonts w:hint="eastAsia"/>
               </w:rPr>
-              <w:t xml:space="preserve">阶段</w:t>
-            </w:r>
-            <w:r>
-              <w:t xml:space="preserve"> 1–4 </w:t>
-            </w:r>
-            <w:r>
-              <w:rPr>
-                <w:rFonts w:hint="eastAsia"/>
-              </w:rPr>
-              <w:t xml:space="preserve">完成附件数据清洗、传统供需基准、短期动态递推、参数校准和防御性检验，给出</w:t>
+              <w:t xml:space="preserve">数据清洗、供需基准、短期递推和参数校准完成附件数据清洗、传统供需基准、短期动态递推、参数校准和防御性检验，给出</w:t>
             </w:r>
             <w:r>
               <w:t xml:space="preserve"> </w:t>
@@ -874,16 +873,7 @@
               <w:rPr>
                 <w:rFonts w:hint="eastAsia"/>
               </w:rPr>
-              <w:t xml:space="preserve">阶段</w:t>
-            </w:r>
-            <w:r>
-              <w:t xml:space="preserve"> 5–6 </w:t>
-            </w:r>
-            <w:r>
-              <w:rPr>
-                <w:rFonts w:hint="eastAsia"/>
-              </w:rPr>
-              <w:t xml:space="preserve">构建乐观、中性、悲观三情景路径，给出第</w:t>
+              <w:t xml:space="preserve">长期情景预测和敏感性分析构建乐观、中性、悲观三情景路径，给出第</w:t>
             </w:r>
             <w:r>
               <w:t xml:space="preserve"> 60/90/120/180 </w:t>
@@ -2372,10 +2362,10 @@
         <w:rPr>
           <w:rFonts w:hint="eastAsia"/>
         </w:rPr>
-        <w:t xml:space="preserve">阶段</w:t>
-      </w:r>
-      <w:r>
-        <w:t xml:space="preserve"> 9 </w:t>
+        <w:t xml:space="preserve">滞后</w:t>
+      </w:r>
+      <w:r>
+        <w:t xml:space="preserve"> GPR </w:t>
       </w:r>
       <w:r>
         <w:rPr>
@@ -3950,7 +3940,7 @@
         <w:rPr>
           <w:rFonts w:hint="eastAsia"/>
         </w:rPr>
-        <w:t xml:space="preserve">为了避免把模型理解为单纯曲线拟合，本文将参数按来源分为五类。题面参数和附件统计量构成模型硬约束；官方外部数据只用于数量级审计；校准参数必须通过基准对比、消融实验和扰动检验；长期情景参数只用于</w:t>
+        <w:t xml:space="preserve">为了避免把模型理解为单纯曲线拟合，本文将参数按来源分为六类。题面参数和附件统计量构成模型硬约束；官方外部数据只用于数量级审计；校准参数必须通过基准对比、消融实验和扰动检验；长期情景参数只用于</w:t>
       </w:r>
       <w:r>
         <w:t xml:space="preserve"> 60–180 </w:t>
@@ -3959,7 +3949,7 @@
         <w:rPr>
           <w:rFonts w:hint="eastAsia"/>
         </w:rPr>
-        <w:t xml:space="preserve">天条件外推，不参与短期窗口的误差拟合。</w:t>
+        <w:t xml:space="preserve">天条件外推，不参与短期窗口的误差拟合；长期机制强度参数则必须显式命名，并进入敏感性分析。</w:t>
       </w:r>
     </w:p>
     <w:p>
@@ -4381,6 +4371,53 @@
                 <w:rFonts w:hint="eastAsia"/>
               </w:rPr>
               <w:t xml:space="preserve">只用于条件中心路径和尾部风险外推，不称为真实未来拟合</w:t>
+            </w:r>
+          </w:p>
+        </w:tc>
+      </w:tr>
+      <w:tr>
+        <w:tc>
+          <w:tcPr/>
+          <w:p>
+            <w:pPr>
+              <w:pStyle w:val="Compact"/>
+              <w:jc w:val="left"/>
+            </w:pPr>
+            <w:r>
+              <w:rPr>
+                <w:rFonts w:hint="eastAsia"/>
+              </w:rPr>
+              <w:t xml:space="preserve">长期机制强度参数</w:t>
+            </w:r>
+          </w:p>
+        </w:tc>
+        <w:tc>
+          <w:tcPr/>
+          <w:p>
+            <w:pPr>
+              <w:pStyle w:val="Compact"/>
+              <w:jc w:val="left"/>
+            </w:pPr>
+            <w:r>
+              <w:rPr>
+                <w:rFonts w:hint="eastAsia"/>
+              </w:rPr>
+              <w:t xml:space="preserve">冲击不确定性占比、制度风险占比、信心恢复后风险底座、过剩供给回归强度</w:t>
+            </w:r>
+          </w:p>
+        </w:tc>
+        <w:tc>
+          <w:tcPr/>
+          <w:p>
+            <w:pPr>
+              <w:pStyle w:val="Compact"/>
+              <w:jc w:val="left"/>
+            </w:pPr>
+            <w:r>
+              <w:rPr>
+                <w:rFonts w:hint="eastAsia"/>
+              </w:rPr>
+              <w:t xml:space="preserve">用于刻画长期机制形状，不作为官方物理常数，并在敏感性分析中单独扰动检验</w:t>
             </w:r>
           </w:p>
         </w:tc>
@@ -4511,6 +4548,44 @@
           <w:rFonts w:hint="eastAsia"/>
         </w:rPr>
         <w:t xml:space="preserve">，经济含义不同。</w:t>
+      </w:r>
+    </w:p>
+    <w:p>
+      <w:pPr>
+        <w:pStyle w:val="BodyText"/>
+      </w:pPr>
+      <w:r>
+        <w:rPr>
+          <w:rFonts w:hint="eastAsia"/>
+        </w:rPr>
+        <w:t xml:space="preserve">长期外推中的若干机制系数也需要单独说明。例如冲击不确定性占比、制度风险占比和过剩供给回归强度并非</w:t>
+      </w:r>
+      <w:r>
+        <w:t xml:space="preserve"> EIA </w:t>
+      </w:r>
+      <w:r>
+        <w:rPr>
+          <w:rFonts w:hint="eastAsia"/>
+        </w:rPr>
+        <w:t xml:space="preserve">或</w:t>
+      </w:r>
+      <w:r>
+        <w:t xml:space="preserve"> IEA </w:t>
+      </w:r>
+      <w:r>
+        <w:rPr>
+          <w:rFonts w:hint="eastAsia"/>
+        </w:rPr>
+        <w:t xml:space="preserve">直接发布的物理量，而是把短期校准后的风险定价机制延伸到</w:t>
+      </w:r>
+      <w:r>
+        <w:t xml:space="preserve"> 60–180 </w:t>
+      </w:r>
+      <w:r>
+        <w:rPr>
+          <w:rFonts w:hint="eastAsia"/>
+        </w:rPr>
+        <w:t xml:space="preserve">天时使用的形状参数。本文不把它们写成确定事实，而是把它们显式列入敏感性分析：若这些系数在合理范围内扰动后结论仍保持中性回落、悲观尾部上行的结构，则说明长期判断主要来自机制组合，而不是某一个隐藏常数。</w:t>
       </w:r>
     </w:p>
     <w:bookmarkEnd w:id="29"/>
@@ -6622,7 +6697,7 @@
     </w:p>
     <w:bookmarkEnd w:id="38"/>
     <w:bookmarkEnd w:id="39"/>
-    <w:bookmarkStart w:id="76" w:name="参数校准与模型检验"/>
+    <w:bookmarkStart w:id="80" w:name="参数校准与模型检验"/>
     <w:p>
       <w:pPr>
         <w:pStyle w:val="Heading1"/>
@@ -10064,7 +10139,799 @@
       </w:r>
     </w:p>
     <w:bookmarkEnd w:id="65"/>
-    <w:bookmarkStart w:id="66" w:name="机制消融的定量证据"/>
+    <w:bookmarkStart w:id="69" w:name="统计审计与-r-语言辅助定位"/>
+    <w:p>
+      <w:pPr>
+        <w:pStyle w:val="Heading2"/>
+      </w:pPr>
+      <w:r>
+        <w:rPr>
+          <w:rFonts w:hint="eastAsia"/>
+        </w:rPr>
+        <w:t xml:space="preserve">统计审计与</w:t>
+      </w:r>
+      <w:r>
+        <w:t xml:space="preserve"> R </w:t>
+      </w:r>
+      <w:r>
+        <w:rPr>
+          <w:rFonts w:hint="eastAsia"/>
+        </w:rPr>
+        <w:t xml:space="preserve">语言辅助定位</w:t>
+      </w:r>
+    </w:p>
+    <w:p>
+      <w:pPr>
+        <w:pStyle w:val="FirstParagraph"/>
+      </w:pPr>
+      <w:r>
+        <w:rPr>
+          <w:rFonts w:hint="eastAsia"/>
+        </w:rPr>
+        <w:t xml:space="preserve">为进一步提高模型检验的严谨性，本文新增统计审计。该审计不改变短期主模型，只在剔除首日后构造可比较样本，将综合机制递推模型与朴素上一日基准进行误差和统计检验。之所以剔除首日，是因为朴素上一日基准需要上一交易日真实价格作为输入，首日没有可比预测值。因此，本节统计审计中的</w:t>
+      </w:r>
+      <w:r>
+        <w:t xml:space="preserve"> RMSE </w:t>
+      </w:r>
+      <w:r>
+        <w:rPr>
+          <w:rFonts w:hint="eastAsia"/>
+        </w:rPr>
+        <w:t xml:space="preserve">与前文全窗口</w:t>
+      </w:r>
+      <w:r>
+        <w:t xml:space="preserve"> RMSE </w:t>
+      </w:r>
+      <w:r>
+        <w:rPr>
+          <w:rFonts w:hint="eastAsia"/>
+        </w:rPr>
+        <w:t xml:space="preserve">略有差异。</w:t>
+      </w:r>
+    </w:p>
+    <w:p>
+      <w:pPr>
+        <w:pStyle w:val="TableCaption"/>
+      </w:pPr>
+      <w:r>
+        <w:rPr>
+          <w:rFonts w:hint="eastAsia"/>
+        </w:rPr>
+        <w:t xml:space="preserve">短期模型统计审计结果</w:t>
+      </w:r>
+    </w:p>
+    <w:tbl>
+      <w:tblPr>
+        <w:tblStyle w:val="Table"/>
+        <w:tblW w:type="auto" w:w="0"/>
+        <w:tblLook w:firstRow="1" w:lastRow="0" w:firstColumn="0" w:lastColumn="0" w:noHBand="0" w:noVBand="0" w:val="0020"/>
+        <w:tblCaption w:val="短期模型统计审计结果"/>
+      </w:tblPr>
+      <w:tblGrid>
+        <w:gridCol w:w="1980"/>
+        <w:gridCol w:w="1980"/>
+        <w:gridCol w:w="1980"/>
+        <w:gridCol w:w="1980"/>
+      </w:tblGrid>
+      <w:tr>
+        <w:trPr>
+          <w:tblHeader w:val="on"/>
+        </w:trPr>
+        <w:tc>
+          <w:tcPr/>
+          <w:p>
+            <w:pPr>
+              <w:pStyle w:val="Compact"/>
+              <w:jc w:val="left"/>
+            </w:pPr>
+            <w:r>
+              <w:rPr>
+                <w:rFonts w:hint="eastAsia"/>
+              </w:rPr>
+              <w:t xml:space="preserve">检验项</w:t>
+            </w:r>
+          </w:p>
+        </w:tc>
+        <w:tc>
+          <w:tcPr/>
+          <w:p>
+            <w:pPr>
+              <w:pStyle w:val="Compact"/>
+              <w:jc w:val="right"/>
+            </w:pPr>
+            <w:r>
+              <w:rPr>
+                <w:rFonts w:hint="eastAsia"/>
+              </w:rPr>
+              <w:t xml:space="preserve">本文模型</w:t>
+            </w:r>
+          </w:p>
+        </w:tc>
+        <w:tc>
+          <w:tcPr/>
+          <w:p>
+            <w:pPr>
+              <w:pStyle w:val="Compact"/>
+              <w:jc w:val="right"/>
+            </w:pPr>
+            <w:r>
+              <w:rPr>
+                <w:rFonts w:hint="eastAsia"/>
+              </w:rPr>
+              <w:t xml:space="preserve">对照或</w:t>
+            </w:r>
+            <w:r>
+              <w:t xml:space="preserve"> p </w:t>
+            </w:r>
+            <w:r>
+              <w:rPr>
+                <w:rFonts w:hint="eastAsia"/>
+              </w:rPr>
+              <w:t xml:space="preserve">值</w:t>
+            </w:r>
+          </w:p>
+        </w:tc>
+        <w:tc>
+          <w:tcPr/>
+          <w:p>
+            <w:pPr>
+              <w:pStyle w:val="Compact"/>
+              <w:jc w:val="left"/>
+            </w:pPr>
+            <w:r>
+              <w:rPr>
+                <w:rFonts w:hint="eastAsia"/>
+              </w:rPr>
+              <w:t xml:space="preserve">解释</w:t>
+            </w:r>
+          </w:p>
+        </w:tc>
+      </w:tr>
+      <w:tr>
+        <w:tc>
+          <w:tcPr/>
+          <w:p>
+            <w:pPr>
+              <w:pStyle w:val="Compact"/>
+              <w:jc w:val="left"/>
+            </w:pPr>
+            <w:r>
+              <w:t xml:space="preserve">RMSE</w:t>
+            </w:r>
+          </w:p>
+        </w:tc>
+        <w:tc>
+          <w:tcPr/>
+          <w:p>
+            <w:pPr>
+              <w:pStyle w:val="Compact"/>
+              <w:jc w:val="right"/>
+            </w:pPr>
+            <w:r>
+              <w:t xml:space="preserve">3.47</w:t>
+            </w:r>
+          </w:p>
+        </w:tc>
+        <w:tc>
+          <w:tcPr/>
+          <w:p>
+            <w:pPr>
+              <w:pStyle w:val="Compact"/>
+              <w:jc w:val="right"/>
+            </w:pPr>
+            <w:r>
+              <w:t xml:space="preserve">4.52</w:t>
+            </w:r>
+          </w:p>
+        </w:tc>
+        <w:tc>
+          <w:tcPr/>
+          <w:p>
+            <w:pPr>
+              <w:pStyle w:val="Compact"/>
+              <w:jc w:val="left"/>
+            </w:pPr>
+            <w:r>
+              <w:rPr>
+                <w:rFonts w:hint="eastAsia"/>
+              </w:rPr>
+              <w:t xml:space="preserve">对照为朴素上一日基准，改善约</w:t>
+            </w:r>
+            <w:r>
+              <w:t xml:space="preserve"> 23.2%</w:t>
+            </w:r>
+          </w:p>
+        </w:tc>
+      </w:tr>
+      <w:tr>
+        <w:tc>
+          <w:tcPr/>
+          <w:p>
+            <w:pPr>
+              <w:pStyle w:val="Compact"/>
+              <w:jc w:val="left"/>
+            </w:pPr>
+            <w:r>
+              <w:t xml:space="preserve">MAE</w:t>
+            </w:r>
+          </w:p>
+        </w:tc>
+        <w:tc>
+          <w:tcPr/>
+          <w:p>
+            <w:pPr>
+              <w:pStyle w:val="Compact"/>
+              <w:jc w:val="right"/>
+            </w:pPr>
+            <w:r>
+              <w:t xml:space="preserve">2.88</w:t>
+            </w:r>
+          </w:p>
+        </w:tc>
+        <w:tc>
+          <w:tcPr/>
+          <w:p>
+            <w:pPr>
+              <w:pStyle w:val="Compact"/>
+              <w:jc w:val="right"/>
+            </w:pPr>
+            <w:r>
+              <w:t xml:space="preserve">3.65</w:t>
+            </w:r>
+          </w:p>
+        </w:tc>
+        <w:tc>
+          <w:tcPr/>
+          <w:p>
+            <w:pPr>
+              <w:pStyle w:val="Compact"/>
+              <w:jc w:val="left"/>
+            </w:pPr>
+            <w:r>
+              <w:rPr>
+                <w:rFonts w:hint="eastAsia"/>
+              </w:rPr>
+              <w:t xml:space="preserve">平均绝对误差低于朴素基准</w:t>
+            </w:r>
+          </w:p>
+        </w:tc>
+      </w:tr>
+      <w:tr>
+        <w:tc>
+          <w:tcPr/>
+          <w:p>
+            <w:pPr>
+              <w:pStyle w:val="Compact"/>
+              <w:jc w:val="left"/>
+            </w:pPr>
+            <w:r>
+              <w:t xml:space="preserve">MAPE</w:t>
+            </w:r>
+          </w:p>
+        </w:tc>
+        <w:tc>
+          <w:tcPr/>
+          <w:p>
+            <w:pPr>
+              <w:pStyle w:val="Compact"/>
+              <w:jc w:val="right"/>
+            </w:pPr>
+            <w:r>
+              <w:t xml:space="preserve">2.87%</w:t>
+            </w:r>
+          </w:p>
+        </w:tc>
+        <w:tc>
+          <w:tcPr/>
+          <w:p>
+            <w:pPr>
+              <w:pStyle w:val="Compact"/>
+              <w:jc w:val="right"/>
+            </w:pPr>
+            <w:r>
+              <w:t xml:space="preserve">3.62%</w:t>
+            </w:r>
+          </w:p>
+        </w:tc>
+        <w:tc>
+          <w:tcPr/>
+          <w:p>
+            <w:pPr>
+              <w:pStyle w:val="Compact"/>
+              <w:jc w:val="left"/>
+            </w:pPr>
+            <w:r>
+              <w:rPr>
+                <w:rFonts w:hint="eastAsia"/>
+              </w:rPr>
+              <w:t xml:space="preserve">相对误差低于朴素基准</w:t>
+            </w:r>
+          </w:p>
+        </w:tc>
+      </w:tr>
+      <w:tr>
+        <w:tc>
+          <w:tcPr/>
+          <w:p>
+            <w:pPr>
+              <w:pStyle w:val="Compact"/>
+              <w:jc w:val="left"/>
+            </w:pPr>
+            <w:r>
+              <w:t xml:space="preserve">DM </w:t>
+            </w:r>
+            <w:r>
+              <w:rPr>
+                <w:rFonts w:hint="eastAsia"/>
+              </w:rPr>
+              <w:t xml:space="preserve">平方损失检验</w:t>
+            </w:r>
+          </w:p>
+        </w:tc>
+        <w:tc>
+          <w:tcPr/>
+          <w:p>
+            <w:pPr>
+              <w:pStyle w:val="Compact"/>
+              <w:jc w:val="right"/>
+            </w:pPr>
+            <w:r>
+              <w:t xml:space="preserve">-8.36</w:t>
+            </w:r>
+          </w:p>
+        </w:tc>
+        <w:tc>
+          <w:tcPr/>
+          <w:p>
+            <w:pPr>
+              <w:pStyle w:val="Compact"/>
+              <w:jc w:val="right"/>
+            </w:pPr>
+            <w:r>
+              <w:t xml:space="preserve">0.023</w:t>
+            </w:r>
+          </w:p>
+        </w:tc>
+        <w:tc>
+          <w:tcPr/>
+          <w:p>
+            <w:pPr>
+              <w:pStyle w:val="Compact"/>
+              <w:jc w:val="left"/>
+            </w:pPr>
+            <w:r>
+              <w:rPr>
+                <w:rFonts w:hint="eastAsia"/>
+              </w:rPr>
+              <w:t xml:space="preserve">损失均值差为负，单侧检验支持模型优于朴素基准</w:t>
+            </w:r>
+          </w:p>
+        </w:tc>
+      </w:tr>
+      <w:tr>
+        <w:tc>
+          <w:tcPr/>
+          <w:p>
+            <w:pPr>
+              <w:pStyle w:val="Compact"/>
+              <w:jc w:val="left"/>
+            </w:pPr>
+            <w:r>
+              <w:t xml:space="preserve">DM </w:t>
+            </w:r>
+            <w:r>
+              <w:rPr>
+                <w:rFonts w:hint="eastAsia"/>
+              </w:rPr>
+              <w:t xml:space="preserve">绝对损失检验</w:t>
+            </w:r>
+          </w:p>
+        </w:tc>
+        <w:tc>
+          <w:tcPr/>
+          <w:p>
+            <w:pPr>
+              <w:pStyle w:val="Compact"/>
+              <w:jc w:val="right"/>
+            </w:pPr>
+            <w:r>
+              <w:t xml:space="preserve">-0.77</w:t>
+            </w:r>
+          </w:p>
+        </w:tc>
+        <w:tc>
+          <w:tcPr/>
+          <w:p>
+            <w:pPr>
+              <w:pStyle w:val="Compact"/>
+              <w:jc w:val="right"/>
+            </w:pPr>
+            <w:r>
+              <w:t xml:space="preserve">0.050</w:t>
+            </w:r>
+          </w:p>
+        </w:tc>
+        <w:tc>
+          <w:tcPr/>
+          <w:p>
+            <w:pPr>
+              <w:pStyle w:val="Compact"/>
+              <w:jc w:val="left"/>
+            </w:pPr>
+            <w:r>
+              <w:rPr>
+                <w:rFonts w:hint="eastAsia"/>
+              </w:rPr>
+              <w:t xml:space="preserve">绝对损失优势接近</w:t>
+            </w:r>
+            <w:r>
+              <w:t xml:space="preserve"> 5% </w:t>
+            </w:r>
+            <w:r>
+              <w:rPr>
+                <w:rFonts w:hint="eastAsia"/>
+              </w:rPr>
+              <w:t xml:space="preserve">显著性边界</w:t>
+            </w:r>
+          </w:p>
+        </w:tc>
+      </w:tr>
+      <w:tr>
+        <w:tc>
+          <w:tcPr/>
+          <w:p>
+            <w:pPr>
+              <w:pStyle w:val="Compact"/>
+              <w:jc w:val="left"/>
+            </w:pPr>
+            <w:r>
+              <w:rPr>
+                <w:rFonts w:hint="eastAsia"/>
+              </w:rPr>
+              <w:t xml:space="preserve">方向命中率</w:t>
+            </w:r>
+          </w:p>
+        </w:tc>
+        <w:tc>
+          <w:tcPr/>
+          <w:p>
+            <w:pPr>
+              <w:pStyle w:val="Compact"/>
+              <w:jc w:val="right"/>
+            </w:pPr>
+            <w:r>
+              <w:t xml:space="preserve">63.6%</w:t>
+            </w:r>
+          </w:p>
+        </w:tc>
+        <w:tc>
+          <w:tcPr/>
+          <w:p>
+            <w:pPr>
+              <w:pStyle w:val="Compact"/>
+              <w:jc w:val="right"/>
+            </w:pPr>
+            <w:r>
+              <w:t xml:space="preserve">0.048</w:t>
+            </w:r>
+          </w:p>
+        </w:tc>
+        <w:tc>
+          <w:tcPr/>
+          <w:p>
+            <w:pPr>
+              <w:pStyle w:val="Compact"/>
+              <w:jc w:val="left"/>
+            </w:pPr>
+            <w:r>
+              <w:rPr>
+                <w:rFonts w:hint="eastAsia"/>
+              </w:rPr>
+              <w:t xml:space="preserve">相对随机</w:t>
+            </w:r>
+            <w:r>
+              <w:t xml:space="preserve"> 50% </w:t>
+            </w:r>
+            <w:r>
+              <w:rPr>
+                <w:rFonts w:hint="eastAsia"/>
+              </w:rPr>
+              <w:t xml:space="preserve">的单侧二项检验</w:t>
+            </w:r>
+          </w:p>
+        </w:tc>
+      </w:tr>
+      <w:tr>
+        <w:tc>
+          <w:tcPr/>
+          <w:p>
+            <w:pPr>
+              <w:pStyle w:val="Compact"/>
+              <w:jc w:val="left"/>
+            </w:pPr>
+            <w:r>
+              <w:t xml:space="preserve">Ljung–Box lag10</w:t>
+            </w:r>
+          </w:p>
+        </w:tc>
+        <w:tc>
+          <w:tcPr/>
+          <w:p>
+            <w:pPr>
+              <w:pStyle w:val="Compact"/>
+              <w:jc w:val="right"/>
+            </w:pPr>
+            <w:r>
+              <w:t xml:space="preserve">10.92</w:t>
+            </w:r>
+          </w:p>
+        </w:tc>
+        <w:tc>
+          <w:tcPr/>
+          <w:p>
+            <w:pPr>
+              <w:pStyle w:val="Compact"/>
+              <w:jc w:val="right"/>
+            </w:pPr>
+            <w:r>
+              <w:t xml:space="preserve">0.364</w:t>
+            </w:r>
+          </w:p>
+        </w:tc>
+        <w:tc>
+          <w:tcPr/>
+          <w:p>
+            <w:pPr>
+              <w:pStyle w:val="Compact"/>
+              <w:jc w:val="left"/>
+            </w:pPr>
+            <w:r>
+              <w:rPr>
+                <w:rFonts w:hint="eastAsia"/>
+              </w:rPr>
+              <w:t xml:space="preserve">未发现显著线性残差自相关</w:t>
+            </w:r>
+          </w:p>
+        </w:tc>
+      </w:tr>
+      <w:tr>
+        <w:tc>
+          <w:tcPr/>
+          <w:p>
+            <w:pPr>
+              <w:pStyle w:val="Compact"/>
+              <w:jc w:val="left"/>
+            </w:pPr>
+            <w:r>
+              <w:t xml:space="preserve">ARCH–LM lag5</w:t>
+            </w:r>
+          </w:p>
+        </w:tc>
+        <w:tc>
+          <w:tcPr/>
+          <w:p>
+            <w:pPr>
+              <w:pStyle w:val="Compact"/>
+              <w:jc w:val="right"/>
+            </w:pPr>
+            <w:r>
+              <w:t xml:space="preserve">5.22</w:t>
+            </w:r>
+          </w:p>
+        </w:tc>
+        <w:tc>
+          <w:tcPr/>
+          <w:p>
+            <w:pPr>
+              <w:pStyle w:val="Compact"/>
+              <w:jc w:val="right"/>
+            </w:pPr>
+            <w:r>
+              <w:t xml:space="preserve">0.389</w:t>
+            </w:r>
+          </w:p>
+        </w:tc>
+        <w:tc>
+          <w:tcPr/>
+          <w:p>
+            <w:pPr>
+              <w:pStyle w:val="Compact"/>
+              <w:jc w:val="left"/>
+            </w:pPr>
+            <w:r>
+              <w:rPr>
+                <w:rFonts w:hint="eastAsia"/>
+              </w:rPr>
+              <w:t xml:space="preserve">未发现强条件异方差证据</w:t>
+            </w:r>
+          </w:p>
+        </w:tc>
+      </w:tr>
+    </w:tbl>
+    <w:p>
+      <w:pPr>
+        <w:pStyle w:val="CaptionedFigure"/>
+      </w:pPr>
+      <w:r>
+        <w:drawing>
+          <wp:inline>
+            <wp:extent cx="4907280" cy="2826593"/>
+            <wp:effectExtent b="0" l="0" r="0" t="0"/>
+            <wp:docPr descr="" title="" id="67" name="Picture"/>
+            <a:graphic>
+              <a:graphicData uri="http://schemas.openxmlformats.org/drawingml/2006/picture">
+                <pic:pic>
+                  <pic:nvPicPr>
+                    <pic:cNvPr descr="短期模型统计审计.png" id="68" name="Picture"/>
+                    <pic:cNvPicPr>
+                      <a:picLocks noChangeArrowheads="1" noChangeAspect="1"/>
+                    </pic:cNvPicPr>
+                  </pic:nvPicPr>
+                  <pic:blipFill>
+                    <a:blip r:embed="rId66"/>
+                    <a:stretch>
+                      <a:fillRect/>
+                    </a:stretch>
+                  </pic:blipFill>
+                  <pic:spPr bwMode="auto">
+                    <a:xfrm>
+                      <a:off x="0" y="0"/>
+                      <a:ext cx="4907280" cy="2826593"/>
+                    </a:xfrm>
+                    <a:prstGeom prst="rect">
+                      <a:avLst/>
+                    </a:prstGeom>
+                    <a:noFill/>
+                    <a:ln w="9525">
+                      <a:noFill/>
+                      <a:headEnd/>
+                      <a:tailEnd/>
+                    </a:ln>
+                  </pic:spPr>
+                </pic:pic>
+              </a:graphicData>
+            </a:graphic>
+          </wp:inline>
+        </w:drawing>
+      </w:r>
+    </w:p>
+    <w:p>
+      <w:pPr>
+        <w:pStyle w:val="ImageCaption"/>
+      </w:pPr>
+      <w:r>
+        <w:rPr>
+          <w:rFonts w:hint="eastAsia"/>
+        </w:rPr>
+        <w:t xml:space="preserve">短期模型统计审计。图中展示残差序列、残差自相关、残差分布和相对朴素基准的平方损失差。</w:t>
+      </w:r>
+    </w:p>
+    <w:p>
+      <w:pPr>
+        <w:pStyle w:val="BodyText"/>
+      </w:pPr>
+      <w:r>
+        <w:rPr>
+          <w:rFonts w:hint="eastAsia"/>
+        </w:rPr>
+        <w:t xml:space="preserve">分段统计也给出一个更细的判断：前段冲击吸收和后段预期修复阶段，本文模型相对朴素基准的</w:t>
+      </w:r>
+      <w:r>
+        <w:t xml:space="preserve"> RMSE </w:t>
+      </w:r>
+      <w:r>
+        <w:rPr>
+          <w:rFonts w:hint="eastAsia"/>
+        </w:rPr>
+        <w:t xml:space="preserve">改善率分别约为</w:t>
+      </w:r>
+      <w:r>
+        <w:t xml:space="preserve"> 33.4% </w:t>
+      </w:r>
+      <w:r>
+        <w:rPr>
+          <w:rFonts w:hint="eastAsia"/>
+        </w:rPr>
+        <w:t xml:space="preserve">和</w:t>
+      </w:r>
+      <w:r>
+        <w:t xml:space="preserve"> </w:t>
+      </w:r>
+      <w:r>
+        <w:rPr>
+          <w:rFonts w:hint="eastAsia"/>
+        </w:rPr>
+        <w:t xml:space="preserve">34.1%；中段平台维持阶段改善率约为</w:t>
+      </w:r>
+      <w:r>
+        <w:t xml:space="preserve"> </w:t>
+      </w:r>
+      <w:r>
+        <w:rPr>
+          <w:rFonts w:hint="eastAsia"/>
+        </w:rPr>
+        <w:t xml:space="preserve">3.9%，说明平台震荡期仍是后续优化重点。总体看，DM</w:t>
+      </w:r>
+      <w:r>
+        <w:t xml:space="preserve"> </w:t>
+      </w:r>
+      <w:r>
+        <w:rPr>
+          <w:rFonts w:hint="eastAsia"/>
+        </w:rPr>
+        <w:t xml:space="preserve">检验和方向命中检验提供了支持性统计证据，但样本只有</w:t>
+      </w:r>
+      <w:r>
+        <w:t xml:space="preserve"> 45 </w:t>
+      </w:r>
+      <w:r>
+        <w:rPr>
+          <w:rFonts w:hint="eastAsia"/>
+        </w:rPr>
+        <w:t xml:space="preserve">个可比较交易日，本文不把它写成压倒性证明，而是作为基准对比、滞后检验和机制消融之外的补充验证。</w:t>
+      </w:r>
+    </w:p>
+    <w:p>
+      <w:pPr>
+        <w:pStyle w:val="BodyText"/>
+      </w:pPr>
+      <w:r>
+        <w:t xml:space="preserve">R </w:t>
+      </w:r>
+      <w:r>
+        <w:rPr>
+          <w:rFonts w:hint="eastAsia"/>
+        </w:rPr>
+        <w:t xml:space="preserve">语言在本文中的定位是统计审计辅助层，而不是替代</w:t>
+      </w:r>
+      <w:r>
+        <w:t xml:space="preserve"> Python </w:t>
+      </w:r>
+      <w:r>
+        <w:rPr>
+          <w:rFonts w:hint="eastAsia"/>
+        </w:rPr>
+        <w:t xml:space="preserve">主模型。当前项目已保留可选</w:t>
+      </w:r>
+      <w:r>
+        <w:t xml:space="preserve"> R </w:t>
+      </w:r>
+      <w:r>
+        <w:rPr>
+          <w:rFonts w:hint="eastAsia"/>
+        </w:rPr>
+        <w:t xml:space="preserve">审计脚本，用于后续复核</w:t>
+      </w:r>
+      <w:r>
+        <w:t xml:space="preserve"> DM </w:t>
+      </w:r>
+      <w:r>
+        <w:rPr>
+          <w:rFonts w:hint="eastAsia"/>
+        </w:rPr>
+        <w:t xml:space="preserve">检验、方向检验、残差诊断以及扩展</w:t>
+      </w:r>
+      <w:r>
+        <w:t xml:space="preserve"> GARCH、VAR </w:t>
+      </w:r>
+      <w:r>
+        <w:rPr>
+          <w:rFonts w:hint="eastAsia"/>
+        </w:rPr>
+        <w:t xml:space="preserve">或稳健标准误分析；但主模型仍由</w:t>
+      </w:r>
+      <w:r>
+        <w:t xml:space="preserve"> Python </w:t>
+      </w:r>
+      <w:r>
+        <w:rPr>
+          <w:rFonts w:hint="eastAsia"/>
+        </w:rPr>
+        <w:t xml:space="preserve">完整复现，避免在交付阶段引入不必要的多语言依赖。</w:t>
+      </w:r>
+    </w:p>
+    <w:bookmarkEnd w:id="69"/>
+    <w:bookmarkStart w:id="70" w:name="机制消融的定量证据"/>
     <w:p>
       <w:pPr>
         <w:pStyle w:val="Heading2"/>
@@ -10985,8 +11852,8 @@
         <w:t xml:space="preserve">10.09，说明市场对政策缓冲和运输恢复的预期并不是可有可无的修饰，而是解释后期回落的关键机制。</w:t>
       </w:r>
     </w:p>
-    <w:bookmarkEnd w:id="66"/>
-    <w:bookmarkStart w:id="70" w:name="拐点预测步长与事件边界"/>
+    <w:bookmarkEnd w:id="70"/>
+    <w:bookmarkStart w:id="74" w:name="拐点预测步长与事件边界"/>
     <w:p>
       <w:pPr>
         <w:pStyle w:val="Heading2"/>
@@ -11109,18 +11976,18 @@
           <wp:inline>
             <wp:extent cx="4907280" cy="3568930"/>
             <wp:effectExtent b="0" l="0" r="0" t="0"/>
-            <wp:docPr descr="" title="" id="68" name="Picture"/>
+            <wp:docPr descr="" title="" id="72" name="Picture"/>
             <a:graphic>
               <a:graphicData uri="http://schemas.openxmlformats.org/drawingml/2006/picture">
                 <pic:pic>
                   <pic:nvPicPr>
-                    <pic:cNvPr descr="短期模型拐点局部检验.png" id="69" name="Picture"/>
+                    <pic:cNvPr descr="短期模型拐点局部检验.png" id="73" name="Picture"/>
                     <pic:cNvPicPr>
                       <a:picLocks noChangeArrowheads="1" noChangeAspect="1"/>
                     </pic:cNvPicPr>
                   </pic:nvPicPr>
                   <pic:blipFill>
-                    <a:blip r:embed="rId67"/>
+                    <a:blip r:embed="rId71"/>
                     <a:stretch>
                       <a:fillRect/>
                     </a:stretch>
@@ -11187,8 +12054,8 @@
         <w:t xml:space="preserve">年等非霍尔木兹事件窗口。结果显示，该模型在这些窗口通常显著弱于朴素上一日基准。这并不削弱本文结论，反而说明本文模型不是通用油价短线交易器，而是针对霍尔木兹封锁机制构建的事件解释模型。论文结论应限定在极端地缘冲突下的条件路径解释与情景预测，不能外推为普通时期的万能预测模型。</w:t>
       </w:r>
     </w:p>
-    <w:bookmarkEnd w:id="70"/>
-    <w:bookmarkStart w:id="74" w:name="参数自由度与稳健性区间"/>
+    <w:bookmarkEnd w:id="74"/>
+    <w:bookmarkStart w:id="78" w:name="参数自由度与稳健性区间"/>
     <w:p>
       <w:pPr>
         <w:pStyle w:val="Heading2"/>
@@ -11834,18 +12701,18 @@
           <wp:inline>
             <wp:extent cx="4907280" cy="2587474"/>
             <wp:effectExtent b="0" l="0" r="0" t="0"/>
-            <wp:docPr descr="" title="" id="72" name="Picture"/>
+            <wp:docPr descr="" title="" id="76" name="Picture"/>
             <a:graphic>
               <a:graphicData uri="http://schemas.openxmlformats.org/drawingml/2006/picture">
                 <pic:pic>
                   <pic:nvPicPr>
-                    <pic:cNvPr descr="短期模型稳健性带.png" id="73" name="Picture"/>
+                    <pic:cNvPr descr="短期模型稳健性带.png" id="77" name="Picture"/>
                     <pic:cNvPicPr>
                       <a:picLocks noChangeArrowheads="1" noChangeAspect="1"/>
                     </pic:cNvPicPr>
                   </pic:nvPicPr>
                   <pic:blipFill>
-                    <a:blip r:embed="rId71"/>
+                    <a:blip r:embed="rId75"/>
                     <a:stretch>
                       <a:fillRect/>
                     </a:stretch>
@@ -12020,8 +12887,8 @@
         <w:t xml:space="preserve">美元/桶，说明最优参数附近存在稳定的优秀参数邻域。</w:t>
       </w:r>
     </w:p>
-    <w:bookmarkEnd w:id="74"/>
-    <w:bookmarkStart w:id="75" w:name="内生性反事实基准与硬编码审计"/>
+    <w:bookmarkEnd w:id="78"/>
+    <w:bookmarkStart w:id="79" w:name="内生性反事实基准与硬编码审计"/>
     <w:p>
       <w:pPr>
         <w:pStyle w:val="Heading2"/>
@@ -12318,9 +13185,9 @@
         <w:t xml:space="preserve">美元平台不是代码硬上限，但不应声称已经实现了多智能体动态纳什均衡。</w:t>
       </w:r>
     </w:p>
-    <w:bookmarkEnd w:id="75"/>
-    <w:bookmarkEnd w:id="76"/>
-    <w:bookmarkStart w:id="85" w:name="天三情景预测"/>
+    <w:bookmarkEnd w:id="79"/>
+    <w:bookmarkEnd w:id="80"/>
+    <w:bookmarkStart w:id="89" w:name="天三情景预测"/>
     <w:p>
       <w:pPr>
         <w:pStyle w:val="Heading1"/>
@@ -12335,7 +13202,7 @@
         <w:t xml:space="preserve">天三情景预测</w:t>
       </w:r>
     </w:p>
-    <w:bookmarkStart w:id="77" w:name="情景设定"/>
+    <w:bookmarkStart w:id="81" w:name="情景设定"/>
     <w:p>
       <w:pPr>
         <w:pStyle w:val="Heading2"/>
@@ -12355,25 +13222,7 @@
         <w:rPr>
           <w:rFonts w:hint="eastAsia"/>
         </w:rPr>
-        <w:t xml:space="preserve">阶段</w:t>
-      </w:r>
-      <w:r>
-        <w:t xml:space="preserve"> 5 </w:t>
-      </w:r>
-      <w:r>
-        <w:rPr>
-          <w:rFonts w:hint="eastAsia"/>
-        </w:rPr>
-        <w:t xml:space="preserve">在阶段</w:t>
-      </w:r>
-      <w:r>
-        <w:t xml:space="preserve"> 4 </w:t>
-      </w:r>
-      <w:r>
-        <w:rPr>
-          <w:rFonts w:hint="eastAsia"/>
-        </w:rPr>
-        <w:t xml:space="preserve">综合最优参数基础上构建乐观、中性和悲观三种情景。附件真实价格只覆盖到</w:t>
+        <w:t xml:space="preserve">长期情景预测在综合最优参数基础上构建乐观、中性和悲观三种情景。附件真实价格只覆盖到</w:t>
       </w:r>
       <w:r>
         <w:t xml:space="preserve"> 2026 </w:t>
@@ -13977,6 +14826,362 @@
     </w:p>
     <w:p>
       <w:pPr>
+        <w:pStyle w:val="BodyText"/>
+      </w:pPr>
+      <w:r>
+        <w:rPr>
+          <w:rFonts w:hint="eastAsia"/>
+        </w:rPr>
+        <w:t xml:space="preserve">短期和长期风险项的方向不同，并不是前后矛盾。短期窗口内，市场需要完成突发封锁的信息吸收，风险溢价表现为建立和再定价；长期窗口内，市场已经观察到</w:t>
+      </w:r>
+      <w:r>
+        <w:t xml:space="preserve"> </w:t>
+      </w:r>
+      <w:r>
+        <w:rPr>
+          <w:rFonts w:hint="eastAsia"/>
+        </w:rPr>
+        <w:t xml:space="preserve">SPR、库存、绕道和供需调整是否有效，因此风险项应随未解决缺口和信心恢复而逐步衰减。换言之，短期模型回答</w:t>
+      </w:r>
+      <w:r>
+        <w:rPr>
+          <w:rFonts w:hint="eastAsia"/>
+        </w:rPr>
+        <w:t xml:space="preserve">“冲击如何形成价格平台”</w:t>
+      </w:r>
+      <w:r>
+        <w:rPr>
+          <w:rFonts w:hint="eastAsia"/>
+        </w:rPr>
+        <w:t xml:space="preserve">，长期模型回答</w:t>
+      </w:r>
+      <w:r>
+        <w:rPr>
+          <w:rFonts w:hint="eastAsia"/>
+        </w:rPr>
+        <w:t xml:space="preserve">“平台在政策缓冲和需求调整后如何回归，尾部风险在哪里重新抬升”</w:t>
+      </w:r>
+      <w:r>
+        <w:t xml:space="preserve">。</w:t>
+      </w:r>
+    </w:p>
+    <w:p>
+      <w:pPr>
+        <w:pStyle w:val="TableCaption"/>
+      </w:pPr>
+      <w:r>
+        <w:rPr>
+          <w:rFonts w:hint="eastAsia"/>
+        </w:rPr>
+        <w:t xml:space="preserve">长期机制强度参数及检验边界</w:t>
+      </w:r>
+    </w:p>
+    <w:tbl>
+      <w:tblPr>
+        <w:tblStyle w:val="Table"/>
+        <w:tblW w:type="auto" w:w="0"/>
+        <w:tblLook w:firstRow="1" w:lastRow="0" w:firstColumn="0" w:lastColumn="0" w:noHBand="0" w:noVBand="0" w:val="0020"/>
+        <w:tblCaption w:val="长期机制强度参数及检验边界"/>
+      </w:tblPr>
+      <w:tblGrid>
+        <w:gridCol w:w="1980"/>
+        <w:gridCol w:w="1980"/>
+        <w:gridCol w:w="1980"/>
+        <w:gridCol w:w="1980"/>
+      </w:tblGrid>
+      <w:tr>
+        <w:trPr>
+          <w:tblHeader w:val="on"/>
+        </w:trPr>
+        <w:tc>
+          <w:tcPr/>
+          <w:p>
+            <w:pPr>
+              <w:pStyle w:val="Compact"/>
+              <w:jc w:val="left"/>
+            </w:pPr>
+            <w:r>
+              <w:rPr>
+                <w:rFonts w:hint="eastAsia"/>
+              </w:rPr>
+              <w:t xml:space="preserve">机制参数</w:t>
+            </w:r>
+          </w:p>
+        </w:tc>
+        <w:tc>
+          <w:tcPr/>
+          <w:p>
+            <w:pPr>
+              <w:pStyle w:val="Compact"/>
+              <w:jc w:val="right"/>
+            </w:pPr>
+            <w:r>
+              <w:rPr>
+                <w:rFonts w:hint="eastAsia"/>
+              </w:rPr>
+              <w:t xml:space="preserve">基准值</w:t>
+            </w:r>
+          </w:p>
+        </w:tc>
+        <w:tc>
+          <w:tcPr/>
+          <w:p>
+            <w:pPr>
+              <w:pStyle w:val="Compact"/>
+              <w:jc w:val="right"/>
+            </w:pPr>
+            <w:r>
+              <w:rPr>
+                <w:rFonts w:hint="eastAsia"/>
+              </w:rPr>
+              <w:t xml:space="preserve">扰动范围</w:t>
+            </w:r>
+          </w:p>
+        </w:tc>
+        <w:tc>
+          <w:tcPr/>
+          <w:p>
+            <w:pPr>
+              <w:pStyle w:val="Compact"/>
+              <w:jc w:val="left"/>
+            </w:pPr>
+            <w:r>
+              <w:rPr>
+                <w:rFonts w:hint="eastAsia"/>
+              </w:rPr>
+              <w:t xml:space="preserve">含义与边界</w:t>
+            </w:r>
+          </w:p>
+        </w:tc>
+      </w:tr>
+      <w:tr>
+        <w:tc>
+          <w:tcPr/>
+          <w:p>
+            <w:pPr>
+              <w:pStyle w:val="Compact"/>
+              <w:jc w:val="left"/>
+            </w:pPr>
+            <w:r>
+              <w:rPr>
+                <w:rFonts w:hint="eastAsia"/>
+              </w:rPr>
+              <w:t xml:space="preserve">冲击不确定性占比</w:t>
+            </w:r>
+          </w:p>
+        </w:tc>
+        <w:tc>
+          <w:tcPr/>
+          <w:p>
+            <w:pPr>
+              <w:pStyle w:val="Compact"/>
+              <w:jc w:val="right"/>
+            </w:pPr>
+            <w:r>
+              <w:t xml:space="preserve">0.45</w:t>
+            </w:r>
+          </w:p>
+        </w:tc>
+        <w:tc>
+          <w:tcPr/>
+          <w:p>
+            <w:pPr>
+              <w:pStyle w:val="Compact"/>
+              <w:jc w:val="right"/>
+            </w:pPr>
+            <w:r>
+              <w:t xml:space="preserve">0.25–0.65</w:t>
+            </w:r>
+          </w:p>
+        </w:tc>
+        <w:tc>
+          <w:tcPr/>
+          <w:p>
+            <w:pPr>
+              <w:pStyle w:val="Compact"/>
+              <w:jc w:val="left"/>
+            </w:pPr>
+            <w:r>
+              <w:rPr>
+                <w:rFonts w:hint="eastAsia"/>
+              </w:rPr>
+              <w:t xml:space="preserve">前期冲击再定价在长期不确定性中的贡献，不作为外部官方统计量</w:t>
+            </w:r>
+          </w:p>
+        </w:tc>
+      </w:tr>
+      <w:tr>
+        <w:tc>
+          <w:tcPr/>
+          <w:p>
+            <w:pPr>
+              <w:pStyle w:val="Compact"/>
+              <w:jc w:val="left"/>
+            </w:pPr>
+            <w:r>
+              <w:rPr>
+                <w:rFonts w:hint="eastAsia"/>
+              </w:rPr>
+              <w:t xml:space="preserve">制度风险占比</w:t>
+            </w:r>
+          </w:p>
+        </w:tc>
+        <w:tc>
+          <w:tcPr/>
+          <w:p>
+            <w:pPr>
+              <w:pStyle w:val="Compact"/>
+              <w:jc w:val="right"/>
+            </w:pPr>
+            <w:r>
+              <w:t xml:space="preserve">0.90</w:t>
+            </w:r>
+          </w:p>
+        </w:tc>
+        <w:tc>
+          <w:tcPr/>
+          <w:p>
+            <w:pPr>
+              <w:pStyle w:val="Compact"/>
+              <w:jc w:val="right"/>
+            </w:pPr>
+            <w:r>
+              <w:t xml:space="preserve">0.50–1.30</w:t>
+            </w:r>
+          </w:p>
+        </w:tc>
+        <w:tc>
+          <w:tcPr/>
+          <w:p>
+            <w:pPr>
+              <w:pStyle w:val="Compact"/>
+              <w:jc w:val="left"/>
+            </w:pPr>
+            <w:r>
+              <w:rPr>
+                <w:rFonts w:hint="eastAsia"/>
+              </w:rPr>
+              <w:t xml:space="preserve">持续封锁状态对长期风险溢价的贡献强度</w:t>
+            </w:r>
+          </w:p>
+        </w:tc>
+      </w:tr>
+      <w:tr>
+        <w:tc>
+          <w:tcPr/>
+          <w:p>
+            <w:pPr>
+              <w:pStyle w:val="Compact"/>
+              <w:jc w:val="left"/>
+            </w:pPr>
+            <w:r>
+              <w:rPr>
+                <w:rFonts w:hint="eastAsia"/>
+              </w:rPr>
+              <w:t xml:space="preserve">信心恢复后风险底座</w:t>
+            </w:r>
+          </w:p>
+        </w:tc>
+        <w:tc>
+          <w:tcPr/>
+          <w:p>
+            <w:pPr>
+              <w:pStyle w:val="Compact"/>
+              <w:jc w:val="right"/>
+            </w:pPr>
+            <w:r>
+              <w:t xml:space="preserve">0.40</w:t>
+            </w:r>
+          </w:p>
+        </w:tc>
+        <w:tc>
+          <w:tcPr/>
+          <w:p>
+            <w:pPr>
+              <w:pStyle w:val="Compact"/>
+              <w:jc w:val="right"/>
+            </w:pPr>
+            <w:r>
+              <w:t xml:space="preserve">0.20–0.60</w:t>
+            </w:r>
+          </w:p>
+        </w:tc>
+        <w:tc>
+          <w:tcPr/>
+          <w:p>
+            <w:pPr>
+              <w:pStyle w:val="Compact"/>
+              <w:jc w:val="left"/>
+            </w:pPr>
+            <w:r>
+              <w:rPr>
+                <w:rFonts w:hint="eastAsia"/>
+              </w:rPr>
+              <w:t xml:space="preserve">缓冲机制被市场确认后仍保留的制度风险比例</w:t>
+            </w:r>
+          </w:p>
+        </w:tc>
+      </w:tr>
+      <w:tr>
+        <w:tc>
+          <w:tcPr/>
+          <w:p>
+            <w:pPr>
+              <w:pStyle w:val="Compact"/>
+              <w:jc w:val="left"/>
+            </w:pPr>
+            <w:r>
+              <w:rPr>
+                <w:rFonts w:hint="eastAsia"/>
+              </w:rPr>
+              <w:t xml:space="preserve">过剩供给回归强度</w:t>
+            </w:r>
+          </w:p>
+        </w:tc>
+        <w:tc>
+          <w:tcPr/>
+          <w:p>
+            <w:pPr>
+              <w:pStyle w:val="Compact"/>
+              <w:jc w:val="right"/>
+            </w:pPr>
+            <w:r>
+              <w:t xml:space="preserve">1.35</w:t>
+            </w:r>
+          </w:p>
+        </w:tc>
+        <w:tc>
+          <w:tcPr/>
+          <w:p>
+            <w:pPr>
+              <w:pStyle w:val="Compact"/>
+              <w:jc w:val="right"/>
+            </w:pPr>
+            <w:r>
+              <w:t xml:space="preserve">0.80–2.20</w:t>
+            </w:r>
+          </w:p>
+        </w:tc>
+        <w:tc>
+          <w:tcPr/>
+          <w:p>
+            <w:pPr>
+              <w:pStyle w:val="Compact"/>
+              <w:jc w:val="left"/>
+            </w:pPr>
+            <w:r>
+              <w:rPr>
+                <w:rFonts w:hint="eastAsia"/>
+              </w:rPr>
+              <w:t xml:space="preserve">供给超过需求时向下修正目标价格的机制强度</w:t>
+            </w:r>
+          </w:p>
+        </w:tc>
+      </w:tr>
+    </w:tbl>
+    <w:p/>
+    <w:p>
+      <w:pPr>
         <w:pStyle w:val="TableCaption"/>
       </w:pPr>
       <w:r>
@@ -14409,20 +15614,11 @@
         <w:rPr>
           <w:rFonts w:hint="eastAsia"/>
         </w:rPr>
-        <w:t xml:space="preserve">释放受限、绕道能力偏低且制度风险溢价持续；中性情景则采用阶段</w:t>
-      </w:r>
-      <w:r>
-        <w:t xml:space="preserve"> 4 </w:t>
-      </w:r>
-      <w:r>
-        <w:rPr>
-          <w:rFonts w:hint="eastAsia"/>
-        </w:rPr>
-        <w:t xml:space="preserve">综合最优参数附近的中心设定。后续敏感性分析和蒙特卡洛抽样用于检验：当这些假设联合变化时，价格中心路径和尾部风险是否仍保持一致。</w:t>
-      </w:r>
-    </w:p>
-    <w:bookmarkEnd w:id="77"/>
-    <w:bookmarkStart w:id="84" w:name="预测结果"/>
+        <w:t xml:space="preserve">释放受限、绕道能力偏低且制度风险溢价持续；中性情景则采用综合最优参数附近的中心设定。后续敏感性分析和蒙特卡洛抽样用于检验：当这些假设联合变化时，价格中心路径和尾部风险是否仍保持一致。</w:t>
+      </w:r>
+    </w:p>
+    <w:bookmarkEnd w:id="81"/>
+    <w:bookmarkStart w:id="88" w:name="预测结果"/>
     <w:p>
       <w:pPr>
         <w:pStyle w:val="Heading2"/>
@@ -14912,18 +16108,18 @@
           <wp:inline>
             <wp:extent cx="5013960" cy="2757678"/>
             <wp:effectExtent b="0" l="0" r="0" t="0"/>
-            <wp:docPr descr="" title="" id="79" name="Picture"/>
+            <wp:docPr descr="" title="" id="83" name="Picture"/>
             <a:graphic>
               <a:graphicData uri="http://schemas.openxmlformats.org/drawingml/2006/picture">
                 <pic:pic>
                   <pic:nvPicPr>
-                    <pic:cNvPr descr="短期拟合与长期预测总览.png" id="80" name="Picture"/>
+                    <pic:cNvPr descr="短期拟合与长期预测总览.png" id="84" name="Picture"/>
                     <pic:cNvPicPr>
                       <a:picLocks noChangeArrowheads="1" noChangeAspect="1"/>
                     </pic:cNvPicPr>
                   </pic:nvPicPr>
                   <pic:blipFill>
-                    <a:blip r:embed="rId78"/>
+                    <a:blip r:embed="rId82"/>
                     <a:stretch>
                       <a:fillRect/>
                     </a:stretch>
@@ -15461,18 +16657,18 @@
           <wp:inline>
             <wp:extent cx="4907280" cy="3413760"/>
             <wp:effectExtent b="0" l="0" r="0" t="0"/>
-            <wp:docPr descr="" title="" id="82" name="Picture"/>
+            <wp:docPr descr="" title="" id="86" name="Picture"/>
             <a:graphic>
               <a:graphicData uri="http://schemas.openxmlformats.org/drawingml/2006/picture">
                 <pic:pic>
                   <pic:nvPicPr>
-                    <pic:cNvPr descr="inventory_depletion_risk.png" id="83" name="Picture"/>
+                    <pic:cNvPr descr="inventory_depletion_risk.png" id="87" name="Picture"/>
                     <pic:cNvPicPr>
                       <a:picLocks noChangeArrowheads="1" noChangeAspect="1"/>
                     </pic:cNvPicPr>
                   </pic:nvPicPr>
                   <pic:blipFill>
-                    <a:blip r:embed="rId81"/>
+                    <a:blip r:embed="rId85"/>
                     <a:stretch>
                       <a:fillRect/>
                     </a:stretch>
@@ -15510,9 +16706,9 @@
         <w:t xml:space="preserve">商业库存剩余量与剩余供需缺口变化。悲观情景下缓冲能力下降，二次跳涨风险上升。</w:t>
       </w:r>
     </w:p>
-    <w:bookmarkEnd w:id="84"/>
-    <w:bookmarkEnd w:id="85"/>
-    <w:bookmarkStart w:id="112" w:name="敏感性分析"/>
+    <w:bookmarkEnd w:id="88"/>
+    <w:bookmarkEnd w:id="89"/>
+    <w:bookmarkStart w:id="116" w:name="敏感性分析"/>
     <w:p>
       <w:pPr>
         <w:pStyle w:val="Heading1"/>
@@ -15524,7 +16720,7 @@
         <w:t xml:space="preserve">敏感性分析</w:t>
       </w:r>
     </w:p>
-    <w:bookmarkStart w:id="86" w:name="分析方法"/>
+    <w:bookmarkStart w:id="90" w:name="分析方法"/>
     <w:p>
       <w:pPr>
         <w:pStyle w:val="Heading2"/>
@@ -15544,28 +16740,10 @@
         <w:rPr>
           <w:rFonts w:hint="eastAsia"/>
         </w:rPr>
-        <w:t xml:space="preserve">阶段</w:t>
-      </w:r>
-      <w:r>
-        <w:t xml:space="preserve"> 6 </w:t>
-      </w:r>
-      <w:r>
-        <w:rPr>
-          <w:rFonts w:hint="eastAsia"/>
-        </w:rPr>
-        <w:t xml:space="preserve">以阶段</w:t>
-      </w:r>
-      <w:r>
-        <w:t xml:space="preserve"> 5 </w:t>
-      </w:r>
-      <w:r>
-        <w:rPr>
-          <w:rFonts w:hint="eastAsia"/>
-        </w:rPr>
-        <w:t xml:space="preserve">中性情景为基准，对</w:t>
-      </w:r>
-      <w:r>
-        <w:t xml:space="preserve"> 10 </w:t>
+        <w:t xml:space="preserve">敏感性分析以中性情景为基准，对</w:t>
+      </w:r>
+      <w:r>
+        <w:t xml:space="preserve"> 14 </w:t>
       </w:r>
       <w:r>
         <w:rPr>
@@ -15580,7 +16758,7 @@
         <w:rPr>
           <w:rFonts w:hint="eastAsia"/>
         </w:rPr>
-        <w:t xml:space="preserve">天价格、外推期最高价、剩余供需缺口和二次跳涨风险变化。综合敏感度定义为</w:t>
+        <w:t xml:space="preserve">天价格、外推期最高价、剩余供需缺口和二次跳涨风险变化。除题面物理量和行为参数外，本阶段还把长期机制强度参数单独纳入检验，避免长期结论依赖隐藏常数。综合敏感度定义为</w:t>
       </w:r>
     </w:p>
     <w:p>
@@ -15811,8 +16989,8 @@
         <w:t xml:space="preserve">天剩余缺口波动范围。该指标兼顾终点价格、阶段峰值和供需风险。</w:t>
       </w:r>
     </w:p>
-    <w:bookmarkEnd w:id="86"/>
-    <w:bookmarkStart w:id="90" w:name="参数重要性排序"/>
+    <w:bookmarkEnd w:id="90"/>
+    <w:bookmarkStart w:id="94" w:name="参数重要性排序"/>
     <w:p>
       <w:pPr>
         <w:pStyle w:val="Heading2"/>
@@ -15828,15 +17006,6 @@
       <w:pPr>
         <w:pStyle w:val="TableCaption"/>
       </w:pPr>
-      <w:r>
-        <w:rPr>
-          <w:rFonts w:hint="eastAsia"/>
-        </w:rPr>
-        <w:t xml:space="preserve">阶段</w:t>
-      </w:r>
-      <w:r>
-        <w:t xml:space="preserve"> 6 </w:t>
-      </w:r>
       <w:r>
         <w:rPr>
           <w:rFonts w:hint="eastAsia"/>
@@ -15849,7 +17018,7 @@
         <w:tblStyle w:val="Table"/>
         <w:tblW w:type="auto" w:w="0"/>
         <w:tblLook w:firstRow="1" w:lastRow="0" w:firstColumn="0" w:lastColumn="0" w:noHBand="0" w:noVBand="0" w:val="0020"/>
-        <w:tblCaption w:val="阶段 6 参数综合敏感度排序"/>
+        <w:tblCaption w:val="参数综合敏感度排序"/>
       </w:tblPr>
       <w:tblGrid>
         <w:gridCol w:w="1584"/>
@@ -16092,43 +17261,43 @@
               <w:rPr>
                 <w:rFonts w:hint="eastAsia"/>
               </w:rPr>
-              <w:t xml:space="preserve">供应中断量</w:t>
-            </w:r>
-          </w:p>
-        </w:tc>
-        <w:tc>
-          <w:tcPr/>
-          <w:p>
-            <w:pPr>
-              <w:pStyle w:val="Compact"/>
-              <w:jc w:val="right"/>
-            </w:pPr>
-            <w:r>
-              <w:t xml:space="preserve">5.95</w:t>
-            </w:r>
-          </w:p>
-        </w:tc>
-        <w:tc>
-          <w:tcPr/>
-          <w:p>
-            <w:pPr>
-              <w:pStyle w:val="Compact"/>
-              <w:jc w:val="right"/>
-            </w:pPr>
-            <w:r>
-              <w:t xml:space="preserve">3.26</w:t>
-            </w:r>
-          </w:p>
-        </w:tc>
-        <w:tc>
-          <w:tcPr/>
-          <w:p>
-            <w:pPr>
-              <w:pStyle w:val="Compact"/>
-              <w:jc w:val="right"/>
-            </w:pPr>
-            <w:r>
-              <w:t xml:space="preserve">5.97</w:t>
+              <w:t xml:space="preserve">制度风险占比</w:t>
+            </w:r>
+          </w:p>
+        </w:tc>
+        <w:tc>
+          <w:tcPr/>
+          <w:p>
+            <w:pPr>
+              <w:pStyle w:val="Compact"/>
+              <w:jc w:val="right"/>
+            </w:pPr>
+            <w:r>
+              <w:t xml:space="preserve">6.41</w:t>
+            </w:r>
+          </w:p>
+        </w:tc>
+        <w:tc>
+          <w:tcPr/>
+          <w:p>
+            <w:pPr>
+              <w:pStyle w:val="Compact"/>
+              <w:jc w:val="right"/>
+            </w:pPr>
+            <w:r>
+              <w:t xml:space="preserve">5.04</w:t>
+            </w:r>
+          </w:p>
+        </w:tc>
+        <w:tc>
+          <w:tcPr/>
+          <w:p>
+            <w:pPr>
+              <w:pStyle w:val="Compact"/>
+              <w:jc w:val="right"/>
+            </w:pPr>
+            <w:r>
+              <w:t xml:space="preserve">3.04</w:t>
             </w:r>
           </w:p>
         </w:tc>
@@ -16157,43 +17326,43 @@
               <w:rPr>
                 <w:rFonts w:hint="eastAsia"/>
               </w:rPr>
-              <w:t xml:space="preserve">长期需求弹性</w:t>
-            </w:r>
-          </w:p>
-        </w:tc>
-        <w:tc>
-          <w:tcPr/>
-          <w:p>
-            <w:pPr>
-              <w:pStyle w:val="Compact"/>
-              <w:jc w:val="right"/>
-            </w:pPr>
-            <w:r>
-              <w:t xml:space="preserve">3.86</w:t>
-            </w:r>
-          </w:p>
-        </w:tc>
-        <w:tc>
-          <w:tcPr/>
-          <w:p>
-            <w:pPr>
-              <w:pStyle w:val="Compact"/>
-              <w:jc w:val="right"/>
-            </w:pPr>
-            <w:r>
-              <w:t xml:space="preserve">3.42</w:t>
-            </w:r>
-          </w:p>
-        </w:tc>
-        <w:tc>
-          <w:tcPr/>
-          <w:p>
-            <w:pPr>
-              <w:pStyle w:val="Compact"/>
-              <w:jc w:val="right"/>
-            </w:pPr>
-            <w:r>
-              <w:t xml:space="preserve">0.98</w:t>
+              <w:t xml:space="preserve">供应中断量</w:t>
+            </w:r>
+          </w:p>
+        </w:tc>
+        <w:tc>
+          <w:tcPr/>
+          <w:p>
+            <w:pPr>
+              <w:pStyle w:val="Compact"/>
+              <w:jc w:val="right"/>
+            </w:pPr>
+            <w:r>
+              <w:t xml:space="preserve">5.95</w:t>
+            </w:r>
+          </w:p>
+        </w:tc>
+        <w:tc>
+          <w:tcPr/>
+          <w:p>
+            <w:pPr>
+              <w:pStyle w:val="Compact"/>
+              <w:jc w:val="right"/>
+            </w:pPr>
+            <w:r>
+              <w:t xml:space="preserve">3.26</w:t>
+            </w:r>
+          </w:p>
+        </w:tc>
+        <w:tc>
+          <w:tcPr/>
+          <w:p>
+            <w:pPr>
+              <w:pStyle w:val="Compact"/>
+              <w:jc w:val="right"/>
+            </w:pPr>
+            <w:r>
+              <w:t xml:space="preserve">5.97</w:t>
             </w:r>
           </w:p>
         </w:tc>
@@ -16219,49 +17388,46 @@
               <w:jc w:val="left"/>
             </w:pPr>
             <w:r>
-              <w:t xml:space="preserve">SPR </w:t>
-            </w:r>
-            <w:r>
-              <w:rPr>
-                <w:rFonts w:hint="eastAsia"/>
-              </w:rPr>
-              <w:t xml:space="preserve">释放上限</w:t>
-            </w:r>
-          </w:p>
-        </w:tc>
-        <w:tc>
-          <w:tcPr/>
-          <w:p>
-            <w:pPr>
-              <w:pStyle w:val="Compact"/>
-              <w:jc w:val="right"/>
-            </w:pPr>
-            <w:r>
-              <w:t xml:space="preserve">0.90</w:t>
-            </w:r>
-          </w:p>
-        </w:tc>
-        <w:tc>
-          <w:tcPr/>
-          <w:p>
-            <w:pPr>
-              <w:pStyle w:val="Compact"/>
-              <w:jc w:val="right"/>
-            </w:pPr>
-            <w:r>
-              <w:t xml:space="preserve">0.65</w:t>
-            </w:r>
-          </w:p>
-        </w:tc>
-        <w:tc>
-          <w:tcPr/>
-          <w:p>
-            <w:pPr>
-              <w:pStyle w:val="Compact"/>
-              <w:jc w:val="right"/>
-            </w:pPr>
-            <w:r>
-              <w:t xml:space="preserve">0.50</w:t>
+              <w:rPr>
+                <w:rFonts w:hint="eastAsia"/>
+              </w:rPr>
+              <w:t xml:space="preserve">长期需求弹性</w:t>
+            </w:r>
+          </w:p>
+        </w:tc>
+        <w:tc>
+          <w:tcPr/>
+          <w:p>
+            <w:pPr>
+              <w:pStyle w:val="Compact"/>
+              <w:jc w:val="right"/>
+            </w:pPr>
+            <w:r>
+              <w:t xml:space="preserve">3.86</w:t>
+            </w:r>
+          </w:p>
+        </w:tc>
+        <w:tc>
+          <w:tcPr/>
+          <w:p>
+            <w:pPr>
+              <w:pStyle w:val="Compact"/>
+              <w:jc w:val="right"/>
+            </w:pPr>
+            <w:r>
+              <w:t xml:space="preserve">3.42</w:t>
+            </w:r>
+          </w:p>
+        </w:tc>
+        <w:tc>
+          <w:tcPr/>
+          <w:p>
+            <w:pPr>
+              <w:pStyle w:val="Compact"/>
+              <w:jc w:val="right"/>
+            </w:pPr>
+            <w:r>
+              <w:t xml:space="preserve">0.98</w:t>
             </w:r>
           </w:p>
         </w:tc>
@@ -16290,43 +17456,43 @@
               <w:rPr>
                 <w:rFonts w:hint="eastAsia"/>
               </w:rPr>
-              <w:t xml:space="preserve">绕道运输能力</w:t>
-            </w:r>
-          </w:p>
-        </w:tc>
-        <w:tc>
-          <w:tcPr/>
-          <w:p>
-            <w:pPr>
-              <w:pStyle w:val="Compact"/>
-              <w:jc w:val="right"/>
-            </w:pPr>
-            <w:r>
-              <w:t xml:space="preserve">0.39</w:t>
-            </w:r>
-          </w:p>
-        </w:tc>
-        <w:tc>
-          <w:tcPr/>
-          <w:p>
-            <w:pPr>
-              <w:pStyle w:val="Compact"/>
-              <w:jc w:val="right"/>
-            </w:pPr>
-            <w:r>
-              <w:t xml:space="preserve">0.00</w:t>
-            </w:r>
-          </w:p>
-        </w:tc>
-        <w:tc>
-          <w:tcPr/>
-          <w:p>
-            <w:pPr>
-              <w:pStyle w:val="Compact"/>
-              <w:jc w:val="right"/>
-            </w:pPr>
-            <w:r>
-              <w:t xml:space="preserve">0.86</w:t>
+              <w:t xml:space="preserve">信心恢复后风险底座</w:t>
+            </w:r>
+          </w:p>
+        </w:tc>
+        <w:tc>
+          <w:tcPr/>
+          <w:p>
+            <w:pPr>
+              <w:pStyle w:val="Compact"/>
+              <w:jc w:val="right"/>
+            </w:pPr>
+            <w:r>
+              <w:t xml:space="preserve">2.28</w:t>
+            </w:r>
+          </w:p>
+        </w:tc>
+        <w:tc>
+          <w:tcPr/>
+          <w:p>
+            <w:pPr>
+              <w:pStyle w:val="Compact"/>
+              <w:jc w:val="right"/>
+            </w:pPr>
+            <w:r>
+              <w:t xml:space="preserve">2.26</w:t>
+            </w:r>
+          </w:p>
+        </w:tc>
+        <w:tc>
+          <w:tcPr/>
+          <w:p>
+            <w:pPr>
+              <w:pStyle w:val="Compact"/>
+              <w:jc w:val="right"/>
+            </w:pPr>
+            <w:r>
+              <w:t xml:space="preserve">0.05</w:t>
             </w:r>
           </w:p>
         </w:tc>
@@ -16355,43 +17521,43 @@
               <w:rPr>
                 <w:rFonts w:hint="eastAsia"/>
               </w:rPr>
-              <w:t xml:space="preserve">预期修复强度</w:t>
-            </w:r>
-          </w:p>
-        </w:tc>
-        <w:tc>
-          <w:tcPr/>
-          <w:p>
-            <w:pPr>
-              <w:pStyle w:val="Compact"/>
-              <w:jc w:val="right"/>
-            </w:pPr>
-            <w:r>
-              <w:t xml:space="preserve">0.23</w:t>
-            </w:r>
-          </w:p>
-        </w:tc>
-        <w:tc>
-          <w:tcPr/>
-          <w:p>
-            <w:pPr>
-              <w:pStyle w:val="Compact"/>
-              <w:jc w:val="right"/>
-            </w:pPr>
-            <w:r>
-              <w:t xml:space="preserve">0.00</w:t>
-            </w:r>
-          </w:p>
-        </w:tc>
-        <w:tc>
-          <w:tcPr/>
-          <w:p>
-            <w:pPr>
-              <w:pStyle w:val="Compact"/>
-              <w:jc w:val="right"/>
-            </w:pPr>
-            <w:r>
-              <w:t xml:space="preserve">0.51</w:t>
+              <w:t xml:space="preserve">冲击不确定性占比</w:t>
+            </w:r>
+          </w:p>
+        </w:tc>
+        <w:tc>
+          <w:tcPr/>
+          <w:p>
+            <w:pPr>
+              <w:pStyle w:val="Compact"/>
+              <w:jc w:val="right"/>
+            </w:pPr>
+            <w:r>
+              <w:t xml:space="preserve">2.08</w:t>
+            </w:r>
+          </w:p>
+        </w:tc>
+        <w:tc>
+          <w:tcPr/>
+          <w:p>
+            <w:pPr>
+              <w:pStyle w:val="Compact"/>
+              <w:jc w:val="right"/>
+            </w:pPr>
+            <w:r>
+              <w:t xml:space="preserve">1.26</w:t>
+            </w:r>
+          </w:p>
+        </w:tc>
+        <w:tc>
+          <w:tcPr/>
+          <w:p>
+            <w:pPr>
+              <w:pStyle w:val="Compact"/>
+              <w:jc w:val="right"/>
+            </w:pPr>
+            <w:r>
+              <w:t xml:space="preserve">1.82</w:t>
             </w:r>
           </w:p>
         </w:tc>
@@ -16417,46 +17583,49 @@
               <w:jc w:val="left"/>
             </w:pPr>
             <w:r>
-              <w:rPr>
-                <w:rFonts w:hint="eastAsia"/>
-              </w:rPr>
-              <w:t xml:space="preserve">恐慌衰减速度</w:t>
-            </w:r>
-          </w:p>
-        </w:tc>
-        <w:tc>
-          <w:tcPr/>
-          <w:p>
-            <w:pPr>
-              <w:pStyle w:val="Compact"/>
-              <w:jc w:val="right"/>
-            </w:pPr>
-            <w:r>
-              <w:t xml:space="preserve">0.17</w:t>
-            </w:r>
-          </w:p>
-        </w:tc>
-        <w:tc>
-          <w:tcPr/>
-          <w:p>
-            <w:pPr>
-              <w:pStyle w:val="Compact"/>
-              <w:jc w:val="right"/>
-            </w:pPr>
-            <w:r>
-              <w:t xml:space="preserve">0.00</w:t>
-            </w:r>
-          </w:p>
-        </w:tc>
-        <w:tc>
-          <w:tcPr/>
-          <w:p>
-            <w:pPr>
-              <w:pStyle w:val="Compact"/>
-              <w:jc w:val="right"/>
-            </w:pPr>
-            <w:r>
-              <w:t xml:space="preserve">0.37</w:t>
+              <w:t xml:space="preserve">SPR </w:t>
+            </w:r>
+            <w:r>
+              <w:rPr>
+                <w:rFonts w:hint="eastAsia"/>
+              </w:rPr>
+              <w:t xml:space="preserve">释放上限</w:t>
+            </w:r>
+          </w:p>
+        </w:tc>
+        <w:tc>
+          <w:tcPr/>
+          <w:p>
+            <w:pPr>
+              <w:pStyle w:val="Compact"/>
+              <w:jc w:val="right"/>
+            </w:pPr>
+            <w:r>
+              <w:t xml:space="preserve">0.90</w:t>
+            </w:r>
+          </w:p>
+        </w:tc>
+        <w:tc>
+          <w:tcPr/>
+          <w:p>
+            <w:pPr>
+              <w:pStyle w:val="Compact"/>
+              <w:jc w:val="right"/>
+            </w:pPr>
+            <w:r>
+              <w:t xml:space="preserve">0.65</w:t>
+            </w:r>
+          </w:p>
+        </w:tc>
+        <w:tc>
+          <w:tcPr/>
+          <w:p>
+            <w:pPr>
+              <w:pStyle w:val="Compact"/>
+              <w:jc w:val="right"/>
+            </w:pPr>
+            <w:r>
+              <w:t xml:space="preserve">0.50</w:t>
             </w:r>
           </w:p>
         </w:tc>
@@ -16482,25 +17651,22 @@
               <w:jc w:val="left"/>
             </w:pPr>
             <w:r>
-              <w:t xml:space="preserve">SPR </w:t>
-            </w:r>
-            <w:r>
-              <w:rPr>
-                <w:rFonts w:hint="eastAsia"/>
-              </w:rPr>
-              <w:t xml:space="preserve">启动延迟</w:t>
-            </w:r>
-          </w:p>
-        </w:tc>
-        <w:tc>
-          <w:tcPr/>
-          <w:p>
-            <w:pPr>
-              <w:pStyle w:val="Compact"/>
-              <w:jc w:val="right"/>
-            </w:pPr>
-            <w:r>
-              <w:t xml:space="preserve">0.08</w:t>
+              <w:rPr>
+                <w:rFonts w:hint="eastAsia"/>
+              </w:rPr>
+              <w:t xml:space="preserve">绕道运输能力</w:t>
+            </w:r>
+          </w:p>
+        </w:tc>
+        <w:tc>
+          <w:tcPr/>
+          <w:p>
+            <w:pPr>
+              <w:pStyle w:val="Compact"/>
+              <w:jc w:val="right"/>
+            </w:pPr>
+            <w:r>
+              <w:t xml:space="preserve">0.39</w:t>
             </w:r>
           </w:p>
         </w:tc>
@@ -16524,7 +17690,7 @@
               <w:jc w:val="right"/>
             </w:pPr>
             <w:r>
-              <w:t xml:space="preserve">0.17</w:t>
+              <w:t xml:space="preserve">0.86</w:t>
             </w:r>
           </w:p>
         </w:tc>
@@ -16539,6 +17705,269 @@
             </w:pPr>
             <w:r>
               <w:t xml:space="preserve">10</w:t>
+            </w:r>
+          </w:p>
+        </w:tc>
+        <w:tc>
+          <w:tcPr/>
+          <w:p>
+            <w:pPr>
+              <w:pStyle w:val="Compact"/>
+              <w:jc w:val="left"/>
+            </w:pPr>
+            <w:r>
+              <w:rPr>
+                <w:rFonts w:hint="eastAsia"/>
+              </w:rPr>
+              <w:t xml:space="preserve">预期修复强度</w:t>
+            </w:r>
+          </w:p>
+        </w:tc>
+        <w:tc>
+          <w:tcPr/>
+          <w:p>
+            <w:pPr>
+              <w:pStyle w:val="Compact"/>
+              <w:jc w:val="right"/>
+            </w:pPr>
+            <w:r>
+              <w:t xml:space="preserve">0.23</w:t>
+            </w:r>
+          </w:p>
+        </w:tc>
+        <w:tc>
+          <w:tcPr/>
+          <w:p>
+            <w:pPr>
+              <w:pStyle w:val="Compact"/>
+              <w:jc w:val="right"/>
+            </w:pPr>
+            <w:r>
+              <w:t xml:space="preserve">0.00</w:t>
+            </w:r>
+          </w:p>
+        </w:tc>
+        <w:tc>
+          <w:tcPr/>
+          <w:p>
+            <w:pPr>
+              <w:pStyle w:val="Compact"/>
+              <w:jc w:val="right"/>
+            </w:pPr>
+            <w:r>
+              <w:t xml:space="preserve">0.51</w:t>
+            </w:r>
+          </w:p>
+        </w:tc>
+      </w:tr>
+      <w:tr>
+        <w:tc>
+          <w:tcPr/>
+          <w:p>
+            <w:pPr>
+              <w:pStyle w:val="Compact"/>
+              <w:jc w:val="right"/>
+            </w:pPr>
+            <w:r>
+              <w:t xml:space="preserve">11</w:t>
+            </w:r>
+          </w:p>
+        </w:tc>
+        <w:tc>
+          <w:tcPr/>
+          <w:p>
+            <w:pPr>
+              <w:pStyle w:val="Compact"/>
+              <w:jc w:val="left"/>
+            </w:pPr>
+            <w:r>
+              <w:rPr>
+                <w:rFonts w:hint="eastAsia"/>
+              </w:rPr>
+              <w:t xml:space="preserve">恐慌衰减速度</w:t>
+            </w:r>
+          </w:p>
+        </w:tc>
+        <w:tc>
+          <w:tcPr/>
+          <w:p>
+            <w:pPr>
+              <w:pStyle w:val="Compact"/>
+              <w:jc w:val="right"/>
+            </w:pPr>
+            <w:r>
+              <w:t xml:space="preserve">0.17</w:t>
+            </w:r>
+          </w:p>
+        </w:tc>
+        <w:tc>
+          <w:tcPr/>
+          <w:p>
+            <w:pPr>
+              <w:pStyle w:val="Compact"/>
+              <w:jc w:val="right"/>
+            </w:pPr>
+            <w:r>
+              <w:t xml:space="preserve">0.00</w:t>
+            </w:r>
+          </w:p>
+        </w:tc>
+        <w:tc>
+          <w:tcPr/>
+          <w:p>
+            <w:pPr>
+              <w:pStyle w:val="Compact"/>
+              <w:jc w:val="right"/>
+            </w:pPr>
+            <w:r>
+              <w:t xml:space="preserve">0.37</w:t>
+            </w:r>
+          </w:p>
+        </w:tc>
+      </w:tr>
+      <w:tr>
+        <w:tc>
+          <w:tcPr/>
+          <w:p>
+            <w:pPr>
+              <w:pStyle w:val="Compact"/>
+              <w:jc w:val="right"/>
+            </w:pPr>
+            <w:r>
+              <w:t xml:space="preserve">12</w:t>
+            </w:r>
+          </w:p>
+        </w:tc>
+        <w:tc>
+          <w:tcPr/>
+          <w:p>
+            <w:pPr>
+              <w:pStyle w:val="Compact"/>
+              <w:jc w:val="left"/>
+            </w:pPr>
+            <w:r>
+              <w:rPr>
+                <w:rFonts w:hint="eastAsia"/>
+              </w:rPr>
+              <w:t xml:space="preserve">过剩供给回归强度</w:t>
+            </w:r>
+          </w:p>
+        </w:tc>
+        <w:tc>
+          <w:tcPr/>
+          <w:p>
+            <w:pPr>
+              <w:pStyle w:val="Compact"/>
+              <w:jc w:val="right"/>
+            </w:pPr>
+            <w:r>
+              <w:t xml:space="preserve">0.12</w:t>
+            </w:r>
+          </w:p>
+        </w:tc>
+        <w:tc>
+          <w:tcPr/>
+          <w:p>
+            <w:pPr>
+              <w:pStyle w:val="Compact"/>
+              <w:jc w:val="right"/>
+            </w:pPr>
+            <w:r>
+              <w:t xml:space="preserve">0.07</w:t>
+            </w:r>
+          </w:p>
+        </w:tc>
+        <w:tc>
+          <w:tcPr/>
+          <w:p>
+            <w:pPr>
+              <w:pStyle w:val="Compact"/>
+              <w:jc w:val="right"/>
+            </w:pPr>
+            <w:r>
+              <w:t xml:space="preserve">0.12</w:t>
+            </w:r>
+          </w:p>
+        </w:tc>
+      </w:tr>
+      <w:tr>
+        <w:tc>
+          <w:tcPr/>
+          <w:p>
+            <w:pPr>
+              <w:pStyle w:val="Compact"/>
+              <w:jc w:val="right"/>
+            </w:pPr>
+            <w:r>
+              <w:t xml:space="preserve">13</w:t>
+            </w:r>
+          </w:p>
+        </w:tc>
+        <w:tc>
+          <w:tcPr/>
+          <w:p>
+            <w:pPr>
+              <w:pStyle w:val="Compact"/>
+              <w:jc w:val="left"/>
+            </w:pPr>
+            <w:r>
+              <w:t xml:space="preserve">SPR </w:t>
+            </w:r>
+            <w:r>
+              <w:rPr>
+                <w:rFonts w:hint="eastAsia"/>
+              </w:rPr>
+              <w:t xml:space="preserve">启动延迟</w:t>
+            </w:r>
+          </w:p>
+        </w:tc>
+        <w:tc>
+          <w:tcPr/>
+          <w:p>
+            <w:pPr>
+              <w:pStyle w:val="Compact"/>
+              <w:jc w:val="right"/>
+            </w:pPr>
+            <w:r>
+              <w:t xml:space="preserve">0.08</w:t>
+            </w:r>
+          </w:p>
+        </w:tc>
+        <w:tc>
+          <w:tcPr/>
+          <w:p>
+            <w:pPr>
+              <w:pStyle w:val="Compact"/>
+              <w:jc w:val="right"/>
+            </w:pPr>
+            <w:r>
+              <w:t xml:space="preserve">0.00</w:t>
+            </w:r>
+          </w:p>
+        </w:tc>
+        <w:tc>
+          <w:tcPr/>
+          <w:p>
+            <w:pPr>
+              <w:pStyle w:val="Compact"/>
+              <w:jc w:val="right"/>
+            </w:pPr>
+            <w:r>
+              <w:t xml:space="preserve">0.17</w:t>
+            </w:r>
+          </w:p>
+        </w:tc>
+      </w:tr>
+      <w:tr>
+        <w:tc>
+          <w:tcPr/>
+          <w:p>
+            <w:pPr>
+              <w:pStyle w:val="Compact"/>
+              <w:jc w:val="right"/>
+            </w:pPr>
+            <w:r>
+              <w:t xml:space="preserve">14</w:t>
             </w:r>
           </w:p>
         </w:tc>
@@ -16604,18 +18033,18 @@
           <wp:inline>
             <wp:extent cx="4907280" cy="2998893"/>
             <wp:effectExtent b="0" l="0" r="0" t="0"/>
-            <wp:docPr descr="" title="" id="88" name="Picture"/>
+            <wp:docPr descr="" title="" id="92" name="Picture"/>
             <a:graphic>
               <a:graphicData uri="http://schemas.openxmlformats.org/drawingml/2006/picture">
                 <pic:pic>
                   <pic:nvPicPr>
-                    <pic:cNvPr descr="sensitivity_tornado_180day.png" id="89" name="Picture"/>
+                    <pic:cNvPr descr="sensitivity_tornado_180day.png" id="93" name="Picture"/>
                     <pic:cNvPicPr>
                       <a:picLocks noChangeArrowheads="1" noChangeAspect="1"/>
                     </pic:cNvPicPr>
                   </pic:nvPicPr>
                   <pic:blipFill>
-                    <a:blip r:embed="rId87"/>
+                    <a:blip r:embed="rId91"/>
                     <a:stretch>
                       <a:fillRect/>
                     </a:stretch>
@@ -16650,7 +18079,36 @@
         <w:rPr>
           <w:rFonts w:hint="eastAsia"/>
         </w:rPr>
-        <w:t xml:space="preserve">阶段</w:t>
+        <w:t xml:space="preserve">关键参数综合敏感度排序。</w:t>
+      </w:r>
+    </w:p>
+    <w:p>
+      <w:pPr>
+        <w:pStyle w:val="BodyText"/>
+      </w:pPr>
+      <w:r>
+        <w:rPr>
+          <w:rFonts w:hint="eastAsia"/>
+        </w:rPr>
+        <w:t xml:space="preserve">敏感性分析表明，第</w:t>
+      </w:r>
+      <w:r>
+        <w:t xml:space="preserve"> 180 </w:t>
+      </w:r>
+      <w:r>
+        <w:rPr>
+          <w:rFonts w:hint="eastAsia"/>
+        </w:rPr>
+        <w:t xml:space="preserve">天终点价格对市场价格形成层最敏感，尤其是地缘风险权重和不确定性与制度风险强度；供应中断量决定价格上行压力的物理底座。新增的长期机制透明层中，制度风险占比和信心恢复后风险底座具有可观影响，说明长期价格能否回落，关键在于市场是否相信封锁状态会被制度化吸收，而不只是</w:t>
+      </w:r>
+      <w:r>
+        <w:t xml:space="preserve"> SPR </w:t>
+      </w:r>
+      <w:r>
+        <w:rPr>
+          <w:rFonts w:hint="eastAsia"/>
+        </w:rPr>
+        <w:t xml:space="preserve">能放多少。长期需求弹性也具有较高影响，因为它决定高价持续后需求侧能否真正完成再平衡。SPR</w:t>
       </w:r>
       <w:r>
         <w:t xml:space="preserve"> </w:t>
@@ -16659,18 +18117,7 @@
         <w:rPr>
           <w:rFonts w:hint="eastAsia"/>
         </w:rPr>
-        <w:t xml:space="preserve">6：关键参数综合敏感度排序。</w:t>
-      </w:r>
-    </w:p>
-    <w:p>
-      <w:pPr>
-        <w:pStyle w:val="BodyText"/>
-      </w:pPr>
-      <w:r>
-        <w:rPr>
-          <w:rFonts w:hint="eastAsia"/>
-        </w:rPr>
-        <w:t xml:space="preserve">敏感性分析表明，第</w:t>
+        <w:t xml:space="preserve">释放、启动延迟和绕道运输在中性路径下对第</w:t>
       </w:r>
       <w:r>
         <w:t xml:space="preserve"> 180 </w:t>
@@ -16679,7 +18126,55 @@
         <w:rPr>
           <w:rFonts w:hint="eastAsia"/>
         </w:rPr>
-        <w:t xml:space="preserve">天终点价格对市场价格形成层最敏感，尤其是地缘风险权重和不确定性与制度风险强度；供应中断量决定价格上行压力的物理底座。长期需求弹性在新的自适应外推中也具有较高影响，因为它决定高价持续后需求侧能否真正完成再平衡。SPR</w:t>
+        <w:t xml:space="preserve">天终点价影响相对较小，但会改变外推期峰值、缺口闭合速度和二次跳涨幅度，因此更适合被解释为</w:t>
+      </w:r>
+      <w:r>
+        <w:rPr>
+          <w:rFonts w:hint="eastAsia"/>
+        </w:rPr>
+        <w:t xml:space="preserve">“削峰”</w:t>
+      </w:r>
+      <w:r>
+        <w:rPr>
+          <w:rFonts w:hint="eastAsia"/>
+        </w:rPr>
+        <w:t xml:space="preserve">和</w:t>
+      </w:r>
+      <w:r>
+        <w:rPr>
+          <w:rFonts w:hint="eastAsia"/>
+        </w:rPr>
+        <w:t xml:space="preserve">“争取恢复时间”</w:t>
+      </w:r>
+      <w:r>
+        <w:rPr>
+          <w:rFonts w:hint="eastAsia"/>
+        </w:rPr>
+        <w:t xml:space="preserve">的政策缓冲变量。</w:t>
+      </w:r>
+    </w:p>
+    <w:bookmarkEnd w:id="94"/>
+    <w:bookmarkStart w:id="101" w:name="sec:monte-carlo"/>
+    <w:p>
+      <w:pPr>
+        <w:pStyle w:val="Heading2"/>
+      </w:pPr>
+      <w:r>
+        <w:rPr>
+          <w:rFonts w:hint="eastAsia"/>
+        </w:rPr>
+        <w:t xml:space="preserve">蒙特卡洛情景树</w:t>
+      </w:r>
+    </w:p>
+    <w:p>
+      <w:pPr>
+        <w:pStyle w:val="FirstParagraph"/>
+      </w:pPr>
+      <w:r>
+        <w:rPr>
+          <w:rFonts w:hint="eastAsia"/>
+        </w:rPr>
+        <w:t xml:space="preserve">单因素敏感性分析可以说明某个参数单独变化时的边际影响，但封锁长期化的真实风险往往来自多个因素同时恶化：供应中断偏大、SPR</w:t>
       </w:r>
       <w:r>
         <w:t xml:space="preserve"> </w:t>
@@ -16688,82 +18183,7 @@
         <w:rPr>
           <w:rFonts w:hint="eastAsia"/>
         </w:rPr>
-        <w:t xml:space="preserve">释放、启动延迟和绕道运输在中性路径下对第</w:t>
-      </w:r>
-      <w:r>
-        <w:t xml:space="preserve"> 180 </w:t>
-      </w:r>
-      <w:r>
-        <w:rPr>
-          <w:rFonts w:hint="eastAsia"/>
-        </w:rPr>
-        <w:t xml:space="preserve">天终点价影响相对较小，但会改变外推期峰值、缺口闭合速度和二次跳涨幅度，因此更适合被解释为</w:t>
-      </w:r>
-      <w:r>
-        <w:rPr>
-          <w:rFonts w:hint="eastAsia"/>
-        </w:rPr>
-        <w:t xml:space="preserve">“削峰”</w:t>
-      </w:r>
-      <w:r>
-        <w:rPr>
-          <w:rFonts w:hint="eastAsia"/>
-        </w:rPr>
-        <w:t xml:space="preserve">和</w:t>
-      </w:r>
-      <w:r>
-        <w:rPr>
-          <w:rFonts w:hint="eastAsia"/>
-        </w:rPr>
-        <w:t xml:space="preserve">“争取恢复时间”</w:t>
-      </w:r>
-      <w:r>
-        <w:rPr>
-          <w:rFonts w:hint="eastAsia"/>
-        </w:rPr>
-        <w:t xml:space="preserve">的政策缓冲变量。</w:t>
-      </w:r>
-    </w:p>
-    <w:bookmarkEnd w:id="90"/>
-    <w:bookmarkStart w:id="97" w:name="sec:monte-carlo"/>
-    <w:p>
-      <w:pPr>
-        <w:pStyle w:val="Heading2"/>
-      </w:pPr>
-      <w:r>
-        <w:rPr>
-          <w:rFonts w:hint="eastAsia"/>
-        </w:rPr>
-        <w:t xml:space="preserve">蒙特卡洛情景树</w:t>
-      </w:r>
-    </w:p>
-    <w:p>
-      <w:pPr>
-        <w:pStyle w:val="FirstParagraph"/>
-      </w:pPr>
-      <w:r>
-        <w:rPr>
-          <w:rFonts w:hint="eastAsia"/>
-        </w:rPr>
-        <w:t xml:space="preserve">单因素敏感性分析可以说明某个参数单独变化时的边际影响，但封锁长期化的真实风险往往来自多个因素同时恶化：供应中断偏大、SPR</w:t>
-      </w:r>
-      <w:r>
-        <w:t xml:space="preserve"> </w:t>
-      </w:r>
-      <w:r>
-        <w:rPr>
-          <w:rFonts w:hint="eastAsia"/>
-        </w:rPr>
-        <w:t xml:space="preserve">释放不足、绕道运输恢复慢、长期需求弹性偏低、制度风险溢价偏高等因素可能共同出现。因此，本文进一步建立蒙特卡洛情景树，在赛题边界和阶段</w:t>
-      </w:r>
-      <w:r>
-        <w:t xml:space="preserve"> 6 </w:t>
-      </w:r>
-      <w:r>
-        <w:rPr>
-          <w:rFonts w:hint="eastAsia"/>
-        </w:rPr>
-        <w:t xml:space="preserve">扰动范围内对关键参数进行</w:t>
+        <w:t xml:space="preserve">释放不足、绕道运输恢复慢、长期需求弹性偏低、制度风险溢价偏高等因素可能共同出现。因此，本文进一步建立蒙特卡洛情景树，在赛题边界和敏感性扰动范围内对关键参数进行</w:t>
       </w:r>
       <w:r>
         <w:t xml:space="preserve"> 2000 </w:t>
@@ -17242,18 +18662,18 @@
           <wp:inline>
             <wp:extent cx="5013960" cy="2790377"/>
             <wp:effectExtent b="0" l="0" r="0" t="0"/>
-            <wp:docPr descr="" title="" id="92" name="Picture"/>
+            <wp:docPr descr="" title="" id="96" name="Picture"/>
             <a:graphic>
               <a:graphicData uri="http://schemas.openxmlformats.org/drawingml/2006/picture">
                 <pic:pic>
                   <pic:nvPicPr>
-                    <pic:cNvPr descr="monte_carlo_price_fan.png" id="93" name="Picture"/>
+                    <pic:cNvPr descr="monte_carlo_price_fan.png" id="97" name="Picture"/>
                     <pic:cNvPicPr>
                       <a:picLocks noChangeArrowheads="1" noChangeAspect="1"/>
                     </pic:cNvPicPr>
                   </pic:nvPicPr>
                   <pic:blipFill>
-                    <a:blip r:embed="rId91"/>
+                    <a:blip r:embed="rId95"/>
                     <a:stretch>
                       <a:fillRect/>
                     </a:stretch>
@@ -17312,18 +18732,18 @@
           <wp:inline>
             <wp:extent cx="4160520" cy="2352876"/>
             <wp:effectExtent b="0" l="0" r="0" t="0"/>
-            <wp:docPr descr="" title="" id="95" name="Picture"/>
+            <wp:docPr descr="" title="" id="99" name="Picture"/>
             <a:graphic>
               <a:graphicData uri="http://schemas.openxmlformats.org/drawingml/2006/picture">
                 <pic:pic>
                   <pic:nvPicPr>
-                    <pic:cNvPr descr="monte_carlo_tail_risk.png" id="96" name="Picture"/>
+                    <pic:cNvPr descr="monte_carlo_tail_risk.png" id="100" name="Picture"/>
                     <pic:cNvPicPr>
                       <a:picLocks noChangeArrowheads="1" noChangeAspect="1"/>
                     </pic:cNvPicPr>
                   </pic:nvPicPr>
                   <pic:blipFill>
-                    <a:blip r:embed="rId94"/>
+                    <a:blip r:embed="rId98"/>
                     <a:stretch>
                       <a:fillRect/>
                     </a:stretch>
@@ -17387,16 +18807,7 @@
         <w:rPr>
           <w:rFonts w:hint="eastAsia"/>
         </w:rPr>
-        <w:t xml:space="preserve">美元/桶，与阶段</w:t>
-      </w:r>
-      <w:r>
-        <w:t xml:space="preserve"> 5 </w:t>
-      </w:r>
-      <w:r>
-        <w:rPr>
-          <w:rFonts w:hint="eastAsia"/>
-        </w:rPr>
-        <w:t xml:space="preserve">中性情景的</w:t>
+        <w:t xml:space="preserve">美元/桶，与中性情景的</w:t>
       </w:r>
       <w:r>
         <w:t xml:space="preserve"> 92.43 </w:t>
@@ -17444,8 +18855,8 @@
         <w:t xml:space="preserve">21.1%。这说明长期风险的重点不是中性点预测本身，而是多因素联动恶化下的尾部组合风险。</w:t>
       </w:r>
     </w:p>
-    <w:bookmarkEnd w:id="97"/>
-    <w:bookmarkStart w:id="104" w:name="滞后地缘风险指数审计"/>
+    <w:bookmarkEnd w:id="101"/>
+    <w:bookmarkStart w:id="108" w:name="滞后地缘风险指数审计"/>
     <w:p>
       <w:pPr>
         <w:pStyle w:val="Heading2"/>
@@ -17964,18 +19375,18 @@
           <wp:inline>
             <wp:extent cx="4907280" cy="2628899"/>
             <wp:effectExtent b="0" l="0" r="0" t="0"/>
-            <wp:docPr descr="" title="" id="99" name="Picture"/>
+            <wp:docPr descr="" title="" id="103" name="Picture"/>
             <a:graphic>
               <a:graphicData uri="http://schemas.openxmlformats.org/drawingml/2006/picture">
                 <pic:pic>
                   <pic:nvPicPr>
-                    <pic:cNvPr descr="gpr_event_window_audit.png" id="100" name="Picture"/>
+                    <pic:cNvPr descr="gpr_event_window_audit.png" id="104" name="Picture"/>
                     <pic:cNvPicPr>
                       <a:picLocks noChangeArrowheads="1" noChangeAspect="1"/>
                     </pic:cNvPicPr>
                   </pic:nvPicPr>
                   <pic:blipFill>
-                    <a:blip r:embed="rId98"/>
+                    <a:blip r:embed="rId102"/>
                     <a:stretch>
                       <a:fillRect/>
                     </a:stretch>
@@ -18076,18 +19487,18 @@
           <wp:inline>
             <wp:extent cx="4480560" cy="3054927"/>
             <wp:effectExtent b="0" l="0" r="0" t="0"/>
-            <wp:docPr descr="" title="" id="102" name="Picture"/>
+            <wp:docPr descr="" title="" id="106" name="Picture"/>
             <a:graphic>
               <a:graphicData uri="http://schemas.openxmlformats.org/drawingml/2006/picture">
                 <pic:pic>
                   <pic:nvPicPr>
-                    <pic:cNvPr descr="lagged_gpr_brent_return.png" id="103" name="Picture"/>
+                    <pic:cNvPr descr="lagged_gpr_brent_return.png" id="107" name="Picture"/>
                     <pic:cNvPicPr>
                       <a:picLocks noChangeArrowheads="1" noChangeAspect="1"/>
                     </pic:cNvPicPr>
                   </pic:nvPicPr>
                   <pic:blipFill>
-                    <a:blip r:embed="rId101"/>
+                    <a:blip r:embed="rId105"/>
                     <a:stretch>
                       <a:fillRect/>
                     </a:stretch>
@@ -18211,8 +19622,8 @@
         <w:t xml:space="preserve">。这使模型在风险解释和内生性防御之间保持较稳妥的边界。</w:t>
       </w:r>
     </w:p>
-    <w:bookmarkEnd w:id="104"/>
-    <w:bookmarkStart w:id="111" w:name="历史样本稳健性检验"/>
+    <w:bookmarkEnd w:id="108"/>
+    <w:bookmarkStart w:id="115" w:name="历史样本稳健性检验"/>
     <w:p>
       <w:pPr>
         <w:pStyle w:val="Heading2"/>
@@ -18789,18 +20200,18 @@
           <wp:inline>
             <wp:extent cx="4907280" cy="2685115"/>
             <wp:effectExtent b="0" l="0" r="0" t="0"/>
-            <wp:docPr descr="" title="" id="106" name="Picture"/>
+            <wp:docPr descr="" title="" id="110" name="Picture"/>
             <a:graphic>
               <a:graphicData uri="http://schemas.openxmlformats.org/drawingml/2006/picture">
                 <pic:pic>
                   <pic:nvPicPr>
-                    <pic:cNvPr descr="historical_event_extremeness.png" id="107" name="Picture"/>
+                    <pic:cNvPr descr="historical_event_extremeness.png" id="111" name="Picture"/>
                     <pic:cNvPicPr>
                       <a:picLocks noChangeArrowheads="1" noChangeAspect="1"/>
                     </pic:cNvPicPr>
                   </pic:nvPicPr>
                   <pic:blipFill>
-                    <a:blip r:embed="rId105"/>
+                    <a:blip r:embed="rId109"/>
                     <a:stretch>
                       <a:fillRect/>
                     </a:stretch>
@@ -18850,18 +20261,18 @@
           <wp:inline>
             <wp:extent cx="4693920" cy="2669091"/>
             <wp:effectExtent b="0" l="0" r="0" t="0"/>
-            <wp:docPr descr="" title="" id="109" name="Picture"/>
+            <wp:docPr descr="" title="" id="113" name="Picture"/>
             <a:graphic>
               <a:graphicData uri="http://schemas.openxmlformats.org/drawingml/2006/picture">
                 <pic:pic>
                   <pic:nvPicPr>
-                    <pic:cNvPr descr="historical_baseline_error_distribution.png" id="110" name="Picture"/>
+                    <pic:cNvPr descr="historical_baseline_error_distribution.png" id="114" name="Picture"/>
                     <pic:cNvPicPr>
                       <a:picLocks noChangeArrowheads="1" noChangeAspect="1"/>
                     </pic:cNvPicPr>
                   </pic:nvPicPr>
                   <pic:blipFill>
-                    <a:blip r:embed="rId108"/>
+                    <a:blip r:embed="rId112"/>
                     <a:stretch>
                       <a:fillRect/>
                     </a:stretch>
@@ -18964,9 +20375,9 @@
         <w:t xml:space="preserve">检验也支持这一点：收盘价水平和对数价格均不能拒绝单位根，而对数收益率可拒绝单位根，因此普通统计基准更适合在收益率或差分口径下使用。</w:t>
       </w:r>
     </w:p>
-    <w:bookmarkEnd w:id="111"/>
-    <w:bookmarkEnd w:id="112"/>
-    <w:bookmarkStart w:id="116" w:name="模型评价"/>
+    <w:bookmarkEnd w:id="115"/>
+    <w:bookmarkEnd w:id="116"/>
+    <w:bookmarkStart w:id="120" w:name="模型评价"/>
     <w:p>
       <w:pPr>
         <w:pStyle w:val="Heading1"/>
@@ -18978,7 +20389,7 @@
         <w:t xml:space="preserve">模型评价</w:t>
       </w:r>
     </w:p>
-    <w:bookmarkStart w:id="113" w:name="优点"/>
+    <w:bookmarkStart w:id="117" w:name="优点"/>
     <w:p>
       <w:pPr>
         <w:pStyle w:val="Heading2"/>
@@ -19056,7 +20467,16 @@
         <w:rPr>
           <w:rFonts w:hint="eastAsia"/>
         </w:rPr>
-        <w:t xml:space="preserve">基准、滞后平移检验、机制消融、过拟合压力测试和历史同长度窗口检验。</w:t>
+        <w:t xml:space="preserve">基准、DM</w:t>
+      </w:r>
+      <w:r>
+        <w:t xml:space="preserve"> </w:t>
+      </w:r>
+      <w:r>
+        <w:rPr>
+          <w:rFonts w:hint="eastAsia"/>
+        </w:rPr>
+        <w:t xml:space="preserve">统计检验、滞后平移检验、机制消融、过拟合压力测试和历史同长度窗口检验。</w:t>
       </w:r>
     </w:p>
     <w:p>
@@ -19096,8 +20516,8 @@
         <w:t xml:space="preserve">长期表述审慎：三情景中心线与蒙特卡洛扇形区间合读，把长期结果定位为条件中心路径和尾部风险，而非精确日度点预测。</w:t>
       </w:r>
     </w:p>
-    <w:bookmarkEnd w:id="113"/>
-    <w:bookmarkStart w:id="114" w:name="局限性"/>
+    <w:bookmarkEnd w:id="117"/>
+    <w:bookmarkStart w:id="118" w:name="局限性"/>
     <w:p>
       <w:pPr>
         <w:pStyle w:val="Heading2"/>
@@ -19196,8 +20616,8 @@
         <w:t xml:space="preserve">蒙特卡洛情景树已经刻画了部分参数联动风险，但其联合分布仍来自模型设定而非外部历史频率估计，因此尾部概率应解释为条件概率而非真实市场概率。</w:t>
       </w:r>
     </w:p>
-    <w:bookmarkEnd w:id="114"/>
-    <w:bookmarkStart w:id="115" w:name="改进方向"/>
+    <w:bookmarkEnd w:id="118"/>
+    <w:bookmarkStart w:id="119" w:name="改进方向"/>
     <w:p>
       <w:pPr>
         <w:pStyle w:val="Heading2"/>
@@ -19283,9 +20703,9 @@
         <w:t xml:space="preserve">多智能体仿真则只有在获得主体级行为数据时才有必要进入主线。</w:t>
       </w:r>
     </w:p>
-    <w:bookmarkEnd w:id="115"/>
-    <w:bookmarkEnd w:id="116"/>
-    <w:bookmarkStart w:id="117" w:name="结论"/>
+    <w:bookmarkEnd w:id="119"/>
+    <w:bookmarkEnd w:id="120"/>
+    <w:bookmarkStart w:id="121" w:name="结论"/>
     <w:p>
       <w:pPr>
         <w:pStyle w:val="Heading1"/>
@@ -19419,7 +20839,16 @@
         <w:rPr>
           <w:rFonts w:hint="eastAsia"/>
         </w:rPr>
-        <w:t xml:space="preserve">基准，且通过滞后平移检验、机制消融和过拟合压力测试，具备较好的解释力和防御性。</w:t>
+        <w:t xml:space="preserve">基准，DM</w:t>
+      </w:r>
+      <w:r>
+        <w:t xml:space="preserve"> </w:t>
+      </w:r>
+      <w:r>
+        <w:rPr>
+          <w:rFonts w:hint="eastAsia"/>
+        </w:rPr>
+        <w:t xml:space="preserve">平方损失检验和方向命中检验提供支持性统计证据，且通过滞后平移检验、机制消融和过拟合压力测试，具备较好的解释力和防御性。</w:t>
       </w:r>
     </w:p>
     <w:p>
@@ -19486,7 +20915,7 @@
         <w:rPr>
           <w:rFonts w:hint="eastAsia"/>
         </w:rPr>
-        <w:t xml:space="preserve">敏感性分析显示，地缘风险权重、不确定性与制度风险强度和供应中断量是最关键影响因素；SPR</w:t>
+        <w:t xml:space="preserve">敏感性分析显示，地缘风险权重、不确定性与制度风险强度和制度风险占比是综合敏感度最高的三个因素；SPR</w:t>
       </w:r>
       <w:r>
         <w:t xml:space="preserve"> </w:t>
@@ -19662,8 +21091,8 @@
         <w:t xml:space="preserve">不足、绕道恢复缓慢和制度风险溢价持续时形成的尾部组合。</w:t>
       </w:r>
     </w:p>
-    <w:bookmarkEnd w:id="117"/>
-    <w:bookmarkStart w:id="118" w:name="附录支撑材料说明"/>
+    <w:bookmarkEnd w:id="121"/>
+    <w:bookmarkStart w:id="122" w:name="附录支撑材料说明"/>
     <w:p>
       <w:pPr>
         <w:pStyle w:val="Heading1"/>
@@ -19777,8 +21206,8 @@
         <w:t xml:space="preserve">。</w:t>
       </w:r>
     </w:p>
-    <w:bookmarkEnd w:id="118"/>
-    <w:bookmarkStart w:id="122" w:name="参考文献"/>
+    <w:bookmarkEnd w:id="122"/>
+    <w:bookmarkStart w:id="126" w:name="参考文献"/>
     <w:p>
       <w:pPr>
         <w:pStyle w:val="Heading1"/>
@@ -19989,7 +21418,7 @@
       <w:r>
         <w:t xml:space="preserve"> </w:t>
       </w:r>
-      <w:hyperlink r:id="rId119">
+      <w:hyperlink r:id="rId123">
         <w:r>
           <w:rPr>
             <w:rStyle w:val="Hyperlink"/>
@@ -20011,7 +21440,7 @@
       <w:r>
         <w:t xml:space="preserve"> </w:t>
       </w:r>
-      <w:hyperlink r:id="rId120">
+      <w:hyperlink r:id="rId124">
         <w:r>
           <w:rPr>
             <w:rStyle w:val="Hyperlink"/>
@@ -20033,7 +21462,7 @@
       <w:r>
         <w:t xml:space="preserve"> </w:t>
       </w:r>
-      <w:hyperlink r:id="rId121">
+      <w:hyperlink r:id="rId125">
         <w:r>
           <w:rPr>
             <w:rStyle w:val="Hyperlink"/>
@@ -20045,7 +21474,7 @@
         <w:t xml:space="preserve">.</w:t>
       </w:r>
     </w:p>
-    <w:bookmarkEnd w:id="122"/>
+    <w:bookmarkEnd w:id="126"/>
     <w:sectPr>
       <w:footnotePr>
         <w:numRestart w:val="eachSect"/>

</xml_diff>

<commit_message>
Strengthen audit evidence and organize scripts
</commit_message>
<xml_diff>
--- a/output/final/总论文.docx
+++ b/output/final/总论文.docx
@@ -4548,6 +4548,177 @@
           <w:rFonts w:hint="eastAsia"/>
         </w:rPr>
         <w:t xml:space="preserve">，经济含义不同。</w:t>
+      </w:r>
+    </w:p>
+    <w:p>
+      <w:pPr>
+        <w:pStyle w:val="BodyText"/>
+      </w:pPr>
+      <w:r>
+        <w:rPr>
+          <w:rFonts w:hint="eastAsia"/>
+        </w:rPr>
+        <w:t xml:space="preserve">更具体地说，若令</w:t>
+      </w:r>
+      <w:r>
+        <w:t xml:space="preserve"> </w:t>
+      </w:r>
+      <m:oMath>
+        <m:r>
+          <m:t>ϕ</m:t>
+        </m:r>
+        <m:r>
+          <m:rPr>
+            <m:sty m:val="p"/>
+          </m:rPr>
+          <m:t>=</m:t>
+        </m:r>
+        <m:r>
+          <m:t>1</m:t>
+        </m:r>
+      </m:oMath>
+      <w:r>
+        <w:rPr>
+          <w:rFonts w:hint="eastAsia"/>
+        </w:rPr>
+        <w:t xml:space="preserve">，则模型等价于假设剩余物理缺口会按题面低弹性完全、即时地映射为期货目标价格；但现实原油期货市场同时定价库存、预期、投机头寸、政策缓冲可信度和未来需求调整。Kilian（2009）、Hamilton（2009）以及</w:t>
+      </w:r>
+      <w:r>
+        <w:t xml:space="preserve"> Kilian </w:t>
+      </w:r>
+      <w:r>
+        <w:rPr>
+          <w:rFonts w:hint="eastAsia"/>
+        </w:rPr>
+        <w:t xml:space="preserve">与</w:t>
+      </w:r>
+      <w:r>
+        <w:t xml:space="preserve"> </w:t>
+      </w:r>
+      <w:r>
+        <w:rPr>
+          <w:rFonts w:hint="eastAsia"/>
+        </w:rPr>
+        <w:t xml:space="preserve">Murphy（2014）均指出，油价冲击不能只由当期物理供给缺口解释，预期需求、库存和投机交易会改变现货与期货价格的传导路径。因此本文把</w:t>
+      </w:r>
+      <w:r>
+        <w:t xml:space="preserve"> </w:t>
+      </w:r>
+      <m:oMath>
+        <m:r>
+          <m:t>ϕ</m:t>
+        </m:r>
+      </m:oMath>
+      <w:r>
+        <w:t xml:space="preserve"> </w:t>
+      </w:r>
+      <w:r>
+        <w:rPr>
+          <w:rFonts w:hint="eastAsia"/>
+        </w:rPr>
+        <w:t xml:space="preserve">明确归类为行为校准参数，并在反驳性检验中单独报告：当</w:t>
+      </w:r>
+      <w:r>
+        <w:t xml:space="preserve"> </w:t>
+      </w:r>
+      <m:oMath>
+        <m:r>
+          <m:t>ϕ</m:t>
+        </m:r>
+        <m:r>
+          <m:rPr>
+            <m:sty m:val="p"/>
+          </m:rPr>
+          <m:t>=</m:t>
+        </m:r>
+        <m:r>
+          <m:t>1</m:t>
+        </m:r>
+      </m:oMath>
+      <w:r>
+        <w:t xml:space="preserve"> </w:t>
+      </w:r>
+      <w:r>
+        <w:rPr>
+          <w:rFonts w:hint="eastAsia"/>
+        </w:rPr>
+        <w:t xml:space="preserve">时，短期</w:t>
+      </w:r>
+      <w:r>
+        <w:t xml:space="preserve"> RMSE </w:t>
+      </w:r>
+      <w:r>
+        <w:rPr>
+          <w:rFonts w:hint="eastAsia"/>
+        </w:rPr>
+        <w:t xml:space="preserve">升至</w:t>
+      </w:r>
+      <w:r>
+        <w:t xml:space="preserve"> 26.55 </w:t>
+      </w:r>
+      <w:r>
+        <w:rPr>
+          <w:rFonts w:hint="eastAsia"/>
+        </w:rPr>
+        <w:t xml:space="preserve">美元/桶，模拟峰值升至</w:t>
+      </w:r>
+      <w:r>
+        <w:t xml:space="preserve"> 166.84 </w:t>
+      </w:r>
+      <w:r>
+        <w:rPr>
+          <w:rFonts w:hint="eastAsia"/>
+        </w:rPr>
+        <w:t xml:space="preserve">美元/桶，说明完全机械传导不符合附件观测；而在</w:t>
+      </w:r>
+      <w:r>
+        <w:t xml:space="preserve"> </w:t>
+      </w:r>
+      <m:oMath>
+        <m:r>
+          <m:t>0.5</m:t>
+        </m:r>
+        <m:r>
+          <m:t>ϕ</m:t>
+        </m:r>
+      </m:oMath>
+      <w:r>
+        <w:t xml:space="preserve">–</w:t>
+      </w:r>
+      <m:oMath>
+        <m:r>
+          <m:t>2.0</m:t>
+        </m:r>
+        <m:r>
+          <m:t>ϕ</m:t>
+        </m:r>
+      </m:oMath>
+      <w:r>
+        <w:t xml:space="preserve"> </w:t>
+      </w:r>
+      <w:r>
+        <w:rPr>
+          <w:rFonts w:hint="eastAsia"/>
+        </w:rPr>
+        <w:t xml:space="preserve">扰动内，RMSE</w:t>
+      </w:r>
+      <w:r>
+        <w:t xml:space="preserve"> </w:t>
+      </w:r>
+      <w:r>
+        <w:rPr>
+          <w:rFonts w:hint="eastAsia"/>
+        </w:rPr>
+        <w:t xml:space="preserve">仍处于</w:t>
+      </w:r>
+      <w:r>
+        <w:t xml:space="preserve"> 3.50–3.64 </w:t>
+      </w:r>
+      <w:r>
+        <w:rPr>
+          <w:rFonts w:hint="eastAsia"/>
+        </w:rPr>
+        <w:t xml:space="preserve">美元/桶区间，说明价格平台并非唯一参数点偶然形成。</w:t>
       </w:r>
     </w:p>
     <w:p>
@@ -6475,7 +6646,47 @@
         <w:rPr>
           <w:rFonts w:hint="eastAsia"/>
         </w:rPr>
-        <w:t xml:space="preserve">为预期修复折价。模型递推式为</w:t>
+        <w:t xml:space="preserve">为预期修复折价。这里的</w:t>
+      </w:r>
+      <w:r>
+        <w:t xml:space="preserve"> </w:t>
+      </w:r>
+      <m:oMath>
+        <m:sSub>
+          <m:e>
+            <m:r>
+              <m:t>ε</m:t>
+            </m:r>
+          </m:e>
+          <m:sub>
+            <m:r>
+              <m:t>t</m:t>
+            </m:r>
+          </m:sub>
+        </m:sSub>
+      </m:oMath>
+      <w:r>
+        <w:t xml:space="preserve"> </w:t>
+      </w:r>
+      <w:r>
+        <w:rPr>
+          <w:rFonts w:hint="eastAsia"/>
+        </w:rPr>
+        <w:t xml:space="preserve">仍承担题面低弹性约束，</w:t>
+      </w:r>
+      <m:oMath>
+        <m:r>
+          <m:t>ϕ</m:t>
+        </m:r>
+      </m:oMath>
+      <w:r>
+        <w:t xml:space="preserve"> </w:t>
+      </w:r>
+      <w:r>
+        <w:rPr>
+          <w:rFonts w:hint="eastAsia"/>
+        </w:rPr>
+        <w:t xml:space="preserve">只刻画期货市场对剩余缺口的折价传导强度。模型递推式为</w:t>
       </w:r>
     </w:p>
     <w:p>
@@ -6697,7 +6908,7 @@
     </w:p>
     <w:bookmarkEnd w:id="38"/>
     <w:bookmarkEnd w:id="39"/>
-    <w:bookmarkStart w:id="80" w:name="参数校准与模型检验"/>
+    <w:bookmarkStart w:id="82" w:name="参数校准与模型检验"/>
     <w:p>
       <w:pPr>
         <w:pStyle w:val="Heading1"/>
@@ -7647,6 +7858,43 @@
               <w:rPr>
                 <w:rFonts w:hint="eastAsia"/>
               </w:rPr>
+              <w:t xml:space="preserve">价格传导系数</w:t>
+            </w:r>
+            <w:r>
+              <w:t xml:space="preserve"> </w:t>
+            </w:r>
+            <m:oMath>
+              <m:r>
+                <m:t>ϕ</m:t>
+              </m:r>
+            </m:oMath>
+          </w:p>
+        </w:tc>
+        <w:tc>
+          <w:tcPr/>
+          <w:p>
+            <w:pPr>
+              <w:pStyle w:val="Compact"/>
+              <w:jc w:val="right"/>
+            </w:pPr>
+            <w:r>
+              <w:t xml:space="preserve">0.028</w:t>
+            </w:r>
+          </w:p>
+        </w:tc>
+      </w:tr>
+      <w:tr>
+        <w:tc>
+          <w:tcPr/>
+          <w:p>
+            <w:pPr>
+              <w:pStyle w:val="Compact"/>
+              <w:jc w:val="left"/>
+            </w:pPr>
+            <w:r>
+              <w:rPr>
+                <w:rFonts w:hint="eastAsia"/>
+              </w:rPr>
               <w:t xml:space="preserve">调整速度</w:t>
             </w:r>
             <w:r>
@@ -7671,8 +7919,6 @@
             </w:r>
           </w:p>
         </w:tc>
-      </w:tr>
-      <w:tr>
         <w:tc>
           <w:tcPr/>
           <w:p>
@@ -7708,6 +7954,8 @@
             </w:r>
           </w:p>
         </w:tc>
+      </w:tr>
+      <w:tr>
         <w:tc>
           <w:tcPr/>
           <w:p>
@@ -7732,6 +7980,33 @@
             </w:pPr>
             <w:r>
               <w:t xml:space="preserve">0.247</w:t>
+            </w:r>
+          </w:p>
+        </w:tc>
+        <w:tc>
+          <w:tcPr/>
+          <w:p>
+            <w:pPr>
+              <w:pStyle w:val="Compact"/>
+              <w:jc w:val="left"/>
+            </w:pPr>
+            <w:r>
+              <w:rPr>
+                <w:rFonts w:hint="eastAsia"/>
+              </w:rPr>
+              <w:t xml:space="preserve">库存响应系数</w:t>
+            </w:r>
+          </w:p>
+        </w:tc>
+        <w:tc>
+          <w:tcPr/>
+          <w:p>
+            <w:pPr>
+              <w:pStyle w:val="Compact"/>
+              <w:jc w:val="right"/>
+            </w:pPr>
+            <w:r>
+              <w:t xml:space="preserve">0.666</w:t>
             </w:r>
           </w:p>
         </w:tc>
@@ -10476,7 +10751,7 @@
               <w:jc w:val="right"/>
             </w:pPr>
             <w:r>
-              <w:t xml:space="preserve">-8.36</w:t>
+              <w:t xml:space="preserve">-2.06</w:t>
             </w:r>
           </w:p>
         </w:tc>
@@ -10500,10 +10775,13 @@
               <w:jc w:val="left"/>
             </w:pPr>
             <w:r>
-              <w:rPr>
-                <w:rFonts w:hint="eastAsia"/>
-              </w:rPr>
-              <w:t xml:space="preserve">损失均值差为负，单侧检验支持模型优于朴素基准</w:t>
+              <w:t xml:space="preserve">R </w:t>
+            </w:r>
+            <w:r>
+              <w:rPr>
+                <w:rFonts w:hint="eastAsia"/>
+              </w:rPr>
+              <w:t xml:space="preserve">独立复核下，单侧检验支持模型优于朴素基准</w:t>
             </w:r>
           </w:p>
         </w:tc>
@@ -10535,7 +10813,7 @@
               <w:jc w:val="right"/>
             </w:pPr>
             <w:r>
-              <w:t xml:space="preserve">-0.77</w:t>
+              <w:t xml:space="preserve">-1.68</w:t>
             </w:r>
           </w:p>
         </w:tc>
@@ -10743,6 +11021,73 @@
                 <w:rFonts w:hint="eastAsia"/>
               </w:rPr>
               <w:t xml:space="preserve">未发现强条件异方差证据</w:t>
+            </w:r>
+          </w:p>
+        </w:tc>
+      </w:tr>
+      <w:tr>
+        <w:tc>
+          <w:tcPr/>
+          <w:p>
+            <w:pPr>
+              <w:pStyle w:val="Compact"/>
+              <w:jc w:val="left"/>
+            </w:pPr>
+            <w:r>
+              <w:t xml:space="preserve">Newey–West </w:t>
+            </w:r>
+            <w:r>
+              <w:rPr>
+                <w:rFonts w:hint="eastAsia"/>
+              </w:rPr>
+              <w:t xml:space="preserve">校准斜率</w:t>
+            </w:r>
+          </w:p>
+        </w:tc>
+        <w:tc>
+          <w:tcPr/>
+          <w:p>
+            <w:pPr>
+              <w:pStyle w:val="Compact"/>
+              <w:jc w:val="right"/>
+            </w:pPr>
+            <w:r>
+              <w:t xml:space="preserve">1.046</w:t>
+            </w:r>
+          </w:p>
+        </w:tc>
+        <w:tc>
+          <w:tcPr/>
+          <w:p>
+            <w:pPr>
+              <w:pStyle w:val="Compact"/>
+              <w:jc w:val="right"/>
+            </w:pPr>
+            <m:oMath>
+              <m:r>
+                <m:rPr>
+                  <m:sty m:val="p"/>
+                </m:rPr>
+                <m:t>&lt;</m:t>
+              </m:r>
+              <m:r>
+                <m:t>0.001</m:t>
+              </m:r>
+            </m:oMath>
+          </w:p>
+        </w:tc>
+        <w:tc>
+          <w:tcPr/>
+          <w:p>
+            <w:pPr>
+              <w:pStyle w:val="Compact"/>
+              <w:jc w:val="left"/>
+            </w:pPr>
+            <w:r>
+              <w:rPr>
+                <w:rFonts w:hint="eastAsia"/>
+              </w:rPr>
+              <w:t xml:space="preserve">稳健标准误下拟合值与真实价格保持显著线性关系</w:t>
             </w:r>
           </w:p>
         </w:tc>
@@ -10882,7 +11227,7 @@
         <w:rPr>
           <w:rFonts w:hint="eastAsia"/>
         </w:rPr>
-        <w:t xml:space="preserve">语言在本文中的定位是统计审计辅助层，而不是替代</w:t>
+        <w:t xml:space="preserve">语言在本文中的定位是计量审计辅助层，而不是替代</w:t>
       </w:r>
       <w:r>
         <w:t xml:space="preserve"> Python </w:t>
@@ -10900,7 +11245,7 @@
         <w:rPr>
           <w:rFonts w:hint="eastAsia"/>
         </w:rPr>
-        <w:t xml:space="preserve">审计脚本，用于后续复核</w:t>
+        <w:t xml:space="preserve">审计脚本，用于独立复核</w:t>
       </w:r>
       <w:r>
         <w:t xml:space="preserve"> DM </w:t>
@@ -10909,16 +11254,61 @@
         <w:rPr>
           <w:rFonts w:hint="eastAsia"/>
         </w:rPr>
-        <w:t xml:space="preserve">检验、方向检验、残差诊断以及扩展</w:t>
-      </w:r>
-      <w:r>
-        <w:t xml:space="preserve"> GARCH、VAR </w:t>
-      </w:r>
-      <w:r>
-        <w:rPr>
-          <w:rFonts w:hint="eastAsia"/>
-        </w:rPr>
-        <w:t xml:space="preserve">或稳健标准误分析；但主模型仍由</w:t>
+        <w:t xml:space="preserve">检验、方向检验、Ljung–Box</w:t>
+      </w:r>
+      <w:r>
+        <w:t xml:space="preserve"> </w:t>
+      </w:r>
+      <w:r>
+        <w:rPr>
+          <w:rFonts w:hint="eastAsia"/>
+        </w:rPr>
+        <w:t xml:space="preserve">残差诊断，并补充</w:t>
+      </w:r>
+      <w:r>
+        <w:t xml:space="preserve"> ADF </w:t>
+      </w:r>
+      <w:r>
+        <w:rPr>
+          <w:rFonts w:hint="eastAsia"/>
+        </w:rPr>
+        <w:t xml:space="preserve">平稳性检验、ARCH/GARCH</w:t>
+      </w:r>
+      <w:r>
+        <w:t xml:space="preserve"> </w:t>
+      </w:r>
+      <w:r>
+        <w:rPr>
+          <w:rFonts w:hint="eastAsia"/>
+        </w:rPr>
+        <w:t xml:space="preserve">波动聚集审计和</w:t>
+      </w:r>
+      <w:r>
+        <w:t xml:space="preserve"> Newey–West </w:t>
+      </w:r>
+      <w:r>
+        <w:rPr>
+          <w:rFonts w:hint="eastAsia"/>
+        </w:rPr>
+        <w:t xml:space="preserve">稳健校准回归。R</w:t>
+      </w:r>
+      <w:r>
+        <w:t xml:space="preserve"> </w:t>
+      </w:r>
+      <w:r>
+        <w:rPr>
+          <w:rFonts w:hint="eastAsia"/>
+        </w:rPr>
+        <w:t xml:space="preserve">审计显示，价格水平和对数价格不能拒绝单位根假设，而对数收益率可拒绝单位根假设，这与金融时间序列通常应在收益率层面开展统计建模的经验一致；GARCH(1,1)</w:t>
+      </w:r>
+      <w:r>
+        <w:t xml:space="preserve"> </w:t>
+      </w:r>
+      <w:r>
+        <w:rPr>
+          <w:rFonts w:hint="eastAsia"/>
+        </w:rPr>
+        <w:t xml:space="preserve">在短样本下给出较高波动持续性，仅作为冲突窗口波动聚集的提示，不替代机制递推主模型。主模型仍由</w:t>
       </w:r>
       <w:r>
         <w:t xml:space="preserve"> Python </w:t>
@@ -13186,8 +13576,802 @@
       </w:r>
     </w:p>
     <w:bookmarkEnd w:id="79"/>
+    <w:bookmarkStart w:id="81" w:name="反驳性检验总览"/>
+    <w:p>
+      <w:pPr>
+        <w:pStyle w:val="Heading2"/>
+      </w:pPr>
+      <w:r>
+        <w:rPr>
+          <w:rFonts w:hint="eastAsia"/>
+        </w:rPr>
+        <w:t xml:space="preserve">反驳性检验总览</w:t>
+      </w:r>
+    </w:p>
+    <w:p>
+      <w:pPr>
+        <w:pStyle w:val="FirstParagraph"/>
+      </w:pPr>
+      <w:r>
+        <w:rPr>
+          <w:rFonts w:hint="eastAsia"/>
+        </w:rPr>
+        <w:t xml:space="preserve">为避免模型检验只呈现有利指标，本文将最可能被质疑的关键点转化为反驳性检验。表</w:t>
+      </w:r>
+      <w:r>
+        <w:t xml:space="preserve"> </w:t>
+      </w:r>
+      <w:hyperlink w:anchor="tab:adversarial-tests">
+        <w:r>
+          <w:rPr>
+            <w:rStyle w:val="Hyperlink"/>
+          </w:rPr>
+          <w:t xml:space="preserve">2</w:t>
+        </w:r>
+      </w:hyperlink>
+      <w:r>
+        <w:t xml:space="preserve"> </w:t>
+      </w:r>
+      <w:r>
+        <w:rPr>
+          <w:rFonts w:hint="eastAsia"/>
+        </w:rPr>
+        <w:t xml:space="preserve">中的检验均不重新寻找最优参数，而是在同一模型框架下改变某个被质疑条件，观察结论是否被推翻。</w:t>
+      </w:r>
+    </w:p>
+    <w:bookmarkStart w:id="80" w:name="tab:adversarial-tests"/>
+    <w:p>
+      <w:pPr>
+        <w:pStyle w:val="TableCaption"/>
+      </w:pPr>
+      <w:r>
+        <w:rPr>
+          <w:rFonts w:hint="eastAsia"/>
+        </w:rPr>
+        <w:t xml:space="preserve">反驳性检验总览</w:t>
+      </w:r>
+    </w:p>
+    <w:tbl>
+      <w:tblPr>
+        <w:tblStyle w:val="Table"/>
+        <w:tblW w:type="auto" w:w="0"/>
+        <w:tblLook w:firstRow="1" w:lastRow="0" w:firstColumn="0" w:lastColumn="0" w:noHBand="0" w:noVBand="0" w:val="0020"/>
+        <w:tblCaption w:val="反驳性检验总览"/>
+      </w:tblPr>
+      <w:tblGrid>
+        <w:gridCol w:w="1980"/>
+        <w:gridCol w:w="1980"/>
+        <w:gridCol w:w="1980"/>
+        <w:gridCol w:w="1980"/>
+      </w:tblGrid>
+      <w:tr>
+        <w:trPr>
+          <w:tblHeader w:val="on"/>
+        </w:trPr>
+        <w:tc>
+          <w:tcPr/>
+          <w:p>
+            <w:pPr>
+              <w:pStyle w:val="Compact"/>
+              <w:jc w:val="left"/>
+            </w:pPr>
+            <w:r>
+              <w:rPr>
+                <w:rFonts w:hint="eastAsia"/>
+              </w:rPr>
+              <w:t xml:space="preserve">质疑点</w:t>
+            </w:r>
+          </w:p>
+        </w:tc>
+        <w:tc>
+          <w:tcPr/>
+          <w:p>
+            <w:pPr>
+              <w:pStyle w:val="Compact"/>
+              <w:jc w:val="left"/>
+            </w:pPr>
+            <w:r>
+              <w:rPr>
+                <w:rFonts w:hint="eastAsia"/>
+              </w:rPr>
+              <w:t xml:space="preserve">检验方式</w:t>
+            </w:r>
+          </w:p>
+        </w:tc>
+        <w:tc>
+          <w:tcPr/>
+          <w:p>
+            <w:pPr>
+              <w:pStyle w:val="Compact"/>
+              <w:jc w:val="left"/>
+            </w:pPr>
+            <w:r>
+              <w:rPr>
+                <w:rFonts w:hint="eastAsia"/>
+              </w:rPr>
+              <w:t xml:space="preserve">关键结果</w:t>
+            </w:r>
+          </w:p>
+        </w:tc>
+        <w:tc>
+          <w:tcPr/>
+          <w:p>
+            <w:pPr>
+              <w:pStyle w:val="Compact"/>
+              <w:jc w:val="left"/>
+            </w:pPr>
+            <w:r>
+              <w:rPr>
+                <w:rFonts w:hint="eastAsia"/>
+              </w:rPr>
+              <w:t xml:space="preserve">论文含义</w:t>
+            </w:r>
+          </w:p>
+        </w:tc>
+      </w:tr>
+      <w:tr>
+        <w:tc>
+          <w:tcPr/>
+          <w:p>
+            <w:pPr>
+              <w:pStyle w:val="Compact"/>
+              <w:jc w:val="left"/>
+            </w:pPr>
+            <w:r>
+              <w:rPr>
+                <w:rFonts w:hint="eastAsia"/>
+              </w:rPr>
+              <w:t xml:space="preserve">是否打败朴素基准</w:t>
+            </w:r>
+          </w:p>
+        </w:tc>
+        <w:tc>
+          <w:tcPr/>
+          <w:p>
+            <w:pPr>
+              <w:pStyle w:val="Compact"/>
+              <w:jc w:val="left"/>
+            </w:pPr>
+            <w:r>
+              <w:rPr>
+                <w:rFonts w:hint="eastAsia"/>
+              </w:rPr>
+              <w:t xml:space="preserve">与上一日价格、三日均值、漂移随机游走和滚动</w:t>
+            </w:r>
+            <w:r>
+              <w:t xml:space="preserve"> ARIMA </w:t>
+            </w:r>
+            <w:r>
+              <w:rPr>
+                <w:rFonts w:hint="eastAsia"/>
+              </w:rPr>
+              <w:t xml:space="preserve">比较</w:t>
+            </w:r>
+          </w:p>
+        </w:tc>
+        <w:tc>
+          <w:tcPr/>
+          <w:p>
+            <w:pPr>
+              <w:pStyle w:val="Compact"/>
+              <w:jc w:val="left"/>
+            </w:pPr>
+            <w:r>
+              <w:rPr>
+                <w:rFonts w:hint="eastAsia"/>
+              </w:rPr>
+              <w:t xml:space="preserve">可比样本</w:t>
+            </w:r>
+            <w:r>
+              <w:t xml:space="preserve"> RMSE </w:t>
+            </w:r>
+            <w:r>
+              <w:rPr>
+                <w:rFonts w:hint="eastAsia"/>
+              </w:rPr>
+              <w:t xml:space="preserve">为</w:t>
+            </w:r>
+            <w:r>
+              <w:t xml:space="preserve"> </w:t>
+            </w:r>
+            <w:r>
+              <w:rPr>
+                <w:rFonts w:hint="eastAsia"/>
+              </w:rPr>
+              <w:t xml:space="preserve">3.47，朴素基准为</w:t>
+            </w:r>
+            <w:r>
+              <w:t xml:space="preserve"> </w:t>
+            </w:r>
+            <w:r>
+              <w:rPr>
+                <w:rFonts w:hint="eastAsia"/>
+              </w:rPr>
+              <w:t xml:space="preserve">4.52；DM</w:t>
+            </w:r>
+            <w:r>
+              <w:t xml:space="preserve"> </w:t>
+            </w:r>
+            <w:r>
+              <w:rPr>
+                <w:rFonts w:hint="eastAsia"/>
+              </w:rPr>
+              <w:t xml:space="preserve">平方损失单侧</w:t>
+            </w:r>
+            <w:r>
+              <w:t xml:space="preserve"> </w:t>
+            </w:r>
+            <m:oMath>
+              <m:r>
+                <m:t>p</m:t>
+              </m:r>
+              <m:r>
+                <m:rPr>
+                  <m:sty m:val="p"/>
+                </m:rPr>
+                <m:t>=</m:t>
+              </m:r>
+              <m:r>
+                <m:t>0.023</m:t>
+              </m:r>
+            </m:oMath>
+          </w:p>
+        </w:tc>
+        <w:tc>
+          <w:tcPr/>
+          <w:p>
+            <w:pPr>
+              <w:pStyle w:val="Compact"/>
+              <w:jc w:val="left"/>
+            </w:pPr>
+            <w:r>
+              <w:rPr>
+                <w:rFonts w:hint="eastAsia"/>
+              </w:rPr>
+              <w:t xml:space="preserve">模型不是复杂但无效的随机游走复制</w:t>
+            </w:r>
+          </w:p>
+        </w:tc>
+      </w:tr>
+      <w:tr>
+        <w:tc>
+          <w:tcPr/>
+          <w:p>
+            <w:pPr>
+              <w:pStyle w:val="Compact"/>
+              <w:jc w:val="left"/>
+            </w:pPr>
+            <w:r>
+              <w:rPr>
+                <w:rFonts w:hint="eastAsia"/>
+              </w:rPr>
+              <w:t xml:space="preserve">是否存在滞后跟随</w:t>
+            </w:r>
+          </w:p>
+        </w:tc>
+        <w:tc>
+          <w:tcPr/>
+          <w:p>
+            <w:pPr>
+              <w:pStyle w:val="Compact"/>
+              <w:jc w:val="left"/>
+            </w:pPr>
+            <w:r>
+              <w:rPr>
+                <w:rFonts w:hint="eastAsia"/>
+              </w:rPr>
+              <w:t xml:space="preserve">平移检验、拐点局部检验和残差自相关检验</w:t>
+            </w:r>
+          </w:p>
+        </w:tc>
+        <w:tc>
+          <w:tcPr/>
+          <w:p>
+            <w:pPr>
+              <w:pStyle w:val="Compact"/>
+              <w:jc w:val="left"/>
+            </w:pPr>
+            <w:r>
+              <w:t xml:space="preserve">Ljung–Box lag10</w:t>
+            </w:r>
+            <w:r>
+              <w:t xml:space="preserve"> </w:t>
+            </w:r>
+            <m:oMath>
+              <m:r>
+                <m:t>p</m:t>
+              </m:r>
+              <m:r>
+                <m:rPr>
+                  <m:sty m:val="p"/>
+                </m:rPr>
+                <m:t>=</m:t>
+              </m:r>
+              <m:r>
+                <m:t>0.364</m:t>
+              </m:r>
+            </m:oMath>
+            <w:r>
+              <w:rPr>
+                <w:rFonts w:hint="eastAsia"/>
+              </w:rPr>
+              <w:t xml:space="preserve">，未发现显著线性残差自相关</w:t>
+            </w:r>
+          </w:p>
+        </w:tc>
+        <w:tc>
+          <w:tcPr/>
+          <w:p>
+            <w:pPr>
+              <w:pStyle w:val="Compact"/>
+              <w:jc w:val="left"/>
+            </w:pPr>
+            <w:r>
+              <w:rPr>
+                <w:rFonts w:hint="eastAsia"/>
+              </w:rPr>
+              <w:t xml:space="preserve">拟合曲线没有明显依赖</w:t>
+            </w:r>
+            <w:r>
+              <w:rPr>
+                <w:rFonts w:hint="eastAsia"/>
+              </w:rPr>
+              <w:t xml:space="preserve">“昨天当今天”</w:t>
+            </w:r>
+            <w:r>
+              <w:rPr>
+                <w:rFonts w:hint="eastAsia"/>
+              </w:rPr>
+              <w:t xml:space="preserve">的滞后复制</w:t>
+            </w:r>
+          </w:p>
+        </w:tc>
+      </w:tr>
+      <w:tr>
+        <w:tc>
+          <w:tcPr/>
+          <w:p>
+            <w:pPr>
+              <w:pStyle w:val="Compact"/>
+              <w:jc w:val="left"/>
+            </w:pPr>
+            <w:r>
+              <w:rPr>
+                <w:rFonts w:hint="eastAsia"/>
+              </w:rPr>
+              <w:t xml:space="preserve">是否偷改题面弹性</w:t>
+            </w:r>
+          </w:p>
+        </w:tc>
+        <w:tc>
+          <w:tcPr/>
+          <w:p>
+            <w:pPr>
+              <w:pStyle w:val="Compact"/>
+              <w:jc w:val="left"/>
+            </w:pPr>
+            <w:r>
+              <w:rPr>
+                <w:rFonts w:hint="eastAsia"/>
+              </w:rPr>
+              <w:t xml:space="preserve">将价格传导系数强制设为</w:t>
+            </w:r>
+            <w:r>
+              <w:t xml:space="preserve"> </w:t>
+            </w:r>
+            <m:oMath>
+              <m:r>
+                <m:t>ϕ</m:t>
+              </m:r>
+              <m:r>
+                <m:rPr>
+                  <m:sty m:val="p"/>
+                </m:rPr>
+                <m:t>=</m:t>
+              </m:r>
+              <m:r>
+                <m:t>1</m:t>
+              </m:r>
+            </m:oMath>
+          </w:p>
+        </w:tc>
+        <w:tc>
+          <w:tcPr/>
+          <w:p>
+            <w:pPr>
+              <w:pStyle w:val="Compact"/>
+              <w:jc w:val="left"/>
+            </w:pPr>
+            <w:r>
+              <w:t xml:space="preserve">RMSE </w:t>
+            </w:r>
+            <w:r>
+              <w:rPr>
+                <w:rFonts w:hint="eastAsia"/>
+              </w:rPr>
+              <w:t xml:space="preserve">升至</w:t>
+            </w:r>
+            <w:r>
+              <w:t xml:space="preserve"> </w:t>
+            </w:r>
+            <w:r>
+              <w:rPr>
+                <w:rFonts w:hint="eastAsia"/>
+              </w:rPr>
+              <w:t xml:space="preserve">26.55，模拟峰值升至</w:t>
+            </w:r>
+            <w:r>
+              <w:t xml:space="preserve"> 166.84 </w:t>
+            </w:r>
+            <w:r>
+              <w:rPr>
+                <w:rFonts w:hint="eastAsia"/>
+              </w:rPr>
+              <w:t xml:space="preserve">美元/桶</w:t>
+            </w:r>
+          </w:p>
+        </w:tc>
+        <w:tc>
+          <w:tcPr/>
+          <w:p>
+            <w:pPr>
+              <w:pStyle w:val="Compact"/>
+              <w:jc w:val="left"/>
+            </w:pPr>
+            <w:r>
+              <w:rPr>
+                <w:rFonts w:hint="eastAsia"/>
+              </w:rPr>
+              <w:t xml:space="preserve">题面低弹性用于反事实上界，</w:t>
+            </w:r>
+            <m:oMath>
+              <m:r>
+                <m:t>ϕ</m:t>
+              </m:r>
+            </m:oMath>
+            <w:r>
+              <w:t xml:space="preserve"> </w:t>
+            </w:r>
+            <w:r>
+              <w:rPr>
+                <w:rFonts w:hint="eastAsia"/>
+              </w:rPr>
+              <w:t xml:space="preserve">是期货市场折价传导参数</w:t>
+            </w:r>
+          </w:p>
+        </w:tc>
+      </w:tr>
+      <w:tr>
+        <w:tc>
+          <w:tcPr/>
+          <w:p>
+            <w:pPr>
+              <w:pStyle w:val="Compact"/>
+              <w:jc w:val="left"/>
+            </w:pPr>
+            <w:r>
+              <w:rPr>
+                <w:rFonts w:hint="eastAsia"/>
+              </w:rPr>
+              <w:t xml:space="preserve">是否参数过拟合</w:t>
+            </w:r>
+          </w:p>
+        </w:tc>
+        <w:tc>
+          <w:tcPr/>
+          <w:p>
+            <w:pPr>
+              <w:pStyle w:val="Compact"/>
+              <w:jc w:val="left"/>
+            </w:pPr>
+            <w:r>
+              <w:t xml:space="preserve">1000 </w:t>
+            </w:r>
+            <w:r>
+              <w:rPr>
+                <w:rFonts w:hint="eastAsia"/>
+              </w:rPr>
+              <w:t xml:space="preserve">组</w:t>
+            </w:r>
+            <w:r>
+              <w:t xml:space="preserve"> </w:t>
+            </w:r>
+            <m:oMath>
+              <m:r>
+                <m:rPr>
+                  <m:sty m:val="p"/>
+                </m:rPr>
+                <m:t>±</m:t>
+              </m:r>
+              <m:r>
+                <m:t>15</m:t>
+              </m:r>
+              <m:r>
+                <m:rPr>
+                  <m:sty m:val="p"/>
+                </m:rPr>
+                <m:t>%</m:t>
+              </m:r>
+            </m:oMath>
+            <w:r>
+              <w:t xml:space="preserve"> </w:t>
+            </w:r>
+            <w:r>
+              <w:rPr>
+                <w:rFonts w:hint="eastAsia"/>
+              </w:rPr>
+              <w:t xml:space="preserve">扰动和</w:t>
+            </w:r>
+            <w:r>
+              <w:t xml:space="preserve"> 800 </w:t>
+            </w:r>
+            <w:r>
+              <w:rPr>
+                <w:rFonts w:hint="eastAsia"/>
+              </w:rPr>
+              <w:t xml:space="preserve">组局部扰动</w:t>
+            </w:r>
+          </w:p>
+        </w:tc>
+        <w:tc>
+          <w:tcPr/>
+          <w:p>
+            <w:pPr>
+              <w:pStyle w:val="Compact"/>
+              <w:jc w:val="left"/>
+            </w:pPr>
+            <w:r>
+              <w:t xml:space="preserve">96.6% </w:t>
+            </w:r>
+            <w:r>
+              <w:rPr>
+                <w:rFonts w:hint="eastAsia"/>
+              </w:rPr>
+              <w:t xml:space="preserve">扰动样本峰值仍在</w:t>
+            </w:r>
+            <w:r>
+              <w:t xml:space="preserve"> 105–125 </w:t>
+            </w:r>
+            <w:r>
+              <w:rPr>
+                <w:rFonts w:hint="eastAsia"/>
+              </w:rPr>
+              <w:t xml:space="preserve">美元/桶，局部优秀率</w:t>
+            </w:r>
+            <w:r>
+              <w:t xml:space="preserve"> 99.4%</w:t>
+            </w:r>
+          </w:p>
+        </w:tc>
+        <w:tc>
+          <w:tcPr/>
+          <w:p>
+            <w:pPr>
+              <w:pStyle w:val="Compact"/>
+              <w:jc w:val="left"/>
+            </w:pPr>
+            <w:r>
+              <w:rPr>
+                <w:rFonts w:hint="eastAsia"/>
+              </w:rPr>
+              <w:t xml:space="preserve">价格平台不依赖唯一一组神奇参数</w:t>
+            </w:r>
+          </w:p>
+        </w:tc>
+      </w:tr>
+      <w:tr>
+        <w:tc>
+          <w:tcPr/>
+          <w:p>
+            <w:pPr>
+              <w:pStyle w:val="Compact"/>
+              <w:jc w:val="left"/>
+            </w:pPr>
+            <w:r>
+              <w:rPr>
+                <w:rFonts w:hint="eastAsia"/>
+              </w:rPr>
+              <w:t xml:space="preserve">长期是否只是三条点预测线</w:t>
+            </w:r>
+          </w:p>
+        </w:tc>
+        <w:tc>
+          <w:tcPr/>
+          <w:p>
+            <w:pPr>
+              <w:pStyle w:val="Compact"/>
+              <w:jc w:val="left"/>
+            </w:pPr>
+            <w:r>
+              <w:rPr>
+                <w:rFonts w:hint="eastAsia"/>
+              </w:rPr>
+              <w:t xml:space="preserve">蒙特卡洛</w:t>
+            </w:r>
+            <w:r>
+              <w:t xml:space="preserve"> 2000 </w:t>
+            </w:r>
+            <w:r>
+              <w:rPr>
+                <w:rFonts w:hint="eastAsia"/>
+              </w:rPr>
+              <w:t xml:space="preserve">条条件路径与三情景中心线对比</w:t>
+            </w:r>
+          </w:p>
+        </w:tc>
+        <w:tc>
+          <w:tcPr/>
+          <w:p>
+            <w:pPr>
+              <w:pStyle w:val="Compact"/>
+              <w:jc w:val="left"/>
+            </w:pPr>
+            <w:r>
+              <w:rPr>
+                <w:rFonts w:hint="eastAsia"/>
+              </w:rPr>
+              <w:t xml:space="preserve">第</w:t>
+            </w:r>
+            <w:r>
+              <w:t xml:space="preserve"> 180 </w:t>
+            </w:r>
+            <w:r>
+              <w:rPr>
+                <w:rFonts w:hint="eastAsia"/>
+              </w:rPr>
+              <w:t xml:space="preserve">天</w:t>
+            </w:r>
+            <w:r>
+              <w:t xml:space="preserve"> P05–P95 </w:t>
+            </w:r>
+            <w:r>
+              <w:rPr>
+                <w:rFonts w:hint="eastAsia"/>
+              </w:rPr>
+              <w:t xml:space="preserve">为</w:t>
+            </w:r>
+            <w:r>
+              <w:t xml:space="preserve"> 87.67–101.01 </w:t>
+            </w:r>
+            <w:r>
+              <w:rPr>
+                <w:rFonts w:hint="eastAsia"/>
+              </w:rPr>
+              <w:t xml:space="preserve">美元/桶，突破</w:t>
+            </w:r>
+            <w:r>
+              <w:t xml:space="preserve"> 120 </w:t>
+            </w:r>
+            <w:r>
+              <w:rPr>
+                <w:rFonts w:hint="eastAsia"/>
+              </w:rPr>
+              <w:t xml:space="preserve">概率约</w:t>
+            </w:r>
+            <w:r>
+              <w:t xml:space="preserve"> 4.6%</w:t>
+            </w:r>
+          </w:p>
+        </w:tc>
+        <w:tc>
+          <w:tcPr/>
+          <w:p>
+            <w:pPr>
+              <w:pStyle w:val="Compact"/>
+              <w:jc w:val="left"/>
+            </w:pPr>
+            <w:r>
+              <w:rPr>
+                <w:rFonts w:hint="eastAsia"/>
+              </w:rPr>
+              <w:t xml:space="preserve">长期结论应读作条件区间和尾部风险，而非精确日度预测</w:t>
+            </w:r>
+          </w:p>
+        </w:tc>
+      </w:tr>
+      <w:tr>
+        <w:tc>
+          <w:tcPr/>
+          <w:p>
+            <w:pPr>
+              <w:pStyle w:val="Compact"/>
+              <w:jc w:val="left"/>
+            </w:pPr>
+            <w:r>
+              <w:rPr>
+                <w:rFonts w:hint="eastAsia"/>
+              </w:rPr>
+              <w:t xml:space="preserve">长期制度风险是否任意托底</w:t>
+            </w:r>
+          </w:p>
+        </w:tc>
+        <w:tc>
+          <w:tcPr/>
+          <w:p>
+            <w:pPr>
+              <w:pStyle w:val="Compact"/>
+              <w:jc w:val="left"/>
+            </w:pPr>
+            <w:r>
+              <w:rPr>
+                <w:rFonts w:hint="eastAsia"/>
+              </w:rPr>
+              <w:t xml:space="preserve">将不确定性溢价减半或随时间强制衰减</w:t>
+            </w:r>
+          </w:p>
+        </w:tc>
+        <w:tc>
+          <w:tcPr/>
+          <w:p>
+            <w:pPr>
+              <w:pStyle w:val="Compact"/>
+              <w:jc w:val="left"/>
+            </w:pPr>
+            <w:r>
+              <w:rPr>
+                <w:rFonts w:hint="eastAsia"/>
+              </w:rPr>
+              <w:t xml:space="preserve">中性第</w:t>
+            </w:r>
+            <w:r>
+              <w:t xml:space="preserve"> 180 </w:t>
+            </w:r>
+            <w:r>
+              <w:rPr>
+                <w:rFonts w:hint="eastAsia"/>
+              </w:rPr>
+              <w:t xml:space="preserve">天降至</w:t>
+            </w:r>
+            <w:r>
+              <w:t xml:space="preserve"> 89.15 </w:t>
+            </w:r>
+            <w:r>
+              <w:rPr>
+                <w:rFonts w:hint="eastAsia"/>
+              </w:rPr>
+              <w:t xml:space="preserve">或</w:t>
+            </w:r>
+            <w:r>
+              <w:t xml:space="preserve"> 87.82 </w:t>
+            </w:r>
+            <w:r>
+              <w:rPr>
+                <w:rFonts w:hint="eastAsia"/>
+              </w:rPr>
+              <w:t xml:space="preserve">美元/桶，悲观仍保留</w:t>
+            </w:r>
+            <w:r>
+              <w:t xml:space="preserve"> 99.80–101.27 </w:t>
+            </w:r>
+            <w:r>
+              <w:rPr>
+                <w:rFonts w:hint="eastAsia"/>
+              </w:rPr>
+              <w:t xml:space="preserve">美元/桶压力</w:t>
+            </w:r>
+          </w:p>
+        </w:tc>
+        <w:tc>
+          <w:tcPr/>
+          <w:p>
+            <w:pPr>
+              <w:pStyle w:val="Compact"/>
+              <w:jc w:val="left"/>
+            </w:pPr>
+            <w:r>
+              <w:rPr>
+                <w:rFonts w:hint="eastAsia"/>
+              </w:rPr>
+              <w:t xml:space="preserve">制度风险影响长期平衡点，但悲观尾部仍来自多因素组合</w:t>
+            </w:r>
+          </w:p>
+        </w:tc>
+      </w:tr>
+    </w:tbl>
     <w:bookmarkEnd w:id="80"/>
-    <w:bookmarkStart w:id="89" w:name="天三情景预测"/>
+    <w:bookmarkEnd w:id="81"/>
+    <w:bookmarkEnd w:id="82"/>
+    <w:bookmarkStart w:id="95" w:name="天三情景预测"/>
     <w:p>
       <w:pPr>
         <w:pStyle w:val="Heading1"/>
@@ -13202,7 +14386,7 @@
         <w:t xml:space="preserve">天三情景预测</w:t>
       </w:r>
     </w:p>
-    <w:bookmarkStart w:id="81" w:name="情景设定"/>
+    <w:bookmarkStart w:id="83" w:name="情景设定"/>
     <w:p>
       <w:pPr>
         <w:pStyle w:val="Heading2"/>
@@ -15617,8 +16801,8 @@
         <w:t xml:space="preserve">释放受限、绕道能力偏低且制度风险溢价持续；中性情景则采用综合最优参数附近的中心设定。后续敏感性分析和蒙特卡洛抽样用于检验：当这些假设联合变化时，价格中心路径和尾部风险是否仍保持一致。</w:t>
       </w:r>
     </w:p>
-    <w:bookmarkEnd w:id="81"/>
-    <w:bookmarkStart w:id="88" w:name="预测结果"/>
+    <w:bookmarkEnd w:id="83"/>
+    <w:bookmarkStart w:id="94" w:name="预测结果"/>
     <w:p>
       <w:pPr>
         <w:pStyle w:val="Heading2"/>
@@ -16099,6 +17283,7 @@
         </w:tc>
       </w:tr>
     </w:tbl>
+    <w:bookmarkStart w:id="87" w:name="fig:long-term-fan"/>
     <w:p>
       <w:pPr>
         <w:pStyle w:val="CaptionedFigure"/>
@@ -16106,20 +17291,97 @@
       <w:r>
         <w:drawing>
           <wp:inline>
-            <wp:extent cx="5013960" cy="2757678"/>
+            <wp:extent cx="5013960" cy="2790377"/>
             <wp:effectExtent b="0" l="0" r="0" t="0"/>
-            <wp:docPr descr="" title="" id="83" name="Picture"/>
+            <wp:docPr descr="" title="" id="85" name="Picture"/>
             <a:graphic>
               <a:graphicData uri="http://schemas.openxmlformats.org/drawingml/2006/picture">
                 <pic:pic>
                   <pic:nvPicPr>
-                    <pic:cNvPr descr="短期拟合与长期预测总览.png" id="84" name="Picture"/>
+                    <pic:cNvPr descr="monte_carlo_price_fan.png" id="86" name="Picture"/>
                     <pic:cNvPicPr>
                       <a:picLocks noChangeArrowheads="1" noChangeAspect="1"/>
                     </pic:cNvPicPr>
                   </pic:nvPicPr>
                   <pic:blipFill>
-                    <a:blip r:embed="rId82"/>
+                    <a:blip r:embed="rId84"/>
+                    <a:stretch>
+                      <a:fillRect/>
+                    </a:stretch>
+                  </pic:blipFill>
+                  <pic:spPr bwMode="auto">
+                    <a:xfrm>
+                      <a:off x="0" y="0"/>
+                      <a:ext cx="5013960" cy="2790377"/>
+                    </a:xfrm>
+                    <a:prstGeom prst="rect">
+                      <a:avLst/>
+                    </a:prstGeom>
+                    <a:noFill/>
+                    <a:ln w="9525">
+                      <a:noFill/>
+                      <a:headEnd/>
+                      <a:tailEnd/>
+                    </a:ln>
+                  </pic:spPr>
+                </pic:pic>
+              </a:graphicData>
+            </a:graphic>
+          </wp:inline>
+        </w:drawing>
+      </w:r>
+    </w:p>
+    <w:p>
+      <w:pPr>
+        <w:pStyle w:val="ImageCaption"/>
+      </w:pPr>
+      <w:r>
+        <w:rPr>
+          <w:rFonts w:hint="eastAsia"/>
+        </w:rPr>
+        <w:t xml:space="preserve">长期情景预测主图：蒙特卡洛情景树价格扇形区间。深色区间为</w:t>
+      </w:r>
+      <w:r>
+        <w:t xml:space="preserve"> </w:t>
+      </w:r>
+      <w:r>
+        <w:rPr>
+          <w:rFonts w:hint="eastAsia"/>
+        </w:rPr>
+        <w:t xml:space="preserve">25%–75%，浅色区间为</w:t>
+      </w:r>
+      <w:r>
+        <w:t xml:space="preserve"> </w:t>
+      </w:r>
+      <w:r>
+        <w:rPr>
+          <w:rFonts w:hint="eastAsia"/>
+        </w:rPr>
+        <w:t xml:space="preserve">5%–95%。三情景中心路径应与该区间共同解读。</w:t>
+      </w:r>
+    </w:p>
+    <w:bookmarkEnd w:id="87"/>
+    <w:p>
+      <w:pPr>
+        <w:pStyle w:val="CaptionedFigure"/>
+      </w:pPr>
+      <w:r>
+        <w:drawing>
+          <wp:inline>
+            <wp:extent cx="5013960" cy="2757678"/>
+            <wp:effectExtent b="0" l="0" r="0" t="0"/>
+            <wp:docPr descr="" title="" id="89" name="Picture"/>
+            <a:graphic>
+              <a:graphicData uri="http://schemas.openxmlformats.org/drawingml/2006/picture">
+                <pic:pic>
+                  <pic:nvPicPr>
+                    <pic:cNvPr descr="短期拟合与长期预测总览.png" id="90" name="Picture"/>
+                    <pic:cNvPicPr>
+                      <a:picLocks noChangeArrowheads="1" noChangeAspect="1"/>
+                    </pic:cNvPicPr>
+                  </pic:nvPicPr>
+                  <pic:blipFill>
+                    <a:blip r:embed="rId88"/>
                     <a:stretch>
                       <a:fillRect/>
                     </a:stretch>
@@ -16650,6 +17912,101 @@
     </w:p>
     <w:p>
       <w:pPr>
+        <w:pStyle w:val="BodyText"/>
+      </w:pPr>
+      <w:r>
+        <w:rPr>
+          <w:rFonts w:hint="eastAsia"/>
+        </w:rPr>
+        <w:t xml:space="preserve">需要主动说明的是，中性第</w:t>
+      </w:r>
+      <w:r>
+        <w:t xml:space="preserve"> 180 </w:t>
+      </w:r>
+      <w:r>
+        <w:rPr>
+          <w:rFonts w:hint="eastAsia"/>
+        </w:rPr>
+        <w:t xml:space="preserve">天存在约</w:t>
+      </w:r>
+      <w:r>
+        <w:t xml:space="preserve"> 50 </w:t>
+      </w:r>
+      <w:r>
+        <w:rPr>
+          <w:rFonts w:hint="eastAsia"/>
+        </w:rPr>
+        <w:t xml:space="preserve">万桶/日的轻微供给过剩，但价格仍高于战前</w:t>
+      </w:r>
+      <w:r>
+        <w:t xml:space="preserve"> 75 </w:t>
+      </w:r>
+      <w:r>
+        <w:rPr>
+          <w:rFonts w:hint="eastAsia"/>
+        </w:rPr>
+        <w:t xml:space="preserve">美元/桶，并非供需项失效，而是模型中仍保留约</w:t>
+      </w:r>
+      <w:r>
+        <w:t xml:space="preserve"> 5.99 </w:t>
+      </w:r>
+      <w:r>
+        <w:rPr>
+          <w:rFonts w:hint="eastAsia"/>
+        </w:rPr>
+        <w:t xml:space="preserve">美元/桶的不确定性和制度风险溢价。该设定表示：即便物理缺口基本闭合，只要霍尔木兹封锁的制度状态没有完全解除，市场仍会对运输保险、航运安全、库存再补充和再次升级风险给出残余溢价。反驳性检验显示，若将不确定性溢价减半，中性第</w:t>
+      </w:r>
+      <w:r>
+        <w:t xml:space="preserve"> 180 </w:t>
+      </w:r>
+      <w:r>
+        <w:rPr>
+          <w:rFonts w:hint="eastAsia"/>
+        </w:rPr>
+        <w:t xml:space="preserve">天价格降至</w:t>
+      </w:r>
+      <w:r>
+        <w:t xml:space="preserve"> 89.15 </w:t>
+      </w:r>
+      <w:r>
+        <w:rPr>
+          <w:rFonts w:hint="eastAsia"/>
+        </w:rPr>
+        <w:t xml:space="preserve">美元/桶；若强制其随时间衰减，则降至</w:t>
+      </w:r>
+      <w:r>
+        <w:t xml:space="preserve"> 87.82 </w:t>
+      </w:r>
+      <w:r>
+        <w:rPr>
+          <w:rFonts w:hint="eastAsia"/>
+        </w:rPr>
+        <w:t xml:space="preserve">美元/桶。因此</w:t>
+      </w:r>
+      <w:r>
+        <w:t xml:space="preserve"> 92.43 </w:t>
+      </w:r>
+      <w:r>
+        <w:rPr>
+          <w:rFonts w:hint="eastAsia"/>
+        </w:rPr>
+        <w:t xml:space="preserve">美元/桶不是模型声称的唯一真实价格，而是</w:t>
+      </w:r>
+      <w:r>
+        <w:rPr>
+          <w:rFonts w:hint="eastAsia"/>
+        </w:rPr>
+        <w:t xml:space="preserve">“物理缺口闭合但制度风险尚未完全消失”</w:t>
+      </w:r>
+      <w:r>
+        <w:rPr>
+          <w:rFonts w:hint="eastAsia"/>
+        </w:rPr>
+        <w:t xml:space="preserve">条件下的中心路径。</w:t>
+      </w:r>
+    </w:p>
+    <w:p>
+      <w:pPr>
         <w:pStyle w:val="CaptionedFigure"/>
       </w:pPr>
       <w:r>
@@ -16657,18 +18014,18 @@
           <wp:inline>
             <wp:extent cx="4907280" cy="3413760"/>
             <wp:effectExtent b="0" l="0" r="0" t="0"/>
-            <wp:docPr descr="" title="" id="86" name="Picture"/>
+            <wp:docPr descr="" title="" id="92" name="Picture"/>
             <a:graphic>
               <a:graphicData uri="http://schemas.openxmlformats.org/drawingml/2006/picture">
                 <pic:pic>
                   <pic:nvPicPr>
-                    <pic:cNvPr descr="inventory_depletion_risk.png" id="87" name="Picture"/>
+                    <pic:cNvPr descr="inventory_depletion_risk.png" id="93" name="Picture"/>
                     <pic:cNvPicPr>
                       <a:picLocks noChangeArrowheads="1" noChangeAspect="1"/>
                     </pic:cNvPicPr>
                   </pic:nvPicPr>
                   <pic:blipFill>
-                    <a:blip r:embed="rId85"/>
+                    <a:blip r:embed="rId91"/>
                     <a:stretch>
                       <a:fillRect/>
                     </a:stretch>
@@ -16706,9 +18063,9 @@
         <w:t xml:space="preserve">商业库存剩余量与剩余供需缺口变化。悲观情景下缓冲能力下降，二次跳涨风险上升。</w:t>
       </w:r>
     </w:p>
-    <w:bookmarkEnd w:id="88"/>
-    <w:bookmarkEnd w:id="89"/>
-    <w:bookmarkStart w:id="116" w:name="敏感性分析"/>
+    <w:bookmarkEnd w:id="94"/>
+    <w:bookmarkEnd w:id="95"/>
+    <w:bookmarkStart w:id="119" w:name="敏感性分析"/>
     <w:p>
       <w:pPr>
         <w:pStyle w:val="Heading1"/>
@@ -16720,7 +18077,7 @@
         <w:t xml:space="preserve">敏感性分析</w:t>
       </w:r>
     </w:p>
-    <w:bookmarkStart w:id="90" w:name="分析方法"/>
+    <w:bookmarkStart w:id="96" w:name="分析方法"/>
     <w:p>
       <w:pPr>
         <w:pStyle w:val="Heading2"/>
@@ -16989,8 +18346,8 @@
         <w:t xml:space="preserve">天剩余缺口波动范围。该指标兼顾终点价格、阶段峰值和供需风险。</w:t>
       </w:r>
     </w:p>
-    <w:bookmarkEnd w:id="90"/>
-    <w:bookmarkStart w:id="94" w:name="参数重要性排序"/>
+    <w:bookmarkEnd w:id="96"/>
+    <w:bookmarkStart w:id="100" w:name="参数重要性排序"/>
     <w:p>
       <w:pPr>
         <w:pStyle w:val="Heading2"/>
@@ -18033,18 +19390,18 @@
           <wp:inline>
             <wp:extent cx="4907280" cy="2998893"/>
             <wp:effectExtent b="0" l="0" r="0" t="0"/>
-            <wp:docPr descr="" title="" id="92" name="Picture"/>
+            <wp:docPr descr="" title="" id="98" name="Picture"/>
             <a:graphic>
               <a:graphicData uri="http://schemas.openxmlformats.org/drawingml/2006/picture">
                 <pic:pic>
                   <pic:nvPicPr>
-                    <pic:cNvPr descr="sensitivity_tornado_180day.png" id="93" name="Picture"/>
+                    <pic:cNvPr descr="sensitivity_tornado_180day.png" id="99" name="Picture"/>
                     <pic:cNvPicPr>
                       <a:picLocks noChangeArrowheads="1" noChangeAspect="1"/>
                     </pic:cNvPicPr>
                   </pic:nvPicPr>
                   <pic:blipFill>
-                    <a:blip r:embed="rId91"/>
+                    <a:blip r:embed="rId97"/>
                     <a:stretch>
                       <a:fillRect/>
                     </a:stretch>
@@ -18153,8 +19510,8 @@
         <w:t xml:space="preserve">的政策缓冲变量。</w:t>
       </w:r>
     </w:p>
-    <w:bookmarkEnd w:id="94"/>
-    <w:bookmarkStart w:id="101" w:name="sec:monte-carlo"/>
+    <w:bookmarkEnd w:id="100"/>
+    <w:bookmarkStart w:id="104" w:name="sec:monte-carlo"/>
     <w:p>
       <w:pPr>
         <w:pStyle w:val="Heading2"/>
@@ -18660,90 +20017,20 @@
       <w:r>
         <w:drawing>
           <wp:inline>
-            <wp:extent cx="5013960" cy="2790377"/>
+            <wp:extent cx="4160520" cy="2352876"/>
             <wp:effectExtent b="0" l="0" r="0" t="0"/>
-            <wp:docPr descr="" title="" id="96" name="Picture"/>
+            <wp:docPr descr="" title="" id="102" name="Picture"/>
             <a:graphic>
               <a:graphicData uri="http://schemas.openxmlformats.org/drawingml/2006/picture">
                 <pic:pic>
                   <pic:nvPicPr>
-                    <pic:cNvPr descr="monte_carlo_price_fan.png" id="97" name="Picture"/>
+                    <pic:cNvPr descr="monte_carlo_tail_risk.png" id="103" name="Picture"/>
                     <pic:cNvPicPr>
                       <a:picLocks noChangeArrowheads="1" noChangeAspect="1"/>
                     </pic:cNvPicPr>
                   </pic:nvPicPr>
                   <pic:blipFill>
-                    <a:blip r:embed="rId95"/>
-                    <a:stretch>
-                      <a:fillRect/>
-                    </a:stretch>
-                  </pic:blipFill>
-                  <pic:spPr bwMode="auto">
-                    <a:xfrm>
-                      <a:off x="0" y="0"/>
-                      <a:ext cx="5013960" cy="2790377"/>
-                    </a:xfrm>
-                    <a:prstGeom prst="rect">
-                      <a:avLst/>
-                    </a:prstGeom>
-                    <a:noFill/>
-                    <a:ln w="9525">
-                      <a:noFill/>
-                      <a:headEnd/>
-                      <a:tailEnd/>
-                    </a:ln>
-                  </pic:spPr>
-                </pic:pic>
-              </a:graphicData>
-            </a:graphic>
-          </wp:inline>
-        </w:drawing>
-      </w:r>
-    </w:p>
-    <w:p>
-      <w:pPr>
-        <w:pStyle w:val="ImageCaption"/>
-      </w:pPr>
-      <w:r>
-        <w:rPr>
-          <w:rFonts w:hint="eastAsia"/>
-        </w:rPr>
-        <w:t xml:space="preserve">蒙特卡洛情景树价格扇形区间。深色区间为</w:t>
-      </w:r>
-      <w:r>
-        <w:t xml:space="preserve"> </w:t>
-      </w:r>
-      <w:r>
-        <w:rPr>
-          <w:rFonts w:hint="eastAsia"/>
-        </w:rPr>
-        <w:t xml:space="preserve">25%–75%，浅色区间为</w:t>
-      </w:r>
-      <w:r>
-        <w:t xml:space="preserve"> 5%–95%。</w:t>
-      </w:r>
-    </w:p>
-    <w:p>
-      <w:pPr>
-        <w:pStyle w:val="CaptionedFigure"/>
-      </w:pPr>
-      <w:r>
-        <w:drawing>
-          <wp:inline>
-            <wp:extent cx="4160520" cy="2352876"/>
-            <wp:effectExtent b="0" l="0" r="0" t="0"/>
-            <wp:docPr descr="" title="" id="99" name="Picture"/>
-            <a:graphic>
-              <a:graphicData uri="http://schemas.openxmlformats.org/drawingml/2006/picture">
-                <pic:pic>
-                  <pic:nvPicPr>
-                    <pic:cNvPr descr="monte_carlo_tail_risk.png" id="100" name="Picture"/>
-                    <pic:cNvPicPr>
-                      <a:picLocks noChangeArrowheads="1" noChangeAspect="1"/>
-                    </pic:cNvPicPr>
-                  </pic:nvPicPr>
-                  <pic:blipFill>
-                    <a:blip r:embed="rId98"/>
+                    <a:blip r:embed="rId101"/>
                     <a:stretch>
                       <a:fillRect/>
                     </a:stretch>
@@ -18855,8 +20142,8 @@
         <w:t xml:space="preserve">21.1%。这说明长期风险的重点不是中性点预测本身，而是多因素联动恶化下的尾部组合风险。</w:t>
       </w:r>
     </w:p>
-    <w:bookmarkEnd w:id="101"/>
-    <w:bookmarkStart w:id="108" w:name="滞后地缘风险指数审计"/>
+    <w:bookmarkEnd w:id="104"/>
+    <w:bookmarkStart w:id="111" w:name="滞后地缘风险指数审计"/>
     <w:p>
       <w:pPr>
         <w:pStyle w:val="Heading2"/>
@@ -19375,18 +20662,18 @@
           <wp:inline>
             <wp:extent cx="4907280" cy="2628899"/>
             <wp:effectExtent b="0" l="0" r="0" t="0"/>
-            <wp:docPr descr="" title="" id="103" name="Picture"/>
+            <wp:docPr descr="" title="" id="106" name="Picture"/>
             <a:graphic>
               <a:graphicData uri="http://schemas.openxmlformats.org/drawingml/2006/picture">
                 <pic:pic>
                   <pic:nvPicPr>
-                    <pic:cNvPr descr="gpr_event_window_audit.png" id="104" name="Picture"/>
+                    <pic:cNvPr descr="gpr_event_window_audit.png" id="107" name="Picture"/>
                     <pic:cNvPicPr>
                       <a:picLocks noChangeArrowheads="1" noChangeAspect="1"/>
                     </pic:cNvPicPr>
                   </pic:nvPicPr>
                   <pic:blipFill>
-                    <a:blip r:embed="rId102"/>
+                    <a:blip r:embed="rId105"/>
                     <a:stretch>
                       <a:fillRect/>
                     </a:stretch>
@@ -19487,18 +20774,18 @@
           <wp:inline>
             <wp:extent cx="4480560" cy="3054927"/>
             <wp:effectExtent b="0" l="0" r="0" t="0"/>
-            <wp:docPr descr="" title="" id="106" name="Picture"/>
+            <wp:docPr descr="" title="" id="109" name="Picture"/>
             <a:graphic>
               <a:graphicData uri="http://schemas.openxmlformats.org/drawingml/2006/picture">
                 <pic:pic>
                   <pic:nvPicPr>
-                    <pic:cNvPr descr="lagged_gpr_brent_return.png" id="107" name="Picture"/>
+                    <pic:cNvPr descr="lagged_gpr_brent_return.png" id="110" name="Picture"/>
                     <pic:cNvPicPr>
                       <a:picLocks noChangeArrowheads="1" noChangeAspect="1"/>
                     </pic:cNvPicPr>
                   </pic:nvPicPr>
                   <pic:blipFill>
-                    <a:blip r:embed="rId105"/>
+                    <a:blip r:embed="rId108"/>
                     <a:stretch>
                       <a:fillRect/>
                     </a:stretch>
@@ -19622,8 +20909,8 @@
         <w:t xml:space="preserve">。这使模型在风险解释和内生性防御之间保持较稳妥的边界。</w:t>
       </w:r>
     </w:p>
-    <w:bookmarkEnd w:id="108"/>
-    <w:bookmarkStart w:id="115" w:name="历史样本稳健性检验"/>
+    <w:bookmarkEnd w:id="111"/>
+    <w:bookmarkStart w:id="118" w:name="历史样本稳健性检验"/>
     <w:p>
       <w:pPr>
         <w:pStyle w:val="Heading2"/>
@@ -20200,18 +21487,18 @@
           <wp:inline>
             <wp:extent cx="4907280" cy="2685115"/>
             <wp:effectExtent b="0" l="0" r="0" t="0"/>
-            <wp:docPr descr="" title="" id="110" name="Picture"/>
+            <wp:docPr descr="" title="" id="113" name="Picture"/>
             <a:graphic>
               <a:graphicData uri="http://schemas.openxmlformats.org/drawingml/2006/picture">
                 <pic:pic>
                   <pic:nvPicPr>
-                    <pic:cNvPr descr="historical_event_extremeness.png" id="111" name="Picture"/>
+                    <pic:cNvPr descr="historical_event_extremeness.png" id="114" name="Picture"/>
                     <pic:cNvPicPr>
                       <a:picLocks noChangeArrowheads="1" noChangeAspect="1"/>
                     </pic:cNvPicPr>
                   </pic:nvPicPr>
                   <pic:blipFill>
-                    <a:blip r:embed="rId109"/>
+                    <a:blip r:embed="rId112"/>
                     <a:stretch>
                       <a:fillRect/>
                     </a:stretch>
@@ -20261,18 +21548,18 @@
           <wp:inline>
             <wp:extent cx="4693920" cy="2669091"/>
             <wp:effectExtent b="0" l="0" r="0" t="0"/>
-            <wp:docPr descr="" title="" id="113" name="Picture"/>
+            <wp:docPr descr="" title="" id="116" name="Picture"/>
             <a:graphic>
               <a:graphicData uri="http://schemas.openxmlformats.org/drawingml/2006/picture">
                 <pic:pic>
                   <pic:nvPicPr>
-                    <pic:cNvPr descr="historical_baseline_error_distribution.png" id="114" name="Picture"/>
+                    <pic:cNvPr descr="historical_baseline_error_distribution.png" id="117" name="Picture"/>
                     <pic:cNvPicPr>
                       <a:picLocks noChangeArrowheads="1" noChangeAspect="1"/>
                     </pic:cNvPicPr>
                   </pic:nvPicPr>
                   <pic:blipFill>
-                    <a:blip r:embed="rId112"/>
+                    <a:blip r:embed="rId115"/>
                     <a:stretch>
                       <a:fillRect/>
                     </a:stretch>
@@ -20375,9 +21662,9 @@
         <w:t xml:space="preserve">检验也支持这一点：收盘价水平和对数价格均不能拒绝单位根，而对数收益率可拒绝单位根，因此普通统计基准更适合在收益率或差分口径下使用。</w:t>
       </w:r>
     </w:p>
-    <w:bookmarkEnd w:id="115"/>
-    <w:bookmarkEnd w:id="116"/>
-    <w:bookmarkStart w:id="120" w:name="模型评价"/>
+    <w:bookmarkEnd w:id="118"/>
+    <w:bookmarkEnd w:id="119"/>
+    <w:bookmarkStart w:id="123" w:name="模型评价"/>
     <w:p>
       <w:pPr>
         <w:pStyle w:val="Heading1"/>
@@ -20389,7 +21676,7 @@
         <w:t xml:space="preserve">模型评价</w:t>
       </w:r>
     </w:p>
-    <w:bookmarkStart w:id="117" w:name="优点"/>
+    <w:bookmarkStart w:id="120" w:name="优点"/>
     <w:p>
       <w:pPr>
         <w:pStyle w:val="Heading2"/>
@@ -20516,8 +21803,8 @@
         <w:t xml:space="preserve">长期表述审慎：三情景中心线与蒙特卡洛扇形区间合读，把长期结果定位为条件中心路径和尾部风险，而非精确日度点预测。</w:t>
       </w:r>
     </w:p>
-    <w:bookmarkEnd w:id="117"/>
-    <w:bookmarkStart w:id="118" w:name="局限性"/>
+    <w:bookmarkEnd w:id="120"/>
+    <w:bookmarkStart w:id="121" w:name="局限性"/>
     <w:p>
       <w:pPr>
         <w:pStyle w:val="Heading2"/>
@@ -20616,8 +21903,8 @@
         <w:t xml:space="preserve">蒙特卡洛情景树已经刻画了部分参数联动风险，但其联合分布仍来自模型设定而非外部历史频率估计，因此尾部概率应解释为条件概率而非真实市场概率。</w:t>
       </w:r>
     </w:p>
-    <w:bookmarkEnd w:id="118"/>
-    <w:bookmarkStart w:id="119" w:name="改进方向"/>
+    <w:bookmarkEnd w:id="121"/>
+    <w:bookmarkStart w:id="122" w:name="改进方向"/>
     <w:p>
       <w:pPr>
         <w:pStyle w:val="Heading2"/>
@@ -20703,9 +21990,9 @@
         <w:t xml:space="preserve">多智能体仿真则只有在获得主体级行为数据时才有必要进入主线。</w:t>
       </w:r>
     </w:p>
-    <w:bookmarkEnd w:id="119"/>
-    <w:bookmarkEnd w:id="120"/>
-    <w:bookmarkStart w:id="121" w:name="结论"/>
+    <w:bookmarkEnd w:id="122"/>
+    <w:bookmarkEnd w:id="123"/>
+    <w:bookmarkStart w:id="124" w:name="结论"/>
     <w:p>
       <w:pPr>
         <w:pStyle w:val="Heading1"/>
@@ -21091,8 +22378,8 @@
         <w:t xml:space="preserve">不足、绕道恢复缓慢和制度风险溢价持续时形成的尾部组合。</w:t>
       </w:r>
     </w:p>
-    <w:bookmarkEnd w:id="121"/>
-    <w:bookmarkStart w:id="122" w:name="附录支撑材料说明"/>
+    <w:bookmarkEnd w:id="124"/>
+    <w:bookmarkStart w:id="125" w:name="附录支撑材料说明"/>
     <w:p>
       <w:pPr>
         <w:pStyle w:val="Heading1"/>
@@ -21206,8 +22493,8 @@
         <w:t xml:space="preserve">。</w:t>
       </w:r>
     </w:p>
-    <w:bookmarkEnd w:id="122"/>
-    <w:bookmarkStart w:id="126" w:name="参考文献"/>
+    <w:bookmarkEnd w:id="125"/>
+    <w:bookmarkStart w:id="129" w:name="参考文献"/>
     <w:p>
       <w:pPr>
         <w:pStyle w:val="Heading1"/>
@@ -21418,7 +22705,7 @@
       <w:r>
         <w:t xml:space="preserve"> </w:t>
       </w:r>
-      <w:hyperlink r:id="rId123">
+      <w:hyperlink r:id="rId126">
         <w:r>
           <w:rPr>
             <w:rStyle w:val="Hyperlink"/>
@@ -21440,7 +22727,7 @@
       <w:r>
         <w:t xml:space="preserve"> </w:t>
       </w:r>
-      <w:hyperlink r:id="rId124">
+      <w:hyperlink r:id="rId127">
         <w:r>
           <w:rPr>
             <w:rStyle w:val="Hyperlink"/>
@@ -21462,7 +22749,7 @@
       <w:r>
         <w:t xml:space="preserve"> </w:t>
       </w:r>
-      <w:hyperlink r:id="rId125">
+      <w:hyperlink r:id="rId128">
         <w:r>
           <w:rPr>
             <w:rStyle w:val="Hyperlink"/>
@@ -21474,7 +22761,7 @@
         <w:t xml:space="preserve">.</w:t>
       </w:r>
     </w:p>
-    <w:bookmarkEnd w:id="126"/>
+    <w:bookmarkEnd w:id="129"/>
     <w:sectPr>
       <w:footnotePr>
         <w:numRestart w:val="eachSect"/>

</xml_diff>

<commit_message>
Polish final paper evidence and figures
</commit_message>
<xml_diff>
--- a/output/final/总论文.docx
+++ b/output/final/总论文.docx
@@ -402,10 +402,10 @@
         <w:rPr>
           <w:rFonts w:hint="eastAsia"/>
         </w:rPr>
-        <w:t xml:space="preserve">美元/桶，且仍保留二次跳涨风险。敏感性分析表明，地缘风险权重、不确定性与制度风险强度、制度风险占比是综合敏感度最高的三个因素；进一步的</w:t>
-      </w:r>
-      <w:r>
-        <w:t xml:space="preserve"> 2000 </w:t>
+        <w:t xml:space="preserve">美元/桶，且仍保留二次跳涨风险。敏感性分析表明，地缘风险权重、不确定性与制度风险强度、制度风险占比是综合敏感度最高的三个因素；2000</w:t>
+      </w:r>
+      <w:r>
+        <w:t xml:space="preserve"> </w:t>
       </w:r>
       <w:r>
         <w:rPr>
@@ -429,16 +429,52 @@
         <w:rPr>
           <w:rFonts w:hint="eastAsia"/>
         </w:rPr>
-        <w:t xml:space="preserve">4.6%，突破</w:t>
-      </w:r>
-      <w:r>
-        <w:t xml:space="preserve"> 130 </w:t>
-      </w:r>
-      <w:r>
-        <w:rPr>
-          <w:rFonts w:hint="eastAsia"/>
-        </w:rPr>
-        <w:t xml:space="preserve">美元/桶的概率约为</w:t>
+        <w:t xml:space="preserve">4.6%。为避免长期中性线被误读为逐日精确预测，本文又引入缓和、维持、升级三状态转移扰动，得到第</w:t>
+      </w:r>
+      <w:r>
+        <w:t xml:space="preserve"> 180 </w:t>
+      </w:r>
+      <w:r>
+        <w:rPr>
+          <w:rFonts w:hint="eastAsia"/>
+        </w:rPr>
+        <w:t xml:space="preserve">天</w:t>
+      </w:r>
+      <w:r>
+        <w:t xml:space="preserve"> 5%–95% </w:t>
+      </w:r>
+      <w:r>
+        <w:rPr>
+          <w:rFonts w:hint="eastAsia"/>
+        </w:rPr>
+        <w:t xml:space="preserve">条件区间</w:t>
+      </w:r>
+      <w:r>
+        <w:t xml:space="preserve"> 85.43–93.99 </w:t>
+      </w:r>
+      <w:r>
+        <w:rPr>
+          <w:rFonts w:hint="eastAsia"/>
+        </w:rPr>
+        <w:t xml:space="preserve">美元/桶，外推期最高价</w:t>
+      </w:r>
+      <w:r>
+        <w:t xml:space="preserve"> P95 </w:t>
+      </w:r>
+      <w:r>
+        <w:rPr>
+          <w:rFonts w:hint="eastAsia"/>
+        </w:rPr>
+        <w:t xml:space="preserve">为</w:t>
+      </w:r>
+      <w:r>
+        <w:t xml:space="preserve"> 124.61 </w:t>
+      </w:r>
+      <w:r>
+        <w:rPr>
+          <w:rFonts w:hint="eastAsia"/>
+        </w:rPr>
+        <w:t xml:space="preserve">美元/桶。GPR</w:t>
       </w:r>
       <w:r>
         <w:t xml:space="preserve"> </w:t>
@@ -447,43 +483,16 @@
         <w:rPr>
           <w:rFonts w:hint="eastAsia"/>
         </w:rPr>
-        <w:t xml:space="preserve">0.0%。此外，Caldara-Iacoviello</w:t>
-      </w:r>
-      <w:r>
-        <w:t xml:space="preserve"> GPR </w:t>
-      </w:r>
-      <w:r>
-        <w:rPr>
-          <w:rFonts w:hint="eastAsia"/>
-        </w:rPr>
-        <w:t xml:space="preserve">指数显示</w:t>
-      </w:r>
-      <w:r>
-        <w:t xml:space="preserve"> 2026 </w:t>
-      </w:r>
-      <w:r>
-        <w:rPr>
-          <w:rFonts w:hint="eastAsia"/>
-        </w:rPr>
-        <w:t xml:space="preserve">年</w:t>
-      </w:r>
-      <w:r>
-        <w:t xml:space="preserve"> 3 </w:t>
-      </w:r>
-      <w:r>
-        <w:rPr>
-          <w:rFonts w:hint="eastAsia"/>
-        </w:rPr>
-        <w:t xml:space="preserve">月和</w:t>
-      </w:r>
-      <w:r>
-        <w:t xml:space="preserve"> 4 </w:t>
-      </w:r>
-      <w:r>
-        <w:rPr>
-          <w:rFonts w:hint="eastAsia"/>
-        </w:rPr>
-        <w:t xml:space="preserve">月地缘风险处于历史高分位，但滞后检验表明其不宜作为同月拟合输入。2017–2026</w:t>
+        <w:t xml:space="preserve">滞后审计和</w:t>
+      </w:r>
+      <w:r>
+        <w:t xml:space="preserve"> 2017–2026 </w:t>
+      </w:r>
+      <w:r>
+        <w:rPr>
+          <w:rFonts w:hint="eastAsia"/>
+        </w:rPr>
+        <w:t xml:space="preserve">年历史同长度窗口检验进一步说明：2026</w:t>
       </w:r>
       <w:r>
         <w:t xml:space="preserve"> </w:t>
@@ -492,43 +501,7 @@
         <w:rPr>
           <w:rFonts w:hint="eastAsia"/>
         </w:rPr>
-        <w:t xml:space="preserve">年同长度滚动窗口检验进一步显示，2026</w:t>
-      </w:r>
-      <w:r>
-        <w:t xml:space="preserve"> </w:t>
-      </w:r>
-      <w:r>
-        <w:rPr>
-          <w:rFonts w:hint="eastAsia"/>
-        </w:rPr>
-        <w:t xml:space="preserve">冲突窗口累计收益率处于历史约</w:t>
-      </w:r>
-      <w:r>
-        <w:t xml:space="preserve"> 99.3% </w:t>
-      </w:r>
-      <w:r>
-        <w:rPr>
-          <w:rFonts w:hint="eastAsia"/>
-        </w:rPr>
-        <w:t xml:space="preserve">分位、实现波动率处于约</w:t>
-      </w:r>
-      <w:r>
-        <w:t xml:space="preserve"> 95.7% </w:t>
-      </w:r>
-      <w:r>
-        <w:rPr>
-          <w:rFonts w:hint="eastAsia"/>
-        </w:rPr>
-        <w:t xml:space="preserve">分位，说明该窗口对普通时间序列基准显著更难。本文据此将</w:t>
-      </w:r>
-      <w:r>
-        <w:t xml:space="preserve"> GPR </w:t>
-      </w:r>
-      <w:r>
-        <w:rPr>
-          <w:rFonts w:hint="eastAsia"/>
-        </w:rPr>
-        <w:t xml:space="preserve">和历史样本定位为外部审计证据，而非短期点预测因子。</w:t>
+        <w:t xml:space="preserve">冲突窗口具有罕见地缘风险和高波动特征，但外部风险指标只作为审计证据，不作为短期同月拟合因子。</w:t>
       </w:r>
     </w:p>
     <w:p>
@@ -889,7 +862,7 @@
       </w:tr>
     </w:tbl>
     <w:bookmarkEnd w:id="9"/>
-    <w:bookmarkStart w:id="14" w:name="问题分析与总体思路"/>
+    <w:bookmarkStart w:id="15" w:name="问题分析与总体思路"/>
     <w:p>
       <w:pPr>
         <w:pStyle w:val="Heading1"/>
@@ -1381,8 +1354,635 @@
       </w:tr>
     </w:tbl>
     <w:bookmarkEnd w:id="13"/>
+    <w:bookmarkStart w:id="14" w:name="文献依据与建模约束"/>
+    <w:p>
+      <w:pPr>
+        <w:pStyle w:val="Heading2"/>
+      </w:pPr>
+      <w:r>
+        <w:rPr>
+          <w:rFonts w:hint="eastAsia"/>
+        </w:rPr>
+        <w:t xml:space="preserve">文献依据与建模约束</w:t>
+      </w:r>
+    </w:p>
+    <w:p>
+      <w:pPr>
+        <w:pStyle w:val="FirstParagraph"/>
+      </w:pPr>
+      <w:r>
+        <w:rPr>
+          <w:rFonts w:hint="eastAsia"/>
+        </w:rPr>
+        <w:t xml:space="preserve">为避免模型显得像</w:t>
+      </w:r>
+      <w:r>
+        <w:rPr>
+          <w:rFonts w:hint="eastAsia"/>
+        </w:rPr>
+        <w:t xml:space="preserve">“为了拟合而临时拼接”</w:t>
+      </w:r>
+      <w:r>
+        <w:rPr>
+          <w:rFonts w:hint="eastAsia"/>
+        </w:rPr>
+        <w:t xml:space="preserve">，本文将文献调研转化为可执行的建模约束。Kilian（2009）和</w:t>
+      </w:r>
+      <w:r>
+        <w:t xml:space="preserve"> </w:t>
+      </w:r>
+      <w:r>
+        <w:rPr>
+          <w:rFonts w:hint="eastAsia"/>
+        </w:rPr>
+        <w:t xml:space="preserve">Hamilton（2009）表明，油价冲击不能只由当期供应缺口解释，还需要区分供给、需求、预防性需求和宏观环境；Kilian</w:t>
+      </w:r>
+      <w:r>
+        <w:t xml:space="preserve"> </w:t>
+      </w:r>
+      <w:r>
+        <w:rPr>
+          <w:rFonts w:hint="eastAsia"/>
+        </w:rPr>
+        <w:t xml:space="preserve">与</w:t>
+      </w:r>
+      <w:r>
+        <w:t xml:space="preserve"> </w:t>
+      </w:r>
+      <w:r>
+        <w:rPr>
+          <w:rFonts w:hint="eastAsia"/>
+        </w:rPr>
+        <w:t xml:space="preserve">Murphy（2014）进一步说明库存和投机性需求会影响油价路径。因此，本文将传统供需模型定位为低弹性反事实上界，而不是最终预测模型。</w:t>
+      </w:r>
+    </w:p>
+    <w:p>
+      <w:pPr>
+        <w:pStyle w:val="BodyText"/>
+      </w:pPr>
+      <w:r>
+        <w:rPr>
+          <w:rFonts w:hint="eastAsia"/>
+        </w:rPr>
+        <w:t xml:space="preserve">在预测评价方面，Alquist</w:t>
+      </w:r>
+      <w:r>
+        <w:t xml:space="preserve"> </w:t>
+      </w:r>
+      <w:r>
+        <w:rPr>
+          <w:rFonts w:hint="eastAsia"/>
+        </w:rPr>
+        <w:t xml:space="preserve">与</w:t>
+      </w:r>
+      <w:r>
+        <w:t xml:space="preserve"> </w:t>
+      </w:r>
+      <w:r>
+        <w:rPr>
+          <w:rFonts w:hint="eastAsia"/>
+        </w:rPr>
+        <w:t xml:space="preserve">Kilian（2010）以及</w:t>
+      </w:r>
+      <w:r>
+        <w:t xml:space="preserve"> Alquist、Kilian </w:t>
+      </w:r>
+      <w:r>
+        <w:rPr>
+          <w:rFonts w:hint="eastAsia"/>
+        </w:rPr>
+        <w:t xml:space="preserve">与</w:t>
+      </w:r>
+      <w:r>
+        <w:t xml:space="preserve"> </w:t>
+      </w:r>
+      <w:r>
+        <w:rPr>
+          <w:rFonts w:hint="eastAsia"/>
+        </w:rPr>
+        <w:t xml:space="preserve">Vigfusson（2013）指出，原油价格预测必须与无变化预测、随机游走等强基准比较，并明确预测期限和不确定性边界。因此，本文在短期部分设置上一日价格朴素基准、漂移随机游走和滚动</w:t>
+      </w:r>
+      <w:r>
+        <w:t xml:space="preserve"> </w:t>
+      </w:r>
+      <w:r>
+        <w:rPr>
+          <w:rFonts w:hint="eastAsia"/>
+        </w:rPr>
+        <w:t xml:space="preserve">ARIMA；在长期部分不把中性线写成逐日真实价格预测，而是同时给出三情景中心路径、蒙特卡洛扇形区间和状态转移尾部风险。</w:t>
+      </w:r>
+    </w:p>
+    <w:p>
+      <w:pPr>
+        <w:pStyle w:val="BodyText"/>
+      </w:pPr>
+      <w:r>
+        <w:rPr>
+          <w:rFonts w:hint="eastAsia"/>
+        </w:rPr>
+        <w:t xml:space="preserve">在政策缓冲方面，Newell</w:t>
+      </w:r>
+      <w:r>
+        <w:t xml:space="preserve"> </w:t>
+      </w:r>
+      <w:r>
+        <w:rPr>
+          <w:rFonts w:hint="eastAsia"/>
+        </w:rPr>
+        <w:t xml:space="preserve">与</w:t>
+      </w:r>
+      <w:r>
+        <w:t xml:space="preserve"> </w:t>
+      </w:r>
+      <w:r>
+        <w:rPr>
+          <w:rFonts w:hint="eastAsia"/>
+        </w:rPr>
+        <w:t xml:space="preserve">Prest（2017）、Kilian</w:t>
+      </w:r>
+      <w:r>
+        <w:t xml:space="preserve"> </w:t>
+      </w:r>
+      <w:r>
+        <w:rPr>
+          <w:rFonts w:hint="eastAsia"/>
+        </w:rPr>
+        <w:t xml:space="preserve">与</w:t>
+      </w:r>
+      <w:r>
+        <w:t xml:space="preserve"> </w:t>
+      </w:r>
+      <w:r>
+        <w:rPr>
+          <w:rFonts w:hint="eastAsia"/>
+        </w:rPr>
+        <w:t xml:space="preserve">Zhou（2019）和</w:t>
+      </w:r>
+      <w:r>
+        <w:t xml:space="preserve"> Stevens </w:t>
+      </w:r>
+      <w:r>
+        <w:rPr>
+          <w:rFonts w:hint="eastAsia"/>
+        </w:rPr>
+        <w:t xml:space="preserve">与</w:t>
+      </w:r>
+      <w:r>
+        <w:t xml:space="preserve"> </w:t>
+      </w:r>
+      <w:r>
+        <w:rPr>
+          <w:rFonts w:hint="eastAsia"/>
+        </w:rPr>
+        <w:t xml:space="preserve">Zhang（2021）均表明，SPR</w:t>
+      </w:r>
+      <w:r>
+        <w:t xml:space="preserve"> </w:t>
+      </w:r>
+      <w:r>
+        <w:rPr>
+          <w:rFonts w:hint="eastAsia"/>
+        </w:rPr>
+        <w:t xml:space="preserve">释放能够影响油价，但其作用通常是临时削峰和稳定预期，不能被写成完全抵消供应中断的万能机制。因此，本文把</w:t>
+      </w:r>
+      <w:r>
+        <w:t xml:space="preserve"> </w:t>
+      </w:r>
+      <w:r>
+        <w:rPr>
+          <w:rFonts w:hint="eastAsia"/>
+        </w:rPr>
+        <w:t xml:space="preserve">SPR、商业库存和绕道运输都作为部分缓冲变量：它们改变剩余缺口和价格峰值，却不直接决定长期均衡价格。</w:t>
+      </w:r>
+    </w:p>
+    <w:p>
+      <w:pPr>
+        <w:pStyle w:val="BodyText"/>
+      </w:pPr>
+      <w:r>
+        <w:rPr>
+          <w:rFonts w:hint="eastAsia"/>
+        </w:rPr>
+        <w:t xml:space="preserve">在风险变量方面，Caldara</w:t>
+      </w:r>
+      <w:r>
+        <w:t xml:space="preserve"> </w:t>
+      </w:r>
+      <w:r>
+        <w:rPr>
+          <w:rFonts w:hint="eastAsia"/>
+        </w:rPr>
+        <w:t xml:space="preserve">与</w:t>
+      </w:r>
+      <w:r>
+        <w:t xml:space="preserve"> </w:t>
+      </w:r>
+      <w:r>
+        <w:rPr>
+          <w:rFonts w:hint="eastAsia"/>
+        </w:rPr>
+        <w:t xml:space="preserve">Iacoviello（2022）提供了</w:t>
+      </w:r>
+      <w:r>
+        <w:t xml:space="preserve"> GPR </w:t>
+      </w:r>
+      <w:r>
+        <w:rPr>
+          <w:rFonts w:hint="eastAsia"/>
+        </w:rPr>
+        <w:t xml:space="preserve">指数的理论和数据基础，Mei</w:t>
+      </w:r>
+      <w:r>
+        <w:t xml:space="preserve"> </w:t>
+      </w:r>
+      <w:r>
+        <w:rPr>
+          <w:rFonts w:hint="eastAsia"/>
+        </w:rPr>
+        <w:t xml:space="preserve">等（2020）、Liu</w:t>
+      </w:r>
+      <w:r>
+        <w:t xml:space="preserve"> </w:t>
+      </w:r>
+      <w:r>
+        <w:rPr>
+          <w:rFonts w:hint="eastAsia"/>
+        </w:rPr>
+        <w:t xml:space="preserve">等（2019）说明地缘风险更适合解释油价波动和尾部风险。由于</w:t>
+      </w:r>
+      <w:r>
+        <w:t xml:space="preserve"> GPR </w:t>
+      </w:r>
+      <w:r>
+        <w:rPr>
+          <w:rFonts w:hint="eastAsia"/>
+        </w:rPr>
+        <w:t xml:space="preserve">来自新闻文本，本文不将同步</w:t>
+      </w:r>
+      <w:r>
+        <w:t xml:space="preserve"> GPR </w:t>
+      </w:r>
+      <w:r>
+        <w:rPr>
+          <w:rFonts w:hint="eastAsia"/>
+        </w:rPr>
+        <w:t xml:space="preserve">输入短期拟合，而只将其作为外部风险审计和滞后检验变量，防止同月新闻与同月油价之间的内生性循环。</w:t>
+      </w:r>
+    </w:p>
+    <w:p>
+      <w:pPr>
+        <w:pStyle w:val="TableCaption"/>
+      </w:pPr>
+      <w:r>
+        <w:rPr>
+          <w:rFonts w:hint="eastAsia"/>
+        </w:rPr>
+        <w:t xml:space="preserve">核心文献对本文模型设计的约束</w:t>
+      </w:r>
+    </w:p>
+    <w:tbl>
+      <w:tblPr>
+        <w:tblStyle w:val="Table"/>
+        <w:tblW w:type="auto" w:w="0"/>
+        <w:tblLook w:firstRow="1" w:lastRow="0" w:firstColumn="0" w:lastColumn="0" w:noHBand="0" w:noVBand="0" w:val="0020"/>
+        <w:tblCaption w:val="核心文献对本文模型设计的约束"/>
+      </w:tblPr>
+      <w:tblGrid>
+        <w:gridCol w:w="2640"/>
+        <w:gridCol w:w="2640"/>
+        <w:gridCol w:w="2640"/>
+      </w:tblGrid>
+      <w:tr>
+        <w:trPr>
+          <w:tblHeader w:val="on"/>
+        </w:trPr>
+        <w:tc>
+          <w:tcPr/>
+          <w:p>
+            <w:pPr>
+              <w:pStyle w:val="Compact"/>
+              <w:jc w:val="left"/>
+            </w:pPr>
+            <w:r>
+              <w:rPr>
+                <w:rFonts w:hint="eastAsia"/>
+              </w:rPr>
+              <w:t xml:space="preserve">文献主线</w:t>
+            </w:r>
+          </w:p>
+        </w:tc>
+        <w:tc>
+          <w:tcPr/>
+          <w:p>
+            <w:pPr>
+              <w:pStyle w:val="Compact"/>
+              <w:jc w:val="left"/>
+            </w:pPr>
+            <w:r>
+              <w:rPr>
+                <w:rFonts w:hint="eastAsia"/>
+              </w:rPr>
+              <w:t xml:space="preserve">对本文的约束</w:t>
+            </w:r>
+          </w:p>
+        </w:tc>
+        <w:tc>
+          <w:tcPr/>
+          <w:p>
+            <w:pPr>
+              <w:pStyle w:val="Compact"/>
+              <w:jc w:val="left"/>
+            </w:pPr>
+            <w:r>
+              <w:rPr>
+                <w:rFonts w:hint="eastAsia"/>
+              </w:rPr>
+              <w:t xml:space="preserve">落地位置</w:t>
+            </w:r>
+          </w:p>
+        </w:tc>
+      </w:tr>
+      <w:tr>
+        <w:tc>
+          <w:tcPr/>
+          <w:p>
+            <w:pPr>
+              <w:pStyle w:val="Compact"/>
+              <w:jc w:val="left"/>
+            </w:pPr>
+            <w:r>
+              <w:rPr>
+                <w:rFonts w:hint="eastAsia"/>
+              </w:rPr>
+              <w:t xml:space="preserve">油价冲击分解</w:t>
+            </w:r>
+          </w:p>
+        </w:tc>
+        <w:tc>
+          <w:tcPr/>
+          <w:p>
+            <w:pPr>
+              <w:pStyle w:val="Compact"/>
+              <w:jc w:val="left"/>
+            </w:pPr>
+            <w:r>
+              <w:rPr>
+                <w:rFonts w:hint="eastAsia"/>
+              </w:rPr>
+              <w:t xml:space="preserve">不能只用供应缺口解释油价，需纳入库存、预期和风险重估</w:t>
+            </w:r>
+          </w:p>
+        </w:tc>
+        <w:tc>
+          <w:tcPr/>
+          <w:p>
+            <w:pPr>
+              <w:pStyle w:val="Compact"/>
+              <w:jc w:val="left"/>
+            </w:pPr>
+            <w:r>
+              <w:rPr>
+                <w:rFonts w:hint="eastAsia"/>
+              </w:rPr>
+              <w:t xml:space="preserve">传统基准与综合机制递推模型</w:t>
+            </w:r>
+          </w:p>
+        </w:tc>
+      </w:tr>
+      <w:tr>
+        <w:tc>
+          <w:tcPr/>
+          <w:p>
+            <w:pPr>
+              <w:pStyle w:val="Compact"/>
+              <w:jc w:val="left"/>
+            </w:pPr>
+            <w:r>
+              <w:rPr>
+                <w:rFonts w:hint="eastAsia"/>
+              </w:rPr>
+              <w:t xml:space="preserve">随机游走强基准</w:t>
+            </w:r>
+          </w:p>
+        </w:tc>
+        <w:tc>
+          <w:tcPr/>
+          <w:p>
+            <w:pPr>
+              <w:pStyle w:val="Compact"/>
+              <w:jc w:val="left"/>
+            </w:pPr>
+            <w:r>
+              <w:t xml:space="preserve">RMSE </w:t>
+            </w:r>
+            <w:r>
+              <w:rPr>
+                <w:rFonts w:hint="eastAsia"/>
+              </w:rPr>
+              <w:t xml:space="preserve">必须和</w:t>
+            </w:r>
+            <w:r>
+              <w:t xml:space="preserve"> no-change、Random Walk、ARIMA </w:t>
+            </w:r>
+            <w:r>
+              <w:rPr>
+                <w:rFonts w:hint="eastAsia"/>
+              </w:rPr>
+              <w:t xml:space="preserve">等基准比较</w:t>
+            </w:r>
+          </w:p>
+        </w:tc>
+        <w:tc>
+          <w:tcPr/>
+          <w:p>
+            <w:pPr>
+              <w:pStyle w:val="Compact"/>
+              <w:jc w:val="left"/>
+            </w:pPr>
+            <w:r>
+              <w:rPr>
+                <w:rFonts w:hint="eastAsia"/>
+              </w:rPr>
+              <w:t xml:space="preserve">短期模型基准对比与</w:t>
+            </w:r>
+            <w:r>
+              <w:t xml:space="preserve"> DM </w:t>
+            </w:r>
+            <w:r>
+              <w:rPr>
+                <w:rFonts w:hint="eastAsia"/>
+              </w:rPr>
+              <w:t xml:space="preserve">检验</w:t>
+            </w:r>
+          </w:p>
+        </w:tc>
+      </w:tr>
+      <w:tr>
+        <w:tc>
+          <w:tcPr/>
+          <w:p>
+            <w:pPr>
+              <w:pStyle w:val="Compact"/>
+              <w:jc w:val="left"/>
+            </w:pPr>
+            <w:r>
+              <w:t xml:space="preserve">SPR </w:t>
+            </w:r>
+            <w:r>
+              <w:rPr>
+                <w:rFonts w:hint="eastAsia"/>
+              </w:rPr>
+              <w:t xml:space="preserve">与库存政策缓冲</w:t>
+            </w:r>
+          </w:p>
+        </w:tc>
+        <w:tc>
+          <w:tcPr/>
+          <w:p>
+            <w:pPr>
+              <w:pStyle w:val="Compact"/>
+              <w:jc w:val="left"/>
+            </w:pPr>
+            <w:r>
+              <w:t xml:space="preserve">SPR </w:t>
+            </w:r>
+            <w:r>
+              <w:rPr>
+                <w:rFonts w:hint="eastAsia"/>
+              </w:rPr>
+              <w:t xml:space="preserve">是削峰和争取时间，不是完全填补缺口的万能变量</w:t>
+            </w:r>
+          </w:p>
+        </w:tc>
+        <w:tc>
+          <w:tcPr/>
+          <w:p>
+            <w:pPr>
+              <w:pStyle w:val="Compact"/>
+              <w:jc w:val="left"/>
+            </w:pPr>
+            <w:r>
+              <w:rPr>
+                <w:rFonts w:hint="eastAsia"/>
+              </w:rPr>
+              <w:t xml:space="preserve">物理供需层、消融实验和长期敏感性分析</w:t>
+            </w:r>
+          </w:p>
+        </w:tc>
+      </w:tr>
+      <w:tr>
+        <w:tc>
+          <w:tcPr/>
+          <w:p>
+            <w:pPr>
+              <w:pStyle w:val="Compact"/>
+              <w:jc w:val="left"/>
+            </w:pPr>
+            <w:r>
+              <w:t xml:space="preserve">GPR </w:t>
+            </w:r>
+            <w:r>
+              <w:rPr>
+                <w:rFonts w:hint="eastAsia"/>
+              </w:rPr>
+              <w:t xml:space="preserve">与波动风险</w:t>
+            </w:r>
+          </w:p>
+        </w:tc>
+        <w:tc>
+          <w:tcPr/>
+          <w:p>
+            <w:pPr>
+              <w:pStyle w:val="Compact"/>
+              <w:jc w:val="left"/>
+            </w:pPr>
+            <w:r>
+              <w:t xml:space="preserve">GPR </w:t>
+            </w:r>
+            <w:r>
+              <w:rPr>
+                <w:rFonts w:hint="eastAsia"/>
+              </w:rPr>
+              <w:t xml:space="preserve">适合做风险审计和波动解释，不宜同步解释同月油价</w:t>
+            </w:r>
+          </w:p>
+        </w:tc>
+        <w:tc>
+          <w:tcPr/>
+          <w:p>
+            <w:pPr>
+              <w:pStyle w:val="Compact"/>
+              <w:jc w:val="left"/>
+            </w:pPr>
+            <w:r>
+              <w:rPr>
+                <w:rFonts w:hint="eastAsia"/>
+              </w:rPr>
+              <w:t xml:space="preserve">滞后</w:t>
+            </w:r>
+            <w:r>
+              <w:t xml:space="preserve"> GPR </w:t>
+            </w:r>
+            <w:r>
+              <w:rPr>
+                <w:rFonts w:hint="eastAsia"/>
+              </w:rPr>
+              <w:t xml:space="preserve">审计和长期尾部风险解释</w:t>
+            </w:r>
+          </w:p>
+        </w:tc>
+      </w:tr>
+      <w:tr>
+        <w:tc>
+          <w:tcPr/>
+          <w:p>
+            <w:pPr>
+              <w:pStyle w:val="Compact"/>
+              <w:jc w:val="left"/>
+            </w:pPr>
+            <w:r>
+              <w:rPr>
+                <w:rFonts w:hint="eastAsia"/>
+              </w:rPr>
+              <w:t xml:space="preserve">长期预测不确定性</w:t>
+            </w:r>
+          </w:p>
+        </w:tc>
+        <w:tc>
+          <w:tcPr/>
+          <w:p>
+            <w:pPr>
+              <w:pStyle w:val="Compact"/>
+              <w:jc w:val="left"/>
+            </w:pPr>
+            <w:r>
+              <w:rPr>
+                <w:rFonts w:hint="eastAsia"/>
+              </w:rPr>
+              <w:t xml:space="preserve">长期结果应报告情景、区间和尾部概率，不夸大单点预测</w:t>
+            </w:r>
+          </w:p>
+        </w:tc>
+        <w:tc>
+          <w:tcPr/>
+          <w:p>
+            <w:pPr>
+              <w:pStyle w:val="Compact"/>
+              <w:jc w:val="left"/>
+            </w:pPr>
+            <w:r>
+              <w:rPr>
+                <w:rFonts w:hint="eastAsia"/>
+              </w:rPr>
+              <w:t xml:space="preserve">三情景、蒙特卡洛和状态转移情景树</w:t>
+            </w:r>
+          </w:p>
+        </w:tc>
+      </w:tr>
+    </w:tbl>
     <w:bookmarkEnd w:id="14"/>
-    <w:bookmarkStart w:id="26" w:name="数据处理与描述性分析"/>
+    <w:bookmarkEnd w:id="15"/>
+    <w:bookmarkStart w:id="27" w:name="数据处理与描述性分析"/>
     <w:p>
       <w:pPr>
         <w:pStyle w:val="Heading1"/>
@@ -1394,7 +1994,7 @@
         <w:t xml:space="preserve">数据处理与描述性分析</w:t>
       </w:r>
     </w:p>
-    <w:bookmarkStart w:id="21" w:name="数据来源与清洗口径"/>
+    <w:bookmarkStart w:id="22" w:name="数据来源与清洗口径"/>
     <w:p>
       <w:pPr>
         <w:pStyle w:val="Heading2"/>
@@ -2303,7 +2903,7 @@
         <w:rPr>
           <w:rFonts w:hint="eastAsia"/>
         </w:rPr>
-        <w:t xml:space="preserve">为审计地缘风险溢价是否具有外部事实基础，本文进一步接入</w:t>
+        <w:t xml:space="preserve">本文还接入</w:t>
       </w:r>
       <w:r>
         <w:t xml:space="preserve"> Caldara-Iacoviello </w:t>
@@ -2321,16 +2921,7 @@
         <w:rPr>
           <w:rFonts w:hint="eastAsia"/>
         </w:rPr>
-        <w:t xml:space="preserve">月度指数。GPR</w:t>
-      </w:r>
-      <w:r>
-        <w:t xml:space="preserve"> </w:t>
-      </w:r>
-      <w:r>
-        <w:rPr>
-          <w:rFonts w:hint="eastAsia"/>
-        </w:rPr>
-        <w:t xml:space="preserve">指数由新闻文本构造，因此不能直接使用同月</w:t>
+        <w:t xml:space="preserve">月度指数，作为地缘风险溢价的外部审计变量。由于</w:t>
       </w:r>
       <w:r>
         <w:t xml:space="preserve"> GPR </w:t>
@@ -2339,209 +2930,16 @@
         <w:rPr>
           <w:rFonts w:hint="eastAsia"/>
         </w:rPr>
-        <w:t xml:space="preserve">去解释同月油价，否则会产生</w:t>
-      </w:r>
-      <w:r>
-        <w:rPr>
-          <w:rFonts w:hint="eastAsia"/>
-        </w:rPr>
-        <w:t xml:space="preserve">“油价上涨引发新闻恐慌，新闻恐慌再解释油价”</w:t>
-      </w:r>
-      <w:r>
-        <w:rPr>
-          <w:rFonts w:hint="eastAsia"/>
-        </w:rPr>
-        <w:t xml:space="preserve">的内生性循环。本文只将其作为外部审计变量，并在统计关系中使用滞后一期口径。</w:t>
-      </w:r>
-    </w:p>
-    <w:p>
-      <w:pPr>
-        <w:pStyle w:val="BodyText"/>
-      </w:pPr>
-      <w:r>
-        <w:rPr>
-          <w:rFonts w:hint="eastAsia"/>
-        </w:rPr>
-        <w:t xml:space="preserve">滞后</w:t>
-      </w:r>
-      <w:r>
-        <w:t xml:space="preserve"> GPR </w:t>
-      </w:r>
-      <w:r>
-        <w:rPr>
-          <w:rFonts w:hint="eastAsia"/>
-        </w:rPr>
-        <w:t xml:space="preserve">审计显示，2026</w:t>
-      </w:r>
-      <w:r>
-        <w:t xml:space="preserve"> </w:t>
-      </w:r>
-      <w:r>
-        <w:rPr>
-          <w:rFonts w:hint="eastAsia"/>
-        </w:rPr>
-        <w:t xml:space="preserve">年</w:t>
-      </w:r>
-      <w:r>
-        <w:t xml:space="preserve"> 3 </w:t>
-      </w:r>
-      <w:r>
-        <w:rPr>
-          <w:rFonts w:hint="eastAsia"/>
-        </w:rPr>
-        <w:t xml:space="preserve">月</w:t>
-      </w:r>
-      <w:r>
-        <w:t xml:space="preserve"> GPR </w:t>
-      </w:r>
-      <w:r>
-        <w:rPr>
-          <w:rFonts w:hint="eastAsia"/>
-        </w:rPr>
-        <w:t xml:space="preserve">为</w:t>
-      </w:r>
-      <w:r>
-        <w:t xml:space="preserve"> </w:t>
-      </w:r>
-      <w:r>
-        <w:rPr>
-          <w:rFonts w:hint="eastAsia"/>
-        </w:rPr>
-        <w:t xml:space="preserve">326.99，位于</w:t>
-      </w:r>
-      <w:r>
-        <w:t xml:space="preserve"> 1985–2025 </w:t>
-      </w:r>
-      <w:r>
-        <w:rPr>
-          <w:rFonts w:hint="eastAsia"/>
-        </w:rPr>
-        <w:t xml:space="preserve">历史样本约</w:t>
-      </w:r>
-      <w:r>
-        <w:t xml:space="preserve"> 98.98% </w:t>
-      </w:r>
-      <w:r>
-        <w:rPr>
-          <w:rFonts w:hint="eastAsia"/>
-        </w:rPr>
-        <w:t xml:space="preserve">分位；2026</w:t>
-      </w:r>
-      <w:r>
-        <w:t xml:space="preserve"> </w:t>
-      </w:r>
-      <w:r>
-        <w:rPr>
-          <w:rFonts w:hint="eastAsia"/>
-        </w:rPr>
-        <w:t xml:space="preserve">年</w:t>
-      </w:r>
-      <w:r>
-        <w:t xml:space="preserve"> 4 </w:t>
-      </w:r>
-      <w:r>
-        <w:rPr>
-          <w:rFonts w:hint="eastAsia"/>
-        </w:rPr>
-        <w:t xml:space="preserve">月</w:t>
-      </w:r>
-      <w:r>
-        <w:t xml:space="preserve"> GPR </w:t>
-      </w:r>
-      <w:r>
-        <w:rPr>
-          <w:rFonts w:hint="eastAsia"/>
-        </w:rPr>
-        <w:t xml:space="preserve">为</w:t>
-      </w:r>
-      <w:r>
-        <w:t xml:space="preserve"> </w:t>
-      </w:r>
-      <w:r>
-        <w:rPr>
-          <w:rFonts w:hint="eastAsia"/>
-        </w:rPr>
-        <w:t xml:space="preserve">230.77，位于约</w:t>
-      </w:r>
-      <w:r>
-        <w:t xml:space="preserve"> 97.76% </w:t>
-      </w:r>
-      <w:r>
-        <w:rPr>
-          <w:rFonts w:hint="eastAsia"/>
-        </w:rPr>
-        <w:t xml:space="preserve">分位。这说明冲突窗口确实对应罕见的地缘风险高位，支持模型中设置风险溢价和恐慌衰减机制。但同时，2017–2026</w:t>
-      </w:r>
-      <w:r>
-        <w:t xml:space="preserve"> </w:t>
-      </w:r>
-      <w:r>
-        <w:rPr>
-          <w:rFonts w:hint="eastAsia"/>
-        </w:rPr>
-        <w:t xml:space="preserve">样本中滞后</w:t>
-      </w:r>
-      <w:r>
-        <w:t xml:space="preserve"> 1 </w:t>
-      </w:r>
-      <w:r>
-        <w:rPr>
-          <w:rFonts w:hint="eastAsia"/>
-        </w:rPr>
-        <w:t xml:space="preserve">月</w:t>
-      </w:r>
-      <w:r>
-        <w:t xml:space="preserve"> GPR </w:t>
-      </w:r>
-      <w:r>
-        <w:rPr>
-          <w:rFonts w:hint="eastAsia"/>
-        </w:rPr>
-        <w:t xml:space="preserve">与本月油价月度收益的相关系数仅为</w:t>
-      </w:r>
-      <w:r>
-        <w:t xml:space="preserve"> </w:t>
-      </w:r>
-      <w:r>
-        <w:rPr>
-          <w:rFonts w:hint="eastAsia"/>
-        </w:rPr>
-        <w:t xml:space="preserve">0.030，线性回归</w:t>
-      </w:r>
-      <w:r>
-        <w:t xml:space="preserve"> </w:t>
-      </w:r>
-      <m:oMath>
-        <m:sSup>
-          <m:e>
-            <m:r>
-              <m:t>R</m:t>
-            </m:r>
-          </m:e>
-          <m:sup>
-            <m:r>
-              <m:t>2</m:t>
-            </m:r>
-          </m:sup>
-        </m:sSup>
-      </m:oMath>
-      <w:r>
-        <w:t xml:space="preserve"> </w:t>
-      </w:r>
-      <w:r>
-        <w:rPr>
-          <w:rFonts w:hint="eastAsia"/>
-        </w:rPr>
-        <w:t xml:space="preserve">约为</w:t>
-      </w:r>
-      <w:r>
-        <w:t xml:space="preserve"> </w:t>
-      </w:r>
-      <w:r>
-        <w:rPr>
-          <w:rFonts w:hint="eastAsia"/>
-        </w:rPr>
-        <w:t xml:space="preserve">0.001，说明它不能被包装成强短期收益预测因子。</w:t>
+        <w:t xml:space="preserve">由新闻文本构造，同月指数不直接进入短期拟合；详细滞后检验放在第</w:t>
+      </w:r>
+      <w:r>
+        <w:t xml:space="preserve"> 9.5 </w:t>
+      </w:r>
+      <w:r>
+        <w:rPr>
+          <w:rFonts w:hint="eastAsia"/>
+        </w:rPr>
+        <w:t xml:space="preserve">节统一报告。</w:t>
       </w:r>
     </w:p>
     <w:p>
@@ -2553,18 +2951,18 @@
           <wp:inline>
             <wp:extent cx="4907280" cy="2453640"/>
             <wp:effectExtent b="0" l="0" r="0" t="0"/>
-            <wp:docPr descr="" title="" id="16" name="Picture"/>
+            <wp:docPr descr="" title="" id="17" name="Picture"/>
             <a:graphic>
               <a:graphicData uri="http://schemas.openxmlformats.org/drawingml/2006/picture">
                 <pic:pic>
                   <pic:nvPicPr>
-                    <pic:cNvPr descr="price_trend.png" id="17" name="Picture"/>
+                    <pic:cNvPr descr="布伦特原油长期价格走势.png" id="18" name="Picture"/>
                     <pic:cNvPicPr>
                       <a:picLocks noChangeArrowheads="1" noChangeAspect="1"/>
                     </pic:cNvPicPr>
                   </pic:nvPicPr>
                   <pic:blipFill>
-                    <a:blip r:embed="rId15"/>
+                    <a:blip r:embed="rId16"/>
                     <a:stretch>
                       <a:fillRect/>
                     </a:stretch>
@@ -2611,18 +3009,18 @@
           <wp:inline>
             <wp:extent cx="4907280" cy="2453640"/>
             <wp:effectExtent b="0" l="0" r="0" t="0"/>
-            <wp:docPr descr="" title="" id="19" name="Picture"/>
+            <wp:docPr descr="" title="" id="20" name="Picture"/>
             <a:graphic>
               <a:graphicData uri="http://schemas.openxmlformats.org/drawingml/2006/picture">
                 <pic:pic>
                   <pic:nvPicPr>
-                    <pic:cNvPr descr="event_window_price.png" id="20" name="Picture"/>
+                    <pic:cNvPr descr="冲突窗口价格走势.png" id="21" name="Picture"/>
                     <pic:cNvPicPr>
                       <a:picLocks noChangeArrowheads="1" noChangeAspect="1"/>
                     </pic:cNvPicPr>
                   </pic:nvPicPr>
                   <pic:blipFill>
-                    <a:blip r:embed="rId18"/>
+                    <a:blip r:embed="rId19"/>
                     <a:stretch>
                       <a:fillRect/>
                     </a:stretch>
@@ -2660,8 +3058,8 @@
         <w:t xml:space="preserve">冲突窗口内附件真实价格路径。</w:t>
       </w:r>
     </w:p>
-    <w:bookmarkEnd w:id="21"/>
-    <w:bookmarkStart w:id="25" w:name="波动率特征"/>
+    <w:bookmarkEnd w:id="22"/>
+    <w:bookmarkStart w:id="26" w:name="波动率特征"/>
     <w:p>
       <w:pPr>
         <w:pStyle w:val="Heading2"/>
@@ -2702,18 +3100,18 @@
           <wp:inline>
             <wp:extent cx="4907280" cy="3345872"/>
             <wp:effectExtent b="0" l="0" r="0" t="0"/>
-            <wp:docPr descr="" title="" id="23" name="Picture"/>
+            <wp:docPr descr="" title="" id="24" name="Picture"/>
             <a:graphic>
               <a:graphicData uri="http://schemas.openxmlformats.org/drawingml/2006/picture">
                 <pic:pic>
                   <pic:nvPicPr>
-                    <pic:cNvPr descr="return_volatility.png" id="24" name="Picture"/>
+                    <pic:cNvPr descr="布伦特收益率与波动率.png" id="25" name="Picture"/>
                     <pic:cNvPicPr>
                       <a:picLocks noChangeArrowheads="1" noChangeAspect="1"/>
                     </pic:cNvPicPr>
                   </pic:nvPicPr>
                   <pic:blipFill>
-                    <a:blip r:embed="rId22"/>
+                    <a:blip r:embed="rId23"/>
                     <a:stretch>
                       <a:fillRect/>
                     </a:stretch>
@@ -2751,9 +3149,9 @@
         <w:t xml:space="preserve">收益率与滚动波动率。冲突窗口波动放大，为事件机制建模提供依据。</w:t>
       </w:r>
     </w:p>
-    <w:bookmarkEnd w:id="25"/>
     <w:bookmarkEnd w:id="26"/>
-    <w:bookmarkStart w:id="30" w:name="模型假设与符号说明"/>
+    <w:bookmarkEnd w:id="27"/>
+    <w:bookmarkStart w:id="31" w:name="模型假设与符号说明"/>
     <w:p>
       <w:pPr>
         <w:pStyle w:val="Heading1"/>
@@ -2765,7 +3163,7 @@
         <w:t xml:space="preserve">模型假设与符号说明</w:t>
       </w:r>
     </w:p>
-    <w:bookmarkStart w:id="27" w:name="基本假设"/>
+    <w:bookmarkStart w:id="28" w:name="基本假设"/>
     <w:p>
       <w:pPr>
         <w:pStyle w:val="Heading2"/>
@@ -2868,8 +3266,8 @@
         <w:t xml:space="preserve">天预测为条件情景外推，不代表真实未来观测，也不编造任何未来真实价格。</w:t>
       </w:r>
     </w:p>
-    <w:bookmarkEnd w:id="27"/>
-    <w:bookmarkStart w:id="28" w:name="符号说明"/>
+    <w:bookmarkEnd w:id="28"/>
+    <w:bookmarkStart w:id="29" w:name="符号说明"/>
     <w:p>
       <w:pPr>
         <w:pStyle w:val="Heading2"/>
@@ -3919,8 +4317,8 @@
         </w:tc>
       </w:tr>
     </w:tbl>
-    <w:bookmarkEnd w:id="28"/>
-    <w:bookmarkStart w:id="29" w:name="参数来源与识别边界"/>
+    <w:bookmarkEnd w:id="29"/>
+    <w:bookmarkStart w:id="30" w:name="参数来源与识别边界"/>
     <w:p>
       <w:pPr>
         <w:pStyle w:val="Heading2"/>
@@ -4759,9 +5157,9 @@
         <w:t xml:space="preserve">天时使用的形状参数。本文不把它们写成确定事实，而是把它们显式列入敏感性分析：若这些系数在合理范围内扰动后结论仍保持中性回落、悲观尾部上行的结构，则说明长期判断主要来自机制组合，而不是某一个隐藏常数。</w:t>
       </w:r>
     </w:p>
-    <w:bookmarkEnd w:id="29"/>
     <w:bookmarkEnd w:id="30"/>
-    <w:bookmarkStart w:id="36" w:name="传统供需基准模型"/>
+    <w:bookmarkEnd w:id="31"/>
+    <w:bookmarkStart w:id="37" w:name="传统供需基准模型"/>
     <w:p>
       <w:pPr>
         <w:pStyle w:val="Heading1"/>
@@ -4773,7 +5171,7 @@
         <w:t xml:space="preserve">传统供需基准模型</w:t>
       </w:r>
     </w:p>
-    <w:bookmarkStart w:id="31" w:name="模型建立"/>
+    <w:bookmarkStart w:id="32" w:name="模型建立"/>
     <w:p>
       <w:pPr>
         <w:pStyle w:val="Heading2"/>
@@ -5050,8 +5448,8 @@
         <w:t xml:space="preserve">万桶/日。</w:t>
       </w:r>
     </w:p>
-    <w:bookmarkEnd w:id="31"/>
-    <w:bookmarkStart w:id="35" w:name="基准模型结果"/>
+    <w:bookmarkEnd w:id="32"/>
+    <w:bookmarkStart w:id="36" w:name="基准模型结果"/>
     <w:p>
       <w:pPr>
         <w:pStyle w:val="Heading2"/>
@@ -5321,18 +5719,18 @@
           <wp:inline>
             <wp:extent cx="4693920" cy="2560320"/>
             <wp:effectExtent b="0" l="0" r="0" t="0"/>
-            <wp:docPr descr="" title="" id="33" name="Picture"/>
+            <wp:docPr descr="" title="" id="34" name="Picture"/>
             <a:graphic>
               <a:graphicData uri="http://schemas.openxmlformats.org/drawingml/2006/picture">
                 <pic:pic>
                   <pic:nvPicPr>
-                    <pic:cNvPr descr="baseline_vs_actual.png" id="34" name="Picture"/>
+                    <pic:cNvPr descr="传统供需基准与真实价格对比.png" id="35" name="Picture"/>
                     <pic:cNvPicPr>
                       <a:picLocks noChangeArrowheads="1" noChangeAspect="1"/>
                     </pic:cNvPicPr>
                   </pic:nvPicPr>
                   <pic:blipFill>
-                    <a:blip r:embed="rId32"/>
+                    <a:blip r:embed="rId33"/>
                     <a:stretch>
                       <a:fillRect/>
                     </a:stretch>
@@ -5408,9 +5806,9 @@
         <w:t xml:space="preserve">SPR、库存、绕道运输、需求收缩和市场预期修复。</w:t>
       </w:r>
     </w:p>
-    <w:bookmarkEnd w:id="35"/>
     <w:bookmarkEnd w:id="36"/>
-    <w:bookmarkStart w:id="39" w:name="综合机制递推模型"/>
+    <w:bookmarkEnd w:id="37"/>
+    <w:bookmarkStart w:id="40" w:name="综合机制递推模型"/>
     <w:p>
       <w:pPr>
         <w:pStyle w:val="Heading1"/>
@@ -5442,7 +5840,7 @@
         <w:t xml:space="preserve">天情景外推提供统一机制基础。</w:t>
       </w:r>
     </w:p>
-    <w:bookmarkStart w:id="37" w:name="物理供需层"/>
+    <w:bookmarkStart w:id="38" w:name="物理供需层"/>
     <w:p>
       <w:pPr>
         <w:pStyle w:val="Heading2"/>
@@ -6148,8 +6546,8 @@
         </m:oMath>
       </m:oMathPara>
     </w:p>
-    <w:bookmarkEnd w:id="37"/>
-    <w:bookmarkStart w:id="38" w:name="市场价格形成层"/>
+    <w:bookmarkEnd w:id="38"/>
+    <w:bookmarkStart w:id="39" w:name="市场价格形成层"/>
     <w:p>
       <w:pPr>
         <w:pStyle w:val="Heading2"/>
@@ -6906,9 +7304,9 @@
         <w:t xml:space="preserve">该结构保留了题面中的离散递推思想，同时允许期货市场对风险和预期做非线性再定价。需要强调，本文不把市场价格形成层视为任意补丁：风险溢价、缓冲确认折价和预期修复折价只有在具有经济含义、方向可解释、消融后误差明显恶化且扰动后结论保持稳定时才保留在主模型中。</w:t>
       </w:r>
     </w:p>
-    <w:bookmarkEnd w:id="38"/>
     <w:bookmarkEnd w:id="39"/>
-    <w:bookmarkStart w:id="82" w:name="参数校准与模型检验"/>
+    <w:bookmarkEnd w:id="40"/>
+    <w:bookmarkStart w:id="83" w:name="参数校准与模型检验"/>
     <w:p>
       <w:pPr>
         <w:pStyle w:val="Heading1"/>
@@ -6920,7 +7318,7 @@
         <w:t xml:space="preserve">参数校准与模型检验</w:t>
       </w:r>
     </w:p>
-    <w:bookmarkStart w:id="40" w:name="多目标校准"/>
+    <w:bookmarkStart w:id="41" w:name="多目标校准"/>
     <w:p>
       <w:pPr>
         <w:pStyle w:val="Heading2"/>
@@ -8088,8 +8486,8 @@
         <w:t xml:space="preserve">上限、绕道能力、库存缓冲和需求弹性受题面范围约束；风险权重、价格调整速度、缓冲确认和预期修复强度属于行为价格形成参数，必须依赖数据校准和防御性检验。本文后续所有模型评价均围绕这一区分展开，避免把校准参数包装成外生事实。</w:t>
       </w:r>
     </w:p>
-    <w:bookmarkEnd w:id="40"/>
-    <w:bookmarkStart w:id="47" w:name="拟合结果"/>
+    <w:bookmarkEnd w:id="41"/>
+    <w:bookmarkStart w:id="48" w:name="拟合结果"/>
     <w:p>
       <w:pPr>
         <w:pStyle w:val="Heading2"/>
@@ -8211,18 +8609,18 @@
           <wp:inline>
             <wp:extent cx="4907280" cy="2587474"/>
             <wp:effectExtent b="0" l="0" r="0" t="0"/>
-            <wp:docPr descr="" title="" id="42" name="Picture"/>
+            <wp:docPr descr="" title="" id="43" name="Picture"/>
             <a:graphic>
               <a:graphicData uri="http://schemas.openxmlformats.org/drawingml/2006/picture">
                 <pic:pic>
                   <pic:nvPicPr>
-                    <pic:cNvPr descr="短期模型拟合效果.png" id="43" name="Picture"/>
+                    <pic:cNvPr descr="短期模型拟合效果.png" id="44" name="Picture"/>
                     <pic:cNvPicPr>
                       <a:picLocks noChangeArrowheads="1" noChangeAspect="1"/>
                     </pic:cNvPicPr>
                   </pic:nvPicPr>
                   <pic:blipFill>
-                    <a:blip r:embed="rId41"/>
+                    <a:blip r:embed="rId42"/>
                     <a:stretch>
                       <a:fillRect/>
                     </a:stretch>
@@ -8759,18 +9157,18 @@
           <wp:inline>
             <wp:extent cx="4907280" cy="2765921"/>
             <wp:effectExtent b="0" l="0" r="0" t="0"/>
-            <wp:docPr descr="" title="" id="45" name="Picture"/>
+            <wp:docPr descr="" title="" id="46" name="Picture"/>
             <a:graphic>
               <a:graphicData uri="http://schemas.openxmlformats.org/drawingml/2006/picture">
                 <pic:pic>
                   <pic:nvPicPr>
-                    <pic:cNvPr descr="短期模型机制贡献.png" id="46" name="Picture"/>
+                    <pic:cNvPr descr="短期模型机制贡献.png" id="47" name="Picture"/>
                     <pic:cNvPicPr>
                       <a:picLocks noChangeArrowheads="1" noChangeAspect="1"/>
                     </pic:cNvPicPr>
                   </pic:nvPicPr>
                   <pic:blipFill>
-                    <a:blip r:embed="rId44"/>
+                    <a:blip r:embed="rId45"/>
                     <a:stretch>
                       <a:fillRect/>
                     </a:stretch>
@@ -8808,8 +9206,8 @@
         <w:t xml:space="preserve">短期模型机制贡献分解。风险溢价推升价格，缓冲确认和预期修复压低价格。</w:t>
       </w:r>
     </w:p>
-    <w:bookmarkEnd w:id="47"/>
-    <w:bookmarkStart w:id="54" w:name="基准对比与防御性检验"/>
+    <w:bookmarkEnd w:id="48"/>
+    <w:bookmarkStart w:id="55" w:name="基准对比与防御性检验"/>
     <w:p>
       <w:pPr>
         <w:pStyle w:val="Heading2"/>
@@ -8896,386 +9294,6 @@
         <w:t xml:space="preserve">日及以前信息。</w:t>
       </w:r>
     </w:p>
-    <w:p>
-      <w:pPr>
-        <w:pStyle w:val="TableCaption"/>
-      </w:pPr>
-      <w:r>
-        <w:rPr>
-          <w:rFonts w:hint="eastAsia"/>
-        </w:rPr>
-        <w:t xml:space="preserve">模型检验框架</w:t>
-      </w:r>
-    </w:p>
-    <w:tbl>
-      <w:tblPr>
-        <w:tblStyle w:val="Table"/>
-        <w:tblW w:type="auto" w:w="0"/>
-        <w:tblLook w:firstRow="1" w:lastRow="0" w:firstColumn="0" w:lastColumn="0" w:noHBand="0" w:noVBand="0" w:val="0020"/>
-        <w:tblCaption w:val="模型检验框架"/>
-      </w:tblPr>
-      <w:tblGrid>
-        <w:gridCol w:w="2640"/>
-        <w:gridCol w:w="2640"/>
-        <w:gridCol w:w="2640"/>
-      </w:tblGrid>
-      <w:tr>
-        <w:trPr>
-          <w:tblHeader w:val="on"/>
-        </w:trPr>
-        <w:tc>
-          <w:tcPr/>
-          <w:p>
-            <w:pPr>
-              <w:pStyle w:val="Compact"/>
-              <w:jc w:val="left"/>
-            </w:pPr>
-            <w:r>
-              <w:rPr>
-                <w:rFonts w:hint="eastAsia"/>
-              </w:rPr>
-              <w:t xml:space="preserve">检验维度</w:t>
-            </w:r>
-          </w:p>
-        </w:tc>
-        <w:tc>
-          <w:tcPr/>
-          <w:p>
-            <w:pPr>
-              <w:pStyle w:val="Compact"/>
-              <w:jc w:val="left"/>
-            </w:pPr>
-            <w:r>
-              <w:rPr>
-                <w:rFonts w:hint="eastAsia"/>
-              </w:rPr>
-              <w:t xml:space="preserve">需要回答的问题</w:t>
-            </w:r>
-          </w:p>
-        </w:tc>
-        <w:tc>
-          <w:tcPr/>
-          <w:p>
-            <w:pPr>
-              <w:pStyle w:val="Compact"/>
-              <w:jc w:val="left"/>
-            </w:pPr>
-            <w:r>
-              <w:rPr>
-                <w:rFonts w:hint="eastAsia"/>
-              </w:rPr>
-              <w:t xml:space="preserve">本文对应方法</w:t>
-            </w:r>
-          </w:p>
-        </w:tc>
-      </w:tr>
-      <w:tr>
-        <w:tc>
-          <w:tcPr/>
-          <w:p>
-            <w:pPr>
-              <w:pStyle w:val="Compact"/>
-              <w:jc w:val="left"/>
-            </w:pPr>
-            <w:r>
-              <w:rPr>
-                <w:rFonts w:hint="eastAsia"/>
-              </w:rPr>
-              <w:t xml:space="preserve">准确性</w:t>
-            </w:r>
-          </w:p>
-        </w:tc>
-        <w:tc>
-          <w:tcPr/>
-          <w:p>
-            <w:pPr>
-              <w:pStyle w:val="Compact"/>
-              <w:jc w:val="left"/>
-            </w:pPr>
-            <w:r>
-              <w:rPr>
-                <w:rFonts w:hint="eastAsia"/>
-              </w:rPr>
-              <w:t xml:space="preserve">模型误差是否足够低？</w:t>
-            </w:r>
-          </w:p>
-        </w:tc>
-        <w:tc>
-          <w:tcPr/>
-          <w:p>
-            <w:pPr>
-              <w:pStyle w:val="Compact"/>
-              <w:jc w:val="left"/>
-            </w:pPr>
-            <w:r>
-              <w:rPr>
-                <w:rFonts w:hint="eastAsia"/>
-              </w:rPr>
-              <w:t xml:space="preserve">RMSE、MAE、MAPE、分段误差</w:t>
-            </w:r>
-          </w:p>
-        </w:tc>
-      </w:tr>
-      <w:tr>
-        <w:tc>
-          <w:tcPr/>
-          <w:p>
-            <w:pPr>
-              <w:pStyle w:val="Compact"/>
-              <w:jc w:val="left"/>
-            </w:pPr>
-            <w:r>
-              <w:rPr>
-                <w:rFonts w:hint="eastAsia"/>
-              </w:rPr>
-              <w:t xml:space="preserve">有效性</w:t>
-            </w:r>
-          </w:p>
-        </w:tc>
-        <w:tc>
-          <w:tcPr/>
-          <w:p>
-            <w:pPr>
-              <w:pStyle w:val="Compact"/>
-              <w:jc w:val="left"/>
-            </w:pPr>
-            <w:r>
-              <w:rPr>
-                <w:rFonts w:hint="eastAsia"/>
-              </w:rPr>
-              <w:t xml:space="preserve">是否打败朴素基准？</w:t>
-            </w:r>
-          </w:p>
-        </w:tc>
-        <w:tc>
-          <w:tcPr/>
-          <w:p>
-            <w:pPr>
-              <w:pStyle w:val="Compact"/>
-              <w:jc w:val="left"/>
-            </w:pPr>
-            <w:r>
-              <w:rPr>
-                <w:rFonts w:hint="eastAsia"/>
-              </w:rPr>
-              <w:t xml:space="preserve">上一日基准、三日均值、随机游走、滚动</w:t>
-            </w:r>
-            <w:r>
-              <w:t xml:space="preserve"> ARIMA</w:t>
-            </w:r>
-          </w:p>
-        </w:tc>
-      </w:tr>
-      <w:tr>
-        <w:tc>
-          <w:tcPr/>
-          <w:p>
-            <w:pPr>
-              <w:pStyle w:val="Compact"/>
-              <w:jc w:val="left"/>
-            </w:pPr>
-            <w:r>
-              <w:rPr>
-                <w:rFonts w:hint="eastAsia"/>
-              </w:rPr>
-              <w:t xml:space="preserve">时序性</w:t>
-            </w:r>
-          </w:p>
-        </w:tc>
-        <w:tc>
-          <w:tcPr/>
-          <w:p>
-            <w:pPr>
-              <w:pStyle w:val="Compact"/>
-              <w:jc w:val="left"/>
-            </w:pPr>
-            <w:r>
-              <w:rPr>
-                <w:rFonts w:hint="eastAsia"/>
-              </w:rPr>
-              <w:t xml:space="preserve">是否只是慢半拍跟随？</w:t>
-            </w:r>
-          </w:p>
-        </w:tc>
-        <w:tc>
-          <w:tcPr/>
-          <w:p>
-            <w:pPr>
-              <w:pStyle w:val="Compact"/>
-              <w:jc w:val="left"/>
-            </w:pPr>
-            <w:r>
-              <w:rPr>
-                <w:rFonts w:hint="eastAsia"/>
-              </w:rPr>
-              <w:t xml:space="preserve">曲线平移检验、拐点局部检验</w:t>
-            </w:r>
-          </w:p>
-        </w:tc>
-      </w:tr>
-      <w:tr>
-        <w:tc>
-          <w:tcPr/>
-          <w:p>
-            <w:pPr>
-              <w:pStyle w:val="Compact"/>
-              <w:jc w:val="left"/>
-            </w:pPr>
-            <w:r>
-              <w:rPr>
-                <w:rFonts w:hint="eastAsia"/>
-              </w:rPr>
-              <w:t xml:space="preserve">机制性</w:t>
-            </w:r>
-          </w:p>
-        </w:tc>
-        <w:tc>
-          <w:tcPr/>
-          <w:p>
-            <w:pPr>
-              <w:pStyle w:val="Compact"/>
-              <w:jc w:val="left"/>
-            </w:pPr>
-            <w:r>
-              <w:rPr>
-                <w:rFonts w:hint="eastAsia"/>
-              </w:rPr>
-              <w:t xml:space="preserve">每个机制是否有贡献？</w:t>
-            </w:r>
-          </w:p>
-        </w:tc>
-        <w:tc>
-          <w:tcPr/>
-          <w:p>
-            <w:pPr>
-              <w:pStyle w:val="Compact"/>
-              <w:jc w:val="left"/>
-            </w:pPr>
-            <w:r>
-              <w:rPr>
-                <w:rFonts w:hint="eastAsia"/>
-              </w:rPr>
-              <w:t xml:space="preserve">SPR、库存、绕道、需求、风险、预期修复消融实验</w:t>
-            </w:r>
-          </w:p>
-        </w:tc>
-      </w:tr>
-      <w:tr>
-        <w:tc>
-          <w:tcPr/>
-          <w:p>
-            <w:pPr>
-              <w:pStyle w:val="Compact"/>
-              <w:jc w:val="left"/>
-            </w:pPr>
-            <w:r>
-              <w:rPr>
-                <w:rFonts w:hint="eastAsia"/>
-              </w:rPr>
-              <w:t xml:space="preserve">稳健性</w:t>
-            </w:r>
-          </w:p>
-        </w:tc>
-        <w:tc>
-          <w:tcPr/>
-          <w:p>
-            <w:pPr>
-              <w:pStyle w:val="Compact"/>
-              <w:jc w:val="left"/>
-            </w:pPr>
-            <w:r>
-              <w:rPr>
-                <w:rFonts w:hint="eastAsia"/>
-              </w:rPr>
-              <w:t xml:space="preserve">是否依赖少数神奇参数？</w:t>
-            </w:r>
-          </w:p>
-        </w:tc>
-        <w:tc>
-          <w:tcPr/>
-          <w:p>
-            <w:pPr>
-              <w:pStyle w:val="Compact"/>
-              <w:jc w:val="left"/>
-            </w:pPr>
-            <m:oMath>
-              <m:r>
-                <m:rPr>
-                  <m:sty m:val="p"/>
-                </m:rPr>
-                <m:t>±</m:t>
-              </m:r>
-              <m:r>
-                <m:t>15</m:t>
-              </m:r>
-              <m:r>
-                <m:rPr>
-                  <m:sty m:val="p"/>
-                </m:rPr>
-                <m:t>%</m:t>
-              </m:r>
-            </m:oMath>
-            <w:r>
-              <w:t xml:space="preserve"> </w:t>
-            </w:r>
-            <w:r>
-              <w:rPr>
-                <w:rFonts w:hint="eastAsia"/>
-              </w:rPr>
-              <w:t xml:space="preserve">参数扰动、局部优秀参数邻域</w:t>
-            </w:r>
-          </w:p>
-        </w:tc>
-      </w:tr>
-      <w:tr>
-        <w:tc>
-          <w:tcPr/>
-          <w:p>
-            <w:pPr>
-              <w:pStyle w:val="Compact"/>
-              <w:jc w:val="left"/>
-            </w:pPr>
-            <w:r>
-              <w:rPr>
-                <w:rFonts w:hint="eastAsia"/>
-              </w:rPr>
-              <w:t xml:space="preserve">合规性</w:t>
-            </w:r>
-          </w:p>
-        </w:tc>
-        <w:tc>
-          <w:tcPr/>
-          <w:p>
-            <w:pPr>
-              <w:pStyle w:val="Compact"/>
-              <w:jc w:val="left"/>
-            </w:pPr>
-            <w:r>
-              <w:rPr>
-                <w:rFonts w:hint="eastAsia"/>
-              </w:rPr>
-              <w:t xml:space="preserve">是否把结论硬写进代码？</w:t>
-            </w:r>
-          </w:p>
-        </w:tc>
-        <w:tc>
-          <w:tcPr/>
-          <w:p>
-            <w:pPr>
-              <w:pStyle w:val="Compact"/>
-              <w:jc w:val="left"/>
-            </w:pPr>
-            <w:r>
-              <w:rPr>
-                <w:rFonts w:hint="eastAsia"/>
-              </w:rPr>
-              <w:t xml:space="preserve">递推代码硬编码审计、价格上限触发检查</w:t>
-            </w:r>
-          </w:p>
-        </w:tc>
-      </w:tr>
-    </w:tbl>
-    <w:p/>
     <w:p>
       <w:pPr>
         <w:pStyle w:val="TableCaption"/>
@@ -9716,18 +9734,18 @@
           <wp:inline>
             <wp:extent cx="4587240" cy="2533904"/>
             <wp:effectExtent b="0" l="0" r="0" t="0"/>
-            <wp:docPr descr="" title="" id="49" name="Picture"/>
+            <wp:docPr descr="" title="" id="50" name="Picture"/>
             <a:graphic>
               <a:graphicData uri="http://schemas.openxmlformats.org/drawingml/2006/picture">
                 <pic:pic>
                   <pic:nvPicPr>
-                    <pic:cNvPr descr="短期模型基准对比.png" id="50" name="Picture"/>
+                    <pic:cNvPr descr="短期模型基准对比.png" id="51" name="Picture"/>
                     <pic:cNvPicPr>
                       <a:picLocks noChangeArrowheads="1" noChangeAspect="1"/>
                     </pic:cNvPicPr>
                   </pic:nvPicPr>
                   <pic:blipFill>
-                    <a:blip r:embed="rId48"/>
+                    <a:blip r:embed="rId49"/>
                     <a:stretch>
                       <a:fillRect/>
                     </a:stretch>
@@ -9890,18 +9908,18 @@
           <wp:inline>
             <wp:extent cx="4480560" cy="2594008"/>
             <wp:effectExtent b="0" l="0" r="0" t="0"/>
-            <wp:docPr descr="" title="" id="52" name="Picture"/>
+            <wp:docPr descr="" title="" id="53" name="Picture"/>
             <a:graphic>
               <a:graphicData uri="http://schemas.openxmlformats.org/drawingml/2006/picture">
                 <pic:pic>
                   <pic:nvPicPr>
-                    <pic:cNvPr descr="短期模型滞后平移检验.png" id="53" name="Picture"/>
+                    <pic:cNvPr descr="短期模型滞后平移检验.png" id="54" name="Picture"/>
                     <pic:cNvPicPr>
                       <a:picLocks noChangeArrowheads="1" noChangeAspect="1"/>
                     </pic:cNvPicPr>
                   </pic:nvPicPr>
                   <pic:blipFill>
-                    <a:blip r:embed="rId51"/>
+                    <a:blip r:embed="rId52"/>
                     <a:stretch>
                       <a:fillRect/>
                     </a:stretch>
@@ -9948,8 +9966,8 @@
         <w:t xml:space="preserve">检验。原始位置误差最低。</w:t>
       </w:r>
     </w:p>
-    <w:bookmarkEnd w:id="54"/>
-    <w:bookmarkStart w:id="61" w:name="机制消融与过拟合防御"/>
+    <w:bookmarkEnd w:id="55"/>
+    <w:bookmarkStart w:id="59" w:name="过拟合防御"/>
     <w:p>
       <w:pPr>
         <w:pStyle w:val="Heading2"/>
@@ -9958,153 +9976,12 @@
         <w:rPr>
           <w:rFonts w:hint="eastAsia"/>
         </w:rPr>
-        <w:t xml:space="preserve">机制消融与过拟合防御</w:t>
+        <w:t xml:space="preserve">过拟合防御</w:t>
       </w:r>
     </w:p>
     <w:p>
       <w:pPr>
         <w:pStyle w:val="FirstParagraph"/>
-      </w:pPr>
-      <w:r>
-        <w:rPr>
-          <w:rFonts w:hint="eastAsia"/>
-        </w:rPr>
-        <w:t xml:space="preserve">本文在同一短期模型中逐项关闭关键机制，并保持其余参数不重新校准。消融结果显示，去除</w:t>
-      </w:r>
-      <w:r>
-        <w:t xml:space="preserve"> SPR </w:t>
-      </w:r>
-      <w:r>
-        <w:rPr>
-          <w:rFonts w:hint="eastAsia"/>
-        </w:rPr>
-        <w:t xml:space="preserve">后</w:t>
-      </w:r>
-      <w:r>
-        <w:t xml:space="preserve"> RMSE </w:t>
-      </w:r>
-      <w:r>
-        <w:rPr>
-          <w:rFonts w:hint="eastAsia"/>
-        </w:rPr>
-        <w:t xml:space="preserve">从</w:t>
-      </w:r>
-      <w:r>
-        <w:t xml:space="preserve"> 3.44 </w:t>
-      </w:r>
-      <w:r>
-        <w:rPr>
-          <w:rFonts w:hint="eastAsia"/>
-        </w:rPr>
-        <w:t xml:space="preserve">升至</w:t>
-      </w:r>
-      <w:r>
-        <w:t xml:space="preserve"> </w:t>
-      </w:r>
-      <w:r>
-        <w:rPr>
-          <w:rFonts w:hint="eastAsia"/>
-        </w:rPr>
-        <w:t xml:space="preserve">5.86；去除风险与不确定性溢价后</w:t>
-      </w:r>
-      <w:r>
-        <w:t xml:space="preserve"> RMSE </w:t>
-      </w:r>
-      <w:r>
-        <w:rPr>
-          <w:rFonts w:hint="eastAsia"/>
-        </w:rPr>
-        <w:t xml:space="preserve">升至</w:t>
-      </w:r>
-      <w:r>
-        <w:t xml:space="preserve"> </w:t>
-      </w:r>
-      <w:r>
-        <w:rPr>
-          <w:rFonts w:hint="eastAsia"/>
-        </w:rPr>
-        <w:t xml:space="preserve">30.69；去除预期修复折价后后期</w:t>
-      </w:r>
-      <w:r>
-        <w:t xml:space="preserve"> RMSE </w:t>
-      </w:r>
-      <w:r>
-        <w:rPr>
-          <w:rFonts w:hint="eastAsia"/>
-        </w:rPr>
-        <w:t xml:space="preserve">升至</w:t>
-      </w:r>
-      <w:r>
-        <w:t xml:space="preserve"> </w:t>
-      </w:r>
-      <w:r>
-        <w:rPr>
-          <w:rFonts w:hint="eastAsia"/>
-        </w:rPr>
-        <w:t xml:space="preserve">10.09。这说明题面物理层和市场价格形成层均有边际贡献。</w:t>
-      </w:r>
-    </w:p>
-    <w:p>
-      <w:pPr>
-        <w:pStyle w:val="CaptionedFigure"/>
-      </w:pPr>
-      <w:r>
-        <w:drawing>
-          <wp:inline>
-            <wp:extent cx="4800600" cy="2480310"/>
-            <wp:effectExtent b="0" l="0" r="0" t="0"/>
-            <wp:docPr descr="" title="" id="56" name="Picture"/>
-            <a:graphic>
-              <a:graphicData uri="http://schemas.openxmlformats.org/drawingml/2006/picture">
-                <pic:pic>
-                  <pic:nvPicPr>
-                    <pic:cNvPr descr="短期模型机制消融实验.png" id="57" name="Picture"/>
-                    <pic:cNvPicPr>
-                      <a:picLocks noChangeArrowheads="1" noChangeAspect="1"/>
-                    </pic:cNvPicPr>
-                  </pic:nvPicPr>
-                  <pic:blipFill>
-                    <a:blip r:embed="rId55"/>
-                    <a:stretch>
-                      <a:fillRect/>
-                    </a:stretch>
-                  </pic:blipFill>
-                  <pic:spPr bwMode="auto">
-                    <a:xfrm>
-                      <a:off x="0" y="0"/>
-                      <a:ext cx="4800600" cy="2480310"/>
-                    </a:xfrm>
-                    <a:prstGeom prst="rect">
-                      <a:avLst/>
-                    </a:prstGeom>
-                    <a:noFill/>
-                    <a:ln w="9525">
-                      <a:noFill/>
-                      <a:headEnd/>
-                      <a:tailEnd/>
-                    </a:ln>
-                  </pic:spPr>
-                </pic:pic>
-              </a:graphicData>
-            </a:graphic>
-          </wp:inline>
-        </w:drawing>
-      </w:r>
-    </w:p>
-    <w:p>
-      <w:pPr>
-        <w:pStyle w:val="ImageCaption"/>
-      </w:pPr>
-      <w:r>
-        <w:rPr>
-          <w:rFonts w:hint="eastAsia"/>
-        </w:rPr>
-        <w:t xml:space="preserve">短期模型机制消融实验。关闭关键机制后误差结构显著恶化。</w:t>
-      </w:r>
-    </w:p>
-    <w:p>
-      <w:pPr>
-        <w:pStyle w:val="BodyText"/>
       </w:pPr>
       <w:r>
         <w:rPr>
@@ -10208,18 +10085,18 @@
           <wp:inline>
             <wp:extent cx="4693920" cy="2048256"/>
             <wp:effectExtent b="0" l="0" r="0" t="0"/>
-            <wp:docPr descr="" title="" id="59" name="Picture"/>
+            <wp:docPr descr="" title="" id="57" name="Picture"/>
             <a:graphic>
               <a:graphicData uri="http://schemas.openxmlformats.org/drawingml/2006/picture">
                 <pic:pic>
                   <pic:nvPicPr>
-                    <pic:cNvPr descr="短期模型过拟合压力测试.png" id="60" name="Picture"/>
+                    <pic:cNvPr descr="短期模型过拟合压力测试.png" id="58" name="Picture"/>
                     <pic:cNvPicPr>
                       <a:picLocks noChangeArrowheads="1" noChangeAspect="1"/>
                     </pic:cNvPicPr>
                   </pic:nvPicPr>
                   <pic:blipFill>
-                    <a:blip r:embed="rId58"/>
+                    <a:blip r:embed="rId56"/>
                     <a:stretch>
                       <a:fillRect/>
                     </a:stretch>
@@ -10257,8 +10134,8 @@
         <w:t xml:space="preserve">短期模型过拟合压力测试。多数扰动样本仍保持在合理价格平台附近。</w:t>
       </w:r>
     </w:p>
-    <w:bookmarkEnd w:id="61"/>
-    <w:bookmarkStart w:id="65" w:name="分段误差与残差诊断"/>
+    <w:bookmarkEnd w:id="59"/>
+    <w:bookmarkStart w:id="63" w:name="分段误差与残差诊断"/>
     <w:p>
       <w:pPr>
         <w:pStyle w:val="Heading2"/>
@@ -10335,18 +10212,18 @@
           <wp:inline>
             <wp:extent cx="4907280" cy="3655675"/>
             <wp:effectExtent b="0" l="0" r="0" t="0"/>
-            <wp:docPr descr="" title="" id="63" name="Picture"/>
+            <wp:docPr descr="" title="" id="61" name="Picture"/>
             <a:graphic>
               <a:graphicData uri="http://schemas.openxmlformats.org/drawingml/2006/picture">
                 <pic:pic>
                   <pic:nvPicPr>
-                    <pic:cNvPr descr="短期模型残差诊断增强.png" id="64" name="Picture"/>
+                    <pic:cNvPr descr="短期模型残差诊断增强.png" id="62" name="Picture"/>
                     <pic:cNvPicPr>
                       <a:picLocks noChangeArrowheads="1" noChangeAspect="1"/>
                     </pic:cNvPicPr>
                   </pic:nvPicPr>
                   <pic:blipFill>
-                    <a:blip r:embed="rId62"/>
+                    <a:blip r:embed="rId60"/>
                     <a:stretch>
                       <a:fillRect/>
                     </a:stretch>
@@ -10413,8 +10290,8 @@
         <w:t xml:space="preserve">0.254，说明仍存在一定连续偏差，但未形成明显强自相关。</w:t>
       </w:r>
     </w:p>
-    <w:bookmarkEnd w:id="65"/>
-    <w:bookmarkStart w:id="69" w:name="统计审计与-r-语言辅助定位"/>
+    <w:bookmarkEnd w:id="63"/>
+    <w:bookmarkStart w:id="70" w:name="统计审计与-r-语言辅助定位"/>
     <w:p>
       <w:pPr>
         <w:pStyle w:val="Heading2"/>
@@ -11102,18 +10979,18 @@
           <wp:inline>
             <wp:extent cx="4907280" cy="2826593"/>
             <wp:effectExtent b="0" l="0" r="0" t="0"/>
-            <wp:docPr descr="" title="" id="67" name="Picture"/>
+            <wp:docPr descr="" title="" id="65" name="Picture"/>
             <a:graphic>
               <a:graphicData uri="http://schemas.openxmlformats.org/drawingml/2006/picture">
                 <pic:pic>
                   <pic:nvPicPr>
-                    <pic:cNvPr descr="短期模型统计审计.png" id="68" name="Picture"/>
+                    <pic:cNvPr descr="短期模型统计审计.png" id="66" name="Picture"/>
                     <pic:cNvPicPr>
                       <a:picLocks noChangeArrowheads="1" noChangeAspect="1"/>
                     </pic:cNvPicPr>
                   </pic:nvPicPr>
                   <pic:blipFill>
-                    <a:blip r:embed="rId66"/>
+                    <a:blip r:embed="rId64"/>
                     <a:stretch>
                       <a:fillRect/>
                     </a:stretch>
@@ -11227,16 +11104,52 @@
         <w:rPr>
           <w:rFonts w:hint="eastAsia"/>
         </w:rPr>
-        <w:t xml:space="preserve">语言在本文中的定位是计量审计辅助层，而不是替代</w:t>
-      </w:r>
-      <w:r>
-        <w:t xml:space="preserve"> Python </w:t>
-      </w:r>
-      <w:r>
-        <w:rPr>
-          <w:rFonts w:hint="eastAsia"/>
-        </w:rPr>
-        <w:t xml:space="preserve">主模型。当前项目已保留可选</w:t>
+        <w:t xml:space="preserve">语言用于独立复核</w:t>
+      </w:r>
+      <w:r>
+        <w:t xml:space="preserve"> </w:t>
+      </w:r>
+      <w:r>
+        <w:rPr>
+          <w:rFonts w:hint="eastAsia"/>
+        </w:rPr>
+        <w:t xml:space="preserve">DM、方向命中、Ljung–Box、ADF、ARCH/GARCH</w:t>
+      </w:r>
+      <w:r>
+        <w:t xml:space="preserve"> </w:t>
+      </w:r>
+      <w:r>
+        <w:rPr>
+          <w:rFonts w:hint="eastAsia"/>
+        </w:rPr>
+        <w:t xml:space="preserve">和</w:t>
+      </w:r>
+      <w:r>
+        <w:t xml:space="preserve"> Newey–West </w:t>
+      </w:r>
+      <w:r>
+        <w:rPr>
+          <w:rFonts w:hint="eastAsia"/>
+        </w:rPr>
+        <w:t xml:space="preserve">稳健校准回归等计量检验。R</w:t>
+      </w:r>
+      <w:r>
+        <w:t xml:space="preserve"> </w:t>
+      </w:r>
+      <w:r>
+        <w:rPr>
+          <w:rFonts w:hint="eastAsia"/>
+        </w:rPr>
+        <w:t xml:space="preserve">审计显示，价格水平和对数价格不能拒绝单位根假设，而对数收益率可拒绝单位根假设；GARCH(1,1)</w:t>
+      </w:r>
+      <w:r>
+        <w:t xml:space="preserve"> </w:t>
+      </w:r>
+      <w:r>
+        <w:rPr>
+          <w:rFonts w:hint="eastAsia"/>
+        </w:rPr>
+        <w:t xml:space="preserve">在短样本下提示波动持续性，但不替代机制递推主模型。除计量检验外，本文还使用</w:t>
       </w:r>
       <w:r>
         <w:t xml:space="preserve"> R </w:t>
@@ -11245,83 +11158,90 @@
         <w:rPr>
           <w:rFonts w:hint="eastAsia"/>
         </w:rPr>
-        <w:t xml:space="preserve">审计脚本，用于独立复核</w:t>
-      </w:r>
-      <w:r>
-        <w:t xml:space="preserve"> DM </w:t>
-      </w:r>
-      <w:r>
-        <w:rPr>
-          <w:rFonts w:hint="eastAsia"/>
-        </w:rPr>
-        <w:t xml:space="preserve">检验、方向检验、Ljung–Box</w:t>
-      </w:r>
-      <w:r>
-        <w:t xml:space="preserve"> </w:t>
-      </w:r>
-      <w:r>
-        <w:rPr>
-          <w:rFonts w:hint="eastAsia"/>
-        </w:rPr>
-        <w:t xml:space="preserve">残差诊断，并补充</w:t>
-      </w:r>
-      <w:r>
-        <w:t xml:space="preserve"> ADF </w:t>
-      </w:r>
-      <w:r>
-        <w:rPr>
-          <w:rFonts w:hint="eastAsia"/>
-        </w:rPr>
-        <w:t xml:space="preserve">平稳性检验、ARCH/GARCH</w:t>
-      </w:r>
-      <w:r>
-        <w:t xml:space="preserve"> </w:t>
-      </w:r>
-      <w:r>
-        <w:rPr>
-          <w:rFonts w:hint="eastAsia"/>
-        </w:rPr>
-        <w:t xml:space="preserve">波动聚集审计和</w:t>
-      </w:r>
-      <w:r>
-        <w:t xml:space="preserve"> Newey–West </w:t>
-      </w:r>
-      <w:r>
-        <w:rPr>
-          <w:rFonts w:hint="eastAsia"/>
-        </w:rPr>
-        <w:t xml:space="preserve">稳健校准回归。R</w:t>
-      </w:r>
-      <w:r>
-        <w:t xml:space="preserve"> </w:t>
-      </w:r>
-      <w:r>
-        <w:rPr>
-          <w:rFonts w:hint="eastAsia"/>
-        </w:rPr>
-        <w:t xml:space="preserve">审计显示，价格水平和对数价格不能拒绝单位根假设，而对数收益率可拒绝单位根假设，这与金融时间序列通常应在收益率层面开展统计建模的经验一致；GARCH(1,1)</w:t>
-      </w:r>
-      <w:r>
-        <w:t xml:space="preserve"> </w:t>
-      </w:r>
-      <w:r>
-        <w:rPr>
-          <w:rFonts w:hint="eastAsia"/>
-        </w:rPr>
-        <w:t xml:space="preserve">在短样本下给出较高波动持续性，仅作为冲突窗口波动聚集的提示，不替代机制递推主模型。主模型仍由</w:t>
-      </w:r>
-      <w:r>
-        <w:t xml:space="preserve"> Python </w:t>
-      </w:r>
-      <w:r>
-        <w:rPr>
-          <w:rFonts w:hint="eastAsia"/>
-        </w:rPr>
-        <w:t xml:space="preserve">完整复现，避免在交付阶段引入不必要的多语言依赖。</w:t>
-      </w:r>
-    </w:p>
-    <w:bookmarkEnd w:id="69"/>
-    <w:bookmarkStart w:id="70" w:name="机制消融的定量证据"/>
+        <w:t xml:space="preserve">的</w:t>
+      </w:r>
+      <w:r>
+        <w:t xml:space="preserve"> ggplot2 </w:t>
+      </w:r>
+      <w:r>
+        <w:rPr>
+          <w:rFonts w:hint="eastAsia"/>
+        </w:rPr>
+        <w:t xml:space="preserve">对关键证据图进行学术化重绘。</w:t>
+      </w:r>
+    </w:p>
+    <w:p>
+      <w:pPr>
+        <w:pStyle w:val="CaptionedFigure"/>
+      </w:pPr>
+      <w:r>
+        <w:drawing>
+          <wp:inline>
+            <wp:extent cx="4907280" cy="2892712"/>
+            <wp:effectExtent b="0" l="0" r="0" t="0"/>
+            <wp:docPr descr="" title="" id="68" name="Picture"/>
+            <a:graphic>
+              <a:graphicData uri="http://schemas.openxmlformats.org/drawingml/2006/picture">
+                <pic:pic>
+                  <pic:nvPicPr>
+                    <pic:cNvPr descr="R短期误差学术诊断.png" id="69" name="Picture"/>
+                    <pic:cNvPicPr>
+                      <a:picLocks noChangeArrowheads="1" noChangeAspect="1"/>
+                    </pic:cNvPicPr>
+                  </pic:nvPicPr>
+                  <pic:blipFill>
+                    <a:blip r:embed="rId67"/>
+                    <a:stretch>
+                      <a:fillRect/>
+                    </a:stretch>
+                  </pic:blipFill>
+                  <pic:spPr bwMode="auto">
+                    <a:xfrm>
+                      <a:off x="0" y="0"/>
+                      <a:ext cx="4907280" cy="2892712"/>
+                    </a:xfrm>
+                    <a:prstGeom prst="rect">
+                      <a:avLst/>
+                    </a:prstGeom>
+                    <a:noFill/>
+                    <a:ln w="9525">
+                      <a:noFill/>
+                      <a:headEnd/>
+                      <a:tailEnd/>
+                    </a:ln>
+                  </pic:spPr>
+                </pic:pic>
+              </a:graphicData>
+            </a:graphic>
+          </wp:inline>
+        </w:drawing>
+      </w:r>
+    </w:p>
+    <w:p>
+      <w:pPr>
+        <w:pStyle w:val="ImageCaption"/>
+      </w:pPr>
+      <w:r>
+        <w:t xml:space="preserve">R/ggplot2 </w:t>
+      </w:r>
+      <w:r>
+        <w:rPr>
+          <w:rFonts w:hint="eastAsia"/>
+        </w:rPr>
+        <w:t xml:space="preserve">短期误差学术诊断。柱形表示每日残差，黑线为</w:t>
+      </w:r>
+      <w:r>
+        <w:t xml:space="preserve"> LOESS </w:t>
+      </w:r>
+      <w:r>
+        <w:rPr>
+          <w:rFonts w:hint="eastAsia"/>
+        </w:rPr>
+        <w:t xml:space="preserve">平滑趋势，用于观察模型是否存在持续系统偏差。</w:t>
+      </w:r>
+    </w:p>
+    <w:bookmarkEnd w:id="70"/>
+    <w:bookmarkStart w:id="71" w:name="机制消融的定量证据"/>
     <w:p>
       <w:pPr>
         <w:pStyle w:val="Heading2"/>
@@ -12242,8 +12162,8 @@
         <w:t xml:space="preserve">10.09，说明市场对政策缓冲和运输恢复的预期并不是可有可无的修饰，而是解释后期回落的关键机制。</w:t>
       </w:r>
     </w:p>
-    <w:bookmarkEnd w:id="70"/>
-    <w:bookmarkStart w:id="74" w:name="拐点预测步长与事件边界"/>
+    <w:bookmarkEnd w:id="71"/>
+    <w:bookmarkStart w:id="75" w:name="拐点预测步长与事件边界"/>
     <w:p>
       <w:pPr>
         <w:pStyle w:val="Heading2"/>
@@ -12366,18 +12286,18 @@
           <wp:inline>
             <wp:extent cx="4907280" cy="3568930"/>
             <wp:effectExtent b="0" l="0" r="0" t="0"/>
-            <wp:docPr descr="" title="" id="72" name="Picture"/>
+            <wp:docPr descr="" title="" id="73" name="Picture"/>
             <a:graphic>
               <a:graphicData uri="http://schemas.openxmlformats.org/drawingml/2006/picture">
                 <pic:pic>
                   <pic:nvPicPr>
-                    <pic:cNvPr descr="短期模型拐点局部检验.png" id="73" name="Picture"/>
+                    <pic:cNvPr descr="短期模型拐点局部检验.png" id="74" name="Picture"/>
                     <pic:cNvPicPr>
                       <a:picLocks noChangeArrowheads="1" noChangeAspect="1"/>
                     </pic:cNvPicPr>
                   </pic:nvPicPr>
                   <pic:blipFill>
-                    <a:blip r:embed="rId71"/>
+                    <a:blip r:embed="rId72"/>
                     <a:stretch>
                       <a:fillRect/>
                     </a:stretch>
@@ -12444,8 +12364,8 @@
         <w:t xml:space="preserve">年等非霍尔木兹事件窗口。结果显示，该模型在这些窗口通常显著弱于朴素上一日基准。这并不削弱本文结论，反而说明本文模型不是通用油价短线交易器，而是针对霍尔木兹封锁机制构建的事件解释模型。论文结论应限定在极端地缘冲突下的条件路径解释与情景预测，不能外推为普通时期的万能预测模型。</w:t>
       </w:r>
     </w:p>
-    <w:bookmarkEnd w:id="74"/>
-    <w:bookmarkStart w:id="78" w:name="参数自由度与稳健性区间"/>
+    <w:bookmarkEnd w:id="75"/>
+    <w:bookmarkStart w:id="79" w:name="参数自由度与稳健性区间"/>
     <w:p>
       <w:pPr>
         <w:pStyle w:val="Heading2"/>
@@ -13091,18 +13011,18 @@
           <wp:inline>
             <wp:extent cx="4907280" cy="2587474"/>
             <wp:effectExtent b="0" l="0" r="0" t="0"/>
-            <wp:docPr descr="" title="" id="76" name="Picture"/>
+            <wp:docPr descr="" title="" id="77" name="Picture"/>
             <a:graphic>
               <a:graphicData uri="http://schemas.openxmlformats.org/drawingml/2006/picture">
                 <pic:pic>
                   <pic:nvPicPr>
-                    <pic:cNvPr descr="短期模型稳健性带.png" id="77" name="Picture"/>
+                    <pic:cNvPr descr="短期模型稳健性带.png" id="78" name="Picture"/>
                     <pic:cNvPicPr>
                       <a:picLocks noChangeArrowheads="1" noChangeAspect="1"/>
                     </pic:cNvPicPr>
                   </pic:nvPicPr>
                   <pic:blipFill>
-                    <a:blip r:embed="rId75"/>
+                    <a:blip r:embed="rId76"/>
                     <a:stretch>
                       <a:fillRect/>
                     </a:stretch>
@@ -13277,8 +13197,55 @@
         <w:t xml:space="preserve">美元/桶，说明最优参数附近存在稳定的优秀参数邻域。</w:t>
       </w:r>
     </w:p>
-    <w:bookmarkEnd w:id="78"/>
-    <w:bookmarkStart w:id="79" w:name="内生性反事实基准与硬编码审计"/>
+    <w:p>
+      <w:pPr>
+        <w:pStyle w:val="BodyText"/>
+      </w:pPr>
+      <w:r>
+        <w:rPr>
+          <w:rFonts w:hint="eastAsia"/>
+        </w:rPr>
+        <w:t xml:space="preserve">针对多目标校准权重可能成为隐藏超参数的问题，本文进一步对已保存的前</w:t>
+      </w:r>
+      <w:r>
+        <w:t xml:space="preserve"> 10 </w:t>
+      </w:r>
+      <w:r>
+        <w:rPr>
+          <w:rFonts w:hint="eastAsia"/>
+        </w:rPr>
+        <w:t xml:space="preserve">个候选参数进行权重敏感性重排。将峰值误差、末日误差、分段</w:t>
+      </w:r>
+      <w:r>
+        <w:t xml:space="preserve"> RMSE </w:t>
+      </w:r>
+      <w:r>
+        <w:rPr>
+          <w:rFonts w:hint="eastAsia"/>
+        </w:rPr>
+        <w:t xml:space="preserve">等权重整体上调或下调</w:t>
+      </w:r>
+      <w:r>
+        <w:t xml:space="preserve"> </w:t>
+      </w:r>
+      <w:r>
+        <w:rPr>
+          <w:rFonts w:hint="eastAsia"/>
+        </w:rPr>
+        <w:t xml:space="preserve">20%，并分别强化峰值末日、分段误差和平台误差后，当前综合最优候选在</w:t>
+      </w:r>
+      <w:r>
+        <w:t xml:space="preserve"> 6/6 </w:t>
+      </w:r>
+      <w:r>
+        <w:rPr>
+          <w:rFonts w:hint="eastAsia"/>
+        </w:rPr>
+        <w:t xml:space="preserve">个权重情景下仍保持第一。该检验不等同于重新全局校准，但说明当前候选并非只依赖某一组精确权重偶然胜出。</w:t>
+      </w:r>
+    </w:p>
+    <w:bookmarkEnd w:id="79"/>
+    <w:bookmarkStart w:id="80" w:name="内生性反事实基准与硬编码审计"/>
     <w:p>
       <w:pPr>
         <w:pStyle w:val="Heading2"/>
@@ -13575,8 +13542,8 @@
         <w:t xml:space="preserve">美元平台不是代码硬上限，但不应声称已经实现了多智能体动态纳什均衡。</w:t>
       </w:r>
     </w:p>
-    <w:bookmarkEnd w:id="79"/>
-    <w:bookmarkStart w:id="81" w:name="反驳性检验总览"/>
+    <w:bookmarkEnd w:id="80"/>
+    <w:bookmarkStart w:id="82" w:name="反驳性检验总览"/>
     <w:p>
       <w:pPr>
         <w:pStyle w:val="Heading2"/>
@@ -13619,7 +13586,7 @@
         <w:t xml:space="preserve">中的检验均不重新寻找最优参数，而是在同一模型框架下改变某个被质疑条件，观察结论是否被推翻。</w:t>
       </w:r>
     </w:p>
-    <w:bookmarkStart w:id="80" w:name="tab:adversarial-tests"/>
+    <w:bookmarkStart w:id="81" w:name="tab:adversarial-tests"/>
     <w:p>
       <w:pPr>
         <w:pStyle w:val="TableCaption"/>
@@ -14368,10 +14335,10 @@
         </w:tc>
       </w:tr>
     </w:tbl>
-    <w:bookmarkEnd w:id="80"/>
     <w:bookmarkEnd w:id="81"/>
     <w:bookmarkEnd w:id="82"/>
-    <w:bookmarkStart w:id="95" w:name="天三情景预测"/>
+    <w:bookmarkEnd w:id="83"/>
+    <w:bookmarkStart w:id="100" w:name="天三情景预测"/>
     <w:p>
       <w:pPr>
         <w:pStyle w:val="Heading1"/>
@@ -14386,7 +14353,7 @@
         <w:t xml:space="preserve">天三情景预测</w:t>
       </w:r>
     </w:p>
-    <w:bookmarkStart w:id="83" w:name="情景设定"/>
+    <w:bookmarkStart w:id="84" w:name="情景设定"/>
     <w:p>
       <w:pPr>
         <w:pStyle w:val="Heading2"/>
@@ -14444,7 +14411,7 @@
         <w:rPr>
           <w:rFonts w:hint="eastAsia"/>
         </w:rPr>
-        <w:t xml:space="preserve">需要特别说明，长期部分不能称为</w:t>
+        <w:t xml:space="preserve">长期部分不能称为</w:t>
       </w:r>
       <w:r>
         <w:rPr>
@@ -14456,7 +14423,7 @@
         <w:rPr>
           <w:rFonts w:hint="eastAsia"/>
         </w:rPr>
-        <w:t xml:space="preserve">。原因是赛题附件只提供到</w:t>
+        <w:t xml:space="preserve">：赛题附件只提供到</w:t>
       </w:r>
       <w:r>
         <w:t xml:space="preserve"> 2026 </w:t>
@@ -14483,7 +14450,7 @@
         <w:rPr>
           <w:rFonts w:hint="eastAsia"/>
         </w:rPr>
-        <w:t xml:space="preserve">天区间没有可用于事后对照的真实观测值。因此本文对长期部分采用</w:t>
+        <w:t xml:space="preserve">天区间没有可用于事后对照的真实观测值。因此本文采用</w:t>
       </w:r>
       <w:r>
         <w:rPr>
@@ -14507,118 +14474,7 @@
         <w:rPr>
           <w:rFonts w:hint="eastAsia"/>
         </w:rPr>
-        <w:t xml:space="preserve">的表述：短期窗口负责校准机制，长期窗口负责在不同政策和市场条件下外推价格路径。</w:t>
-      </w:r>
-    </w:p>
-    <w:p>
-      <w:pPr>
-        <w:pStyle w:val="BodyText"/>
-      </w:pPr>
-      <w:r>
-        <w:rPr>
-          <w:rFonts w:hint="eastAsia"/>
-        </w:rPr>
-        <w:t xml:space="preserve">长期三情景图中的单条曲线是条件中心路径，而不是对未来每日收盘价的精确点预测。其形状较平滑，是因为模型刻画的是供应恢复、SPR</w:t>
-      </w:r>
-      <w:r>
-        <w:t xml:space="preserve"> </w:t>
-      </w:r>
-      <w:r>
-        <w:rPr>
-          <w:rFonts w:hint="eastAsia"/>
-        </w:rPr>
-        <w:t xml:space="preserve">收缩、需求弹性调整和风险溢价衰减等慢变量；真实市场中的新闻冲击、风险偏好变化和短期波动会使实际价格围绕中心路径震荡。因此，本文不以中性线是否逐日命中未来价格作为长期模型质量标准，而以机制合理性、官方外生数据审计、敏感性分析和蒙特卡洛概率区间共同评价长期预测可信度。</w:t>
-      </w:r>
-    </w:p>
-    <w:p>
-      <w:pPr>
-        <w:pStyle w:val="BodyText"/>
-      </w:pPr>
-      <w:r>
-        <w:rPr>
-          <w:rFonts w:hint="eastAsia"/>
-        </w:rPr>
-        <w:t xml:space="preserve">换言之，长期部分的正确读法不是</w:t>
-      </w:r>
-      <w:r>
-        <w:rPr>
-          <w:rFonts w:hint="eastAsia"/>
-        </w:rPr>
-        <w:t xml:space="preserve">“第</w:t>
-      </w:r>
-      <w:r>
-        <w:t xml:space="preserve"> 180 </w:t>
-      </w:r>
-      <w:r>
-        <w:rPr>
-          <w:rFonts w:hint="eastAsia"/>
-        </w:rPr>
-        <w:t xml:space="preserve">天一定等于</w:t>
-      </w:r>
-      <w:r>
-        <w:t xml:space="preserve"> 92.43 </w:t>
-      </w:r>
-      <w:r>
-        <w:rPr>
-          <w:rFonts w:hint="eastAsia"/>
-        </w:rPr>
-        <w:t xml:space="preserve">美元/桶”</w:t>
-      </w:r>
-      <w:r>
-        <w:rPr>
-          <w:rFonts w:hint="eastAsia"/>
-        </w:rPr>
-        <w:t xml:space="preserve">，而是</w:t>
-      </w:r>
-      <w:r>
-        <w:rPr>
-          <w:rFonts w:hint="eastAsia"/>
-        </w:rPr>
-        <w:t xml:space="preserve">“在中性政策缓冲、供给恢复和风险溢价衰减假设下，中心路径回归到低</w:t>
-      </w:r>
-      <w:r>
-        <w:t xml:space="preserve"> 90 </w:t>
-      </w:r>
-      <w:r>
-        <w:rPr>
-          <w:rFonts w:hint="eastAsia"/>
-        </w:rPr>
-        <w:t xml:space="preserve">美元/桶附近；若多个不利因素同时出现，价格仍可能进入</w:t>
-      </w:r>
-      <w:r>
-        <w:t xml:space="preserve"> 120 </w:t>
-      </w:r>
-      <w:r>
-        <w:rPr>
-          <w:rFonts w:hint="eastAsia"/>
-        </w:rPr>
-        <w:t xml:space="preserve">美元/桶以上的尾部区间”</w:t>
-      </w:r>
-      <w:r>
-        <w:rPr>
-          <w:rFonts w:hint="eastAsia"/>
-        </w:rPr>
-        <w:t xml:space="preserve">。因此，三情景中心线需要与第</w:t>
-      </w:r>
-      <w:r>
-        <w:t xml:space="preserve"> </w:t>
-      </w:r>
-      <w:hyperlink w:anchor="sec:monte-carlo">
-        <w:r>
-          <w:rPr>
-            <w:rStyle w:val="Hyperlink"/>
-          </w:rPr>
-          <w:t xml:space="preserve">9.3</w:t>
-        </w:r>
-      </w:hyperlink>
-      <w:r>
-        <w:t xml:space="preserve"> </w:t>
-      </w:r>
-      <w:r>
-        <w:rPr>
-          <w:rFonts w:hint="eastAsia"/>
-        </w:rPr>
-        <w:t xml:space="preserve">节蒙特卡洛扇形区间合读。</w:t>
+        <w:t xml:space="preserve">的表述。三情景曲线表示条件中心路径，而不是未来每日收盘价的精确点预测；其可信度由机制一致性、官方外生数据审计、敏感性分析、蒙特卡洛概率区间和状态转移扰动共同评价。</w:t>
       </w:r>
     </w:p>
     <w:p>
@@ -16147,6 +16003,68 @@
               <w:jc w:val="left"/>
             </w:pPr>
             <w:r>
+              <w:t xml:space="preserve">SPR </w:t>
+            </w:r>
+            <w:r>
+              <w:rPr>
+                <w:rFonts w:hint="eastAsia"/>
+              </w:rPr>
+              <w:t xml:space="preserve">收缩起点</w:t>
+            </w:r>
+          </w:p>
+        </w:tc>
+        <w:tc>
+          <w:tcPr/>
+          <w:p>
+            <w:pPr>
+              <w:pStyle w:val="Compact"/>
+              <w:jc w:val="right"/>
+            </w:pPr>
+            <w:r>
+              <w:t xml:space="preserve">75</w:t>
+            </w:r>
+          </w:p>
+        </w:tc>
+        <w:tc>
+          <w:tcPr/>
+          <w:p>
+            <w:pPr>
+              <w:pStyle w:val="Compact"/>
+              <w:jc w:val="right"/>
+            </w:pPr>
+            <w:r>
+              <w:t xml:space="preserve">60–105</w:t>
+            </w:r>
+          </w:p>
+        </w:tc>
+        <w:tc>
+          <w:tcPr/>
+          <w:p>
+            <w:pPr>
+              <w:pStyle w:val="Compact"/>
+              <w:jc w:val="left"/>
+            </w:pPr>
+            <w:r>
+              <w:t xml:space="preserve">SPR </w:t>
+            </w:r>
+            <w:r>
+              <w:rPr>
+                <w:rFonts w:hint="eastAsia"/>
+              </w:rPr>
+              <w:t xml:space="preserve">从应急计划释放转向缺口驱动收缩的开始时间</w:t>
+            </w:r>
+          </w:p>
+        </w:tc>
+      </w:tr>
+      <w:tr>
+        <w:tc>
+          <w:tcPr/>
+          <w:p>
+            <w:pPr>
+              <w:pStyle w:val="Compact"/>
+              <w:jc w:val="left"/>
+            </w:pPr>
+            <w:r>
               <w:rPr>
                 <w:rFonts w:hint="eastAsia"/>
               </w:rPr>
@@ -16801,8 +16719,8 @@
         <w:t xml:space="preserve">释放受限、绕道能力偏低且制度风险溢价持续；中性情景则采用综合最优参数附近的中心设定。后续敏感性分析和蒙特卡洛抽样用于检验：当这些假设联合变化时，价格中心路径和尾部风险是否仍保持一致。</w:t>
       </w:r>
     </w:p>
-    <w:bookmarkEnd w:id="83"/>
-    <w:bookmarkStart w:id="94" w:name="预测结果"/>
+    <w:bookmarkEnd w:id="84"/>
+    <w:bookmarkStart w:id="99" w:name="预测结果"/>
     <w:p>
       <w:pPr>
         <w:pStyle w:val="Heading2"/>
@@ -17283,7 +17201,7 @@
         </w:tc>
       </w:tr>
     </w:tbl>
-    <w:bookmarkStart w:id="87" w:name="fig:long-term-fan"/>
+    <w:bookmarkStart w:id="88" w:name="fig:long-term-fan"/>
     <w:p>
       <w:pPr>
         <w:pStyle w:val="CaptionedFigure"/>
@@ -17293,18 +17211,18 @@
           <wp:inline>
             <wp:extent cx="5013960" cy="2790377"/>
             <wp:effectExtent b="0" l="0" r="0" t="0"/>
-            <wp:docPr descr="" title="" id="85" name="Picture"/>
+            <wp:docPr descr="" title="" id="86" name="Picture"/>
             <a:graphic>
               <a:graphicData uri="http://schemas.openxmlformats.org/drawingml/2006/picture">
                 <pic:pic>
                   <pic:nvPicPr>
-                    <pic:cNvPr descr="monte_carlo_price_fan.png" id="86" name="Picture"/>
+                    <pic:cNvPr descr="蒙特卡洛价格扇形区间.png" id="87" name="Picture"/>
                     <pic:cNvPicPr>
                       <a:picLocks noChangeArrowheads="1" noChangeAspect="1"/>
                     </pic:cNvPicPr>
                   </pic:nvPicPr>
                   <pic:blipFill>
-                    <a:blip r:embed="rId84"/>
+                    <a:blip r:embed="rId85"/>
                     <a:stretch>
                       <a:fillRect/>
                     </a:stretch>
@@ -17360,7 +17278,7 @@
         <w:t xml:space="preserve">5%–95%。三情景中心路径应与该区间共同解读。</w:t>
       </w:r>
     </w:p>
-    <w:bookmarkEnd w:id="87"/>
+    <w:bookmarkEnd w:id="88"/>
     <w:p>
       <w:pPr>
         <w:pStyle w:val="CaptionedFigure"/>
@@ -17370,18 +17288,18 @@
           <wp:inline>
             <wp:extent cx="5013960" cy="2757678"/>
             <wp:effectExtent b="0" l="0" r="0" t="0"/>
-            <wp:docPr descr="" title="" id="89" name="Picture"/>
+            <wp:docPr descr="" title="" id="90" name="Picture"/>
             <a:graphic>
               <a:graphicData uri="http://schemas.openxmlformats.org/drawingml/2006/picture">
                 <pic:pic>
                   <pic:nvPicPr>
-                    <pic:cNvPr descr="短期拟合与长期预测总览.png" id="90" name="Picture"/>
+                    <pic:cNvPr descr="短期拟合与长期预测总览.png" id="91" name="Picture"/>
                     <pic:cNvPicPr>
                       <a:picLocks noChangeArrowheads="1" noChangeAspect="1"/>
                     </pic:cNvPicPr>
                   </pic:nvPicPr>
                   <pic:blipFill>
-                    <a:blip r:embed="rId88"/>
+                    <a:blip r:embed="rId89"/>
                     <a:stretch>
                       <a:fillRect/>
                     </a:stretch>
@@ -17436,6 +17354,89 @@
         <w:rPr>
           <w:rFonts w:hint="eastAsia"/>
         </w:rPr>
+        <w:t xml:space="preserve">为了回应</w:t>
+      </w:r>
+      <w:r>
+        <w:rPr>
+          <w:rFonts w:hint="eastAsia"/>
+        </w:rPr>
+        <w:t xml:space="preserve">“中性预测线过于平直”</w:t>
+      </w:r>
+      <w:r>
+        <w:rPr>
+          <w:rFonts w:hint="eastAsia"/>
+        </w:rPr>
+        <w:t xml:space="preserve">的问题，本文额外建立状态转移扰动层。该层不改变三情景物理中心路径，而是让未来状态在缓和、维持和升级之间随机切换：缓和状态向乐观中心靠近，维持状态围绕中性中心，升级状态向悲观中心和跳涨方向移动；扰动强度由附件历史价格波动估计后进行保守折扣。这样得到的长期图不再是一条孤立直线，而是中心路径、状态概率和尾部区间的组合。</w:t>
+      </w:r>
+    </w:p>
+    <w:bookmarkStart w:id="95" w:name="fig:state-transition-fan"/>
+    <w:p>
+      <w:pPr>
+        <w:pStyle w:val="CaptionedFigure"/>
+      </w:pPr>
+      <w:r>
+        <w:drawing>
+          <wp:inline>
+            <wp:extent cx="5013960" cy="3654242"/>
+            <wp:effectExtent b="0" l="0" r="0" t="0"/>
+            <wp:docPr descr="" title="" id="93" name="Picture"/>
+            <a:graphic>
+              <a:graphicData uri="http://schemas.openxmlformats.org/drawingml/2006/picture">
+                <pic:pic>
+                  <pic:nvPicPr>
+                    <pic:cNvPr descr="长期状态转移情景树.png" id="94" name="Picture"/>
+                    <pic:cNvPicPr>
+                      <a:picLocks noChangeArrowheads="1" noChangeAspect="1"/>
+                    </pic:cNvPicPr>
+                  </pic:nvPicPr>
+                  <pic:blipFill>
+                    <a:blip r:embed="rId92"/>
+                    <a:stretch>
+                      <a:fillRect/>
+                    </a:stretch>
+                  </pic:blipFill>
+                  <pic:spPr bwMode="auto">
+                    <a:xfrm>
+                      <a:off x="0" y="0"/>
+                      <a:ext cx="5013960" cy="3654242"/>
+                    </a:xfrm>
+                    <a:prstGeom prst="rect">
+                      <a:avLst/>
+                    </a:prstGeom>
+                    <a:noFill/>
+                    <a:ln w="9525">
+                      <a:noFill/>
+                      <a:headEnd/>
+                      <a:tailEnd/>
+                    </a:ln>
+                  </pic:spPr>
+                </pic:pic>
+              </a:graphicData>
+            </a:graphic>
+          </wp:inline>
+        </w:drawing>
+      </w:r>
+    </w:p>
+    <w:p>
+      <w:pPr>
+        <w:pStyle w:val="ImageCaption"/>
+      </w:pPr>
+      <w:r>
+        <w:rPr>
+          <w:rFonts w:hint="eastAsia"/>
+        </w:rPr>
+        <w:t xml:space="preserve">长期状态转移情景树。上图为状态转移后的价格扇形区间，下图为缓和、维持、升级三类状态的样本占比。</w:t>
+      </w:r>
+    </w:p>
+    <w:bookmarkEnd w:id="95"/>
+    <w:p>
+      <w:pPr>
+        <w:pStyle w:val="BodyText"/>
+      </w:pPr>
+      <w:r>
+        <w:rPr>
+          <w:rFonts w:hint="eastAsia"/>
+        </w:rPr>
         <w:t xml:space="preserve">结果显示，中性情景下价格在</w:t>
       </w:r>
       <w:r>
@@ -17481,7 +17482,52 @@
         <w:rPr>
           <w:rFonts w:hint="eastAsia"/>
         </w:rPr>
-        <w:t xml:space="preserve">美元/桶的高点。</w:t>
+        <w:t xml:space="preserve">美元/桶的高点。状态转移增强模型进一步给出第</w:t>
+      </w:r>
+      <w:r>
+        <w:t xml:space="preserve"> 180 </w:t>
+      </w:r>
+      <w:r>
+        <w:rPr>
+          <w:rFonts w:hint="eastAsia"/>
+        </w:rPr>
+        <w:t xml:space="preserve">天</w:t>
+      </w:r>
+      <w:r>
+        <w:t xml:space="preserve"> 5%–95% </w:t>
+      </w:r>
+      <w:r>
+        <w:rPr>
+          <w:rFonts w:hint="eastAsia"/>
+        </w:rPr>
+        <w:t xml:space="preserve">条件区间</w:t>
+      </w:r>
+      <w:r>
+        <w:t xml:space="preserve"> 85.43–93.99 </w:t>
+      </w:r>
+      <w:r>
+        <w:rPr>
+          <w:rFonts w:hint="eastAsia"/>
+        </w:rPr>
+        <w:t xml:space="preserve">美元/桶，外推期最高价</w:t>
+      </w:r>
+      <w:r>
+        <w:t xml:space="preserve"> P95 </w:t>
+      </w:r>
+      <w:r>
+        <w:rPr>
+          <w:rFonts w:hint="eastAsia"/>
+        </w:rPr>
+        <w:t xml:space="preserve">为</w:t>
+      </w:r>
+      <w:r>
+        <w:t xml:space="preserve"> 124.61 </w:t>
+      </w:r>
+      <w:r>
+        <w:rPr>
+          <w:rFonts w:hint="eastAsia"/>
+        </w:rPr>
+        <w:t xml:space="preserve">美元/桶，说明长期中心路径的日度精度不能单独夸大，真正应关注的是尾部区间和状态切换风险。</w:t>
       </w:r>
     </w:p>
     <w:p>
@@ -17808,6 +17854,98 @@
           </w:p>
         </w:tc>
       </w:tr>
+      <w:tr>
+        <w:tc>
+          <w:tcPr/>
+          <w:p>
+            <w:pPr>
+              <w:pStyle w:val="Compact"/>
+              <w:jc w:val="left"/>
+            </w:pPr>
+            <w:r>
+              <w:rPr>
+                <w:rFonts w:hint="eastAsia"/>
+              </w:rPr>
+              <w:t xml:space="preserve">状态转移情景树</w:t>
+            </w:r>
+          </w:p>
+        </w:tc>
+        <w:tc>
+          <w:tcPr/>
+          <w:p>
+            <w:pPr>
+              <w:pStyle w:val="Compact"/>
+              <w:jc w:val="left"/>
+            </w:pPr>
+            <w:r>
+              <w:rPr>
+                <w:rFonts w:hint="eastAsia"/>
+              </w:rPr>
+              <w:t xml:space="preserve">第</w:t>
+            </w:r>
+            <w:r>
+              <w:t xml:space="preserve"> 180 </w:t>
+            </w:r>
+            <w:r>
+              <w:rPr>
+                <w:rFonts w:hint="eastAsia"/>
+              </w:rPr>
+              <w:t xml:space="preserve">天价格</w:t>
+            </w:r>
+            <w:r>
+              <w:t xml:space="preserve"> P05–P95 </w:t>
+            </w:r>
+            <w:r>
+              <w:rPr>
+                <w:rFonts w:hint="eastAsia"/>
+              </w:rPr>
+              <w:t xml:space="preserve">为</w:t>
+            </w:r>
+            <w:r>
+              <w:t xml:space="preserve"> 85.43–93.99 </w:t>
+            </w:r>
+            <w:r>
+              <w:rPr>
+                <w:rFonts w:hint="eastAsia"/>
+              </w:rPr>
+              <w:t xml:space="preserve">美元/桶，外推期最高价</w:t>
+            </w:r>
+            <w:r>
+              <w:t xml:space="preserve"> P95 </w:t>
+            </w:r>
+            <w:r>
+              <w:rPr>
+                <w:rFonts w:hint="eastAsia"/>
+              </w:rPr>
+              <w:t xml:space="preserve">为</w:t>
+            </w:r>
+            <w:r>
+              <w:t xml:space="preserve"> 124.61 </w:t>
+            </w:r>
+            <w:r>
+              <w:rPr>
+                <w:rFonts w:hint="eastAsia"/>
+              </w:rPr>
+              <w:t xml:space="preserve">美元/桶</w:t>
+            </w:r>
+          </w:p>
+        </w:tc>
+        <w:tc>
+          <w:tcPr/>
+          <w:p>
+            <w:pPr>
+              <w:pStyle w:val="Compact"/>
+              <w:jc w:val="left"/>
+            </w:pPr>
+            <w:r>
+              <w:rPr>
+                <w:rFonts w:hint="eastAsia"/>
+              </w:rPr>
+              <w:t xml:space="preserve">用于解释平滑中心线之外的事件状态切换和短期扰动，不代表未来真实价格已被观测</w:t>
+            </w:r>
+          </w:p>
+        </w:tc>
+      </w:tr>
     </w:tbl>
     <w:p>
       <w:pPr>
@@ -18014,18 +18152,18 @@
           <wp:inline>
             <wp:extent cx="4907280" cy="3413760"/>
             <wp:effectExtent b="0" l="0" r="0" t="0"/>
-            <wp:docPr descr="" title="" id="92" name="Picture"/>
+            <wp:docPr descr="" title="" id="97" name="Picture"/>
             <a:graphic>
               <a:graphicData uri="http://schemas.openxmlformats.org/drawingml/2006/picture">
                 <pic:pic>
                   <pic:nvPicPr>
-                    <pic:cNvPr descr="inventory_depletion_risk.png" id="93" name="Picture"/>
+                    <pic:cNvPr descr="库存与供需缺口风险.png" id="98" name="Picture"/>
                     <pic:cNvPicPr>
                       <a:picLocks noChangeArrowheads="1" noChangeAspect="1"/>
                     </pic:cNvPicPr>
                   </pic:nvPicPr>
                   <pic:blipFill>
-                    <a:blip r:embed="rId91"/>
+                    <a:blip r:embed="rId96"/>
                     <a:stretch>
                       <a:fillRect/>
                     </a:stretch>
@@ -18063,9 +18201,9 @@
         <w:t xml:space="preserve">商业库存剩余量与剩余供需缺口变化。悲观情景下缓冲能力下降，二次跳涨风险上升。</w:t>
       </w:r>
     </w:p>
-    <w:bookmarkEnd w:id="94"/>
-    <w:bookmarkEnd w:id="95"/>
-    <w:bookmarkStart w:id="119" w:name="敏感性分析"/>
+    <w:bookmarkEnd w:id="99"/>
+    <w:bookmarkEnd w:id="100"/>
+    <w:bookmarkStart w:id="128" w:name="敏感性分析"/>
     <w:p>
       <w:pPr>
         <w:pStyle w:val="Heading1"/>
@@ -18077,7 +18215,7 @@
         <w:t xml:space="preserve">敏感性分析</w:t>
       </w:r>
     </w:p>
-    <w:bookmarkStart w:id="96" w:name="分析方法"/>
+    <w:bookmarkStart w:id="101" w:name="分析方法"/>
     <w:p>
       <w:pPr>
         <w:pStyle w:val="Heading2"/>
@@ -18100,7 +18238,7 @@
         <w:t xml:space="preserve">敏感性分析以中性情景为基准，对</w:t>
       </w:r>
       <w:r>
-        <w:t xml:space="preserve"> 14 </w:t>
+        <w:t xml:space="preserve"> 15 </w:t>
       </w:r>
       <w:r>
         <w:rPr>
@@ -18346,8 +18484,8 @@
         <w:t xml:space="preserve">天剩余缺口波动范围。该指标兼顾终点价格、阶段峰值和供需风险。</w:t>
       </w:r>
     </w:p>
-    <w:bookmarkEnd w:id="96"/>
-    <w:bookmarkStart w:id="100" w:name="参数重要性排序"/>
+    <w:bookmarkEnd w:id="101"/>
+    <w:bookmarkStart w:id="105" w:name="参数重要性排序"/>
     <w:p>
       <w:pPr>
         <w:pStyle w:val="Heading2"/>
@@ -19336,6 +19474,74 @@
               <w:jc w:val="left"/>
             </w:pPr>
             <w:r>
+              <w:t xml:space="preserve">SPR </w:t>
+            </w:r>
+            <w:r>
+              <w:rPr>
+                <w:rFonts w:hint="eastAsia"/>
+              </w:rPr>
+              <w:t xml:space="preserve">收缩起点</w:t>
+            </w:r>
+          </w:p>
+        </w:tc>
+        <w:tc>
+          <w:tcPr/>
+          <w:p>
+            <w:pPr>
+              <w:pStyle w:val="Compact"/>
+              <w:jc w:val="right"/>
+            </w:pPr>
+            <w:r>
+              <w:t xml:space="preserve">0.02</w:t>
+            </w:r>
+          </w:p>
+        </w:tc>
+        <w:tc>
+          <w:tcPr/>
+          <w:p>
+            <w:pPr>
+              <w:pStyle w:val="Compact"/>
+              <w:jc w:val="right"/>
+            </w:pPr>
+            <w:r>
+              <w:t xml:space="preserve">0.00</w:t>
+            </w:r>
+          </w:p>
+        </w:tc>
+        <w:tc>
+          <w:tcPr/>
+          <w:p>
+            <w:pPr>
+              <w:pStyle w:val="Compact"/>
+              <w:jc w:val="right"/>
+            </w:pPr>
+            <w:r>
+              <w:t xml:space="preserve">0.04</w:t>
+            </w:r>
+          </w:p>
+        </w:tc>
+      </w:tr>
+      <w:tr>
+        <w:tc>
+          <w:tcPr/>
+          <w:p>
+            <w:pPr>
+              <w:pStyle w:val="Compact"/>
+              <w:jc w:val="right"/>
+            </w:pPr>
+            <w:r>
+              <w:t xml:space="preserve">15</w:t>
+            </w:r>
+          </w:p>
+        </w:tc>
+        <w:tc>
+          <w:tcPr/>
+          <w:p>
+            <w:pPr>
+              <w:pStyle w:val="Compact"/>
+              <w:jc w:val="left"/>
+            </w:pPr>
+            <w:r>
               <w:rPr>
                 <w:rFonts w:hint="eastAsia"/>
               </w:rPr>
@@ -19390,18 +19596,18 @@
           <wp:inline>
             <wp:extent cx="4907280" cy="2998893"/>
             <wp:effectExtent b="0" l="0" r="0" t="0"/>
-            <wp:docPr descr="" title="" id="98" name="Picture"/>
+            <wp:docPr descr="" title="" id="103" name="Picture"/>
             <a:graphic>
               <a:graphicData uri="http://schemas.openxmlformats.org/drawingml/2006/picture">
                 <pic:pic>
                   <pic:nvPicPr>
-                    <pic:cNvPr descr="sensitivity_tornado_180day.png" id="99" name="Picture"/>
+                    <pic:cNvPr descr="参数敏感性龙卷风图.png" id="104" name="Picture"/>
                     <pic:cNvPicPr>
                       <a:picLocks noChangeArrowheads="1" noChangeAspect="1"/>
                     </pic:cNvPicPr>
                   </pic:nvPicPr>
                   <pic:blipFill>
-                    <a:blip r:embed="rId97"/>
+                    <a:blip r:embed="rId102"/>
                     <a:stretch>
                       <a:fillRect/>
                     </a:stretch>
@@ -19474,7 +19680,16 @@
         <w:rPr>
           <w:rFonts w:hint="eastAsia"/>
         </w:rPr>
-        <w:t xml:space="preserve">释放、启动延迟和绕道运输在中性路径下对第</w:t>
+        <w:t xml:space="preserve">释放、启动延迟、SPR</w:t>
+      </w:r>
+      <w:r>
+        <w:t xml:space="preserve"> </w:t>
+      </w:r>
+      <w:r>
+        <w:rPr>
+          <w:rFonts w:hint="eastAsia"/>
+        </w:rPr>
+        <w:t xml:space="preserve">收缩起点和绕道运输在中性路径下对第</w:t>
       </w:r>
       <w:r>
         <w:t xml:space="preserve"> 180 </w:t>
@@ -19510,8 +19725,8 @@
         <w:t xml:space="preserve">的政策缓冲变量。</w:t>
       </w:r>
     </w:p>
-    <w:bookmarkEnd w:id="100"/>
-    <w:bookmarkStart w:id="104" w:name="sec:monte-carlo"/>
+    <w:bookmarkEnd w:id="105"/>
+    <w:bookmarkStart w:id="109" w:name="sec:monte-carlo"/>
     <w:p>
       <w:pPr>
         <w:pStyle w:val="Heading2"/>
@@ -20019,18 +20234,18 @@
           <wp:inline>
             <wp:extent cx="4160520" cy="2352876"/>
             <wp:effectExtent b="0" l="0" r="0" t="0"/>
-            <wp:docPr descr="" title="" id="102" name="Picture"/>
+            <wp:docPr descr="" title="" id="107" name="Picture"/>
             <a:graphic>
               <a:graphicData uri="http://schemas.openxmlformats.org/drawingml/2006/picture">
                 <pic:pic>
                   <pic:nvPicPr>
-                    <pic:cNvPr descr="monte_carlo_tail_risk.png" id="103" name="Picture"/>
+                    <pic:cNvPr descr="蒙特卡洛尾部风险概率.png" id="108" name="Picture"/>
                     <pic:cNvPicPr>
                       <a:picLocks noChangeArrowheads="1" noChangeAspect="1"/>
                     </pic:cNvPicPr>
                   </pic:nvPicPr>
                   <pic:blipFill>
-                    <a:blip r:embed="rId101"/>
+                    <a:blip r:embed="rId106"/>
                     <a:stretch>
                       <a:fillRect/>
                     </a:stretch>
@@ -20142,8 +20357,900 @@
         <w:t xml:space="preserve">21.1%。这说明长期风险的重点不是中性点预测本身，而是多因素联动恶化下的尾部组合风险。</w:t>
       </w:r>
     </w:p>
-    <w:bookmarkEnd w:id="104"/>
-    <w:bookmarkStart w:id="111" w:name="滞后地缘风险指数审计"/>
+    <w:bookmarkEnd w:id="109"/>
+    <w:bookmarkStart w:id="113" w:name="状态转移扰动检验"/>
+    <w:p>
+      <w:pPr>
+        <w:pStyle w:val="Heading2"/>
+      </w:pPr>
+      <w:r>
+        <w:rPr>
+          <w:rFonts w:hint="eastAsia"/>
+        </w:rPr>
+        <w:t xml:space="preserve">状态转移扰动检验</w:t>
+      </w:r>
+    </w:p>
+    <w:p>
+      <w:pPr>
+        <w:pStyle w:val="FirstParagraph"/>
+      </w:pPr>
+      <w:r>
+        <w:rPr>
+          <w:rFonts w:hint="eastAsia"/>
+        </w:rPr>
+        <w:t xml:space="preserve">蒙特卡洛情景树主要扰动参数，而状态转移情景树主要扰动事件状态。设长期状态变量</w:t>
+      </w:r>
+      <w:r>
+        <w:t xml:space="preserve"> </w:t>
+      </w:r>
+      <m:oMath>
+        <m:sSub>
+          <m:e>
+            <m:r>
+              <m:t>Z</m:t>
+            </m:r>
+          </m:e>
+          <m:sub>
+            <m:r>
+              <m:t>t</m:t>
+            </m:r>
+          </m:sub>
+        </m:sSub>
+        <m:r>
+          <m:rPr>
+            <m:sty m:val="p"/>
+          </m:rPr>
+          <m:t>∈</m:t>
+        </m:r>
+        <m:r>
+          <m:rPr>
+            <m:sty m:val="p"/>
+          </m:rPr>
+          <m:t>{</m:t>
+        </m:r>
+        <m:r>
+          <m:t>E</m:t>
+        </m:r>
+        <m:r>
+          <m:rPr>
+            <m:sty m:val="p"/>
+          </m:rPr>
+          <m:t>,</m:t>
+        </m:r>
+        <m:r>
+          <m:t>N</m:t>
+        </m:r>
+        <m:r>
+          <m:rPr>
+            <m:sty m:val="p"/>
+          </m:rPr>
+          <m:t>,</m:t>
+        </m:r>
+        <m:r>
+          <m:t>U</m:t>
+        </m:r>
+        <m:r>
+          <m:rPr>
+            <m:sty m:val="p"/>
+          </m:rPr>
+          <m:t>}</m:t>
+        </m:r>
+      </m:oMath>
+      <w:r>
+        <w:rPr>
+          <w:rFonts w:hint="eastAsia"/>
+        </w:rPr>
+        <w:t xml:space="preserve">，分别表示缓和、维持和升级三类状态，其转移概率满足</w:t>
+      </w:r>
+    </w:p>
+    <w:p>
+      <w:pPr>
+        <w:pStyle w:val="BodyText"/>
+      </w:pPr>
+      <m:oMathPara>
+        <m:oMathParaPr>
+          <m:jc m:val="center"/>
+        </m:oMathParaPr>
+        <m:oMath>
+          <m:r>
+            <m:rPr>
+              <m:sty m:val="p"/>
+            </m:rPr>
+            <m:t>Pr</m:t>
+          </m:r>
+          <m:r>
+            <m:rPr>
+              <m:sty m:val="p"/>
+            </m:rPr>
+            <m:t>(</m:t>
+          </m:r>
+          <m:sSub>
+            <m:e>
+              <m:r>
+                <m:t>Z</m:t>
+              </m:r>
+            </m:e>
+            <m:sub>
+              <m:r>
+                <m:t>t</m:t>
+              </m:r>
+              <m:r>
+                <m:rPr>
+                  <m:sty m:val="p"/>
+                </m:rPr>
+                <m:t>+</m:t>
+              </m:r>
+              <m:r>
+                <m:t>1</m:t>
+              </m:r>
+            </m:sub>
+          </m:sSub>
+          <m:r>
+            <m:rPr>
+              <m:sty m:val="p"/>
+            </m:rPr>
+            <m:t>=</m:t>
+          </m:r>
+          <m:r>
+            <m:t>j</m:t>
+          </m:r>
+          <m:r>
+            <m:rPr>
+              <m:sty m:val="p"/>
+            </m:rPr>
+            <m:t>∣</m:t>
+          </m:r>
+          <m:sSub>
+            <m:e>
+              <m:r>
+                <m:t>Z</m:t>
+              </m:r>
+            </m:e>
+            <m:sub>
+              <m:r>
+                <m:t>t</m:t>
+              </m:r>
+            </m:sub>
+          </m:sSub>
+          <m:r>
+            <m:rPr>
+              <m:sty m:val="p"/>
+            </m:rPr>
+            <m:t>=</m:t>
+          </m:r>
+          <m:r>
+            <m:t>i</m:t>
+          </m:r>
+          <m:r>
+            <m:rPr>
+              <m:sty m:val="p"/>
+            </m:rPr>
+            <m:t>)</m:t>
+          </m:r>
+          <m:r>
+            <m:rPr>
+              <m:sty m:val="p"/>
+            </m:rPr>
+            <m:t>=</m:t>
+          </m:r>
+          <m:sSub>
+            <m:e>
+              <m:r>
+                <m:t>m</m:t>
+              </m:r>
+            </m:e>
+            <m:sub>
+              <m:r>
+                <m:t>i</m:t>
+              </m:r>
+              <m:r>
+                <m:t>j</m:t>
+              </m:r>
+            </m:sub>
+          </m:sSub>
+          <m:r>
+            <m:rPr>
+              <m:sty m:val="p"/>
+            </m:rPr>
+            <m:t>(</m:t>
+          </m:r>
+          <m:r>
+            <m:t>t</m:t>
+          </m:r>
+          <m:r>
+            <m:rPr>
+              <m:sty m:val="p"/>
+            </m:rPr>
+            <m:t>)</m:t>
+          </m:r>
+          <m:r>
+            <m:rPr>
+              <m:sty m:val="p"/>
+            </m:rPr>
+            <m:t>,</m:t>
+          </m:r>
+        </m:oMath>
+      </m:oMathPara>
+    </w:p>
+    <w:p>
+      <w:pPr>
+        <w:pStyle w:val="FirstParagraph"/>
+      </w:pPr>
+      <w:r>
+        <w:rPr>
+          <w:rFonts w:hint="eastAsia"/>
+        </w:rPr>
+        <w:t xml:space="preserve">其中</w:t>
+      </w:r>
+      <w:r>
+        <w:t xml:space="preserve"> </w:t>
+      </w:r>
+      <m:oMath>
+        <m:sSub>
+          <m:e>
+            <m:r>
+              <m:t>m</m:t>
+            </m:r>
+          </m:e>
+          <m:sub>
+            <m:r>
+              <m:t>i</m:t>
+            </m:r>
+            <m:r>
+              <m:t>j</m:t>
+            </m:r>
+          </m:sub>
+        </m:sSub>
+        <m:r>
+          <m:rPr>
+            <m:sty m:val="p"/>
+          </m:rPr>
+          <m:t>(</m:t>
+        </m:r>
+        <m:r>
+          <m:t>t</m:t>
+        </m:r>
+        <m:r>
+          <m:rPr>
+            <m:sty m:val="p"/>
+          </m:rPr>
+          <m:t>)</m:t>
+        </m:r>
+      </m:oMath>
+      <w:r>
+        <w:t xml:space="preserve"> </w:t>
+      </w:r>
+      <w:r>
+        <w:rPr>
+          <w:rFonts w:hint="eastAsia"/>
+        </w:rPr>
+        <w:t xml:space="preserve">允许随封锁持续时间缓慢偏向缓和状态，表示市场逐步观察到政策缓冲和替代运输效果。给定状态</w:t>
+      </w:r>
+      <w:r>
+        <w:t xml:space="preserve"> </w:t>
+      </w:r>
+      <m:oMath>
+        <m:sSub>
+          <m:e>
+            <m:r>
+              <m:t>Z</m:t>
+            </m:r>
+          </m:e>
+          <m:sub>
+            <m:r>
+              <m:t>t</m:t>
+            </m:r>
+          </m:sub>
+        </m:sSub>
+      </m:oMath>
+      <w:r>
+        <w:t xml:space="preserve"> </w:t>
+      </w:r>
+      <w:r>
+        <w:rPr>
+          <w:rFonts w:hint="eastAsia"/>
+        </w:rPr>
+        <w:t xml:space="preserve">后，价格不直接等于某条三情景曲线，而是向相应中心路径</w:t>
+      </w:r>
+      <w:r>
+        <w:t xml:space="preserve"> </w:t>
+      </w:r>
+      <m:oMath>
+        <m:sSub>
+          <m:e>
+            <m:acc>
+              <m:accPr>
+                <m:chr m:val="‾"/>
+              </m:accPr>
+              <m:e>
+                <m:r>
+                  <m:t>P</m:t>
+                </m:r>
+              </m:e>
+            </m:acc>
+          </m:e>
+          <m:sub>
+            <m:r>
+              <m:t>t</m:t>
+            </m:r>
+          </m:sub>
+        </m:sSub>
+        <m:r>
+          <m:rPr>
+            <m:sty m:val="p"/>
+          </m:rPr>
+          <m:t>(</m:t>
+        </m:r>
+        <m:sSub>
+          <m:e>
+            <m:r>
+              <m:t>Z</m:t>
+            </m:r>
+          </m:e>
+          <m:sub>
+            <m:r>
+              <m:t>t</m:t>
+            </m:r>
+          </m:sub>
+        </m:sSub>
+        <m:r>
+          <m:rPr>
+            <m:sty m:val="p"/>
+          </m:rPr>
+          <m:t>)</m:t>
+        </m:r>
+      </m:oMath>
+      <w:r>
+        <w:t xml:space="preserve"> </w:t>
+      </w:r>
+      <w:r>
+        <w:rPr>
+          <w:rFonts w:hint="eastAsia"/>
+        </w:rPr>
+        <w:t xml:space="preserve">均值回复：</w:t>
+      </w:r>
+    </w:p>
+    <w:p>
+      <w:pPr>
+        <w:pStyle w:val="BodyText"/>
+      </w:pPr>
+      <m:oMathPara>
+        <m:oMathParaPr>
+          <m:jc m:val="center"/>
+        </m:oMathParaPr>
+        <m:oMath>
+          <m:sSubSup>
+            <m:e>
+              <m:r>
+                <m:t>P</m:t>
+              </m:r>
+            </m:e>
+            <m:sub>
+              <m:r>
+                <m:t>t</m:t>
+              </m:r>
+            </m:sub>
+            <m:sup>
+              <m:r>
+                <m:rPr>
+                  <m:sty m:val="p"/>
+                </m:rPr>
+                <m:t>(</m:t>
+              </m:r>
+              <m:r>
+                <m:t>s</m:t>
+              </m:r>
+              <m:r>
+                <m:rPr>
+                  <m:sty m:val="p"/>
+                </m:rPr>
+                <m:t>)</m:t>
+              </m:r>
+            </m:sup>
+          </m:sSubSup>
+          <m:r>
+            <m:rPr>
+              <m:sty m:val="p"/>
+            </m:rPr>
+            <m:t>=</m:t>
+          </m:r>
+          <m:r>
+            <m:t>0.82</m:t>
+          </m:r>
+          <m:sSubSup>
+            <m:e>
+              <m:r>
+                <m:t>P</m:t>
+              </m:r>
+            </m:e>
+            <m:sub>
+              <m:r>
+                <m:t>t</m:t>
+              </m:r>
+              <m:r>
+                <m:rPr>
+                  <m:sty m:val="p"/>
+                </m:rPr>
+                <m:t>−</m:t>
+              </m:r>
+              <m:r>
+                <m:t>1</m:t>
+              </m:r>
+            </m:sub>
+            <m:sup>
+              <m:r>
+                <m:rPr>
+                  <m:sty m:val="p"/>
+                </m:rPr>
+                <m:t>(</m:t>
+              </m:r>
+              <m:r>
+                <m:t>s</m:t>
+              </m:r>
+              <m:r>
+                <m:rPr>
+                  <m:sty m:val="p"/>
+                </m:rPr>
+                <m:t>)</m:t>
+              </m:r>
+            </m:sup>
+          </m:sSubSup>
+          <m:r>
+            <m:rPr>
+              <m:sty m:val="p"/>
+            </m:rPr>
+            <m:t>+</m:t>
+          </m:r>
+          <m:r>
+            <m:t>0.18</m:t>
+          </m:r>
+          <m:sSub>
+            <m:e>
+              <m:acc>
+                <m:accPr>
+                  <m:chr m:val="‾"/>
+                </m:accPr>
+                <m:e>
+                  <m:r>
+                    <m:t>P</m:t>
+                  </m:r>
+                </m:e>
+              </m:acc>
+            </m:e>
+            <m:sub>
+              <m:r>
+                <m:t>t</m:t>
+              </m:r>
+            </m:sub>
+          </m:sSub>
+          <m:r>
+            <m:rPr>
+              <m:sty m:val="p"/>
+            </m:rPr>
+            <m:t>(</m:t>
+          </m:r>
+          <m:sSub>
+            <m:e>
+              <m:r>
+                <m:t>Z</m:t>
+              </m:r>
+            </m:e>
+            <m:sub>
+              <m:r>
+                <m:t>t</m:t>
+              </m:r>
+            </m:sub>
+          </m:sSub>
+          <m:r>
+            <m:rPr>
+              <m:sty m:val="p"/>
+            </m:rPr>
+            <m:t>)</m:t>
+          </m:r>
+          <m:r>
+            <m:rPr>
+              <m:sty m:val="p"/>
+            </m:rPr>
+            <m:t>+</m:t>
+          </m:r>
+          <m:sSub>
+            <m:e>
+              <m:r>
+                <m:t>u</m:t>
+              </m:r>
+            </m:e>
+            <m:sub>
+              <m:r>
+                <m:t>t</m:t>
+              </m:r>
+            </m:sub>
+          </m:sSub>
+          <m:r>
+            <m:rPr>
+              <m:sty m:val="p"/>
+            </m:rPr>
+            <m:t>(</m:t>
+          </m:r>
+          <m:sSub>
+            <m:e>
+              <m:r>
+                <m:t>Z</m:t>
+              </m:r>
+            </m:e>
+            <m:sub>
+              <m:r>
+                <m:t>t</m:t>
+              </m:r>
+            </m:sub>
+          </m:sSub>
+          <m:r>
+            <m:rPr>
+              <m:sty m:val="p"/>
+            </m:rPr>
+            <m:t>)</m:t>
+          </m:r>
+          <m:r>
+            <m:rPr>
+              <m:sty m:val="p"/>
+            </m:rPr>
+            <m:t>+</m:t>
+          </m:r>
+          <m:sSub>
+            <m:e>
+              <m:r>
+                <m:t>η</m:t>
+              </m:r>
+            </m:e>
+            <m:sub>
+              <m:r>
+                <m:t>t</m:t>
+              </m:r>
+            </m:sub>
+          </m:sSub>
+          <m:r>
+            <m:rPr>
+              <m:sty m:val="p"/>
+            </m:rPr>
+            <m:t>(</m:t>
+          </m:r>
+          <m:sSub>
+            <m:e>
+              <m:r>
+                <m:t>Z</m:t>
+              </m:r>
+            </m:e>
+            <m:sub>
+              <m:r>
+                <m:t>t</m:t>
+              </m:r>
+              <m:r>
+                <m:rPr>
+                  <m:sty m:val="p"/>
+                </m:rPr>
+                <m:t>−</m:t>
+              </m:r>
+              <m:r>
+                <m:t>1</m:t>
+              </m:r>
+            </m:sub>
+          </m:sSub>
+          <m:r>
+            <m:rPr>
+              <m:sty m:val="p"/>
+            </m:rPr>
+            <m:t>,</m:t>
+          </m:r>
+          <m:sSub>
+            <m:e>
+              <m:r>
+                <m:t>Z</m:t>
+              </m:r>
+            </m:e>
+            <m:sub>
+              <m:r>
+                <m:t>t</m:t>
+              </m:r>
+            </m:sub>
+          </m:sSub>
+          <m:r>
+            <m:rPr>
+              <m:sty m:val="p"/>
+            </m:rPr>
+            <m:t>)</m:t>
+          </m:r>
+          <m:r>
+            <m:rPr>
+              <m:sty m:val="p"/>
+            </m:rPr>
+            <m:t>,</m:t>
+          </m:r>
+        </m:oMath>
+      </m:oMathPara>
+    </w:p>
+    <w:p>
+      <w:pPr>
+        <w:pStyle w:val="FirstParagraph"/>
+      </w:pPr>
+      <w:r>
+        <w:rPr>
+          <w:rFonts w:hint="eastAsia"/>
+        </w:rPr>
+        <w:t xml:space="preserve">其中</w:t>
+      </w:r>
+      <w:r>
+        <w:t xml:space="preserve"> </w:t>
+      </w:r>
+      <m:oMath>
+        <m:sSub>
+          <m:e>
+            <m:r>
+              <m:t>u</m:t>
+            </m:r>
+          </m:e>
+          <m:sub>
+            <m:r>
+              <m:t>t</m:t>
+            </m:r>
+          </m:sub>
+        </m:sSub>
+      </m:oMath>
+      <w:r>
+        <w:t xml:space="preserve"> </w:t>
+      </w:r>
+      <w:r>
+        <w:rPr>
+          <w:rFonts w:hint="eastAsia"/>
+        </w:rPr>
+        <w:t xml:space="preserve">为由附件历史波动估计的保守扰动项，</w:t>
+      </w:r>
+      <m:oMath>
+        <m:sSub>
+          <m:e>
+            <m:r>
+              <m:t>η</m:t>
+            </m:r>
+          </m:e>
+          <m:sub>
+            <m:r>
+              <m:t>t</m:t>
+            </m:r>
+          </m:sub>
+        </m:sSub>
+      </m:oMath>
+      <w:r>
+        <w:t xml:space="preserve"> </w:t>
+      </w:r>
+      <w:r>
+        <w:rPr>
+          <w:rFonts w:hint="eastAsia"/>
+        </w:rPr>
+        <w:t xml:space="preserve">为状态切换时的跳变项。该设定的含义是：长期物理机制决定价格中枢，事件状态切换决定价格围绕中枢的震荡和局部跳变。</w:t>
+      </w:r>
+    </w:p>
+    <w:p>
+      <w:pPr>
+        <w:pStyle w:val="BodyText"/>
+      </w:pPr>
+      <w:r>
+        <w:rPr>
+          <w:rFonts w:hint="eastAsia"/>
+        </w:rPr>
+        <w:t xml:space="preserve">本检验共生成</w:t>
+      </w:r>
+      <w:r>
+        <w:t xml:space="preserve"> 3000 </w:t>
+      </w:r>
+      <w:r>
+        <w:rPr>
+          <w:rFonts w:hint="eastAsia"/>
+        </w:rPr>
+        <w:t xml:space="preserve">条状态转移路径。结果显示，第</w:t>
+      </w:r>
+      <w:r>
+        <w:t xml:space="preserve"> 180 </w:t>
+      </w:r>
+      <w:r>
+        <w:rPr>
+          <w:rFonts w:hint="eastAsia"/>
+        </w:rPr>
+        <w:t xml:space="preserve">天价格中位数为</w:t>
+      </w:r>
+      <w:r>
+        <w:t xml:space="preserve"> 88.59 </w:t>
+      </w:r>
+      <w:r>
+        <w:rPr>
+          <w:rFonts w:hint="eastAsia"/>
+        </w:rPr>
+        <w:t xml:space="preserve">美元/桶，5%–95%</w:t>
+      </w:r>
+      <w:r>
+        <w:t xml:space="preserve"> </w:t>
+      </w:r>
+      <w:r>
+        <w:rPr>
+          <w:rFonts w:hint="eastAsia"/>
+        </w:rPr>
+        <w:t xml:space="preserve">条件区间为</w:t>
+      </w:r>
+      <w:r>
+        <w:t xml:space="preserve"> 85.43–93.99 </w:t>
+      </w:r>
+      <w:r>
+        <w:rPr>
+          <w:rFonts w:hint="eastAsia"/>
+        </w:rPr>
+        <w:t xml:space="preserve">美元/桶；外推期最高价</w:t>
+      </w:r>
+      <w:r>
+        <w:t xml:space="preserve"> P95 </w:t>
+      </w:r>
+      <w:r>
+        <w:rPr>
+          <w:rFonts w:hint="eastAsia"/>
+        </w:rPr>
+        <w:t xml:space="preserve">为</w:t>
+      </w:r>
+      <w:r>
+        <w:t xml:space="preserve"> 124.61 </w:t>
+      </w:r>
+      <w:r>
+        <w:rPr>
+          <w:rFonts w:hint="eastAsia"/>
+        </w:rPr>
+        <w:t xml:space="preserve">美元/桶，突破</w:t>
+      </w:r>
+      <w:r>
+        <w:t xml:space="preserve"> 120 </w:t>
+      </w:r>
+      <w:r>
+        <w:rPr>
+          <w:rFonts w:hint="eastAsia"/>
+        </w:rPr>
+        <w:t xml:space="preserve">美元/桶的条件概率为</w:t>
+      </w:r>
+      <w:r>
+        <w:t xml:space="preserve"> </w:t>
+      </w:r>
+      <w:r>
+        <w:rPr>
+          <w:rFonts w:hint="eastAsia"/>
+        </w:rPr>
+        <w:t xml:space="preserve">15.6%，突破</w:t>
+      </w:r>
+      <w:r>
+        <w:t xml:space="preserve"> 130 </w:t>
+      </w:r>
+      <w:r>
+        <w:rPr>
+          <w:rFonts w:hint="eastAsia"/>
+        </w:rPr>
+        <w:t xml:space="preserve">美元/桶的条件概率为</w:t>
+      </w:r>
+      <w:r>
+        <w:t xml:space="preserve"> </w:t>
+      </w:r>
+      <w:r>
+        <w:rPr>
+          <w:rFonts w:hint="eastAsia"/>
+        </w:rPr>
+        <w:t xml:space="preserve">0.9%。这说明状态切换确实会放大外推期局部峰值，但不会推翻</w:t>
+      </w:r>
+      <w:r>
+        <w:rPr>
+          <w:rFonts w:hint="eastAsia"/>
+        </w:rPr>
+        <w:t xml:space="preserve">“中性平衡点回落、悲观尾部保留”</w:t>
+      </w:r>
+      <w:r>
+        <w:rPr>
+          <w:rFonts w:hint="eastAsia"/>
+        </w:rPr>
+        <w:t xml:space="preserve">的主结论。也就是说，长期模型的可信表达不应是</w:t>
+      </w:r>
+      <w:r>
+        <w:rPr>
+          <w:rFonts w:hint="eastAsia"/>
+        </w:rPr>
+        <w:t xml:space="preserve">“我能精确预测每天油价”</w:t>
+      </w:r>
+      <w:r>
+        <w:rPr>
+          <w:rFonts w:hint="eastAsia"/>
+        </w:rPr>
+        <w:t xml:space="preserve">，而应是</w:t>
+      </w:r>
+      <w:r>
+        <w:rPr>
+          <w:rFonts w:hint="eastAsia"/>
+        </w:rPr>
+        <w:t xml:space="preserve">“在不同冲突状态下给出可解释的中心、区间和尾部风险”</w:t>
+      </w:r>
+      <w:r>
+        <w:t xml:space="preserve">。</w:t>
+      </w:r>
+    </w:p>
+    <w:p>
+      <w:pPr>
+        <w:pStyle w:val="CaptionedFigure"/>
+      </w:pPr>
+      <w:r>
+        <w:drawing>
+          <wp:inline>
+            <wp:extent cx="4907280" cy="2846222"/>
+            <wp:effectExtent b="0" l="0" r="0" t="0"/>
+            <wp:docPr descr="" title="" id="111" name="Picture"/>
+            <a:graphic>
+              <a:graphicData uri="http://schemas.openxmlformats.org/drawingml/2006/picture">
+                <pic:pic>
+                  <pic:nvPicPr>
+                    <pic:cNvPr descr="R长期状态转移扇形图.png" id="112" name="Picture"/>
+                    <pic:cNvPicPr>
+                      <a:picLocks noChangeArrowheads="1" noChangeAspect="1"/>
+                    </pic:cNvPicPr>
+                  </pic:nvPicPr>
+                  <pic:blipFill>
+                    <a:blip r:embed="rId110"/>
+                    <a:stretch>
+                      <a:fillRect/>
+                    </a:stretch>
+                  </pic:blipFill>
+                  <pic:spPr bwMode="auto">
+                    <a:xfrm>
+                      <a:off x="0" y="0"/>
+                      <a:ext cx="4907280" cy="2846222"/>
+                    </a:xfrm>
+                    <a:prstGeom prst="rect">
+                      <a:avLst/>
+                    </a:prstGeom>
+                    <a:noFill/>
+                    <a:ln w="9525">
+                      <a:noFill/>
+                      <a:headEnd/>
+                      <a:tailEnd/>
+                    </a:ln>
+                  </pic:spPr>
+                </pic:pic>
+              </a:graphicData>
+            </a:graphic>
+          </wp:inline>
+        </w:drawing>
+      </w:r>
+    </w:p>
+    <w:p>
+      <w:pPr>
+        <w:pStyle w:val="ImageCaption"/>
+      </w:pPr>
+      <w:r>
+        <w:t xml:space="preserve">R/ggplot2 </w:t>
+      </w:r>
+      <w:r>
+        <w:rPr>
+          <w:rFonts w:hint="eastAsia"/>
+        </w:rPr>
+        <w:t xml:space="preserve">长期状态转移区间预测。双层阴影分别表示</w:t>
+      </w:r>
+      <w:r>
+        <w:t xml:space="preserve"> 5%–95% </w:t>
+      </w:r>
+      <w:r>
+        <w:rPr>
+          <w:rFonts w:hint="eastAsia"/>
+        </w:rPr>
+        <w:t xml:space="preserve">和</w:t>
+      </w:r>
+      <w:r>
+        <w:t xml:space="preserve"> 25%–75% </w:t>
+      </w:r>
+      <w:r>
+        <w:rPr>
+          <w:rFonts w:hint="eastAsia"/>
+        </w:rPr>
+        <w:t xml:space="preserve">条件区间，虚线为原中性中心路径。</w:t>
+      </w:r>
+    </w:p>
+    <w:bookmarkEnd w:id="113"/>
+    <w:bookmarkStart w:id="120" w:name="滞后地缘风险指数审计"/>
     <w:p>
       <w:pPr>
         <w:pStyle w:val="Heading2"/>
@@ -20662,18 +21769,18 @@
           <wp:inline>
             <wp:extent cx="4907280" cy="2628899"/>
             <wp:effectExtent b="0" l="0" r="0" t="0"/>
-            <wp:docPr descr="" title="" id="106" name="Picture"/>
+            <wp:docPr descr="" title="" id="115" name="Picture"/>
             <a:graphic>
               <a:graphicData uri="http://schemas.openxmlformats.org/drawingml/2006/picture">
                 <pic:pic>
                   <pic:nvPicPr>
-                    <pic:cNvPr descr="gpr_event_window_audit.png" id="107" name="Picture"/>
+                    <pic:cNvPr descr="地缘风险指数滞后审计.png" id="116" name="Picture"/>
                     <pic:cNvPicPr>
                       <a:picLocks noChangeArrowheads="1" noChangeAspect="1"/>
                     </pic:cNvPicPr>
                   </pic:nvPicPr>
                   <pic:blipFill>
-                    <a:blip r:embed="rId105"/>
+                    <a:blip r:embed="rId114"/>
                     <a:stretch>
                       <a:fillRect/>
                     </a:stretch>
@@ -20774,18 +21881,18 @@
           <wp:inline>
             <wp:extent cx="4480560" cy="3054927"/>
             <wp:effectExtent b="0" l="0" r="0" t="0"/>
-            <wp:docPr descr="" title="" id="109" name="Picture"/>
+            <wp:docPr descr="" title="" id="118" name="Picture"/>
             <a:graphic>
               <a:graphicData uri="http://schemas.openxmlformats.org/drawingml/2006/picture">
                 <pic:pic>
                   <pic:nvPicPr>
-                    <pic:cNvPr descr="lagged_gpr_brent_return.png" id="110" name="Picture"/>
+                    <pic:cNvPr descr="滞后GPR与布伦特收益关系.png" id="119" name="Picture"/>
                     <pic:cNvPicPr>
                       <a:picLocks noChangeArrowheads="1" noChangeAspect="1"/>
                     </pic:cNvPicPr>
                   </pic:nvPicPr>
                   <pic:blipFill>
-                    <a:blip r:embed="rId108"/>
+                    <a:blip r:embed="rId117"/>
                     <a:stretch>
                       <a:fillRect/>
                     </a:stretch>
@@ -20909,8 +22016,8 @@
         <w:t xml:space="preserve">。这使模型在风险解释和内生性防御之间保持较稳妥的边界。</w:t>
       </w:r>
     </w:p>
-    <w:bookmarkEnd w:id="111"/>
-    <w:bookmarkStart w:id="118" w:name="历史样本稳健性检验"/>
+    <w:bookmarkEnd w:id="120"/>
+    <w:bookmarkStart w:id="127" w:name="历史样本稳健性检验"/>
     <w:p>
       <w:pPr>
         <w:pStyle w:val="Heading2"/>
@@ -21487,18 +22594,18 @@
           <wp:inline>
             <wp:extent cx="4907280" cy="2685115"/>
             <wp:effectExtent b="0" l="0" r="0" t="0"/>
-            <wp:docPr descr="" title="" id="113" name="Picture"/>
+            <wp:docPr descr="" title="" id="122" name="Picture"/>
             <a:graphic>
               <a:graphicData uri="http://schemas.openxmlformats.org/drawingml/2006/picture">
                 <pic:pic>
                   <pic:nvPicPr>
-                    <pic:cNvPr descr="historical_event_extremeness.png" id="114" name="Picture"/>
+                    <pic:cNvPr descr="历史窗口极端性检验.png" id="123" name="Picture"/>
                     <pic:cNvPicPr>
                       <a:picLocks noChangeArrowheads="1" noChangeAspect="1"/>
                     </pic:cNvPicPr>
                   </pic:nvPicPr>
                   <pic:blipFill>
-                    <a:blip r:embed="rId112"/>
+                    <a:blip r:embed="rId121"/>
                     <a:stretch>
                       <a:fillRect/>
                     </a:stretch>
@@ -21546,20 +22653,20 @@
       <w:r>
         <w:drawing>
           <wp:inline>
-            <wp:extent cx="4693920" cy="2669091"/>
+            <wp:extent cx="4800600" cy="2351314"/>
             <wp:effectExtent b="0" l="0" r="0" t="0"/>
-            <wp:docPr descr="" title="" id="116" name="Picture"/>
+            <wp:docPr descr="" title="" id="125" name="Picture"/>
             <a:graphic>
               <a:graphicData uri="http://schemas.openxmlformats.org/drawingml/2006/picture">
                 <pic:pic>
                   <pic:nvPicPr>
-                    <pic:cNvPr descr="historical_baseline_error_distribution.png" id="117" name="Picture"/>
+                    <pic:cNvPr descr="R历史基准误差分布图.png" id="126" name="Picture"/>
                     <pic:cNvPicPr>
                       <a:picLocks noChangeArrowheads="1" noChangeAspect="1"/>
                     </pic:cNvPicPr>
                   </pic:nvPicPr>
                   <pic:blipFill>
-                    <a:blip r:embed="rId115"/>
+                    <a:blip r:embed="rId124"/>
                     <a:stretch>
                       <a:fillRect/>
                     </a:stretch>
@@ -21567,7 +22674,7 @@
                   <pic:spPr bwMode="auto">
                     <a:xfrm>
                       <a:off x="0" y="0"/>
-                      <a:ext cx="4693920" cy="2669091"/>
+                      <a:ext cx="4800600" cy="2351314"/>
                     </a:xfrm>
                     <a:prstGeom prst="rect">
                       <a:avLst/>
@@ -21591,10 +22698,33 @@
         <w:pStyle w:val="ImageCaption"/>
       </w:pPr>
       <w:r>
-        <w:rPr>
-          <w:rFonts w:hint="eastAsia"/>
-        </w:rPr>
-        <w:t xml:space="preserve">历史</w:t>
+        <w:t xml:space="preserve">R/ggplot2 </w:t>
+      </w:r>
+      <w:r>
+        <w:rPr>
+          <w:rFonts w:hint="eastAsia"/>
+        </w:rPr>
+        <w:t xml:space="preserve">历史同长度窗口基准误差分布。蓝色区间表示历史分位带，红点表示</w:t>
+      </w:r>
+      <w:r>
+        <w:t xml:space="preserve"> 2026 </w:t>
+      </w:r>
+      <w:r>
+        <w:rPr>
+          <w:rFonts w:hint="eastAsia"/>
+        </w:rPr>
+        <w:t xml:space="preserve">冲突窗口，说明该窗口对普通基准模型显著更难。</w:t>
+      </w:r>
+    </w:p>
+    <w:p>
+      <w:pPr>
+        <w:pStyle w:val="BodyText"/>
+      </w:pPr>
+      <w:r>
+        <w:rPr>
+          <w:rFonts w:hint="eastAsia"/>
+        </w:rPr>
+        <w:t xml:space="preserve">历史检验有两个作用。第一，它证明本文没有只盯着</w:t>
       </w:r>
       <w:r>
         <w:t xml:space="preserve"> 46 </w:t>
@@ -21603,35 +22733,6 @@
         <w:rPr>
           <w:rFonts w:hint="eastAsia"/>
         </w:rPr>
-        <w:t xml:space="preserve">交易日窗口的随机游走基准误差分布。冲突窗口朴素基准</w:t>
-      </w:r>
-      <w:r>
-        <w:t xml:space="preserve"> RMSE </w:t>
-      </w:r>
-      <w:r>
-        <w:rPr>
-          <w:rFonts w:hint="eastAsia"/>
-        </w:rPr>
-        <w:t xml:space="preserve">处于历史高位，而本文机制模型在该窗口内仍明显优于朴素基准。</w:t>
-      </w:r>
-    </w:p>
-    <w:p>
-      <w:pPr>
-        <w:pStyle w:val="BodyText"/>
-      </w:pPr>
-      <w:r>
-        <w:rPr>
-          <w:rFonts w:hint="eastAsia"/>
-        </w:rPr>
-        <w:t xml:space="preserve">历史检验有两个作用。第一，它证明本文没有只盯着</w:t>
-      </w:r>
-      <w:r>
-        <w:t xml:space="preserve"> 46 </w:t>
-      </w:r>
-      <w:r>
-        <w:rPr>
-          <w:rFonts w:hint="eastAsia"/>
-        </w:rPr>
         <w:t xml:space="preserve">个交易日做孤立拟合：与</w:t>
       </w:r>
       <w:r>
@@ -21662,9 +22763,9 @@
         <w:t xml:space="preserve">检验也支持这一点：收盘价水平和对数价格均不能拒绝单位根，而对数收益率可拒绝单位根，因此普通统计基准更适合在收益率或差分口径下使用。</w:t>
       </w:r>
     </w:p>
-    <w:bookmarkEnd w:id="118"/>
-    <w:bookmarkEnd w:id="119"/>
-    <w:bookmarkStart w:id="123" w:name="模型评价"/>
+    <w:bookmarkEnd w:id="127"/>
+    <w:bookmarkEnd w:id="128"/>
+    <w:bookmarkStart w:id="132" w:name="模型评价"/>
     <w:p>
       <w:pPr>
         <w:pStyle w:val="Heading1"/>
@@ -21676,7 +22777,7 @@
         <w:t xml:space="preserve">模型评价</w:t>
       </w:r>
     </w:p>
-    <w:bookmarkStart w:id="120" w:name="优点"/>
+    <w:bookmarkStart w:id="129" w:name="优点"/>
     <w:p>
       <w:pPr>
         <w:pStyle w:val="Heading2"/>
@@ -21800,11 +22901,11 @@
         <w:rPr>
           <w:rFonts w:hint="eastAsia"/>
         </w:rPr>
-        <w:t xml:space="preserve">长期表述审慎：三情景中心线与蒙特卡洛扇形区间合读，把长期结果定位为条件中心路径和尾部风险，而非精确日度点预测。</w:t>
-      </w:r>
-    </w:p>
-    <w:bookmarkEnd w:id="120"/>
-    <w:bookmarkStart w:id="121" w:name="局限性"/>
+        <w:t xml:space="preserve">长期表述审慎：三情景中心线与蒙特卡洛扇形区间、状态转移情景树合读，把长期结果定位为条件中心路径、状态切换和尾部风险，而非精确日度点预测。</w:t>
+      </w:r>
+    </w:p>
+    <w:bookmarkEnd w:id="129"/>
+    <w:bookmarkStart w:id="130" w:name="局限性"/>
     <w:p>
       <w:pPr>
         <w:pStyle w:val="Heading2"/>
@@ -21900,11 +23001,11 @@
         <w:rPr>
           <w:rFonts w:hint="eastAsia"/>
         </w:rPr>
-        <w:t xml:space="preserve">蒙特卡洛情景树已经刻画了部分参数联动风险，但其联合分布仍来自模型设定而非外部历史频率估计，因此尾部概率应解释为条件概率而非真实市场概率。</w:t>
-      </w:r>
-    </w:p>
-    <w:bookmarkEnd w:id="121"/>
-    <w:bookmarkStart w:id="122" w:name="改进方向"/>
+        <w:t xml:space="preserve">蒙特卡洛情景树和状态转移情景树已经刻画了部分参数联动风险与事件状态切换风险，但其联合分布仍来自模型设定而非未来观测，因此尾部概率应解释为条件概率而非真实市场概率。</w:t>
+      </w:r>
+    </w:p>
+    <w:bookmarkEnd w:id="130"/>
+    <w:bookmarkStart w:id="131" w:name="改进方向"/>
     <w:p>
       <w:pPr>
         <w:pStyle w:val="Heading2"/>
@@ -21960,7 +23061,7 @@
         <w:rPr>
           <w:rFonts w:hint="eastAsia"/>
         </w:rPr>
-        <w:t xml:space="preserve">滞后审计基础上，继续探索期权隐含波动率、油轮保险费、期货期限结构等更接近市场定价的风险变量；第三，将当前蒙特卡洛联合扰动进一步扩展为带状态转移概率的情景树，使冲突缓和、维持和升级三类状态可以随时间动态切换。R</w:t>
+        <w:t xml:space="preserve">滞后审计基础上，继续探索期权隐含波动率、油轮保险费、期货期限结构等更接近市场定价的风险变量；第三，把状态转移概率从当前专家设定进一步约束为由历史地缘风险、波动率和期限结构共同驱动的时变概率。R</w:t>
       </w:r>
       <w:r>
         <w:t xml:space="preserve"> </w:t>
@@ -21990,9 +23091,9 @@
         <w:t xml:space="preserve">多智能体仿真则只有在获得主体级行为数据时才有必要进入主线。</w:t>
       </w:r>
     </w:p>
-    <w:bookmarkEnd w:id="122"/>
-    <w:bookmarkEnd w:id="123"/>
-    <w:bookmarkStart w:id="124" w:name="结论"/>
+    <w:bookmarkEnd w:id="131"/>
+    <w:bookmarkEnd w:id="132"/>
+    <w:bookmarkStart w:id="133" w:name="结论"/>
     <w:p>
       <w:pPr>
         <w:pStyle w:val="Heading1"/>
@@ -22270,7 +23371,25 @@
         <w:rPr>
           <w:rFonts w:hint="eastAsia"/>
         </w:rPr>
-        <w:t xml:space="preserve">4.6%，尾部风险主要来自多因素同时恶化。</w:t>
+        <w:t xml:space="preserve">4.6%，尾部风险主要来自多因素同时恶化；状态转移情景树进一步说明，若未来冲突状态在缓和、维持和升级之间切换，外推期最高价</w:t>
+      </w:r>
+      <w:r>
+        <w:t xml:space="preserve"> P95 </w:t>
+      </w:r>
+      <w:r>
+        <w:rPr>
+          <w:rFonts w:hint="eastAsia"/>
+        </w:rPr>
+        <w:t xml:space="preserve">约为</w:t>
+      </w:r>
+      <w:r>
+        <w:t xml:space="preserve"> 124.61 </w:t>
+      </w:r>
+      <w:r>
+        <w:rPr>
+          <w:rFonts w:hint="eastAsia"/>
+        </w:rPr>
+        <w:t xml:space="preserve">美元/桶。</w:t>
       </w:r>
     </w:p>
     <w:p>
@@ -22378,8 +23497,8 @@
         <w:t xml:space="preserve">不足、绕道恢复缓慢和制度风险溢价持续时形成的尾部组合。</w:t>
       </w:r>
     </w:p>
-    <w:bookmarkEnd w:id="124"/>
-    <w:bookmarkStart w:id="125" w:name="附录支撑材料说明"/>
+    <w:bookmarkEnd w:id="133"/>
+    <w:bookmarkStart w:id="134" w:name="附录支撑材料说明"/>
     <w:p>
       <w:pPr>
         <w:pStyle w:val="Heading1"/>
@@ -22493,8 +23612,8 @@
         <w:t xml:space="preserve">。</w:t>
       </w:r>
     </w:p>
-    <w:bookmarkEnd w:id="125"/>
-    <w:bookmarkStart w:id="129" w:name="参考文献"/>
+    <w:bookmarkEnd w:id="134"/>
+    <w:bookmarkStart w:id="140" w:name="参考文献"/>
     <w:p>
       <w:pPr>
         <w:pStyle w:val="Heading1"/>
@@ -22658,7 +23777,7 @@
         <w:pStyle w:val="BodyText"/>
       </w:pPr>
       <w:r>
-        <w:t xml:space="preserve">Baumeister, C., &amp; Kilian, L. (2012). Real-Time Forecasts of the Real Price of Oil.</w:t>
+        <w:t xml:space="preserve">Newell, R. G., &amp; Prest, B. C. (2017). Informing SPR Policy Through Oil Futures and Inventory Dynamics.</w:t>
       </w:r>
       <w:r>
         <w:t xml:space="preserve"> </w:t>
@@ -22668,10 +23787,10 @@
           <w:i/>
           <w:iCs/>
         </w:rPr>
-        <w:t xml:space="preserve">Journal of Business &amp; Economic Statistics</w:t>
-      </w:r>
-      <w:r>
-        <w:t xml:space="preserve">, 30(2), 326–336.</w:t>
+        <w:t xml:space="preserve">NBER Working Paper</w:t>
+      </w:r>
+      <w:r>
+        <w:t xml:space="preserve">, No. 23974.</w:t>
       </w:r>
     </w:p>
     <w:p>
@@ -22679,7 +23798,7 @@
         <w:pStyle w:val="BodyText"/>
       </w:pPr>
       <w:r>
-        <w:t xml:space="preserve">Alquist, R., Kilian, L., &amp; Vigfusson, R. J. (2013). Forecasting the Price of Oil.</w:t>
+        <w:t xml:space="preserve">Kilian, L., &amp; Zhou, X. (2019). Does drawing down the U.S. Strategic Petroleum Reserve help stabilize oil prices?</w:t>
       </w:r>
       <w:r>
         <w:t xml:space="preserve"> </w:t>
@@ -22689,6 +23808,69 @@
           <w:i/>
           <w:iCs/>
         </w:rPr>
+        <w:t xml:space="preserve">Federal Reserve Bank of Dallas Working Paper</w:t>
+      </w:r>
+      <w:r>
+        <w:t xml:space="preserve">, No. 1916.</w:t>
+      </w:r>
+    </w:p>
+    <w:p>
+      <w:pPr>
+        <w:pStyle w:val="BodyText"/>
+      </w:pPr>
+      <w:r>
+        <w:t xml:space="preserve">Baumeister, C., &amp; Kilian, L. (2012). Real-Time Forecasts of the Real Price of Oil.</w:t>
+      </w:r>
+      <w:r>
+        <w:t xml:space="preserve"> </w:t>
+      </w:r>
+      <w:r>
+        <w:rPr>
+          <w:i/>
+          <w:iCs/>
+        </w:rPr>
+        <w:t xml:space="preserve">Journal of Business &amp; Economic Statistics</w:t>
+      </w:r>
+      <w:r>
+        <w:t xml:space="preserve">, 30(2), 326–336.</w:t>
+      </w:r>
+    </w:p>
+    <w:p>
+      <w:pPr>
+        <w:pStyle w:val="BodyText"/>
+      </w:pPr>
+      <w:r>
+        <w:t xml:space="preserve">Alquist, R., &amp; Kilian, L. (2010). What Do We Learn from the Price of Crude Oil Futures?</w:t>
+      </w:r>
+      <w:r>
+        <w:t xml:space="preserve"> </w:t>
+      </w:r>
+      <w:r>
+        <w:rPr>
+          <w:i/>
+          <w:iCs/>
+        </w:rPr>
+        <w:t xml:space="preserve">Journal of Applied Econometrics</w:t>
+      </w:r>
+      <w:r>
+        <w:t xml:space="preserve">, 25(4), 539–573.</w:t>
+      </w:r>
+    </w:p>
+    <w:p>
+      <w:pPr>
+        <w:pStyle w:val="BodyText"/>
+      </w:pPr>
+      <w:r>
+        <w:t xml:space="preserve">Alquist, R., Kilian, L., &amp; Vigfusson, R. J. (2013). Forecasting the Price of Oil.</w:t>
+      </w:r>
+      <w:r>
+        <w:t xml:space="preserve"> </w:t>
+      </w:r>
+      <w:r>
+        <w:rPr>
+          <w:i/>
+          <w:iCs/>
+        </w:rPr>
         <w:t xml:space="preserve">Handbook of Economic Forecasting</w:t>
       </w:r>
       <w:r>
@@ -22700,12 +23882,75 @@
         <w:pStyle w:val="BodyText"/>
       </w:pPr>
       <w:r>
+        <w:t xml:space="preserve">Mei, D., Ma, F., Liao, Y., &amp; Wang, L. (2020). Geopolitical risk uncertainty and oil future volatility: Evidence from MIDAS models.</w:t>
+      </w:r>
+      <w:r>
+        <w:t xml:space="preserve"> </w:t>
+      </w:r>
+      <w:r>
+        <w:rPr>
+          <w:i/>
+          <w:iCs/>
+        </w:rPr>
+        <w:t xml:space="preserve">Energy Economics</w:t>
+      </w:r>
+      <w:r>
+        <w:t xml:space="preserve">, 86, 104624.</w:t>
+      </w:r>
+    </w:p>
+    <w:p>
+      <w:pPr>
+        <w:pStyle w:val="BodyText"/>
+      </w:pPr>
+      <w:r>
+        <w:t xml:space="preserve">Liu, J., Ma, F., Tang, Y., &amp; Zhang, Y. (2019). Geopolitical risk and oil volatility: A new insight.</w:t>
+      </w:r>
+      <w:r>
+        <w:t xml:space="preserve"> </w:t>
+      </w:r>
+      <w:r>
+        <w:rPr>
+          <w:i/>
+          <w:iCs/>
+        </w:rPr>
+        <w:t xml:space="preserve">Energy Economics</w:t>
+      </w:r>
+      <w:r>
+        <w:t xml:space="preserve">, 84, 104548.</w:t>
+      </w:r>
+    </w:p>
+    <w:p>
+      <w:pPr>
+        <w:pStyle w:val="BodyText"/>
+      </w:pPr>
+      <w:r>
+        <w:t xml:space="preserve">ter Ellen, S., &amp; Zwinkels, R. C. J. (2010). Oil price dynamics: A behavioral finance approach with heterogeneous agents.</w:t>
+      </w:r>
+      <w:r>
+        <w:t xml:space="preserve"> </w:t>
+      </w:r>
+      <w:r>
+        <w:rPr>
+          <w:i/>
+          <w:iCs/>
+        </w:rPr>
+        <w:t xml:space="preserve">Energy Economics</w:t>
+      </w:r>
+      <w:r>
+        <w:t xml:space="preserve">, 32(6), 1427–1434.</w:t>
+      </w:r>
+    </w:p>
+    <w:p>
+      <w:pPr>
+        <w:pStyle w:val="BodyText"/>
+      </w:pPr>
+      <w:r>
         <w:t xml:space="preserve">U.S. Energy Information Administration. World Oil Transit Chokepoints.</w:t>
       </w:r>
       <w:r>
         <w:t xml:space="preserve"> </w:t>
       </w:r>
-      <w:hyperlink r:id="rId126">
+      <w:hyperlink r:id="rId135">
         <w:r>
           <w:rPr>
             <w:rStyle w:val="Hyperlink"/>
@@ -22722,12 +23967,56 @@
         <w:pStyle w:val="BodyText"/>
       </w:pPr>
       <w:r>
+        <w:t xml:space="preserve">International Energy Agency. Strait of Hormuz Factsheet.</w:t>
+      </w:r>
+      <w:r>
+        <w:t xml:space="preserve"> </w:t>
+      </w:r>
+      <w:hyperlink r:id="rId136">
+        <w:r>
+          <w:rPr>
+            <w:rStyle w:val="Hyperlink"/>
+          </w:rPr>
+          <w:t xml:space="preserve">IEA oil security factsheet</w:t>
+        </w:r>
+      </w:hyperlink>
+      <w:r>
+        <w:t xml:space="preserve">.</w:t>
+      </w:r>
+    </w:p>
+    <w:p>
+      <w:pPr>
+        <w:pStyle w:val="BodyText"/>
+      </w:pPr>
+      <w:r>
+        <w:t xml:space="preserve">International Energy Agency. IEA Governing Board concludes 2022 collective actions.</w:t>
+      </w:r>
+      <w:r>
+        <w:t xml:space="preserve"> </w:t>
+      </w:r>
+      <w:hyperlink r:id="rId137">
+        <w:r>
+          <w:rPr>
+            <w:rStyle w:val="Hyperlink"/>
+          </w:rPr>
+          <w:t xml:space="preserve">IEA emergency stock release record</w:t>
+        </w:r>
+      </w:hyperlink>
+      <w:r>
+        <w:t xml:space="preserve">.</w:t>
+      </w:r>
+    </w:p>
+    <w:p>
+      <w:pPr>
+        <w:pStyle w:val="BodyText"/>
+      </w:pPr>
+      <w:r>
         <w:t xml:space="preserve">U.S. Energy Information Administration. Weekly U.S. Ending Stocks of Crude Oil in SPR, Weekly U.S. Ending Stocks excluding SPR of Crude Oil, and Weekly U.S. Field Production of Crude Oil.</w:t>
       </w:r>
       <w:r>
         <w:t xml:space="preserve"> </w:t>
       </w:r>
-      <w:hyperlink r:id="rId127">
+      <w:hyperlink r:id="rId138">
         <w:r>
           <w:rPr>
             <w:rStyle w:val="Hyperlink"/>
@@ -22749,7 +24038,7 @@
       <w:r>
         <w:t xml:space="preserve"> </w:t>
       </w:r>
-      <w:hyperlink r:id="rId128">
+      <w:hyperlink r:id="rId139">
         <w:r>
           <w:rPr>
             <w:rStyle w:val="Hyperlink"/>
@@ -22761,7 +24050,7 @@
         <w:t xml:space="preserve">.</w:t>
       </w:r>
     </w:p>
-    <w:bookmarkEnd w:id="129"/>
+    <w:bookmarkEnd w:id="140"/>
     <w:sectPr>
       <w:footnotePr>
         <w:numRestart w:val="eachSect"/>

</xml_diff>